<commit_message>
Add AC4400CW and fix GP60M independent brake
</commit_message>
<xml_diff>
--- a/raildriver-USA-Remapped.docx
+++ b/raildriver-USA-Remapped.docx
@@ -2,6 +2,1153 @@
 <file path=word/document.xml><?xml version="1.0" encoding="utf-8"?>
 <w:document xmlns:o="urn:schemas-microsoft-com:office:office" xmlns:r="http://schemas.openxmlformats.org/officeDocument/2006/relationships" xmlns:v="urn:schemas-microsoft-com:vml" xmlns:w="http://schemas.openxmlformats.org/wordprocessingml/2006/main" xmlns:w10="urn:schemas-microsoft-com:office:word" xmlns:wp="http://schemas.openxmlformats.org/drawingml/2006/wordprocessingDrawing" xmlns:pic="http://schemas.openxmlformats.org/drawingml/2006/picture" xmlns:wps="http://schemas.microsoft.com/office/word/2010/wordprocessingShape" xmlns:wpg="http://schemas.microsoft.com/office/word/2010/wordprocessingGroup" xmlns:mc="http://schemas.openxmlformats.org/markup-compatibility/2006" xmlns:wp14="http://schemas.microsoft.com/office/word/2010/wordprocessingDrawing" xmlns:w14="http://schemas.microsoft.com/office/word/2010/wordml" xmlns:w15="http://schemas.microsoft.com/office/word/2012/wordml" mc:Ignorable="w14 wp14 w15">
   <w:body>
+    <w:p>
+      <w:pPr>
+        <w:pStyle w:val="Normal"/>
+        <w:rPr>
+          <w:color w:val="000000"/>
+          <w:sz w:val="16"/>
+          <w:szCs w:val="16"/>
+        </w:rPr>
+      </w:pPr>
+      <w:r>
+        <w:rPr>
+          <w:color w:val="000000"/>
+          <w:sz w:val="16"/>
+          <w:szCs w:val="16"/>
+        </w:rPr>
+        <w:tab/>
+        <w:t xml:space="preserve">       </w:t>
+      </w:r>
+      <w:r>
+        <w:rPr>
+          <w:rFonts w:eastAsia="arial" w:ascii="arial" w:hAnsi="arial"/>
+          <w:color w:val="000000"/>
+          <w:sz w:val="16"/>
+          <w:szCs w:val="16"/>
+        </w:rPr>
+        <w:t xml:space="preserve">    GP60M-1</w:t>
+      </w:r>
+    </w:p>
+    <w:tbl>
+      <w:tblPr>
+        <w:tblW w:w="14248" w:type="dxa"/>
+        <w:jc w:val="left"/>
+        <w:tblInd w:w="-5" w:type="dxa"/>
+        <w:tblLayout w:type="fixed"/>
+        <w:tblCellMar>
+          <w:top w:w="0" w:type="dxa"/>
+          <w:left w:w="108" w:type="dxa"/>
+          <w:bottom w:w="0" w:type="dxa"/>
+          <w:right w:w="108" w:type="dxa"/>
+        </w:tblCellMar>
+        <w:tblLook w:firstRow="1" w:noVBand="1" w:lastRow="0" w:firstColumn="1" w:lastColumn="0" w:noHBand="0" w:val="04a0"/>
+      </w:tblPr>
+      <w:tblGrid>
+        <w:gridCol w:w="1017"/>
+        <w:gridCol w:w="1019"/>
+        <w:gridCol w:w="1014"/>
+        <w:gridCol w:w="1016"/>
+        <w:gridCol w:w="1020"/>
+        <w:gridCol w:w="1016"/>
+        <w:gridCol w:w="1016"/>
+        <w:gridCol w:w="1017"/>
+        <w:gridCol w:w="1016"/>
+        <w:gridCol w:w="1020"/>
+        <w:gridCol w:w="1016"/>
+        <w:gridCol w:w="1016"/>
+        <w:gridCol w:w="1016"/>
+        <w:gridCol w:w="1029"/>
+      </w:tblGrid>
+      <w:tr>
+        <w:trPr>
+          <w:trHeight w:val="440" w:hRule="exact"/>
+          <w:cantSplit w:val="true"/>
+        </w:trPr>
+        <w:tc>
+          <w:tcPr>
+            <w:tcW w:w="1017" w:type="dxa"/>
+            <w:tcBorders>
+              <w:top w:val="single" w:sz="4" w:space="0" w:color="000000"/>
+              <w:left w:val="single" w:sz="4" w:space="0" w:color="000000"/>
+              <w:bottom w:val="single" w:sz="4" w:space="0" w:color="000000"/>
+            </w:tcBorders>
+            <w:vAlign w:val="bottom"/>
+          </w:tcPr>
+          <w:p>
+            <w:pPr>
+              <w:pStyle w:val="Normal"/>
+              <w:widowControl w:val="false"/>
+              <w:spacing w:lineRule="auto" w:line="180" w:before="0" w:after="60"/>
+              <w:jc w:val="center"/>
+              <w:rPr>
+                <w:color w:val="000000"/>
+                <w:sz w:val="16"/>
+                <w:szCs w:val="16"/>
+              </w:rPr>
+            </w:pPr>
+            <w:r>
+              <w:rPr>
+                <w:rFonts w:eastAsia="arial" w:ascii="arial" w:hAnsi="arial"/>
+                <w:b/>
+                <w:color w:val="000000"/>
+                <w:sz w:val="16"/>
+                <w:szCs w:val="16"/>
+              </w:rPr>
+              <w:t>Pause</w:t>
+            </w:r>
+          </w:p>
+        </w:tc>
+        <w:tc>
+          <w:tcPr>
+            <w:tcW w:w="1019" w:type="dxa"/>
+            <w:tcBorders>
+              <w:top w:val="single" w:sz="4" w:space="0" w:color="000000"/>
+              <w:left w:val="single" w:sz="4" w:space="0" w:color="000000"/>
+              <w:bottom w:val="single" w:sz="4" w:space="0" w:color="000000"/>
+            </w:tcBorders>
+            <w:vAlign w:val="bottom"/>
+          </w:tcPr>
+          <w:p>
+            <w:pPr>
+              <w:pStyle w:val="Normal"/>
+              <w:widowControl w:val="false"/>
+              <w:spacing w:lineRule="auto" w:line="180"/>
+              <w:jc w:val="center"/>
+              <w:rPr>
+                <w:color w:val="000000"/>
+                <w:sz w:val="16"/>
+                <w:szCs w:val="16"/>
+              </w:rPr>
+            </w:pPr>
+            <w:r>
+              <w:rPr>
+                <w:color w:val="000000"/>
+                <w:sz w:val="16"/>
+                <w:szCs w:val="16"/>
+              </w:rPr>
+            </w:r>
+          </w:p>
+        </w:tc>
+        <w:tc>
+          <w:tcPr>
+            <w:tcW w:w="1014" w:type="dxa"/>
+            <w:tcBorders>
+              <w:top w:val="single" w:sz="4" w:space="0" w:color="000000"/>
+              <w:left w:val="single" w:sz="4" w:space="0" w:color="000000"/>
+              <w:bottom w:val="single" w:sz="4" w:space="0" w:color="000000"/>
+            </w:tcBorders>
+            <w:vAlign w:val="bottom"/>
+          </w:tcPr>
+          <w:p>
+            <w:pPr>
+              <w:pStyle w:val="Normal"/>
+              <w:widowControl w:val="false"/>
+              <w:spacing w:lineRule="auto" w:line="180"/>
+              <w:jc w:val="center"/>
+              <w:rPr>
+                <w:color w:val="000000"/>
+                <w:sz w:val="16"/>
+                <w:szCs w:val="16"/>
+              </w:rPr>
+            </w:pPr>
+            <w:r>
+              <w:rPr>
+                <w:rFonts w:eastAsia="arial" w:ascii="arial" w:hAnsi="arial"/>
+                <w:color w:val="000000"/>
+                <w:sz w:val="16"/>
+                <w:szCs w:val="16"/>
+              </w:rPr>
+              <w:t>Engine Start</w:t>
+            </w:r>
+          </w:p>
+        </w:tc>
+        <w:tc>
+          <w:tcPr>
+            <w:tcW w:w="1016" w:type="dxa"/>
+            <w:tcBorders>
+              <w:top w:val="single" w:sz="4" w:space="0" w:color="000000"/>
+              <w:left w:val="single" w:sz="4" w:space="0" w:color="000000"/>
+              <w:bottom w:val="single" w:sz="4" w:space="0" w:color="000000"/>
+            </w:tcBorders>
+            <w:vAlign w:val="bottom"/>
+          </w:tcPr>
+          <w:p>
+            <w:pPr>
+              <w:pStyle w:val="Normal"/>
+              <w:widowControl w:val="false"/>
+              <w:spacing w:lineRule="auto" w:line="180"/>
+              <w:jc w:val="center"/>
+              <w:rPr>
+                <w:color w:val="000000"/>
+                <w:sz w:val="16"/>
+                <w:szCs w:val="16"/>
+              </w:rPr>
+            </w:pPr>
+            <w:r>
+              <w:rPr>
+                <w:color w:val="000000"/>
+                <w:sz w:val="16"/>
+                <w:szCs w:val="16"/>
+              </w:rPr>
+              <w:t>Engine Run</w:t>
+            </w:r>
+          </w:p>
+        </w:tc>
+        <w:tc>
+          <w:tcPr>
+            <w:tcW w:w="1020" w:type="dxa"/>
+            <w:tcBorders>
+              <w:top w:val="single" w:sz="4" w:space="0" w:color="000000"/>
+              <w:left w:val="single" w:sz="4" w:space="0" w:color="000000"/>
+              <w:bottom w:val="single" w:sz="4" w:space="0" w:color="000000"/>
+            </w:tcBorders>
+            <w:vAlign w:val="bottom"/>
+          </w:tcPr>
+          <w:p>
+            <w:pPr>
+              <w:pStyle w:val="Normal"/>
+              <w:widowControl w:val="false"/>
+              <w:spacing w:lineRule="auto" w:line="180"/>
+              <w:jc w:val="center"/>
+              <w:rPr>
+                <w:color w:val="000000"/>
+                <w:sz w:val="16"/>
+                <w:szCs w:val="16"/>
+              </w:rPr>
+            </w:pPr>
+            <w:r>
+              <w:rPr>
+                <w:color w:val="000000"/>
+                <w:sz w:val="16"/>
+                <w:szCs w:val="16"/>
+              </w:rPr>
+              <w:t>Generator Field</w:t>
+            </w:r>
+          </w:p>
+        </w:tc>
+        <w:tc>
+          <w:tcPr>
+            <w:tcW w:w="1016" w:type="dxa"/>
+            <w:tcBorders>
+              <w:top w:val="single" w:sz="4" w:space="0" w:color="000000"/>
+              <w:left w:val="single" w:sz="4" w:space="0" w:color="000000"/>
+              <w:bottom w:val="single" w:sz="4" w:space="0" w:color="000000"/>
+            </w:tcBorders>
+            <w:vAlign w:val="bottom"/>
+          </w:tcPr>
+          <w:p>
+            <w:pPr>
+              <w:pStyle w:val="Normal"/>
+              <w:widowControl w:val="false"/>
+              <w:jc w:val="center"/>
+              <w:rPr>
+                <w:color w:val="000000"/>
+                <w:sz w:val="16"/>
+                <w:szCs w:val="16"/>
+              </w:rPr>
+            </w:pPr>
+            <w:r>
+              <w:rPr>
+                <w:color w:val="000000"/>
+                <w:sz w:val="16"/>
+                <w:szCs w:val="16"/>
+              </w:rPr>
+              <w:t>Brake</w:t>
+            </w:r>
+          </w:p>
+          <w:p>
+            <w:pPr>
+              <w:pStyle w:val="Normal"/>
+              <w:widowControl w:val="false"/>
+              <w:jc w:val="center"/>
+              <w:rPr>
+                <w:color w:val="000000"/>
+                <w:sz w:val="16"/>
+                <w:szCs w:val="16"/>
+              </w:rPr>
+            </w:pPr>
+            <w:r>
+              <w:rPr>
+                <w:color w:val="000000"/>
+                <w:sz w:val="16"/>
+                <w:szCs w:val="16"/>
+              </w:rPr>
+              <w:t>Cut-In</w:t>
+            </w:r>
+          </w:p>
+        </w:tc>
+        <w:tc>
+          <w:tcPr>
+            <w:tcW w:w="1016" w:type="dxa"/>
+            <w:tcBorders>
+              <w:top w:val="single" w:sz="4" w:space="0" w:color="000000"/>
+              <w:left w:val="single" w:sz="4" w:space="0" w:color="000000"/>
+              <w:bottom w:val="single" w:sz="4" w:space="0" w:color="000000"/>
+            </w:tcBorders>
+            <w:vAlign w:val="bottom"/>
+          </w:tcPr>
+          <w:p>
+            <w:pPr>
+              <w:pStyle w:val="Normal"/>
+              <w:widowControl w:val="false"/>
+              <w:jc w:val="center"/>
+              <w:rPr>
+                <w:color w:val="000000"/>
+                <w:sz w:val="16"/>
+                <w:szCs w:val="16"/>
+              </w:rPr>
+            </w:pPr>
+            <w:r>
+              <w:rPr>
+                <w:color w:val="000000"/>
+                <w:sz w:val="16"/>
+                <w:szCs w:val="16"/>
+              </w:rPr>
+              <w:t>MU-2A Lead</w:t>
+            </w:r>
+          </w:p>
+        </w:tc>
+        <w:tc>
+          <w:tcPr>
+            <w:tcW w:w="1017" w:type="dxa"/>
+            <w:tcBorders>
+              <w:top w:val="single" w:sz="4" w:space="0" w:color="000000"/>
+              <w:left w:val="single" w:sz="4" w:space="0" w:color="000000"/>
+              <w:bottom w:val="single" w:sz="4" w:space="0" w:color="000000"/>
+            </w:tcBorders>
+            <w:vAlign w:val="bottom"/>
+          </w:tcPr>
+          <w:p>
+            <w:pPr>
+              <w:pStyle w:val="Normal"/>
+              <w:widowControl w:val="false"/>
+              <w:jc w:val="center"/>
+              <w:rPr>
+                <w:color w:val="000000"/>
+                <w:sz w:val="16"/>
+                <w:szCs w:val="16"/>
+              </w:rPr>
+            </w:pPr>
+            <w:r>
+              <w:rPr>
+                <w:rFonts w:eastAsia="arial" w:ascii="arial" w:hAnsi="arial"/>
+                <w:color w:val="000000"/>
+                <w:sz w:val="16"/>
+                <w:szCs w:val="16"/>
+              </w:rPr>
+              <w:t>Banking COMM</w:t>
+            </w:r>
+          </w:p>
+        </w:tc>
+        <w:tc>
+          <w:tcPr>
+            <w:tcW w:w="1016" w:type="dxa"/>
+            <w:tcBorders>
+              <w:top w:val="single" w:sz="4" w:space="0" w:color="000000"/>
+              <w:left w:val="single" w:sz="4" w:space="0" w:color="000000"/>
+              <w:bottom w:val="single" w:sz="4" w:space="0" w:color="000000"/>
+            </w:tcBorders>
+            <w:vAlign w:val="bottom"/>
+          </w:tcPr>
+          <w:p>
+            <w:pPr>
+              <w:pStyle w:val="Normal"/>
+              <w:widowControl w:val="false"/>
+              <w:jc w:val="center"/>
+              <w:rPr>
+                <w:sz w:val="16"/>
+                <w:szCs w:val="16"/>
+              </w:rPr>
+            </w:pPr>
+            <w:r>
+              <w:rPr>
+                <w:sz w:val="16"/>
+                <w:szCs w:val="16"/>
+              </w:rPr>
+              <w:t>Rear HL Up</w:t>
+            </w:r>
+          </w:p>
+        </w:tc>
+        <w:tc>
+          <w:tcPr>
+            <w:tcW w:w="1020" w:type="dxa"/>
+            <w:tcBorders>
+              <w:top w:val="single" w:sz="4" w:space="0" w:color="000000"/>
+              <w:left w:val="single" w:sz="4" w:space="0" w:color="000000"/>
+              <w:bottom w:val="single" w:sz="4" w:space="0" w:color="000000"/>
+            </w:tcBorders>
+            <w:vAlign w:val="bottom"/>
+          </w:tcPr>
+          <w:p>
+            <w:pPr>
+              <w:pStyle w:val="Normal"/>
+              <w:widowControl w:val="false"/>
+              <w:spacing w:lineRule="auto" w:line="180"/>
+              <w:jc w:val="center"/>
+              <w:rPr>
+                <w:sz w:val="16"/>
+                <w:szCs w:val="16"/>
+              </w:rPr>
+            </w:pPr>
+            <w:r>
+              <w:rPr>
+                <w:sz w:val="16"/>
+                <w:szCs w:val="16"/>
+              </w:rPr>
+              <w:t>Ditch Light</w:t>
+            </w:r>
+          </w:p>
+        </w:tc>
+        <w:tc>
+          <w:tcPr>
+            <w:tcW w:w="1016" w:type="dxa"/>
+            <w:tcBorders>
+              <w:top w:val="single" w:sz="4" w:space="0" w:color="000000"/>
+              <w:left w:val="single" w:sz="4" w:space="0" w:color="000000"/>
+              <w:bottom w:val="single" w:sz="4" w:space="0" w:color="000000"/>
+            </w:tcBorders>
+            <w:vAlign w:val="bottom"/>
+          </w:tcPr>
+          <w:p>
+            <w:pPr>
+              <w:pStyle w:val="Normal"/>
+              <w:widowControl w:val="false"/>
+              <w:spacing w:lineRule="auto" w:line="180"/>
+              <w:jc w:val="center"/>
+              <w:rPr>
+                <w:sz w:val="16"/>
+                <w:szCs w:val="16"/>
+              </w:rPr>
+            </w:pPr>
+            <w:r>
+              <w:rPr>
+                <w:rFonts w:eastAsia="arial" w:ascii="arial" w:hAnsi="arial"/>
+                <w:color w:val="000000"/>
+                <w:sz w:val="16"/>
+                <w:szCs w:val="16"/>
+              </w:rPr>
+              <w:t>Gauge Light</w:t>
+            </w:r>
+          </w:p>
+        </w:tc>
+        <w:tc>
+          <w:tcPr>
+            <w:tcW w:w="1016" w:type="dxa"/>
+            <w:tcBorders>
+              <w:top w:val="single" w:sz="4" w:space="0" w:color="000000"/>
+              <w:left w:val="single" w:sz="4" w:space="0" w:color="000000"/>
+              <w:bottom w:val="single" w:sz="4" w:space="0" w:color="000000"/>
+            </w:tcBorders>
+            <w:vAlign w:val="bottom"/>
+          </w:tcPr>
+          <w:p>
+            <w:pPr>
+              <w:pStyle w:val="Normal"/>
+              <w:widowControl w:val="false"/>
+              <w:spacing w:lineRule="auto" w:line="180"/>
+              <w:jc w:val="center"/>
+              <w:rPr>
+                <w:sz w:val="16"/>
+                <w:szCs w:val="16"/>
+              </w:rPr>
+            </w:pPr>
+            <w:r>
+              <w:rPr>
+                <w:sz w:val="16"/>
+                <w:szCs w:val="16"/>
+              </w:rPr>
+              <w:t>Cab Light</w:t>
+            </w:r>
+          </w:p>
+        </w:tc>
+        <w:tc>
+          <w:tcPr>
+            <w:tcW w:w="1016" w:type="dxa"/>
+            <w:tcBorders>
+              <w:top w:val="single" w:sz="4" w:space="0" w:color="000000"/>
+              <w:left w:val="single" w:sz="4" w:space="0" w:color="000000"/>
+              <w:bottom w:val="single" w:sz="4" w:space="0" w:color="000000"/>
+            </w:tcBorders>
+            <w:vAlign w:val="bottom"/>
+          </w:tcPr>
+          <w:p>
+            <w:pPr>
+              <w:pStyle w:val="Normal"/>
+              <w:widowControl w:val="false"/>
+              <w:spacing w:lineRule="auto" w:line="180"/>
+              <w:jc w:val="center"/>
+              <w:rPr>
+                <w:sz w:val="16"/>
+                <w:szCs w:val="16"/>
+              </w:rPr>
+            </w:pPr>
+            <w:r>
+              <w:rPr>
+                <w:rFonts w:eastAsia="arial" w:ascii="arial" w:hAnsi="arial"/>
+                <w:color w:val="000000"/>
+                <w:sz w:val="16"/>
+                <w:szCs w:val="16"/>
+              </w:rPr>
+              <w:t>1-Person</w:t>
+            </w:r>
+          </w:p>
+        </w:tc>
+        <w:tc>
+          <w:tcPr>
+            <w:tcW w:w="1029" w:type="dxa"/>
+            <w:tcBorders>
+              <w:top w:val="single" w:sz="4" w:space="0" w:color="000000"/>
+              <w:left w:val="single" w:sz="4" w:space="0" w:color="000000"/>
+              <w:bottom w:val="single" w:sz="4" w:space="0" w:color="000000"/>
+              <w:right w:val="single" w:sz="4" w:space="0" w:color="000000"/>
+            </w:tcBorders>
+            <w:vAlign w:val="bottom"/>
+          </w:tcPr>
+          <w:p>
+            <w:pPr>
+              <w:pStyle w:val="Normal"/>
+              <w:widowControl w:val="false"/>
+              <w:spacing w:lineRule="auto" w:line="180"/>
+              <w:jc w:val="center"/>
+              <w:rPr>
+                <w:sz w:val="16"/>
+                <w:szCs w:val="16"/>
+              </w:rPr>
+            </w:pPr>
+            <w:r>
+              <w:rPr>
+                <w:rFonts w:eastAsia="arial" w:ascii="arial" w:hAnsi="arial"/>
+                <w:color w:val="000000"/>
+                <w:sz w:val="16"/>
+                <w:szCs w:val="16"/>
+              </w:rPr>
+              <w:t>Next</w:t>
+            </w:r>
+          </w:p>
+          <w:p>
+            <w:pPr>
+              <w:pStyle w:val="Normal"/>
+              <w:widowControl w:val="false"/>
+              <w:spacing w:lineRule="auto" w:line="180"/>
+              <w:jc w:val="center"/>
+              <w:rPr>
+                <w:sz w:val="16"/>
+                <w:szCs w:val="16"/>
+              </w:rPr>
+            </w:pPr>
+            <w:r>
+              <w:rPr>
+                <w:rFonts w:eastAsia="arial" w:ascii="arial" w:hAnsi="arial"/>
+                <w:color w:val="000000"/>
+                <w:sz w:val="16"/>
+                <w:szCs w:val="16"/>
+              </w:rPr>
+              <w:t>Cab Cam</w:t>
+            </w:r>
+          </w:p>
+        </w:tc>
+      </w:tr>
+    </w:tbl>
+    <w:p>
+      <w:pPr>
+        <w:pStyle w:val="Normal"/>
+        <w:rPr>
+          <w:rFonts w:ascii="arial" w:hAnsi="arial" w:eastAsia="arial"/>
+          <w:color w:val="000000"/>
+          <w:sz w:val="16"/>
+          <w:szCs w:val="16"/>
+        </w:rPr>
+      </w:pPr>
+      <w:r>
+        <w:rPr>
+          <w:rFonts w:eastAsia="arial" w:ascii="arial" w:hAnsi="arial"/>
+          <w:color w:val="000000"/>
+          <w:sz w:val="16"/>
+          <w:szCs w:val="16"/>
+        </w:rPr>
+      </w:r>
+    </w:p>
+    <w:p>
+      <w:pPr>
+        <w:pStyle w:val="Normal"/>
+        <w:rPr>
+          <w:color w:val="000000"/>
+          <w:sz w:val="16"/>
+          <w:szCs w:val="16"/>
+        </w:rPr>
+      </w:pPr>
+      <w:r>
+        <w:rPr>
+          <w:rFonts w:eastAsia="arial" w:ascii="arial" w:hAnsi="arial"/>
+          <w:color w:val="000000"/>
+          <w:sz w:val="16"/>
+          <w:szCs w:val="16"/>
+        </w:rPr>
+        <w:tab/>
+        <w:t xml:space="preserve">           GP60M-2</w:t>
+      </w:r>
+    </w:p>
+    <w:tbl>
+      <w:tblPr>
+        <w:tblW w:w="14248" w:type="dxa"/>
+        <w:jc w:val="left"/>
+        <w:tblInd w:w="-5" w:type="dxa"/>
+        <w:tblLayout w:type="fixed"/>
+        <w:tblCellMar>
+          <w:top w:w="0" w:type="dxa"/>
+          <w:left w:w="108" w:type="dxa"/>
+          <w:bottom w:w="0" w:type="dxa"/>
+          <w:right w:w="108" w:type="dxa"/>
+        </w:tblCellMar>
+        <w:tblLook w:firstRow="1" w:noVBand="1" w:lastRow="0" w:firstColumn="1" w:lastColumn="0" w:noHBand="0" w:val="04a0"/>
+      </w:tblPr>
+      <w:tblGrid>
+        <w:gridCol w:w="1017"/>
+        <w:gridCol w:w="1019"/>
+        <w:gridCol w:w="1014"/>
+        <w:gridCol w:w="1016"/>
+        <w:gridCol w:w="1020"/>
+        <w:gridCol w:w="1016"/>
+        <w:gridCol w:w="1016"/>
+        <w:gridCol w:w="1017"/>
+        <w:gridCol w:w="1016"/>
+        <w:gridCol w:w="1020"/>
+        <w:gridCol w:w="1016"/>
+        <w:gridCol w:w="1016"/>
+        <w:gridCol w:w="1016"/>
+        <w:gridCol w:w="1029"/>
+      </w:tblGrid>
+      <w:tr>
+        <w:trPr>
+          <w:trHeight w:val="440" w:hRule="exact"/>
+          <w:cantSplit w:val="true"/>
+        </w:trPr>
+        <w:tc>
+          <w:tcPr>
+            <w:tcW w:w="1017" w:type="dxa"/>
+            <w:tcBorders>
+              <w:top w:val="single" w:sz="4" w:space="0" w:color="000000"/>
+              <w:left w:val="single" w:sz="4" w:space="0" w:color="000000"/>
+              <w:bottom w:val="single" w:sz="4" w:space="0" w:color="000000"/>
+            </w:tcBorders>
+            <w:vAlign w:val="bottom"/>
+          </w:tcPr>
+          <w:p>
+            <w:pPr>
+              <w:pStyle w:val="Normal"/>
+              <w:widowControl w:val="false"/>
+              <w:spacing w:lineRule="auto" w:line="180" w:before="0" w:after="60"/>
+              <w:jc w:val="center"/>
+              <w:rPr>
+                <w:b/>
+                <w:bCs/>
+              </w:rPr>
+            </w:pPr>
+            <w:r>
+              <w:rPr>
+                <w:b/>
+                <w:bCs/>
+                <w:color w:val="000000"/>
+                <w:sz w:val="16"/>
+                <w:szCs w:val="16"/>
+              </w:rPr>
+              <w:t>HUD</w:t>
+            </w:r>
+          </w:p>
+        </w:tc>
+        <w:tc>
+          <w:tcPr>
+            <w:tcW w:w="1019" w:type="dxa"/>
+            <w:tcBorders>
+              <w:top w:val="single" w:sz="4" w:space="0" w:color="000000"/>
+              <w:left w:val="single" w:sz="4" w:space="0" w:color="000000"/>
+              <w:bottom w:val="single" w:sz="4" w:space="0" w:color="000000"/>
+            </w:tcBorders>
+            <w:vAlign w:val="bottom"/>
+          </w:tcPr>
+          <w:p>
+            <w:pPr>
+              <w:pStyle w:val="Normal"/>
+              <w:widowControl w:val="false"/>
+              <w:spacing w:lineRule="auto" w:line="180"/>
+              <w:jc w:val="center"/>
+              <w:rPr>
+                <w:color w:val="000000"/>
+                <w:sz w:val="16"/>
+                <w:szCs w:val="16"/>
+              </w:rPr>
+            </w:pPr>
+            <w:r>
+              <w:rPr>
+                <w:color w:val="000000"/>
+                <w:sz w:val="16"/>
+                <w:szCs w:val="16"/>
+              </w:rPr>
+              <w:t>Schedule</w:t>
+            </w:r>
+          </w:p>
+        </w:tc>
+        <w:tc>
+          <w:tcPr>
+            <w:tcW w:w="1014" w:type="dxa"/>
+            <w:tcBorders>
+              <w:top w:val="single" w:sz="4" w:space="0" w:color="000000"/>
+              <w:left w:val="single" w:sz="4" w:space="0" w:color="000000"/>
+              <w:bottom w:val="single" w:sz="4" w:space="0" w:color="000000"/>
+            </w:tcBorders>
+            <w:vAlign w:val="bottom"/>
+          </w:tcPr>
+          <w:p>
+            <w:pPr>
+              <w:pStyle w:val="Normal"/>
+              <w:widowControl w:val="false"/>
+              <w:spacing w:lineRule="auto" w:line="180"/>
+              <w:jc w:val="center"/>
+              <w:rPr>
+                <w:color w:val="000000"/>
+                <w:sz w:val="16"/>
+                <w:szCs w:val="16"/>
+              </w:rPr>
+            </w:pPr>
+            <w:r>
+              <w:rPr>
+                <w:rFonts w:eastAsia="arial" w:ascii="arial" w:hAnsi="arial"/>
+                <w:color w:val="000000"/>
+                <w:sz w:val="16"/>
+                <w:szCs w:val="16"/>
+              </w:rPr>
+              <w:t>Engine Stop</w:t>
+            </w:r>
+          </w:p>
+        </w:tc>
+        <w:tc>
+          <w:tcPr>
+            <w:tcW w:w="1016" w:type="dxa"/>
+            <w:tcBorders>
+              <w:top w:val="single" w:sz="4" w:space="0" w:color="000000"/>
+              <w:left w:val="single" w:sz="4" w:space="0" w:color="000000"/>
+              <w:bottom w:val="single" w:sz="4" w:space="0" w:color="000000"/>
+            </w:tcBorders>
+            <w:vAlign w:val="bottom"/>
+          </w:tcPr>
+          <w:p>
+            <w:pPr>
+              <w:pStyle w:val="Normal"/>
+              <w:widowControl w:val="false"/>
+              <w:spacing w:lineRule="auto" w:line="180"/>
+              <w:jc w:val="center"/>
+              <w:rPr>
+                <w:color w:val="000000"/>
+                <w:sz w:val="16"/>
+                <w:szCs w:val="16"/>
+              </w:rPr>
+            </w:pPr>
+            <w:r>
+              <w:rPr>
+                <w:color w:val="000000"/>
+                <w:sz w:val="16"/>
+                <w:szCs w:val="16"/>
+              </w:rPr>
+              <w:t>Warning Devices</w:t>
+            </w:r>
+          </w:p>
+        </w:tc>
+        <w:tc>
+          <w:tcPr>
+            <w:tcW w:w="1020" w:type="dxa"/>
+            <w:tcBorders>
+              <w:top w:val="single" w:sz="4" w:space="0" w:color="000000"/>
+              <w:left w:val="single" w:sz="4" w:space="0" w:color="000000"/>
+              <w:bottom w:val="single" w:sz="4" w:space="0" w:color="000000"/>
+            </w:tcBorders>
+            <w:vAlign w:val="bottom"/>
+          </w:tcPr>
+          <w:p>
+            <w:pPr>
+              <w:pStyle w:val="Normal"/>
+              <w:widowControl w:val="false"/>
+              <w:spacing w:lineRule="auto" w:line="180"/>
+              <w:jc w:val="center"/>
+              <w:rPr>
+                <w:color w:val="000000"/>
+                <w:sz w:val="16"/>
+                <w:szCs w:val="16"/>
+              </w:rPr>
+            </w:pPr>
+            <w:r>
+              <w:rPr>
+                <w:color w:val="000000"/>
+                <w:sz w:val="16"/>
+                <w:szCs w:val="16"/>
+              </w:rPr>
+              <w:t>Control Switch</w:t>
+            </w:r>
+          </w:p>
+        </w:tc>
+        <w:tc>
+          <w:tcPr>
+            <w:tcW w:w="1016" w:type="dxa"/>
+            <w:tcBorders>
+              <w:top w:val="single" w:sz="4" w:space="0" w:color="000000"/>
+              <w:left w:val="single" w:sz="4" w:space="0" w:color="000000"/>
+              <w:bottom w:val="single" w:sz="4" w:space="0" w:color="000000"/>
+            </w:tcBorders>
+            <w:vAlign w:val="bottom"/>
+          </w:tcPr>
+          <w:p>
+            <w:pPr>
+              <w:pStyle w:val="Normal"/>
+              <w:widowControl w:val="false"/>
+              <w:jc w:val="center"/>
+              <w:rPr>
+                <w:color w:val="000000"/>
+                <w:sz w:val="16"/>
+                <w:szCs w:val="16"/>
+              </w:rPr>
+            </w:pPr>
+            <w:r>
+              <w:rPr>
+                <w:color w:val="000000"/>
+                <w:sz w:val="16"/>
+                <w:szCs w:val="16"/>
+              </w:rPr>
+              <w:t>Brake</w:t>
+            </w:r>
+          </w:p>
+          <w:p>
+            <w:pPr>
+              <w:pStyle w:val="Normal"/>
+              <w:widowControl w:val="false"/>
+              <w:jc w:val="center"/>
+              <w:rPr>
+                <w:color w:val="000000"/>
+                <w:sz w:val="16"/>
+                <w:szCs w:val="16"/>
+              </w:rPr>
+            </w:pPr>
+            <w:r>
+              <w:rPr>
+                <w:color w:val="000000"/>
+                <w:sz w:val="16"/>
+                <w:szCs w:val="16"/>
+              </w:rPr>
+              <w:t>Cut-Out</w:t>
+            </w:r>
+          </w:p>
+        </w:tc>
+        <w:tc>
+          <w:tcPr>
+            <w:tcW w:w="1016" w:type="dxa"/>
+            <w:tcBorders>
+              <w:top w:val="single" w:sz="4" w:space="0" w:color="000000"/>
+              <w:left w:val="single" w:sz="4" w:space="0" w:color="000000"/>
+              <w:bottom w:val="single" w:sz="4" w:space="0" w:color="000000"/>
+            </w:tcBorders>
+            <w:vAlign w:val="bottom"/>
+          </w:tcPr>
+          <w:p>
+            <w:pPr>
+              <w:pStyle w:val="Normal"/>
+              <w:widowControl w:val="false"/>
+              <w:jc w:val="center"/>
+              <w:rPr>
+                <w:color w:val="000000"/>
+                <w:sz w:val="16"/>
+                <w:szCs w:val="16"/>
+              </w:rPr>
+            </w:pPr>
+            <w:r>
+              <w:rPr>
+                <w:rFonts w:eastAsia="arial" w:ascii="arial" w:hAnsi="arial"/>
+                <w:color w:val="000000"/>
+                <w:sz w:val="16"/>
+                <w:szCs w:val="16"/>
+              </w:rPr>
+              <w:t>MU-2A Trail</w:t>
+            </w:r>
+          </w:p>
+        </w:tc>
+        <w:tc>
+          <w:tcPr>
+            <w:tcW w:w="1017" w:type="dxa"/>
+            <w:tcBorders>
+              <w:top w:val="single" w:sz="4" w:space="0" w:color="000000"/>
+              <w:left w:val="single" w:sz="4" w:space="0" w:color="000000"/>
+              <w:bottom w:val="single" w:sz="4" w:space="0" w:color="000000"/>
+            </w:tcBorders>
+            <w:vAlign w:val="bottom"/>
+          </w:tcPr>
+          <w:p>
+            <w:pPr>
+              <w:pStyle w:val="Normal"/>
+              <w:widowControl w:val="false"/>
+              <w:jc w:val="center"/>
+              <w:rPr>
+                <w:rFonts w:ascii="arial" w:hAnsi="arial" w:eastAsia="arial"/>
+                <w:color w:val="000000"/>
+                <w:sz w:val="16"/>
+                <w:szCs w:val="16"/>
+              </w:rPr>
+            </w:pPr>
+            <w:r>
+              <w:rPr>
+                <w:rFonts w:eastAsia="arial" w:ascii="arial" w:hAnsi="arial"/>
+                <w:color w:val="000000"/>
+                <w:sz w:val="16"/>
+                <w:szCs w:val="16"/>
+              </w:rPr>
+              <w:t>Lead Sand</w:t>
+            </w:r>
+          </w:p>
+        </w:tc>
+        <w:tc>
+          <w:tcPr>
+            <w:tcW w:w="1016" w:type="dxa"/>
+            <w:tcBorders>
+              <w:top w:val="single" w:sz="4" w:space="0" w:color="000000"/>
+              <w:left w:val="single" w:sz="4" w:space="0" w:color="000000"/>
+              <w:bottom w:val="single" w:sz="4" w:space="0" w:color="000000"/>
+            </w:tcBorders>
+            <w:vAlign w:val="bottom"/>
+          </w:tcPr>
+          <w:p>
+            <w:pPr>
+              <w:pStyle w:val="Normal"/>
+              <w:widowControl w:val="false"/>
+              <w:jc w:val="center"/>
+              <w:rPr>
+                <w:sz w:val="16"/>
+                <w:szCs w:val="16"/>
+              </w:rPr>
+            </w:pPr>
+            <w:r>
+              <w:rPr>
+                <w:rFonts w:eastAsia="arial" w:ascii="arial" w:hAnsi="arial"/>
+                <w:color w:val="000000"/>
+                <w:sz w:val="16"/>
+                <w:szCs w:val="16"/>
+              </w:rPr>
+              <w:t>Rear HL Down</w:t>
+            </w:r>
+          </w:p>
+        </w:tc>
+        <w:tc>
+          <w:tcPr>
+            <w:tcW w:w="1020" w:type="dxa"/>
+            <w:tcBorders>
+              <w:top w:val="single" w:sz="4" w:space="0" w:color="000000"/>
+              <w:left w:val="single" w:sz="4" w:space="0" w:color="000000"/>
+              <w:bottom w:val="single" w:sz="4" w:space="0" w:color="000000"/>
+            </w:tcBorders>
+            <w:vAlign w:val="bottom"/>
+          </w:tcPr>
+          <w:p>
+            <w:pPr>
+              <w:pStyle w:val="Normal"/>
+              <w:widowControl w:val="false"/>
+              <w:spacing w:lineRule="auto" w:line="180"/>
+              <w:jc w:val="center"/>
+              <w:rPr>
+                <w:sz w:val="16"/>
+                <w:szCs w:val="16"/>
+              </w:rPr>
+            </w:pPr>
+            <w:r>
+              <w:rPr>
+                <w:sz w:val="16"/>
+                <w:szCs w:val="16"/>
+              </w:rPr>
+              <w:t>Headlight Control</w:t>
+            </w:r>
+          </w:p>
+        </w:tc>
+        <w:tc>
+          <w:tcPr>
+            <w:tcW w:w="1016" w:type="dxa"/>
+            <w:tcBorders>
+              <w:top w:val="single" w:sz="4" w:space="0" w:color="000000"/>
+              <w:left w:val="single" w:sz="4" w:space="0" w:color="000000"/>
+              <w:bottom w:val="single" w:sz="4" w:space="0" w:color="000000"/>
+            </w:tcBorders>
+            <w:vAlign w:val="bottom"/>
+          </w:tcPr>
+          <w:p>
+            <w:pPr>
+              <w:pStyle w:val="Normal"/>
+              <w:widowControl w:val="false"/>
+              <w:spacing w:lineRule="auto" w:line="180"/>
+              <w:jc w:val="center"/>
+              <w:rPr>
+                <w:sz w:val="16"/>
+                <w:szCs w:val="16"/>
+              </w:rPr>
+            </w:pPr>
+            <w:r>
+              <w:rPr>
+                <w:sz w:val="16"/>
+                <w:szCs w:val="16"/>
+              </w:rPr>
+              <w:t>Step Light</w:t>
+            </w:r>
+          </w:p>
+        </w:tc>
+        <w:tc>
+          <w:tcPr>
+            <w:tcW w:w="1016" w:type="dxa"/>
+            <w:tcBorders>
+              <w:top w:val="single" w:sz="4" w:space="0" w:color="000000"/>
+              <w:left w:val="single" w:sz="4" w:space="0" w:color="000000"/>
+              <w:bottom w:val="single" w:sz="4" w:space="0" w:color="000000"/>
+            </w:tcBorders>
+            <w:vAlign w:val="bottom"/>
+          </w:tcPr>
+          <w:p>
+            <w:pPr>
+              <w:pStyle w:val="Normal"/>
+              <w:widowControl w:val="false"/>
+              <w:spacing w:lineRule="auto" w:line="180"/>
+              <w:jc w:val="center"/>
+              <w:rPr>
+                <w:sz w:val="16"/>
+                <w:szCs w:val="16"/>
+              </w:rPr>
+            </w:pPr>
+            <w:r>
+              <w:rPr>
+                <w:sz w:val="16"/>
+                <w:szCs w:val="16"/>
+              </w:rPr>
+              <w:t>Desk Light</w:t>
+            </w:r>
+          </w:p>
+        </w:tc>
+        <w:tc>
+          <w:tcPr>
+            <w:tcW w:w="1016" w:type="dxa"/>
+            <w:tcBorders>
+              <w:top w:val="single" w:sz="4" w:space="0" w:color="000000"/>
+              <w:left w:val="single" w:sz="4" w:space="0" w:color="000000"/>
+              <w:bottom w:val="single" w:sz="4" w:space="0" w:color="000000"/>
+            </w:tcBorders>
+            <w:vAlign w:val="bottom"/>
+          </w:tcPr>
+          <w:p>
+            <w:pPr>
+              <w:pStyle w:val="Normal"/>
+              <w:widowControl w:val="false"/>
+              <w:spacing w:lineRule="auto" w:line="180"/>
+              <w:jc w:val="center"/>
+              <w:rPr>
+                <w:sz w:val="16"/>
+                <w:szCs w:val="16"/>
+              </w:rPr>
+            </w:pPr>
+            <w:r>
+              <w:rPr>
+                <w:rFonts w:eastAsia="arial" w:ascii="arial" w:hAnsi="arial"/>
+                <w:color w:val="000000"/>
+                <w:sz w:val="16"/>
+                <w:szCs w:val="16"/>
+              </w:rPr>
+              <w:t>Exterior</w:t>
+            </w:r>
+          </w:p>
+          <w:p>
+            <w:pPr>
+              <w:pStyle w:val="Normal"/>
+              <w:widowControl w:val="false"/>
+              <w:spacing w:lineRule="auto" w:line="180"/>
+              <w:jc w:val="center"/>
+              <w:rPr>
+                <w:sz w:val="16"/>
+                <w:szCs w:val="16"/>
+              </w:rPr>
+            </w:pPr>
+            <w:r>
+              <w:rPr>
+                <w:rFonts w:eastAsia="arial" w:ascii="arial" w:hAnsi="arial"/>
+                <w:color w:val="000000"/>
+                <w:sz w:val="16"/>
+                <w:szCs w:val="16"/>
+              </w:rPr>
+              <w:t>Camera</w:t>
+            </w:r>
+          </w:p>
+        </w:tc>
+        <w:tc>
+          <w:tcPr>
+            <w:tcW w:w="1029" w:type="dxa"/>
+            <w:tcBorders>
+              <w:top w:val="single" w:sz="4" w:space="0" w:color="000000"/>
+              <w:left w:val="single" w:sz="4" w:space="0" w:color="000000"/>
+              <w:bottom w:val="single" w:sz="4" w:space="0" w:color="000000"/>
+              <w:right w:val="single" w:sz="4" w:space="0" w:color="000000"/>
+            </w:tcBorders>
+            <w:vAlign w:val="bottom"/>
+          </w:tcPr>
+          <w:p>
+            <w:pPr>
+              <w:pStyle w:val="Normal"/>
+              <w:widowControl w:val="false"/>
+              <w:spacing w:lineRule="auto" w:line="180"/>
+              <w:jc w:val="center"/>
+              <w:rPr>
+                <w:sz w:val="16"/>
+                <w:szCs w:val="16"/>
+              </w:rPr>
+            </w:pPr>
+            <w:r>
+              <w:rPr>
+                <w:rFonts w:eastAsia="arial" w:ascii="arial" w:hAnsi="arial"/>
+                <w:color w:val="000000"/>
+                <w:sz w:val="16"/>
+                <w:szCs w:val="16"/>
+              </w:rPr>
+              <w:t>Prev</w:t>
+            </w:r>
+          </w:p>
+          <w:p>
+            <w:pPr>
+              <w:pStyle w:val="Normal"/>
+              <w:widowControl w:val="false"/>
+              <w:spacing w:lineRule="auto" w:line="180"/>
+              <w:jc w:val="center"/>
+              <w:rPr>
+                <w:sz w:val="16"/>
+                <w:szCs w:val="16"/>
+              </w:rPr>
+            </w:pPr>
+            <w:r>
+              <w:rPr>
+                <w:rFonts w:eastAsia="arial" w:ascii="arial" w:hAnsi="arial"/>
+                <w:color w:val="000000"/>
+                <w:sz w:val="16"/>
+                <w:szCs w:val="16"/>
+              </w:rPr>
+              <w:t>Cab Cam</w:t>
+            </w:r>
+          </w:p>
+        </w:tc>
+      </w:tr>
+    </w:tbl>
+    <w:p>
+      <w:pPr>
+        <w:pStyle w:val="Normal"/>
+        <w:rPr>
+          <w:color w:val="000000"/>
+          <w:sz w:val="16"/>
+          <w:szCs w:val="16"/>
+        </w:rPr>
+      </w:pPr>
+      <w:r>
+        <w:rPr>
+          <w:color w:val="000000"/>
+          <w:sz w:val="16"/>
+          <w:szCs w:val="16"/>
+        </w:rPr>
+      </w:r>
+    </w:p>
     <w:p>
       <w:pPr>
         <w:pStyle w:val="Normal"/>
@@ -36,7 +1183,7 @@
           <w:sz w:val="16"/>
           <w:szCs w:val="16"/>
         </w:rPr>
-        <w:t>GP60M</w:t>
+        <w:t>AC4400CW</w:t>
       </w:r>
       <w:r>
         <w:rPr>
@@ -272,27 +1419,7 @@
                 <w:sz w:val="16"/>
                 <w:szCs w:val="16"/>
               </w:rPr>
-              <w:t>Brake</w:t>
-            </w:r>
-          </w:p>
-          <w:p>
-            <w:pPr>
-              <w:pStyle w:val="Normal"/>
-              <w:widowControl w:val="false"/>
-              <w:jc w:val="center"/>
-              <w:rPr>
-                <w:color w:val="000000"/>
-                <w:sz w:val="16"/>
-                <w:szCs w:val="16"/>
-              </w:rPr>
-            </w:pPr>
-            <w:r>
-              <w:rPr>
-                <w:color w:val="000000"/>
-                <w:sz w:val="16"/>
-                <w:szCs w:val="16"/>
-              </w:rPr>
-              <w:t>Cut-In</w:t>
+              <w:t>Headlight Control Up</w:t>
             </w:r>
           </w:p>
         </w:tc>
@@ -323,7 +1450,7 @@
                 <w:sz w:val="16"/>
                 <w:szCs w:val="16"/>
               </w:rPr>
-              <w:t>MU-2A Lead</w:t>
+              <w:t>Engine Cont. Run</w:t>
             </w:r>
           </w:p>
         </w:tc>
@@ -410,11 +1537,7 @@
               </w:rPr>
             </w:pPr>
             <w:r>
-              <w:rPr>
-                <w:sz w:val="16"/>
-                <w:szCs w:val="16"/>
-              </w:rPr>
-              <w:t>Ditch Light</w:t>
+              <w:rPr/>
             </w:r>
           </w:p>
         </w:tc>
@@ -613,7 +1736,7 @@
           <w:sz w:val="16"/>
           <w:szCs w:val="16"/>
         </w:rPr>
-        <w:t>GP60M</w:t>
+        <w:t>AC4400CW</w:t>
       </w:r>
       <w:r>
         <w:rPr>
@@ -849,27 +1972,7 @@
                 <w:sz w:val="16"/>
                 <w:szCs w:val="16"/>
               </w:rPr>
-              <w:t>Brake</w:t>
-            </w:r>
-          </w:p>
-          <w:p>
-            <w:pPr>
-              <w:pStyle w:val="Normal"/>
-              <w:widowControl w:val="false"/>
-              <w:jc w:val="center"/>
-              <w:rPr>
-                <w:color w:val="000000"/>
-                <w:sz w:val="16"/>
-                <w:szCs w:val="16"/>
-              </w:rPr>
-            </w:pPr>
-            <w:r>
-              <w:rPr>
-                <w:color w:val="000000"/>
-                <w:sz w:val="16"/>
-                <w:szCs w:val="16"/>
-              </w:rPr>
-              <w:t>Cut-Out</w:t>
+              <w:t>Headlight Control Dw</w:t>
             </w:r>
           </w:p>
         </w:tc>
@@ -901,7 +2004,7 @@
                 <w:sz w:val="16"/>
                 <w:szCs w:val="16"/>
               </w:rPr>
-              <w:t>MU-2A Trail</w:t>
+              <w:t>Engine Cont. Jog</w:t>
             </w:r>
           </w:p>
         </w:tc>
@@ -995,7 +2098,7 @@
                 <w:sz w:val="16"/>
                 <w:szCs w:val="16"/>
               </w:rPr>
-              <w:t>Headlight Control</w:t>
+              <w:t>Crosswalk Light</w:t>
             </w:r>
           </w:p>
         </w:tc>
@@ -1055,7 +2158,7 @@
                 <w:sz w:val="16"/>
                 <w:szCs w:val="16"/>
               </w:rPr>
-              <w:t>Desk Light</w:t>
+              <w:t>Number Light</w:t>
             </w:r>
           </w:p>
         </w:tc>
@@ -1179,7 +2282,6 @@
       </w:pPr>
       <w:r>
         <w:rPr>
-          <w:rFonts w:eastAsia="arial" w:ascii="arial" w:hAnsi="arial"/>
           <w:color w:val="000000"/>
           <w:sz w:val="16"/>
           <w:szCs w:val="16"/>
@@ -2207,12 +3309,12 @@
       <w:rFonts w:ascii="Symbol" w:hAnsi="Symbol" w:cs="Symbol"/>
     </w:rPr>
   </w:style>
-  <w:style w:type="character" w:styleId="Style5" w:customStyle="1">
-    <w:name w:val="번호 매기기 기호"/>
-    <w:qFormat/>
-    <w:rPr/>
-  </w:style>
-  <w:style w:type="paragraph" w:styleId="Style6">
+  <w:style w:type="character" w:styleId="user" w:customStyle="1">
+    <w:name w:val="번호 매기기 기호 (user)"/>
+    <w:qFormat/>
+    <w:rPr/>
+  </w:style>
+  <w:style w:type="paragraph" w:styleId="Style5">
     <w:name w:val="제목"/>
     <w:basedOn w:val="Normal"/>
     <w:next w:val="BodyText"/>
@@ -2222,7 +3324,7 @@
       <w:spacing w:before="240" w:after="120"/>
     </w:pPr>
     <w:rPr>
-      <w:rFonts w:ascii="Liberation Sans" w:hAnsi="Liberation Sans" w:eastAsia="나눔고딕" w:cs="Arial"/>
+      <w:rFonts w:ascii="Liberation Sans" w:hAnsi="Liberation Sans" w:eastAsia="Noto Sans CJK KR" w:cs="Lohit Devanagari"/>
       <w:sz w:val="28"/>
       <w:szCs w:val="28"/>
     </w:rPr>
@@ -2259,8 +3361,34 @@
       <w:szCs w:val="24"/>
     </w:rPr>
   </w:style>
-  <w:style w:type="paragraph" w:styleId="Style7">
+  <w:style w:type="paragraph" w:styleId="Style6" w:customStyle="1">
     <w:name w:val="색인"/>
+    <w:basedOn w:val="Normal"/>
+    <w:qFormat/>
+    <w:pPr>
+      <w:suppressLineNumbers/>
+    </w:pPr>
+    <w:rPr>
+      <w:rFonts w:cs="Lohit Devanagari"/>
+    </w:rPr>
+  </w:style>
+  <w:style w:type="paragraph" w:styleId="user1">
+    <w:name w:val="제목 (user)"/>
+    <w:basedOn w:val="Normal"/>
+    <w:next w:val="BodyText"/>
+    <w:qFormat/>
+    <w:pPr>
+      <w:keepNext w:val="true"/>
+      <w:spacing w:before="240" w:after="120"/>
+    </w:pPr>
+    <w:rPr>
+      <w:rFonts w:ascii="Liberation Sans" w:hAnsi="Liberation Sans" w:eastAsia="나눔고딕" w:cs="Arial"/>
+      <w:sz w:val="28"/>
+      <w:szCs w:val="28"/>
+    </w:rPr>
+  </w:style>
+  <w:style w:type="paragraph" w:styleId="user2">
+    <w:name w:val="색인 (user)"/>
     <w:basedOn w:val="Normal"/>
     <w:qFormat/>
     <w:pPr>
@@ -2269,32 +3397,6 @@
     <w:rPr>
       <w:rFonts w:cs="Arial"/>
       <w:sz w:val="24"/>
-    </w:rPr>
-  </w:style>
-  <w:style w:type="paragraph" w:styleId="user">
-    <w:name w:val="제목 (user)"/>
-    <w:basedOn w:val="Normal"/>
-    <w:next w:val="BodyText"/>
-    <w:qFormat/>
-    <w:pPr>
-      <w:keepNext w:val="true"/>
-      <w:spacing w:before="240" w:after="120"/>
-    </w:pPr>
-    <w:rPr>
-      <w:rFonts w:ascii="Liberation Sans" w:hAnsi="Liberation Sans" w:eastAsia="Noto Sans CJK KR" w:cs="Lohit Devanagari"/>
-      <w:sz w:val="28"/>
-      <w:szCs w:val="28"/>
-    </w:rPr>
-  </w:style>
-  <w:style w:type="paragraph" w:styleId="user1" w:customStyle="1">
-    <w:name w:val="색인 (user)"/>
-    <w:basedOn w:val="Normal"/>
-    <w:qFormat/>
-    <w:pPr>
-      <w:suppressLineNumbers/>
-    </w:pPr>
-    <w:rPr>
-      <w:rFonts w:cs="Lohit Devanagari"/>
     </w:rPr>
   </w:style>
   <w:style w:type="paragraph" w:styleId="Title">
@@ -2976,8 +4078,8 @@
       <w:szCs w:val="24"/>
     </w:rPr>
   </w:style>
-  <w:style w:type="paragraph" w:styleId="user2" w:customStyle="1">
-    <w:name w:val="표 내용 (user)"/>
+  <w:style w:type="paragraph" w:styleId="Style7" w:customStyle="1">
+    <w:name w:val="표 내용"/>
     <w:basedOn w:val="Normal"/>
     <w:qFormat/>
     <w:pPr>
@@ -2985,9 +4087,9 @@
     </w:pPr>
     <w:rPr/>
   </w:style>
-  <w:style w:type="paragraph" w:styleId="user3" w:customStyle="1">
-    <w:name w:val="표제목 (user)"/>
-    <w:basedOn w:val="user2"/>
+  <w:style w:type="paragraph" w:styleId="Style8" w:customStyle="1">
+    <w:name w:val="표제목"/>
+    <w:basedOn w:val="Style7"/>
     <w:qFormat/>
     <w:pPr>
       <w:jc w:val="center"/>
@@ -2997,8 +4099,8 @@
       <w:bCs/>
     </w:rPr>
   </w:style>
-  <w:style w:type="paragraph" w:styleId="Style8">
-    <w:name w:val="표 내용"/>
+  <w:style w:type="paragraph" w:styleId="user3">
+    <w:name w:val="표 내용 (user)"/>
     <w:basedOn w:val="Normal"/>
     <w:qFormat/>
     <w:pPr>
@@ -3007,9 +4109,9 @@
     </w:pPr>
     <w:rPr/>
   </w:style>
-  <w:style w:type="paragraph" w:styleId="Style9">
-    <w:name w:val="표제목"/>
-    <w:basedOn w:val="Style8"/>
+  <w:style w:type="paragraph" w:styleId="user4">
+    <w:name w:val="표제목 (user)"/>
+    <w:basedOn w:val="user3"/>
     <w:qFormat/>
     <w:pPr>
       <w:suppressLineNumbers/>

</xml_diff>

<commit_message>
Add ES44C4 and fix AC4400CW headlight
</commit_message>
<xml_diff>
--- a/raildriver-USA-Remapped.docx
+++ b/raildriver-USA-Remapped.docx
@@ -1174,6 +1174,1112 @@
           <w:sz w:val="16"/>
           <w:szCs w:val="16"/>
         </w:rPr>
+        <w:t xml:space="preserve">    AC4400CW-1</w:t>
+      </w:r>
+    </w:p>
+    <w:tbl>
+      <w:tblPr>
+        <w:tblW w:w="14248" w:type="dxa"/>
+        <w:jc w:val="left"/>
+        <w:tblInd w:w="-5" w:type="dxa"/>
+        <w:tblLayout w:type="fixed"/>
+        <w:tblCellMar>
+          <w:top w:w="0" w:type="dxa"/>
+          <w:left w:w="108" w:type="dxa"/>
+          <w:bottom w:w="0" w:type="dxa"/>
+          <w:right w:w="108" w:type="dxa"/>
+        </w:tblCellMar>
+        <w:tblLook w:firstRow="1" w:noVBand="1" w:lastRow="0" w:firstColumn="1" w:lastColumn="0" w:noHBand="0" w:val="04a0"/>
+      </w:tblPr>
+      <w:tblGrid>
+        <w:gridCol w:w="1017"/>
+        <w:gridCol w:w="1019"/>
+        <w:gridCol w:w="1014"/>
+        <w:gridCol w:w="1016"/>
+        <w:gridCol w:w="1020"/>
+        <w:gridCol w:w="1016"/>
+        <w:gridCol w:w="1016"/>
+        <w:gridCol w:w="1017"/>
+        <w:gridCol w:w="1016"/>
+        <w:gridCol w:w="1020"/>
+        <w:gridCol w:w="1016"/>
+        <w:gridCol w:w="1016"/>
+        <w:gridCol w:w="1016"/>
+        <w:gridCol w:w="1029"/>
+      </w:tblGrid>
+      <w:tr>
+        <w:trPr>
+          <w:trHeight w:val="440" w:hRule="exact"/>
+          <w:cantSplit w:val="true"/>
+        </w:trPr>
+        <w:tc>
+          <w:tcPr>
+            <w:tcW w:w="1017" w:type="dxa"/>
+            <w:tcBorders>
+              <w:top w:val="single" w:sz="4" w:space="0" w:color="000000"/>
+              <w:left w:val="single" w:sz="4" w:space="0" w:color="000000"/>
+              <w:bottom w:val="single" w:sz="4" w:space="0" w:color="000000"/>
+            </w:tcBorders>
+            <w:vAlign w:val="bottom"/>
+          </w:tcPr>
+          <w:p>
+            <w:pPr>
+              <w:pStyle w:val="Normal"/>
+              <w:widowControl w:val="false"/>
+              <w:spacing w:lineRule="auto" w:line="180" w:before="0" w:after="60"/>
+              <w:jc w:val="center"/>
+              <w:rPr>
+                <w:color w:val="000000"/>
+                <w:sz w:val="16"/>
+                <w:szCs w:val="16"/>
+              </w:rPr>
+            </w:pPr>
+            <w:r>
+              <w:rPr>
+                <w:rFonts w:eastAsia="arial" w:ascii="arial" w:hAnsi="arial"/>
+                <w:b/>
+                <w:color w:val="000000"/>
+                <w:sz w:val="16"/>
+                <w:szCs w:val="16"/>
+              </w:rPr>
+              <w:t>Pause</w:t>
+            </w:r>
+          </w:p>
+        </w:tc>
+        <w:tc>
+          <w:tcPr>
+            <w:tcW w:w="1019" w:type="dxa"/>
+            <w:tcBorders>
+              <w:top w:val="single" w:sz="4" w:space="0" w:color="000000"/>
+              <w:left w:val="single" w:sz="4" w:space="0" w:color="000000"/>
+              <w:bottom w:val="single" w:sz="4" w:space="0" w:color="000000"/>
+            </w:tcBorders>
+            <w:vAlign w:val="bottom"/>
+          </w:tcPr>
+          <w:p>
+            <w:pPr>
+              <w:pStyle w:val="Normal"/>
+              <w:widowControl w:val="false"/>
+              <w:spacing w:lineRule="auto" w:line="180"/>
+              <w:jc w:val="center"/>
+              <w:rPr>
+                <w:color w:val="000000"/>
+                <w:sz w:val="16"/>
+                <w:szCs w:val="16"/>
+              </w:rPr>
+            </w:pPr>
+            <w:r>
+              <w:rPr>
+                <w:color w:val="000000"/>
+                <w:sz w:val="16"/>
+                <w:szCs w:val="16"/>
+              </w:rPr>
+            </w:r>
+          </w:p>
+        </w:tc>
+        <w:tc>
+          <w:tcPr>
+            <w:tcW w:w="1014" w:type="dxa"/>
+            <w:tcBorders>
+              <w:top w:val="single" w:sz="4" w:space="0" w:color="000000"/>
+              <w:left w:val="single" w:sz="4" w:space="0" w:color="000000"/>
+              <w:bottom w:val="single" w:sz="4" w:space="0" w:color="000000"/>
+            </w:tcBorders>
+            <w:vAlign w:val="bottom"/>
+          </w:tcPr>
+          <w:p>
+            <w:pPr>
+              <w:pStyle w:val="Normal"/>
+              <w:widowControl w:val="false"/>
+              <w:spacing w:lineRule="auto" w:line="180"/>
+              <w:jc w:val="center"/>
+              <w:rPr>
+                <w:color w:val="000000"/>
+                <w:sz w:val="16"/>
+                <w:szCs w:val="16"/>
+              </w:rPr>
+            </w:pPr>
+            <w:r>
+              <w:rPr>
+                <w:rFonts w:eastAsia="arial" w:ascii="arial" w:hAnsi="arial"/>
+                <w:color w:val="000000"/>
+                <w:sz w:val="16"/>
+                <w:szCs w:val="16"/>
+              </w:rPr>
+              <w:t>Engine Start</w:t>
+            </w:r>
+          </w:p>
+        </w:tc>
+        <w:tc>
+          <w:tcPr>
+            <w:tcW w:w="1016" w:type="dxa"/>
+            <w:tcBorders>
+              <w:top w:val="single" w:sz="4" w:space="0" w:color="000000"/>
+              <w:left w:val="single" w:sz="4" w:space="0" w:color="000000"/>
+              <w:bottom w:val="single" w:sz="4" w:space="0" w:color="000000"/>
+            </w:tcBorders>
+            <w:vAlign w:val="bottom"/>
+          </w:tcPr>
+          <w:p>
+            <w:pPr>
+              <w:pStyle w:val="Normal"/>
+              <w:widowControl w:val="false"/>
+              <w:spacing w:lineRule="auto" w:line="180"/>
+              <w:jc w:val="center"/>
+              <w:rPr>
+                <w:color w:val="000000"/>
+                <w:sz w:val="16"/>
+                <w:szCs w:val="16"/>
+              </w:rPr>
+            </w:pPr>
+            <w:r>
+              <w:rPr>
+                <w:color w:val="000000"/>
+                <w:sz w:val="16"/>
+                <w:szCs w:val="16"/>
+              </w:rPr>
+              <w:t>Engine Run</w:t>
+            </w:r>
+          </w:p>
+        </w:tc>
+        <w:tc>
+          <w:tcPr>
+            <w:tcW w:w="1020" w:type="dxa"/>
+            <w:tcBorders>
+              <w:top w:val="single" w:sz="4" w:space="0" w:color="000000"/>
+              <w:left w:val="single" w:sz="4" w:space="0" w:color="000000"/>
+              <w:bottom w:val="single" w:sz="4" w:space="0" w:color="000000"/>
+            </w:tcBorders>
+            <w:vAlign w:val="bottom"/>
+          </w:tcPr>
+          <w:p>
+            <w:pPr>
+              <w:pStyle w:val="Normal"/>
+              <w:widowControl w:val="false"/>
+              <w:spacing w:lineRule="auto" w:line="180"/>
+              <w:jc w:val="center"/>
+              <w:rPr>
+                <w:color w:val="000000"/>
+                <w:sz w:val="16"/>
+                <w:szCs w:val="16"/>
+              </w:rPr>
+            </w:pPr>
+            <w:r>
+              <w:rPr>
+                <w:color w:val="000000"/>
+                <w:sz w:val="16"/>
+                <w:szCs w:val="16"/>
+              </w:rPr>
+              <w:t>Generator Field</w:t>
+            </w:r>
+          </w:p>
+        </w:tc>
+        <w:tc>
+          <w:tcPr>
+            <w:tcW w:w="1016" w:type="dxa"/>
+            <w:tcBorders>
+              <w:top w:val="single" w:sz="4" w:space="0" w:color="000000"/>
+              <w:left w:val="single" w:sz="4" w:space="0" w:color="000000"/>
+              <w:bottom w:val="single" w:sz="4" w:space="0" w:color="000000"/>
+            </w:tcBorders>
+            <w:vAlign w:val="bottom"/>
+          </w:tcPr>
+          <w:p>
+            <w:pPr>
+              <w:pStyle w:val="Normal"/>
+              <w:widowControl w:val="false"/>
+              <w:jc w:val="center"/>
+              <w:rPr>
+                <w:color w:val="000000"/>
+                <w:sz w:val="16"/>
+                <w:szCs w:val="16"/>
+              </w:rPr>
+            </w:pPr>
+            <w:r>
+              <w:rPr>
+                <w:color w:val="000000"/>
+                <w:sz w:val="16"/>
+                <w:szCs w:val="16"/>
+              </w:rPr>
+              <w:t>Headlight Control Up</w:t>
+            </w:r>
+          </w:p>
+        </w:tc>
+        <w:tc>
+          <w:tcPr>
+            <w:tcW w:w="1016" w:type="dxa"/>
+            <w:tcBorders>
+              <w:top w:val="single" w:sz="4" w:space="0" w:color="000000"/>
+              <w:left w:val="single" w:sz="4" w:space="0" w:color="000000"/>
+              <w:bottom w:val="single" w:sz="4" w:space="0" w:color="000000"/>
+            </w:tcBorders>
+            <w:vAlign w:val="bottom"/>
+          </w:tcPr>
+          <w:p>
+            <w:pPr>
+              <w:pStyle w:val="Normal"/>
+              <w:widowControl w:val="false"/>
+              <w:jc w:val="center"/>
+              <w:rPr>
+                <w:color w:val="000000"/>
+                <w:sz w:val="16"/>
+                <w:szCs w:val="16"/>
+              </w:rPr>
+            </w:pPr>
+            <w:r>
+              <w:rPr>
+                <w:color w:val="000000"/>
+                <w:sz w:val="16"/>
+                <w:szCs w:val="16"/>
+              </w:rPr>
+              <w:t>Engine Cont. Run</w:t>
+            </w:r>
+          </w:p>
+        </w:tc>
+        <w:tc>
+          <w:tcPr>
+            <w:tcW w:w="1017" w:type="dxa"/>
+            <w:tcBorders>
+              <w:top w:val="single" w:sz="4" w:space="0" w:color="000000"/>
+              <w:left w:val="single" w:sz="4" w:space="0" w:color="000000"/>
+              <w:bottom w:val="single" w:sz="4" w:space="0" w:color="000000"/>
+            </w:tcBorders>
+            <w:vAlign w:val="bottom"/>
+          </w:tcPr>
+          <w:p>
+            <w:pPr>
+              <w:pStyle w:val="Normal"/>
+              <w:widowControl w:val="false"/>
+              <w:jc w:val="center"/>
+              <w:rPr>
+                <w:color w:val="000000"/>
+                <w:sz w:val="16"/>
+                <w:szCs w:val="16"/>
+              </w:rPr>
+            </w:pPr>
+            <w:r>
+              <w:rPr>
+                <w:rFonts w:eastAsia="arial" w:ascii="arial" w:hAnsi="arial"/>
+                <w:color w:val="000000"/>
+                <w:sz w:val="16"/>
+                <w:szCs w:val="16"/>
+              </w:rPr>
+              <w:t>Banking COMM</w:t>
+            </w:r>
+          </w:p>
+        </w:tc>
+        <w:tc>
+          <w:tcPr>
+            <w:tcW w:w="1016" w:type="dxa"/>
+            <w:tcBorders>
+              <w:top w:val="single" w:sz="4" w:space="0" w:color="000000"/>
+              <w:left w:val="single" w:sz="4" w:space="0" w:color="000000"/>
+              <w:bottom w:val="single" w:sz="4" w:space="0" w:color="000000"/>
+            </w:tcBorders>
+            <w:vAlign w:val="bottom"/>
+          </w:tcPr>
+          <w:p>
+            <w:pPr>
+              <w:pStyle w:val="Normal"/>
+              <w:widowControl w:val="false"/>
+              <w:jc w:val="center"/>
+              <w:rPr>
+                <w:sz w:val="16"/>
+                <w:szCs w:val="16"/>
+              </w:rPr>
+            </w:pPr>
+            <w:r>
+              <w:rPr>
+                <w:sz w:val="16"/>
+                <w:szCs w:val="16"/>
+              </w:rPr>
+              <w:t>Rear HL Up</w:t>
+            </w:r>
+          </w:p>
+        </w:tc>
+        <w:tc>
+          <w:tcPr>
+            <w:tcW w:w="1020" w:type="dxa"/>
+            <w:tcBorders>
+              <w:top w:val="single" w:sz="4" w:space="0" w:color="000000"/>
+              <w:left w:val="single" w:sz="4" w:space="0" w:color="000000"/>
+              <w:bottom w:val="single" w:sz="4" w:space="0" w:color="000000"/>
+            </w:tcBorders>
+            <w:vAlign w:val="bottom"/>
+          </w:tcPr>
+          <w:p>
+            <w:pPr>
+              <w:pStyle w:val="Normal"/>
+              <w:widowControl w:val="false"/>
+              <w:spacing w:lineRule="auto" w:line="180"/>
+              <w:jc w:val="center"/>
+              <w:rPr>
+                <w:sz w:val="16"/>
+                <w:szCs w:val="16"/>
+              </w:rPr>
+            </w:pPr>
+            <w:r>
+              <w:rPr>
+                <w:sz w:val="16"/>
+                <w:szCs w:val="16"/>
+              </w:rPr>
+            </w:r>
+          </w:p>
+        </w:tc>
+        <w:tc>
+          <w:tcPr>
+            <w:tcW w:w="1016" w:type="dxa"/>
+            <w:tcBorders>
+              <w:top w:val="single" w:sz="4" w:space="0" w:color="000000"/>
+              <w:left w:val="single" w:sz="4" w:space="0" w:color="000000"/>
+              <w:bottom w:val="single" w:sz="4" w:space="0" w:color="000000"/>
+            </w:tcBorders>
+            <w:vAlign w:val="bottom"/>
+          </w:tcPr>
+          <w:p>
+            <w:pPr>
+              <w:pStyle w:val="Normal"/>
+              <w:widowControl w:val="false"/>
+              <w:spacing w:lineRule="auto" w:line="180"/>
+              <w:jc w:val="center"/>
+              <w:rPr>
+                <w:sz w:val="16"/>
+                <w:szCs w:val="16"/>
+              </w:rPr>
+            </w:pPr>
+            <w:r>
+              <w:rPr>
+                <w:rFonts w:eastAsia="arial" w:ascii="arial" w:hAnsi="arial"/>
+                <w:color w:val="000000"/>
+                <w:sz w:val="16"/>
+                <w:szCs w:val="16"/>
+              </w:rPr>
+              <w:t>Gauge Light</w:t>
+            </w:r>
+          </w:p>
+        </w:tc>
+        <w:tc>
+          <w:tcPr>
+            <w:tcW w:w="1016" w:type="dxa"/>
+            <w:tcBorders>
+              <w:top w:val="single" w:sz="4" w:space="0" w:color="000000"/>
+              <w:left w:val="single" w:sz="4" w:space="0" w:color="000000"/>
+              <w:bottom w:val="single" w:sz="4" w:space="0" w:color="000000"/>
+            </w:tcBorders>
+            <w:vAlign w:val="bottom"/>
+          </w:tcPr>
+          <w:p>
+            <w:pPr>
+              <w:pStyle w:val="Normal"/>
+              <w:widowControl w:val="false"/>
+              <w:spacing w:lineRule="auto" w:line="180"/>
+              <w:jc w:val="center"/>
+              <w:rPr>
+                <w:sz w:val="16"/>
+                <w:szCs w:val="16"/>
+              </w:rPr>
+            </w:pPr>
+            <w:r>
+              <w:rPr>
+                <w:sz w:val="16"/>
+                <w:szCs w:val="16"/>
+              </w:rPr>
+              <w:t>Cab Light</w:t>
+            </w:r>
+          </w:p>
+        </w:tc>
+        <w:tc>
+          <w:tcPr>
+            <w:tcW w:w="1016" w:type="dxa"/>
+            <w:tcBorders>
+              <w:top w:val="single" w:sz="4" w:space="0" w:color="000000"/>
+              <w:left w:val="single" w:sz="4" w:space="0" w:color="000000"/>
+              <w:bottom w:val="single" w:sz="4" w:space="0" w:color="000000"/>
+            </w:tcBorders>
+            <w:vAlign w:val="bottom"/>
+          </w:tcPr>
+          <w:p>
+            <w:pPr>
+              <w:pStyle w:val="Normal"/>
+              <w:widowControl w:val="false"/>
+              <w:spacing w:lineRule="auto" w:line="180"/>
+              <w:jc w:val="center"/>
+              <w:rPr>
+                <w:sz w:val="16"/>
+                <w:szCs w:val="16"/>
+              </w:rPr>
+            </w:pPr>
+            <w:r>
+              <w:rPr>
+                <w:rFonts w:eastAsia="arial" w:ascii="arial" w:hAnsi="arial"/>
+                <w:color w:val="000000"/>
+                <w:sz w:val="16"/>
+                <w:szCs w:val="16"/>
+              </w:rPr>
+              <w:t>1-Person</w:t>
+            </w:r>
+          </w:p>
+        </w:tc>
+        <w:tc>
+          <w:tcPr>
+            <w:tcW w:w="1029" w:type="dxa"/>
+            <w:tcBorders>
+              <w:top w:val="single" w:sz="4" w:space="0" w:color="000000"/>
+              <w:left w:val="single" w:sz="4" w:space="0" w:color="000000"/>
+              <w:bottom w:val="single" w:sz="4" w:space="0" w:color="000000"/>
+              <w:right w:val="single" w:sz="4" w:space="0" w:color="000000"/>
+            </w:tcBorders>
+            <w:vAlign w:val="bottom"/>
+          </w:tcPr>
+          <w:p>
+            <w:pPr>
+              <w:pStyle w:val="Normal"/>
+              <w:widowControl w:val="false"/>
+              <w:spacing w:lineRule="auto" w:line="180"/>
+              <w:jc w:val="center"/>
+              <w:rPr>
+                <w:sz w:val="16"/>
+                <w:szCs w:val="16"/>
+              </w:rPr>
+            </w:pPr>
+            <w:r>
+              <w:rPr>
+                <w:rFonts w:eastAsia="arial" w:ascii="arial" w:hAnsi="arial"/>
+                <w:color w:val="000000"/>
+                <w:sz w:val="16"/>
+                <w:szCs w:val="16"/>
+              </w:rPr>
+              <w:t>Next</w:t>
+            </w:r>
+          </w:p>
+          <w:p>
+            <w:pPr>
+              <w:pStyle w:val="Normal"/>
+              <w:widowControl w:val="false"/>
+              <w:spacing w:lineRule="auto" w:line="180"/>
+              <w:jc w:val="center"/>
+              <w:rPr>
+                <w:sz w:val="16"/>
+                <w:szCs w:val="16"/>
+              </w:rPr>
+            </w:pPr>
+            <w:r>
+              <w:rPr>
+                <w:rFonts w:eastAsia="arial" w:ascii="arial" w:hAnsi="arial"/>
+                <w:color w:val="000000"/>
+                <w:sz w:val="16"/>
+                <w:szCs w:val="16"/>
+              </w:rPr>
+              <w:t>Cab Cam</w:t>
+            </w:r>
+          </w:p>
+        </w:tc>
+      </w:tr>
+    </w:tbl>
+    <w:p>
+      <w:pPr>
+        <w:pStyle w:val="Normal"/>
+        <w:rPr>
+          <w:rFonts w:ascii="arial" w:hAnsi="arial" w:eastAsia="arial"/>
+          <w:color w:val="000000"/>
+          <w:sz w:val="16"/>
+          <w:szCs w:val="16"/>
+        </w:rPr>
+      </w:pPr>
+      <w:r>
+        <w:rPr>
+          <w:rFonts w:eastAsia="arial" w:ascii="arial" w:hAnsi="arial"/>
+          <w:color w:val="000000"/>
+          <w:sz w:val="16"/>
+          <w:szCs w:val="16"/>
+        </w:rPr>
+      </w:r>
+    </w:p>
+    <w:p>
+      <w:pPr>
+        <w:pStyle w:val="Normal"/>
+        <w:rPr>
+          <w:color w:val="000000"/>
+          <w:sz w:val="16"/>
+          <w:szCs w:val="16"/>
+        </w:rPr>
+      </w:pPr>
+      <w:r>
+        <w:rPr>
+          <w:rFonts w:eastAsia="arial" w:ascii="arial" w:hAnsi="arial"/>
+          <w:color w:val="000000"/>
+          <w:sz w:val="16"/>
+          <w:szCs w:val="16"/>
+        </w:rPr>
+        <w:tab/>
+        <w:t xml:space="preserve">           AC4400CW-2</w:t>
+      </w:r>
+    </w:p>
+    <w:tbl>
+      <w:tblPr>
+        <w:tblW w:w="14248" w:type="dxa"/>
+        <w:jc w:val="left"/>
+        <w:tblInd w:w="-5" w:type="dxa"/>
+        <w:tblLayout w:type="fixed"/>
+        <w:tblCellMar>
+          <w:top w:w="0" w:type="dxa"/>
+          <w:left w:w="108" w:type="dxa"/>
+          <w:bottom w:w="0" w:type="dxa"/>
+          <w:right w:w="108" w:type="dxa"/>
+        </w:tblCellMar>
+        <w:tblLook w:firstRow="1" w:noVBand="1" w:lastRow="0" w:firstColumn="1" w:lastColumn="0" w:noHBand="0" w:val="04a0"/>
+      </w:tblPr>
+      <w:tblGrid>
+        <w:gridCol w:w="1017"/>
+        <w:gridCol w:w="1019"/>
+        <w:gridCol w:w="1014"/>
+        <w:gridCol w:w="1016"/>
+        <w:gridCol w:w="1020"/>
+        <w:gridCol w:w="1016"/>
+        <w:gridCol w:w="1016"/>
+        <w:gridCol w:w="1017"/>
+        <w:gridCol w:w="1016"/>
+        <w:gridCol w:w="1020"/>
+        <w:gridCol w:w="1016"/>
+        <w:gridCol w:w="1016"/>
+        <w:gridCol w:w="1016"/>
+        <w:gridCol w:w="1029"/>
+      </w:tblGrid>
+      <w:tr>
+        <w:trPr>
+          <w:trHeight w:val="440" w:hRule="exact"/>
+          <w:cantSplit w:val="true"/>
+        </w:trPr>
+        <w:tc>
+          <w:tcPr>
+            <w:tcW w:w="1017" w:type="dxa"/>
+            <w:tcBorders>
+              <w:top w:val="single" w:sz="4" w:space="0" w:color="000000"/>
+              <w:left w:val="single" w:sz="4" w:space="0" w:color="000000"/>
+              <w:bottom w:val="single" w:sz="4" w:space="0" w:color="000000"/>
+            </w:tcBorders>
+            <w:vAlign w:val="bottom"/>
+          </w:tcPr>
+          <w:p>
+            <w:pPr>
+              <w:pStyle w:val="Normal"/>
+              <w:widowControl w:val="false"/>
+              <w:spacing w:lineRule="auto" w:line="180" w:before="0" w:after="60"/>
+              <w:jc w:val="center"/>
+              <w:rPr>
+                <w:b/>
+                <w:bCs/>
+              </w:rPr>
+            </w:pPr>
+            <w:r>
+              <w:rPr>
+                <w:b/>
+                <w:bCs/>
+                <w:color w:val="000000"/>
+                <w:sz w:val="16"/>
+                <w:szCs w:val="16"/>
+              </w:rPr>
+              <w:t>HUD</w:t>
+            </w:r>
+          </w:p>
+        </w:tc>
+        <w:tc>
+          <w:tcPr>
+            <w:tcW w:w="1019" w:type="dxa"/>
+            <w:tcBorders>
+              <w:top w:val="single" w:sz="4" w:space="0" w:color="000000"/>
+              <w:left w:val="single" w:sz="4" w:space="0" w:color="000000"/>
+              <w:bottom w:val="single" w:sz="4" w:space="0" w:color="000000"/>
+            </w:tcBorders>
+            <w:vAlign w:val="bottom"/>
+          </w:tcPr>
+          <w:p>
+            <w:pPr>
+              <w:pStyle w:val="Normal"/>
+              <w:widowControl w:val="false"/>
+              <w:spacing w:lineRule="auto" w:line="180"/>
+              <w:jc w:val="center"/>
+              <w:rPr>
+                <w:color w:val="000000"/>
+                <w:sz w:val="16"/>
+                <w:szCs w:val="16"/>
+              </w:rPr>
+            </w:pPr>
+            <w:r>
+              <w:rPr>
+                <w:color w:val="000000"/>
+                <w:sz w:val="16"/>
+                <w:szCs w:val="16"/>
+              </w:rPr>
+              <w:t>Schedule</w:t>
+            </w:r>
+          </w:p>
+        </w:tc>
+        <w:tc>
+          <w:tcPr>
+            <w:tcW w:w="1014" w:type="dxa"/>
+            <w:tcBorders>
+              <w:top w:val="single" w:sz="4" w:space="0" w:color="000000"/>
+              <w:left w:val="single" w:sz="4" w:space="0" w:color="000000"/>
+              <w:bottom w:val="single" w:sz="4" w:space="0" w:color="000000"/>
+            </w:tcBorders>
+            <w:vAlign w:val="bottom"/>
+          </w:tcPr>
+          <w:p>
+            <w:pPr>
+              <w:pStyle w:val="Normal"/>
+              <w:widowControl w:val="false"/>
+              <w:spacing w:lineRule="auto" w:line="180"/>
+              <w:jc w:val="center"/>
+              <w:rPr>
+                <w:color w:val="000000"/>
+                <w:sz w:val="16"/>
+                <w:szCs w:val="16"/>
+              </w:rPr>
+            </w:pPr>
+            <w:r>
+              <w:rPr>
+                <w:rFonts w:eastAsia="arial" w:ascii="arial" w:hAnsi="arial"/>
+                <w:color w:val="000000"/>
+                <w:sz w:val="16"/>
+                <w:szCs w:val="16"/>
+              </w:rPr>
+              <w:t>Engine Stop</w:t>
+            </w:r>
+          </w:p>
+        </w:tc>
+        <w:tc>
+          <w:tcPr>
+            <w:tcW w:w="1016" w:type="dxa"/>
+            <w:tcBorders>
+              <w:top w:val="single" w:sz="4" w:space="0" w:color="000000"/>
+              <w:left w:val="single" w:sz="4" w:space="0" w:color="000000"/>
+              <w:bottom w:val="single" w:sz="4" w:space="0" w:color="000000"/>
+            </w:tcBorders>
+            <w:vAlign w:val="bottom"/>
+          </w:tcPr>
+          <w:p>
+            <w:pPr>
+              <w:pStyle w:val="Normal"/>
+              <w:widowControl w:val="false"/>
+              <w:spacing w:lineRule="auto" w:line="180"/>
+              <w:jc w:val="center"/>
+              <w:rPr>
+                <w:color w:val="000000"/>
+                <w:sz w:val="16"/>
+                <w:szCs w:val="16"/>
+              </w:rPr>
+            </w:pPr>
+            <w:r>
+              <w:rPr>
+                <w:color w:val="000000"/>
+                <w:sz w:val="16"/>
+                <w:szCs w:val="16"/>
+              </w:rPr>
+              <w:t>Warning Devices</w:t>
+            </w:r>
+          </w:p>
+        </w:tc>
+        <w:tc>
+          <w:tcPr>
+            <w:tcW w:w="1020" w:type="dxa"/>
+            <w:tcBorders>
+              <w:top w:val="single" w:sz="4" w:space="0" w:color="000000"/>
+              <w:left w:val="single" w:sz="4" w:space="0" w:color="000000"/>
+              <w:bottom w:val="single" w:sz="4" w:space="0" w:color="000000"/>
+            </w:tcBorders>
+            <w:vAlign w:val="bottom"/>
+          </w:tcPr>
+          <w:p>
+            <w:pPr>
+              <w:pStyle w:val="Normal"/>
+              <w:widowControl w:val="false"/>
+              <w:spacing w:lineRule="auto" w:line="180"/>
+              <w:jc w:val="center"/>
+              <w:rPr>
+                <w:color w:val="000000"/>
+                <w:sz w:val="16"/>
+                <w:szCs w:val="16"/>
+              </w:rPr>
+            </w:pPr>
+            <w:r>
+              <w:rPr>
+                <w:color w:val="000000"/>
+                <w:sz w:val="16"/>
+                <w:szCs w:val="16"/>
+              </w:rPr>
+              <w:t>Control Switch</w:t>
+            </w:r>
+          </w:p>
+        </w:tc>
+        <w:tc>
+          <w:tcPr>
+            <w:tcW w:w="1016" w:type="dxa"/>
+            <w:tcBorders>
+              <w:top w:val="single" w:sz="4" w:space="0" w:color="000000"/>
+              <w:left w:val="single" w:sz="4" w:space="0" w:color="000000"/>
+              <w:bottom w:val="single" w:sz="4" w:space="0" w:color="000000"/>
+            </w:tcBorders>
+            <w:vAlign w:val="bottom"/>
+          </w:tcPr>
+          <w:p>
+            <w:pPr>
+              <w:pStyle w:val="Normal"/>
+              <w:widowControl w:val="false"/>
+              <w:jc w:val="center"/>
+              <w:rPr>
+                <w:color w:val="000000"/>
+                <w:sz w:val="16"/>
+                <w:szCs w:val="16"/>
+              </w:rPr>
+            </w:pPr>
+            <w:r>
+              <w:rPr>
+                <w:color w:val="000000"/>
+                <w:sz w:val="16"/>
+                <w:szCs w:val="16"/>
+              </w:rPr>
+              <w:t>Headlight Control Dw</w:t>
+            </w:r>
+          </w:p>
+        </w:tc>
+        <w:tc>
+          <w:tcPr>
+            <w:tcW w:w="1016" w:type="dxa"/>
+            <w:tcBorders>
+              <w:top w:val="single" w:sz="4" w:space="0" w:color="000000"/>
+              <w:left w:val="single" w:sz="4" w:space="0" w:color="000000"/>
+              <w:bottom w:val="single" w:sz="4" w:space="0" w:color="000000"/>
+            </w:tcBorders>
+            <w:vAlign w:val="bottom"/>
+          </w:tcPr>
+          <w:p>
+            <w:pPr>
+              <w:pStyle w:val="Normal"/>
+              <w:widowControl w:val="false"/>
+              <w:jc w:val="center"/>
+              <w:rPr>
+                <w:color w:val="000000"/>
+                <w:sz w:val="16"/>
+                <w:szCs w:val="16"/>
+              </w:rPr>
+            </w:pPr>
+            <w:r>
+              <w:rPr>
+                <w:rFonts w:eastAsia="arial" w:ascii="arial" w:hAnsi="arial"/>
+                <w:color w:val="000000"/>
+                <w:sz w:val="16"/>
+                <w:szCs w:val="16"/>
+              </w:rPr>
+              <w:t>Engine Cont. Jog</w:t>
+            </w:r>
+          </w:p>
+        </w:tc>
+        <w:tc>
+          <w:tcPr>
+            <w:tcW w:w="1017" w:type="dxa"/>
+            <w:tcBorders>
+              <w:top w:val="single" w:sz="4" w:space="0" w:color="000000"/>
+              <w:left w:val="single" w:sz="4" w:space="0" w:color="000000"/>
+              <w:bottom w:val="single" w:sz="4" w:space="0" w:color="000000"/>
+            </w:tcBorders>
+            <w:vAlign w:val="bottom"/>
+          </w:tcPr>
+          <w:p>
+            <w:pPr>
+              <w:pStyle w:val="Normal"/>
+              <w:widowControl w:val="false"/>
+              <w:jc w:val="center"/>
+              <w:rPr>
+                <w:rFonts w:ascii="arial" w:hAnsi="arial" w:eastAsia="arial"/>
+                <w:color w:val="000000"/>
+                <w:sz w:val="16"/>
+                <w:szCs w:val="16"/>
+              </w:rPr>
+            </w:pPr>
+            <w:r>
+              <w:rPr>
+                <w:rFonts w:eastAsia="arial" w:ascii="arial" w:hAnsi="arial"/>
+                <w:color w:val="000000"/>
+                <w:sz w:val="16"/>
+                <w:szCs w:val="16"/>
+              </w:rPr>
+              <w:t>Lead Sand</w:t>
+            </w:r>
+          </w:p>
+        </w:tc>
+        <w:tc>
+          <w:tcPr>
+            <w:tcW w:w="1016" w:type="dxa"/>
+            <w:tcBorders>
+              <w:top w:val="single" w:sz="4" w:space="0" w:color="000000"/>
+              <w:left w:val="single" w:sz="4" w:space="0" w:color="000000"/>
+              <w:bottom w:val="single" w:sz="4" w:space="0" w:color="000000"/>
+            </w:tcBorders>
+            <w:vAlign w:val="bottom"/>
+          </w:tcPr>
+          <w:p>
+            <w:pPr>
+              <w:pStyle w:val="Normal"/>
+              <w:widowControl w:val="false"/>
+              <w:jc w:val="center"/>
+              <w:rPr>
+                <w:sz w:val="16"/>
+                <w:szCs w:val="16"/>
+              </w:rPr>
+            </w:pPr>
+            <w:r>
+              <w:rPr>
+                <w:rFonts w:eastAsia="arial" w:ascii="arial" w:hAnsi="arial"/>
+                <w:color w:val="000000"/>
+                <w:sz w:val="16"/>
+                <w:szCs w:val="16"/>
+              </w:rPr>
+              <w:t>Rear HL Down</w:t>
+            </w:r>
+          </w:p>
+        </w:tc>
+        <w:tc>
+          <w:tcPr>
+            <w:tcW w:w="1020" w:type="dxa"/>
+            <w:tcBorders>
+              <w:top w:val="single" w:sz="4" w:space="0" w:color="000000"/>
+              <w:left w:val="single" w:sz="4" w:space="0" w:color="000000"/>
+              <w:bottom w:val="single" w:sz="4" w:space="0" w:color="000000"/>
+            </w:tcBorders>
+            <w:vAlign w:val="bottom"/>
+          </w:tcPr>
+          <w:p>
+            <w:pPr>
+              <w:pStyle w:val="Normal"/>
+              <w:widowControl w:val="false"/>
+              <w:spacing w:lineRule="auto" w:line="180"/>
+              <w:jc w:val="center"/>
+              <w:rPr>
+                <w:sz w:val="16"/>
+                <w:szCs w:val="16"/>
+              </w:rPr>
+            </w:pPr>
+            <w:r>
+              <w:rPr>
+                <w:sz w:val="16"/>
+                <w:szCs w:val="16"/>
+              </w:rPr>
+              <w:t>Crosswalk Light</w:t>
+            </w:r>
+          </w:p>
+        </w:tc>
+        <w:tc>
+          <w:tcPr>
+            <w:tcW w:w="1016" w:type="dxa"/>
+            <w:tcBorders>
+              <w:top w:val="single" w:sz="4" w:space="0" w:color="000000"/>
+              <w:left w:val="single" w:sz="4" w:space="0" w:color="000000"/>
+              <w:bottom w:val="single" w:sz="4" w:space="0" w:color="000000"/>
+            </w:tcBorders>
+            <w:vAlign w:val="bottom"/>
+          </w:tcPr>
+          <w:p>
+            <w:pPr>
+              <w:pStyle w:val="Normal"/>
+              <w:widowControl w:val="false"/>
+              <w:spacing w:lineRule="auto" w:line="180"/>
+              <w:jc w:val="center"/>
+              <w:rPr>
+                <w:sz w:val="16"/>
+                <w:szCs w:val="16"/>
+              </w:rPr>
+            </w:pPr>
+            <w:r>
+              <w:rPr>
+                <w:sz w:val="16"/>
+                <w:szCs w:val="16"/>
+              </w:rPr>
+              <w:t>Step Light</w:t>
+            </w:r>
+          </w:p>
+        </w:tc>
+        <w:tc>
+          <w:tcPr>
+            <w:tcW w:w="1016" w:type="dxa"/>
+            <w:tcBorders>
+              <w:top w:val="single" w:sz="4" w:space="0" w:color="000000"/>
+              <w:left w:val="single" w:sz="4" w:space="0" w:color="000000"/>
+              <w:bottom w:val="single" w:sz="4" w:space="0" w:color="000000"/>
+            </w:tcBorders>
+            <w:vAlign w:val="bottom"/>
+          </w:tcPr>
+          <w:p>
+            <w:pPr>
+              <w:pStyle w:val="Normal"/>
+              <w:widowControl w:val="false"/>
+              <w:spacing w:lineRule="auto" w:line="180"/>
+              <w:jc w:val="center"/>
+              <w:rPr>
+                <w:sz w:val="16"/>
+                <w:szCs w:val="16"/>
+              </w:rPr>
+            </w:pPr>
+            <w:r>
+              <w:rPr>
+                <w:sz w:val="16"/>
+                <w:szCs w:val="16"/>
+              </w:rPr>
+              <w:t>Number Light</w:t>
+            </w:r>
+          </w:p>
+        </w:tc>
+        <w:tc>
+          <w:tcPr>
+            <w:tcW w:w="1016" w:type="dxa"/>
+            <w:tcBorders>
+              <w:top w:val="single" w:sz="4" w:space="0" w:color="000000"/>
+              <w:left w:val="single" w:sz="4" w:space="0" w:color="000000"/>
+              <w:bottom w:val="single" w:sz="4" w:space="0" w:color="000000"/>
+            </w:tcBorders>
+            <w:vAlign w:val="bottom"/>
+          </w:tcPr>
+          <w:p>
+            <w:pPr>
+              <w:pStyle w:val="Normal"/>
+              <w:widowControl w:val="false"/>
+              <w:spacing w:lineRule="auto" w:line="180"/>
+              <w:jc w:val="center"/>
+              <w:rPr>
+                <w:sz w:val="16"/>
+                <w:szCs w:val="16"/>
+              </w:rPr>
+            </w:pPr>
+            <w:r>
+              <w:rPr>
+                <w:rFonts w:eastAsia="arial" w:ascii="arial" w:hAnsi="arial"/>
+                <w:color w:val="000000"/>
+                <w:sz w:val="16"/>
+                <w:szCs w:val="16"/>
+              </w:rPr>
+              <w:t>Exterior</w:t>
+            </w:r>
+          </w:p>
+          <w:p>
+            <w:pPr>
+              <w:pStyle w:val="Normal"/>
+              <w:widowControl w:val="false"/>
+              <w:spacing w:lineRule="auto" w:line="180"/>
+              <w:jc w:val="center"/>
+              <w:rPr>
+                <w:sz w:val="16"/>
+                <w:szCs w:val="16"/>
+              </w:rPr>
+            </w:pPr>
+            <w:r>
+              <w:rPr>
+                <w:rFonts w:eastAsia="arial" w:ascii="arial" w:hAnsi="arial"/>
+                <w:color w:val="000000"/>
+                <w:sz w:val="16"/>
+                <w:szCs w:val="16"/>
+              </w:rPr>
+              <w:t>Camera</w:t>
+            </w:r>
+          </w:p>
+        </w:tc>
+        <w:tc>
+          <w:tcPr>
+            <w:tcW w:w="1029" w:type="dxa"/>
+            <w:tcBorders>
+              <w:top w:val="single" w:sz="4" w:space="0" w:color="000000"/>
+              <w:left w:val="single" w:sz="4" w:space="0" w:color="000000"/>
+              <w:bottom w:val="single" w:sz="4" w:space="0" w:color="000000"/>
+              <w:right w:val="single" w:sz="4" w:space="0" w:color="000000"/>
+            </w:tcBorders>
+            <w:vAlign w:val="bottom"/>
+          </w:tcPr>
+          <w:p>
+            <w:pPr>
+              <w:pStyle w:val="Normal"/>
+              <w:widowControl w:val="false"/>
+              <w:spacing w:lineRule="auto" w:line="180"/>
+              <w:jc w:val="center"/>
+              <w:rPr>
+                <w:sz w:val="16"/>
+                <w:szCs w:val="16"/>
+              </w:rPr>
+            </w:pPr>
+            <w:r>
+              <w:rPr>
+                <w:rFonts w:eastAsia="arial" w:ascii="arial" w:hAnsi="arial"/>
+                <w:color w:val="000000"/>
+                <w:sz w:val="16"/>
+                <w:szCs w:val="16"/>
+              </w:rPr>
+              <w:t>Prev</w:t>
+            </w:r>
+          </w:p>
+          <w:p>
+            <w:pPr>
+              <w:pStyle w:val="Normal"/>
+              <w:widowControl w:val="false"/>
+              <w:spacing w:lineRule="auto" w:line="180"/>
+              <w:jc w:val="center"/>
+              <w:rPr>
+                <w:sz w:val="16"/>
+                <w:szCs w:val="16"/>
+              </w:rPr>
+            </w:pPr>
+            <w:r>
+              <w:rPr>
+                <w:rFonts w:eastAsia="arial" w:ascii="arial" w:hAnsi="arial"/>
+                <w:color w:val="000000"/>
+                <w:sz w:val="16"/>
+                <w:szCs w:val="16"/>
+              </w:rPr>
+              <w:t>Cab Cam</w:t>
+            </w:r>
+          </w:p>
+        </w:tc>
+      </w:tr>
+    </w:tbl>
+    <w:p>
+      <w:pPr>
+        <w:pStyle w:val="Normal"/>
+        <w:rPr>
+          <w:color w:val="000000"/>
+          <w:sz w:val="16"/>
+          <w:szCs w:val="16"/>
+        </w:rPr>
+      </w:pPr>
+      <w:r>
+        <w:rPr>
+          <w:color w:val="000000"/>
+          <w:sz w:val="16"/>
+          <w:szCs w:val="16"/>
+        </w:rPr>
+      </w:r>
+    </w:p>
+    <w:p>
+      <w:pPr>
+        <w:pStyle w:val="Normal"/>
+        <w:rPr>
+          <w:color w:val="000000"/>
+          <w:sz w:val="16"/>
+          <w:szCs w:val="16"/>
+        </w:rPr>
+      </w:pPr>
+      <w:r>
+        <w:rPr>
+          <w:color w:val="000000"/>
+          <w:sz w:val="16"/>
+          <w:szCs w:val="16"/>
+        </w:rPr>
+        <w:tab/>
+        <w:t xml:space="preserve">       </w:t>
+      </w:r>
+      <w:r>
+        <w:rPr>
+          <w:rFonts w:eastAsia="arial" w:ascii="arial" w:hAnsi="arial"/>
+          <w:color w:val="000000"/>
+          <w:sz w:val="16"/>
+          <w:szCs w:val="16"/>
+        </w:rPr>
         <w:t xml:space="preserve">    </w:t>
       </w:r>
       <w:r>
@@ -1183,7 +2289,7 @@
           <w:sz w:val="16"/>
           <w:szCs w:val="16"/>
         </w:rPr>
-        <w:t>AC4400CW</w:t>
+        <w:t>ES44C4</w:t>
       </w:r>
       <w:r>
         <w:rPr>
@@ -1292,6 +2398,7 @@
                 <w:sz w:val="16"/>
                 <w:szCs w:val="16"/>
               </w:rPr>
+              <w:t>Reverser Handle</w:t>
             </w:r>
           </w:p>
         </w:tc>
@@ -1537,7 +2644,10 @@
               </w:rPr>
             </w:pPr>
             <w:r>
-              <w:rPr/>
+              <w:rPr>
+                <w:sz w:val="16"/>
+                <w:szCs w:val="16"/>
+              </w:rPr>
             </w:r>
           </w:p>
         </w:tc>
@@ -1736,7 +2846,7 @@
           <w:sz w:val="16"/>
           <w:szCs w:val="16"/>
         </w:rPr>
-        <w:t>AC4400CW</w:t>
+        <w:t>ES44C4</w:t>
       </w:r>
       <w:r>
         <w:rPr>
@@ -3309,12 +4419,12 @@
       <w:rFonts w:ascii="Symbol" w:hAnsi="Symbol" w:cs="Symbol"/>
     </w:rPr>
   </w:style>
-  <w:style w:type="character" w:styleId="user" w:customStyle="1">
-    <w:name w:val="번호 매기기 기호 (user)"/>
-    <w:qFormat/>
-    <w:rPr/>
-  </w:style>
-  <w:style w:type="paragraph" w:styleId="Style5">
+  <w:style w:type="character" w:styleId="Style5" w:customStyle="1">
+    <w:name w:val="번호 매기기 기호"/>
+    <w:qFormat/>
+    <w:rPr/>
+  </w:style>
+  <w:style w:type="paragraph" w:styleId="Style6">
     <w:name w:val="제목"/>
     <w:basedOn w:val="Normal"/>
     <w:next w:val="BodyText"/>
@@ -3324,7 +4434,7 @@
       <w:spacing w:before="240" w:after="120"/>
     </w:pPr>
     <w:rPr>
-      <w:rFonts w:ascii="Liberation Sans" w:hAnsi="Liberation Sans" w:eastAsia="Noto Sans CJK KR" w:cs="Lohit Devanagari"/>
+      <w:rFonts w:ascii="Liberation Sans" w:hAnsi="Liberation Sans" w:eastAsia="나눔고딕" w:cs="Arial"/>
       <w:sz w:val="28"/>
       <w:szCs w:val="28"/>
     </w:rPr>
@@ -3361,7 +4471,7 @@
       <w:szCs w:val="24"/>
     </w:rPr>
   </w:style>
-  <w:style w:type="paragraph" w:styleId="Style6" w:customStyle="1">
+  <w:style w:type="paragraph" w:styleId="Style7">
     <w:name w:val="색인"/>
     <w:basedOn w:val="Normal"/>
     <w:qFormat/>
@@ -3369,10 +4479,11 @@
       <w:suppressLineNumbers/>
     </w:pPr>
     <w:rPr>
-      <w:rFonts w:cs="Lohit Devanagari"/>
+      <w:rFonts w:cs="Arial"/>
+      <w:sz w:val="24"/>
     </w:rPr>
   </w:style>
-  <w:style w:type="paragraph" w:styleId="user1">
+  <w:style w:type="paragraph" w:styleId="user">
     <w:name w:val="제목 (user)"/>
     <w:basedOn w:val="Normal"/>
     <w:next w:val="BodyText"/>
@@ -3382,12 +4493,12 @@
       <w:spacing w:before="240" w:after="120"/>
     </w:pPr>
     <w:rPr>
-      <w:rFonts w:ascii="Liberation Sans" w:hAnsi="Liberation Sans" w:eastAsia="나눔고딕" w:cs="Arial"/>
+      <w:rFonts w:ascii="Liberation Sans" w:hAnsi="Liberation Sans" w:eastAsia="Noto Sans CJK KR" w:cs="Lohit Devanagari"/>
       <w:sz w:val="28"/>
       <w:szCs w:val="28"/>
     </w:rPr>
   </w:style>
-  <w:style w:type="paragraph" w:styleId="user2">
+  <w:style w:type="paragraph" w:styleId="user1" w:customStyle="1">
     <w:name w:val="색인 (user)"/>
     <w:basedOn w:val="Normal"/>
     <w:qFormat/>
@@ -3395,8 +4506,7 @@
       <w:suppressLineNumbers/>
     </w:pPr>
     <w:rPr>
-      <w:rFonts w:cs="Arial"/>
-      <w:sz w:val="24"/>
+      <w:rFonts w:cs="Lohit Devanagari"/>
     </w:rPr>
   </w:style>
   <w:style w:type="paragraph" w:styleId="Title">
@@ -4078,8 +5188,8 @@
       <w:szCs w:val="24"/>
     </w:rPr>
   </w:style>
-  <w:style w:type="paragraph" w:styleId="Style7" w:customStyle="1">
-    <w:name w:val="표 내용"/>
+  <w:style w:type="paragraph" w:styleId="user2" w:customStyle="1">
+    <w:name w:val="표 내용 (user)"/>
     <w:basedOn w:val="Normal"/>
     <w:qFormat/>
     <w:pPr>
@@ -4087,9 +5197,9 @@
     </w:pPr>
     <w:rPr/>
   </w:style>
-  <w:style w:type="paragraph" w:styleId="Style8" w:customStyle="1">
-    <w:name w:val="표제목"/>
-    <w:basedOn w:val="Style7"/>
+  <w:style w:type="paragraph" w:styleId="user3" w:customStyle="1">
+    <w:name w:val="표제목 (user)"/>
+    <w:basedOn w:val="user2"/>
     <w:qFormat/>
     <w:pPr>
       <w:jc w:val="center"/>
@@ -4099,8 +5209,8 @@
       <w:bCs/>
     </w:rPr>
   </w:style>
-  <w:style w:type="paragraph" w:styleId="user3">
-    <w:name w:val="표 내용 (user)"/>
+  <w:style w:type="paragraph" w:styleId="Style8">
+    <w:name w:val="표 내용"/>
     <w:basedOn w:val="Normal"/>
     <w:qFormat/>
     <w:pPr>
@@ -4109,9 +5219,9 @@
     </w:pPr>
     <w:rPr/>
   </w:style>
-  <w:style w:type="paragraph" w:styleId="user4">
-    <w:name w:val="표제목 (user)"/>
-    <w:basedOn w:val="user3"/>
+  <w:style w:type="paragraph" w:styleId="Style9">
+    <w:name w:val="표제목"/>
+    <w:basedOn w:val="Style8"/>
     <w:qFormat/>
     <w:pPr>
       <w:suppressLineNumbers/>

</xml_diff>

<commit_message>
Add C40-8W, ES44AC, F7 and C40-8W
</commit_message>
<xml_diff>
--- a/raildriver-USA-Remapped.docx
+++ b/raildriver-USA-Remapped.docx
@@ -3387,6 +3387,1113 @@
           <w:sz w:val="16"/>
           <w:szCs w:val="16"/>
         </w:rPr>
+        <w:t xml:space="preserve">    SD70ACe-1</w:t>
+      </w:r>
+    </w:p>
+    <w:tbl>
+      <w:tblPr>
+        <w:tblW w:w="14248" w:type="dxa"/>
+        <w:jc w:val="left"/>
+        <w:tblInd w:w="-5" w:type="dxa"/>
+        <w:tblLayout w:type="fixed"/>
+        <w:tblCellMar>
+          <w:top w:w="0" w:type="dxa"/>
+          <w:left w:w="108" w:type="dxa"/>
+          <w:bottom w:w="0" w:type="dxa"/>
+          <w:right w:w="108" w:type="dxa"/>
+        </w:tblCellMar>
+        <w:tblLook w:firstRow="1" w:noVBand="1" w:lastRow="0" w:firstColumn="1" w:lastColumn="0" w:noHBand="0" w:val="04a0"/>
+      </w:tblPr>
+      <w:tblGrid>
+        <w:gridCol w:w="1017"/>
+        <w:gridCol w:w="1019"/>
+        <w:gridCol w:w="1014"/>
+        <w:gridCol w:w="1016"/>
+        <w:gridCol w:w="1020"/>
+        <w:gridCol w:w="1016"/>
+        <w:gridCol w:w="1016"/>
+        <w:gridCol w:w="1017"/>
+        <w:gridCol w:w="1016"/>
+        <w:gridCol w:w="1020"/>
+        <w:gridCol w:w="1016"/>
+        <w:gridCol w:w="1016"/>
+        <w:gridCol w:w="1016"/>
+        <w:gridCol w:w="1029"/>
+      </w:tblGrid>
+      <w:tr>
+        <w:trPr>
+          <w:trHeight w:val="440" w:hRule="exact"/>
+          <w:cantSplit w:val="true"/>
+        </w:trPr>
+        <w:tc>
+          <w:tcPr>
+            <w:tcW w:w="1017" w:type="dxa"/>
+            <w:tcBorders>
+              <w:top w:val="single" w:sz="4" w:space="0" w:color="000000"/>
+              <w:left w:val="single" w:sz="4" w:space="0" w:color="000000"/>
+              <w:bottom w:val="single" w:sz="4" w:space="0" w:color="000000"/>
+            </w:tcBorders>
+            <w:vAlign w:val="bottom"/>
+          </w:tcPr>
+          <w:p>
+            <w:pPr>
+              <w:pStyle w:val="Normal"/>
+              <w:widowControl w:val="false"/>
+              <w:spacing w:lineRule="auto" w:line="180" w:before="0" w:after="60"/>
+              <w:jc w:val="center"/>
+              <w:rPr>
+                <w:color w:val="000000"/>
+                <w:sz w:val="16"/>
+                <w:szCs w:val="16"/>
+              </w:rPr>
+            </w:pPr>
+            <w:r>
+              <w:rPr>
+                <w:rFonts w:eastAsia="arial" w:ascii="arial" w:hAnsi="arial"/>
+                <w:b/>
+                <w:color w:val="000000"/>
+                <w:sz w:val="16"/>
+                <w:szCs w:val="16"/>
+              </w:rPr>
+              <w:t>Pause</w:t>
+            </w:r>
+          </w:p>
+        </w:tc>
+        <w:tc>
+          <w:tcPr>
+            <w:tcW w:w="1019" w:type="dxa"/>
+            <w:tcBorders>
+              <w:top w:val="single" w:sz="4" w:space="0" w:color="000000"/>
+              <w:left w:val="single" w:sz="4" w:space="0" w:color="000000"/>
+              <w:bottom w:val="single" w:sz="4" w:space="0" w:color="000000"/>
+            </w:tcBorders>
+            <w:vAlign w:val="bottom"/>
+          </w:tcPr>
+          <w:p>
+            <w:pPr>
+              <w:pStyle w:val="Normal"/>
+              <w:widowControl w:val="false"/>
+              <w:spacing w:lineRule="auto" w:line="180"/>
+              <w:jc w:val="center"/>
+              <w:rPr>
+                <w:color w:val="000000"/>
+                <w:sz w:val="16"/>
+                <w:szCs w:val="16"/>
+              </w:rPr>
+            </w:pPr>
+            <w:r>
+              <w:rPr>
+                <w:color w:val="000000"/>
+                <w:sz w:val="16"/>
+                <w:szCs w:val="16"/>
+              </w:rPr>
+              <w:t>Reverser Handle</w:t>
+            </w:r>
+          </w:p>
+        </w:tc>
+        <w:tc>
+          <w:tcPr>
+            <w:tcW w:w="1014" w:type="dxa"/>
+            <w:tcBorders>
+              <w:top w:val="single" w:sz="4" w:space="0" w:color="000000"/>
+              <w:left w:val="single" w:sz="4" w:space="0" w:color="000000"/>
+              <w:bottom w:val="single" w:sz="4" w:space="0" w:color="000000"/>
+            </w:tcBorders>
+            <w:vAlign w:val="bottom"/>
+          </w:tcPr>
+          <w:p>
+            <w:pPr>
+              <w:pStyle w:val="Normal"/>
+              <w:widowControl w:val="false"/>
+              <w:spacing w:lineRule="auto" w:line="180"/>
+              <w:jc w:val="center"/>
+              <w:rPr>
+                <w:color w:val="000000"/>
+                <w:sz w:val="16"/>
+                <w:szCs w:val="16"/>
+              </w:rPr>
+            </w:pPr>
+            <w:r>
+              <w:rPr>
+                <w:rFonts w:eastAsia="arial" w:ascii="arial" w:hAnsi="arial"/>
+                <w:color w:val="000000"/>
+                <w:sz w:val="16"/>
+                <w:szCs w:val="16"/>
+              </w:rPr>
+              <w:t>Engine Start</w:t>
+            </w:r>
+          </w:p>
+        </w:tc>
+        <w:tc>
+          <w:tcPr>
+            <w:tcW w:w="1016" w:type="dxa"/>
+            <w:tcBorders>
+              <w:top w:val="single" w:sz="4" w:space="0" w:color="000000"/>
+              <w:left w:val="single" w:sz="4" w:space="0" w:color="000000"/>
+              <w:bottom w:val="single" w:sz="4" w:space="0" w:color="000000"/>
+            </w:tcBorders>
+            <w:vAlign w:val="bottom"/>
+          </w:tcPr>
+          <w:p>
+            <w:pPr>
+              <w:pStyle w:val="Normal"/>
+              <w:widowControl w:val="false"/>
+              <w:spacing w:lineRule="auto" w:line="180"/>
+              <w:jc w:val="center"/>
+              <w:rPr>
+                <w:color w:val="000000"/>
+                <w:sz w:val="16"/>
+                <w:szCs w:val="16"/>
+              </w:rPr>
+            </w:pPr>
+            <w:r>
+              <w:rPr>
+                <w:color w:val="000000"/>
+                <w:sz w:val="16"/>
+                <w:szCs w:val="16"/>
+              </w:rPr>
+              <w:t>EAD Fuse</w:t>
+            </w:r>
+          </w:p>
+        </w:tc>
+        <w:tc>
+          <w:tcPr>
+            <w:tcW w:w="1020" w:type="dxa"/>
+            <w:tcBorders>
+              <w:top w:val="single" w:sz="4" w:space="0" w:color="000000"/>
+              <w:left w:val="single" w:sz="4" w:space="0" w:color="000000"/>
+              <w:bottom w:val="single" w:sz="4" w:space="0" w:color="000000"/>
+            </w:tcBorders>
+            <w:vAlign w:val="bottom"/>
+          </w:tcPr>
+          <w:p>
+            <w:pPr>
+              <w:pStyle w:val="Normal"/>
+              <w:widowControl w:val="false"/>
+              <w:spacing w:lineRule="auto" w:line="180"/>
+              <w:jc w:val="center"/>
+              <w:rPr>
+                <w:color w:val="000000"/>
+                <w:sz w:val="16"/>
+                <w:szCs w:val="16"/>
+              </w:rPr>
+            </w:pPr>
+            <w:r>
+              <w:rPr>
+                <w:color w:val="000000"/>
+                <w:sz w:val="16"/>
+                <w:szCs w:val="16"/>
+              </w:rPr>
+              <w:t>Generator Field</w:t>
+            </w:r>
+          </w:p>
+        </w:tc>
+        <w:tc>
+          <w:tcPr>
+            <w:tcW w:w="1016" w:type="dxa"/>
+            <w:tcBorders>
+              <w:top w:val="single" w:sz="4" w:space="0" w:color="000000"/>
+              <w:left w:val="single" w:sz="4" w:space="0" w:color="000000"/>
+              <w:bottom w:val="single" w:sz="4" w:space="0" w:color="000000"/>
+            </w:tcBorders>
+            <w:vAlign w:val="bottom"/>
+          </w:tcPr>
+          <w:p>
+            <w:pPr>
+              <w:pStyle w:val="Normal"/>
+              <w:widowControl w:val="false"/>
+              <w:jc w:val="center"/>
+              <w:rPr>
+                <w:color w:val="000000"/>
+                <w:sz w:val="16"/>
+                <w:szCs w:val="16"/>
+              </w:rPr>
+            </w:pPr>
+            <w:r>
+              <w:rPr>
+                <w:color w:val="000000"/>
+                <w:sz w:val="16"/>
+                <w:szCs w:val="16"/>
+              </w:rPr>
+              <w:t>Headlight Control</w:t>
+            </w:r>
+          </w:p>
+        </w:tc>
+        <w:tc>
+          <w:tcPr>
+            <w:tcW w:w="1016" w:type="dxa"/>
+            <w:tcBorders>
+              <w:top w:val="single" w:sz="4" w:space="0" w:color="000000"/>
+              <w:left w:val="single" w:sz="4" w:space="0" w:color="000000"/>
+              <w:bottom w:val="single" w:sz="4" w:space="0" w:color="000000"/>
+            </w:tcBorders>
+            <w:vAlign w:val="bottom"/>
+          </w:tcPr>
+          <w:p>
+            <w:pPr>
+              <w:pStyle w:val="Normal"/>
+              <w:widowControl w:val="false"/>
+              <w:jc w:val="center"/>
+              <w:rPr>
+                <w:color w:val="000000"/>
+                <w:sz w:val="16"/>
+                <w:szCs w:val="16"/>
+              </w:rPr>
+            </w:pPr>
+            <w:r>
+              <w:rPr>
+                <w:color w:val="000000"/>
+                <w:sz w:val="16"/>
+                <w:szCs w:val="16"/>
+              </w:rPr>
+              <w:t>Isolation Cont. Iso</w:t>
+            </w:r>
+          </w:p>
+        </w:tc>
+        <w:tc>
+          <w:tcPr>
+            <w:tcW w:w="1017" w:type="dxa"/>
+            <w:tcBorders>
+              <w:top w:val="single" w:sz="4" w:space="0" w:color="000000"/>
+              <w:left w:val="single" w:sz="4" w:space="0" w:color="000000"/>
+              <w:bottom w:val="single" w:sz="4" w:space="0" w:color="000000"/>
+            </w:tcBorders>
+            <w:vAlign w:val="bottom"/>
+          </w:tcPr>
+          <w:p>
+            <w:pPr>
+              <w:pStyle w:val="Normal"/>
+              <w:widowControl w:val="false"/>
+              <w:jc w:val="center"/>
+              <w:rPr>
+                <w:color w:val="000000"/>
+                <w:sz w:val="16"/>
+                <w:szCs w:val="16"/>
+              </w:rPr>
+            </w:pPr>
+            <w:r>
+              <w:rPr>
+                <w:rFonts w:eastAsia="arial" w:ascii="arial" w:hAnsi="arial"/>
+                <w:color w:val="000000"/>
+                <w:sz w:val="16"/>
+                <w:szCs w:val="16"/>
+              </w:rPr>
+              <w:t>Banking COMM</w:t>
+            </w:r>
+          </w:p>
+        </w:tc>
+        <w:tc>
+          <w:tcPr>
+            <w:tcW w:w="1016" w:type="dxa"/>
+            <w:tcBorders>
+              <w:top w:val="single" w:sz="4" w:space="0" w:color="000000"/>
+              <w:left w:val="single" w:sz="4" w:space="0" w:color="000000"/>
+              <w:bottom w:val="single" w:sz="4" w:space="0" w:color="000000"/>
+            </w:tcBorders>
+            <w:vAlign w:val="bottom"/>
+          </w:tcPr>
+          <w:p>
+            <w:pPr>
+              <w:pStyle w:val="Normal"/>
+              <w:widowControl w:val="false"/>
+              <w:jc w:val="center"/>
+              <w:rPr>
+                <w:sz w:val="16"/>
+                <w:szCs w:val="16"/>
+              </w:rPr>
+            </w:pPr>
+            <w:r>
+              <w:rPr>
+                <w:sz w:val="16"/>
+                <w:szCs w:val="16"/>
+              </w:rPr>
+              <w:t>Rear HL Up</w:t>
+            </w:r>
+          </w:p>
+        </w:tc>
+        <w:tc>
+          <w:tcPr>
+            <w:tcW w:w="1020" w:type="dxa"/>
+            <w:tcBorders>
+              <w:top w:val="single" w:sz="4" w:space="0" w:color="000000"/>
+              <w:left w:val="single" w:sz="4" w:space="0" w:color="000000"/>
+              <w:bottom w:val="single" w:sz="4" w:space="0" w:color="000000"/>
+            </w:tcBorders>
+            <w:vAlign w:val="bottom"/>
+          </w:tcPr>
+          <w:p>
+            <w:pPr>
+              <w:pStyle w:val="Normal"/>
+              <w:widowControl w:val="false"/>
+              <w:spacing w:lineRule="auto" w:line="180"/>
+              <w:jc w:val="center"/>
+              <w:rPr>
+                <w:sz w:val="16"/>
+                <w:szCs w:val="16"/>
+              </w:rPr>
+            </w:pPr>
+            <w:r>
+              <w:rPr>
+                <w:sz w:val="16"/>
+                <w:szCs w:val="16"/>
+              </w:rPr>
+            </w:r>
+          </w:p>
+        </w:tc>
+        <w:tc>
+          <w:tcPr>
+            <w:tcW w:w="1016" w:type="dxa"/>
+            <w:tcBorders>
+              <w:top w:val="single" w:sz="4" w:space="0" w:color="000000"/>
+              <w:left w:val="single" w:sz="4" w:space="0" w:color="000000"/>
+              <w:bottom w:val="single" w:sz="4" w:space="0" w:color="000000"/>
+            </w:tcBorders>
+            <w:vAlign w:val="bottom"/>
+          </w:tcPr>
+          <w:p>
+            <w:pPr>
+              <w:pStyle w:val="Normal"/>
+              <w:widowControl w:val="false"/>
+              <w:spacing w:lineRule="auto" w:line="180"/>
+              <w:jc w:val="center"/>
+              <w:rPr>
+                <w:sz w:val="16"/>
+                <w:szCs w:val="16"/>
+              </w:rPr>
+            </w:pPr>
+            <w:r>
+              <w:rPr>
+                <w:rFonts w:eastAsia="arial" w:ascii="arial" w:hAnsi="arial"/>
+                <w:color w:val="000000"/>
+                <w:sz w:val="16"/>
+                <w:szCs w:val="16"/>
+              </w:rPr>
+              <w:t>Onboard Light</w:t>
+            </w:r>
+          </w:p>
+        </w:tc>
+        <w:tc>
+          <w:tcPr>
+            <w:tcW w:w="1016" w:type="dxa"/>
+            <w:tcBorders>
+              <w:top w:val="single" w:sz="4" w:space="0" w:color="000000"/>
+              <w:left w:val="single" w:sz="4" w:space="0" w:color="000000"/>
+              <w:bottom w:val="single" w:sz="4" w:space="0" w:color="000000"/>
+            </w:tcBorders>
+            <w:vAlign w:val="bottom"/>
+          </w:tcPr>
+          <w:p>
+            <w:pPr>
+              <w:pStyle w:val="Normal"/>
+              <w:widowControl w:val="false"/>
+              <w:spacing w:lineRule="auto" w:line="180"/>
+              <w:jc w:val="center"/>
+              <w:rPr>
+                <w:sz w:val="16"/>
+                <w:szCs w:val="16"/>
+              </w:rPr>
+            </w:pPr>
+            <w:r>
+              <w:rPr>
+                <w:sz w:val="16"/>
+                <w:szCs w:val="16"/>
+              </w:rPr>
+              <w:t>Cab Light</w:t>
+            </w:r>
+          </w:p>
+        </w:tc>
+        <w:tc>
+          <w:tcPr>
+            <w:tcW w:w="1016" w:type="dxa"/>
+            <w:tcBorders>
+              <w:top w:val="single" w:sz="4" w:space="0" w:color="000000"/>
+              <w:left w:val="single" w:sz="4" w:space="0" w:color="000000"/>
+              <w:bottom w:val="single" w:sz="4" w:space="0" w:color="000000"/>
+            </w:tcBorders>
+            <w:vAlign w:val="bottom"/>
+          </w:tcPr>
+          <w:p>
+            <w:pPr>
+              <w:pStyle w:val="Normal"/>
+              <w:widowControl w:val="false"/>
+              <w:spacing w:lineRule="auto" w:line="180"/>
+              <w:jc w:val="center"/>
+              <w:rPr>
+                <w:sz w:val="16"/>
+                <w:szCs w:val="16"/>
+              </w:rPr>
+            </w:pPr>
+            <w:r>
+              <w:rPr>
+                <w:rFonts w:eastAsia="arial" w:ascii="arial" w:hAnsi="arial"/>
+                <w:color w:val="000000"/>
+                <w:sz w:val="16"/>
+                <w:szCs w:val="16"/>
+              </w:rPr>
+              <w:t>1-Person</w:t>
+            </w:r>
+          </w:p>
+        </w:tc>
+        <w:tc>
+          <w:tcPr>
+            <w:tcW w:w="1029" w:type="dxa"/>
+            <w:tcBorders>
+              <w:top w:val="single" w:sz="4" w:space="0" w:color="000000"/>
+              <w:left w:val="single" w:sz="4" w:space="0" w:color="000000"/>
+              <w:bottom w:val="single" w:sz="4" w:space="0" w:color="000000"/>
+              <w:right w:val="single" w:sz="4" w:space="0" w:color="000000"/>
+            </w:tcBorders>
+            <w:vAlign w:val="bottom"/>
+          </w:tcPr>
+          <w:p>
+            <w:pPr>
+              <w:pStyle w:val="Normal"/>
+              <w:widowControl w:val="false"/>
+              <w:spacing w:lineRule="auto" w:line="180"/>
+              <w:jc w:val="center"/>
+              <w:rPr>
+                <w:sz w:val="16"/>
+                <w:szCs w:val="16"/>
+              </w:rPr>
+            </w:pPr>
+            <w:r>
+              <w:rPr>
+                <w:rFonts w:eastAsia="arial" w:ascii="arial" w:hAnsi="arial"/>
+                <w:color w:val="000000"/>
+                <w:sz w:val="16"/>
+                <w:szCs w:val="16"/>
+              </w:rPr>
+              <w:t>Next</w:t>
+            </w:r>
+          </w:p>
+          <w:p>
+            <w:pPr>
+              <w:pStyle w:val="Normal"/>
+              <w:widowControl w:val="false"/>
+              <w:spacing w:lineRule="auto" w:line="180"/>
+              <w:jc w:val="center"/>
+              <w:rPr>
+                <w:sz w:val="16"/>
+                <w:szCs w:val="16"/>
+              </w:rPr>
+            </w:pPr>
+            <w:r>
+              <w:rPr>
+                <w:rFonts w:eastAsia="arial" w:ascii="arial" w:hAnsi="arial"/>
+                <w:color w:val="000000"/>
+                <w:sz w:val="16"/>
+                <w:szCs w:val="16"/>
+              </w:rPr>
+              <w:t>Cab Cam</w:t>
+            </w:r>
+          </w:p>
+        </w:tc>
+      </w:tr>
+    </w:tbl>
+    <w:p>
+      <w:pPr>
+        <w:pStyle w:val="Normal"/>
+        <w:rPr>
+          <w:rFonts w:ascii="arial" w:hAnsi="arial" w:eastAsia="arial"/>
+          <w:color w:val="000000"/>
+          <w:sz w:val="16"/>
+          <w:szCs w:val="16"/>
+        </w:rPr>
+      </w:pPr>
+      <w:r>
+        <w:rPr>
+          <w:rFonts w:eastAsia="arial" w:ascii="arial" w:hAnsi="arial"/>
+          <w:color w:val="000000"/>
+          <w:sz w:val="16"/>
+          <w:szCs w:val="16"/>
+        </w:rPr>
+      </w:r>
+    </w:p>
+    <w:p>
+      <w:pPr>
+        <w:pStyle w:val="Normal"/>
+        <w:rPr>
+          <w:color w:val="000000"/>
+          <w:sz w:val="16"/>
+          <w:szCs w:val="16"/>
+        </w:rPr>
+      </w:pPr>
+      <w:r>
+        <w:rPr>
+          <w:rFonts w:eastAsia="arial" w:ascii="arial" w:hAnsi="arial"/>
+          <w:color w:val="000000"/>
+          <w:sz w:val="16"/>
+          <w:szCs w:val="16"/>
+        </w:rPr>
+        <w:tab/>
+        <w:t xml:space="preserve">           SD70ACe-2</w:t>
+      </w:r>
+    </w:p>
+    <w:tbl>
+      <w:tblPr>
+        <w:tblW w:w="14248" w:type="dxa"/>
+        <w:jc w:val="left"/>
+        <w:tblInd w:w="-5" w:type="dxa"/>
+        <w:tblLayout w:type="fixed"/>
+        <w:tblCellMar>
+          <w:top w:w="0" w:type="dxa"/>
+          <w:left w:w="108" w:type="dxa"/>
+          <w:bottom w:w="0" w:type="dxa"/>
+          <w:right w:w="108" w:type="dxa"/>
+        </w:tblCellMar>
+        <w:tblLook w:firstRow="1" w:noVBand="1" w:lastRow="0" w:firstColumn="1" w:lastColumn="0" w:noHBand="0" w:val="04a0"/>
+      </w:tblPr>
+      <w:tblGrid>
+        <w:gridCol w:w="1017"/>
+        <w:gridCol w:w="1019"/>
+        <w:gridCol w:w="1014"/>
+        <w:gridCol w:w="1016"/>
+        <w:gridCol w:w="1020"/>
+        <w:gridCol w:w="1016"/>
+        <w:gridCol w:w="1016"/>
+        <w:gridCol w:w="1017"/>
+        <w:gridCol w:w="1016"/>
+        <w:gridCol w:w="1020"/>
+        <w:gridCol w:w="1016"/>
+        <w:gridCol w:w="1016"/>
+        <w:gridCol w:w="1016"/>
+        <w:gridCol w:w="1029"/>
+      </w:tblGrid>
+      <w:tr>
+        <w:trPr>
+          <w:trHeight w:val="440" w:hRule="exact"/>
+          <w:cantSplit w:val="true"/>
+        </w:trPr>
+        <w:tc>
+          <w:tcPr>
+            <w:tcW w:w="1017" w:type="dxa"/>
+            <w:tcBorders>
+              <w:top w:val="single" w:sz="4" w:space="0" w:color="000000"/>
+              <w:left w:val="single" w:sz="4" w:space="0" w:color="000000"/>
+              <w:bottom w:val="single" w:sz="4" w:space="0" w:color="000000"/>
+            </w:tcBorders>
+            <w:vAlign w:val="bottom"/>
+          </w:tcPr>
+          <w:p>
+            <w:pPr>
+              <w:pStyle w:val="Normal"/>
+              <w:widowControl w:val="false"/>
+              <w:spacing w:lineRule="auto" w:line="180" w:before="0" w:after="60"/>
+              <w:jc w:val="center"/>
+              <w:rPr>
+                <w:b/>
+                <w:bCs/>
+              </w:rPr>
+            </w:pPr>
+            <w:r>
+              <w:rPr>
+                <w:b/>
+                <w:bCs/>
+                <w:color w:val="000000"/>
+                <w:sz w:val="16"/>
+                <w:szCs w:val="16"/>
+              </w:rPr>
+              <w:t>HUD</w:t>
+            </w:r>
+          </w:p>
+        </w:tc>
+        <w:tc>
+          <w:tcPr>
+            <w:tcW w:w="1019" w:type="dxa"/>
+            <w:tcBorders>
+              <w:top w:val="single" w:sz="4" w:space="0" w:color="000000"/>
+              <w:left w:val="single" w:sz="4" w:space="0" w:color="000000"/>
+              <w:bottom w:val="single" w:sz="4" w:space="0" w:color="000000"/>
+            </w:tcBorders>
+            <w:vAlign w:val="bottom"/>
+          </w:tcPr>
+          <w:p>
+            <w:pPr>
+              <w:pStyle w:val="Normal"/>
+              <w:widowControl w:val="false"/>
+              <w:spacing w:lineRule="auto" w:line="180"/>
+              <w:jc w:val="center"/>
+              <w:rPr>
+                <w:color w:val="000000"/>
+                <w:sz w:val="16"/>
+                <w:szCs w:val="16"/>
+              </w:rPr>
+            </w:pPr>
+            <w:r>
+              <w:rPr>
+                <w:color w:val="000000"/>
+                <w:sz w:val="16"/>
+                <w:szCs w:val="16"/>
+              </w:rPr>
+              <w:t>Schedule</w:t>
+            </w:r>
+          </w:p>
+        </w:tc>
+        <w:tc>
+          <w:tcPr>
+            <w:tcW w:w="1014" w:type="dxa"/>
+            <w:tcBorders>
+              <w:top w:val="single" w:sz="4" w:space="0" w:color="000000"/>
+              <w:left w:val="single" w:sz="4" w:space="0" w:color="000000"/>
+              <w:bottom w:val="single" w:sz="4" w:space="0" w:color="000000"/>
+            </w:tcBorders>
+            <w:vAlign w:val="bottom"/>
+          </w:tcPr>
+          <w:p>
+            <w:pPr>
+              <w:pStyle w:val="Normal"/>
+              <w:widowControl w:val="false"/>
+              <w:spacing w:lineRule="auto" w:line="180"/>
+              <w:jc w:val="center"/>
+              <w:rPr>
+                <w:color w:val="000000"/>
+                <w:sz w:val="16"/>
+                <w:szCs w:val="16"/>
+              </w:rPr>
+            </w:pPr>
+            <w:r>
+              <w:rPr>
+                <w:rFonts w:eastAsia="arial" w:ascii="arial" w:hAnsi="arial"/>
+                <w:color w:val="000000"/>
+                <w:sz w:val="16"/>
+                <w:szCs w:val="16"/>
+              </w:rPr>
+              <w:t>Engine Stop</w:t>
+            </w:r>
+          </w:p>
+        </w:tc>
+        <w:tc>
+          <w:tcPr>
+            <w:tcW w:w="1016" w:type="dxa"/>
+            <w:tcBorders>
+              <w:top w:val="single" w:sz="4" w:space="0" w:color="000000"/>
+              <w:left w:val="single" w:sz="4" w:space="0" w:color="000000"/>
+              <w:bottom w:val="single" w:sz="4" w:space="0" w:color="000000"/>
+            </w:tcBorders>
+            <w:vAlign w:val="bottom"/>
+          </w:tcPr>
+          <w:p>
+            <w:pPr>
+              <w:pStyle w:val="Normal"/>
+              <w:widowControl w:val="false"/>
+              <w:spacing w:lineRule="auto" w:line="180"/>
+              <w:jc w:val="center"/>
+              <w:rPr>
+                <w:color w:val="000000"/>
+                <w:sz w:val="16"/>
+                <w:szCs w:val="16"/>
+              </w:rPr>
+            </w:pPr>
+            <w:r>
+              <w:rPr>
+                <w:color w:val="000000"/>
+                <w:sz w:val="16"/>
+                <w:szCs w:val="16"/>
+              </w:rPr>
+              <w:t>Cab Signal</w:t>
+            </w:r>
+          </w:p>
+        </w:tc>
+        <w:tc>
+          <w:tcPr>
+            <w:tcW w:w="1020" w:type="dxa"/>
+            <w:tcBorders>
+              <w:top w:val="single" w:sz="4" w:space="0" w:color="000000"/>
+              <w:left w:val="single" w:sz="4" w:space="0" w:color="000000"/>
+              <w:bottom w:val="single" w:sz="4" w:space="0" w:color="000000"/>
+            </w:tcBorders>
+            <w:vAlign w:val="bottom"/>
+          </w:tcPr>
+          <w:p>
+            <w:pPr>
+              <w:pStyle w:val="Normal"/>
+              <w:widowControl w:val="false"/>
+              <w:spacing w:lineRule="auto" w:line="180"/>
+              <w:jc w:val="center"/>
+              <w:rPr>
+                <w:color w:val="000000"/>
+                <w:sz w:val="16"/>
+                <w:szCs w:val="16"/>
+              </w:rPr>
+            </w:pPr>
+            <w:r>
+              <w:rPr>
+                <w:color w:val="000000"/>
+                <w:sz w:val="16"/>
+                <w:szCs w:val="16"/>
+              </w:rPr>
+              <w:t>Fuel Pump</w:t>
+            </w:r>
+          </w:p>
+        </w:tc>
+        <w:tc>
+          <w:tcPr>
+            <w:tcW w:w="1016" w:type="dxa"/>
+            <w:tcBorders>
+              <w:top w:val="single" w:sz="4" w:space="0" w:color="000000"/>
+              <w:left w:val="single" w:sz="4" w:space="0" w:color="000000"/>
+              <w:bottom w:val="single" w:sz="4" w:space="0" w:color="000000"/>
+            </w:tcBorders>
+            <w:vAlign w:val="bottom"/>
+          </w:tcPr>
+          <w:p>
+            <w:pPr>
+              <w:pStyle w:val="Normal"/>
+              <w:widowControl w:val="false"/>
+              <w:spacing w:lineRule="auto" w:line="180"/>
+              <w:jc w:val="center"/>
+              <w:rPr>
+                <w:color w:val="000000"/>
+                <w:sz w:val="16"/>
+                <w:szCs w:val="16"/>
+              </w:rPr>
+            </w:pPr>
+            <w:r>
+              <w:rPr>
+                <w:color w:val="000000"/>
+                <w:sz w:val="16"/>
+                <w:szCs w:val="16"/>
+              </w:rPr>
+              <w:t>Engine Run</w:t>
+            </w:r>
+          </w:p>
+        </w:tc>
+        <w:tc>
+          <w:tcPr>
+            <w:tcW w:w="1016" w:type="dxa"/>
+            <w:tcBorders>
+              <w:top w:val="single" w:sz="4" w:space="0" w:color="000000"/>
+              <w:left w:val="single" w:sz="4" w:space="0" w:color="000000"/>
+              <w:bottom w:val="single" w:sz="4" w:space="0" w:color="000000"/>
+            </w:tcBorders>
+            <w:vAlign w:val="bottom"/>
+          </w:tcPr>
+          <w:p>
+            <w:pPr>
+              <w:pStyle w:val="Normal"/>
+              <w:widowControl w:val="false"/>
+              <w:jc w:val="center"/>
+              <w:rPr>
+                <w:color w:val="000000"/>
+                <w:sz w:val="16"/>
+                <w:szCs w:val="16"/>
+              </w:rPr>
+            </w:pPr>
+            <w:r>
+              <w:rPr>
+                <w:rFonts w:eastAsia="arial" w:ascii="arial" w:hAnsi="arial"/>
+                <w:color w:val="000000"/>
+                <w:sz w:val="16"/>
+                <w:szCs w:val="16"/>
+              </w:rPr>
+              <w:t>Isolation Cont. D.B.</w:t>
+            </w:r>
+          </w:p>
+        </w:tc>
+        <w:tc>
+          <w:tcPr>
+            <w:tcW w:w="1017" w:type="dxa"/>
+            <w:tcBorders>
+              <w:top w:val="single" w:sz="4" w:space="0" w:color="000000"/>
+              <w:left w:val="single" w:sz="4" w:space="0" w:color="000000"/>
+              <w:bottom w:val="single" w:sz="4" w:space="0" w:color="000000"/>
+            </w:tcBorders>
+            <w:vAlign w:val="bottom"/>
+          </w:tcPr>
+          <w:p>
+            <w:pPr>
+              <w:pStyle w:val="Normal"/>
+              <w:widowControl w:val="false"/>
+              <w:jc w:val="center"/>
+              <w:rPr>
+                <w:rFonts w:ascii="arial" w:hAnsi="arial" w:eastAsia="arial"/>
+                <w:color w:val="000000"/>
+                <w:sz w:val="16"/>
+                <w:szCs w:val="16"/>
+              </w:rPr>
+            </w:pPr>
+            <w:r>
+              <w:rPr>
+                <w:rFonts w:eastAsia="arial" w:ascii="arial" w:hAnsi="arial"/>
+                <w:color w:val="000000"/>
+                <w:sz w:val="16"/>
+                <w:szCs w:val="16"/>
+              </w:rPr>
+              <w:t>Lead Sand</w:t>
+            </w:r>
+          </w:p>
+        </w:tc>
+        <w:tc>
+          <w:tcPr>
+            <w:tcW w:w="1016" w:type="dxa"/>
+            <w:tcBorders>
+              <w:top w:val="single" w:sz="4" w:space="0" w:color="000000"/>
+              <w:left w:val="single" w:sz="4" w:space="0" w:color="000000"/>
+              <w:bottom w:val="single" w:sz="4" w:space="0" w:color="000000"/>
+            </w:tcBorders>
+            <w:vAlign w:val="bottom"/>
+          </w:tcPr>
+          <w:p>
+            <w:pPr>
+              <w:pStyle w:val="Normal"/>
+              <w:widowControl w:val="false"/>
+              <w:jc w:val="center"/>
+              <w:rPr>
+                <w:sz w:val="16"/>
+                <w:szCs w:val="16"/>
+              </w:rPr>
+            </w:pPr>
+            <w:r>
+              <w:rPr>
+                <w:rFonts w:eastAsia="arial" w:ascii="arial" w:hAnsi="arial"/>
+                <w:color w:val="000000"/>
+                <w:sz w:val="16"/>
+                <w:szCs w:val="16"/>
+              </w:rPr>
+              <w:t>Rear HL Down</w:t>
+            </w:r>
+          </w:p>
+        </w:tc>
+        <w:tc>
+          <w:tcPr>
+            <w:tcW w:w="1020" w:type="dxa"/>
+            <w:tcBorders>
+              <w:top w:val="single" w:sz="4" w:space="0" w:color="000000"/>
+              <w:left w:val="single" w:sz="4" w:space="0" w:color="000000"/>
+              <w:bottom w:val="single" w:sz="4" w:space="0" w:color="000000"/>
+            </w:tcBorders>
+            <w:vAlign w:val="bottom"/>
+          </w:tcPr>
+          <w:p>
+            <w:pPr>
+              <w:pStyle w:val="Normal"/>
+              <w:widowControl w:val="false"/>
+              <w:spacing w:lineRule="auto" w:line="180"/>
+              <w:jc w:val="center"/>
+              <w:rPr>
+                <w:sz w:val="16"/>
+                <w:szCs w:val="16"/>
+              </w:rPr>
+            </w:pPr>
+            <w:r>
+              <w:rPr>
+                <w:sz w:val="16"/>
+                <w:szCs w:val="16"/>
+              </w:rPr>
+            </w:r>
+          </w:p>
+        </w:tc>
+        <w:tc>
+          <w:tcPr>
+            <w:tcW w:w="1016" w:type="dxa"/>
+            <w:tcBorders>
+              <w:top w:val="single" w:sz="4" w:space="0" w:color="000000"/>
+              <w:left w:val="single" w:sz="4" w:space="0" w:color="000000"/>
+              <w:bottom w:val="single" w:sz="4" w:space="0" w:color="000000"/>
+            </w:tcBorders>
+            <w:vAlign w:val="bottom"/>
+          </w:tcPr>
+          <w:p>
+            <w:pPr>
+              <w:pStyle w:val="Normal"/>
+              <w:widowControl w:val="false"/>
+              <w:spacing w:lineRule="auto" w:line="180"/>
+              <w:jc w:val="center"/>
+              <w:rPr>
+                <w:sz w:val="16"/>
+                <w:szCs w:val="16"/>
+              </w:rPr>
+            </w:pPr>
+            <w:r>
+              <w:rPr>
+                <w:sz w:val="16"/>
+                <w:szCs w:val="16"/>
+              </w:rPr>
+              <w:t>Step Light</w:t>
+            </w:r>
+          </w:p>
+        </w:tc>
+        <w:tc>
+          <w:tcPr>
+            <w:tcW w:w="1016" w:type="dxa"/>
+            <w:tcBorders>
+              <w:top w:val="single" w:sz="4" w:space="0" w:color="000000"/>
+              <w:left w:val="single" w:sz="4" w:space="0" w:color="000000"/>
+              <w:bottom w:val="single" w:sz="4" w:space="0" w:color="000000"/>
+            </w:tcBorders>
+            <w:vAlign w:val="bottom"/>
+          </w:tcPr>
+          <w:p>
+            <w:pPr>
+              <w:pStyle w:val="Normal"/>
+              <w:widowControl w:val="false"/>
+              <w:spacing w:lineRule="auto" w:line="180"/>
+              <w:jc w:val="center"/>
+              <w:rPr>
+                <w:sz w:val="16"/>
+                <w:szCs w:val="16"/>
+              </w:rPr>
+            </w:pPr>
+            <w:r>
+              <w:rPr>
+                <w:sz w:val="16"/>
+                <w:szCs w:val="16"/>
+              </w:rPr>
+              <w:t>Number Light</w:t>
+            </w:r>
+          </w:p>
+        </w:tc>
+        <w:tc>
+          <w:tcPr>
+            <w:tcW w:w="1016" w:type="dxa"/>
+            <w:tcBorders>
+              <w:top w:val="single" w:sz="4" w:space="0" w:color="000000"/>
+              <w:left w:val="single" w:sz="4" w:space="0" w:color="000000"/>
+              <w:bottom w:val="single" w:sz="4" w:space="0" w:color="000000"/>
+            </w:tcBorders>
+            <w:vAlign w:val="bottom"/>
+          </w:tcPr>
+          <w:p>
+            <w:pPr>
+              <w:pStyle w:val="Normal"/>
+              <w:widowControl w:val="false"/>
+              <w:spacing w:lineRule="auto" w:line="180"/>
+              <w:jc w:val="center"/>
+              <w:rPr>
+                <w:sz w:val="16"/>
+                <w:szCs w:val="16"/>
+              </w:rPr>
+            </w:pPr>
+            <w:r>
+              <w:rPr>
+                <w:rFonts w:eastAsia="arial" w:ascii="arial" w:hAnsi="arial"/>
+                <w:color w:val="000000"/>
+                <w:sz w:val="16"/>
+                <w:szCs w:val="16"/>
+              </w:rPr>
+              <w:t>Exterior</w:t>
+            </w:r>
+          </w:p>
+          <w:p>
+            <w:pPr>
+              <w:pStyle w:val="Normal"/>
+              <w:widowControl w:val="false"/>
+              <w:spacing w:lineRule="auto" w:line="180"/>
+              <w:jc w:val="center"/>
+              <w:rPr>
+                <w:sz w:val="16"/>
+                <w:szCs w:val="16"/>
+              </w:rPr>
+            </w:pPr>
+            <w:r>
+              <w:rPr>
+                <w:rFonts w:eastAsia="arial" w:ascii="arial" w:hAnsi="arial"/>
+                <w:color w:val="000000"/>
+                <w:sz w:val="16"/>
+                <w:szCs w:val="16"/>
+              </w:rPr>
+              <w:t>Camera</w:t>
+            </w:r>
+          </w:p>
+        </w:tc>
+        <w:tc>
+          <w:tcPr>
+            <w:tcW w:w="1029" w:type="dxa"/>
+            <w:tcBorders>
+              <w:top w:val="single" w:sz="4" w:space="0" w:color="000000"/>
+              <w:left w:val="single" w:sz="4" w:space="0" w:color="000000"/>
+              <w:bottom w:val="single" w:sz="4" w:space="0" w:color="000000"/>
+              <w:right w:val="single" w:sz="4" w:space="0" w:color="000000"/>
+            </w:tcBorders>
+            <w:vAlign w:val="bottom"/>
+          </w:tcPr>
+          <w:p>
+            <w:pPr>
+              <w:pStyle w:val="Normal"/>
+              <w:widowControl w:val="false"/>
+              <w:spacing w:lineRule="auto" w:line="180"/>
+              <w:jc w:val="center"/>
+              <w:rPr>
+                <w:sz w:val="16"/>
+                <w:szCs w:val="16"/>
+              </w:rPr>
+            </w:pPr>
+            <w:r>
+              <w:rPr>
+                <w:rFonts w:eastAsia="arial" w:ascii="arial" w:hAnsi="arial"/>
+                <w:color w:val="000000"/>
+                <w:sz w:val="16"/>
+                <w:szCs w:val="16"/>
+              </w:rPr>
+              <w:t>Prev</w:t>
+            </w:r>
+          </w:p>
+          <w:p>
+            <w:pPr>
+              <w:pStyle w:val="Normal"/>
+              <w:widowControl w:val="false"/>
+              <w:spacing w:lineRule="auto" w:line="180"/>
+              <w:jc w:val="center"/>
+              <w:rPr>
+                <w:sz w:val="16"/>
+                <w:szCs w:val="16"/>
+              </w:rPr>
+            </w:pPr>
+            <w:r>
+              <w:rPr>
+                <w:rFonts w:eastAsia="arial" w:ascii="arial" w:hAnsi="arial"/>
+                <w:color w:val="000000"/>
+                <w:sz w:val="16"/>
+                <w:szCs w:val="16"/>
+              </w:rPr>
+              <w:t>Cab Cam</w:t>
+            </w:r>
+          </w:p>
+        </w:tc>
+      </w:tr>
+    </w:tbl>
+    <w:p>
+      <w:pPr>
+        <w:pStyle w:val="Normal"/>
+        <w:rPr>
+          <w:color w:val="000000"/>
+          <w:sz w:val="16"/>
+          <w:szCs w:val="16"/>
+        </w:rPr>
+      </w:pPr>
+      <w:r>
+        <w:rPr>
+          <w:color w:val="000000"/>
+          <w:sz w:val="16"/>
+          <w:szCs w:val="16"/>
+        </w:rPr>
+      </w:r>
+    </w:p>
+    <w:p>
+      <w:pPr>
+        <w:pStyle w:val="Normal"/>
+        <w:rPr>
+          <w:color w:val="000000"/>
+          <w:sz w:val="16"/>
+          <w:szCs w:val="16"/>
+        </w:rPr>
+      </w:pPr>
+      <w:r>
+        <w:rPr>
+          <w:color w:val="000000"/>
+          <w:sz w:val="16"/>
+          <w:szCs w:val="16"/>
+        </w:rPr>
+        <w:tab/>
+        <w:t xml:space="preserve">       </w:t>
+      </w:r>
+      <w:r>
+        <w:rPr>
+          <w:rFonts w:eastAsia="arial" w:ascii="arial" w:hAnsi="arial"/>
+          <w:color w:val="000000"/>
+          <w:sz w:val="16"/>
+          <w:szCs w:val="16"/>
+        </w:rPr>
         <w:t xml:space="preserve">    </w:t>
       </w:r>
       <w:r>
@@ -3396,7 +4503,7 @@
           <w:sz w:val="16"/>
           <w:szCs w:val="16"/>
         </w:rPr>
-        <w:t>SD70ACe</w:t>
+        <w:t>C40-8W</w:t>
       </w:r>
       <w:r>
         <w:rPr>
@@ -3491,21 +4598,20 @@
             <w:pPr>
               <w:pStyle w:val="Normal"/>
               <w:widowControl w:val="false"/>
-              <w:spacing w:lineRule="auto" w:line="180"/>
-              <w:jc w:val="center"/>
-              <w:rPr>
-                <w:color w:val="000000"/>
-                <w:sz w:val="16"/>
-                <w:szCs w:val="16"/>
-              </w:rPr>
-            </w:pPr>
-            <w:r>
-              <w:rPr>
-                <w:color w:val="000000"/>
-                <w:sz w:val="16"/>
-                <w:szCs w:val="16"/>
-              </w:rPr>
-              <w:t>Reverser Handle</w:t>
+              <w:jc w:val="center"/>
+              <w:rPr>
+                <w:color w:val="000000"/>
+                <w:sz w:val="16"/>
+                <w:szCs w:val="16"/>
+              </w:rPr>
+            </w:pPr>
+            <w:r>
+              <w:rPr>
+                <w:color w:val="000000"/>
+                <w:sz w:val="16"/>
+                <w:szCs w:val="16"/>
+              </w:rPr>
+              <w:t>MU-2A</w:t>
             </w:r>
           </w:p>
         </w:tc>
@@ -3570,7 +4676,7 @@
                 <w:sz w:val="16"/>
                 <w:szCs w:val="16"/>
               </w:rPr>
-              <w:t>EAD Fuse</w:t>
+              <w:t>Engine Run</w:t>
             </w:r>
           </w:p>
         </w:tc>
@@ -3633,7 +4739,27 @@
                 <w:sz w:val="16"/>
                 <w:szCs w:val="16"/>
               </w:rPr>
-              <w:t>Headlight Control</w:t>
+              <w:t>Brake</w:t>
+            </w:r>
+          </w:p>
+          <w:p>
+            <w:pPr>
+              <w:pStyle w:val="Normal"/>
+              <w:widowControl w:val="false"/>
+              <w:jc w:val="center"/>
+              <w:rPr>
+                <w:color w:val="000000"/>
+                <w:sz w:val="16"/>
+                <w:szCs w:val="16"/>
+              </w:rPr>
+            </w:pPr>
+            <w:r>
+              <w:rPr>
+                <w:color w:val="000000"/>
+                <w:sz w:val="16"/>
+                <w:szCs w:val="16"/>
+              </w:rPr>
+              <w:t>Cut-In</w:t>
             </w:r>
           </w:p>
         </w:tc>
@@ -3664,15 +4790,7 @@
                 <w:sz w:val="16"/>
                 <w:szCs w:val="16"/>
               </w:rPr>
-              <w:t>I</w:t>
-            </w:r>
-            <w:r>
-              <w:rPr>
-                <w:color w:val="000000"/>
-                <w:sz w:val="16"/>
-                <w:szCs w:val="16"/>
-              </w:rPr>
-              <w:t>solation Cont. Iso</w:t>
+              <w:t>Headlight Control Up</w:t>
             </w:r>
           </w:p>
         </w:tc>
@@ -3751,18 +4869,19 @@
             <w:pPr>
               <w:pStyle w:val="Normal"/>
               <w:widowControl w:val="false"/>
-              <w:spacing w:lineRule="auto" w:line="180"/>
-              <w:jc w:val="center"/>
-              <w:rPr>
-                <w:sz w:val="16"/>
-                <w:szCs w:val="16"/>
-              </w:rPr>
-            </w:pPr>
-            <w:r>
-              <w:rPr>
-                <w:sz w:val="16"/>
-                <w:szCs w:val="16"/>
-              </w:rPr>
+              <w:jc w:val="center"/>
+              <w:rPr>
+                <w:sz w:val="16"/>
+                <w:szCs w:val="16"/>
+              </w:rPr>
+            </w:pPr>
+            <w:r>
+              <w:rPr>
+                <w:color w:val="000000"/>
+                <w:sz w:val="16"/>
+                <w:szCs w:val="16"/>
+              </w:rPr>
+              <w:t>Engine Cont. Run</w:t>
             </w:r>
           </w:p>
         </w:tc>
@@ -3794,16 +4913,7 @@
                 <w:sz w:val="16"/>
                 <w:szCs w:val="16"/>
               </w:rPr>
-              <w:t>Onboard</w:t>
-            </w:r>
-            <w:r>
-              <w:rPr>
-                <w:rFonts w:eastAsia="arial" w:ascii="arial" w:hAnsi="arial"/>
-                <w:color w:val="000000"/>
-                <w:sz w:val="16"/>
-                <w:szCs w:val="16"/>
-              </w:rPr>
-              <w:t xml:space="preserve"> Light</w:t>
+              <w:t>Gauge Light</w:t>
             </w:r>
           </w:p>
         </w:tc>
@@ -3970,7 +5080,7 @@
           <w:sz w:val="16"/>
           <w:szCs w:val="16"/>
         </w:rPr>
-        <w:t>SD70ACe</w:t>
+        <w:t>C40-8W</w:t>
       </w:r>
       <w:r>
         <w:rPr>
@@ -4143,7 +5253,7 @@
                 <w:sz w:val="16"/>
                 <w:szCs w:val="16"/>
               </w:rPr>
-              <w:t>Cab Signal</w:t>
+              <w:t>Warning Devices</w:t>
             </w:r>
           </w:p>
         </w:tc>
@@ -4175,7 +5285,7 @@
                 <w:sz w:val="16"/>
                 <w:szCs w:val="16"/>
               </w:rPr>
-              <w:t>Fuel Pump</w:t>
+              <w:t>Control Switch</w:t>
             </w:r>
           </w:p>
         </w:tc>
@@ -4193,6 +5303,558 @@
             <w:pPr>
               <w:pStyle w:val="Normal"/>
               <w:widowControl w:val="false"/>
+              <w:jc w:val="center"/>
+              <w:rPr>
+                <w:color w:val="000000"/>
+                <w:sz w:val="16"/>
+                <w:szCs w:val="16"/>
+              </w:rPr>
+            </w:pPr>
+            <w:r>
+              <w:rPr>
+                <w:color w:val="000000"/>
+                <w:sz w:val="16"/>
+                <w:szCs w:val="16"/>
+              </w:rPr>
+              <w:t>Brake</w:t>
+            </w:r>
+          </w:p>
+          <w:p>
+            <w:pPr>
+              <w:pStyle w:val="Normal"/>
+              <w:widowControl w:val="false"/>
+              <w:jc w:val="center"/>
+              <w:rPr>
+                <w:color w:val="000000"/>
+                <w:sz w:val="16"/>
+                <w:szCs w:val="16"/>
+              </w:rPr>
+            </w:pPr>
+            <w:r>
+              <w:rPr>
+                <w:color w:val="000000"/>
+                <w:sz w:val="16"/>
+                <w:szCs w:val="16"/>
+              </w:rPr>
+              <w:t>Cut-</w:t>
+            </w:r>
+            <w:r>
+              <w:rPr>
+                <w:color w:val="000000"/>
+                <w:sz w:val="16"/>
+                <w:szCs w:val="16"/>
+              </w:rPr>
+              <w:t>Out</w:t>
+            </w:r>
+          </w:p>
+        </w:tc>
+        <w:tc>
+          <w:tcPr>
+            <w:tcW w:w="1016" w:type="dxa"/>
+            <w:tcBorders>
+              <w:top w:val="single" w:sz="4" w:space="0" w:color="000000"/>
+              <w:left w:val="single" w:sz="4" w:space="0" w:color="000000"/>
+              <w:bottom w:val="single" w:sz="4" w:space="0" w:color="000000"/>
+            </w:tcBorders>
+            <w:vAlign w:val="bottom"/>
+          </w:tcPr>
+          <w:p>
+            <w:pPr>
+              <w:pStyle w:val="Normal"/>
+              <w:widowControl w:val="false"/>
+              <w:jc w:val="center"/>
+              <w:rPr>
+                <w:color w:val="000000"/>
+                <w:sz w:val="16"/>
+                <w:szCs w:val="16"/>
+              </w:rPr>
+            </w:pPr>
+            <w:r>
+              <w:rPr>
+                <w:rFonts w:eastAsia="arial" w:ascii="arial" w:hAnsi="arial"/>
+                <w:color w:val="000000"/>
+                <w:sz w:val="16"/>
+                <w:szCs w:val="16"/>
+              </w:rPr>
+              <w:t>Headlight Control Dw</w:t>
+            </w:r>
+          </w:p>
+        </w:tc>
+        <w:tc>
+          <w:tcPr>
+            <w:tcW w:w="1017" w:type="dxa"/>
+            <w:tcBorders>
+              <w:top w:val="single" w:sz="4" w:space="0" w:color="000000"/>
+              <w:left w:val="single" w:sz="4" w:space="0" w:color="000000"/>
+              <w:bottom w:val="single" w:sz="4" w:space="0" w:color="000000"/>
+            </w:tcBorders>
+            <w:vAlign w:val="bottom"/>
+          </w:tcPr>
+          <w:p>
+            <w:pPr>
+              <w:pStyle w:val="Normal"/>
+              <w:widowControl w:val="false"/>
+              <w:jc w:val="center"/>
+              <w:rPr>
+                <w:rFonts w:ascii="arial" w:hAnsi="arial" w:eastAsia="arial"/>
+                <w:color w:val="000000"/>
+                <w:sz w:val="16"/>
+                <w:szCs w:val="16"/>
+              </w:rPr>
+            </w:pPr>
+            <w:r>
+              <w:rPr>
+                <w:rFonts w:eastAsia="arial" w:ascii="arial" w:hAnsi="arial"/>
+                <w:color w:val="000000"/>
+                <w:sz w:val="16"/>
+                <w:szCs w:val="16"/>
+              </w:rPr>
+              <w:t>Lead Sand</w:t>
+            </w:r>
+          </w:p>
+        </w:tc>
+        <w:tc>
+          <w:tcPr>
+            <w:tcW w:w="1016" w:type="dxa"/>
+            <w:tcBorders>
+              <w:top w:val="single" w:sz="4" w:space="0" w:color="000000"/>
+              <w:left w:val="single" w:sz="4" w:space="0" w:color="000000"/>
+              <w:bottom w:val="single" w:sz="4" w:space="0" w:color="000000"/>
+            </w:tcBorders>
+            <w:vAlign w:val="bottom"/>
+          </w:tcPr>
+          <w:p>
+            <w:pPr>
+              <w:pStyle w:val="Normal"/>
+              <w:widowControl w:val="false"/>
+              <w:jc w:val="center"/>
+              <w:rPr>
+                <w:sz w:val="16"/>
+                <w:szCs w:val="16"/>
+              </w:rPr>
+            </w:pPr>
+            <w:r>
+              <w:rPr>
+                <w:rFonts w:eastAsia="arial" w:ascii="arial" w:hAnsi="arial"/>
+                <w:color w:val="000000"/>
+                <w:sz w:val="16"/>
+                <w:szCs w:val="16"/>
+              </w:rPr>
+              <w:t>Rear HL Down</w:t>
+            </w:r>
+          </w:p>
+        </w:tc>
+        <w:tc>
+          <w:tcPr>
+            <w:tcW w:w="1020" w:type="dxa"/>
+            <w:tcBorders>
+              <w:top w:val="single" w:sz="4" w:space="0" w:color="000000"/>
+              <w:left w:val="single" w:sz="4" w:space="0" w:color="000000"/>
+              <w:bottom w:val="single" w:sz="4" w:space="0" w:color="000000"/>
+            </w:tcBorders>
+            <w:vAlign w:val="bottom"/>
+          </w:tcPr>
+          <w:p>
+            <w:pPr>
+              <w:pStyle w:val="Normal"/>
+              <w:widowControl w:val="false"/>
+              <w:jc w:val="center"/>
+              <w:rPr>
+                <w:sz w:val="16"/>
+                <w:szCs w:val="16"/>
+              </w:rPr>
+            </w:pPr>
+            <w:r>
+              <w:rPr>
+                <w:rFonts w:eastAsia="arial" w:ascii="arial" w:hAnsi="arial"/>
+                <w:color w:val="000000"/>
+                <w:sz w:val="16"/>
+                <w:szCs w:val="16"/>
+              </w:rPr>
+              <w:t>Engine Cont. Jog</w:t>
+            </w:r>
+          </w:p>
+        </w:tc>
+        <w:tc>
+          <w:tcPr>
+            <w:tcW w:w="1016" w:type="dxa"/>
+            <w:tcBorders>
+              <w:top w:val="single" w:sz="4" w:space="0" w:color="000000"/>
+              <w:left w:val="single" w:sz="4" w:space="0" w:color="000000"/>
+              <w:bottom w:val="single" w:sz="4" w:space="0" w:color="000000"/>
+            </w:tcBorders>
+            <w:vAlign w:val="bottom"/>
+          </w:tcPr>
+          <w:p>
+            <w:pPr>
+              <w:pStyle w:val="Normal"/>
+              <w:widowControl w:val="false"/>
+              <w:spacing w:lineRule="auto" w:line="180"/>
+              <w:jc w:val="center"/>
+              <w:rPr>
+                <w:sz w:val="16"/>
+                <w:szCs w:val="16"/>
+              </w:rPr>
+            </w:pPr>
+            <w:r>
+              <w:rPr>
+                <w:sz w:val="16"/>
+                <w:szCs w:val="16"/>
+              </w:rPr>
+              <w:t>Step Light</w:t>
+            </w:r>
+          </w:p>
+        </w:tc>
+        <w:tc>
+          <w:tcPr>
+            <w:tcW w:w="1016" w:type="dxa"/>
+            <w:tcBorders>
+              <w:top w:val="single" w:sz="4" w:space="0" w:color="000000"/>
+              <w:left w:val="single" w:sz="4" w:space="0" w:color="000000"/>
+              <w:bottom w:val="single" w:sz="4" w:space="0" w:color="000000"/>
+            </w:tcBorders>
+            <w:vAlign w:val="bottom"/>
+          </w:tcPr>
+          <w:p>
+            <w:pPr>
+              <w:pStyle w:val="Normal"/>
+              <w:widowControl w:val="false"/>
+              <w:spacing w:lineRule="auto" w:line="180"/>
+              <w:jc w:val="center"/>
+              <w:rPr>
+                <w:sz w:val="16"/>
+                <w:szCs w:val="16"/>
+              </w:rPr>
+            </w:pPr>
+            <w:r>
+              <w:rPr>
+                <w:sz w:val="16"/>
+                <w:szCs w:val="16"/>
+              </w:rPr>
+              <w:t>Number Light</w:t>
+            </w:r>
+          </w:p>
+        </w:tc>
+        <w:tc>
+          <w:tcPr>
+            <w:tcW w:w="1016" w:type="dxa"/>
+            <w:tcBorders>
+              <w:top w:val="single" w:sz="4" w:space="0" w:color="000000"/>
+              <w:left w:val="single" w:sz="4" w:space="0" w:color="000000"/>
+              <w:bottom w:val="single" w:sz="4" w:space="0" w:color="000000"/>
+            </w:tcBorders>
+            <w:vAlign w:val="bottom"/>
+          </w:tcPr>
+          <w:p>
+            <w:pPr>
+              <w:pStyle w:val="Normal"/>
+              <w:widowControl w:val="false"/>
+              <w:spacing w:lineRule="auto" w:line="180"/>
+              <w:jc w:val="center"/>
+              <w:rPr>
+                <w:sz w:val="16"/>
+                <w:szCs w:val="16"/>
+              </w:rPr>
+            </w:pPr>
+            <w:r>
+              <w:rPr>
+                <w:rFonts w:eastAsia="arial" w:ascii="arial" w:hAnsi="arial"/>
+                <w:color w:val="000000"/>
+                <w:sz w:val="16"/>
+                <w:szCs w:val="16"/>
+              </w:rPr>
+              <w:t>Exterior</w:t>
+            </w:r>
+          </w:p>
+          <w:p>
+            <w:pPr>
+              <w:pStyle w:val="Normal"/>
+              <w:widowControl w:val="false"/>
+              <w:spacing w:lineRule="auto" w:line="180"/>
+              <w:jc w:val="center"/>
+              <w:rPr>
+                <w:sz w:val="16"/>
+                <w:szCs w:val="16"/>
+              </w:rPr>
+            </w:pPr>
+            <w:r>
+              <w:rPr>
+                <w:rFonts w:eastAsia="arial" w:ascii="arial" w:hAnsi="arial"/>
+                <w:color w:val="000000"/>
+                <w:sz w:val="16"/>
+                <w:szCs w:val="16"/>
+              </w:rPr>
+              <w:t>Camera</w:t>
+            </w:r>
+          </w:p>
+        </w:tc>
+        <w:tc>
+          <w:tcPr>
+            <w:tcW w:w="1029" w:type="dxa"/>
+            <w:tcBorders>
+              <w:top w:val="single" w:sz="4" w:space="0" w:color="000000"/>
+              <w:left w:val="single" w:sz="4" w:space="0" w:color="000000"/>
+              <w:bottom w:val="single" w:sz="4" w:space="0" w:color="000000"/>
+              <w:right w:val="single" w:sz="4" w:space="0" w:color="000000"/>
+            </w:tcBorders>
+            <w:vAlign w:val="bottom"/>
+          </w:tcPr>
+          <w:p>
+            <w:pPr>
+              <w:pStyle w:val="Normal"/>
+              <w:widowControl w:val="false"/>
+              <w:spacing w:lineRule="auto" w:line="180"/>
+              <w:jc w:val="center"/>
+              <w:rPr>
+                <w:sz w:val="16"/>
+                <w:szCs w:val="16"/>
+              </w:rPr>
+            </w:pPr>
+            <w:r>
+              <w:rPr>
+                <w:rFonts w:eastAsia="arial" w:ascii="arial" w:hAnsi="arial"/>
+                <w:color w:val="000000"/>
+                <w:sz w:val="16"/>
+                <w:szCs w:val="16"/>
+              </w:rPr>
+              <w:t>Prev</w:t>
+            </w:r>
+          </w:p>
+          <w:p>
+            <w:pPr>
+              <w:pStyle w:val="Normal"/>
+              <w:widowControl w:val="false"/>
+              <w:spacing w:lineRule="auto" w:line="180"/>
+              <w:jc w:val="center"/>
+              <w:rPr>
+                <w:sz w:val="16"/>
+                <w:szCs w:val="16"/>
+              </w:rPr>
+            </w:pPr>
+            <w:r>
+              <w:rPr>
+                <w:rFonts w:eastAsia="arial" w:ascii="arial" w:hAnsi="arial"/>
+                <w:color w:val="000000"/>
+                <w:sz w:val="16"/>
+                <w:szCs w:val="16"/>
+              </w:rPr>
+              <w:t>Cab Cam</w:t>
+            </w:r>
+          </w:p>
+        </w:tc>
+      </w:tr>
+    </w:tbl>
+    <w:p>
+      <w:pPr>
+        <w:pStyle w:val="Normal"/>
+        <w:rPr>
+          <w:color w:val="000000"/>
+          <w:sz w:val="16"/>
+          <w:szCs w:val="16"/>
+        </w:rPr>
+      </w:pPr>
+      <w:r>
+        <w:rPr>
+          <w:color w:val="000000"/>
+          <w:sz w:val="16"/>
+          <w:szCs w:val="16"/>
+        </w:rPr>
+      </w:r>
+    </w:p>
+    <w:p>
+      <w:pPr>
+        <w:pStyle w:val="Normal"/>
+        <w:rPr>
+          <w:color w:val="000000"/>
+          <w:sz w:val="16"/>
+          <w:szCs w:val="16"/>
+        </w:rPr>
+      </w:pPr>
+      <w:r>
+        <w:rPr>
+          <w:color w:val="000000"/>
+          <w:sz w:val="16"/>
+          <w:szCs w:val="16"/>
+        </w:rPr>
+        <w:tab/>
+        <w:t xml:space="preserve">       </w:t>
+      </w:r>
+      <w:r>
+        <w:rPr>
+          <w:rFonts w:eastAsia="arial" w:ascii="arial" w:hAnsi="arial"/>
+          <w:color w:val="000000"/>
+          <w:sz w:val="16"/>
+          <w:szCs w:val="16"/>
+        </w:rPr>
+        <w:t xml:space="preserve">    ES44</w:t>
+      </w:r>
+      <w:r>
+        <w:rPr>
+          <w:rFonts w:eastAsia="arial" w:ascii="arial" w:hAnsi="arial"/>
+          <w:color w:val="000000"/>
+          <w:sz w:val="16"/>
+          <w:szCs w:val="16"/>
+        </w:rPr>
+        <w:t>AC</w:t>
+      </w:r>
+      <w:r>
+        <w:rPr>
+          <w:rFonts w:eastAsia="arial" w:ascii="arial" w:hAnsi="arial"/>
+          <w:color w:val="000000"/>
+          <w:sz w:val="16"/>
+          <w:szCs w:val="16"/>
+        </w:rPr>
+        <w:t>-1</w:t>
+      </w:r>
+    </w:p>
+    <w:tbl>
+      <w:tblPr>
+        <w:tblW w:w="14248" w:type="dxa"/>
+        <w:jc w:val="left"/>
+        <w:tblInd w:w="-5" w:type="dxa"/>
+        <w:tblLayout w:type="fixed"/>
+        <w:tblCellMar>
+          <w:top w:w="0" w:type="dxa"/>
+          <w:left w:w="108" w:type="dxa"/>
+          <w:bottom w:w="0" w:type="dxa"/>
+          <w:right w:w="108" w:type="dxa"/>
+        </w:tblCellMar>
+        <w:tblLook w:firstRow="1" w:noVBand="1" w:lastRow="0" w:firstColumn="1" w:lastColumn="0" w:noHBand="0" w:val="04a0"/>
+      </w:tblPr>
+      <w:tblGrid>
+        <w:gridCol w:w="1017"/>
+        <w:gridCol w:w="1019"/>
+        <w:gridCol w:w="1014"/>
+        <w:gridCol w:w="1016"/>
+        <w:gridCol w:w="1020"/>
+        <w:gridCol w:w="1016"/>
+        <w:gridCol w:w="1016"/>
+        <w:gridCol w:w="1017"/>
+        <w:gridCol w:w="1016"/>
+        <w:gridCol w:w="1020"/>
+        <w:gridCol w:w="1016"/>
+        <w:gridCol w:w="1016"/>
+        <w:gridCol w:w="1016"/>
+        <w:gridCol w:w="1029"/>
+      </w:tblGrid>
+      <w:tr>
+        <w:trPr>
+          <w:trHeight w:val="440" w:hRule="exact"/>
+          <w:cantSplit w:val="true"/>
+        </w:trPr>
+        <w:tc>
+          <w:tcPr>
+            <w:tcW w:w="1017" w:type="dxa"/>
+            <w:tcBorders>
+              <w:top w:val="single" w:sz="4" w:space="0" w:color="000000"/>
+              <w:left w:val="single" w:sz="4" w:space="0" w:color="000000"/>
+              <w:bottom w:val="single" w:sz="4" w:space="0" w:color="000000"/>
+            </w:tcBorders>
+            <w:vAlign w:val="bottom"/>
+          </w:tcPr>
+          <w:p>
+            <w:pPr>
+              <w:pStyle w:val="Normal"/>
+              <w:widowControl w:val="false"/>
+              <w:spacing w:lineRule="auto" w:line="180" w:before="0" w:after="60"/>
+              <w:jc w:val="center"/>
+              <w:rPr>
+                <w:color w:val="000000"/>
+                <w:sz w:val="16"/>
+                <w:szCs w:val="16"/>
+              </w:rPr>
+            </w:pPr>
+            <w:r>
+              <w:rPr>
+                <w:rFonts w:eastAsia="arial" w:ascii="arial" w:hAnsi="arial"/>
+                <w:b/>
+                <w:color w:val="000000"/>
+                <w:sz w:val="16"/>
+                <w:szCs w:val="16"/>
+              </w:rPr>
+              <w:t>Pause</w:t>
+            </w:r>
+          </w:p>
+        </w:tc>
+        <w:tc>
+          <w:tcPr>
+            <w:tcW w:w="1019" w:type="dxa"/>
+            <w:tcBorders>
+              <w:top w:val="single" w:sz="4" w:space="0" w:color="000000"/>
+              <w:left w:val="single" w:sz="4" w:space="0" w:color="000000"/>
+              <w:bottom w:val="single" w:sz="4" w:space="0" w:color="000000"/>
+            </w:tcBorders>
+            <w:vAlign w:val="bottom"/>
+          </w:tcPr>
+          <w:p>
+            <w:pPr>
+              <w:pStyle w:val="Normal"/>
+              <w:widowControl w:val="false"/>
+              <w:spacing w:lineRule="auto" w:line="180"/>
+              <w:jc w:val="center"/>
+              <w:rPr>
+                <w:color w:val="000000"/>
+                <w:sz w:val="16"/>
+                <w:szCs w:val="16"/>
+              </w:rPr>
+            </w:pPr>
+            <w:r>
+              <w:rPr>
+                <w:color w:val="000000"/>
+                <w:sz w:val="16"/>
+                <w:szCs w:val="16"/>
+              </w:rPr>
+              <w:t>Reverser Handle</w:t>
+            </w:r>
+          </w:p>
+        </w:tc>
+        <w:tc>
+          <w:tcPr>
+            <w:tcW w:w="1014" w:type="dxa"/>
+            <w:tcBorders>
+              <w:top w:val="single" w:sz="4" w:space="0" w:color="000000"/>
+              <w:left w:val="single" w:sz="4" w:space="0" w:color="000000"/>
+              <w:bottom w:val="single" w:sz="4" w:space="0" w:color="000000"/>
+            </w:tcBorders>
+            <w:vAlign w:val="bottom"/>
+          </w:tcPr>
+          <w:p>
+            <w:pPr>
+              <w:pStyle w:val="Normal"/>
+              <w:widowControl w:val="false"/>
+              <w:spacing w:lineRule="auto" w:line="180"/>
+              <w:jc w:val="center"/>
+              <w:rPr>
+                <w:color w:val="000000"/>
+                <w:sz w:val="16"/>
+                <w:szCs w:val="16"/>
+              </w:rPr>
+            </w:pPr>
+            <w:r>
+              <w:rPr>
+                <w:rFonts w:eastAsia="arial" w:ascii="arial" w:hAnsi="arial"/>
+                <w:color w:val="000000"/>
+                <w:sz w:val="16"/>
+                <w:szCs w:val="16"/>
+              </w:rPr>
+              <w:t>Engine Start</w:t>
+            </w:r>
+          </w:p>
+        </w:tc>
+        <w:tc>
+          <w:tcPr>
+            <w:tcW w:w="1016" w:type="dxa"/>
+            <w:tcBorders>
+              <w:top w:val="single" w:sz="4" w:space="0" w:color="000000"/>
+              <w:left w:val="single" w:sz="4" w:space="0" w:color="000000"/>
+              <w:bottom w:val="single" w:sz="4" w:space="0" w:color="000000"/>
+            </w:tcBorders>
+            <w:vAlign w:val="bottom"/>
+          </w:tcPr>
+          <w:p>
+            <w:pPr>
+              <w:pStyle w:val="Normal"/>
+              <w:widowControl w:val="false"/>
               <w:spacing w:lineRule="auto" w:line="180"/>
               <w:jc w:val="center"/>
               <w:rPr>
@@ -4213,6 +5875,38 @@
         </w:tc>
         <w:tc>
           <w:tcPr>
+            <w:tcW w:w="1020" w:type="dxa"/>
+            <w:tcBorders>
+              <w:top w:val="single" w:sz="4" w:space="0" w:color="000000"/>
+              <w:left w:val="single" w:sz="4" w:space="0" w:color="000000"/>
+              <w:bottom w:val="single" w:sz="4" w:space="0" w:color="000000"/>
+            </w:tcBorders>
+            <w:vAlign w:val="bottom"/>
+          </w:tcPr>
+          <w:p>
+            <w:pPr>
+              <w:pStyle w:val="Normal"/>
+              <w:widowControl w:val="false"/>
+              <w:spacing w:lineRule="auto" w:line="180"/>
+              <w:jc w:val="center"/>
+              <w:rPr>
+                <w:color w:val="000000"/>
+                <w:sz w:val="16"/>
+                <w:szCs w:val="16"/>
+              </w:rPr>
+            </w:pPr>
+            <w:r>
+              <w:rPr>
+                <w:color w:val="000000"/>
+                <w:sz w:val="16"/>
+                <w:szCs w:val="16"/>
+              </w:rPr>
+              <w:t>Generator Field</w:t>
+            </w:r>
+          </w:p>
+        </w:tc>
+        <w:tc>
+          <w:tcPr>
             <w:tcW w:w="1016" w:type="dxa"/>
             <w:tcBorders>
               <w:top w:val="single" w:sz="4" w:space="0" w:color="000000"/>
@@ -4234,21 +5928,42 @@
             </w:pPr>
             <w:r>
               <w:rPr>
-                <w:rFonts w:eastAsia="arial" w:ascii="arial" w:hAnsi="arial"/>
-                <w:color w:val="000000"/>
-                <w:sz w:val="16"/>
-                <w:szCs w:val="16"/>
-              </w:rPr>
-              <w:t>I</w:t>
-            </w:r>
-            <w:r>
-              <w:rPr>
-                <w:rFonts w:eastAsia="arial" w:ascii="arial" w:hAnsi="arial"/>
-                <w:color w:val="000000"/>
-                <w:sz w:val="16"/>
-                <w:szCs w:val="16"/>
-              </w:rPr>
-              <w:t>solation Cont. D.B.</w:t>
+                <w:color w:val="000000"/>
+                <w:sz w:val="16"/>
+                <w:szCs w:val="16"/>
+              </w:rPr>
+              <w:t>Headlight Control Up</w:t>
+            </w:r>
+          </w:p>
+        </w:tc>
+        <w:tc>
+          <w:tcPr>
+            <w:tcW w:w="1016" w:type="dxa"/>
+            <w:tcBorders>
+              <w:top w:val="single" w:sz="4" w:space="0" w:color="000000"/>
+              <w:left w:val="single" w:sz="4" w:space="0" w:color="000000"/>
+              <w:bottom w:val="single" w:sz="4" w:space="0" w:color="000000"/>
+            </w:tcBorders>
+            <w:vAlign w:val="bottom"/>
+          </w:tcPr>
+          <w:p>
+            <w:pPr>
+              <w:pStyle w:val="Normal"/>
+              <w:widowControl w:val="false"/>
+              <w:jc w:val="center"/>
+              <w:rPr>
+                <w:color w:val="000000"/>
+                <w:sz w:val="16"/>
+                <w:szCs w:val="16"/>
+              </w:rPr>
+            </w:pPr>
+            <w:r>
+              <w:rPr>
+                <w:color w:val="000000"/>
+                <w:sz w:val="16"/>
+                <w:szCs w:val="16"/>
+              </w:rPr>
+              <w:t>Engine Cont. Run</w:t>
             </w:r>
           </w:p>
         </w:tc>
@@ -4268,6 +5983,563 @@
               <w:widowControl w:val="false"/>
               <w:jc w:val="center"/>
               <w:rPr>
+                <w:color w:val="000000"/>
+                <w:sz w:val="16"/>
+                <w:szCs w:val="16"/>
+              </w:rPr>
+            </w:pPr>
+            <w:r>
+              <w:rPr>
+                <w:rFonts w:eastAsia="arial" w:ascii="arial" w:hAnsi="arial"/>
+                <w:color w:val="000000"/>
+                <w:sz w:val="16"/>
+                <w:szCs w:val="16"/>
+              </w:rPr>
+              <w:t>Banking COMM</w:t>
+            </w:r>
+          </w:p>
+        </w:tc>
+        <w:tc>
+          <w:tcPr>
+            <w:tcW w:w="1016" w:type="dxa"/>
+            <w:tcBorders>
+              <w:top w:val="single" w:sz="4" w:space="0" w:color="000000"/>
+              <w:left w:val="single" w:sz="4" w:space="0" w:color="000000"/>
+              <w:bottom w:val="single" w:sz="4" w:space="0" w:color="000000"/>
+            </w:tcBorders>
+            <w:vAlign w:val="bottom"/>
+          </w:tcPr>
+          <w:p>
+            <w:pPr>
+              <w:pStyle w:val="Normal"/>
+              <w:widowControl w:val="false"/>
+              <w:jc w:val="center"/>
+              <w:rPr>
+                <w:sz w:val="16"/>
+                <w:szCs w:val="16"/>
+              </w:rPr>
+            </w:pPr>
+            <w:r>
+              <w:rPr>
+                <w:sz w:val="16"/>
+                <w:szCs w:val="16"/>
+              </w:rPr>
+              <w:t>Rear HL Up</w:t>
+            </w:r>
+          </w:p>
+        </w:tc>
+        <w:tc>
+          <w:tcPr>
+            <w:tcW w:w="1020" w:type="dxa"/>
+            <w:tcBorders>
+              <w:top w:val="single" w:sz="4" w:space="0" w:color="000000"/>
+              <w:left w:val="single" w:sz="4" w:space="0" w:color="000000"/>
+              <w:bottom w:val="single" w:sz="4" w:space="0" w:color="000000"/>
+            </w:tcBorders>
+            <w:vAlign w:val="bottom"/>
+          </w:tcPr>
+          <w:p>
+            <w:pPr>
+              <w:pStyle w:val="Normal"/>
+              <w:widowControl w:val="false"/>
+              <w:spacing w:lineRule="auto" w:line="180"/>
+              <w:jc w:val="center"/>
+              <w:rPr>
+                <w:sz w:val="16"/>
+                <w:szCs w:val="16"/>
+              </w:rPr>
+            </w:pPr>
+            <w:r>
+              <w:rPr>
+                <w:sz w:val="16"/>
+                <w:szCs w:val="16"/>
+              </w:rPr>
+            </w:r>
+          </w:p>
+        </w:tc>
+        <w:tc>
+          <w:tcPr>
+            <w:tcW w:w="1016" w:type="dxa"/>
+            <w:tcBorders>
+              <w:top w:val="single" w:sz="4" w:space="0" w:color="000000"/>
+              <w:left w:val="single" w:sz="4" w:space="0" w:color="000000"/>
+              <w:bottom w:val="single" w:sz="4" w:space="0" w:color="000000"/>
+            </w:tcBorders>
+            <w:vAlign w:val="bottom"/>
+          </w:tcPr>
+          <w:p>
+            <w:pPr>
+              <w:pStyle w:val="Normal"/>
+              <w:widowControl w:val="false"/>
+              <w:spacing w:lineRule="auto" w:line="180"/>
+              <w:jc w:val="center"/>
+              <w:rPr>
+                <w:sz w:val="16"/>
+                <w:szCs w:val="16"/>
+              </w:rPr>
+            </w:pPr>
+            <w:r>
+              <w:rPr>
+                <w:rFonts w:eastAsia="arial" w:ascii="arial" w:hAnsi="arial"/>
+                <w:color w:val="000000"/>
+                <w:sz w:val="16"/>
+                <w:szCs w:val="16"/>
+              </w:rPr>
+              <w:t>Gauge Light</w:t>
+            </w:r>
+          </w:p>
+        </w:tc>
+        <w:tc>
+          <w:tcPr>
+            <w:tcW w:w="1016" w:type="dxa"/>
+            <w:tcBorders>
+              <w:top w:val="single" w:sz="4" w:space="0" w:color="000000"/>
+              <w:left w:val="single" w:sz="4" w:space="0" w:color="000000"/>
+              <w:bottom w:val="single" w:sz="4" w:space="0" w:color="000000"/>
+            </w:tcBorders>
+            <w:vAlign w:val="bottom"/>
+          </w:tcPr>
+          <w:p>
+            <w:pPr>
+              <w:pStyle w:val="Normal"/>
+              <w:widowControl w:val="false"/>
+              <w:spacing w:lineRule="auto" w:line="180"/>
+              <w:jc w:val="center"/>
+              <w:rPr>
+                <w:sz w:val="16"/>
+                <w:szCs w:val="16"/>
+              </w:rPr>
+            </w:pPr>
+            <w:r>
+              <w:rPr>
+                <w:sz w:val="16"/>
+                <w:szCs w:val="16"/>
+              </w:rPr>
+              <w:t>Cab Light</w:t>
+            </w:r>
+          </w:p>
+        </w:tc>
+        <w:tc>
+          <w:tcPr>
+            <w:tcW w:w="1016" w:type="dxa"/>
+            <w:tcBorders>
+              <w:top w:val="single" w:sz="4" w:space="0" w:color="000000"/>
+              <w:left w:val="single" w:sz="4" w:space="0" w:color="000000"/>
+              <w:bottom w:val="single" w:sz="4" w:space="0" w:color="000000"/>
+            </w:tcBorders>
+            <w:vAlign w:val="bottom"/>
+          </w:tcPr>
+          <w:p>
+            <w:pPr>
+              <w:pStyle w:val="Normal"/>
+              <w:widowControl w:val="false"/>
+              <w:spacing w:lineRule="auto" w:line="180"/>
+              <w:jc w:val="center"/>
+              <w:rPr>
+                <w:sz w:val="16"/>
+                <w:szCs w:val="16"/>
+              </w:rPr>
+            </w:pPr>
+            <w:r>
+              <w:rPr>
+                <w:rFonts w:eastAsia="arial" w:ascii="arial" w:hAnsi="arial"/>
+                <w:color w:val="000000"/>
+                <w:sz w:val="16"/>
+                <w:szCs w:val="16"/>
+              </w:rPr>
+              <w:t>1-Person</w:t>
+            </w:r>
+          </w:p>
+        </w:tc>
+        <w:tc>
+          <w:tcPr>
+            <w:tcW w:w="1029" w:type="dxa"/>
+            <w:tcBorders>
+              <w:top w:val="single" w:sz="4" w:space="0" w:color="000000"/>
+              <w:left w:val="single" w:sz="4" w:space="0" w:color="000000"/>
+              <w:bottom w:val="single" w:sz="4" w:space="0" w:color="000000"/>
+              <w:right w:val="single" w:sz="4" w:space="0" w:color="000000"/>
+            </w:tcBorders>
+            <w:vAlign w:val="bottom"/>
+          </w:tcPr>
+          <w:p>
+            <w:pPr>
+              <w:pStyle w:val="Normal"/>
+              <w:widowControl w:val="false"/>
+              <w:spacing w:lineRule="auto" w:line="180"/>
+              <w:jc w:val="center"/>
+              <w:rPr>
+                <w:sz w:val="16"/>
+                <w:szCs w:val="16"/>
+              </w:rPr>
+            </w:pPr>
+            <w:r>
+              <w:rPr>
+                <w:rFonts w:eastAsia="arial" w:ascii="arial" w:hAnsi="arial"/>
+                <w:color w:val="000000"/>
+                <w:sz w:val="16"/>
+                <w:szCs w:val="16"/>
+              </w:rPr>
+              <w:t>Next</w:t>
+            </w:r>
+          </w:p>
+          <w:p>
+            <w:pPr>
+              <w:pStyle w:val="Normal"/>
+              <w:widowControl w:val="false"/>
+              <w:spacing w:lineRule="auto" w:line="180"/>
+              <w:jc w:val="center"/>
+              <w:rPr>
+                <w:sz w:val="16"/>
+                <w:szCs w:val="16"/>
+              </w:rPr>
+            </w:pPr>
+            <w:r>
+              <w:rPr>
+                <w:rFonts w:eastAsia="arial" w:ascii="arial" w:hAnsi="arial"/>
+                <w:color w:val="000000"/>
+                <w:sz w:val="16"/>
+                <w:szCs w:val="16"/>
+              </w:rPr>
+              <w:t>Cab Cam</w:t>
+            </w:r>
+          </w:p>
+        </w:tc>
+      </w:tr>
+    </w:tbl>
+    <w:p>
+      <w:pPr>
+        <w:pStyle w:val="Normal"/>
+        <w:rPr>
+          <w:rFonts w:ascii="arial" w:hAnsi="arial" w:eastAsia="arial"/>
+          <w:color w:val="000000"/>
+          <w:sz w:val="16"/>
+          <w:szCs w:val="16"/>
+        </w:rPr>
+      </w:pPr>
+      <w:r>
+        <w:rPr>
+          <w:rFonts w:eastAsia="arial" w:ascii="arial" w:hAnsi="arial"/>
+          <w:color w:val="000000"/>
+          <w:sz w:val="16"/>
+          <w:szCs w:val="16"/>
+        </w:rPr>
+      </w:r>
+    </w:p>
+    <w:p>
+      <w:pPr>
+        <w:pStyle w:val="Normal"/>
+        <w:rPr>
+          <w:color w:val="000000"/>
+          <w:sz w:val="16"/>
+          <w:szCs w:val="16"/>
+        </w:rPr>
+      </w:pPr>
+      <w:r>
+        <w:rPr>
+          <w:rFonts w:eastAsia="arial" w:ascii="arial" w:hAnsi="arial"/>
+          <w:color w:val="000000"/>
+          <w:sz w:val="16"/>
+          <w:szCs w:val="16"/>
+        </w:rPr>
+        <w:tab/>
+        <w:t xml:space="preserve">           ES44</w:t>
+      </w:r>
+      <w:r>
+        <w:rPr>
+          <w:rFonts w:eastAsia="arial" w:ascii="arial" w:hAnsi="arial"/>
+          <w:color w:val="000000"/>
+          <w:sz w:val="16"/>
+          <w:szCs w:val="16"/>
+        </w:rPr>
+        <w:t>AC</w:t>
+      </w:r>
+      <w:r>
+        <w:rPr>
+          <w:rFonts w:eastAsia="arial" w:ascii="arial" w:hAnsi="arial"/>
+          <w:color w:val="000000"/>
+          <w:sz w:val="16"/>
+          <w:szCs w:val="16"/>
+        </w:rPr>
+        <w:t>-2</w:t>
+      </w:r>
+    </w:p>
+    <w:tbl>
+      <w:tblPr>
+        <w:tblW w:w="14248" w:type="dxa"/>
+        <w:jc w:val="left"/>
+        <w:tblInd w:w="-5" w:type="dxa"/>
+        <w:tblLayout w:type="fixed"/>
+        <w:tblCellMar>
+          <w:top w:w="0" w:type="dxa"/>
+          <w:left w:w="108" w:type="dxa"/>
+          <w:bottom w:w="0" w:type="dxa"/>
+          <w:right w:w="108" w:type="dxa"/>
+        </w:tblCellMar>
+        <w:tblLook w:firstRow="1" w:noVBand="1" w:lastRow="0" w:firstColumn="1" w:lastColumn="0" w:noHBand="0" w:val="04a0"/>
+      </w:tblPr>
+      <w:tblGrid>
+        <w:gridCol w:w="1017"/>
+        <w:gridCol w:w="1019"/>
+        <w:gridCol w:w="1014"/>
+        <w:gridCol w:w="1016"/>
+        <w:gridCol w:w="1020"/>
+        <w:gridCol w:w="1016"/>
+        <w:gridCol w:w="1016"/>
+        <w:gridCol w:w="1017"/>
+        <w:gridCol w:w="1016"/>
+        <w:gridCol w:w="1020"/>
+        <w:gridCol w:w="1016"/>
+        <w:gridCol w:w="1016"/>
+        <w:gridCol w:w="1016"/>
+        <w:gridCol w:w="1029"/>
+      </w:tblGrid>
+      <w:tr>
+        <w:trPr>
+          <w:trHeight w:val="440" w:hRule="exact"/>
+          <w:cantSplit w:val="true"/>
+        </w:trPr>
+        <w:tc>
+          <w:tcPr>
+            <w:tcW w:w="1017" w:type="dxa"/>
+            <w:tcBorders>
+              <w:top w:val="single" w:sz="4" w:space="0" w:color="000000"/>
+              <w:left w:val="single" w:sz="4" w:space="0" w:color="000000"/>
+              <w:bottom w:val="single" w:sz="4" w:space="0" w:color="000000"/>
+            </w:tcBorders>
+            <w:vAlign w:val="bottom"/>
+          </w:tcPr>
+          <w:p>
+            <w:pPr>
+              <w:pStyle w:val="Normal"/>
+              <w:widowControl w:val="false"/>
+              <w:spacing w:lineRule="auto" w:line="180" w:before="0" w:after="60"/>
+              <w:jc w:val="center"/>
+              <w:rPr>
+                <w:b/>
+                <w:bCs/>
+              </w:rPr>
+            </w:pPr>
+            <w:r>
+              <w:rPr>
+                <w:b/>
+                <w:bCs/>
+                <w:color w:val="000000"/>
+                <w:sz w:val="16"/>
+                <w:szCs w:val="16"/>
+              </w:rPr>
+              <w:t>HUD</w:t>
+            </w:r>
+          </w:p>
+        </w:tc>
+        <w:tc>
+          <w:tcPr>
+            <w:tcW w:w="1019" w:type="dxa"/>
+            <w:tcBorders>
+              <w:top w:val="single" w:sz="4" w:space="0" w:color="000000"/>
+              <w:left w:val="single" w:sz="4" w:space="0" w:color="000000"/>
+              <w:bottom w:val="single" w:sz="4" w:space="0" w:color="000000"/>
+            </w:tcBorders>
+            <w:vAlign w:val="bottom"/>
+          </w:tcPr>
+          <w:p>
+            <w:pPr>
+              <w:pStyle w:val="Normal"/>
+              <w:widowControl w:val="false"/>
+              <w:spacing w:lineRule="auto" w:line="180"/>
+              <w:jc w:val="center"/>
+              <w:rPr>
+                <w:color w:val="000000"/>
+                <w:sz w:val="16"/>
+                <w:szCs w:val="16"/>
+              </w:rPr>
+            </w:pPr>
+            <w:r>
+              <w:rPr>
+                <w:color w:val="000000"/>
+                <w:sz w:val="16"/>
+                <w:szCs w:val="16"/>
+              </w:rPr>
+              <w:t>Schedule</w:t>
+            </w:r>
+          </w:p>
+        </w:tc>
+        <w:tc>
+          <w:tcPr>
+            <w:tcW w:w="1014" w:type="dxa"/>
+            <w:tcBorders>
+              <w:top w:val="single" w:sz="4" w:space="0" w:color="000000"/>
+              <w:left w:val="single" w:sz="4" w:space="0" w:color="000000"/>
+              <w:bottom w:val="single" w:sz="4" w:space="0" w:color="000000"/>
+            </w:tcBorders>
+            <w:vAlign w:val="bottom"/>
+          </w:tcPr>
+          <w:p>
+            <w:pPr>
+              <w:pStyle w:val="Normal"/>
+              <w:widowControl w:val="false"/>
+              <w:spacing w:lineRule="auto" w:line="180"/>
+              <w:jc w:val="center"/>
+              <w:rPr>
+                <w:color w:val="000000"/>
+                <w:sz w:val="16"/>
+                <w:szCs w:val="16"/>
+              </w:rPr>
+            </w:pPr>
+            <w:r>
+              <w:rPr>
+                <w:rFonts w:eastAsia="arial" w:ascii="arial" w:hAnsi="arial"/>
+                <w:color w:val="000000"/>
+                <w:sz w:val="16"/>
+                <w:szCs w:val="16"/>
+              </w:rPr>
+              <w:t>Engine Stop</w:t>
+            </w:r>
+          </w:p>
+        </w:tc>
+        <w:tc>
+          <w:tcPr>
+            <w:tcW w:w="1016" w:type="dxa"/>
+            <w:tcBorders>
+              <w:top w:val="single" w:sz="4" w:space="0" w:color="000000"/>
+              <w:left w:val="single" w:sz="4" w:space="0" w:color="000000"/>
+              <w:bottom w:val="single" w:sz="4" w:space="0" w:color="000000"/>
+            </w:tcBorders>
+            <w:vAlign w:val="bottom"/>
+          </w:tcPr>
+          <w:p>
+            <w:pPr>
+              <w:pStyle w:val="Normal"/>
+              <w:widowControl w:val="false"/>
+              <w:spacing w:lineRule="auto" w:line="180"/>
+              <w:jc w:val="center"/>
+              <w:rPr>
+                <w:color w:val="000000"/>
+                <w:sz w:val="16"/>
+                <w:szCs w:val="16"/>
+              </w:rPr>
+            </w:pPr>
+            <w:r>
+              <w:rPr>
+                <w:color w:val="000000"/>
+                <w:sz w:val="16"/>
+                <w:szCs w:val="16"/>
+              </w:rPr>
+              <w:t>Warning Devices</w:t>
+            </w:r>
+          </w:p>
+        </w:tc>
+        <w:tc>
+          <w:tcPr>
+            <w:tcW w:w="1020" w:type="dxa"/>
+            <w:tcBorders>
+              <w:top w:val="single" w:sz="4" w:space="0" w:color="000000"/>
+              <w:left w:val="single" w:sz="4" w:space="0" w:color="000000"/>
+              <w:bottom w:val="single" w:sz="4" w:space="0" w:color="000000"/>
+            </w:tcBorders>
+            <w:vAlign w:val="bottom"/>
+          </w:tcPr>
+          <w:p>
+            <w:pPr>
+              <w:pStyle w:val="Normal"/>
+              <w:widowControl w:val="false"/>
+              <w:spacing w:lineRule="auto" w:line="180"/>
+              <w:jc w:val="center"/>
+              <w:rPr>
+                <w:color w:val="000000"/>
+                <w:sz w:val="16"/>
+                <w:szCs w:val="16"/>
+              </w:rPr>
+            </w:pPr>
+            <w:r>
+              <w:rPr>
+                <w:color w:val="000000"/>
+                <w:sz w:val="16"/>
+                <w:szCs w:val="16"/>
+              </w:rPr>
+              <w:t>Control Switch</w:t>
+            </w:r>
+          </w:p>
+        </w:tc>
+        <w:tc>
+          <w:tcPr>
+            <w:tcW w:w="1016" w:type="dxa"/>
+            <w:tcBorders>
+              <w:top w:val="single" w:sz="4" w:space="0" w:color="000000"/>
+              <w:left w:val="single" w:sz="4" w:space="0" w:color="000000"/>
+              <w:bottom w:val="single" w:sz="4" w:space="0" w:color="000000"/>
+            </w:tcBorders>
+            <w:vAlign w:val="bottom"/>
+          </w:tcPr>
+          <w:p>
+            <w:pPr>
+              <w:pStyle w:val="Normal"/>
+              <w:widowControl w:val="false"/>
+              <w:jc w:val="center"/>
+              <w:rPr>
+                <w:color w:val="000000"/>
+                <w:sz w:val="16"/>
+                <w:szCs w:val="16"/>
+              </w:rPr>
+            </w:pPr>
+            <w:r>
+              <w:rPr>
+                <w:color w:val="000000"/>
+                <w:sz w:val="16"/>
+                <w:szCs w:val="16"/>
+              </w:rPr>
+              <w:t>Headlight Control Dw</w:t>
+            </w:r>
+          </w:p>
+        </w:tc>
+        <w:tc>
+          <w:tcPr>
+            <w:tcW w:w="1016" w:type="dxa"/>
+            <w:tcBorders>
+              <w:top w:val="single" w:sz="4" w:space="0" w:color="000000"/>
+              <w:left w:val="single" w:sz="4" w:space="0" w:color="000000"/>
+              <w:bottom w:val="single" w:sz="4" w:space="0" w:color="000000"/>
+            </w:tcBorders>
+            <w:vAlign w:val="bottom"/>
+          </w:tcPr>
+          <w:p>
+            <w:pPr>
+              <w:pStyle w:val="Normal"/>
+              <w:widowControl w:val="false"/>
+              <w:jc w:val="center"/>
+              <w:rPr>
+                <w:color w:val="000000"/>
+                <w:sz w:val="16"/>
+                <w:szCs w:val="16"/>
+              </w:rPr>
+            </w:pPr>
+            <w:r>
+              <w:rPr>
+                <w:rFonts w:eastAsia="arial" w:ascii="arial" w:hAnsi="arial"/>
+                <w:color w:val="000000"/>
+                <w:sz w:val="16"/>
+                <w:szCs w:val="16"/>
+              </w:rPr>
+              <w:t>Engine Cont. Jog</w:t>
+            </w:r>
+          </w:p>
+        </w:tc>
+        <w:tc>
+          <w:tcPr>
+            <w:tcW w:w="1017" w:type="dxa"/>
+            <w:tcBorders>
+              <w:top w:val="single" w:sz="4" w:space="0" w:color="000000"/>
+              <w:left w:val="single" w:sz="4" w:space="0" w:color="000000"/>
+              <w:bottom w:val="single" w:sz="4" w:space="0" w:color="000000"/>
+            </w:tcBorders>
+            <w:vAlign w:val="bottom"/>
+          </w:tcPr>
+          <w:p>
+            <w:pPr>
+              <w:pStyle w:val="Normal"/>
+              <w:widowControl w:val="false"/>
+              <w:jc w:val="center"/>
+              <w:rPr>
                 <w:rFonts w:ascii="arial" w:hAnsi="arial" w:eastAsia="arial"/>
                 <w:color w:val="000000"/>
                 <w:sz w:val="16"/>
@@ -4338,7 +6610,11 @@
               </w:rPr>
             </w:pPr>
             <w:r>
-              <w:rPr/>
+              <w:rPr>
+                <w:sz w:val="16"/>
+                <w:szCs w:val="16"/>
+              </w:rPr>
+              <w:t>Crosswalk Light</w:t>
             </w:r>
           </w:p>
         </w:tc>
@@ -4369,6 +6645,1212 @@
                 <w:szCs w:val="16"/>
               </w:rPr>
               <w:t>Step Light</w:t>
+            </w:r>
+          </w:p>
+        </w:tc>
+        <w:tc>
+          <w:tcPr>
+            <w:tcW w:w="1016" w:type="dxa"/>
+            <w:tcBorders>
+              <w:top w:val="single" w:sz="4" w:space="0" w:color="000000"/>
+              <w:left w:val="single" w:sz="4" w:space="0" w:color="000000"/>
+              <w:bottom w:val="single" w:sz="4" w:space="0" w:color="000000"/>
+            </w:tcBorders>
+            <w:vAlign w:val="bottom"/>
+          </w:tcPr>
+          <w:p>
+            <w:pPr>
+              <w:pStyle w:val="Normal"/>
+              <w:widowControl w:val="false"/>
+              <w:spacing w:lineRule="auto" w:line="180"/>
+              <w:jc w:val="center"/>
+              <w:rPr>
+                <w:sz w:val="16"/>
+                <w:szCs w:val="16"/>
+              </w:rPr>
+            </w:pPr>
+            <w:r>
+              <w:rPr>
+                <w:sz w:val="16"/>
+                <w:szCs w:val="16"/>
+              </w:rPr>
+              <w:t>Number Light</w:t>
+            </w:r>
+          </w:p>
+        </w:tc>
+        <w:tc>
+          <w:tcPr>
+            <w:tcW w:w="1016" w:type="dxa"/>
+            <w:tcBorders>
+              <w:top w:val="single" w:sz="4" w:space="0" w:color="000000"/>
+              <w:left w:val="single" w:sz="4" w:space="0" w:color="000000"/>
+              <w:bottom w:val="single" w:sz="4" w:space="0" w:color="000000"/>
+            </w:tcBorders>
+            <w:vAlign w:val="bottom"/>
+          </w:tcPr>
+          <w:p>
+            <w:pPr>
+              <w:pStyle w:val="Normal"/>
+              <w:widowControl w:val="false"/>
+              <w:spacing w:lineRule="auto" w:line="180"/>
+              <w:jc w:val="center"/>
+              <w:rPr>
+                <w:sz w:val="16"/>
+                <w:szCs w:val="16"/>
+              </w:rPr>
+            </w:pPr>
+            <w:r>
+              <w:rPr>
+                <w:rFonts w:eastAsia="arial" w:ascii="arial" w:hAnsi="arial"/>
+                <w:color w:val="000000"/>
+                <w:sz w:val="16"/>
+                <w:szCs w:val="16"/>
+              </w:rPr>
+              <w:t>Exterior</w:t>
+            </w:r>
+          </w:p>
+          <w:p>
+            <w:pPr>
+              <w:pStyle w:val="Normal"/>
+              <w:widowControl w:val="false"/>
+              <w:spacing w:lineRule="auto" w:line="180"/>
+              <w:jc w:val="center"/>
+              <w:rPr>
+                <w:sz w:val="16"/>
+                <w:szCs w:val="16"/>
+              </w:rPr>
+            </w:pPr>
+            <w:r>
+              <w:rPr>
+                <w:rFonts w:eastAsia="arial" w:ascii="arial" w:hAnsi="arial"/>
+                <w:color w:val="000000"/>
+                <w:sz w:val="16"/>
+                <w:szCs w:val="16"/>
+              </w:rPr>
+              <w:t>Camera</w:t>
+            </w:r>
+          </w:p>
+        </w:tc>
+        <w:tc>
+          <w:tcPr>
+            <w:tcW w:w="1029" w:type="dxa"/>
+            <w:tcBorders>
+              <w:top w:val="single" w:sz="4" w:space="0" w:color="000000"/>
+              <w:left w:val="single" w:sz="4" w:space="0" w:color="000000"/>
+              <w:bottom w:val="single" w:sz="4" w:space="0" w:color="000000"/>
+              <w:right w:val="single" w:sz="4" w:space="0" w:color="000000"/>
+            </w:tcBorders>
+            <w:vAlign w:val="bottom"/>
+          </w:tcPr>
+          <w:p>
+            <w:pPr>
+              <w:pStyle w:val="Normal"/>
+              <w:widowControl w:val="false"/>
+              <w:spacing w:lineRule="auto" w:line="180"/>
+              <w:jc w:val="center"/>
+              <w:rPr>
+                <w:sz w:val="16"/>
+                <w:szCs w:val="16"/>
+              </w:rPr>
+            </w:pPr>
+            <w:r>
+              <w:rPr>
+                <w:rFonts w:eastAsia="arial" w:ascii="arial" w:hAnsi="arial"/>
+                <w:color w:val="000000"/>
+                <w:sz w:val="16"/>
+                <w:szCs w:val="16"/>
+              </w:rPr>
+              <w:t>Prev</w:t>
+            </w:r>
+          </w:p>
+          <w:p>
+            <w:pPr>
+              <w:pStyle w:val="Normal"/>
+              <w:widowControl w:val="false"/>
+              <w:spacing w:lineRule="auto" w:line="180"/>
+              <w:jc w:val="center"/>
+              <w:rPr>
+                <w:sz w:val="16"/>
+                <w:szCs w:val="16"/>
+              </w:rPr>
+            </w:pPr>
+            <w:r>
+              <w:rPr>
+                <w:rFonts w:eastAsia="arial" w:ascii="arial" w:hAnsi="arial"/>
+                <w:color w:val="000000"/>
+                <w:sz w:val="16"/>
+                <w:szCs w:val="16"/>
+              </w:rPr>
+              <w:t>Cab Cam</w:t>
+            </w:r>
+          </w:p>
+        </w:tc>
+      </w:tr>
+    </w:tbl>
+    <w:p>
+      <w:pPr>
+        <w:pStyle w:val="Normal"/>
+        <w:rPr>
+          <w:color w:val="000000"/>
+          <w:sz w:val="16"/>
+          <w:szCs w:val="16"/>
+        </w:rPr>
+      </w:pPr>
+      <w:r>
+        <w:rPr>
+          <w:color w:val="000000"/>
+          <w:sz w:val="16"/>
+          <w:szCs w:val="16"/>
+        </w:rPr>
+      </w:r>
+    </w:p>
+    <w:p>
+      <w:pPr>
+        <w:pStyle w:val="Normal"/>
+        <w:rPr>
+          <w:color w:val="000000"/>
+          <w:sz w:val="16"/>
+          <w:szCs w:val="16"/>
+        </w:rPr>
+      </w:pPr>
+      <w:r>
+        <w:rPr>
+          <w:color w:val="000000"/>
+          <w:sz w:val="16"/>
+          <w:szCs w:val="16"/>
+        </w:rPr>
+        <w:tab/>
+        <w:t xml:space="preserve">       </w:t>
+      </w:r>
+      <w:r>
+        <w:rPr>
+          <w:rFonts w:eastAsia="arial" w:ascii="arial" w:hAnsi="arial"/>
+          <w:color w:val="000000"/>
+          <w:sz w:val="16"/>
+          <w:szCs w:val="16"/>
+        </w:rPr>
+        <w:t xml:space="preserve">    </w:t>
+      </w:r>
+      <w:r>
+        <w:rPr>
+          <w:rFonts w:eastAsia="arial" w:ascii="arial" w:hAnsi="arial"/>
+          <w:color w:val="000000"/>
+          <w:sz w:val="16"/>
+          <w:szCs w:val="16"/>
+        </w:rPr>
+        <w:t>F7</w:t>
+      </w:r>
+      <w:r>
+        <w:rPr>
+          <w:rFonts w:eastAsia="arial" w:ascii="arial" w:hAnsi="arial"/>
+          <w:color w:val="000000"/>
+          <w:sz w:val="16"/>
+          <w:szCs w:val="16"/>
+        </w:rPr>
+        <w:t>-1</w:t>
+      </w:r>
+    </w:p>
+    <w:tbl>
+      <w:tblPr>
+        <w:tblW w:w="14248" w:type="dxa"/>
+        <w:jc w:val="left"/>
+        <w:tblInd w:w="-5" w:type="dxa"/>
+        <w:tblLayout w:type="fixed"/>
+        <w:tblCellMar>
+          <w:top w:w="0" w:type="dxa"/>
+          <w:left w:w="108" w:type="dxa"/>
+          <w:bottom w:w="0" w:type="dxa"/>
+          <w:right w:w="108" w:type="dxa"/>
+        </w:tblCellMar>
+        <w:tblLook w:firstRow="1" w:noVBand="1" w:lastRow="0" w:firstColumn="1" w:lastColumn="0" w:noHBand="0" w:val="04a0"/>
+      </w:tblPr>
+      <w:tblGrid>
+        <w:gridCol w:w="1017"/>
+        <w:gridCol w:w="1019"/>
+        <w:gridCol w:w="1014"/>
+        <w:gridCol w:w="1016"/>
+        <w:gridCol w:w="1020"/>
+        <w:gridCol w:w="1016"/>
+        <w:gridCol w:w="1016"/>
+        <w:gridCol w:w="1017"/>
+        <w:gridCol w:w="1016"/>
+        <w:gridCol w:w="1020"/>
+        <w:gridCol w:w="1016"/>
+        <w:gridCol w:w="1016"/>
+        <w:gridCol w:w="1016"/>
+        <w:gridCol w:w="1029"/>
+      </w:tblGrid>
+      <w:tr>
+        <w:trPr>
+          <w:trHeight w:val="440" w:hRule="exact"/>
+          <w:cantSplit w:val="true"/>
+        </w:trPr>
+        <w:tc>
+          <w:tcPr>
+            <w:tcW w:w="1017" w:type="dxa"/>
+            <w:tcBorders>
+              <w:top w:val="single" w:sz="4" w:space="0" w:color="000000"/>
+              <w:left w:val="single" w:sz="4" w:space="0" w:color="000000"/>
+              <w:bottom w:val="single" w:sz="4" w:space="0" w:color="000000"/>
+            </w:tcBorders>
+            <w:vAlign w:val="bottom"/>
+          </w:tcPr>
+          <w:p>
+            <w:pPr>
+              <w:pStyle w:val="Normal"/>
+              <w:widowControl w:val="false"/>
+              <w:spacing w:lineRule="auto" w:line="180" w:before="0" w:after="60"/>
+              <w:jc w:val="center"/>
+              <w:rPr>
+                <w:color w:val="000000"/>
+                <w:sz w:val="16"/>
+                <w:szCs w:val="16"/>
+              </w:rPr>
+            </w:pPr>
+            <w:r>
+              <w:rPr>
+                <w:rFonts w:eastAsia="arial" w:ascii="arial" w:hAnsi="arial"/>
+                <w:b/>
+                <w:color w:val="000000"/>
+                <w:sz w:val="16"/>
+                <w:szCs w:val="16"/>
+              </w:rPr>
+              <w:t>Pause</w:t>
+            </w:r>
+          </w:p>
+        </w:tc>
+        <w:tc>
+          <w:tcPr>
+            <w:tcW w:w="1019" w:type="dxa"/>
+            <w:tcBorders>
+              <w:top w:val="single" w:sz="4" w:space="0" w:color="000000"/>
+              <w:left w:val="single" w:sz="4" w:space="0" w:color="000000"/>
+              <w:bottom w:val="single" w:sz="4" w:space="0" w:color="000000"/>
+            </w:tcBorders>
+            <w:vAlign w:val="bottom"/>
+          </w:tcPr>
+          <w:p>
+            <w:pPr>
+              <w:pStyle w:val="Normal"/>
+              <w:widowControl w:val="false"/>
+              <w:spacing w:lineRule="auto" w:line="180"/>
+              <w:jc w:val="center"/>
+              <w:rPr>
+                <w:color w:val="000000"/>
+                <w:sz w:val="16"/>
+                <w:szCs w:val="16"/>
+              </w:rPr>
+            </w:pPr>
+            <w:r>
+              <w:rPr>
+                <w:color w:val="000000"/>
+                <w:sz w:val="16"/>
+                <w:szCs w:val="16"/>
+              </w:rPr>
+              <w:t>Reverser Handle</w:t>
+            </w:r>
+          </w:p>
+        </w:tc>
+        <w:tc>
+          <w:tcPr>
+            <w:tcW w:w="1014" w:type="dxa"/>
+            <w:tcBorders>
+              <w:top w:val="single" w:sz="4" w:space="0" w:color="000000"/>
+              <w:left w:val="single" w:sz="4" w:space="0" w:color="000000"/>
+              <w:bottom w:val="single" w:sz="4" w:space="0" w:color="000000"/>
+            </w:tcBorders>
+            <w:vAlign w:val="bottom"/>
+          </w:tcPr>
+          <w:p>
+            <w:pPr>
+              <w:pStyle w:val="Normal"/>
+              <w:widowControl w:val="false"/>
+              <w:spacing w:lineRule="auto" w:line="180"/>
+              <w:jc w:val="center"/>
+              <w:rPr>
+                <w:color w:val="000000"/>
+                <w:sz w:val="16"/>
+                <w:szCs w:val="16"/>
+              </w:rPr>
+            </w:pPr>
+            <w:r>
+              <w:rPr>
+                <w:rFonts w:eastAsia="arial" w:ascii="arial" w:hAnsi="arial"/>
+                <w:color w:val="000000"/>
+                <w:sz w:val="16"/>
+                <w:szCs w:val="16"/>
+              </w:rPr>
+              <w:t>Engine Start</w:t>
+            </w:r>
+          </w:p>
+        </w:tc>
+        <w:tc>
+          <w:tcPr>
+            <w:tcW w:w="1016" w:type="dxa"/>
+            <w:tcBorders>
+              <w:top w:val="single" w:sz="4" w:space="0" w:color="000000"/>
+              <w:left w:val="single" w:sz="4" w:space="0" w:color="000000"/>
+              <w:bottom w:val="single" w:sz="4" w:space="0" w:color="000000"/>
+            </w:tcBorders>
+            <w:vAlign w:val="bottom"/>
+          </w:tcPr>
+          <w:p>
+            <w:pPr>
+              <w:pStyle w:val="Normal"/>
+              <w:widowControl w:val="false"/>
+              <w:spacing w:lineRule="auto" w:line="180"/>
+              <w:jc w:val="center"/>
+              <w:rPr>
+                <w:color w:val="000000"/>
+                <w:sz w:val="16"/>
+                <w:szCs w:val="16"/>
+              </w:rPr>
+            </w:pPr>
+            <w:r>
+              <w:rPr>
+                <w:color w:val="000000"/>
+                <w:sz w:val="16"/>
+                <w:szCs w:val="16"/>
+              </w:rPr>
+              <w:t>Engine Run</w:t>
+            </w:r>
+          </w:p>
+        </w:tc>
+        <w:tc>
+          <w:tcPr>
+            <w:tcW w:w="1020" w:type="dxa"/>
+            <w:tcBorders>
+              <w:top w:val="single" w:sz="4" w:space="0" w:color="000000"/>
+              <w:left w:val="single" w:sz="4" w:space="0" w:color="000000"/>
+              <w:bottom w:val="single" w:sz="4" w:space="0" w:color="000000"/>
+            </w:tcBorders>
+            <w:vAlign w:val="bottom"/>
+          </w:tcPr>
+          <w:p>
+            <w:pPr>
+              <w:pStyle w:val="Normal"/>
+              <w:widowControl w:val="false"/>
+              <w:spacing w:lineRule="auto" w:line="180"/>
+              <w:jc w:val="center"/>
+              <w:rPr>
+                <w:color w:val="000000"/>
+                <w:sz w:val="16"/>
+                <w:szCs w:val="16"/>
+              </w:rPr>
+            </w:pPr>
+            <w:r>
+              <w:rPr>
+                <w:color w:val="000000"/>
+                <w:sz w:val="16"/>
+                <w:szCs w:val="16"/>
+              </w:rPr>
+              <w:t>Generator Field</w:t>
+            </w:r>
+          </w:p>
+        </w:tc>
+        <w:tc>
+          <w:tcPr>
+            <w:tcW w:w="1016" w:type="dxa"/>
+            <w:tcBorders>
+              <w:top w:val="single" w:sz="4" w:space="0" w:color="000000"/>
+              <w:left w:val="single" w:sz="4" w:space="0" w:color="000000"/>
+              <w:bottom w:val="single" w:sz="4" w:space="0" w:color="000000"/>
+            </w:tcBorders>
+            <w:vAlign w:val="bottom"/>
+          </w:tcPr>
+          <w:p>
+            <w:pPr>
+              <w:pStyle w:val="Normal"/>
+              <w:widowControl w:val="false"/>
+              <w:jc w:val="center"/>
+              <w:rPr>
+                <w:color w:val="000000"/>
+                <w:sz w:val="16"/>
+                <w:szCs w:val="16"/>
+              </w:rPr>
+            </w:pPr>
+            <w:r>
+              <w:rPr>
+                <w:color w:val="000000"/>
+                <w:sz w:val="16"/>
+                <w:szCs w:val="16"/>
+              </w:rPr>
+              <w:t>Brake</w:t>
+            </w:r>
+          </w:p>
+          <w:p>
+            <w:pPr>
+              <w:pStyle w:val="Normal"/>
+              <w:widowControl w:val="false"/>
+              <w:jc w:val="center"/>
+              <w:rPr>
+                <w:color w:val="000000"/>
+                <w:sz w:val="16"/>
+                <w:szCs w:val="16"/>
+              </w:rPr>
+            </w:pPr>
+            <w:r>
+              <w:rPr>
+                <w:color w:val="000000"/>
+                <w:sz w:val="16"/>
+                <w:szCs w:val="16"/>
+              </w:rPr>
+              <w:t>Cut-In</w:t>
+            </w:r>
+          </w:p>
+        </w:tc>
+        <w:tc>
+          <w:tcPr>
+            <w:tcW w:w="1016" w:type="dxa"/>
+            <w:tcBorders>
+              <w:top w:val="single" w:sz="4" w:space="0" w:color="000000"/>
+              <w:left w:val="single" w:sz="4" w:space="0" w:color="000000"/>
+              <w:bottom w:val="single" w:sz="4" w:space="0" w:color="000000"/>
+            </w:tcBorders>
+            <w:vAlign w:val="bottom"/>
+          </w:tcPr>
+          <w:p>
+            <w:pPr>
+              <w:pStyle w:val="Normal"/>
+              <w:widowControl w:val="false"/>
+              <w:jc w:val="center"/>
+              <w:rPr>
+                <w:color w:val="000000"/>
+                <w:sz w:val="16"/>
+                <w:szCs w:val="16"/>
+              </w:rPr>
+            </w:pPr>
+            <w:r>
+              <w:rPr>
+                <w:color w:val="000000"/>
+                <w:sz w:val="16"/>
+                <w:szCs w:val="16"/>
+              </w:rPr>
+              <w:t>Isolation Run</w:t>
+            </w:r>
+          </w:p>
+        </w:tc>
+        <w:tc>
+          <w:tcPr>
+            <w:tcW w:w="1017" w:type="dxa"/>
+            <w:tcBorders>
+              <w:top w:val="single" w:sz="4" w:space="0" w:color="000000"/>
+              <w:left w:val="single" w:sz="4" w:space="0" w:color="000000"/>
+              <w:bottom w:val="single" w:sz="4" w:space="0" w:color="000000"/>
+            </w:tcBorders>
+            <w:vAlign w:val="bottom"/>
+          </w:tcPr>
+          <w:p>
+            <w:pPr>
+              <w:pStyle w:val="Normal"/>
+              <w:widowControl w:val="false"/>
+              <w:jc w:val="center"/>
+              <w:rPr>
+                <w:sz w:val="16"/>
+                <w:szCs w:val="16"/>
+              </w:rPr>
+            </w:pPr>
+            <w:r>
+              <w:rPr>
+                <w:rFonts w:eastAsia="arial" w:ascii="arial" w:hAnsi="arial"/>
+                <w:color w:val="000000"/>
+                <w:sz w:val="16"/>
+                <w:szCs w:val="16"/>
+              </w:rPr>
+              <w:t>Unit Selector</w:t>
+            </w:r>
+          </w:p>
+        </w:tc>
+        <w:tc>
+          <w:tcPr>
+            <w:tcW w:w="1016" w:type="dxa"/>
+            <w:tcBorders>
+              <w:top w:val="single" w:sz="4" w:space="0" w:color="000000"/>
+              <w:left w:val="single" w:sz="4" w:space="0" w:color="000000"/>
+              <w:bottom w:val="single" w:sz="4" w:space="0" w:color="000000"/>
+            </w:tcBorders>
+            <w:vAlign w:val="bottom"/>
+          </w:tcPr>
+          <w:p>
+            <w:pPr>
+              <w:pStyle w:val="Normal"/>
+              <w:widowControl w:val="false"/>
+              <w:jc w:val="center"/>
+              <w:rPr>
+                <w:sz w:val="16"/>
+                <w:szCs w:val="16"/>
+              </w:rPr>
+            </w:pPr>
+            <w:r>
+              <w:rPr>
+                <w:sz w:val="16"/>
+                <w:szCs w:val="16"/>
+              </w:rPr>
+              <w:t>Transition Series</w:t>
+            </w:r>
+          </w:p>
+        </w:tc>
+        <w:tc>
+          <w:tcPr>
+            <w:tcW w:w="1020" w:type="dxa"/>
+            <w:tcBorders>
+              <w:top w:val="single" w:sz="4" w:space="0" w:color="000000"/>
+              <w:left w:val="single" w:sz="4" w:space="0" w:color="000000"/>
+              <w:bottom w:val="single" w:sz="4" w:space="0" w:color="000000"/>
+            </w:tcBorders>
+            <w:vAlign w:val="bottom"/>
+          </w:tcPr>
+          <w:p>
+            <w:pPr>
+              <w:pStyle w:val="Normal"/>
+              <w:widowControl w:val="false"/>
+              <w:jc w:val="center"/>
+              <w:rPr>
+                <w:sz w:val="16"/>
+                <w:szCs w:val="16"/>
+              </w:rPr>
+            </w:pPr>
+            <w:r>
+              <w:rPr>
+                <w:color w:val="000000"/>
+                <w:sz w:val="16"/>
+                <w:szCs w:val="16"/>
+              </w:rPr>
+              <w:t xml:space="preserve">Rotair Valve </w:t>
+            </w:r>
+            <w:r>
+              <w:rPr>
+                <w:color w:val="000000"/>
+                <w:sz w:val="16"/>
+                <w:szCs w:val="16"/>
+              </w:rPr>
+              <w:t>P</w:t>
+            </w:r>
+          </w:p>
+        </w:tc>
+        <w:tc>
+          <w:tcPr>
+            <w:tcW w:w="1016" w:type="dxa"/>
+            <w:tcBorders>
+              <w:top w:val="single" w:sz="4" w:space="0" w:color="000000"/>
+              <w:left w:val="single" w:sz="4" w:space="0" w:color="000000"/>
+              <w:bottom w:val="single" w:sz="4" w:space="0" w:color="000000"/>
+            </w:tcBorders>
+            <w:vAlign w:val="bottom"/>
+          </w:tcPr>
+          <w:p>
+            <w:pPr>
+              <w:pStyle w:val="Normal"/>
+              <w:widowControl w:val="false"/>
+              <w:spacing w:lineRule="auto" w:line="180"/>
+              <w:jc w:val="center"/>
+              <w:rPr>
+                <w:sz w:val="16"/>
+                <w:szCs w:val="16"/>
+              </w:rPr>
+            </w:pPr>
+            <w:r>
+              <w:rPr>
+                <w:rFonts w:eastAsia="arial" w:ascii="arial" w:hAnsi="arial"/>
+                <w:color w:val="000000"/>
+                <w:sz w:val="16"/>
+                <w:szCs w:val="16"/>
+              </w:rPr>
+              <w:t>Gauge Light</w:t>
+            </w:r>
+          </w:p>
+        </w:tc>
+        <w:tc>
+          <w:tcPr>
+            <w:tcW w:w="1016" w:type="dxa"/>
+            <w:tcBorders>
+              <w:top w:val="single" w:sz="4" w:space="0" w:color="000000"/>
+              <w:left w:val="single" w:sz="4" w:space="0" w:color="000000"/>
+              <w:bottom w:val="single" w:sz="4" w:space="0" w:color="000000"/>
+            </w:tcBorders>
+            <w:vAlign w:val="bottom"/>
+          </w:tcPr>
+          <w:p>
+            <w:pPr>
+              <w:pStyle w:val="Normal"/>
+              <w:widowControl w:val="false"/>
+              <w:spacing w:lineRule="auto" w:line="180"/>
+              <w:jc w:val="center"/>
+              <w:rPr>
+                <w:sz w:val="16"/>
+                <w:szCs w:val="16"/>
+              </w:rPr>
+            </w:pPr>
+            <w:r>
+              <w:rPr>
+                <w:sz w:val="16"/>
+                <w:szCs w:val="16"/>
+              </w:rPr>
+              <w:t>Cab Light</w:t>
+            </w:r>
+          </w:p>
+        </w:tc>
+        <w:tc>
+          <w:tcPr>
+            <w:tcW w:w="1016" w:type="dxa"/>
+            <w:tcBorders>
+              <w:top w:val="single" w:sz="4" w:space="0" w:color="000000"/>
+              <w:left w:val="single" w:sz="4" w:space="0" w:color="000000"/>
+              <w:bottom w:val="single" w:sz="4" w:space="0" w:color="000000"/>
+            </w:tcBorders>
+            <w:vAlign w:val="bottom"/>
+          </w:tcPr>
+          <w:p>
+            <w:pPr>
+              <w:pStyle w:val="Normal"/>
+              <w:widowControl w:val="false"/>
+              <w:spacing w:lineRule="auto" w:line="180"/>
+              <w:jc w:val="center"/>
+              <w:rPr>
+                <w:sz w:val="16"/>
+                <w:szCs w:val="16"/>
+              </w:rPr>
+            </w:pPr>
+            <w:r>
+              <w:rPr>
+                <w:rFonts w:eastAsia="arial" w:ascii="arial" w:hAnsi="arial"/>
+                <w:color w:val="000000"/>
+                <w:sz w:val="16"/>
+                <w:szCs w:val="16"/>
+              </w:rPr>
+              <w:t>1-Person</w:t>
+            </w:r>
+          </w:p>
+        </w:tc>
+        <w:tc>
+          <w:tcPr>
+            <w:tcW w:w="1029" w:type="dxa"/>
+            <w:tcBorders>
+              <w:top w:val="single" w:sz="4" w:space="0" w:color="000000"/>
+              <w:left w:val="single" w:sz="4" w:space="0" w:color="000000"/>
+              <w:bottom w:val="single" w:sz="4" w:space="0" w:color="000000"/>
+              <w:right w:val="single" w:sz="4" w:space="0" w:color="000000"/>
+            </w:tcBorders>
+            <w:vAlign w:val="bottom"/>
+          </w:tcPr>
+          <w:p>
+            <w:pPr>
+              <w:pStyle w:val="Normal"/>
+              <w:widowControl w:val="false"/>
+              <w:spacing w:lineRule="auto" w:line="180"/>
+              <w:jc w:val="center"/>
+              <w:rPr>
+                <w:sz w:val="16"/>
+                <w:szCs w:val="16"/>
+              </w:rPr>
+            </w:pPr>
+            <w:r>
+              <w:rPr>
+                <w:rFonts w:eastAsia="arial" w:ascii="arial" w:hAnsi="arial"/>
+                <w:color w:val="000000"/>
+                <w:sz w:val="16"/>
+                <w:szCs w:val="16"/>
+              </w:rPr>
+              <w:t>Next</w:t>
+            </w:r>
+          </w:p>
+          <w:p>
+            <w:pPr>
+              <w:pStyle w:val="Normal"/>
+              <w:widowControl w:val="false"/>
+              <w:spacing w:lineRule="auto" w:line="180"/>
+              <w:jc w:val="center"/>
+              <w:rPr>
+                <w:sz w:val="16"/>
+                <w:szCs w:val="16"/>
+              </w:rPr>
+            </w:pPr>
+            <w:r>
+              <w:rPr>
+                <w:rFonts w:eastAsia="arial" w:ascii="arial" w:hAnsi="arial"/>
+                <w:color w:val="000000"/>
+                <w:sz w:val="16"/>
+                <w:szCs w:val="16"/>
+              </w:rPr>
+              <w:t>Cab Cam</w:t>
+            </w:r>
+          </w:p>
+        </w:tc>
+      </w:tr>
+    </w:tbl>
+    <w:p>
+      <w:pPr>
+        <w:pStyle w:val="Normal"/>
+        <w:rPr>
+          <w:color w:val="000000"/>
+          <w:sz w:val="16"/>
+          <w:szCs w:val="16"/>
+        </w:rPr>
+      </w:pPr>
+      <w:r>
+        <w:rPr>
+          <w:rFonts w:eastAsia="arial" w:ascii="arial" w:hAnsi="arial"/>
+          <w:color w:val="000000"/>
+          <w:sz w:val="16"/>
+          <w:szCs w:val="16"/>
+        </w:rPr>
+        <w:tab/>
+        <w:t xml:space="preserve">           </w:t>
+      </w:r>
+      <w:r>
+        <w:rPr>
+          <w:rFonts w:eastAsia="arial" w:ascii="arial" w:hAnsi="arial"/>
+          <w:color w:val="000000"/>
+          <w:sz w:val="16"/>
+          <w:szCs w:val="16"/>
+        </w:rPr>
+        <w:t>F7</w:t>
+      </w:r>
+      <w:r>
+        <w:rPr>
+          <w:rFonts w:eastAsia="arial" w:ascii="arial" w:hAnsi="arial"/>
+          <w:color w:val="000000"/>
+          <w:sz w:val="16"/>
+          <w:szCs w:val="16"/>
+        </w:rPr>
+        <w:t>-2</w:t>
+      </w:r>
+    </w:p>
+    <w:tbl>
+      <w:tblPr>
+        <w:tblW w:w="14248" w:type="dxa"/>
+        <w:jc w:val="left"/>
+        <w:tblInd w:w="-5" w:type="dxa"/>
+        <w:tblLayout w:type="fixed"/>
+        <w:tblCellMar>
+          <w:top w:w="0" w:type="dxa"/>
+          <w:left w:w="108" w:type="dxa"/>
+          <w:bottom w:w="0" w:type="dxa"/>
+          <w:right w:w="108" w:type="dxa"/>
+        </w:tblCellMar>
+        <w:tblLook w:firstRow="1" w:noVBand="1" w:lastRow="0" w:firstColumn="1" w:lastColumn="0" w:noHBand="0" w:val="04a0"/>
+      </w:tblPr>
+      <w:tblGrid>
+        <w:gridCol w:w="1017"/>
+        <w:gridCol w:w="1019"/>
+        <w:gridCol w:w="1014"/>
+        <w:gridCol w:w="1016"/>
+        <w:gridCol w:w="1020"/>
+        <w:gridCol w:w="1016"/>
+        <w:gridCol w:w="1016"/>
+        <w:gridCol w:w="1017"/>
+        <w:gridCol w:w="1016"/>
+        <w:gridCol w:w="1020"/>
+        <w:gridCol w:w="1016"/>
+        <w:gridCol w:w="1016"/>
+        <w:gridCol w:w="1016"/>
+        <w:gridCol w:w="1029"/>
+      </w:tblGrid>
+      <w:tr>
+        <w:trPr>
+          <w:trHeight w:val="440" w:hRule="exact"/>
+          <w:cantSplit w:val="true"/>
+        </w:trPr>
+        <w:tc>
+          <w:tcPr>
+            <w:tcW w:w="1017" w:type="dxa"/>
+            <w:tcBorders>
+              <w:top w:val="single" w:sz="4" w:space="0" w:color="000000"/>
+              <w:left w:val="single" w:sz="4" w:space="0" w:color="000000"/>
+              <w:bottom w:val="single" w:sz="4" w:space="0" w:color="000000"/>
+            </w:tcBorders>
+            <w:vAlign w:val="bottom"/>
+          </w:tcPr>
+          <w:p>
+            <w:pPr>
+              <w:pStyle w:val="Normal"/>
+              <w:widowControl w:val="false"/>
+              <w:spacing w:lineRule="auto" w:line="180" w:before="0" w:after="60"/>
+              <w:jc w:val="center"/>
+              <w:rPr>
+                <w:b/>
+                <w:bCs/>
+              </w:rPr>
+            </w:pPr>
+            <w:r>
+              <w:rPr>
+                <w:b/>
+                <w:bCs/>
+                <w:color w:val="000000"/>
+                <w:sz w:val="16"/>
+                <w:szCs w:val="16"/>
+              </w:rPr>
+              <w:t>HUD</w:t>
+            </w:r>
+          </w:p>
+        </w:tc>
+        <w:tc>
+          <w:tcPr>
+            <w:tcW w:w="1019" w:type="dxa"/>
+            <w:tcBorders>
+              <w:top w:val="single" w:sz="4" w:space="0" w:color="000000"/>
+              <w:left w:val="single" w:sz="4" w:space="0" w:color="000000"/>
+              <w:bottom w:val="single" w:sz="4" w:space="0" w:color="000000"/>
+            </w:tcBorders>
+            <w:vAlign w:val="bottom"/>
+          </w:tcPr>
+          <w:p>
+            <w:pPr>
+              <w:pStyle w:val="Normal"/>
+              <w:widowControl w:val="false"/>
+              <w:spacing w:lineRule="auto" w:line="180"/>
+              <w:jc w:val="center"/>
+              <w:rPr>
+                <w:color w:val="000000"/>
+                <w:sz w:val="16"/>
+                <w:szCs w:val="16"/>
+              </w:rPr>
+            </w:pPr>
+            <w:r>
+              <w:rPr>
+                <w:color w:val="000000"/>
+                <w:sz w:val="16"/>
+                <w:szCs w:val="16"/>
+              </w:rPr>
+              <w:t>Schedule</w:t>
+            </w:r>
+          </w:p>
+        </w:tc>
+        <w:tc>
+          <w:tcPr>
+            <w:tcW w:w="1014" w:type="dxa"/>
+            <w:tcBorders>
+              <w:top w:val="single" w:sz="4" w:space="0" w:color="000000"/>
+              <w:left w:val="single" w:sz="4" w:space="0" w:color="000000"/>
+              <w:bottom w:val="single" w:sz="4" w:space="0" w:color="000000"/>
+            </w:tcBorders>
+            <w:vAlign w:val="bottom"/>
+          </w:tcPr>
+          <w:p>
+            <w:pPr>
+              <w:pStyle w:val="Normal"/>
+              <w:widowControl w:val="false"/>
+              <w:spacing w:lineRule="auto" w:line="180"/>
+              <w:jc w:val="center"/>
+              <w:rPr>
+                <w:color w:val="000000"/>
+                <w:sz w:val="16"/>
+                <w:szCs w:val="16"/>
+              </w:rPr>
+            </w:pPr>
+            <w:r>
+              <w:rPr>
+                <w:rFonts w:eastAsia="arial" w:ascii="arial" w:hAnsi="arial"/>
+                <w:color w:val="000000"/>
+                <w:sz w:val="16"/>
+                <w:szCs w:val="16"/>
+              </w:rPr>
+              <w:t>Engine Stop</w:t>
+            </w:r>
+          </w:p>
+        </w:tc>
+        <w:tc>
+          <w:tcPr>
+            <w:tcW w:w="1016" w:type="dxa"/>
+            <w:tcBorders>
+              <w:top w:val="single" w:sz="4" w:space="0" w:color="000000"/>
+              <w:left w:val="single" w:sz="4" w:space="0" w:color="000000"/>
+              <w:bottom w:val="single" w:sz="4" w:space="0" w:color="000000"/>
+            </w:tcBorders>
+            <w:vAlign w:val="bottom"/>
+          </w:tcPr>
+          <w:p>
+            <w:pPr>
+              <w:pStyle w:val="Normal"/>
+              <w:widowControl w:val="false"/>
+              <w:spacing w:lineRule="auto" w:line="180"/>
+              <w:jc w:val="center"/>
+              <w:rPr>
+                <w:color w:val="000000"/>
+                <w:sz w:val="16"/>
+                <w:szCs w:val="16"/>
+              </w:rPr>
+            </w:pPr>
+            <w:r>
+              <w:rPr>
+                <w:color w:val="000000"/>
+                <w:sz w:val="16"/>
+                <w:szCs w:val="16"/>
+              </w:rPr>
+              <w:t>Safety Cock</w:t>
+            </w:r>
+          </w:p>
+        </w:tc>
+        <w:tc>
+          <w:tcPr>
+            <w:tcW w:w="1020" w:type="dxa"/>
+            <w:tcBorders>
+              <w:top w:val="single" w:sz="4" w:space="0" w:color="000000"/>
+              <w:left w:val="single" w:sz="4" w:space="0" w:color="000000"/>
+              <w:bottom w:val="single" w:sz="4" w:space="0" w:color="000000"/>
+            </w:tcBorders>
+            <w:vAlign w:val="bottom"/>
+          </w:tcPr>
+          <w:p>
+            <w:pPr>
+              <w:pStyle w:val="Normal"/>
+              <w:widowControl w:val="false"/>
+              <w:spacing w:lineRule="auto" w:line="180"/>
+              <w:jc w:val="center"/>
+              <w:rPr>
+                <w:color w:val="000000"/>
+                <w:sz w:val="16"/>
+                <w:szCs w:val="16"/>
+              </w:rPr>
+            </w:pPr>
+            <w:r>
+              <w:rPr>
+                <w:color w:val="000000"/>
+                <w:sz w:val="16"/>
+                <w:szCs w:val="16"/>
+              </w:rPr>
+              <w:t xml:space="preserve">Control </w:t>
+            </w:r>
+            <w:r>
+              <w:rPr>
+                <w:color w:val="000000"/>
+                <w:sz w:val="16"/>
+                <w:szCs w:val="16"/>
+              </w:rPr>
+              <w:t>&amp; Fuel Pump</w:t>
+            </w:r>
+          </w:p>
+        </w:tc>
+        <w:tc>
+          <w:tcPr>
+            <w:tcW w:w="1016" w:type="dxa"/>
+            <w:tcBorders>
+              <w:top w:val="single" w:sz="4" w:space="0" w:color="000000"/>
+              <w:left w:val="single" w:sz="4" w:space="0" w:color="000000"/>
+              <w:bottom w:val="single" w:sz="4" w:space="0" w:color="000000"/>
+            </w:tcBorders>
+            <w:vAlign w:val="bottom"/>
+          </w:tcPr>
+          <w:p>
+            <w:pPr>
+              <w:pStyle w:val="Normal"/>
+              <w:widowControl w:val="false"/>
+              <w:jc w:val="center"/>
+              <w:rPr>
+                <w:color w:val="000000"/>
+                <w:sz w:val="16"/>
+                <w:szCs w:val="16"/>
+              </w:rPr>
+            </w:pPr>
+            <w:r>
+              <w:rPr>
+                <w:color w:val="000000"/>
+                <w:sz w:val="16"/>
+                <w:szCs w:val="16"/>
+              </w:rPr>
+              <w:t>Brake</w:t>
+            </w:r>
+          </w:p>
+          <w:p>
+            <w:pPr>
+              <w:pStyle w:val="Normal"/>
+              <w:widowControl w:val="false"/>
+              <w:jc w:val="center"/>
+              <w:rPr>
+                <w:color w:val="000000"/>
+                <w:sz w:val="16"/>
+                <w:szCs w:val="16"/>
+              </w:rPr>
+            </w:pPr>
+            <w:r>
+              <w:rPr>
+                <w:color w:val="000000"/>
+                <w:sz w:val="16"/>
+                <w:szCs w:val="16"/>
+              </w:rPr>
+              <w:t>Cut-</w:t>
+            </w:r>
+            <w:r>
+              <w:rPr>
+                <w:color w:val="000000"/>
+                <w:sz w:val="16"/>
+                <w:szCs w:val="16"/>
+              </w:rPr>
+              <w:t>Out</w:t>
+            </w:r>
+          </w:p>
+        </w:tc>
+        <w:tc>
+          <w:tcPr>
+            <w:tcW w:w="1016" w:type="dxa"/>
+            <w:tcBorders>
+              <w:top w:val="single" w:sz="4" w:space="0" w:color="000000"/>
+              <w:left w:val="single" w:sz="4" w:space="0" w:color="000000"/>
+              <w:bottom w:val="single" w:sz="4" w:space="0" w:color="000000"/>
+            </w:tcBorders>
+            <w:vAlign w:val="bottom"/>
+          </w:tcPr>
+          <w:p>
+            <w:pPr>
+              <w:pStyle w:val="Normal"/>
+              <w:widowControl w:val="false"/>
+              <w:jc w:val="center"/>
+              <w:rPr>
+                <w:color w:val="000000"/>
+                <w:sz w:val="16"/>
+                <w:szCs w:val="16"/>
+              </w:rPr>
+            </w:pPr>
+            <w:r>
+              <w:rPr>
+                <w:rFonts w:eastAsia="arial" w:ascii="arial" w:hAnsi="arial"/>
+                <w:color w:val="000000"/>
+                <w:sz w:val="16"/>
+                <w:szCs w:val="16"/>
+              </w:rPr>
+              <w:t>Isolation Start</w:t>
+            </w:r>
+          </w:p>
+        </w:tc>
+        <w:tc>
+          <w:tcPr>
+            <w:tcW w:w="1017" w:type="dxa"/>
+            <w:tcBorders>
+              <w:top w:val="single" w:sz="4" w:space="0" w:color="000000"/>
+              <w:left w:val="single" w:sz="4" w:space="0" w:color="000000"/>
+              <w:bottom w:val="single" w:sz="4" w:space="0" w:color="000000"/>
+            </w:tcBorders>
+            <w:vAlign w:val="bottom"/>
+          </w:tcPr>
+          <w:p>
+            <w:pPr>
+              <w:pStyle w:val="Normal"/>
+              <w:widowControl w:val="false"/>
+              <w:jc w:val="center"/>
+              <w:rPr>
+                <w:rFonts w:ascii="arial" w:hAnsi="arial" w:eastAsia="arial"/>
+                <w:color w:val="000000"/>
+                <w:sz w:val="16"/>
+                <w:szCs w:val="16"/>
+              </w:rPr>
+            </w:pPr>
+            <w:r>
+              <w:rPr>
+                <w:rFonts w:eastAsia="arial" w:ascii="arial" w:hAnsi="arial"/>
+                <w:color w:val="000000"/>
+                <w:sz w:val="16"/>
+                <w:szCs w:val="16"/>
+              </w:rPr>
+              <w:t>Lead Sand</w:t>
+            </w:r>
+          </w:p>
+        </w:tc>
+        <w:tc>
+          <w:tcPr>
+            <w:tcW w:w="1016" w:type="dxa"/>
+            <w:tcBorders>
+              <w:top w:val="single" w:sz="4" w:space="0" w:color="000000"/>
+              <w:left w:val="single" w:sz="4" w:space="0" w:color="000000"/>
+              <w:bottom w:val="single" w:sz="4" w:space="0" w:color="000000"/>
+            </w:tcBorders>
+            <w:vAlign w:val="bottom"/>
+          </w:tcPr>
+          <w:p>
+            <w:pPr>
+              <w:pStyle w:val="Normal"/>
+              <w:widowControl w:val="false"/>
+              <w:jc w:val="center"/>
+              <w:rPr>
+                <w:sz w:val="16"/>
+                <w:szCs w:val="16"/>
+              </w:rPr>
+            </w:pPr>
+            <w:r>
+              <w:rPr>
+                <w:rFonts w:eastAsia="arial" w:ascii="arial" w:hAnsi="arial"/>
+                <w:color w:val="000000"/>
+                <w:sz w:val="16"/>
+                <w:szCs w:val="16"/>
+              </w:rPr>
+              <w:t>Transition Braking</w:t>
+            </w:r>
+          </w:p>
+        </w:tc>
+        <w:tc>
+          <w:tcPr>
+            <w:tcW w:w="1020" w:type="dxa"/>
+            <w:tcBorders>
+              <w:top w:val="single" w:sz="4" w:space="0" w:color="000000"/>
+              <w:left w:val="single" w:sz="4" w:space="0" w:color="000000"/>
+              <w:bottom w:val="single" w:sz="4" w:space="0" w:color="000000"/>
+            </w:tcBorders>
+            <w:vAlign w:val="bottom"/>
+          </w:tcPr>
+          <w:p>
+            <w:pPr>
+              <w:pStyle w:val="Normal"/>
+              <w:widowControl w:val="false"/>
+              <w:jc w:val="center"/>
+              <w:rPr>
+                <w:color w:val="000000"/>
+                <w:sz w:val="16"/>
+                <w:szCs w:val="16"/>
+              </w:rPr>
+            </w:pPr>
+            <w:r>
+              <w:rPr>
+                <w:rFonts w:eastAsia="arial" w:ascii="arial" w:hAnsi="arial"/>
+                <w:color w:val="000000"/>
+                <w:sz w:val="16"/>
+                <w:szCs w:val="16"/>
+              </w:rPr>
+              <w:t xml:space="preserve">Rotair Valve </w:t>
+            </w:r>
+            <w:r>
+              <w:rPr>
+                <w:rFonts w:eastAsia="arial" w:ascii="arial" w:hAnsi="arial"/>
+                <w:color w:val="000000"/>
+                <w:sz w:val="16"/>
+                <w:szCs w:val="16"/>
+              </w:rPr>
+              <w:t>F</w:t>
+            </w:r>
+          </w:p>
+        </w:tc>
+        <w:tc>
+          <w:tcPr>
+            <w:tcW w:w="1016" w:type="dxa"/>
+            <w:tcBorders>
+              <w:top w:val="single" w:sz="4" w:space="0" w:color="000000"/>
+              <w:left w:val="single" w:sz="4" w:space="0" w:color="000000"/>
+              <w:bottom w:val="single" w:sz="4" w:space="0" w:color="000000"/>
+            </w:tcBorders>
+            <w:vAlign w:val="bottom"/>
+          </w:tcPr>
+          <w:p>
+            <w:pPr>
+              <w:pStyle w:val="Normal"/>
+              <w:widowControl w:val="false"/>
+              <w:spacing w:lineRule="auto" w:line="180"/>
+              <w:jc w:val="center"/>
+              <w:rPr>
+                <w:sz w:val="16"/>
+                <w:szCs w:val="16"/>
+              </w:rPr>
+            </w:pPr>
+            <w:r>
+              <w:rPr>
+                <w:sz w:val="16"/>
+                <w:szCs w:val="16"/>
+              </w:rPr>
+              <w:t>Class</w:t>
+            </w:r>
+            <w:r>
+              <w:rPr>
+                <w:sz w:val="16"/>
+                <w:szCs w:val="16"/>
+              </w:rPr>
+              <w:t xml:space="preserve"> Light</w:t>
             </w:r>
           </w:p>
         </w:tc>
@@ -5549,12 +9031,12 @@
       <w:rFonts w:ascii="Symbol" w:hAnsi="Symbol" w:cs="Symbol"/>
     </w:rPr>
   </w:style>
-  <w:style w:type="character" w:styleId="user" w:customStyle="1">
-    <w:name w:val="번호 매기기 기호 (user)"/>
+  <w:style w:type="character" w:styleId="Style5" w:customStyle="1">
+    <w:name w:val="번호 매기기 기호"/>
     <w:qFormat/>
     <w:rPr/>
   </w:style>
-  <w:style w:type="paragraph" w:styleId="Style5">
+  <w:style w:type="paragraph" w:styleId="Style6">
     <w:name w:val="제목"/>
     <w:basedOn w:val="Normal"/>
     <w:next w:val="BodyText"/>
@@ -5564,7 +9046,7 @@
       <w:spacing w:before="240" w:after="120"/>
     </w:pPr>
     <w:rPr>
-      <w:rFonts w:ascii="Liberation Sans" w:hAnsi="Liberation Sans" w:eastAsia="Noto Sans CJK KR" w:cs="Lohit Devanagari"/>
+      <w:rFonts w:ascii="Liberation Sans" w:hAnsi="Liberation Sans" w:eastAsia="나눔고딕" w:cs="Arial"/>
       <w:sz w:val="28"/>
       <w:szCs w:val="28"/>
     </w:rPr>
@@ -5601,7 +9083,7 @@
       <w:szCs w:val="24"/>
     </w:rPr>
   </w:style>
-  <w:style w:type="paragraph" w:styleId="Style6" w:customStyle="1">
+  <w:style w:type="paragraph" w:styleId="Style7">
     <w:name w:val="색인"/>
     <w:basedOn w:val="Normal"/>
     <w:qFormat/>
@@ -5609,10 +9091,11 @@
       <w:suppressLineNumbers/>
     </w:pPr>
     <w:rPr>
-      <w:rFonts w:cs="Lohit Devanagari"/>
+      <w:rFonts w:cs="Arial"/>
+      <w:sz w:val="24"/>
     </w:rPr>
   </w:style>
-  <w:style w:type="paragraph" w:styleId="user1">
+  <w:style w:type="paragraph" w:styleId="user">
     <w:name w:val="제목 (user)"/>
     <w:basedOn w:val="Normal"/>
     <w:next w:val="BodyText"/>
@@ -5622,12 +9105,12 @@
       <w:spacing w:before="240" w:after="120"/>
     </w:pPr>
     <w:rPr>
-      <w:rFonts w:ascii="Liberation Sans" w:hAnsi="Liberation Sans" w:eastAsia="나눔고딕" w:cs="Arial"/>
+      <w:rFonts w:ascii="Liberation Sans" w:hAnsi="Liberation Sans" w:eastAsia="Noto Sans CJK KR" w:cs="Lohit Devanagari"/>
       <w:sz w:val="28"/>
       <w:szCs w:val="28"/>
     </w:rPr>
   </w:style>
-  <w:style w:type="paragraph" w:styleId="user2">
+  <w:style w:type="paragraph" w:styleId="user1" w:customStyle="1">
     <w:name w:val="색인 (user)"/>
     <w:basedOn w:val="Normal"/>
     <w:qFormat/>
@@ -5635,8 +9118,7 @@
       <w:suppressLineNumbers/>
     </w:pPr>
     <w:rPr>
-      <w:rFonts w:cs="Arial"/>
-      <w:sz w:val="24"/>
+      <w:rFonts w:cs="Lohit Devanagari"/>
     </w:rPr>
   </w:style>
   <w:style w:type="paragraph" w:styleId="Title">
@@ -6318,8 +9800,8 @@
       <w:szCs w:val="24"/>
     </w:rPr>
   </w:style>
-  <w:style w:type="paragraph" w:styleId="Style7" w:customStyle="1">
-    <w:name w:val="표 내용"/>
+  <w:style w:type="paragraph" w:styleId="user2" w:customStyle="1">
+    <w:name w:val="표 내용 (user)"/>
     <w:basedOn w:val="Normal"/>
     <w:qFormat/>
     <w:pPr>
@@ -6327,9 +9809,9 @@
     </w:pPr>
     <w:rPr/>
   </w:style>
-  <w:style w:type="paragraph" w:styleId="Style8" w:customStyle="1">
-    <w:name w:val="표제목"/>
-    <w:basedOn w:val="Style7"/>
+  <w:style w:type="paragraph" w:styleId="user3" w:customStyle="1">
+    <w:name w:val="표제목 (user)"/>
+    <w:basedOn w:val="user2"/>
     <w:qFormat/>
     <w:pPr>
       <w:jc w:val="center"/>
@@ -6339,8 +9821,8 @@
       <w:bCs/>
     </w:rPr>
   </w:style>
-  <w:style w:type="paragraph" w:styleId="user3">
-    <w:name w:val="표 내용 (user)"/>
+  <w:style w:type="paragraph" w:styleId="Style8">
+    <w:name w:val="표 내용"/>
     <w:basedOn w:val="Normal"/>
     <w:qFormat/>
     <w:pPr>
@@ -6349,9 +9831,9 @@
     </w:pPr>
     <w:rPr/>
   </w:style>
-  <w:style w:type="paragraph" w:styleId="user4">
-    <w:name w:val="표제목 (user)"/>
-    <w:basedOn w:val="user3"/>
+  <w:style w:type="paragraph" w:styleId="Style9">
+    <w:name w:val="표제목"/>
+    <w:basedOn w:val="Style8"/>
     <w:qFormat/>
     <w:pPr>
       <w:suppressLineNumbers/>

</xml_diff>

<commit_message>
Add F40PH-2CAT and Gallery Cab Car
Added F40PH-2CAT and Gallery Cab Car from Caltrain.
</commit_message>
<xml_diff>
--- a/raildriver-USA-Remapped.docx
+++ b/raildriver-USA-Remapped.docx
@@ -14804,6 +14804,2290 @@
           <w:sz w:val="16"/>
           <w:szCs w:val="16"/>
         </w:rPr>
+        <w:t xml:space="preserve">    MP15DC-1</w:t>
+      </w:r>
+    </w:p>
+    <w:tbl>
+      <w:tblPr>
+        <w:tblW w:w="14248" w:type="dxa"/>
+        <w:jc w:val="left"/>
+        <w:tblInd w:w="-5" w:type="dxa"/>
+        <w:tblLayout w:type="fixed"/>
+        <w:tblCellMar>
+          <w:top w:w="0" w:type="dxa"/>
+          <w:left w:w="108" w:type="dxa"/>
+          <w:bottom w:w="0" w:type="dxa"/>
+          <w:right w:w="108" w:type="dxa"/>
+        </w:tblCellMar>
+        <w:tblLook w:firstRow="1" w:noVBand="1" w:lastRow="0" w:firstColumn="1" w:lastColumn="0" w:noHBand="0" w:val="04a0"/>
+      </w:tblPr>
+      <w:tblGrid>
+        <w:gridCol w:w="1017"/>
+        <w:gridCol w:w="1019"/>
+        <w:gridCol w:w="1014"/>
+        <w:gridCol w:w="1016"/>
+        <w:gridCol w:w="1020"/>
+        <w:gridCol w:w="1016"/>
+        <w:gridCol w:w="1016"/>
+        <w:gridCol w:w="1017"/>
+        <w:gridCol w:w="1016"/>
+        <w:gridCol w:w="1020"/>
+        <w:gridCol w:w="1016"/>
+        <w:gridCol w:w="1016"/>
+        <w:gridCol w:w="1016"/>
+        <w:gridCol w:w="1029"/>
+      </w:tblGrid>
+      <w:tr>
+        <w:trPr>
+          <w:trHeight w:val="440" w:hRule="exact"/>
+          <w:cantSplit w:val="true"/>
+        </w:trPr>
+        <w:tc>
+          <w:tcPr>
+            <w:tcW w:w="1017" w:type="dxa"/>
+            <w:tcBorders>
+              <w:top w:val="single" w:sz="4" w:space="0" w:color="000000"/>
+              <w:left w:val="single" w:sz="4" w:space="0" w:color="000000"/>
+              <w:bottom w:val="single" w:sz="4" w:space="0" w:color="000000"/>
+            </w:tcBorders>
+            <w:vAlign w:val="bottom"/>
+          </w:tcPr>
+          <w:p>
+            <w:pPr>
+              <w:pStyle w:val="Normal"/>
+              <w:widowControl w:val="false"/>
+              <w:spacing w:lineRule="auto" w:line="180" w:before="0" w:after="60"/>
+              <w:jc w:val="center"/>
+              <w:rPr>
+                <w:color w:val="000000"/>
+                <w:sz w:val="16"/>
+                <w:szCs w:val="16"/>
+              </w:rPr>
+            </w:pPr>
+            <w:r>
+              <w:rPr>
+                <w:rFonts w:eastAsia="arial" w:ascii="arial" w:hAnsi="arial"/>
+                <w:b/>
+                <w:color w:val="000000"/>
+                <w:sz w:val="16"/>
+                <w:szCs w:val="16"/>
+              </w:rPr>
+              <w:t>Pause</w:t>
+            </w:r>
+          </w:p>
+        </w:tc>
+        <w:tc>
+          <w:tcPr>
+            <w:tcW w:w="1019" w:type="dxa"/>
+            <w:tcBorders>
+              <w:top w:val="single" w:sz="4" w:space="0" w:color="000000"/>
+              <w:left w:val="single" w:sz="4" w:space="0" w:color="000000"/>
+              <w:bottom w:val="single" w:sz="4" w:space="0" w:color="000000"/>
+            </w:tcBorders>
+            <w:vAlign w:val="bottom"/>
+          </w:tcPr>
+          <w:p>
+            <w:pPr>
+              <w:pStyle w:val="Normal"/>
+              <w:widowControl w:val="false"/>
+              <w:spacing w:lineRule="auto" w:line="180"/>
+              <w:jc w:val="center"/>
+              <w:rPr>
+                <w:color w:val="000000"/>
+                <w:sz w:val="16"/>
+                <w:szCs w:val="16"/>
+              </w:rPr>
+            </w:pPr>
+            <w:r>
+              <w:rPr>
+                <w:color w:val="000000"/>
+                <w:sz w:val="16"/>
+                <w:szCs w:val="16"/>
+              </w:rPr>
+              <w:t>Reverser Handle</w:t>
+            </w:r>
+          </w:p>
+        </w:tc>
+        <w:tc>
+          <w:tcPr>
+            <w:tcW w:w="1014" w:type="dxa"/>
+            <w:tcBorders>
+              <w:top w:val="single" w:sz="4" w:space="0" w:color="000000"/>
+              <w:left w:val="single" w:sz="4" w:space="0" w:color="000000"/>
+              <w:bottom w:val="single" w:sz="4" w:space="0" w:color="000000"/>
+            </w:tcBorders>
+            <w:vAlign w:val="bottom"/>
+          </w:tcPr>
+          <w:p>
+            <w:pPr>
+              <w:pStyle w:val="Normal"/>
+              <w:widowControl w:val="false"/>
+              <w:jc w:val="center"/>
+              <w:rPr>
+                <w:rFonts w:ascii="arial" w:hAnsi="arial" w:eastAsia="arial"/>
+                <w:color w:val="000000"/>
+                <w:sz w:val="16"/>
+                <w:szCs w:val="16"/>
+              </w:rPr>
+            </w:pPr>
+            <w:r>
+              <w:rPr>
+                <w:rFonts w:eastAsia="arial" w:ascii="arial" w:hAnsi="arial"/>
+                <w:color w:val="000000"/>
+                <w:sz w:val="16"/>
+                <w:szCs w:val="16"/>
+              </w:rPr>
+              <w:t>Radio</w:t>
+            </w:r>
+          </w:p>
+        </w:tc>
+        <w:tc>
+          <w:tcPr>
+            <w:tcW w:w="1016" w:type="dxa"/>
+            <w:tcBorders>
+              <w:top w:val="single" w:sz="4" w:space="0" w:color="000000"/>
+              <w:left w:val="single" w:sz="4" w:space="0" w:color="000000"/>
+              <w:bottom w:val="single" w:sz="4" w:space="0" w:color="000000"/>
+            </w:tcBorders>
+            <w:vAlign w:val="bottom"/>
+          </w:tcPr>
+          <w:p>
+            <w:pPr>
+              <w:pStyle w:val="Normal"/>
+              <w:widowControl w:val="false"/>
+              <w:spacing w:lineRule="auto" w:line="180"/>
+              <w:jc w:val="center"/>
+              <w:rPr>
+                <w:color w:val="000000"/>
+                <w:sz w:val="16"/>
+                <w:szCs w:val="16"/>
+              </w:rPr>
+            </w:pPr>
+            <w:r>
+              <w:rPr>
+                <w:color w:val="000000"/>
+                <w:sz w:val="16"/>
+                <w:szCs w:val="16"/>
+              </w:rPr>
+              <w:t>Engine Run</w:t>
+            </w:r>
+          </w:p>
+        </w:tc>
+        <w:tc>
+          <w:tcPr>
+            <w:tcW w:w="1020" w:type="dxa"/>
+            <w:tcBorders>
+              <w:top w:val="single" w:sz="4" w:space="0" w:color="000000"/>
+              <w:left w:val="single" w:sz="4" w:space="0" w:color="000000"/>
+              <w:bottom w:val="single" w:sz="4" w:space="0" w:color="000000"/>
+            </w:tcBorders>
+            <w:vAlign w:val="bottom"/>
+          </w:tcPr>
+          <w:p>
+            <w:pPr>
+              <w:pStyle w:val="Normal"/>
+              <w:widowControl w:val="false"/>
+              <w:spacing w:lineRule="auto" w:line="180"/>
+              <w:jc w:val="center"/>
+              <w:rPr>
+                <w:color w:val="000000"/>
+                <w:sz w:val="16"/>
+                <w:szCs w:val="16"/>
+              </w:rPr>
+            </w:pPr>
+            <w:r>
+              <w:rPr>
+                <w:color w:val="000000"/>
+                <w:sz w:val="16"/>
+                <w:szCs w:val="16"/>
+              </w:rPr>
+              <w:t>Generator Field</w:t>
+            </w:r>
+          </w:p>
+        </w:tc>
+        <w:tc>
+          <w:tcPr>
+            <w:tcW w:w="1016" w:type="dxa"/>
+            <w:tcBorders>
+              <w:top w:val="single" w:sz="4" w:space="0" w:color="000000"/>
+              <w:left w:val="single" w:sz="4" w:space="0" w:color="000000"/>
+              <w:bottom w:val="single" w:sz="4" w:space="0" w:color="000000"/>
+            </w:tcBorders>
+            <w:vAlign w:val="bottom"/>
+          </w:tcPr>
+          <w:p>
+            <w:pPr>
+              <w:pStyle w:val="Normal"/>
+              <w:widowControl w:val="false"/>
+              <w:jc w:val="center"/>
+              <w:rPr>
+                <w:color w:val="000000"/>
+                <w:sz w:val="16"/>
+                <w:szCs w:val="16"/>
+              </w:rPr>
+            </w:pPr>
+            <w:r>
+              <w:rPr>
+                <w:color w:val="000000"/>
+                <w:sz w:val="16"/>
+                <w:szCs w:val="16"/>
+              </w:rPr>
+              <w:t>Brake</w:t>
+            </w:r>
+          </w:p>
+          <w:p>
+            <w:pPr>
+              <w:pStyle w:val="Normal"/>
+              <w:widowControl w:val="false"/>
+              <w:jc w:val="center"/>
+              <w:rPr>
+                <w:color w:val="000000"/>
+                <w:sz w:val="16"/>
+                <w:szCs w:val="16"/>
+              </w:rPr>
+            </w:pPr>
+            <w:r>
+              <w:rPr>
+                <w:color w:val="000000"/>
+                <w:sz w:val="16"/>
+                <w:szCs w:val="16"/>
+              </w:rPr>
+              <w:t>Cut-In</w:t>
+            </w:r>
+          </w:p>
+        </w:tc>
+        <w:tc>
+          <w:tcPr>
+            <w:tcW w:w="1016" w:type="dxa"/>
+            <w:tcBorders>
+              <w:top w:val="single" w:sz="4" w:space="0" w:color="000000"/>
+              <w:left w:val="single" w:sz="4" w:space="0" w:color="000000"/>
+              <w:bottom w:val="single" w:sz="4" w:space="0" w:color="000000"/>
+            </w:tcBorders>
+            <w:vAlign w:val="bottom"/>
+          </w:tcPr>
+          <w:p>
+            <w:pPr>
+              <w:pStyle w:val="Normal"/>
+              <w:widowControl w:val="false"/>
+              <w:jc w:val="center"/>
+              <w:rPr>
+                <w:color w:val="000000"/>
+                <w:sz w:val="16"/>
+                <w:szCs w:val="16"/>
+              </w:rPr>
+            </w:pPr>
+            <w:r>
+              <w:rPr>
+                <w:color w:val="000000"/>
+                <w:sz w:val="16"/>
+                <w:szCs w:val="16"/>
+              </w:rPr>
+              <w:t>MU-2A Lead</w:t>
+            </w:r>
+          </w:p>
+        </w:tc>
+        <w:tc>
+          <w:tcPr>
+            <w:tcW w:w="1017" w:type="dxa"/>
+            <w:tcBorders>
+              <w:top w:val="single" w:sz="4" w:space="0" w:color="000000"/>
+              <w:left w:val="single" w:sz="4" w:space="0" w:color="000000"/>
+              <w:bottom w:val="single" w:sz="4" w:space="0" w:color="000000"/>
+            </w:tcBorders>
+            <w:vAlign w:val="bottom"/>
+          </w:tcPr>
+          <w:p>
+            <w:pPr>
+              <w:pStyle w:val="Normal"/>
+              <w:widowControl w:val="false"/>
+              <w:jc w:val="center"/>
+              <w:rPr>
+                <w:color w:val="000000"/>
+                <w:sz w:val="16"/>
+                <w:szCs w:val="16"/>
+              </w:rPr>
+            </w:pPr>
+            <w:r>
+              <w:rPr>
+                <w:rFonts w:eastAsia="arial" w:ascii="arial" w:hAnsi="arial"/>
+                <w:color w:val="000000"/>
+                <w:sz w:val="16"/>
+                <w:szCs w:val="16"/>
+              </w:rPr>
+              <w:t>Isolation Run</w:t>
+            </w:r>
+          </w:p>
+        </w:tc>
+        <w:tc>
+          <w:tcPr>
+            <w:tcW w:w="1016" w:type="dxa"/>
+            <w:tcBorders>
+              <w:top w:val="single" w:sz="4" w:space="0" w:color="000000"/>
+              <w:left w:val="single" w:sz="4" w:space="0" w:color="000000"/>
+              <w:bottom w:val="single" w:sz="4" w:space="0" w:color="000000"/>
+            </w:tcBorders>
+            <w:vAlign w:val="bottom"/>
+          </w:tcPr>
+          <w:p>
+            <w:pPr>
+              <w:pStyle w:val="Normal"/>
+              <w:widowControl w:val="false"/>
+              <w:jc w:val="center"/>
+              <w:rPr>
+                <w:sz w:val="16"/>
+                <w:szCs w:val="16"/>
+              </w:rPr>
+            </w:pPr>
+            <w:r>
+              <w:rPr>
+                <w:sz w:val="16"/>
+                <w:szCs w:val="16"/>
+              </w:rPr>
+              <w:t>Rear HL Up</w:t>
+            </w:r>
+          </w:p>
+        </w:tc>
+        <w:tc>
+          <w:tcPr>
+            <w:tcW w:w="1020" w:type="dxa"/>
+            <w:tcBorders>
+              <w:top w:val="single" w:sz="4" w:space="0" w:color="000000"/>
+              <w:left w:val="single" w:sz="4" w:space="0" w:color="000000"/>
+              <w:bottom w:val="single" w:sz="4" w:space="0" w:color="000000"/>
+            </w:tcBorders>
+            <w:vAlign w:val="bottom"/>
+          </w:tcPr>
+          <w:p>
+            <w:pPr>
+              <w:pStyle w:val="Normal"/>
+              <w:widowControl w:val="false"/>
+              <w:jc w:val="center"/>
+              <w:rPr>
+                <w:color w:val="000000"/>
+                <w:sz w:val="16"/>
+                <w:szCs w:val="16"/>
+              </w:rPr>
+            </w:pPr>
+            <w:r>
+              <w:rPr>
+                <w:rFonts w:eastAsia="arial" w:ascii="arial" w:hAnsi="arial"/>
+                <w:color w:val="000000"/>
+                <w:sz w:val="16"/>
+                <w:szCs w:val="16"/>
+              </w:rPr>
+              <w:t>Banking COMM</w:t>
+            </w:r>
+          </w:p>
+        </w:tc>
+        <w:tc>
+          <w:tcPr>
+            <w:tcW w:w="1016" w:type="dxa"/>
+            <w:tcBorders>
+              <w:top w:val="single" w:sz="4" w:space="0" w:color="000000"/>
+              <w:left w:val="single" w:sz="4" w:space="0" w:color="000000"/>
+              <w:bottom w:val="single" w:sz="4" w:space="0" w:color="000000"/>
+            </w:tcBorders>
+            <w:vAlign w:val="bottom"/>
+          </w:tcPr>
+          <w:p>
+            <w:pPr>
+              <w:pStyle w:val="Normal"/>
+              <w:widowControl w:val="false"/>
+              <w:spacing w:lineRule="auto" w:line="180"/>
+              <w:jc w:val="center"/>
+              <w:rPr>
+                <w:sz w:val="16"/>
+                <w:szCs w:val="16"/>
+              </w:rPr>
+            </w:pPr>
+            <w:r>
+              <w:rPr>
+                <w:rFonts w:eastAsia="arial" w:ascii="arial" w:hAnsi="arial"/>
+                <w:color w:val="000000"/>
+                <w:sz w:val="16"/>
+                <w:szCs w:val="16"/>
+              </w:rPr>
+              <w:t>Gauge Light Up</w:t>
+            </w:r>
+          </w:p>
+        </w:tc>
+        <w:tc>
+          <w:tcPr>
+            <w:tcW w:w="1016" w:type="dxa"/>
+            <w:tcBorders>
+              <w:top w:val="single" w:sz="4" w:space="0" w:color="000000"/>
+              <w:left w:val="single" w:sz="4" w:space="0" w:color="000000"/>
+              <w:bottom w:val="single" w:sz="4" w:space="0" w:color="000000"/>
+            </w:tcBorders>
+            <w:vAlign w:val="bottom"/>
+          </w:tcPr>
+          <w:p>
+            <w:pPr>
+              <w:pStyle w:val="Normal"/>
+              <w:widowControl w:val="false"/>
+              <w:spacing w:lineRule="auto" w:line="180"/>
+              <w:jc w:val="center"/>
+              <w:rPr>
+                <w:sz w:val="16"/>
+                <w:szCs w:val="16"/>
+              </w:rPr>
+            </w:pPr>
+            <w:r>
+              <w:rPr>
+                <w:sz w:val="16"/>
+                <w:szCs w:val="16"/>
+              </w:rPr>
+              <w:t>Cab Light</w:t>
+            </w:r>
+          </w:p>
+        </w:tc>
+        <w:tc>
+          <w:tcPr>
+            <w:tcW w:w="1016" w:type="dxa"/>
+            <w:tcBorders>
+              <w:top w:val="single" w:sz="4" w:space="0" w:color="000000"/>
+              <w:left w:val="single" w:sz="4" w:space="0" w:color="000000"/>
+              <w:bottom w:val="single" w:sz="4" w:space="0" w:color="000000"/>
+            </w:tcBorders>
+            <w:vAlign w:val="bottom"/>
+          </w:tcPr>
+          <w:p>
+            <w:pPr>
+              <w:pStyle w:val="Normal"/>
+              <w:widowControl w:val="false"/>
+              <w:spacing w:lineRule="auto" w:line="180"/>
+              <w:jc w:val="center"/>
+              <w:rPr>
+                <w:sz w:val="16"/>
+                <w:szCs w:val="16"/>
+              </w:rPr>
+            </w:pPr>
+            <w:r>
+              <w:rPr>
+                <w:rFonts w:eastAsia="arial" w:ascii="arial" w:hAnsi="arial"/>
+                <w:color w:val="000000"/>
+                <w:sz w:val="16"/>
+                <w:szCs w:val="16"/>
+              </w:rPr>
+              <w:t>1-Person</w:t>
+            </w:r>
+          </w:p>
+        </w:tc>
+        <w:tc>
+          <w:tcPr>
+            <w:tcW w:w="1029" w:type="dxa"/>
+            <w:tcBorders>
+              <w:top w:val="single" w:sz="4" w:space="0" w:color="000000"/>
+              <w:left w:val="single" w:sz="4" w:space="0" w:color="000000"/>
+              <w:bottom w:val="single" w:sz="4" w:space="0" w:color="000000"/>
+              <w:right w:val="single" w:sz="4" w:space="0" w:color="000000"/>
+            </w:tcBorders>
+            <w:vAlign w:val="bottom"/>
+          </w:tcPr>
+          <w:p>
+            <w:pPr>
+              <w:pStyle w:val="Normal"/>
+              <w:widowControl w:val="false"/>
+              <w:spacing w:lineRule="auto" w:line="180"/>
+              <w:jc w:val="center"/>
+              <w:rPr>
+                <w:sz w:val="16"/>
+                <w:szCs w:val="16"/>
+              </w:rPr>
+            </w:pPr>
+            <w:r>
+              <w:rPr>
+                <w:rFonts w:eastAsia="arial" w:ascii="arial" w:hAnsi="arial"/>
+                <w:color w:val="000000"/>
+                <w:sz w:val="16"/>
+                <w:szCs w:val="16"/>
+              </w:rPr>
+              <w:t>Next</w:t>
+            </w:r>
+          </w:p>
+          <w:p>
+            <w:pPr>
+              <w:pStyle w:val="Normal"/>
+              <w:widowControl w:val="false"/>
+              <w:spacing w:lineRule="auto" w:line="180"/>
+              <w:jc w:val="center"/>
+              <w:rPr>
+                <w:sz w:val="16"/>
+                <w:szCs w:val="16"/>
+              </w:rPr>
+            </w:pPr>
+            <w:r>
+              <w:rPr>
+                <w:rFonts w:eastAsia="arial" w:ascii="arial" w:hAnsi="arial"/>
+                <w:color w:val="000000"/>
+                <w:sz w:val="16"/>
+                <w:szCs w:val="16"/>
+              </w:rPr>
+              <w:t>Cab Cam</w:t>
+            </w:r>
+          </w:p>
+        </w:tc>
+      </w:tr>
+    </w:tbl>
+    <w:p>
+      <w:pPr>
+        <w:pStyle w:val="Normal"/>
+        <w:rPr>
+          <w:rFonts w:ascii="arial" w:hAnsi="arial" w:eastAsia="arial"/>
+          <w:color w:val="000000"/>
+          <w:sz w:val="16"/>
+          <w:szCs w:val="16"/>
+        </w:rPr>
+      </w:pPr>
+      <w:r>
+        <w:rPr>
+          <w:rFonts w:eastAsia="arial" w:ascii="arial" w:hAnsi="arial"/>
+          <w:color w:val="000000"/>
+          <w:sz w:val="16"/>
+          <w:szCs w:val="16"/>
+        </w:rPr>
+      </w:r>
+    </w:p>
+    <w:p>
+      <w:pPr>
+        <w:pStyle w:val="Normal"/>
+        <w:rPr>
+          <w:color w:val="000000"/>
+          <w:sz w:val="16"/>
+          <w:szCs w:val="16"/>
+        </w:rPr>
+      </w:pPr>
+      <w:r>
+        <w:rPr>
+          <w:rFonts w:eastAsia="arial" w:ascii="arial" w:hAnsi="arial"/>
+          <w:color w:val="000000"/>
+          <w:sz w:val="16"/>
+          <w:szCs w:val="16"/>
+        </w:rPr>
+        <w:tab/>
+        <w:t xml:space="preserve">           MP15DC-2</w:t>
+      </w:r>
+    </w:p>
+    <w:tbl>
+      <w:tblPr>
+        <w:tblW w:w="14248" w:type="dxa"/>
+        <w:jc w:val="left"/>
+        <w:tblInd w:w="-5" w:type="dxa"/>
+        <w:tblLayout w:type="fixed"/>
+        <w:tblCellMar>
+          <w:top w:w="0" w:type="dxa"/>
+          <w:left w:w="108" w:type="dxa"/>
+          <w:bottom w:w="0" w:type="dxa"/>
+          <w:right w:w="108" w:type="dxa"/>
+        </w:tblCellMar>
+        <w:tblLook w:firstRow="1" w:noVBand="1" w:lastRow="0" w:firstColumn="1" w:lastColumn="0" w:noHBand="0" w:val="04a0"/>
+      </w:tblPr>
+      <w:tblGrid>
+        <w:gridCol w:w="1017"/>
+        <w:gridCol w:w="1019"/>
+        <w:gridCol w:w="1014"/>
+        <w:gridCol w:w="1016"/>
+        <w:gridCol w:w="1020"/>
+        <w:gridCol w:w="1016"/>
+        <w:gridCol w:w="1016"/>
+        <w:gridCol w:w="1017"/>
+        <w:gridCol w:w="1016"/>
+        <w:gridCol w:w="1020"/>
+        <w:gridCol w:w="1016"/>
+        <w:gridCol w:w="1016"/>
+        <w:gridCol w:w="1016"/>
+        <w:gridCol w:w="1029"/>
+      </w:tblGrid>
+      <w:tr>
+        <w:trPr>
+          <w:trHeight w:val="440" w:hRule="exact"/>
+          <w:cantSplit w:val="true"/>
+        </w:trPr>
+        <w:tc>
+          <w:tcPr>
+            <w:tcW w:w="1017" w:type="dxa"/>
+            <w:tcBorders>
+              <w:top w:val="single" w:sz="4" w:space="0" w:color="000000"/>
+              <w:left w:val="single" w:sz="4" w:space="0" w:color="000000"/>
+              <w:bottom w:val="single" w:sz="4" w:space="0" w:color="000000"/>
+            </w:tcBorders>
+            <w:vAlign w:val="bottom"/>
+          </w:tcPr>
+          <w:p>
+            <w:pPr>
+              <w:pStyle w:val="Normal"/>
+              <w:widowControl w:val="false"/>
+              <w:spacing w:lineRule="auto" w:line="180" w:before="0" w:after="60"/>
+              <w:jc w:val="center"/>
+              <w:rPr>
+                <w:b/>
+                <w:bCs/>
+              </w:rPr>
+            </w:pPr>
+            <w:r>
+              <w:rPr>
+                <w:b/>
+                <w:bCs/>
+                <w:color w:val="000000"/>
+                <w:sz w:val="16"/>
+                <w:szCs w:val="16"/>
+              </w:rPr>
+              <w:t>HUD</w:t>
+            </w:r>
+          </w:p>
+        </w:tc>
+        <w:tc>
+          <w:tcPr>
+            <w:tcW w:w="1019" w:type="dxa"/>
+            <w:tcBorders>
+              <w:top w:val="single" w:sz="4" w:space="0" w:color="000000"/>
+              <w:left w:val="single" w:sz="4" w:space="0" w:color="000000"/>
+              <w:bottom w:val="single" w:sz="4" w:space="0" w:color="000000"/>
+            </w:tcBorders>
+            <w:vAlign w:val="bottom"/>
+          </w:tcPr>
+          <w:p>
+            <w:pPr>
+              <w:pStyle w:val="Normal"/>
+              <w:widowControl w:val="false"/>
+              <w:spacing w:lineRule="auto" w:line="180"/>
+              <w:jc w:val="center"/>
+              <w:rPr>
+                <w:color w:val="000000"/>
+                <w:sz w:val="16"/>
+                <w:szCs w:val="16"/>
+              </w:rPr>
+            </w:pPr>
+            <w:r>
+              <w:rPr>
+                <w:color w:val="000000"/>
+                <w:sz w:val="16"/>
+                <w:szCs w:val="16"/>
+              </w:rPr>
+              <w:t>Schedule</w:t>
+            </w:r>
+          </w:p>
+        </w:tc>
+        <w:tc>
+          <w:tcPr>
+            <w:tcW w:w="1014" w:type="dxa"/>
+            <w:tcBorders>
+              <w:top w:val="single" w:sz="4" w:space="0" w:color="000000"/>
+              <w:left w:val="single" w:sz="4" w:space="0" w:color="000000"/>
+              <w:bottom w:val="single" w:sz="4" w:space="0" w:color="000000"/>
+            </w:tcBorders>
+            <w:vAlign w:val="bottom"/>
+          </w:tcPr>
+          <w:p>
+            <w:pPr>
+              <w:pStyle w:val="Normal"/>
+              <w:widowControl w:val="false"/>
+              <w:spacing w:lineRule="auto" w:line="180"/>
+              <w:jc w:val="center"/>
+              <w:rPr>
+                <w:color w:val="000000"/>
+                <w:sz w:val="16"/>
+                <w:szCs w:val="16"/>
+              </w:rPr>
+            </w:pPr>
+            <w:r>
+              <w:rPr>
+                <w:rFonts w:eastAsia="arial" w:ascii="arial" w:hAnsi="arial"/>
+                <w:color w:val="000000"/>
+                <w:sz w:val="16"/>
+                <w:szCs w:val="16"/>
+              </w:rPr>
+              <w:t>Engine Stop</w:t>
+            </w:r>
+          </w:p>
+        </w:tc>
+        <w:tc>
+          <w:tcPr>
+            <w:tcW w:w="1016" w:type="dxa"/>
+            <w:tcBorders>
+              <w:top w:val="single" w:sz="4" w:space="0" w:color="000000"/>
+              <w:left w:val="single" w:sz="4" w:space="0" w:color="000000"/>
+              <w:bottom w:val="single" w:sz="4" w:space="0" w:color="000000"/>
+            </w:tcBorders>
+            <w:vAlign w:val="bottom"/>
+          </w:tcPr>
+          <w:p>
+            <w:pPr>
+              <w:pStyle w:val="Normal"/>
+              <w:widowControl w:val="false"/>
+              <w:spacing w:lineRule="auto" w:line="180"/>
+              <w:jc w:val="center"/>
+              <w:rPr>
+                <w:color w:val="000000"/>
+                <w:sz w:val="16"/>
+                <w:szCs w:val="16"/>
+              </w:rPr>
+            </w:pPr>
+            <w:r>
+              <w:rPr>
+                <w:color w:val="000000"/>
+                <w:sz w:val="16"/>
+                <w:szCs w:val="16"/>
+              </w:rPr>
+              <w:t>Warning Devices</w:t>
+            </w:r>
+          </w:p>
+        </w:tc>
+        <w:tc>
+          <w:tcPr>
+            <w:tcW w:w="1020" w:type="dxa"/>
+            <w:tcBorders>
+              <w:top w:val="single" w:sz="4" w:space="0" w:color="000000"/>
+              <w:left w:val="single" w:sz="4" w:space="0" w:color="000000"/>
+              <w:bottom w:val="single" w:sz="4" w:space="0" w:color="000000"/>
+            </w:tcBorders>
+            <w:vAlign w:val="bottom"/>
+          </w:tcPr>
+          <w:p>
+            <w:pPr>
+              <w:pStyle w:val="Normal"/>
+              <w:widowControl w:val="false"/>
+              <w:spacing w:lineRule="auto" w:line="180"/>
+              <w:jc w:val="center"/>
+              <w:rPr>
+                <w:color w:val="000000"/>
+                <w:sz w:val="16"/>
+                <w:szCs w:val="16"/>
+              </w:rPr>
+            </w:pPr>
+            <w:r>
+              <w:rPr>
+                <w:color w:val="000000"/>
+                <w:sz w:val="16"/>
+                <w:szCs w:val="16"/>
+              </w:rPr>
+              <w:t>Control &amp; Fuel Pump</w:t>
+            </w:r>
+          </w:p>
+        </w:tc>
+        <w:tc>
+          <w:tcPr>
+            <w:tcW w:w="1016" w:type="dxa"/>
+            <w:tcBorders>
+              <w:top w:val="single" w:sz="4" w:space="0" w:color="000000"/>
+              <w:left w:val="single" w:sz="4" w:space="0" w:color="000000"/>
+              <w:bottom w:val="single" w:sz="4" w:space="0" w:color="000000"/>
+            </w:tcBorders>
+            <w:vAlign w:val="bottom"/>
+          </w:tcPr>
+          <w:p>
+            <w:pPr>
+              <w:pStyle w:val="Normal"/>
+              <w:widowControl w:val="false"/>
+              <w:jc w:val="center"/>
+              <w:rPr>
+                <w:color w:val="000000"/>
+                <w:sz w:val="16"/>
+                <w:szCs w:val="16"/>
+              </w:rPr>
+            </w:pPr>
+            <w:r>
+              <w:rPr>
+                <w:color w:val="000000"/>
+                <w:sz w:val="16"/>
+                <w:szCs w:val="16"/>
+              </w:rPr>
+              <w:t>Brake</w:t>
+            </w:r>
+          </w:p>
+          <w:p>
+            <w:pPr>
+              <w:pStyle w:val="Normal"/>
+              <w:widowControl w:val="false"/>
+              <w:jc w:val="center"/>
+              <w:rPr>
+                <w:color w:val="000000"/>
+                <w:sz w:val="16"/>
+                <w:szCs w:val="16"/>
+              </w:rPr>
+            </w:pPr>
+            <w:r>
+              <w:rPr>
+                <w:color w:val="000000"/>
+                <w:sz w:val="16"/>
+                <w:szCs w:val="16"/>
+              </w:rPr>
+              <w:t>Cut-Out</w:t>
+            </w:r>
+          </w:p>
+        </w:tc>
+        <w:tc>
+          <w:tcPr>
+            <w:tcW w:w="1016" w:type="dxa"/>
+            <w:tcBorders>
+              <w:top w:val="single" w:sz="4" w:space="0" w:color="000000"/>
+              <w:left w:val="single" w:sz="4" w:space="0" w:color="000000"/>
+              <w:bottom w:val="single" w:sz="4" w:space="0" w:color="000000"/>
+            </w:tcBorders>
+            <w:vAlign w:val="bottom"/>
+          </w:tcPr>
+          <w:p>
+            <w:pPr>
+              <w:pStyle w:val="Normal"/>
+              <w:widowControl w:val="false"/>
+              <w:jc w:val="center"/>
+              <w:rPr>
+                <w:color w:val="000000"/>
+                <w:sz w:val="16"/>
+                <w:szCs w:val="16"/>
+              </w:rPr>
+            </w:pPr>
+            <w:r>
+              <w:rPr>
+                <w:rFonts w:eastAsia="arial" w:ascii="arial" w:hAnsi="arial"/>
+                <w:color w:val="000000"/>
+                <w:sz w:val="16"/>
+                <w:szCs w:val="16"/>
+              </w:rPr>
+              <w:t>MU-2A Trail</w:t>
+            </w:r>
+          </w:p>
+        </w:tc>
+        <w:tc>
+          <w:tcPr>
+            <w:tcW w:w="1017" w:type="dxa"/>
+            <w:tcBorders>
+              <w:top w:val="single" w:sz="4" w:space="0" w:color="000000"/>
+              <w:left w:val="single" w:sz="4" w:space="0" w:color="000000"/>
+              <w:bottom w:val="single" w:sz="4" w:space="0" w:color="000000"/>
+            </w:tcBorders>
+            <w:vAlign w:val="bottom"/>
+          </w:tcPr>
+          <w:p>
+            <w:pPr>
+              <w:pStyle w:val="Normal"/>
+              <w:widowControl w:val="false"/>
+              <w:jc w:val="center"/>
+              <w:rPr>
+                <w:color w:val="000000"/>
+                <w:sz w:val="16"/>
+                <w:szCs w:val="16"/>
+              </w:rPr>
+            </w:pPr>
+            <w:r>
+              <w:rPr>
+                <w:rFonts w:eastAsia="arial" w:ascii="arial" w:hAnsi="arial"/>
+                <w:color w:val="000000"/>
+                <w:sz w:val="16"/>
+                <w:szCs w:val="16"/>
+              </w:rPr>
+              <w:t>Isolation Start Iso.</w:t>
+            </w:r>
+          </w:p>
+        </w:tc>
+        <w:tc>
+          <w:tcPr>
+            <w:tcW w:w="1016" w:type="dxa"/>
+            <w:tcBorders>
+              <w:top w:val="single" w:sz="4" w:space="0" w:color="000000"/>
+              <w:left w:val="single" w:sz="4" w:space="0" w:color="000000"/>
+              <w:bottom w:val="single" w:sz="4" w:space="0" w:color="000000"/>
+            </w:tcBorders>
+            <w:vAlign w:val="bottom"/>
+          </w:tcPr>
+          <w:p>
+            <w:pPr>
+              <w:pStyle w:val="Normal"/>
+              <w:widowControl w:val="false"/>
+              <w:jc w:val="center"/>
+              <w:rPr>
+                <w:sz w:val="16"/>
+                <w:szCs w:val="16"/>
+              </w:rPr>
+            </w:pPr>
+            <w:r>
+              <w:rPr>
+                <w:rFonts w:eastAsia="arial" w:ascii="arial" w:hAnsi="arial"/>
+                <w:color w:val="000000"/>
+                <w:sz w:val="16"/>
+                <w:szCs w:val="16"/>
+              </w:rPr>
+              <w:t>Rear HL Down</w:t>
+            </w:r>
+          </w:p>
+        </w:tc>
+        <w:tc>
+          <w:tcPr>
+            <w:tcW w:w="1020" w:type="dxa"/>
+            <w:tcBorders>
+              <w:top w:val="single" w:sz="4" w:space="0" w:color="000000"/>
+              <w:left w:val="single" w:sz="4" w:space="0" w:color="000000"/>
+              <w:bottom w:val="single" w:sz="4" w:space="0" w:color="000000"/>
+            </w:tcBorders>
+            <w:vAlign w:val="bottom"/>
+          </w:tcPr>
+          <w:p>
+            <w:pPr>
+              <w:pStyle w:val="Normal"/>
+              <w:widowControl w:val="false"/>
+              <w:spacing w:lineRule="auto" w:line="180"/>
+              <w:jc w:val="center"/>
+              <w:rPr>
+                <w:sz w:val="16"/>
+                <w:szCs w:val="16"/>
+              </w:rPr>
+            </w:pPr>
+            <w:r>
+              <w:rPr>
+                <w:sz w:val="16"/>
+                <w:szCs w:val="16"/>
+              </w:rPr>
+              <w:t>Headlight Control</w:t>
+            </w:r>
+          </w:p>
+        </w:tc>
+        <w:tc>
+          <w:tcPr>
+            <w:tcW w:w="1016" w:type="dxa"/>
+            <w:tcBorders>
+              <w:top w:val="single" w:sz="4" w:space="0" w:color="000000"/>
+              <w:left w:val="single" w:sz="4" w:space="0" w:color="000000"/>
+              <w:bottom w:val="single" w:sz="4" w:space="0" w:color="000000"/>
+            </w:tcBorders>
+            <w:vAlign w:val="bottom"/>
+          </w:tcPr>
+          <w:p>
+            <w:pPr>
+              <w:pStyle w:val="Normal"/>
+              <w:widowControl w:val="false"/>
+              <w:spacing w:lineRule="auto" w:line="180"/>
+              <w:jc w:val="center"/>
+              <w:rPr>
+                <w:sz w:val="16"/>
+                <w:szCs w:val="16"/>
+              </w:rPr>
+            </w:pPr>
+            <w:r>
+              <w:rPr>
+                <w:rFonts w:eastAsia="arial" w:ascii="arial" w:hAnsi="arial"/>
+                <w:color w:val="000000"/>
+                <w:sz w:val="16"/>
+                <w:szCs w:val="16"/>
+              </w:rPr>
+              <w:t>Gauge Light Dw</w:t>
+            </w:r>
+          </w:p>
+        </w:tc>
+        <w:tc>
+          <w:tcPr>
+            <w:tcW w:w="1016" w:type="dxa"/>
+            <w:tcBorders>
+              <w:top w:val="single" w:sz="4" w:space="0" w:color="000000"/>
+              <w:left w:val="single" w:sz="4" w:space="0" w:color="000000"/>
+              <w:bottom w:val="single" w:sz="4" w:space="0" w:color="000000"/>
+            </w:tcBorders>
+            <w:vAlign w:val="bottom"/>
+          </w:tcPr>
+          <w:p>
+            <w:pPr>
+              <w:pStyle w:val="Normal"/>
+              <w:widowControl w:val="false"/>
+              <w:spacing w:lineRule="auto" w:line="180"/>
+              <w:jc w:val="center"/>
+              <w:rPr>
+                <w:sz w:val="16"/>
+                <w:szCs w:val="16"/>
+              </w:rPr>
+            </w:pPr>
+            <w:r>
+              <w:rPr>
+                <w:sz w:val="16"/>
+                <w:szCs w:val="16"/>
+              </w:rPr>
+              <w:t>Step Light</w:t>
+            </w:r>
+          </w:p>
+        </w:tc>
+        <w:tc>
+          <w:tcPr>
+            <w:tcW w:w="1016" w:type="dxa"/>
+            <w:tcBorders>
+              <w:top w:val="single" w:sz="4" w:space="0" w:color="000000"/>
+              <w:left w:val="single" w:sz="4" w:space="0" w:color="000000"/>
+              <w:bottom w:val="single" w:sz="4" w:space="0" w:color="000000"/>
+            </w:tcBorders>
+            <w:vAlign w:val="bottom"/>
+          </w:tcPr>
+          <w:p>
+            <w:pPr>
+              <w:pStyle w:val="Normal"/>
+              <w:widowControl w:val="false"/>
+              <w:spacing w:lineRule="auto" w:line="180"/>
+              <w:jc w:val="center"/>
+              <w:rPr>
+                <w:sz w:val="16"/>
+                <w:szCs w:val="16"/>
+              </w:rPr>
+            </w:pPr>
+            <w:r>
+              <w:rPr>
+                <w:rFonts w:eastAsia="arial" w:ascii="arial" w:hAnsi="arial"/>
+                <w:color w:val="000000"/>
+                <w:sz w:val="16"/>
+                <w:szCs w:val="16"/>
+              </w:rPr>
+              <w:t>Exterior</w:t>
+            </w:r>
+          </w:p>
+          <w:p>
+            <w:pPr>
+              <w:pStyle w:val="Normal"/>
+              <w:widowControl w:val="false"/>
+              <w:spacing w:lineRule="auto" w:line="180"/>
+              <w:jc w:val="center"/>
+              <w:rPr>
+                <w:sz w:val="16"/>
+                <w:szCs w:val="16"/>
+              </w:rPr>
+            </w:pPr>
+            <w:r>
+              <w:rPr>
+                <w:rFonts w:eastAsia="arial" w:ascii="arial" w:hAnsi="arial"/>
+                <w:color w:val="000000"/>
+                <w:sz w:val="16"/>
+                <w:szCs w:val="16"/>
+              </w:rPr>
+              <w:t>Camera</w:t>
+            </w:r>
+          </w:p>
+        </w:tc>
+        <w:tc>
+          <w:tcPr>
+            <w:tcW w:w="1029" w:type="dxa"/>
+            <w:tcBorders>
+              <w:top w:val="single" w:sz="4" w:space="0" w:color="000000"/>
+              <w:left w:val="single" w:sz="4" w:space="0" w:color="000000"/>
+              <w:bottom w:val="single" w:sz="4" w:space="0" w:color="000000"/>
+              <w:right w:val="single" w:sz="4" w:space="0" w:color="000000"/>
+            </w:tcBorders>
+            <w:vAlign w:val="bottom"/>
+          </w:tcPr>
+          <w:p>
+            <w:pPr>
+              <w:pStyle w:val="Normal"/>
+              <w:widowControl w:val="false"/>
+              <w:spacing w:lineRule="auto" w:line="180"/>
+              <w:jc w:val="center"/>
+              <w:rPr>
+                <w:sz w:val="16"/>
+                <w:szCs w:val="16"/>
+              </w:rPr>
+            </w:pPr>
+            <w:r>
+              <w:rPr>
+                <w:rFonts w:eastAsia="arial" w:ascii="arial" w:hAnsi="arial"/>
+                <w:color w:val="000000"/>
+                <w:sz w:val="16"/>
+                <w:szCs w:val="16"/>
+              </w:rPr>
+              <w:t>Prev</w:t>
+            </w:r>
+          </w:p>
+          <w:p>
+            <w:pPr>
+              <w:pStyle w:val="Normal"/>
+              <w:widowControl w:val="false"/>
+              <w:spacing w:lineRule="auto" w:line="180"/>
+              <w:jc w:val="center"/>
+              <w:rPr>
+                <w:sz w:val="16"/>
+                <w:szCs w:val="16"/>
+              </w:rPr>
+            </w:pPr>
+            <w:r>
+              <w:rPr>
+                <w:rFonts w:eastAsia="arial" w:ascii="arial" w:hAnsi="arial"/>
+                <w:color w:val="000000"/>
+                <w:sz w:val="16"/>
+                <w:szCs w:val="16"/>
+              </w:rPr>
+              <w:t>Cab Cam</w:t>
+            </w:r>
+          </w:p>
+        </w:tc>
+      </w:tr>
+    </w:tbl>
+    <w:p>
+      <w:pPr>
+        <w:pStyle w:val="Normal"/>
+        <w:rPr>
+          <w:color w:val="000000"/>
+          <w:sz w:val="16"/>
+          <w:szCs w:val="16"/>
+        </w:rPr>
+      </w:pPr>
+      <w:r>
+        <w:rPr>
+          <w:color w:val="000000"/>
+          <w:sz w:val="16"/>
+          <w:szCs w:val="16"/>
+        </w:rPr>
+      </w:r>
+    </w:p>
+    <w:p>
+      <w:pPr>
+        <w:pStyle w:val="Normal"/>
+        <w:rPr>
+          <w:color w:val="000000"/>
+          <w:sz w:val="16"/>
+          <w:szCs w:val="16"/>
+        </w:rPr>
+      </w:pPr>
+      <w:r>
+        <w:rPr>
+          <w:color w:val="000000"/>
+          <w:sz w:val="16"/>
+          <w:szCs w:val="16"/>
+        </w:rPr>
+        <w:tab/>
+        <w:t xml:space="preserve">       </w:t>
+      </w:r>
+      <w:r>
+        <w:rPr>
+          <w:rFonts w:eastAsia="arial" w:ascii="arial" w:hAnsi="arial"/>
+          <w:color w:val="000000"/>
+          <w:sz w:val="16"/>
+          <w:szCs w:val="16"/>
+        </w:rPr>
+        <w:t xml:space="preserve">    F40PH-2CAT-1</w:t>
+      </w:r>
+    </w:p>
+    <w:tbl>
+      <w:tblPr>
+        <w:tblW w:w="14248" w:type="dxa"/>
+        <w:jc w:val="left"/>
+        <w:tblInd w:w="-5" w:type="dxa"/>
+        <w:tblLayout w:type="fixed"/>
+        <w:tblCellMar>
+          <w:top w:w="0" w:type="dxa"/>
+          <w:left w:w="108" w:type="dxa"/>
+          <w:bottom w:w="0" w:type="dxa"/>
+          <w:right w:w="108" w:type="dxa"/>
+        </w:tblCellMar>
+        <w:tblLook w:firstRow="1" w:noVBand="1" w:lastRow="0" w:firstColumn="1" w:lastColumn="0" w:noHBand="0" w:val="04a0"/>
+      </w:tblPr>
+      <w:tblGrid>
+        <w:gridCol w:w="1017"/>
+        <w:gridCol w:w="1019"/>
+        <w:gridCol w:w="1014"/>
+        <w:gridCol w:w="1016"/>
+        <w:gridCol w:w="1020"/>
+        <w:gridCol w:w="1016"/>
+        <w:gridCol w:w="1016"/>
+        <w:gridCol w:w="1017"/>
+        <w:gridCol w:w="1016"/>
+        <w:gridCol w:w="1020"/>
+        <w:gridCol w:w="1016"/>
+        <w:gridCol w:w="1016"/>
+        <w:gridCol w:w="1016"/>
+        <w:gridCol w:w="1029"/>
+      </w:tblGrid>
+      <w:tr>
+        <w:trPr>
+          <w:trHeight w:val="440" w:hRule="exact"/>
+          <w:cantSplit w:val="true"/>
+        </w:trPr>
+        <w:tc>
+          <w:tcPr>
+            <w:tcW w:w="1017" w:type="dxa"/>
+            <w:tcBorders>
+              <w:top w:val="single" w:sz="4" w:space="0" w:color="000000"/>
+              <w:left w:val="single" w:sz="4" w:space="0" w:color="000000"/>
+              <w:bottom w:val="single" w:sz="4" w:space="0" w:color="000000"/>
+            </w:tcBorders>
+            <w:vAlign w:val="bottom"/>
+          </w:tcPr>
+          <w:p>
+            <w:pPr>
+              <w:pStyle w:val="Normal"/>
+              <w:widowControl w:val="false"/>
+              <w:spacing w:lineRule="auto" w:line="180" w:before="0" w:after="60"/>
+              <w:jc w:val="center"/>
+              <w:rPr>
+                <w:color w:val="000000"/>
+                <w:sz w:val="16"/>
+                <w:szCs w:val="16"/>
+              </w:rPr>
+            </w:pPr>
+            <w:r>
+              <w:rPr>
+                <w:rFonts w:eastAsia="arial" w:ascii="arial" w:hAnsi="arial"/>
+                <w:b/>
+                <w:color w:val="000000"/>
+                <w:sz w:val="16"/>
+                <w:szCs w:val="16"/>
+              </w:rPr>
+              <w:t>Pause</w:t>
+            </w:r>
+          </w:p>
+        </w:tc>
+        <w:tc>
+          <w:tcPr>
+            <w:tcW w:w="1019" w:type="dxa"/>
+            <w:tcBorders>
+              <w:top w:val="single" w:sz="4" w:space="0" w:color="000000"/>
+              <w:left w:val="single" w:sz="4" w:space="0" w:color="000000"/>
+              <w:bottom w:val="single" w:sz="4" w:space="0" w:color="000000"/>
+            </w:tcBorders>
+            <w:vAlign w:val="bottom"/>
+          </w:tcPr>
+          <w:p>
+            <w:pPr>
+              <w:pStyle w:val="Normal"/>
+              <w:widowControl w:val="false"/>
+              <w:spacing w:lineRule="auto" w:line="180"/>
+              <w:jc w:val="center"/>
+              <w:rPr>
+                <w:color w:val="000000"/>
+                <w:sz w:val="16"/>
+                <w:szCs w:val="16"/>
+              </w:rPr>
+            </w:pPr>
+            <w:r>
+              <w:rPr>
+                <w:color w:val="000000"/>
+                <w:sz w:val="16"/>
+                <w:szCs w:val="16"/>
+              </w:rPr>
+              <w:t>Reverser Handle</w:t>
+            </w:r>
+          </w:p>
+        </w:tc>
+        <w:tc>
+          <w:tcPr>
+            <w:tcW w:w="1014" w:type="dxa"/>
+            <w:tcBorders>
+              <w:top w:val="single" w:sz="4" w:space="0" w:color="000000"/>
+              <w:left w:val="single" w:sz="4" w:space="0" w:color="000000"/>
+              <w:bottom w:val="single" w:sz="4" w:space="0" w:color="000000"/>
+            </w:tcBorders>
+            <w:vAlign w:val="bottom"/>
+          </w:tcPr>
+          <w:p>
+            <w:pPr>
+              <w:pStyle w:val="Normal"/>
+              <w:widowControl w:val="false"/>
+              <w:jc w:val="center"/>
+              <w:rPr>
+                <w:rFonts w:ascii="arial" w:hAnsi="arial" w:eastAsia="arial"/>
+                <w:color w:val="000000"/>
+                <w:sz w:val="16"/>
+                <w:szCs w:val="16"/>
+              </w:rPr>
+            </w:pPr>
+            <w:r>
+              <w:rPr>
+                <w:rFonts w:eastAsia="arial" w:ascii="arial" w:hAnsi="arial"/>
+                <w:color w:val="000000"/>
+                <w:sz w:val="16"/>
+                <w:szCs w:val="16"/>
+              </w:rPr>
+              <w:t>Engine Start</w:t>
+            </w:r>
+          </w:p>
+        </w:tc>
+        <w:tc>
+          <w:tcPr>
+            <w:tcW w:w="1016" w:type="dxa"/>
+            <w:tcBorders>
+              <w:top w:val="single" w:sz="4" w:space="0" w:color="000000"/>
+              <w:left w:val="single" w:sz="4" w:space="0" w:color="000000"/>
+              <w:bottom w:val="single" w:sz="4" w:space="0" w:color="000000"/>
+            </w:tcBorders>
+            <w:vAlign w:val="bottom"/>
+          </w:tcPr>
+          <w:p>
+            <w:pPr>
+              <w:pStyle w:val="Normal"/>
+              <w:widowControl w:val="false"/>
+              <w:spacing w:lineRule="auto" w:line="180"/>
+              <w:jc w:val="center"/>
+              <w:rPr>
+                <w:color w:val="000000"/>
+                <w:sz w:val="16"/>
+                <w:szCs w:val="16"/>
+              </w:rPr>
+            </w:pPr>
+            <w:r>
+              <w:rPr>
+                <w:color w:val="000000"/>
+                <w:sz w:val="16"/>
+                <w:szCs w:val="16"/>
+              </w:rPr>
+              <w:t>Engine Run</w:t>
+            </w:r>
+          </w:p>
+        </w:tc>
+        <w:tc>
+          <w:tcPr>
+            <w:tcW w:w="1020" w:type="dxa"/>
+            <w:tcBorders>
+              <w:top w:val="single" w:sz="4" w:space="0" w:color="000000"/>
+              <w:left w:val="single" w:sz="4" w:space="0" w:color="000000"/>
+              <w:bottom w:val="single" w:sz="4" w:space="0" w:color="000000"/>
+            </w:tcBorders>
+            <w:vAlign w:val="bottom"/>
+          </w:tcPr>
+          <w:p>
+            <w:pPr>
+              <w:pStyle w:val="Normal"/>
+              <w:widowControl w:val="false"/>
+              <w:spacing w:lineRule="auto" w:line="180"/>
+              <w:jc w:val="center"/>
+              <w:rPr>
+                <w:color w:val="000000"/>
+                <w:sz w:val="16"/>
+                <w:szCs w:val="16"/>
+              </w:rPr>
+            </w:pPr>
+            <w:r>
+              <w:rPr>
+                <w:color w:val="000000"/>
+                <w:sz w:val="16"/>
+                <w:szCs w:val="16"/>
+              </w:rPr>
+              <w:t>Generator Field</w:t>
+            </w:r>
+          </w:p>
+        </w:tc>
+        <w:tc>
+          <w:tcPr>
+            <w:tcW w:w="1016" w:type="dxa"/>
+            <w:tcBorders>
+              <w:top w:val="single" w:sz="4" w:space="0" w:color="000000"/>
+              <w:left w:val="single" w:sz="4" w:space="0" w:color="000000"/>
+              <w:bottom w:val="single" w:sz="4" w:space="0" w:color="000000"/>
+            </w:tcBorders>
+            <w:vAlign w:val="bottom"/>
+          </w:tcPr>
+          <w:p>
+            <w:pPr>
+              <w:pStyle w:val="Normal"/>
+              <w:widowControl w:val="false"/>
+              <w:jc w:val="center"/>
+              <w:rPr>
+                <w:color w:val="000000"/>
+                <w:sz w:val="16"/>
+                <w:szCs w:val="16"/>
+              </w:rPr>
+            </w:pPr>
+            <w:r>
+              <w:rPr>
+                <w:color w:val="000000"/>
+                <w:sz w:val="16"/>
+                <w:szCs w:val="16"/>
+              </w:rPr>
+              <w:t>Brake</w:t>
+            </w:r>
+          </w:p>
+          <w:p>
+            <w:pPr>
+              <w:pStyle w:val="Normal"/>
+              <w:widowControl w:val="false"/>
+              <w:jc w:val="center"/>
+              <w:rPr>
+                <w:color w:val="000000"/>
+                <w:sz w:val="16"/>
+                <w:szCs w:val="16"/>
+              </w:rPr>
+            </w:pPr>
+            <w:r>
+              <w:rPr>
+                <w:color w:val="000000"/>
+                <w:sz w:val="16"/>
+                <w:szCs w:val="16"/>
+              </w:rPr>
+              <w:t>Cutoff</w:t>
+            </w:r>
+          </w:p>
+        </w:tc>
+        <w:tc>
+          <w:tcPr>
+            <w:tcW w:w="1016" w:type="dxa"/>
+            <w:tcBorders>
+              <w:top w:val="single" w:sz="4" w:space="0" w:color="000000"/>
+              <w:left w:val="single" w:sz="4" w:space="0" w:color="000000"/>
+              <w:bottom w:val="single" w:sz="4" w:space="0" w:color="000000"/>
+            </w:tcBorders>
+            <w:vAlign w:val="bottom"/>
+          </w:tcPr>
+          <w:p>
+            <w:pPr>
+              <w:pStyle w:val="Normal"/>
+              <w:widowControl w:val="false"/>
+              <w:jc w:val="center"/>
+              <w:rPr>
+                <w:color w:val="000000"/>
+                <w:sz w:val="16"/>
+                <w:szCs w:val="16"/>
+              </w:rPr>
+            </w:pPr>
+            <w:r>
+              <w:rPr>
+                <w:color w:val="000000"/>
+                <w:sz w:val="16"/>
+                <w:szCs w:val="16"/>
+              </w:rPr>
+              <w:t>MU-2A Lead</w:t>
+            </w:r>
+          </w:p>
+        </w:tc>
+        <w:tc>
+          <w:tcPr>
+            <w:tcW w:w="1017" w:type="dxa"/>
+            <w:tcBorders>
+              <w:top w:val="single" w:sz="4" w:space="0" w:color="000000"/>
+              <w:left w:val="single" w:sz="4" w:space="0" w:color="000000"/>
+              <w:bottom w:val="single" w:sz="4" w:space="0" w:color="000000"/>
+            </w:tcBorders>
+            <w:vAlign w:val="bottom"/>
+          </w:tcPr>
+          <w:p>
+            <w:pPr>
+              <w:pStyle w:val="Normal"/>
+              <w:widowControl w:val="false"/>
+              <w:jc w:val="center"/>
+              <w:rPr>
+                <w:color w:val="000000"/>
+                <w:sz w:val="16"/>
+                <w:szCs w:val="16"/>
+              </w:rPr>
+            </w:pPr>
+            <w:r>
+              <w:rPr>
+                <w:rFonts w:eastAsia="arial" w:ascii="arial" w:hAnsi="arial"/>
+                <w:color w:val="000000"/>
+                <w:sz w:val="16"/>
+                <w:szCs w:val="16"/>
+              </w:rPr>
+              <w:t>Isolation Run</w:t>
+            </w:r>
+          </w:p>
+        </w:tc>
+        <w:tc>
+          <w:tcPr>
+            <w:tcW w:w="1016" w:type="dxa"/>
+            <w:tcBorders>
+              <w:top w:val="single" w:sz="4" w:space="0" w:color="000000"/>
+              <w:left w:val="single" w:sz="4" w:space="0" w:color="000000"/>
+              <w:bottom w:val="single" w:sz="4" w:space="0" w:color="000000"/>
+            </w:tcBorders>
+            <w:vAlign w:val="bottom"/>
+          </w:tcPr>
+          <w:p>
+            <w:pPr>
+              <w:pStyle w:val="Normal"/>
+              <w:widowControl w:val="false"/>
+              <w:jc w:val="center"/>
+              <w:rPr>
+                <w:sz w:val="16"/>
+                <w:szCs w:val="16"/>
+              </w:rPr>
+            </w:pPr>
+            <w:r>
+              <w:rPr>
+                <w:sz w:val="16"/>
+                <w:szCs w:val="16"/>
+              </w:rPr>
+              <w:t>Rear HL Up</w:t>
+            </w:r>
+          </w:p>
+        </w:tc>
+        <w:tc>
+          <w:tcPr>
+            <w:tcW w:w="1020" w:type="dxa"/>
+            <w:tcBorders>
+              <w:top w:val="single" w:sz="4" w:space="0" w:color="000000"/>
+              <w:left w:val="single" w:sz="4" w:space="0" w:color="000000"/>
+              <w:bottom w:val="single" w:sz="4" w:space="0" w:color="000000"/>
+            </w:tcBorders>
+            <w:vAlign w:val="bottom"/>
+          </w:tcPr>
+          <w:p>
+            <w:pPr>
+              <w:pStyle w:val="Normal"/>
+              <w:widowControl w:val="false"/>
+              <w:jc w:val="center"/>
+              <w:rPr>
+                <w:color w:val="000000"/>
+                <w:sz w:val="16"/>
+                <w:szCs w:val="16"/>
+              </w:rPr>
+            </w:pPr>
+            <w:r>
+              <w:rPr>
+                <w:rFonts w:eastAsia="arial" w:ascii="arial" w:hAnsi="arial"/>
+                <w:color w:val="000000"/>
+                <w:sz w:val="16"/>
+                <w:szCs w:val="16"/>
+              </w:rPr>
+              <w:t>HEP On</w:t>
+            </w:r>
+          </w:p>
+        </w:tc>
+        <w:tc>
+          <w:tcPr>
+            <w:tcW w:w="1016" w:type="dxa"/>
+            <w:tcBorders>
+              <w:top w:val="single" w:sz="4" w:space="0" w:color="000000"/>
+              <w:left w:val="single" w:sz="4" w:space="0" w:color="000000"/>
+              <w:bottom w:val="single" w:sz="4" w:space="0" w:color="000000"/>
+            </w:tcBorders>
+            <w:vAlign w:val="bottom"/>
+          </w:tcPr>
+          <w:p>
+            <w:pPr>
+              <w:pStyle w:val="Normal"/>
+              <w:widowControl w:val="false"/>
+              <w:spacing w:lineRule="auto" w:line="180"/>
+              <w:jc w:val="center"/>
+              <w:rPr>
+                <w:sz w:val="16"/>
+                <w:szCs w:val="16"/>
+              </w:rPr>
+            </w:pPr>
+            <w:r>
+              <w:rPr>
+                <w:rFonts w:eastAsia="arial" w:ascii="arial" w:hAnsi="arial"/>
+                <w:color w:val="000000"/>
+                <w:sz w:val="16"/>
+                <w:szCs w:val="16"/>
+              </w:rPr>
+              <w:t>Gauge Light</w:t>
+            </w:r>
+          </w:p>
+        </w:tc>
+        <w:tc>
+          <w:tcPr>
+            <w:tcW w:w="1016" w:type="dxa"/>
+            <w:tcBorders>
+              <w:top w:val="single" w:sz="4" w:space="0" w:color="000000"/>
+              <w:left w:val="single" w:sz="4" w:space="0" w:color="000000"/>
+              <w:bottom w:val="single" w:sz="4" w:space="0" w:color="000000"/>
+            </w:tcBorders>
+            <w:vAlign w:val="bottom"/>
+          </w:tcPr>
+          <w:p>
+            <w:pPr>
+              <w:pStyle w:val="Normal"/>
+              <w:widowControl w:val="false"/>
+              <w:spacing w:lineRule="auto" w:line="180"/>
+              <w:jc w:val="center"/>
+              <w:rPr>
+                <w:sz w:val="16"/>
+                <w:szCs w:val="16"/>
+              </w:rPr>
+            </w:pPr>
+            <w:r>
+              <w:rPr>
+                <w:sz w:val="16"/>
+                <w:szCs w:val="16"/>
+              </w:rPr>
+              <w:t>Cab Light</w:t>
+            </w:r>
+          </w:p>
+        </w:tc>
+        <w:tc>
+          <w:tcPr>
+            <w:tcW w:w="1016" w:type="dxa"/>
+            <w:tcBorders>
+              <w:top w:val="single" w:sz="4" w:space="0" w:color="000000"/>
+              <w:left w:val="single" w:sz="4" w:space="0" w:color="000000"/>
+              <w:bottom w:val="single" w:sz="4" w:space="0" w:color="000000"/>
+            </w:tcBorders>
+            <w:vAlign w:val="bottom"/>
+          </w:tcPr>
+          <w:p>
+            <w:pPr>
+              <w:pStyle w:val="Normal"/>
+              <w:widowControl w:val="false"/>
+              <w:spacing w:lineRule="auto" w:line="180"/>
+              <w:jc w:val="center"/>
+              <w:rPr>
+                <w:sz w:val="16"/>
+                <w:szCs w:val="16"/>
+              </w:rPr>
+            </w:pPr>
+            <w:r>
+              <w:rPr>
+                <w:rFonts w:eastAsia="arial" w:ascii="arial" w:hAnsi="arial"/>
+                <w:color w:val="000000"/>
+                <w:sz w:val="16"/>
+                <w:szCs w:val="16"/>
+              </w:rPr>
+              <w:t>1-Person</w:t>
+            </w:r>
+          </w:p>
+        </w:tc>
+        <w:tc>
+          <w:tcPr>
+            <w:tcW w:w="1029" w:type="dxa"/>
+            <w:tcBorders>
+              <w:top w:val="single" w:sz="4" w:space="0" w:color="000000"/>
+              <w:left w:val="single" w:sz="4" w:space="0" w:color="000000"/>
+              <w:bottom w:val="single" w:sz="4" w:space="0" w:color="000000"/>
+              <w:right w:val="single" w:sz="4" w:space="0" w:color="000000"/>
+            </w:tcBorders>
+            <w:vAlign w:val="bottom"/>
+          </w:tcPr>
+          <w:p>
+            <w:pPr>
+              <w:pStyle w:val="Normal"/>
+              <w:widowControl w:val="false"/>
+              <w:spacing w:lineRule="auto" w:line="180"/>
+              <w:jc w:val="center"/>
+              <w:rPr>
+                <w:sz w:val="16"/>
+                <w:szCs w:val="16"/>
+              </w:rPr>
+            </w:pPr>
+            <w:r>
+              <w:rPr>
+                <w:rFonts w:eastAsia="arial" w:ascii="arial" w:hAnsi="arial"/>
+                <w:color w:val="000000"/>
+                <w:sz w:val="16"/>
+                <w:szCs w:val="16"/>
+              </w:rPr>
+              <w:t>Next</w:t>
+            </w:r>
+          </w:p>
+          <w:p>
+            <w:pPr>
+              <w:pStyle w:val="Normal"/>
+              <w:widowControl w:val="false"/>
+              <w:spacing w:lineRule="auto" w:line="180"/>
+              <w:jc w:val="center"/>
+              <w:rPr>
+                <w:sz w:val="16"/>
+                <w:szCs w:val="16"/>
+              </w:rPr>
+            </w:pPr>
+            <w:r>
+              <w:rPr>
+                <w:rFonts w:eastAsia="arial" w:ascii="arial" w:hAnsi="arial"/>
+                <w:color w:val="000000"/>
+                <w:sz w:val="16"/>
+                <w:szCs w:val="16"/>
+              </w:rPr>
+              <w:t>Cab Cam</w:t>
+            </w:r>
+          </w:p>
+        </w:tc>
+      </w:tr>
+    </w:tbl>
+    <w:p>
+      <w:pPr>
+        <w:pStyle w:val="Normal"/>
+        <w:rPr>
+          <w:rFonts w:ascii="arial" w:hAnsi="arial" w:eastAsia="arial"/>
+          <w:color w:val="000000"/>
+          <w:sz w:val="16"/>
+          <w:szCs w:val="16"/>
+        </w:rPr>
+      </w:pPr>
+      <w:r>
+        <w:rPr>
+          <w:rFonts w:eastAsia="arial" w:ascii="arial" w:hAnsi="arial"/>
+          <w:color w:val="000000"/>
+          <w:sz w:val="16"/>
+          <w:szCs w:val="16"/>
+        </w:rPr>
+      </w:r>
+    </w:p>
+    <w:p>
+      <w:pPr>
+        <w:pStyle w:val="Normal"/>
+        <w:rPr>
+          <w:color w:val="000000"/>
+          <w:sz w:val="16"/>
+          <w:szCs w:val="16"/>
+        </w:rPr>
+      </w:pPr>
+      <w:r>
+        <w:rPr>
+          <w:rFonts w:eastAsia="arial" w:ascii="arial" w:hAnsi="arial"/>
+          <w:color w:val="000000"/>
+          <w:sz w:val="16"/>
+          <w:szCs w:val="16"/>
+        </w:rPr>
+        <w:tab/>
+        <w:t xml:space="preserve">           F40PH-2CAT-2</w:t>
+      </w:r>
+    </w:p>
+    <w:tbl>
+      <w:tblPr>
+        <w:tblW w:w="14248" w:type="dxa"/>
+        <w:jc w:val="left"/>
+        <w:tblInd w:w="-5" w:type="dxa"/>
+        <w:tblLayout w:type="fixed"/>
+        <w:tblCellMar>
+          <w:top w:w="0" w:type="dxa"/>
+          <w:left w:w="108" w:type="dxa"/>
+          <w:bottom w:w="0" w:type="dxa"/>
+          <w:right w:w="108" w:type="dxa"/>
+        </w:tblCellMar>
+        <w:tblLook w:firstRow="1" w:noVBand="1" w:lastRow="0" w:firstColumn="1" w:lastColumn="0" w:noHBand="0" w:val="04a0"/>
+      </w:tblPr>
+      <w:tblGrid>
+        <w:gridCol w:w="1017"/>
+        <w:gridCol w:w="1019"/>
+        <w:gridCol w:w="1014"/>
+        <w:gridCol w:w="1016"/>
+        <w:gridCol w:w="1020"/>
+        <w:gridCol w:w="1016"/>
+        <w:gridCol w:w="1016"/>
+        <w:gridCol w:w="1017"/>
+        <w:gridCol w:w="1016"/>
+        <w:gridCol w:w="1020"/>
+        <w:gridCol w:w="1016"/>
+        <w:gridCol w:w="1016"/>
+        <w:gridCol w:w="1016"/>
+        <w:gridCol w:w="1029"/>
+      </w:tblGrid>
+      <w:tr>
+        <w:trPr>
+          <w:trHeight w:val="440" w:hRule="exact"/>
+          <w:cantSplit w:val="true"/>
+        </w:trPr>
+        <w:tc>
+          <w:tcPr>
+            <w:tcW w:w="1017" w:type="dxa"/>
+            <w:tcBorders>
+              <w:top w:val="single" w:sz="4" w:space="0" w:color="000000"/>
+              <w:left w:val="single" w:sz="4" w:space="0" w:color="000000"/>
+              <w:bottom w:val="single" w:sz="4" w:space="0" w:color="000000"/>
+            </w:tcBorders>
+            <w:vAlign w:val="bottom"/>
+          </w:tcPr>
+          <w:p>
+            <w:pPr>
+              <w:pStyle w:val="Normal"/>
+              <w:widowControl w:val="false"/>
+              <w:spacing w:lineRule="auto" w:line="180" w:before="0" w:after="60"/>
+              <w:jc w:val="center"/>
+              <w:rPr>
+                <w:b/>
+                <w:bCs/>
+              </w:rPr>
+            </w:pPr>
+            <w:r>
+              <w:rPr>
+                <w:b/>
+                <w:bCs/>
+                <w:color w:val="000000"/>
+                <w:sz w:val="16"/>
+                <w:szCs w:val="16"/>
+              </w:rPr>
+              <w:t>HUD</w:t>
+            </w:r>
+          </w:p>
+        </w:tc>
+        <w:tc>
+          <w:tcPr>
+            <w:tcW w:w="1019" w:type="dxa"/>
+            <w:tcBorders>
+              <w:top w:val="single" w:sz="4" w:space="0" w:color="000000"/>
+              <w:left w:val="single" w:sz="4" w:space="0" w:color="000000"/>
+              <w:bottom w:val="single" w:sz="4" w:space="0" w:color="000000"/>
+            </w:tcBorders>
+            <w:vAlign w:val="bottom"/>
+          </w:tcPr>
+          <w:p>
+            <w:pPr>
+              <w:pStyle w:val="Normal"/>
+              <w:widowControl w:val="false"/>
+              <w:spacing w:lineRule="auto" w:line="180"/>
+              <w:jc w:val="center"/>
+              <w:rPr>
+                <w:color w:val="000000"/>
+                <w:sz w:val="16"/>
+                <w:szCs w:val="16"/>
+              </w:rPr>
+            </w:pPr>
+            <w:r>
+              <w:rPr>
+                <w:color w:val="000000"/>
+                <w:sz w:val="16"/>
+                <w:szCs w:val="16"/>
+              </w:rPr>
+              <w:t>Schedule</w:t>
+            </w:r>
+          </w:p>
+        </w:tc>
+        <w:tc>
+          <w:tcPr>
+            <w:tcW w:w="1014" w:type="dxa"/>
+            <w:tcBorders>
+              <w:top w:val="single" w:sz="4" w:space="0" w:color="000000"/>
+              <w:left w:val="single" w:sz="4" w:space="0" w:color="000000"/>
+              <w:bottom w:val="single" w:sz="4" w:space="0" w:color="000000"/>
+            </w:tcBorders>
+            <w:vAlign w:val="bottom"/>
+          </w:tcPr>
+          <w:p>
+            <w:pPr>
+              <w:pStyle w:val="Normal"/>
+              <w:widowControl w:val="false"/>
+              <w:spacing w:lineRule="auto" w:line="180"/>
+              <w:jc w:val="center"/>
+              <w:rPr>
+                <w:color w:val="000000"/>
+                <w:sz w:val="16"/>
+                <w:szCs w:val="16"/>
+              </w:rPr>
+            </w:pPr>
+            <w:r>
+              <w:rPr>
+                <w:rFonts w:eastAsia="arial" w:ascii="arial" w:hAnsi="arial"/>
+                <w:color w:val="000000"/>
+                <w:sz w:val="16"/>
+                <w:szCs w:val="16"/>
+              </w:rPr>
+              <w:t>Engine Stop</w:t>
+            </w:r>
+          </w:p>
+        </w:tc>
+        <w:tc>
+          <w:tcPr>
+            <w:tcW w:w="1016" w:type="dxa"/>
+            <w:tcBorders>
+              <w:top w:val="single" w:sz="4" w:space="0" w:color="000000"/>
+              <w:left w:val="single" w:sz="4" w:space="0" w:color="000000"/>
+              <w:bottom w:val="single" w:sz="4" w:space="0" w:color="000000"/>
+            </w:tcBorders>
+            <w:vAlign w:val="bottom"/>
+          </w:tcPr>
+          <w:p>
+            <w:pPr>
+              <w:pStyle w:val="Normal"/>
+              <w:widowControl w:val="false"/>
+              <w:spacing w:lineRule="auto" w:line="180"/>
+              <w:jc w:val="center"/>
+              <w:rPr>
+                <w:color w:val="000000"/>
+                <w:sz w:val="16"/>
+                <w:szCs w:val="16"/>
+              </w:rPr>
+            </w:pPr>
+            <w:r>
+              <w:rPr>
+                <w:color w:val="000000"/>
+                <w:sz w:val="16"/>
+                <w:szCs w:val="16"/>
+              </w:rPr>
+              <w:t>Alerter</w:t>
+            </w:r>
+          </w:p>
+        </w:tc>
+        <w:tc>
+          <w:tcPr>
+            <w:tcW w:w="1020" w:type="dxa"/>
+            <w:tcBorders>
+              <w:top w:val="single" w:sz="4" w:space="0" w:color="000000"/>
+              <w:left w:val="single" w:sz="4" w:space="0" w:color="000000"/>
+              <w:bottom w:val="single" w:sz="4" w:space="0" w:color="000000"/>
+            </w:tcBorders>
+            <w:vAlign w:val="bottom"/>
+          </w:tcPr>
+          <w:p>
+            <w:pPr>
+              <w:pStyle w:val="Normal"/>
+              <w:widowControl w:val="false"/>
+              <w:spacing w:lineRule="auto" w:line="180"/>
+              <w:jc w:val="center"/>
+              <w:rPr>
+                <w:color w:val="000000"/>
+                <w:sz w:val="16"/>
+                <w:szCs w:val="16"/>
+              </w:rPr>
+            </w:pPr>
+            <w:r>
+              <w:rPr>
+                <w:color w:val="000000"/>
+                <w:sz w:val="16"/>
+                <w:szCs w:val="16"/>
+              </w:rPr>
+              <w:t>Control &amp; Fuel Pump</w:t>
+            </w:r>
+          </w:p>
+        </w:tc>
+        <w:tc>
+          <w:tcPr>
+            <w:tcW w:w="1016" w:type="dxa"/>
+            <w:tcBorders>
+              <w:top w:val="single" w:sz="4" w:space="0" w:color="000000"/>
+              <w:left w:val="single" w:sz="4" w:space="0" w:color="000000"/>
+              <w:bottom w:val="single" w:sz="4" w:space="0" w:color="000000"/>
+            </w:tcBorders>
+            <w:vAlign w:val="bottom"/>
+          </w:tcPr>
+          <w:p>
+            <w:pPr>
+              <w:pStyle w:val="Normal"/>
+              <w:widowControl w:val="false"/>
+              <w:jc w:val="center"/>
+              <w:rPr>
+                <w:color w:val="000000"/>
+                <w:sz w:val="16"/>
+                <w:szCs w:val="16"/>
+              </w:rPr>
+            </w:pPr>
+            <w:r>
+              <w:rPr>
+                <w:color w:val="000000"/>
+                <w:sz w:val="16"/>
+                <w:szCs w:val="16"/>
+              </w:rPr>
+              <w:t>Marker Light</w:t>
+            </w:r>
+          </w:p>
+        </w:tc>
+        <w:tc>
+          <w:tcPr>
+            <w:tcW w:w="1016" w:type="dxa"/>
+            <w:tcBorders>
+              <w:top w:val="single" w:sz="4" w:space="0" w:color="000000"/>
+              <w:left w:val="single" w:sz="4" w:space="0" w:color="000000"/>
+              <w:bottom w:val="single" w:sz="4" w:space="0" w:color="000000"/>
+            </w:tcBorders>
+            <w:vAlign w:val="bottom"/>
+          </w:tcPr>
+          <w:p>
+            <w:pPr>
+              <w:pStyle w:val="Normal"/>
+              <w:widowControl w:val="false"/>
+              <w:jc w:val="center"/>
+              <w:rPr>
+                <w:color w:val="000000"/>
+                <w:sz w:val="16"/>
+                <w:szCs w:val="16"/>
+              </w:rPr>
+            </w:pPr>
+            <w:r>
+              <w:rPr>
+                <w:rFonts w:eastAsia="arial" w:ascii="arial" w:hAnsi="arial"/>
+                <w:color w:val="000000"/>
+                <w:sz w:val="16"/>
+                <w:szCs w:val="16"/>
+              </w:rPr>
+              <w:t>MU-2A Trail</w:t>
+            </w:r>
+          </w:p>
+        </w:tc>
+        <w:tc>
+          <w:tcPr>
+            <w:tcW w:w="1017" w:type="dxa"/>
+            <w:tcBorders>
+              <w:top w:val="single" w:sz="4" w:space="0" w:color="000000"/>
+              <w:left w:val="single" w:sz="4" w:space="0" w:color="000000"/>
+              <w:bottom w:val="single" w:sz="4" w:space="0" w:color="000000"/>
+            </w:tcBorders>
+            <w:vAlign w:val="bottom"/>
+          </w:tcPr>
+          <w:p>
+            <w:pPr>
+              <w:pStyle w:val="Normal"/>
+              <w:widowControl w:val="false"/>
+              <w:jc w:val="center"/>
+              <w:rPr>
+                <w:color w:val="000000"/>
+                <w:sz w:val="16"/>
+                <w:szCs w:val="16"/>
+              </w:rPr>
+            </w:pPr>
+            <w:r>
+              <w:rPr>
+                <w:rFonts w:eastAsia="arial" w:ascii="arial" w:hAnsi="arial"/>
+                <w:color w:val="000000"/>
+                <w:sz w:val="16"/>
+                <w:szCs w:val="16"/>
+              </w:rPr>
+              <w:t>Isolation Start Iso.</w:t>
+            </w:r>
+          </w:p>
+        </w:tc>
+        <w:tc>
+          <w:tcPr>
+            <w:tcW w:w="1016" w:type="dxa"/>
+            <w:tcBorders>
+              <w:top w:val="single" w:sz="4" w:space="0" w:color="000000"/>
+              <w:left w:val="single" w:sz="4" w:space="0" w:color="000000"/>
+              <w:bottom w:val="single" w:sz="4" w:space="0" w:color="000000"/>
+            </w:tcBorders>
+            <w:vAlign w:val="bottom"/>
+          </w:tcPr>
+          <w:p>
+            <w:pPr>
+              <w:pStyle w:val="Normal"/>
+              <w:widowControl w:val="false"/>
+              <w:jc w:val="center"/>
+              <w:rPr>
+                <w:sz w:val="16"/>
+                <w:szCs w:val="16"/>
+              </w:rPr>
+            </w:pPr>
+            <w:r>
+              <w:rPr>
+                <w:rFonts w:eastAsia="arial" w:ascii="arial" w:hAnsi="arial"/>
+                <w:color w:val="000000"/>
+                <w:sz w:val="16"/>
+                <w:szCs w:val="16"/>
+              </w:rPr>
+              <w:t>Rear HL Down</w:t>
+            </w:r>
+          </w:p>
+        </w:tc>
+        <w:tc>
+          <w:tcPr>
+            <w:tcW w:w="1020" w:type="dxa"/>
+            <w:tcBorders>
+              <w:top w:val="single" w:sz="4" w:space="0" w:color="000000"/>
+              <w:left w:val="single" w:sz="4" w:space="0" w:color="000000"/>
+              <w:bottom w:val="single" w:sz="4" w:space="0" w:color="000000"/>
+            </w:tcBorders>
+            <w:vAlign w:val="bottom"/>
+          </w:tcPr>
+          <w:p>
+            <w:pPr>
+              <w:pStyle w:val="Normal"/>
+              <w:widowControl w:val="false"/>
+              <w:jc w:val="center"/>
+              <w:rPr>
+                <w:color w:val="000000"/>
+                <w:sz w:val="16"/>
+                <w:szCs w:val="16"/>
+              </w:rPr>
+            </w:pPr>
+            <w:r>
+              <w:rPr>
+                <w:rFonts w:eastAsia="arial" w:ascii="arial" w:hAnsi="arial"/>
+                <w:color w:val="000000"/>
+                <w:sz w:val="16"/>
+                <w:szCs w:val="16"/>
+              </w:rPr>
+              <w:t>HEP Off</w:t>
+            </w:r>
+          </w:p>
+        </w:tc>
+        <w:tc>
+          <w:tcPr>
+            <w:tcW w:w="1016" w:type="dxa"/>
+            <w:tcBorders>
+              <w:top w:val="single" w:sz="4" w:space="0" w:color="000000"/>
+              <w:left w:val="single" w:sz="4" w:space="0" w:color="000000"/>
+              <w:bottom w:val="single" w:sz="4" w:space="0" w:color="000000"/>
+            </w:tcBorders>
+            <w:vAlign w:val="bottom"/>
+          </w:tcPr>
+          <w:p>
+            <w:pPr>
+              <w:pStyle w:val="Normal"/>
+              <w:widowControl w:val="false"/>
+              <w:spacing w:lineRule="auto" w:line="180"/>
+              <w:jc w:val="center"/>
+              <w:rPr>
+                <w:sz w:val="16"/>
+                <w:szCs w:val="16"/>
+              </w:rPr>
+            </w:pPr>
+            <w:r>
+              <w:rPr>
+                <w:rFonts w:eastAsia="arial" w:ascii="arial" w:hAnsi="arial"/>
+                <w:color w:val="000000"/>
+                <w:sz w:val="16"/>
+                <w:szCs w:val="16"/>
+              </w:rPr>
+              <w:t>Ditchlight Pulse</w:t>
+            </w:r>
+          </w:p>
+        </w:tc>
+        <w:tc>
+          <w:tcPr>
+            <w:tcW w:w="1016" w:type="dxa"/>
+            <w:tcBorders>
+              <w:top w:val="single" w:sz="4" w:space="0" w:color="000000"/>
+              <w:left w:val="single" w:sz="4" w:space="0" w:color="000000"/>
+              <w:bottom w:val="single" w:sz="4" w:space="0" w:color="000000"/>
+            </w:tcBorders>
+            <w:vAlign w:val="bottom"/>
+          </w:tcPr>
+          <w:p>
+            <w:pPr>
+              <w:pStyle w:val="Normal"/>
+              <w:widowControl w:val="false"/>
+              <w:spacing w:lineRule="auto" w:line="180"/>
+              <w:jc w:val="center"/>
+              <w:rPr>
+                <w:sz w:val="16"/>
+                <w:szCs w:val="16"/>
+              </w:rPr>
+            </w:pPr>
+            <w:r>
+              <w:rPr>
+                <w:sz w:val="16"/>
+                <w:szCs w:val="16"/>
+              </w:rPr>
+              <w:t>Step Light</w:t>
+            </w:r>
+          </w:p>
+        </w:tc>
+        <w:tc>
+          <w:tcPr>
+            <w:tcW w:w="1016" w:type="dxa"/>
+            <w:tcBorders>
+              <w:top w:val="single" w:sz="4" w:space="0" w:color="000000"/>
+              <w:left w:val="single" w:sz="4" w:space="0" w:color="000000"/>
+              <w:bottom w:val="single" w:sz="4" w:space="0" w:color="000000"/>
+            </w:tcBorders>
+            <w:vAlign w:val="bottom"/>
+          </w:tcPr>
+          <w:p>
+            <w:pPr>
+              <w:pStyle w:val="Normal"/>
+              <w:widowControl w:val="false"/>
+              <w:spacing w:lineRule="auto" w:line="180"/>
+              <w:jc w:val="center"/>
+              <w:rPr>
+                <w:sz w:val="16"/>
+                <w:szCs w:val="16"/>
+              </w:rPr>
+            </w:pPr>
+            <w:r>
+              <w:rPr>
+                <w:rFonts w:eastAsia="arial" w:ascii="arial" w:hAnsi="arial"/>
+                <w:color w:val="000000"/>
+                <w:sz w:val="16"/>
+                <w:szCs w:val="16"/>
+              </w:rPr>
+              <w:t>Exterior</w:t>
+            </w:r>
+          </w:p>
+          <w:p>
+            <w:pPr>
+              <w:pStyle w:val="Normal"/>
+              <w:widowControl w:val="false"/>
+              <w:spacing w:lineRule="auto" w:line="180"/>
+              <w:jc w:val="center"/>
+              <w:rPr>
+                <w:sz w:val="16"/>
+                <w:szCs w:val="16"/>
+              </w:rPr>
+            </w:pPr>
+            <w:r>
+              <w:rPr>
+                <w:rFonts w:eastAsia="arial" w:ascii="arial" w:hAnsi="arial"/>
+                <w:color w:val="000000"/>
+                <w:sz w:val="16"/>
+                <w:szCs w:val="16"/>
+              </w:rPr>
+              <w:t>Camera</w:t>
+            </w:r>
+          </w:p>
+        </w:tc>
+        <w:tc>
+          <w:tcPr>
+            <w:tcW w:w="1029" w:type="dxa"/>
+            <w:tcBorders>
+              <w:top w:val="single" w:sz="4" w:space="0" w:color="000000"/>
+              <w:left w:val="single" w:sz="4" w:space="0" w:color="000000"/>
+              <w:bottom w:val="single" w:sz="4" w:space="0" w:color="000000"/>
+              <w:right w:val="single" w:sz="4" w:space="0" w:color="000000"/>
+            </w:tcBorders>
+            <w:vAlign w:val="bottom"/>
+          </w:tcPr>
+          <w:p>
+            <w:pPr>
+              <w:pStyle w:val="Normal"/>
+              <w:widowControl w:val="false"/>
+              <w:spacing w:lineRule="auto" w:line="180"/>
+              <w:jc w:val="center"/>
+              <w:rPr>
+                <w:sz w:val="16"/>
+                <w:szCs w:val="16"/>
+              </w:rPr>
+            </w:pPr>
+            <w:r>
+              <w:rPr>
+                <w:rFonts w:eastAsia="arial" w:ascii="arial" w:hAnsi="arial"/>
+                <w:color w:val="000000"/>
+                <w:sz w:val="16"/>
+                <w:szCs w:val="16"/>
+              </w:rPr>
+              <w:t>Prev</w:t>
+            </w:r>
+          </w:p>
+          <w:p>
+            <w:pPr>
+              <w:pStyle w:val="Normal"/>
+              <w:widowControl w:val="false"/>
+              <w:spacing w:lineRule="auto" w:line="180"/>
+              <w:jc w:val="center"/>
+              <w:rPr>
+                <w:sz w:val="16"/>
+                <w:szCs w:val="16"/>
+              </w:rPr>
+            </w:pPr>
+            <w:r>
+              <w:rPr>
+                <w:rFonts w:eastAsia="arial" w:ascii="arial" w:hAnsi="arial"/>
+                <w:color w:val="000000"/>
+                <w:sz w:val="16"/>
+                <w:szCs w:val="16"/>
+              </w:rPr>
+              <w:t>Cab Cam</w:t>
+            </w:r>
+          </w:p>
+        </w:tc>
+      </w:tr>
+    </w:tbl>
+    <w:p>
+      <w:pPr>
+        <w:pStyle w:val="Normal"/>
+        <w:rPr>
+          <w:color w:val="000000"/>
+          <w:sz w:val="16"/>
+          <w:szCs w:val="16"/>
+        </w:rPr>
+      </w:pPr>
+      <w:r>
+        <w:rPr>
+          <w:color w:val="000000"/>
+          <w:sz w:val="16"/>
+          <w:szCs w:val="16"/>
+        </w:rPr>
+      </w:r>
+    </w:p>
+    <w:p>
+      <w:pPr>
+        <w:pStyle w:val="Normal"/>
+        <w:rPr>
+          <w:color w:val="000000"/>
+          <w:sz w:val="16"/>
+          <w:szCs w:val="16"/>
+        </w:rPr>
+      </w:pPr>
+      <w:r>
+        <w:rPr>
+          <w:color w:val="000000"/>
+          <w:sz w:val="16"/>
+          <w:szCs w:val="16"/>
+        </w:rPr>
+        <w:tab/>
+        <w:t xml:space="preserve">       </w:t>
+      </w:r>
+      <w:r>
+        <w:rPr>
+          <w:rFonts w:eastAsia="arial" w:ascii="arial" w:hAnsi="arial"/>
+          <w:color w:val="000000"/>
+          <w:sz w:val="16"/>
+          <w:szCs w:val="16"/>
+        </w:rPr>
         <w:t xml:space="preserve">    </w:t>
       </w:r>
       <w:r>
@@ -14813,7 +17097,7 @@
           <w:sz w:val="16"/>
           <w:szCs w:val="16"/>
         </w:rPr>
-        <w:t>MP15DC</w:t>
+        <w:t>Gallery Cab Car</w:t>
       </w:r>
       <w:r>
         <w:rPr>
@@ -14949,13 +17233,7 @@
               </w:rPr>
             </w:pPr>
             <w:r>
-              <w:rPr>
-                <w:rFonts w:eastAsia="arial" w:ascii="arial" w:hAnsi="arial"/>
-                <w:color w:val="000000"/>
-                <w:sz w:val="16"/>
-                <w:szCs w:val="16"/>
-              </w:rPr>
-              <w:t>Radio</w:t>
+              <w:rPr/>
             </w:r>
           </w:p>
         </w:tc>
@@ -15070,38 +17348,41 @@
                 <w:sz w:val="16"/>
                 <w:szCs w:val="16"/>
               </w:rPr>
-              <w:t>Cut-In</w:t>
-            </w:r>
-          </w:p>
-        </w:tc>
-        <w:tc>
-          <w:tcPr>
-            <w:tcW w:w="1016" w:type="dxa"/>
-            <w:tcBorders>
-              <w:top w:val="single" w:sz="4" w:space="0" w:color="000000"/>
-              <w:left w:val="single" w:sz="4" w:space="0" w:color="000000"/>
-              <w:bottom w:val="single" w:sz="4" w:space="0" w:color="000000"/>
-            </w:tcBorders>
-            <w:vAlign w:val="bottom"/>
-          </w:tcPr>
-          <w:p>
-            <w:pPr>
-              <w:pStyle w:val="Normal"/>
-              <w:widowControl w:val="false"/>
-              <w:jc w:val="center"/>
-              <w:rPr>
-                <w:color w:val="000000"/>
-                <w:sz w:val="16"/>
-                <w:szCs w:val="16"/>
-              </w:rPr>
-            </w:pPr>
-            <w:r>
-              <w:rPr>
-                <w:color w:val="000000"/>
-                <w:sz w:val="16"/>
-                <w:szCs w:val="16"/>
-              </w:rPr>
-              <w:t>MU-2A Lead</w:t>
+              <w:t>Cut-</w:t>
+            </w:r>
+            <w:r>
+              <w:rPr>
+                <w:color w:val="000000"/>
+                <w:sz w:val="16"/>
+                <w:szCs w:val="16"/>
+              </w:rPr>
+              <w:t>In</w:t>
+            </w:r>
+          </w:p>
+        </w:tc>
+        <w:tc>
+          <w:tcPr>
+            <w:tcW w:w="1016" w:type="dxa"/>
+            <w:tcBorders>
+              <w:top w:val="single" w:sz="4" w:space="0" w:color="000000"/>
+              <w:left w:val="single" w:sz="4" w:space="0" w:color="000000"/>
+              <w:bottom w:val="single" w:sz="4" w:space="0" w:color="000000"/>
+            </w:tcBorders>
+            <w:vAlign w:val="bottom"/>
+          </w:tcPr>
+          <w:p>
+            <w:pPr>
+              <w:pStyle w:val="Normal"/>
+              <w:widowControl w:val="false"/>
+              <w:jc w:val="center"/>
+              <w:rPr>
+                <w:color w:val="000000"/>
+                <w:sz w:val="16"/>
+                <w:szCs w:val="16"/>
+              </w:rPr>
+            </w:pPr>
+            <w:r>
+              <w:rPr/>
             </w:r>
           </w:p>
         </w:tc>
@@ -15127,42 +17408,39 @@
               </w:rPr>
             </w:pPr>
             <w:r>
-              <w:rPr>
-                <w:rFonts w:eastAsia="arial" w:ascii="arial" w:hAnsi="arial"/>
-                <w:color w:val="000000"/>
-                <w:sz w:val="16"/>
-                <w:szCs w:val="16"/>
-              </w:rPr>
-              <w:t>Isolation Run</w:t>
-            </w:r>
-          </w:p>
-        </w:tc>
-        <w:tc>
-          <w:tcPr>
-            <w:tcW w:w="1016" w:type="dxa"/>
-            <w:tcBorders>
-              <w:top w:val="single" w:sz="4" w:space="0" w:color="000000"/>
-              <w:left w:val="single" w:sz="4" w:space="0" w:color="000000"/>
-              <w:bottom w:val="single" w:sz="4" w:space="0" w:color="000000"/>
-            </w:tcBorders>
-            <w:vAlign w:val="bottom"/>
-          </w:tcPr>
-          <w:p>
-            <w:pPr>
-              <w:pStyle w:val="Normal"/>
-              <w:widowControl w:val="false"/>
-              <w:jc w:val="center"/>
-              <w:rPr>
-                <w:sz w:val="16"/>
-                <w:szCs w:val="16"/>
-              </w:rPr>
-            </w:pPr>
-            <w:r>
-              <w:rPr>
-                <w:sz w:val="16"/>
-                <w:szCs w:val="16"/>
-              </w:rPr>
-              <w:t>Rear HL Up</w:t>
+              <w:rPr/>
+            </w:r>
+          </w:p>
+        </w:tc>
+        <w:tc>
+          <w:tcPr>
+            <w:tcW w:w="1016" w:type="dxa"/>
+            <w:tcBorders>
+              <w:top w:val="single" w:sz="4" w:space="0" w:color="000000"/>
+              <w:left w:val="single" w:sz="4" w:space="0" w:color="000000"/>
+              <w:bottom w:val="single" w:sz="4" w:space="0" w:color="000000"/>
+            </w:tcBorders>
+            <w:vAlign w:val="bottom"/>
+          </w:tcPr>
+          <w:p>
+            <w:pPr>
+              <w:pStyle w:val="Normal"/>
+              <w:widowControl w:val="false"/>
+              <w:jc w:val="center"/>
+              <w:rPr>
+                <w:color w:val="000000"/>
+                <w:sz w:val="16"/>
+                <w:szCs w:val="16"/>
+              </w:rPr>
+            </w:pPr>
+            <w:r>
+              <w:rPr>
+                <w:rFonts w:eastAsia="arial" w:ascii="arial" w:hAnsi="arial"/>
+                <w:color w:val="000000"/>
+                <w:sz w:val="16"/>
+                <w:szCs w:val="16"/>
+              </w:rPr>
+              <w:t>Gauge Light Up</w:t>
             </w:r>
           </w:p>
         </w:tc>
@@ -15194,74 +17472,67 @@
                 <w:sz w:val="16"/>
                 <w:szCs w:val="16"/>
               </w:rPr>
-              <w:t>Banking COMM</w:t>
-            </w:r>
-          </w:p>
-        </w:tc>
-        <w:tc>
-          <w:tcPr>
-            <w:tcW w:w="1016" w:type="dxa"/>
-            <w:tcBorders>
-              <w:top w:val="single" w:sz="4" w:space="0" w:color="000000"/>
-              <w:left w:val="single" w:sz="4" w:space="0" w:color="000000"/>
-              <w:bottom w:val="single" w:sz="4" w:space="0" w:color="000000"/>
-            </w:tcBorders>
-            <w:vAlign w:val="bottom"/>
-          </w:tcPr>
-          <w:p>
-            <w:pPr>
-              <w:pStyle w:val="Normal"/>
-              <w:widowControl w:val="false"/>
-              <w:spacing w:lineRule="auto" w:line="180"/>
-              <w:jc w:val="center"/>
-              <w:rPr>
-                <w:sz w:val="16"/>
-                <w:szCs w:val="16"/>
-              </w:rPr>
-            </w:pPr>
-            <w:r>
-              <w:rPr>
-                <w:rFonts w:eastAsia="arial" w:ascii="arial" w:hAnsi="arial"/>
-                <w:color w:val="000000"/>
-                <w:sz w:val="16"/>
-                <w:szCs w:val="16"/>
-              </w:rPr>
-              <w:t xml:space="preserve">Gauge Light </w:t>
-            </w:r>
-            <w:r>
-              <w:rPr>
-                <w:rFonts w:eastAsia="arial" w:ascii="arial" w:hAnsi="arial"/>
-                <w:color w:val="000000"/>
-                <w:sz w:val="16"/>
-                <w:szCs w:val="16"/>
-              </w:rPr>
-              <w:t>Up</w:t>
-            </w:r>
-          </w:p>
-        </w:tc>
-        <w:tc>
-          <w:tcPr>
-            <w:tcW w:w="1016" w:type="dxa"/>
-            <w:tcBorders>
-              <w:top w:val="single" w:sz="4" w:space="0" w:color="000000"/>
-              <w:left w:val="single" w:sz="4" w:space="0" w:color="000000"/>
-              <w:bottom w:val="single" w:sz="4" w:space="0" w:color="000000"/>
-            </w:tcBorders>
-            <w:vAlign w:val="bottom"/>
-          </w:tcPr>
-          <w:p>
-            <w:pPr>
-              <w:pStyle w:val="Normal"/>
-              <w:widowControl w:val="false"/>
-              <w:spacing w:lineRule="auto" w:line="180"/>
-              <w:jc w:val="center"/>
-              <w:rPr>
-                <w:sz w:val="16"/>
-                <w:szCs w:val="16"/>
-              </w:rPr>
-            </w:pPr>
-            <w:r>
-              <w:rPr>
+              <w:t>HEP On</w:t>
+            </w:r>
+          </w:p>
+        </w:tc>
+        <w:tc>
+          <w:tcPr>
+            <w:tcW w:w="1016" w:type="dxa"/>
+            <w:tcBorders>
+              <w:top w:val="single" w:sz="4" w:space="0" w:color="000000"/>
+              <w:left w:val="single" w:sz="4" w:space="0" w:color="000000"/>
+              <w:bottom w:val="single" w:sz="4" w:space="0" w:color="000000"/>
+            </w:tcBorders>
+            <w:vAlign w:val="bottom"/>
+          </w:tcPr>
+          <w:p>
+            <w:pPr>
+              <w:pStyle w:val="Normal"/>
+              <w:widowControl w:val="false"/>
+              <w:spacing w:lineRule="auto" w:line="180"/>
+              <w:jc w:val="center"/>
+              <w:rPr>
+                <w:sz w:val="16"/>
+                <w:szCs w:val="16"/>
+              </w:rPr>
+            </w:pPr>
+            <w:r>
+              <w:rPr>
+                <w:rFonts w:eastAsia="arial" w:ascii="arial" w:hAnsi="arial"/>
+                <w:color w:val="000000"/>
+                <w:sz w:val="16"/>
+                <w:szCs w:val="16"/>
+              </w:rPr>
+              <w:t>Gauge Light</w:t>
+            </w:r>
+          </w:p>
+        </w:tc>
+        <w:tc>
+          <w:tcPr>
+            <w:tcW w:w="1016" w:type="dxa"/>
+            <w:tcBorders>
+              <w:top w:val="single" w:sz="4" w:space="0" w:color="000000"/>
+              <w:left w:val="single" w:sz="4" w:space="0" w:color="000000"/>
+              <w:bottom w:val="single" w:sz="4" w:space="0" w:color="000000"/>
+            </w:tcBorders>
+            <w:vAlign w:val="bottom"/>
+          </w:tcPr>
+          <w:p>
+            <w:pPr>
+              <w:pStyle w:val="Normal"/>
+              <w:widowControl w:val="false"/>
+              <w:spacing w:lineRule="auto" w:line="180"/>
+              <w:jc w:val="center"/>
+              <w:rPr>
+                <w:sz w:val="16"/>
+                <w:szCs w:val="16"/>
+              </w:rPr>
+            </w:pPr>
+            <w:r>
+              <w:rPr>
+                <w:rFonts w:eastAsia="arial" w:ascii="arial" w:hAnsi="arial"/>
+                <w:color w:val="000000"/>
                 <w:sz w:val="16"/>
                 <w:szCs w:val="16"/>
               </w:rPr>
@@ -15402,7 +17673,7 @@
           <w:sz w:val="16"/>
           <w:szCs w:val="16"/>
         </w:rPr>
-        <w:t>MP15DC</w:t>
+        <w:t>Gallery Cab Car</w:t>
       </w:r>
       <w:r>
         <w:rPr>
@@ -15537,45 +17808,39 @@
               </w:rPr>
             </w:pPr>
             <w:r>
-              <w:rPr>
-                <w:rFonts w:eastAsia="arial" w:ascii="arial" w:hAnsi="arial"/>
-                <w:color w:val="000000"/>
-                <w:sz w:val="16"/>
-                <w:szCs w:val="16"/>
-              </w:rPr>
-              <w:t>Engine Stop</w:t>
-            </w:r>
-          </w:p>
-        </w:tc>
-        <w:tc>
-          <w:tcPr>
-            <w:tcW w:w="1016" w:type="dxa"/>
-            <w:tcBorders>
-              <w:top w:val="single" w:sz="4" w:space="0" w:color="000000"/>
-              <w:left w:val="single" w:sz="4" w:space="0" w:color="000000"/>
-              <w:bottom w:val="single" w:sz="4" w:space="0" w:color="000000"/>
-            </w:tcBorders>
-            <w:vAlign w:val="bottom"/>
-          </w:tcPr>
-          <w:p>
-            <w:pPr>
-              <w:pStyle w:val="Normal"/>
-              <w:widowControl w:val="false"/>
-              <w:spacing w:lineRule="auto" w:line="180"/>
-              <w:jc w:val="center"/>
-              <w:rPr>
-                <w:color w:val="000000"/>
-                <w:sz w:val="16"/>
-                <w:szCs w:val="16"/>
-              </w:rPr>
-            </w:pPr>
-            <w:r>
-              <w:rPr>
-                <w:color w:val="000000"/>
-                <w:sz w:val="16"/>
-                <w:szCs w:val="16"/>
-              </w:rPr>
-              <w:t>Warning Devices</w:t>
+              <w:rPr/>
+            </w:r>
+          </w:p>
+        </w:tc>
+        <w:tc>
+          <w:tcPr>
+            <w:tcW w:w="1016" w:type="dxa"/>
+            <w:tcBorders>
+              <w:top w:val="single" w:sz="4" w:space="0" w:color="000000"/>
+              <w:left w:val="single" w:sz="4" w:space="0" w:color="000000"/>
+              <w:bottom w:val="single" w:sz="4" w:space="0" w:color="000000"/>
+            </w:tcBorders>
+            <w:vAlign w:val="bottom"/>
+          </w:tcPr>
+          <w:p>
+            <w:pPr>
+              <w:pStyle w:val="Normal"/>
+              <w:widowControl w:val="false"/>
+              <w:spacing w:lineRule="auto" w:line="180"/>
+              <w:jc w:val="center"/>
+              <w:rPr>
+                <w:color w:val="000000"/>
+                <w:sz w:val="16"/>
+                <w:szCs w:val="16"/>
+              </w:rPr>
+            </w:pPr>
+            <w:r>
+              <w:rPr>
+                <w:color w:val="000000"/>
+                <w:sz w:val="16"/>
+                <w:szCs w:val="16"/>
+              </w:rPr>
+              <w:t>Alerter</w:t>
             </w:r>
           </w:p>
         </w:tc>
@@ -15658,39 +17923,41 @@
                 <w:sz w:val="16"/>
                 <w:szCs w:val="16"/>
               </w:rPr>
-              <w:t>Cut-Out</w:t>
-            </w:r>
-          </w:p>
-        </w:tc>
-        <w:tc>
-          <w:tcPr>
-            <w:tcW w:w="1016" w:type="dxa"/>
-            <w:tcBorders>
-              <w:top w:val="single" w:sz="4" w:space="0" w:color="000000"/>
-              <w:left w:val="single" w:sz="4" w:space="0" w:color="000000"/>
-              <w:bottom w:val="single" w:sz="4" w:space="0" w:color="000000"/>
-            </w:tcBorders>
-            <w:vAlign w:val="bottom"/>
-          </w:tcPr>
-          <w:p>
-            <w:pPr>
-              <w:pStyle w:val="Normal"/>
-              <w:widowControl w:val="false"/>
-              <w:jc w:val="center"/>
-              <w:rPr>
-                <w:color w:val="000000"/>
-                <w:sz w:val="16"/>
-                <w:szCs w:val="16"/>
-              </w:rPr>
-            </w:pPr>
-            <w:r>
-              <w:rPr>
-                <w:rFonts w:eastAsia="arial" w:ascii="arial" w:hAnsi="arial"/>
-                <w:color w:val="000000"/>
-                <w:sz w:val="16"/>
-                <w:szCs w:val="16"/>
-              </w:rPr>
-              <w:t>MU-2A Trail</w:t>
+              <w:t>Cut-</w:t>
+            </w:r>
+            <w:r>
+              <w:rPr>
+                <w:color w:val="000000"/>
+                <w:sz w:val="16"/>
+                <w:szCs w:val="16"/>
+              </w:rPr>
+              <w:t>Out</w:t>
+            </w:r>
+          </w:p>
+        </w:tc>
+        <w:tc>
+          <w:tcPr>
+            <w:tcW w:w="1016" w:type="dxa"/>
+            <w:tcBorders>
+              <w:top w:val="single" w:sz="4" w:space="0" w:color="000000"/>
+              <w:left w:val="single" w:sz="4" w:space="0" w:color="000000"/>
+              <w:bottom w:val="single" w:sz="4" w:space="0" w:color="000000"/>
+            </w:tcBorders>
+            <w:vAlign w:val="bottom"/>
+          </w:tcPr>
+          <w:p>
+            <w:pPr>
+              <w:pStyle w:val="Normal"/>
+              <w:widowControl w:val="false"/>
+              <w:jc w:val="center"/>
+              <w:rPr>
+                <w:color w:val="000000"/>
+                <w:sz w:val="16"/>
+                <w:szCs w:val="16"/>
+              </w:rPr>
+            </w:pPr>
+            <w:r>
+              <w:rPr/>
             </w:r>
           </w:p>
         </w:tc>
@@ -15716,44 +17983,39 @@
               </w:rPr>
             </w:pPr>
             <w:r>
-              <w:rPr>
-                <w:rFonts w:eastAsia="arial" w:ascii="arial" w:hAnsi="arial"/>
-                <w:color w:val="000000"/>
-                <w:sz w:val="16"/>
-                <w:szCs w:val="16"/>
-              </w:rPr>
-              <w:t>Isolation Start Iso.</w:t>
-            </w:r>
-          </w:p>
-        </w:tc>
-        <w:tc>
-          <w:tcPr>
-            <w:tcW w:w="1016" w:type="dxa"/>
-            <w:tcBorders>
-              <w:top w:val="single" w:sz="4" w:space="0" w:color="000000"/>
-              <w:left w:val="single" w:sz="4" w:space="0" w:color="000000"/>
-              <w:bottom w:val="single" w:sz="4" w:space="0" w:color="000000"/>
-            </w:tcBorders>
-            <w:vAlign w:val="bottom"/>
-          </w:tcPr>
-          <w:p>
-            <w:pPr>
-              <w:pStyle w:val="Normal"/>
-              <w:widowControl w:val="false"/>
-              <w:jc w:val="center"/>
-              <w:rPr>
-                <w:sz w:val="16"/>
-                <w:szCs w:val="16"/>
-              </w:rPr>
-            </w:pPr>
-            <w:r>
-              <w:rPr>
-                <w:rFonts w:eastAsia="arial" w:ascii="arial" w:hAnsi="arial"/>
-                <w:color w:val="000000"/>
-                <w:sz w:val="16"/>
-                <w:szCs w:val="16"/>
-              </w:rPr>
-              <w:t>Rear HL Down</w:t>
+              <w:rPr/>
+            </w:r>
+          </w:p>
+        </w:tc>
+        <w:tc>
+          <w:tcPr>
+            <w:tcW w:w="1016" w:type="dxa"/>
+            <w:tcBorders>
+              <w:top w:val="single" w:sz="4" w:space="0" w:color="000000"/>
+              <w:left w:val="single" w:sz="4" w:space="0" w:color="000000"/>
+              <w:bottom w:val="single" w:sz="4" w:space="0" w:color="000000"/>
+            </w:tcBorders>
+            <w:vAlign w:val="bottom"/>
+          </w:tcPr>
+          <w:p>
+            <w:pPr>
+              <w:pStyle w:val="Normal"/>
+              <w:widowControl w:val="false"/>
+              <w:jc w:val="center"/>
+              <w:rPr>
+                <w:color w:val="000000"/>
+                <w:sz w:val="16"/>
+                <w:szCs w:val="16"/>
+              </w:rPr>
+            </w:pPr>
+            <w:r>
+              <w:rPr>
+                <w:rFonts w:eastAsia="arial" w:ascii="arial" w:hAnsi="arial"/>
+                <w:color w:val="000000"/>
+                <w:sz w:val="16"/>
+                <w:szCs w:val="16"/>
+              </w:rPr>
+              <w:t>Gauge Light Dw</w:t>
             </w:r>
           </w:p>
         </w:tc>
@@ -15771,90 +18033,85 @@
             <w:pPr>
               <w:pStyle w:val="Normal"/>
               <w:widowControl w:val="false"/>
-              <w:spacing w:lineRule="auto" w:line="180"/>
-              <w:jc w:val="center"/>
-              <w:rPr>
-                <w:sz w:val="16"/>
-                <w:szCs w:val="16"/>
-              </w:rPr>
-            </w:pPr>
-            <w:r>
-              <w:rPr>
-                <w:sz w:val="16"/>
-                <w:szCs w:val="16"/>
-              </w:rPr>
-              <w:t>Headlight Control</w:t>
-            </w:r>
-          </w:p>
-        </w:tc>
-        <w:tc>
-          <w:tcPr>
-            <w:tcW w:w="1016" w:type="dxa"/>
-            <w:tcBorders>
-              <w:top w:val="single" w:sz="4" w:space="0" w:color="000000"/>
-              <w:left w:val="single" w:sz="4" w:space="0" w:color="000000"/>
-              <w:bottom w:val="single" w:sz="4" w:space="0" w:color="000000"/>
-            </w:tcBorders>
-            <w:vAlign w:val="bottom"/>
-          </w:tcPr>
-          <w:p>
-            <w:pPr>
-              <w:pStyle w:val="Normal"/>
-              <w:widowControl w:val="false"/>
-              <w:spacing w:lineRule="auto" w:line="180"/>
-              <w:jc w:val="center"/>
-              <w:rPr>
-                <w:sz w:val="16"/>
-                <w:szCs w:val="16"/>
-              </w:rPr>
-            </w:pPr>
-            <w:r>
-              <w:rPr>
-                <w:rFonts w:eastAsia="arial" w:ascii="arial" w:hAnsi="arial"/>
-                <w:color w:val="000000"/>
-                <w:sz w:val="16"/>
-                <w:szCs w:val="16"/>
-              </w:rPr>
-              <w:t xml:space="preserve">Gauge Light </w:t>
-            </w:r>
-            <w:r>
-              <w:rPr>
-                <w:rFonts w:eastAsia="arial" w:ascii="arial" w:hAnsi="arial"/>
-                <w:color w:val="000000"/>
-                <w:sz w:val="16"/>
-                <w:szCs w:val="16"/>
-              </w:rPr>
-              <w:t>Dw</w:t>
-            </w:r>
-          </w:p>
-        </w:tc>
-        <w:tc>
-          <w:tcPr>
-            <w:tcW w:w="1016" w:type="dxa"/>
-            <w:tcBorders>
-              <w:top w:val="single" w:sz="4" w:space="0" w:color="000000"/>
-              <w:left w:val="single" w:sz="4" w:space="0" w:color="000000"/>
-              <w:bottom w:val="single" w:sz="4" w:space="0" w:color="000000"/>
-            </w:tcBorders>
-            <w:vAlign w:val="bottom"/>
-          </w:tcPr>
-          <w:p>
-            <w:pPr>
-              <w:pStyle w:val="Normal"/>
-              <w:widowControl w:val="false"/>
-              <w:spacing w:lineRule="auto" w:line="180"/>
-              <w:jc w:val="center"/>
-              <w:rPr>
-                <w:sz w:val="16"/>
-                <w:szCs w:val="16"/>
-              </w:rPr>
-            </w:pPr>
-            <w:r>
-              <w:rPr>
-                <w:sz w:val="16"/>
-                <w:szCs w:val="16"/>
-              </w:rPr>
-              <w:t>Step Light</w:t>
+              <w:jc w:val="center"/>
+              <w:rPr>
+                <w:color w:val="000000"/>
+                <w:sz w:val="16"/>
+                <w:szCs w:val="16"/>
+              </w:rPr>
+            </w:pPr>
+            <w:r>
+              <w:rPr>
+                <w:rFonts w:eastAsia="arial" w:ascii="arial" w:hAnsi="arial"/>
+                <w:color w:val="000000"/>
+                <w:sz w:val="16"/>
+                <w:szCs w:val="16"/>
+              </w:rPr>
+              <w:t>HEP Off</w:t>
+            </w:r>
+          </w:p>
+        </w:tc>
+        <w:tc>
+          <w:tcPr>
+            <w:tcW w:w="1016" w:type="dxa"/>
+            <w:tcBorders>
+              <w:top w:val="single" w:sz="4" w:space="0" w:color="000000"/>
+              <w:left w:val="single" w:sz="4" w:space="0" w:color="000000"/>
+              <w:bottom w:val="single" w:sz="4" w:space="0" w:color="000000"/>
+            </w:tcBorders>
+            <w:vAlign w:val="bottom"/>
+          </w:tcPr>
+          <w:p>
+            <w:pPr>
+              <w:pStyle w:val="Normal"/>
+              <w:widowControl w:val="false"/>
+              <w:jc w:val="center"/>
+              <w:rPr>
+                <w:color w:val="000000"/>
+                <w:sz w:val="16"/>
+                <w:szCs w:val="16"/>
+              </w:rPr>
+            </w:pPr>
+            <w:r>
+              <w:rPr>
+                <w:rFonts w:eastAsia="arial" w:ascii="arial" w:hAnsi="arial"/>
+                <w:color w:val="000000"/>
+                <w:sz w:val="16"/>
+                <w:szCs w:val="16"/>
+              </w:rPr>
+              <w:t>Marker Light</w:t>
+            </w:r>
+          </w:p>
+        </w:tc>
+        <w:tc>
+          <w:tcPr>
+            <w:tcW w:w="1016" w:type="dxa"/>
+            <w:tcBorders>
+              <w:top w:val="single" w:sz="4" w:space="0" w:color="000000"/>
+              <w:left w:val="single" w:sz="4" w:space="0" w:color="000000"/>
+              <w:bottom w:val="single" w:sz="4" w:space="0" w:color="000000"/>
+            </w:tcBorders>
+            <w:vAlign w:val="bottom"/>
+          </w:tcPr>
+          <w:p>
+            <w:pPr>
+              <w:pStyle w:val="Normal"/>
+              <w:widowControl w:val="false"/>
+              <w:spacing w:lineRule="auto" w:line="180"/>
+              <w:jc w:val="center"/>
+              <w:rPr>
+                <w:sz w:val="16"/>
+                <w:szCs w:val="16"/>
+              </w:rPr>
+            </w:pPr>
+            <w:r>
+              <w:rPr>
+                <w:rFonts w:eastAsia="arial" w:ascii="arial" w:hAnsi="arial"/>
+                <w:color w:val="000000"/>
+                <w:sz w:val="16"/>
+                <w:szCs w:val="16"/>
+              </w:rPr>
+              <w:t>Crossing Light</w:t>
             </w:r>
           </w:p>
         </w:tc>

</xml_diff>

<commit_message>
Add MP36PH-3C and Bombardier Bi-Level Cab Car
* MP36PH-3C from Caltrain and Metrolink
* Bombardier Bi-Level Cab Car from Caltrain
</commit_message>
<xml_diff>
--- a/raildriver-USA-Remapped.docx
+++ b/raildriver-USA-Remapped.docx
@@ -17088,25 +17088,7 @@
           <w:sz w:val="16"/>
           <w:szCs w:val="16"/>
         </w:rPr>
-        <w:t xml:space="preserve">    </w:t>
-      </w:r>
-      <w:r>
-        <w:rPr>
-          <w:rFonts w:eastAsia="arial" w:ascii="arial" w:hAnsi="arial"/>
-          <w:color w:val="000000"/>
-          <w:sz w:val="16"/>
-          <w:szCs w:val="16"/>
-        </w:rPr>
-        <w:t>Gallery Cab Car</w:t>
-      </w:r>
-      <w:r>
-        <w:rPr>
-          <w:rFonts w:eastAsia="arial" w:ascii="arial" w:hAnsi="arial"/>
-          <w:color w:val="000000"/>
-          <w:sz w:val="16"/>
-          <w:szCs w:val="16"/>
-        </w:rPr>
-        <w:t>-1</w:t>
+        <w:t xml:space="preserve">    Gallery Cab Car-1</w:t>
       </w:r>
     </w:p>
     <w:tbl>
@@ -17233,7 +17215,12 @@
               </w:rPr>
             </w:pPr>
             <w:r>
-              <w:rPr/>
+              <w:rPr>
+                <w:rFonts w:eastAsia="arial" w:ascii="arial" w:hAnsi="arial"/>
+                <w:color w:val="000000"/>
+                <w:sz w:val="16"/>
+                <w:szCs w:val="16"/>
+              </w:rPr>
             </w:r>
           </w:p>
         </w:tc>
@@ -17348,6 +17335,1158 @@
                 <w:sz w:val="16"/>
                 <w:szCs w:val="16"/>
               </w:rPr>
+              <w:t>Cut-In</w:t>
+            </w:r>
+          </w:p>
+        </w:tc>
+        <w:tc>
+          <w:tcPr>
+            <w:tcW w:w="1016" w:type="dxa"/>
+            <w:tcBorders>
+              <w:top w:val="single" w:sz="4" w:space="0" w:color="000000"/>
+              <w:left w:val="single" w:sz="4" w:space="0" w:color="000000"/>
+              <w:bottom w:val="single" w:sz="4" w:space="0" w:color="000000"/>
+            </w:tcBorders>
+            <w:vAlign w:val="bottom"/>
+          </w:tcPr>
+          <w:p>
+            <w:pPr>
+              <w:pStyle w:val="Normal"/>
+              <w:widowControl w:val="false"/>
+              <w:jc w:val="center"/>
+              <w:rPr>
+                <w:color w:val="000000"/>
+                <w:sz w:val="16"/>
+                <w:szCs w:val="16"/>
+              </w:rPr>
+            </w:pPr>
+            <w:r>
+              <w:rPr>
+                <w:color w:val="000000"/>
+                <w:sz w:val="16"/>
+                <w:szCs w:val="16"/>
+              </w:rPr>
+            </w:r>
+          </w:p>
+        </w:tc>
+        <w:tc>
+          <w:tcPr>
+            <w:tcW w:w="1017" w:type="dxa"/>
+            <w:tcBorders>
+              <w:top w:val="single" w:sz="4" w:space="0" w:color="000000"/>
+              <w:left w:val="single" w:sz="4" w:space="0" w:color="000000"/>
+              <w:bottom w:val="single" w:sz="4" w:space="0" w:color="000000"/>
+            </w:tcBorders>
+            <w:vAlign w:val="bottom"/>
+          </w:tcPr>
+          <w:p>
+            <w:pPr>
+              <w:pStyle w:val="Normal"/>
+              <w:widowControl w:val="false"/>
+              <w:jc w:val="center"/>
+              <w:rPr>
+                <w:color w:val="000000"/>
+                <w:sz w:val="16"/>
+                <w:szCs w:val="16"/>
+              </w:rPr>
+            </w:pPr>
+            <w:r>
+              <w:rPr>
+                <w:color w:val="000000"/>
+                <w:sz w:val="16"/>
+                <w:szCs w:val="16"/>
+              </w:rPr>
+            </w:r>
+          </w:p>
+        </w:tc>
+        <w:tc>
+          <w:tcPr>
+            <w:tcW w:w="1016" w:type="dxa"/>
+            <w:tcBorders>
+              <w:top w:val="single" w:sz="4" w:space="0" w:color="000000"/>
+              <w:left w:val="single" w:sz="4" w:space="0" w:color="000000"/>
+              <w:bottom w:val="single" w:sz="4" w:space="0" w:color="000000"/>
+            </w:tcBorders>
+            <w:vAlign w:val="bottom"/>
+          </w:tcPr>
+          <w:p>
+            <w:pPr>
+              <w:pStyle w:val="Normal"/>
+              <w:widowControl w:val="false"/>
+              <w:jc w:val="center"/>
+              <w:rPr>
+                <w:color w:val="000000"/>
+                <w:sz w:val="16"/>
+                <w:szCs w:val="16"/>
+              </w:rPr>
+            </w:pPr>
+            <w:r>
+              <w:rPr>
+                <w:rFonts w:eastAsia="arial" w:ascii="arial" w:hAnsi="arial"/>
+                <w:color w:val="000000"/>
+                <w:sz w:val="16"/>
+                <w:szCs w:val="16"/>
+              </w:rPr>
+              <w:t>Gauge Light Up</w:t>
+            </w:r>
+          </w:p>
+        </w:tc>
+        <w:tc>
+          <w:tcPr>
+            <w:tcW w:w="1020" w:type="dxa"/>
+            <w:tcBorders>
+              <w:top w:val="single" w:sz="4" w:space="0" w:color="000000"/>
+              <w:left w:val="single" w:sz="4" w:space="0" w:color="000000"/>
+              <w:bottom w:val="single" w:sz="4" w:space="0" w:color="000000"/>
+            </w:tcBorders>
+            <w:vAlign w:val="bottom"/>
+          </w:tcPr>
+          <w:p>
+            <w:pPr>
+              <w:pStyle w:val="Normal"/>
+              <w:widowControl w:val="false"/>
+              <w:jc w:val="center"/>
+              <w:rPr>
+                <w:color w:val="000000"/>
+                <w:sz w:val="16"/>
+                <w:szCs w:val="16"/>
+              </w:rPr>
+            </w:pPr>
+            <w:r>
+              <w:rPr>
+                <w:rFonts w:eastAsia="arial" w:ascii="arial" w:hAnsi="arial"/>
+                <w:color w:val="000000"/>
+                <w:sz w:val="16"/>
+                <w:szCs w:val="16"/>
+              </w:rPr>
+              <w:t>HEP On</w:t>
+            </w:r>
+          </w:p>
+        </w:tc>
+        <w:tc>
+          <w:tcPr>
+            <w:tcW w:w="1016" w:type="dxa"/>
+            <w:tcBorders>
+              <w:top w:val="single" w:sz="4" w:space="0" w:color="000000"/>
+              <w:left w:val="single" w:sz="4" w:space="0" w:color="000000"/>
+              <w:bottom w:val="single" w:sz="4" w:space="0" w:color="000000"/>
+            </w:tcBorders>
+            <w:vAlign w:val="bottom"/>
+          </w:tcPr>
+          <w:p>
+            <w:pPr>
+              <w:pStyle w:val="Normal"/>
+              <w:widowControl w:val="false"/>
+              <w:spacing w:lineRule="auto" w:line="180"/>
+              <w:jc w:val="center"/>
+              <w:rPr>
+                <w:sz w:val="16"/>
+                <w:szCs w:val="16"/>
+              </w:rPr>
+            </w:pPr>
+            <w:r>
+              <w:rPr>
+                <w:rFonts w:eastAsia="arial" w:ascii="arial" w:hAnsi="arial"/>
+                <w:color w:val="000000"/>
+                <w:sz w:val="16"/>
+                <w:szCs w:val="16"/>
+              </w:rPr>
+              <w:t>Gauge Light</w:t>
+            </w:r>
+          </w:p>
+        </w:tc>
+        <w:tc>
+          <w:tcPr>
+            <w:tcW w:w="1016" w:type="dxa"/>
+            <w:tcBorders>
+              <w:top w:val="single" w:sz="4" w:space="0" w:color="000000"/>
+              <w:left w:val="single" w:sz="4" w:space="0" w:color="000000"/>
+              <w:bottom w:val="single" w:sz="4" w:space="0" w:color="000000"/>
+            </w:tcBorders>
+            <w:vAlign w:val="bottom"/>
+          </w:tcPr>
+          <w:p>
+            <w:pPr>
+              <w:pStyle w:val="Normal"/>
+              <w:widowControl w:val="false"/>
+              <w:spacing w:lineRule="auto" w:line="180"/>
+              <w:jc w:val="center"/>
+              <w:rPr>
+                <w:sz w:val="16"/>
+                <w:szCs w:val="16"/>
+              </w:rPr>
+            </w:pPr>
+            <w:r>
+              <w:rPr>
+                <w:rFonts w:eastAsia="arial" w:ascii="arial" w:hAnsi="arial"/>
+                <w:color w:val="000000"/>
+                <w:sz w:val="16"/>
+                <w:szCs w:val="16"/>
+              </w:rPr>
+              <w:t>Cab Light</w:t>
+            </w:r>
+          </w:p>
+        </w:tc>
+        <w:tc>
+          <w:tcPr>
+            <w:tcW w:w="1016" w:type="dxa"/>
+            <w:tcBorders>
+              <w:top w:val="single" w:sz="4" w:space="0" w:color="000000"/>
+              <w:left w:val="single" w:sz="4" w:space="0" w:color="000000"/>
+              <w:bottom w:val="single" w:sz="4" w:space="0" w:color="000000"/>
+            </w:tcBorders>
+            <w:vAlign w:val="bottom"/>
+          </w:tcPr>
+          <w:p>
+            <w:pPr>
+              <w:pStyle w:val="Normal"/>
+              <w:widowControl w:val="false"/>
+              <w:spacing w:lineRule="auto" w:line="180"/>
+              <w:jc w:val="center"/>
+              <w:rPr>
+                <w:sz w:val="16"/>
+                <w:szCs w:val="16"/>
+              </w:rPr>
+            </w:pPr>
+            <w:r>
+              <w:rPr>
+                <w:rFonts w:eastAsia="arial" w:ascii="arial" w:hAnsi="arial"/>
+                <w:color w:val="000000"/>
+                <w:sz w:val="16"/>
+                <w:szCs w:val="16"/>
+              </w:rPr>
+              <w:t>1-Person</w:t>
+            </w:r>
+          </w:p>
+        </w:tc>
+        <w:tc>
+          <w:tcPr>
+            <w:tcW w:w="1029" w:type="dxa"/>
+            <w:tcBorders>
+              <w:top w:val="single" w:sz="4" w:space="0" w:color="000000"/>
+              <w:left w:val="single" w:sz="4" w:space="0" w:color="000000"/>
+              <w:bottom w:val="single" w:sz="4" w:space="0" w:color="000000"/>
+              <w:right w:val="single" w:sz="4" w:space="0" w:color="000000"/>
+            </w:tcBorders>
+            <w:vAlign w:val="bottom"/>
+          </w:tcPr>
+          <w:p>
+            <w:pPr>
+              <w:pStyle w:val="Normal"/>
+              <w:widowControl w:val="false"/>
+              <w:spacing w:lineRule="auto" w:line="180"/>
+              <w:jc w:val="center"/>
+              <w:rPr>
+                <w:sz w:val="16"/>
+                <w:szCs w:val="16"/>
+              </w:rPr>
+            </w:pPr>
+            <w:r>
+              <w:rPr>
+                <w:rFonts w:eastAsia="arial" w:ascii="arial" w:hAnsi="arial"/>
+                <w:color w:val="000000"/>
+                <w:sz w:val="16"/>
+                <w:szCs w:val="16"/>
+              </w:rPr>
+              <w:t>Next</w:t>
+            </w:r>
+          </w:p>
+          <w:p>
+            <w:pPr>
+              <w:pStyle w:val="Normal"/>
+              <w:widowControl w:val="false"/>
+              <w:spacing w:lineRule="auto" w:line="180"/>
+              <w:jc w:val="center"/>
+              <w:rPr>
+                <w:sz w:val="16"/>
+                <w:szCs w:val="16"/>
+              </w:rPr>
+            </w:pPr>
+            <w:r>
+              <w:rPr>
+                <w:rFonts w:eastAsia="arial" w:ascii="arial" w:hAnsi="arial"/>
+                <w:color w:val="000000"/>
+                <w:sz w:val="16"/>
+                <w:szCs w:val="16"/>
+              </w:rPr>
+              <w:t>Cab Cam</w:t>
+            </w:r>
+          </w:p>
+        </w:tc>
+      </w:tr>
+    </w:tbl>
+    <w:p>
+      <w:pPr>
+        <w:pStyle w:val="Normal"/>
+        <w:rPr>
+          <w:rFonts w:ascii="arial" w:hAnsi="arial" w:eastAsia="arial"/>
+          <w:color w:val="000000"/>
+          <w:sz w:val="16"/>
+          <w:szCs w:val="16"/>
+        </w:rPr>
+      </w:pPr>
+      <w:r>
+        <w:rPr>
+          <w:rFonts w:eastAsia="arial" w:ascii="arial" w:hAnsi="arial"/>
+          <w:color w:val="000000"/>
+          <w:sz w:val="16"/>
+          <w:szCs w:val="16"/>
+        </w:rPr>
+      </w:r>
+    </w:p>
+    <w:p>
+      <w:pPr>
+        <w:pStyle w:val="Normal"/>
+        <w:rPr>
+          <w:color w:val="000000"/>
+          <w:sz w:val="16"/>
+          <w:szCs w:val="16"/>
+        </w:rPr>
+      </w:pPr>
+      <w:r>
+        <w:rPr>
+          <w:rFonts w:eastAsia="arial" w:ascii="arial" w:hAnsi="arial"/>
+          <w:color w:val="000000"/>
+          <w:sz w:val="16"/>
+          <w:szCs w:val="16"/>
+        </w:rPr>
+        <w:tab/>
+        <w:t xml:space="preserve">           Gallery Cab Car-2</w:t>
+      </w:r>
+    </w:p>
+    <w:tbl>
+      <w:tblPr>
+        <w:tblW w:w="14248" w:type="dxa"/>
+        <w:jc w:val="left"/>
+        <w:tblInd w:w="-5" w:type="dxa"/>
+        <w:tblLayout w:type="fixed"/>
+        <w:tblCellMar>
+          <w:top w:w="0" w:type="dxa"/>
+          <w:left w:w="108" w:type="dxa"/>
+          <w:bottom w:w="0" w:type="dxa"/>
+          <w:right w:w="108" w:type="dxa"/>
+        </w:tblCellMar>
+        <w:tblLook w:firstRow="1" w:noVBand="1" w:lastRow="0" w:firstColumn="1" w:lastColumn="0" w:noHBand="0" w:val="04a0"/>
+      </w:tblPr>
+      <w:tblGrid>
+        <w:gridCol w:w="1017"/>
+        <w:gridCol w:w="1019"/>
+        <w:gridCol w:w="1014"/>
+        <w:gridCol w:w="1016"/>
+        <w:gridCol w:w="1020"/>
+        <w:gridCol w:w="1016"/>
+        <w:gridCol w:w="1016"/>
+        <w:gridCol w:w="1017"/>
+        <w:gridCol w:w="1016"/>
+        <w:gridCol w:w="1020"/>
+        <w:gridCol w:w="1016"/>
+        <w:gridCol w:w="1016"/>
+        <w:gridCol w:w="1016"/>
+        <w:gridCol w:w="1029"/>
+      </w:tblGrid>
+      <w:tr>
+        <w:trPr>
+          <w:trHeight w:val="440" w:hRule="exact"/>
+          <w:cantSplit w:val="true"/>
+        </w:trPr>
+        <w:tc>
+          <w:tcPr>
+            <w:tcW w:w="1017" w:type="dxa"/>
+            <w:tcBorders>
+              <w:top w:val="single" w:sz="4" w:space="0" w:color="000000"/>
+              <w:left w:val="single" w:sz="4" w:space="0" w:color="000000"/>
+              <w:bottom w:val="single" w:sz="4" w:space="0" w:color="000000"/>
+            </w:tcBorders>
+            <w:vAlign w:val="bottom"/>
+          </w:tcPr>
+          <w:p>
+            <w:pPr>
+              <w:pStyle w:val="Normal"/>
+              <w:widowControl w:val="false"/>
+              <w:spacing w:lineRule="auto" w:line="180" w:before="0" w:after="60"/>
+              <w:jc w:val="center"/>
+              <w:rPr>
+                <w:b/>
+                <w:bCs/>
+              </w:rPr>
+            </w:pPr>
+            <w:r>
+              <w:rPr>
+                <w:b/>
+                <w:bCs/>
+                <w:color w:val="000000"/>
+                <w:sz w:val="16"/>
+                <w:szCs w:val="16"/>
+              </w:rPr>
+              <w:t>HUD</w:t>
+            </w:r>
+          </w:p>
+        </w:tc>
+        <w:tc>
+          <w:tcPr>
+            <w:tcW w:w="1019" w:type="dxa"/>
+            <w:tcBorders>
+              <w:top w:val="single" w:sz="4" w:space="0" w:color="000000"/>
+              <w:left w:val="single" w:sz="4" w:space="0" w:color="000000"/>
+              <w:bottom w:val="single" w:sz="4" w:space="0" w:color="000000"/>
+            </w:tcBorders>
+            <w:vAlign w:val="bottom"/>
+          </w:tcPr>
+          <w:p>
+            <w:pPr>
+              <w:pStyle w:val="Normal"/>
+              <w:widowControl w:val="false"/>
+              <w:spacing w:lineRule="auto" w:line="180"/>
+              <w:jc w:val="center"/>
+              <w:rPr>
+                <w:color w:val="000000"/>
+                <w:sz w:val="16"/>
+                <w:szCs w:val="16"/>
+              </w:rPr>
+            </w:pPr>
+            <w:r>
+              <w:rPr>
+                <w:color w:val="000000"/>
+                <w:sz w:val="16"/>
+                <w:szCs w:val="16"/>
+              </w:rPr>
+              <w:t>Schedule</w:t>
+            </w:r>
+          </w:p>
+        </w:tc>
+        <w:tc>
+          <w:tcPr>
+            <w:tcW w:w="1014" w:type="dxa"/>
+            <w:tcBorders>
+              <w:top w:val="single" w:sz="4" w:space="0" w:color="000000"/>
+              <w:left w:val="single" w:sz="4" w:space="0" w:color="000000"/>
+              <w:bottom w:val="single" w:sz="4" w:space="0" w:color="000000"/>
+            </w:tcBorders>
+            <w:vAlign w:val="bottom"/>
+          </w:tcPr>
+          <w:p>
+            <w:pPr>
+              <w:pStyle w:val="Normal"/>
+              <w:widowControl w:val="false"/>
+              <w:spacing w:lineRule="auto" w:line="180"/>
+              <w:jc w:val="center"/>
+              <w:rPr>
+                <w:color w:val="000000"/>
+                <w:sz w:val="16"/>
+                <w:szCs w:val="16"/>
+              </w:rPr>
+            </w:pPr>
+            <w:r>
+              <w:rPr>
+                <w:color w:val="000000"/>
+                <w:sz w:val="16"/>
+                <w:szCs w:val="16"/>
+              </w:rPr>
+            </w:r>
+          </w:p>
+        </w:tc>
+        <w:tc>
+          <w:tcPr>
+            <w:tcW w:w="1016" w:type="dxa"/>
+            <w:tcBorders>
+              <w:top w:val="single" w:sz="4" w:space="0" w:color="000000"/>
+              <w:left w:val="single" w:sz="4" w:space="0" w:color="000000"/>
+              <w:bottom w:val="single" w:sz="4" w:space="0" w:color="000000"/>
+            </w:tcBorders>
+            <w:vAlign w:val="bottom"/>
+          </w:tcPr>
+          <w:p>
+            <w:pPr>
+              <w:pStyle w:val="Normal"/>
+              <w:widowControl w:val="false"/>
+              <w:spacing w:lineRule="auto" w:line="180"/>
+              <w:jc w:val="center"/>
+              <w:rPr>
+                <w:color w:val="000000"/>
+                <w:sz w:val="16"/>
+                <w:szCs w:val="16"/>
+              </w:rPr>
+            </w:pPr>
+            <w:r>
+              <w:rPr>
+                <w:color w:val="000000"/>
+                <w:sz w:val="16"/>
+                <w:szCs w:val="16"/>
+              </w:rPr>
+              <w:t>Alerter</w:t>
+            </w:r>
+          </w:p>
+        </w:tc>
+        <w:tc>
+          <w:tcPr>
+            <w:tcW w:w="1020" w:type="dxa"/>
+            <w:tcBorders>
+              <w:top w:val="single" w:sz="4" w:space="0" w:color="000000"/>
+              <w:left w:val="single" w:sz="4" w:space="0" w:color="000000"/>
+              <w:bottom w:val="single" w:sz="4" w:space="0" w:color="000000"/>
+            </w:tcBorders>
+            <w:vAlign w:val="bottom"/>
+          </w:tcPr>
+          <w:p>
+            <w:pPr>
+              <w:pStyle w:val="Normal"/>
+              <w:widowControl w:val="false"/>
+              <w:spacing w:lineRule="auto" w:line="180"/>
+              <w:jc w:val="center"/>
+              <w:rPr>
+                <w:color w:val="000000"/>
+                <w:sz w:val="16"/>
+                <w:szCs w:val="16"/>
+              </w:rPr>
+            </w:pPr>
+            <w:r>
+              <w:rPr>
+                <w:color w:val="000000"/>
+                <w:sz w:val="16"/>
+                <w:szCs w:val="16"/>
+              </w:rPr>
+              <w:t>Control &amp; Fuel Pump</w:t>
+            </w:r>
+          </w:p>
+        </w:tc>
+        <w:tc>
+          <w:tcPr>
+            <w:tcW w:w="1016" w:type="dxa"/>
+            <w:tcBorders>
+              <w:top w:val="single" w:sz="4" w:space="0" w:color="000000"/>
+              <w:left w:val="single" w:sz="4" w:space="0" w:color="000000"/>
+              <w:bottom w:val="single" w:sz="4" w:space="0" w:color="000000"/>
+            </w:tcBorders>
+            <w:vAlign w:val="bottom"/>
+          </w:tcPr>
+          <w:p>
+            <w:pPr>
+              <w:pStyle w:val="Normal"/>
+              <w:widowControl w:val="false"/>
+              <w:jc w:val="center"/>
+              <w:rPr>
+                <w:color w:val="000000"/>
+                <w:sz w:val="16"/>
+                <w:szCs w:val="16"/>
+              </w:rPr>
+            </w:pPr>
+            <w:r>
+              <w:rPr>
+                <w:color w:val="000000"/>
+                <w:sz w:val="16"/>
+                <w:szCs w:val="16"/>
+              </w:rPr>
+              <w:t>Brake</w:t>
+            </w:r>
+          </w:p>
+          <w:p>
+            <w:pPr>
+              <w:pStyle w:val="Normal"/>
+              <w:widowControl w:val="false"/>
+              <w:jc w:val="center"/>
+              <w:rPr>
+                <w:color w:val="000000"/>
+                <w:sz w:val="16"/>
+                <w:szCs w:val="16"/>
+              </w:rPr>
+            </w:pPr>
+            <w:r>
+              <w:rPr>
+                <w:color w:val="000000"/>
+                <w:sz w:val="16"/>
+                <w:szCs w:val="16"/>
+              </w:rPr>
+              <w:t>Cut-Out</w:t>
+            </w:r>
+          </w:p>
+        </w:tc>
+        <w:tc>
+          <w:tcPr>
+            <w:tcW w:w="1016" w:type="dxa"/>
+            <w:tcBorders>
+              <w:top w:val="single" w:sz="4" w:space="0" w:color="000000"/>
+              <w:left w:val="single" w:sz="4" w:space="0" w:color="000000"/>
+              <w:bottom w:val="single" w:sz="4" w:space="0" w:color="000000"/>
+            </w:tcBorders>
+            <w:vAlign w:val="bottom"/>
+          </w:tcPr>
+          <w:p>
+            <w:pPr>
+              <w:pStyle w:val="Normal"/>
+              <w:widowControl w:val="false"/>
+              <w:jc w:val="center"/>
+              <w:rPr>
+                <w:color w:val="000000"/>
+                <w:sz w:val="16"/>
+                <w:szCs w:val="16"/>
+              </w:rPr>
+            </w:pPr>
+            <w:r>
+              <w:rPr>
+                <w:color w:val="000000"/>
+                <w:sz w:val="16"/>
+                <w:szCs w:val="16"/>
+              </w:rPr>
+            </w:r>
+          </w:p>
+        </w:tc>
+        <w:tc>
+          <w:tcPr>
+            <w:tcW w:w="1017" w:type="dxa"/>
+            <w:tcBorders>
+              <w:top w:val="single" w:sz="4" w:space="0" w:color="000000"/>
+              <w:left w:val="single" w:sz="4" w:space="0" w:color="000000"/>
+              <w:bottom w:val="single" w:sz="4" w:space="0" w:color="000000"/>
+            </w:tcBorders>
+            <w:vAlign w:val="bottom"/>
+          </w:tcPr>
+          <w:p>
+            <w:pPr>
+              <w:pStyle w:val="Normal"/>
+              <w:widowControl w:val="false"/>
+              <w:jc w:val="center"/>
+              <w:rPr>
+                <w:color w:val="000000"/>
+                <w:sz w:val="16"/>
+                <w:szCs w:val="16"/>
+              </w:rPr>
+            </w:pPr>
+            <w:r>
+              <w:rPr>
+                <w:color w:val="000000"/>
+                <w:sz w:val="16"/>
+                <w:szCs w:val="16"/>
+              </w:rPr>
+            </w:r>
+          </w:p>
+        </w:tc>
+        <w:tc>
+          <w:tcPr>
+            <w:tcW w:w="1016" w:type="dxa"/>
+            <w:tcBorders>
+              <w:top w:val="single" w:sz="4" w:space="0" w:color="000000"/>
+              <w:left w:val="single" w:sz="4" w:space="0" w:color="000000"/>
+              <w:bottom w:val="single" w:sz="4" w:space="0" w:color="000000"/>
+            </w:tcBorders>
+            <w:vAlign w:val="bottom"/>
+          </w:tcPr>
+          <w:p>
+            <w:pPr>
+              <w:pStyle w:val="Normal"/>
+              <w:widowControl w:val="false"/>
+              <w:jc w:val="center"/>
+              <w:rPr>
+                <w:color w:val="000000"/>
+                <w:sz w:val="16"/>
+                <w:szCs w:val="16"/>
+              </w:rPr>
+            </w:pPr>
+            <w:r>
+              <w:rPr>
+                <w:rFonts w:eastAsia="arial" w:ascii="arial" w:hAnsi="arial"/>
+                <w:color w:val="000000"/>
+                <w:sz w:val="16"/>
+                <w:szCs w:val="16"/>
+              </w:rPr>
+              <w:t>Gauge Light Dw</w:t>
+            </w:r>
+          </w:p>
+        </w:tc>
+        <w:tc>
+          <w:tcPr>
+            <w:tcW w:w="1020" w:type="dxa"/>
+            <w:tcBorders>
+              <w:top w:val="single" w:sz="4" w:space="0" w:color="000000"/>
+              <w:left w:val="single" w:sz="4" w:space="0" w:color="000000"/>
+              <w:bottom w:val="single" w:sz="4" w:space="0" w:color="000000"/>
+            </w:tcBorders>
+            <w:vAlign w:val="bottom"/>
+          </w:tcPr>
+          <w:p>
+            <w:pPr>
+              <w:pStyle w:val="Normal"/>
+              <w:widowControl w:val="false"/>
+              <w:jc w:val="center"/>
+              <w:rPr>
+                <w:color w:val="000000"/>
+                <w:sz w:val="16"/>
+                <w:szCs w:val="16"/>
+              </w:rPr>
+            </w:pPr>
+            <w:r>
+              <w:rPr>
+                <w:rFonts w:eastAsia="arial" w:ascii="arial" w:hAnsi="arial"/>
+                <w:color w:val="000000"/>
+                <w:sz w:val="16"/>
+                <w:szCs w:val="16"/>
+              </w:rPr>
+              <w:t>HEP Off</w:t>
+            </w:r>
+          </w:p>
+        </w:tc>
+        <w:tc>
+          <w:tcPr>
+            <w:tcW w:w="1016" w:type="dxa"/>
+            <w:tcBorders>
+              <w:top w:val="single" w:sz="4" w:space="0" w:color="000000"/>
+              <w:left w:val="single" w:sz="4" w:space="0" w:color="000000"/>
+              <w:bottom w:val="single" w:sz="4" w:space="0" w:color="000000"/>
+            </w:tcBorders>
+            <w:vAlign w:val="bottom"/>
+          </w:tcPr>
+          <w:p>
+            <w:pPr>
+              <w:pStyle w:val="Normal"/>
+              <w:widowControl w:val="false"/>
+              <w:jc w:val="center"/>
+              <w:rPr>
+                <w:color w:val="000000"/>
+                <w:sz w:val="16"/>
+                <w:szCs w:val="16"/>
+              </w:rPr>
+            </w:pPr>
+            <w:r>
+              <w:rPr>
+                <w:rFonts w:eastAsia="arial" w:ascii="arial" w:hAnsi="arial"/>
+                <w:color w:val="000000"/>
+                <w:sz w:val="16"/>
+                <w:szCs w:val="16"/>
+              </w:rPr>
+              <w:t>Marker Light</w:t>
+            </w:r>
+          </w:p>
+        </w:tc>
+        <w:tc>
+          <w:tcPr>
+            <w:tcW w:w="1016" w:type="dxa"/>
+            <w:tcBorders>
+              <w:top w:val="single" w:sz="4" w:space="0" w:color="000000"/>
+              <w:left w:val="single" w:sz="4" w:space="0" w:color="000000"/>
+              <w:bottom w:val="single" w:sz="4" w:space="0" w:color="000000"/>
+            </w:tcBorders>
+            <w:vAlign w:val="bottom"/>
+          </w:tcPr>
+          <w:p>
+            <w:pPr>
+              <w:pStyle w:val="Normal"/>
+              <w:widowControl w:val="false"/>
+              <w:spacing w:lineRule="auto" w:line="180"/>
+              <w:jc w:val="center"/>
+              <w:rPr>
+                <w:sz w:val="16"/>
+                <w:szCs w:val="16"/>
+              </w:rPr>
+            </w:pPr>
+            <w:r>
+              <w:rPr>
+                <w:rFonts w:eastAsia="arial" w:ascii="arial" w:hAnsi="arial"/>
+                <w:color w:val="000000"/>
+                <w:sz w:val="16"/>
+                <w:szCs w:val="16"/>
+              </w:rPr>
+              <w:t>Crossing Light</w:t>
+            </w:r>
+          </w:p>
+        </w:tc>
+        <w:tc>
+          <w:tcPr>
+            <w:tcW w:w="1016" w:type="dxa"/>
+            <w:tcBorders>
+              <w:top w:val="single" w:sz="4" w:space="0" w:color="000000"/>
+              <w:left w:val="single" w:sz="4" w:space="0" w:color="000000"/>
+              <w:bottom w:val="single" w:sz="4" w:space="0" w:color="000000"/>
+            </w:tcBorders>
+            <w:vAlign w:val="bottom"/>
+          </w:tcPr>
+          <w:p>
+            <w:pPr>
+              <w:pStyle w:val="Normal"/>
+              <w:widowControl w:val="false"/>
+              <w:spacing w:lineRule="auto" w:line="180"/>
+              <w:jc w:val="center"/>
+              <w:rPr>
+                <w:sz w:val="16"/>
+                <w:szCs w:val="16"/>
+              </w:rPr>
+            </w:pPr>
+            <w:r>
+              <w:rPr>
+                <w:rFonts w:eastAsia="arial" w:ascii="arial" w:hAnsi="arial"/>
+                <w:color w:val="000000"/>
+                <w:sz w:val="16"/>
+                <w:szCs w:val="16"/>
+              </w:rPr>
+              <w:t>Exterior</w:t>
+            </w:r>
+          </w:p>
+          <w:p>
+            <w:pPr>
+              <w:pStyle w:val="Normal"/>
+              <w:widowControl w:val="false"/>
+              <w:spacing w:lineRule="auto" w:line="180"/>
+              <w:jc w:val="center"/>
+              <w:rPr>
+                <w:sz w:val="16"/>
+                <w:szCs w:val="16"/>
+              </w:rPr>
+            </w:pPr>
+            <w:r>
+              <w:rPr>
+                <w:rFonts w:eastAsia="arial" w:ascii="arial" w:hAnsi="arial"/>
+                <w:color w:val="000000"/>
+                <w:sz w:val="16"/>
+                <w:szCs w:val="16"/>
+              </w:rPr>
+              <w:t>Camera</w:t>
+            </w:r>
+          </w:p>
+        </w:tc>
+        <w:tc>
+          <w:tcPr>
+            <w:tcW w:w="1029" w:type="dxa"/>
+            <w:tcBorders>
+              <w:top w:val="single" w:sz="4" w:space="0" w:color="000000"/>
+              <w:left w:val="single" w:sz="4" w:space="0" w:color="000000"/>
+              <w:bottom w:val="single" w:sz="4" w:space="0" w:color="000000"/>
+              <w:right w:val="single" w:sz="4" w:space="0" w:color="000000"/>
+            </w:tcBorders>
+            <w:vAlign w:val="bottom"/>
+          </w:tcPr>
+          <w:p>
+            <w:pPr>
+              <w:pStyle w:val="Normal"/>
+              <w:widowControl w:val="false"/>
+              <w:spacing w:lineRule="auto" w:line="180"/>
+              <w:jc w:val="center"/>
+              <w:rPr>
+                <w:sz w:val="16"/>
+                <w:szCs w:val="16"/>
+              </w:rPr>
+            </w:pPr>
+            <w:r>
+              <w:rPr>
+                <w:rFonts w:eastAsia="arial" w:ascii="arial" w:hAnsi="arial"/>
+                <w:color w:val="000000"/>
+                <w:sz w:val="16"/>
+                <w:szCs w:val="16"/>
+              </w:rPr>
+              <w:t>Prev</w:t>
+            </w:r>
+          </w:p>
+          <w:p>
+            <w:pPr>
+              <w:pStyle w:val="Normal"/>
+              <w:widowControl w:val="false"/>
+              <w:spacing w:lineRule="auto" w:line="180"/>
+              <w:jc w:val="center"/>
+              <w:rPr>
+                <w:sz w:val="16"/>
+                <w:szCs w:val="16"/>
+              </w:rPr>
+            </w:pPr>
+            <w:r>
+              <w:rPr>
+                <w:rFonts w:eastAsia="arial" w:ascii="arial" w:hAnsi="arial"/>
+                <w:color w:val="000000"/>
+                <w:sz w:val="16"/>
+                <w:szCs w:val="16"/>
+              </w:rPr>
+              <w:t>Cab Cam</w:t>
+            </w:r>
+          </w:p>
+        </w:tc>
+      </w:tr>
+    </w:tbl>
+    <w:p>
+      <w:pPr>
+        <w:pStyle w:val="Normal"/>
+        <w:rPr>
+          <w:color w:val="000000"/>
+          <w:sz w:val="16"/>
+          <w:szCs w:val="16"/>
+        </w:rPr>
+      </w:pPr>
+      <w:r>
+        <w:rPr>
+          <w:color w:val="000000"/>
+          <w:sz w:val="16"/>
+          <w:szCs w:val="16"/>
+        </w:rPr>
+      </w:r>
+    </w:p>
+    <w:p>
+      <w:pPr>
+        <w:pStyle w:val="Normal"/>
+        <w:rPr>
+          <w:color w:val="000000"/>
+          <w:sz w:val="16"/>
+          <w:szCs w:val="16"/>
+        </w:rPr>
+      </w:pPr>
+      <w:r>
+        <w:rPr>
+          <w:color w:val="000000"/>
+          <w:sz w:val="16"/>
+          <w:szCs w:val="16"/>
+        </w:rPr>
+        <w:tab/>
+        <w:t xml:space="preserve">       </w:t>
+      </w:r>
+      <w:r>
+        <w:rPr>
+          <w:rFonts w:eastAsia="arial" w:ascii="arial" w:hAnsi="arial"/>
+          <w:color w:val="000000"/>
+          <w:sz w:val="16"/>
+          <w:szCs w:val="16"/>
+        </w:rPr>
+        <w:t xml:space="preserve">    MP36PH-3C-1</w:t>
+      </w:r>
+    </w:p>
+    <w:tbl>
+      <w:tblPr>
+        <w:tblW w:w="14248" w:type="dxa"/>
+        <w:jc w:val="left"/>
+        <w:tblInd w:w="-5" w:type="dxa"/>
+        <w:tblLayout w:type="fixed"/>
+        <w:tblCellMar>
+          <w:top w:w="0" w:type="dxa"/>
+          <w:left w:w="108" w:type="dxa"/>
+          <w:bottom w:w="0" w:type="dxa"/>
+          <w:right w:w="108" w:type="dxa"/>
+        </w:tblCellMar>
+        <w:tblLook w:firstRow="1" w:noVBand="1" w:lastRow="0" w:firstColumn="1" w:lastColumn="0" w:noHBand="0" w:val="04a0"/>
+      </w:tblPr>
+      <w:tblGrid>
+        <w:gridCol w:w="1017"/>
+        <w:gridCol w:w="1019"/>
+        <w:gridCol w:w="1014"/>
+        <w:gridCol w:w="1016"/>
+        <w:gridCol w:w="1020"/>
+        <w:gridCol w:w="1016"/>
+        <w:gridCol w:w="1016"/>
+        <w:gridCol w:w="1017"/>
+        <w:gridCol w:w="1016"/>
+        <w:gridCol w:w="1020"/>
+        <w:gridCol w:w="1016"/>
+        <w:gridCol w:w="1016"/>
+        <w:gridCol w:w="1016"/>
+        <w:gridCol w:w="1029"/>
+      </w:tblGrid>
+      <w:tr>
+        <w:trPr>
+          <w:trHeight w:val="440" w:hRule="exact"/>
+          <w:cantSplit w:val="true"/>
+        </w:trPr>
+        <w:tc>
+          <w:tcPr>
+            <w:tcW w:w="1017" w:type="dxa"/>
+            <w:tcBorders>
+              <w:top w:val="single" w:sz="4" w:space="0" w:color="000000"/>
+              <w:left w:val="single" w:sz="4" w:space="0" w:color="000000"/>
+              <w:bottom w:val="single" w:sz="4" w:space="0" w:color="000000"/>
+            </w:tcBorders>
+            <w:vAlign w:val="bottom"/>
+          </w:tcPr>
+          <w:p>
+            <w:pPr>
+              <w:pStyle w:val="Normal"/>
+              <w:widowControl w:val="false"/>
+              <w:spacing w:lineRule="auto" w:line="180" w:before="0" w:after="60"/>
+              <w:jc w:val="center"/>
+              <w:rPr>
+                <w:color w:val="000000"/>
+                <w:sz w:val="16"/>
+                <w:szCs w:val="16"/>
+              </w:rPr>
+            </w:pPr>
+            <w:r>
+              <w:rPr>
+                <w:rFonts w:eastAsia="arial" w:ascii="arial" w:hAnsi="arial"/>
+                <w:b/>
+                <w:color w:val="000000"/>
+                <w:sz w:val="16"/>
+                <w:szCs w:val="16"/>
+              </w:rPr>
+              <w:t>Pause</w:t>
+            </w:r>
+          </w:p>
+        </w:tc>
+        <w:tc>
+          <w:tcPr>
+            <w:tcW w:w="1019" w:type="dxa"/>
+            <w:tcBorders>
+              <w:top w:val="single" w:sz="4" w:space="0" w:color="000000"/>
+              <w:left w:val="single" w:sz="4" w:space="0" w:color="000000"/>
+              <w:bottom w:val="single" w:sz="4" w:space="0" w:color="000000"/>
+            </w:tcBorders>
+            <w:vAlign w:val="bottom"/>
+          </w:tcPr>
+          <w:p>
+            <w:pPr>
+              <w:pStyle w:val="Normal"/>
+              <w:widowControl w:val="false"/>
+              <w:spacing w:lineRule="auto" w:line="180"/>
+              <w:jc w:val="center"/>
+              <w:rPr>
+                <w:color w:val="000000"/>
+                <w:sz w:val="16"/>
+                <w:szCs w:val="16"/>
+              </w:rPr>
+            </w:pPr>
+            <w:r>
+              <w:rPr>
+                <w:color w:val="000000"/>
+                <w:sz w:val="16"/>
+                <w:szCs w:val="16"/>
+              </w:rPr>
+              <w:t>Reverser Handle</w:t>
+            </w:r>
+          </w:p>
+        </w:tc>
+        <w:tc>
+          <w:tcPr>
+            <w:tcW w:w="1014" w:type="dxa"/>
+            <w:tcBorders>
+              <w:top w:val="single" w:sz="4" w:space="0" w:color="000000"/>
+              <w:left w:val="single" w:sz="4" w:space="0" w:color="000000"/>
+              <w:bottom w:val="single" w:sz="4" w:space="0" w:color="000000"/>
+            </w:tcBorders>
+            <w:vAlign w:val="bottom"/>
+          </w:tcPr>
+          <w:p>
+            <w:pPr>
+              <w:pStyle w:val="Normal"/>
+              <w:widowControl w:val="false"/>
+              <w:jc w:val="center"/>
+              <w:rPr>
+                <w:rFonts w:ascii="arial" w:hAnsi="arial" w:eastAsia="arial"/>
+                <w:color w:val="000000"/>
+                <w:sz w:val="16"/>
+                <w:szCs w:val="16"/>
+              </w:rPr>
+            </w:pPr>
+            <w:r>
+              <w:rPr>
+                <w:rFonts w:eastAsia="arial" w:ascii="arial" w:hAnsi="arial"/>
+                <w:color w:val="000000"/>
+                <w:sz w:val="16"/>
+                <w:szCs w:val="16"/>
+              </w:rPr>
+              <w:t>Engine Start</w:t>
+            </w:r>
+          </w:p>
+        </w:tc>
+        <w:tc>
+          <w:tcPr>
+            <w:tcW w:w="1016" w:type="dxa"/>
+            <w:tcBorders>
+              <w:top w:val="single" w:sz="4" w:space="0" w:color="000000"/>
+              <w:left w:val="single" w:sz="4" w:space="0" w:color="000000"/>
+              <w:bottom w:val="single" w:sz="4" w:space="0" w:color="000000"/>
+            </w:tcBorders>
+            <w:vAlign w:val="bottom"/>
+          </w:tcPr>
+          <w:p>
+            <w:pPr>
+              <w:pStyle w:val="Normal"/>
+              <w:widowControl w:val="false"/>
+              <w:spacing w:lineRule="auto" w:line="180"/>
+              <w:jc w:val="center"/>
+              <w:rPr>
+                <w:color w:val="000000"/>
+                <w:sz w:val="16"/>
+                <w:szCs w:val="16"/>
+              </w:rPr>
+            </w:pPr>
+            <w:r>
+              <w:rPr>
+                <w:color w:val="000000"/>
+                <w:sz w:val="16"/>
+                <w:szCs w:val="16"/>
+              </w:rPr>
+              <w:t>Engine Run</w:t>
+            </w:r>
+          </w:p>
+        </w:tc>
+        <w:tc>
+          <w:tcPr>
+            <w:tcW w:w="1020" w:type="dxa"/>
+            <w:tcBorders>
+              <w:top w:val="single" w:sz="4" w:space="0" w:color="000000"/>
+              <w:left w:val="single" w:sz="4" w:space="0" w:color="000000"/>
+              <w:bottom w:val="single" w:sz="4" w:space="0" w:color="000000"/>
+            </w:tcBorders>
+            <w:vAlign w:val="bottom"/>
+          </w:tcPr>
+          <w:p>
+            <w:pPr>
+              <w:pStyle w:val="Normal"/>
+              <w:widowControl w:val="false"/>
+              <w:spacing w:lineRule="auto" w:line="180"/>
+              <w:jc w:val="center"/>
+              <w:rPr>
+                <w:color w:val="000000"/>
+                <w:sz w:val="16"/>
+                <w:szCs w:val="16"/>
+              </w:rPr>
+            </w:pPr>
+            <w:r>
+              <w:rPr>
+                <w:color w:val="000000"/>
+                <w:sz w:val="16"/>
+                <w:szCs w:val="16"/>
+              </w:rPr>
+              <w:t>Generator Field</w:t>
+            </w:r>
+          </w:p>
+        </w:tc>
+        <w:tc>
+          <w:tcPr>
+            <w:tcW w:w="1016" w:type="dxa"/>
+            <w:tcBorders>
+              <w:top w:val="single" w:sz="4" w:space="0" w:color="000000"/>
+              <w:left w:val="single" w:sz="4" w:space="0" w:color="000000"/>
+              <w:bottom w:val="single" w:sz="4" w:space="0" w:color="000000"/>
+            </w:tcBorders>
+            <w:vAlign w:val="bottom"/>
+          </w:tcPr>
+          <w:p>
+            <w:pPr>
+              <w:pStyle w:val="Normal"/>
+              <w:widowControl w:val="false"/>
+              <w:jc w:val="center"/>
+              <w:rPr>
+                <w:color w:val="000000"/>
+                <w:sz w:val="16"/>
+                <w:szCs w:val="16"/>
+              </w:rPr>
+            </w:pPr>
+            <w:r>
+              <w:rPr>
+                <w:color w:val="000000"/>
+                <w:sz w:val="16"/>
+                <w:szCs w:val="16"/>
+              </w:rPr>
+              <w:t>Brake</w:t>
+            </w:r>
+          </w:p>
+          <w:p>
+            <w:pPr>
+              <w:pStyle w:val="Normal"/>
+              <w:widowControl w:val="false"/>
+              <w:jc w:val="center"/>
+              <w:rPr>
+                <w:color w:val="000000"/>
+                <w:sz w:val="16"/>
+                <w:szCs w:val="16"/>
+              </w:rPr>
+            </w:pPr>
+            <w:r>
+              <w:rPr>
+                <w:color w:val="000000"/>
+                <w:sz w:val="16"/>
+                <w:szCs w:val="16"/>
+              </w:rPr>
               <w:t>Cut-</w:t>
             </w:r>
             <w:r>
@@ -17382,7 +18521,28 @@
               </w:rPr>
             </w:pPr>
             <w:r>
-              <w:rPr/>
+              <w:rPr>
+                <w:color w:val="000000"/>
+                <w:sz w:val="16"/>
+                <w:szCs w:val="16"/>
+              </w:rPr>
+              <w:t xml:space="preserve">HEP </w:t>
+            </w:r>
+            <w:r>
+              <w:rPr>
+                <w:color w:val="000000"/>
+                <w:sz w:val="16"/>
+                <w:szCs w:val="16"/>
+              </w:rPr>
+              <w:t>Run</w:t>
+            </w:r>
+            <w:r>
+              <w:rPr>
+                <w:color w:val="000000"/>
+                <w:sz w:val="16"/>
+                <w:szCs w:val="16"/>
+              </w:rPr>
+              <w:t>/Start</w:t>
             </w:r>
           </w:p>
         </w:tc>
@@ -17408,39 +18568,42 @@
               </w:rPr>
             </w:pPr>
             <w:r>
-              <w:rPr/>
-            </w:r>
-          </w:p>
-        </w:tc>
-        <w:tc>
-          <w:tcPr>
-            <w:tcW w:w="1016" w:type="dxa"/>
-            <w:tcBorders>
-              <w:top w:val="single" w:sz="4" w:space="0" w:color="000000"/>
-              <w:left w:val="single" w:sz="4" w:space="0" w:color="000000"/>
-              <w:bottom w:val="single" w:sz="4" w:space="0" w:color="000000"/>
-            </w:tcBorders>
-            <w:vAlign w:val="bottom"/>
-          </w:tcPr>
-          <w:p>
-            <w:pPr>
-              <w:pStyle w:val="Normal"/>
-              <w:widowControl w:val="false"/>
-              <w:jc w:val="center"/>
-              <w:rPr>
-                <w:color w:val="000000"/>
-                <w:sz w:val="16"/>
-                <w:szCs w:val="16"/>
-              </w:rPr>
-            </w:pPr>
-            <w:r>
-              <w:rPr>
-                <w:rFonts w:eastAsia="arial" w:ascii="arial" w:hAnsi="arial"/>
-                <w:color w:val="000000"/>
-                <w:sz w:val="16"/>
-                <w:szCs w:val="16"/>
-              </w:rPr>
-              <w:t>Gauge Light Up</w:t>
+              <w:rPr>
+                <w:rFonts w:eastAsia="arial" w:ascii="arial" w:hAnsi="arial"/>
+                <w:color w:val="000000"/>
+                <w:sz w:val="16"/>
+                <w:szCs w:val="16"/>
+              </w:rPr>
+              <w:t>Isolation Run</w:t>
+            </w:r>
+          </w:p>
+        </w:tc>
+        <w:tc>
+          <w:tcPr>
+            <w:tcW w:w="1016" w:type="dxa"/>
+            <w:tcBorders>
+              <w:top w:val="single" w:sz="4" w:space="0" w:color="000000"/>
+              <w:left w:val="single" w:sz="4" w:space="0" w:color="000000"/>
+              <w:bottom w:val="single" w:sz="4" w:space="0" w:color="000000"/>
+            </w:tcBorders>
+            <w:vAlign w:val="bottom"/>
+          </w:tcPr>
+          <w:p>
+            <w:pPr>
+              <w:pStyle w:val="Normal"/>
+              <w:widowControl w:val="false"/>
+              <w:jc w:val="center"/>
+              <w:rPr>
+                <w:sz w:val="16"/>
+                <w:szCs w:val="16"/>
+              </w:rPr>
+            </w:pPr>
+            <w:r>
+              <w:rPr>
+                <w:sz w:val="16"/>
+                <w:szCs w:val="16"/>
+              </w:rPr>
+              <w:t>Rear HL Up</w:t>
             </w:r>
           </w:p>
         </w:tc>
@@ -17531,8 +18694,6 @@
             </w:pPr>
             <w:r>
               <w:rPr>
-                <w:rFonts w:eastAsia="arial" w:ascii="arial" w:hAnsi="arial"/>
-                <w:color w:val="000000"/>
                 <w:sz w:val="16"/>
                 <w:szCs w:val="16"/>
               </w:rPr>
@@ -17673,7 +18834,7 @@
           <w:sz w:val="16"/>
           <w:szCs w:val="16"/>
         </w:rPr>
-        <w:t>Gallery Cab Car</w:t>
+        <w:t>MP36PH-3C</w:t>
       </w:r>
       <w:r>
         <w:rPr>
@@ -17808,7 +18969,13 @@
               </w:rPr>
             </w:pPr>
             <w:r>
-              <w:rPr/>
+              <w:rPr>
+                <w:rFonts w:eastAsia="arial" w:ascii="arial" w:hAnsi="arial"/>
+                <w:color w:val="000000"/>
+                <w:sz w:val="16"/>
+                <w:szCs w:val="16"/>
+              </w:rPr>
+              <w:t>Engine Stop</w:t>
             </w:r>
           </w:p>
         </w:tc>
@@ -17957,7 +19124,31 @@
               </w:rPr>
             </w:pPr>
             <w:r>
-              <w:rPr/>
+              <w:rPr>
+                <w:rFonts w:eastAsia="arial" w:ascii="arial" w:hAnsi="arial"/>
+                <w:color w:val="000000"/>
+                <w:sz w:val="16"/>
+                <w:szCs w:val="16"/>
+              </w:rPr>
+              <w:t xml:space="preserve">HEP </w:t>
+            </w:r>
+            <w:r>
+              <w:rPr>
+                <w:rFonts w:eastAsia="arial" w:ascii="arial" w:hAnsi="arial"/>
+                <w:color w:val="000000"/>
+                <w:sz w:val="16"/>
+                <w:szCs w:val="16"/>
+              </w:rPr>
+              <w:t>Iso.</w:t>
+            </w:r>
+            <w:r>
+              <w:rPr>
+                <w:rFonts w:eastAsia="arial" w:ascii="arial" w:hAnsi="arial"/>
+                <w:color w:val="000000"/>
+                <w:sz w:val="16"/>
+                <w:szCs w:val="16"/>
+              </w:rPr>
+              <w:t>/Stop</w:t>
             </w:r>
           </w:p>
         </w:tc>
@@ -17983,39 +19174,44 @@
               </w:rPr>
             </w:pPr>
             <w:r>
-              <w:rPr/>
-            </w:r>
-          </w:p>
-        </w:tc>
-        <w:tc>
-          <w:tcPr>
-            <w:tcW w:w="1016" w:type="dxa"/>
-            <w:tcBorders>
-              <w:top w:val="single" w:sz="4" w:space="0" w:color="000000"/>
-              <w:left w:val="single" w:sz="4" w:space="0" w:color="000000"/>
-              <w:bottom w:val="single" w:sz="4" w:space="0" w:color="000000"/>
-            </w:tcBorders>
-            <w:vAlign w:val="bottom"/>
-          </w:tcPr>
-          <w:p>
-            <w:pPr>
-              <w:pStyle w:val="Normal"/>
-              <w:widowControl w:val="false"/>
-              <w:jc w:val="center"/>
-              <w:rPr>
-                <w:color w:val="000000"/>
-                <w:sz w:val="16"/>
-                <w:szCs w:val="16"/>
-              </w:rPr>
-            </w:pPr>
-            <w:r>
-              <w:rPr>
-                <w:rFonts w:eastAsia="arial" w:ascii="arial" w:hAnsi="arial"/>
-                <w:color w:val="000000"/>
-                <w:sz w:val="16"/>
-                <w:szCs w:val="16"/>
-              </w:rPr>
-              <w:t>Gauge Light Dw</w:t>
+              <w:rPr>
+                <w:rFonts w:eastAsia="arial" w:ascii="arial" w:hAnsi="arial"/>
+                <w:color w:val="000000"/>
+                <w:sz w:val="16"/>
+                <w:szCs w:val="16"/>
+              </w:rPr>
+              <w:t>Isolation Start Iso.</w:t>
+            </w:r>
+          </w:p>
+        </w:tc>
+        <w:tc>
+          <w:tcPr>
+            <w:tcW w:w="1016" w:type="dxa"/>
+            <w:tcBorders>
+              <w:top w:val="single" w:sz="4" w:space="0" w:color="000000"/>
+              <w:left w:val="single" w:sz="4" w:space="0" w:color="000000"/>
+              <w:bottom w:val="single" w:sz="4" w:space="0" w:color="000000"/>
+            </w:tcBorders>
+            <w:vAlign w:val="bottom"/>
+          </w:tcPr>
+          <w:p>
+            <w:pPr>
+              <w:pStyle w:val="Normal"/>
+              <w:widowControl w:val="false"/>
+              <w:jc w:val="center"/>
+              <w:rPr>
+                <w:sz w:val="16"/>
+                <w:szCs w:val="16"/>
+              </w:rPr>
+            </w:pPr>
+            <w:r>
+              <w:rPr>
+                <w:rFonts w:eastAsia="arial" w:ascii="arial" w:hAnsi="arial"/>
+                <w:color w:val="000000"/>
+                <w:sz w:val="16"/>
+                <w:szCs w:val="16"/>
+              </w:rPr>
+              <w:t>Rear HL Down</w:t>
             </w:r>
           </w:p>
         </w:tc>
@@ -18065,53 +19261,58 @@
             <w:pPr>
               <w:pStyle w:val="Normal"/>
               <w:widowControl w:val="false"/>
-              <w:jc w:val="center"/>
-              <w:rPr>
-                <w:color w:val="000000"/>
-                <w:sz w:val="16"/>
-                <w:szCs w:val="16"/>
-              </w:rPr>
-            </w:pPr>
-            <w:r>
-              <w:rPr>
-                <w:rFonts w:eastAsia="arial" w:ascii="arial" w:hAnsi="arial"/>
-                <w:color w:val="000000"/>
-                <w:sz w:val="16"/>
-                <w:szCs w:val="16"/>
-              </w:rPr>
-              <w:t>Marker Light</w:t>
-            </w:r>
-          </w:p>
-        </w:tc>
-        <w:tc>
-          <w:tcPr>
-            <w:tcW w:w="1016" w:type="dxa"/>
-            <w:tcBorders>
-              <w:top w:val="single" w:sz="4" w:space="0" w:color="000000"/>
-              <w:left w:val="single" w:sz="4" w:space="0" w:color="000000"/>
-              <w:bottom w:val="single" w:sz="4" w:space="0" w:color="000000"/>
-            </w:tcBorders>
-            <w:vAlign w:val="bottom"/>
-          </w:tcPr>
-          <w:p>
-            <w:pPr>
-              <w:pStyle w:val="Normal"/>
-              <w:widowControl w:val="false"/>
-              <w:spacing w:lineRule="auto" w:line="180"/>
-              <w:jc w:val="center"/>
-              <w:rPr>
-                <w:sz w:val="16"/>
-                <w:szCs w:val="16"/>
-              </w:rPr>
-            </w:pPr>
-            <w:r>
-              <w:rPr>
-                <w:rFonts w:eastAsia="arial" w:ascii="arial" w:hAnsi="arial"/>
-                <w:color w:val="000000"/>
-                <w:sz w:val="16"/>
-                <w:szCs w:val="16"/>
-              </w:rPr>
-              <w:t>Crossing Light</w:t>
+              <w:spacing w:lineRule="auto" w:line="180"/>
+              <w:jc w:val="center"/>
+              <w:rPr>
+                <w:sz w:val="16"/>
+                <w:szCs w:val="16"/>
+              </w:rPr>
+            </w:pPr>
+            <w:r>
+              <w:rPr>
+                <w:rFonts w:eastAsia="arial" w:ascii="arial" w:hAnsi="arial"/>
+                <w:color w:val="000000"/>
+                <w:sz w:val="16"/>
+                <w:szCs w:val="16"/>
+              </w:rPr>
+              <w:t>(CT) HEP Start/Stop</w:t>
+            </w:r>
+          </w:p>
+        </w:tc>
+        <w:tc>
+          <w:tcPr>
+            <w:tcW w:w="1016" w:type="dxa"/>
+            <w:tcBorders>
+              <w:top w:val="single" w:sz="4" w:space="0" w:color="000000"/>
+              <w:left w:val="single" w:sz="4" w:space="0" w:color="000000"/>
+              <w:bottom w:val="single" w:sz="4" w:space="0" w:color="000000"/>
+            </w:tcBorders>
+            <w:vAlign w:val="bottom"/>
+          </w:tcPr>
+          <w:p>
+            <w:pPr>
+              <w:pStyle w:val="Normal"/>
+              <w:widowControl w:val="false"/>
+              <w:spacing w:lineRule="auto" w:line="180"/>
+              <w:jc w:val="center"/>
+              <w:rPr>
+                <w:sz w:val="16"/>
+                <w:szCs w:val="16"/>
+              </w:rPr>
+            </w:pPr>
+            <w:r>
+              <w:rPr>
+                <w:sz w:val="16"/>
+                <w:szCs w:val="16"/>
+              </w:rPr>
+              <w:t>Marker</w:t>
+            </w:r>
+            <w:r>
+              <w:rPr>
+                <w:sz w:val="16"/>
+                <w:szCs w:val="16"/>
+              </w:rPr>
+              <w:t xml:space="preserve"> Light</w:t>
             </w:r>
           </w:p>
         </w:tc>
@@ -18235,6 +19436,1188 @@
       </w:pPr>
       <w:r>
         <w:rPr>
+          <w:rFonts w:eastAsia="arial" w:ascii="arial" w:hAnsi="arial"/>
+          <w:color w:val="000000"/>
+          <w:sz w:val="16"/>
+          <w:szCs w:val="16"/>
+        </w:rPr>
+      </w:r>
+    </w:p>
+    <w:p>
+      <w:pPr>
+        <w:pStyle w:val="Normal"/>
+        <w:rPr>
+          <w:color w:val="000000"/>
+          <w:sz w:val="16"/>
+          <w:szCs w:val="16"/>
+        </w:rPr>
+      </w:pPr>
+      <w:r>
+        <w:rPr>
+          <w:color w:val="000000"/>
+          <w:sz w:val="16"/>
+          <w:szCs w:val="16"/>
+        </w:rPr>
+        <w:tab/>
+        <w:t xml:space="preserve">       </w:t>
+      </w:r>
+      <w:r>
+        <w:rPr>
+          <w:rFonts w:eastAsia="arial" w:ascii="arial" w:hAnsi="arial"/>
+          <w:color w:val="000000"/>
+          <w:sz w:val="16"/>
+          <w:szCs w:val="16"/>
+        </w:rPr>
+        <w:t xml:space="preserve">    </w:t>
+      </w:r>
+      <w:r>
+        <w:rPr>
+          <w:rFonts w:eastAsia="arial" w:ascii="arial" w:hAnsi="arial"/>
+          <w:color w:val="000000"/>
+          <w:sz w:val="16"/>
+          <w:szCs w:val="16"/>
+        </w:rPr>
+        <w:t>Bombardier Bi-level Cab Car</w:t>
+      </w:r>
+      <w:r>
+        <w:rPr>
+          <w:rFonts w:eastAsia="arial" w:ascii="arial" w:hAnsi="arial"/>
+          <w:color w:val="000000"/>
+          <w:sz w:val="16"/>
+          <w:szCs w:val="16"/>
+        </w:rPr>
+        <w:t>-1</w:t>
+      </w:r>
+    </w:p>
+    <w:tbl>
+      <w:tblPr>
+        <w:tblW w:w="14248" w:type="dxa"/>
+        <w:jc w:val="left"/>
+        <w:tblInd w:w="-5" w:type="dxa"/>
+        <w:tblLayout w:type="fixed"/>
+        <w:tblCellMar>
+          <w:top w:w="0" w:type="dxa"/>
+          <w:left w:w="108" w:type="dxa"/>
+          <w:bottom w:w="0" w:type="dxa"/>
+          <w:right w:w="108" w:type="dxa"/>
+        </w:tblCellMar>
+        <w:tblLook w:firstRow="1" w:noVBand="1" w:lastRow="0" w:firstColumn="1" w:lastColumn="0" w:noHBand="0" w:val="04a0"/>
+      </w:tblPr>
+      <w:tblGrid>
+        <w:gridCol w:w="1017"/>
+        <w:gridCol w:w="1019"/>
+        <w:gridCol w:w="1014"/>
+        <w:gridCol w:w="1016"/>
+        <w:gridCol w:w="1020"/>
+        <w:gridCol w:w="1016"/>
+        <w:gridCol w:w="1016"/>
+        <w:gridCol w:w="1017"/>
+        <w:gridCol w:w="1016"/>
+        <w:gridCol w:w="1020"/>
+        <w:gridCol w:w="1016"/>
+        <w:gridCol w:w="1016"/>
+        <w:gridCol w:w="1016"/>
+        <w:gridCol w:w="1029"/>
+      </w:tblGrid>
+      <w:tr>
+        <w:trPr>
+          <w:trHeight w:val="440" w:hRule="exact"/>
+          <w:cantSplit w:val="true"/>
+        </w:trPr>
+        <w:tc>
+          <w:tcPr>
+            <w:tcW w:w="1017" w:type="dxa"/>
+            <w:tcBorders>
+              <w:top w:val="single" w:sz="4" w:space="0" w:color="000000"/>
+              <w:left w:val="single" w:sz="4" w:space="0" w:color="000000"/>
+              <w:bottom w:val="single" w:sz="4" w:space="0" w:color="000000"/>
+            </w:tcBorders>
+            <w:vAlign w:val="bottom"/>
+          </w:tcPr>
+          <w:p>
+            <w:pPr>
+              <w:pStyle w:val="Normal"/>
+              <w:widowControl w:val="false"/>
+              <w:spacing w:lineRule="auto" w:line="180" w:before="0" w:after="60"/>
+              <w:jc w:val="center"/>
+              <w:rPr>
+                <w:color w:val="000000"/>
+                <w:sz w:val="16"/>
+                <w:szCs w:val="16"/>
+              </w:rPr>
+            </w:pPr>
+            <w:r>
+              <w:rPr>
+                <w:rFonts w:eastAsia="arial" w:ascii="arial" w:hAnsi="arial"/>
+                <w:b/>
+                <w:color w:val="000000"/>
+                <w:sz w:val="16"/>
+                <w:szCs w:val="16"/>
+              </w:rPr>
+              <w:t>Pause</w:t>
+            </w:r>
+          </w:p>
+        </w:tc>
+        <w:tc>
+          <w:tcPr>
+            <w:tcW w:w="1019" w:type="dxa"/>
+            <w:tcBorders>
+              <w:top w:val="single" w:sz="4" w:space="0" w:color="000000"/>
+              <w:left w:val="single" w:sz="4" w:space="0" w:color="000000"/>
+              <w:bottom w:val="single" w:sz="4" w:space="0" w:color="000000"/>
+            </w:tcBorders>
+            <w:vAlign w:val="bottom"/>
+          </w:tcPr>
+          <w:p>
+            <w:pPr>
+              <w:pStyle w:val="Normal"/>
+              <w:widowControl w:val="false"/>
+              <w:spacing w:lineRule="auto" w:line="180"/>
+              <w:jc w:val="center"/>
+              <w:rPr>
+                <w:color w:val="000000"/>
+                <w:sz w:val="16"/>
+                <w:szCs w:val="16"/>
+              </w:rPr>
+            </w:pPr>
+            <w:r>
+              <w:rPr>
+                <w:color w:val="000000"/>
+                <w:sz w:val="16"/>
+                <w:szCs w:val="16"/>
+              </w:rPr>
+              <w:t>Reverser Handle</w:t>
+            </w:r>
+          </w:p>
+        </w:tc>
+        <w:tc>
+          <w:tcPr>
+            <w:tcW w:w="1014" w:type="dxa"/>
+            <w:tcBorders>
+              <w:top w:val="single" w:sz="4" w:space="0" w:color="000000"/>
+              <w:left w:val="single" w:sz="4" w:space="0" w:color="000000"/>
+              <w:bottom w:val="single" w:sz="4" w:space="0" w:color="000000"/>
+            </w:tcBorders>
+            <w:vAlign w:val="bottom"/>
+          </w:tcPr>
+          <w:p>
+            <w:pPr>
+              <w:pStyle w:val="Normal"/>
+              <w:widowControl w:val="false"/>
+              <w:jc w:val="center"/>
+              <w:rPr>
+                <w:rFonts w:ascii="arial" w:hAnsi="arial" w:eastAsia="arial"/>
+                <w:color w:val="000000"/>
+                <w:sz w:val="16"/>
+                <w:szCs w:val="16"/>
+              </w:rPr>
+            </w:pPr>
+            <w:r>
+              <w:rPr>
+                <w:rFonts w:eastAsia="arial" w:ascii="arial" w:hAnsi="arial"/>
+                <w:color w:val="000000"/>
+                <w:sz w:val="16"/>
+                <w:szCs w:val="16"/>
+              </w:rPr>
+              <w:t xml:space="preserve">Engine </w:t>
+            </w:r>
+            <w:r>
+              <w:rPr>
+                <w:rFonts w:eastAsia="arial" w:ascii="arial" w:hAnsi="arial"/>
+                <w:color w:val="000000"/>
+                <w:sz w:val="16"/>
+                <w:szCs w:val="16"/>
+              </w:rPr>
+              <w:t>Run But.</w:t>
+            </w:r>
+          </w:p>
+        </w:tc>
+        <w:tc>
+          <w:tcPr>
+            <w:tcW w:w="1016" w:type="dxa"/>
+            <w:tcBorders>
+              <w:top w:val="single" w:sz="4" w:space="0" w:color="000000"/>
+              <w:left w:val="single" w:sz="4" w:space="0" w:color="000000"/>
+              <w:bottom w:val="single" w:sz="4" w:space="0" w:color="000000"/>
+            </w:tcBorders>
+            <w:vAlign w:val="bottom"/>
+          </w:tcPr>
+          <w:p>
+            <w:pPr>
+              <w:pStyle w:val="Normal"/>
+              <w:widowControl w:val="false"/>
+              <w:spacing w:lineRule="auto" w:line="180"/>
+              <w:jc w:val="center"/>
+              <w:rPr>
+                <w:color w:val="000000"/>
+                <w:sz w:val="16"/>
+                <w:szCs w:val="16"/>
+              </w:rPr>
+            </w:pPr>
+            <w:r>
+              <w:rPr>
+                <w:color w:val="000000"/>
+                <w:sz w:val="16"/>
+                <w:szCs w:val="16"/>
+              </w:rPr>
+              <w:t>Engine Run</w:t>
+            </w:r>
+          </w:p>
+        </w:tc>
+        <w:tc>
+          <w:tcPr>
+            <w:tcW w:w="1020" w:type="dxa"/>
+            <w:tcBorders>
+              <w:top w:val="single" w:sz="4" w:space="0" w:color="000000"/>
+              <w:left w:val="single" w:sz="4" w:space="0" w:color="000000"/>
+              <w:bottom w:val="single" w:sz="4" w:space="0" w:color="000000"/>
+            </w:tcBorders>
+            <w:vAlign w:val="bottom"/>
+          </w:tcPr>
+          <w:p>
+            <w:pPr>
+              <w:pStyle w:val="Normal"/>
+              <w:widowControl w:val="false"/>
+              <w:spacing w:lineRule="auto" w:line="180"/>
+              <w:jc w:val="center"/>
+              <w:rPr>
+                <w:color w:val="000000"/>
+                <w:sz w:val="16"/>
+                <w:szCs w:val="16"/>
+              </w:rPr>
+            </w:pPr>
+            <w:r>
+              <w:rPr>
+                <w:color w:val="000000"/>
+                <w:sz w:val="16"/>
+                <w:szCs w:val="16"/>
+              </w:rPr>
+              <w:t>Generator Field</w:t>
+            </w:r>
+          </w:p>
+        </w:tc>
+        <w:tc>
+          <w:tcPr>
+            <w:tcW w:w="1016" w:type="dxa"/>
+            <w:tcBorders>
+              <w:top w:val="single" w:sz="4" w:space="0" w:color="000000"/>
+              <w:left w:val="single" w:sz="4" w:space="0" w:color="000000"/>
+              <w:bottom w:val="single" w:sz="4" w:space="0" w:color="000000"/>
+            </w:tcBorders>
+            <w:vAlign w:val="bottom"/>
+          </w:tcPr>
+          <w:p>
+            <w:pPr>
+              <w:pStyle w:val="Normal"/>
+              <w:widowControl w:val="false"/>
+              <w:jc w:val="center"/>
+              <w:rPr>
+                <w:color w:val="000000"/>
+                <w:sz w:val="16"/>
+                <w:szCs w:val="16"/>
+              </w:rPr>
+            </w:pPr>
+            <w:r>
+              <w:rPr>
+                <w:color w:val="000000"/>
+                <w:sz w:val="16"/>
+                <w:szCs w:val="16"/>
+              </w:rPr>
+              <w:t>Brake</w:t>
+            </w:r>
+          </w:p>
+          <w:p>
+            <w:pPr>
+              <w:pStyle w:val="Normal"/>
+              <w:widowControl w:val="false"/>
+              <w:jc w:val="center"/>
+              <w:rPr>
+                <w:color w:val="000000"/>
+                <w:sz w:val="16"/>
+                <w:szCs w:val="16"/>
+              </w:rPr>
+            </w:pPr>
+            <w:r>
+              <w:rPr>
+                <w:color w:val="000000"/>
+                <w:sz w:val="16"/>
+                <w:szCs w:val="16"/>
+              </w:rPr>
+              <w:t>Cut-</w:t>
+            </w:r>
+            <w:r>
+              <w:rPr>
+                <w:color w:val="000000"/>
+                <w:sz w:val="16"/>
+                <w:szCs w:val="16"/>
+              </w:rPr>
+              <w:t>In</w:t>
+            </w:r>
+          </w:p>
+        </w:tc>
+        <w:tc>
+          <w:tcPr>
+            <w:tcW w:w="1016" w:type="dxa"/>
+            <w:tcBorders>
+              <w:top w:val="single" w:sz="4" w:space="0" w:color="000000"/>
+              <w:left w:val="single" w:sz="4" w:space="0" w:color="000000"/>
+              <w:bottom w:val="single" w:sz="4" w:space="0" w:color="000000"/>
+            </w:tcBorders>
+            <w:vAlign w:val="bottom"/>
+          </w:tcPr>
+          <w:p>
+            <w:pPr>
+              <w:pStyle w:val="Normal"/>
+              <w:widowControl w:val="false"/>
+              <w:jc w:val="center"/>
+              <w:rPr>
+                <w:color w:val="000000"/>
+                <w:sz w:val="16"/>
+                <w:szCs w:val="16"/>
+              </w:rPr>
+            </w:pPr>
+            <w:r>
+              <w:rPr>
+                <w:color w:val="000000"/>
+                <w:sz w:val="16"/>
+                <w:szCs w:val="16"/>
+              </w:rPr>
+              <w:t>Cab Setup Key</w:t>
+            </w:r>
+          </w:p>
+        </w:tc>
+        <w:tc>
+          <w:tcPr>
+            <w:tcW w:w="1017" w:type="dxa"/>
+            <w:tcBorders>
+              <w:top w:val="single" w:sz="4" w:space="0" w:color="000000"/>
+              <w:left w:val="single" w:sz="4" w:space="0" w:color="000000"/>
+              <w:bottom w:val="single" w:sz="4" w:space="0" w:color="000000"/>
+            </w:tcBorders>
+            <w:vAlign w:val="bottom"/>
+          </w:tcPr>
+          <w:p>
+            <w:pPr>
+              <w:pStyle w:val="Normal"/>
+              <w:widowControl w:val="false"/>
+              <w:jc w:val="center"/>
+              <w:rPr>
+                <w:color w:val="000000"/>
+                <w:sz w:val="16"/>
+                <w:szCs w:val="16"/>
+              </w:rPr>
+            </w:pPr>
+            <w:r>
+              <w:rPr/>
+            </w:r>
+          </w:p>
+        </w:tc>
+        <w:tc>
+          <w:tcPr>
+            <w:tcW w:w="1016" w:type="dxa"/>
+            <w:tcBorders>
+              <w:top w:val="single" w:sz="4" w:space="0" w:color="000000"/>
+              <w:left w:val="single" w:sz="4" w:space="0" w:color="000000"/>
+              <w:bottom w:val="single" w:sz="4" w:space="0" w:color="000000"/>
+            </w:tcBorders>
+            <w:vAlign w:val="bottom"/>
+          </w:tcPr>
+          <w:p>
+            <w:pPr>
+              <w:pStyle w:val="Normal"/>
+              <w:widowControl w:val="false"/>
+              <w:jc w:val="center"/>
+              <w:rPr>
+                <w:sz w:val="16"/>
+                <w:szCs w:val="16"/>
+              </w:rPr>
+            </w:pPr>
+            <w:r>
+              <w:rPr/>
+            </w:r>
+          </w:p>
+        </w:tc>
+        <w:tc>
+          <w:tcPr>
+            <w:tcW w:w="1020" w:type="dxa"/>
+            <w:tcBorders>
+              <w:top w:val="single" w:sz="4" w:space="0" w:color="000000"/>
+              <w:left w:val="single" w:sz="4" w:space="0" w:color="000000"/>
+              <w:bottom w:val="single" w:sz="4" w:space="0" w:color="000000"/>
+            </w:tcBorders>
+            <w:vAlign w:val="bottom"/>
+          </w:tcPr>
+          <w:p>
+            <w:pPr>
+              <w:pStyle w:val="Normal"/>
+              <w:widowControl w:val="false"/>
+              <w:jc w:val="center"/>
+              <w:rPr>
+                <w:color w:val="000000"/>
+                <w:sz w:val="16"/>
+                <w:szCs w:val="16"/>
+              </w:rPr>
+            </w:pPr>
+            <w:r>
+              <w:rPr>
+                <w:rFonts w:eastAsia="arial" w:ascii="arial" w:hAnsi="arial"/>
+                <w:color w:val="000000"/>
+                <w:sz w:val="16"/>
+                <w:szCs w:val="16"/>
+              </w:rPr>
+              <w:t>Number Light</w:t>
+            </w:r>
+          </w:p>
+        </w:tc>
+        <w:tc>
+          <w:tcPr>
+            <w:tcW w:w="1016" w:type="dxa"/>
+            <w:tcBorders>
+              <w:top w:val="single" w:sz="4" w:space="0" w:color="000000"/>
+              <w:left w:val="single" w:sz="4" w:space="0" w:color="000000"/>
+              <w:bottom w:val="single" w:sz="4" w:space="0" w:color="000000"/>
+            </w:tcBorders>
+            <w:vAlign w:val="bottom"/>
+          </w:tcPr>
+          <w:p>
+            <w:pPr>
+              <w:pStyle w:val="Normal"/>
+              <w:widowControl w:val="false"/>
+              <w:spacing w:lineRule="auto" w:line="180"/>
+              <w:jc w:val="center"/>
+              <w:rPr>
+                <w:sz w:val="16"/>
+                <w:szCs w:val="16"/>
+              </w:rPr>
+            </w:pPr>
+            <w:r>
+              <w:rPr>
+                <w:rFonts w:eastAsia="arial" w:ascii="arial" w:hAnsi="arial"/>
+                <w:color w:val="000000"/>
+                <w:sz w:val="16"/>
+                <w:szCs w:val="16"/>
+              </w:rPr>
+              <w:t>Gauge Light</w:t>
+            </w:r>
+          </w:p>
+        </w:tc>
+        <w:tc>
+          <w:tcPr>
+            <w:tcW w:w="1016" w:type="dxa"/>
+            <w:tcBorders>
+              <w:top w:val="single" w:sz="4" w:space="0" w:color="000000"/>
+              <w:left w:val="single" w:sz="4" w:space="0" w:color="000000"/>
+              <w:bottom w:val="single" w:sz="4" w:space="0" w:color="000000"/>
+            </w:tcBorders>
+            <w:vAlign w:val="bottom"/>
+          </w:tcPr>
+          <w:p>
+            <w:pPr>
+              <w:pStyle w:val="Normal"/>
+              <w:widowControl w:val="false"/>
+              <w:spacing w:lineRule="auto" w:line="180"/>
+              <w:jc w:val="center"/>
+              <w:rPr>
+                <w:sz w:val="16"/>
+                <w:szCs w:val="16"/>
+              </w:rPr>
+            </w:pPr>
+            <w:r>
+              <w:rPr>
+                <w:sz w:val="16"/>
+                <w:szCs w:val="16"/>
+              </w:rPr>
+              <w:t>Cab Light</w:t>
+            </w:r>
+          </w:p>
+        </w:tc>
+        <w:tc>
+          <w:tcPr>
+            <w:tcW w:w="1016" w:type="dxa"/>
+            <w:tcBorders>
+              <w:top w:val="single" w:sz="4" w:space="0" w:color="000000"/>
+              <w:left w:val="single" w:sz="4" w:space="0" w:color="000000"/>
+              <w:bottom w:val="single" w:sz="4" w:space="0" w:color="000000"/>
+            </w:tcBorders>
+            <w:vAlign w:val="bottom"/>
+          </w:tcPr>
+          <w:p>
+            <w:pPr>
+              <w:pStyle w:val="Normal"/>
+              <w:widowControl w:val="false"/>
+              <w:spacing w:lineRule="auto" w:line="180"/>
+              <w:jc w:val="center"/>
+              <w:rPr>
+                <w:sz w:val="16"/>
+                <w:szCs w:val="16"/>
+              </w:rPr>
+            </w:pPr>
+            <w:r>
+              <w:rPr>
+                <w:rFonts w:eastAsia="arial" w:ascii="arial" w:hAnsi="arial"/>
+                <w:color w:val="000000"/>
+                <w:sz w:val="16"/>
+                <w:szCs w:val="16"/>
+              </w:rPr>
+              <w:t>1-Person</w:t>
+            </w:r>
+          </w:p>
+        </w:tc>
+        <w:tc>
+          <w:tcPr>
+            <w:tcW w:w="1029" w:type="dxa"/>
+            <w:tcBorders>
+              <w:top w:val="single" w:sz="4" w:space="0" w:color="000000"/>
+              <w:left w:val="single" w:sz="4" w:space="0" w:color="000000"/>
+              <w:bottom w:val="single" w:sz="4" w:space="0" w:color="000000"/>
+              <w:right w:val="single" w:sz="4" w:space="0" w:color="000000"/>
+            </w:tcBorders>
+            <w:vAlign w:val="bottom"/>
+          </w:tcPr>
+          <w:p>
+            <w:pPr>
+              <w:pStyle w:val="Normal"/>
+              <w:widowControl w:val="false"/>
+              <w:spacing w:lineRule="auto" w:line="180"/>
+              <w:jc w:val="center"/>
+              <w:rPr>
+                <w:sz w:val="16"/>
+                <w:szCs w:val="16"/>
+              </w:rPr>
+            </w:pPr>
+            <w:r>
+              <w:rPr>
+                <w:rFonts w:eastAsia="arial" w:ascii="arial" w:hAnsi="arial"/>
+                <w:color w:val="000000"/>
+                <w:sz w:val="16"/>
+                <w:szCs w:val="16"/>
+              </w:rPr>
+              <w:t>Next</w:t>
+            </w:r>
+          </w:p>
+          <w:p>
+            <w:pPr>
+              <w:pStyle w:val="Normal"/>
+              <w:widowControl w:val="false"/>
+              <w:spacing w:lineRule="auto" w:line="180"/>
+              <w:jc w:val="center"/>
+              <w:rPr>
+                <w:sz w:val="16"/>
+                <w:szCs w:val="16"/>
+              </w:rPr>
+            </w:pPr>
+            <w:r>
+              <w:rPr>
+                <w:rFonts w:eastAsia="arial" w:ascii="arial" w:hAnsi="arial"/>
+                <w:color w:val="000000"/>
+                <w:sz w:val="16"/>
+                <w:szCs w:val="16"/>
+              </w:rPr>
+              <w:t>Cab Cam</w:t>
+            </w:r>
+          </w:p>
+        </w:tc>
+      </w:tr>
+    </w:tbl>
+    <w:p>
+      <w:pPr>
+        <w:pStyle w:val="Normal"/>
+        <w:rPr>
+          <w:rFonts w:ascii="arial" w:hAnsi="arial" w:eastAsia="arial"/>
+          <w:color w:val="000000"/>
+          <w:sz w:val="16"/>
+          <w:szCs w:val="16"/>
+        </w:rPr>
+      </w:pPr>
+      <w:r>
+        <w:rPr>
+          <w:rFonts w:eastAsia="arial" w:ascii="arial" w:hAnsi="arial"/>
+          <w:color w:val="000000"/>
+          <w:sz w:val="16"/>
+          <w:szCs w:val="16"/>
+        </w:rPr>
+      </w:r>
+    </w:p>
+    <w:p>
+      <w:pPr>
+        <w:pStyle w:val="Normal"/>
+        <w:rPr>
+          <w:color w:val="000000"/>
+          <w:sz w:val="16"/>
+          <w:szCs w:val="16"/>
+        </w:rPr>
+      </w:pPr>
+      <w:r>
+        <w:rPr>
+          <w:rFonts w:eastAsia="arial" w:ascii="arial" w:hAnsi="arial"/>
+          <w:color w:val="000000"/>
+          <w:sz w:val="16"/>
+          <w:szCs w:val="16"/>
+        </w:rPr>
+        <w:tab/>
+        <w:t xml:space="preserve">           </w:t>
+      </w:r>
+      <w:r>
+        <w:rPr>
+          <w:rFonts w:eastAsia="arial" w:ascii="arial" w:hAnsi="arial"/>
+          <w:color w:val="000000"/>
+          <w:sz w:val="16"/>
+          <w:szCs w:val="16"/>
+        </w:rPr>
+        <w:t>Bombardier Bi-level Cab Car</w:t>
+      </w:r>
+      <w:r>
+        <w:rPr>
+          <w:rFonts w:eastAsia="arial" w:ascii="arial" w:hAnsi="arial"/>
+          <w:color w:val="000000"/>
+          <w:sz w:val="16"/>
+          <w:szCs w:val="16"/>
+        </w:rPr>
+        <w:t>-2</w:t>
+      </w:r>
+    </w:p>
+    <w:tbl>
+      <w:tblPr>
+        <w:tblW w:w="14248" w:type="dxa"/>
+        <w:jc w:val="left"/>
+        <w:tblInd w:w="-5" w:type="dxa"/>
+        <w:tblLayout w:type="fixed"/>
+        <w:tblCellMar>
+          <w:top w:w="0" w:type="dxa"/>
+          <w:left w:w="108" w:type="dxa"/>
+          <w:bottom w:w="0" w:type="dxa"/>
+          <w:right w:w="108" w:type="dxa"/>
+        </w:tblCellMar>
+        <w:tblLook w:firstRow="1" w:noVBand="1" w:lastRow="0" w:firstColumn="1" w:lastColumn="0" w:noHBand="0" w:val="04a0"/>
+      </w:tblPr>
+      <w:tblGrid>
+        <w:gridCol w:w="1017"/>
+        <w:gridCol w:w="1019"/>
+        <w:gridCol w:w="1014"/>
+        <w:gridCol w:w="1016"/>
+        <w:gridCol w:w="1020"/>
+        <w:gridCol w:w="1016"/>
+        <w:gridCol w:w="1016"/>
+        <w:gridCol w:w="1017"/>
+        <w:gridCol w:w="1016"/>
+        <w:gridCol w:w="1020"/>
+        <w:gridCol w:w="1016"/>
+        <w:gridCol w:w="1016"/>
+        <w:gridCol w:w="1016"/>
+        <w:gridCol w:w="1029"/>
+      </w:tblGrid>
+      <w:tr>
+        <w:trPr>
+          <w:trHeight w:val="440" w:hRule="exact"/>
+          <w:cantSplit w:val="true"/>
+        </w:trPr>
+        <w:tc>
+          <w:tcPr>
+            <w:tcW w:w="1017" w:type="dxa"/>
+            <w:tcBorders>
+              <w:top w:val="single" w:sz="4" w:space="0" w:color="000000"/>
+              <w:left w:val="single" w:sz="4" w:space="0" w:color="000000"/>
+              <w:bottom w:val="single" w:sz="4" w:space="0" w:color="000000"/>
+            </w:tcBorders>
+            <w:vAlign w:val="bottom"/>
+          </w:tcPr>
+          <w:p>
+            <w:pPr>
+              <w:pStyle w:val="Normal"/>
+              <w:widowControl w:val="false"/>
+              <w:spacing w:lineRule="auto" w:line="180" w:before="0" w:after="60"/>
+              <w:jc w:val="center"/>
+              <w:rPr>
+                <w:b/>
+                <w:bCs/>
+              </w:rPr>
+            </w:pPr>
+            <w:r>
+              <w:rPr>
+                <w:b/>
+                <w:bCs/>
+                <w:color w:val="000000"/>
+                <w:sz w:val="16"/>
+                <w:szCs w:val="16"/>
+              </w:rPr>
+              <w:t>HUD</w:t>
+            </w:r>
+          </w:p>
+        </w:tc>
+        <w:tc>
+          <w:tcPr>
+            <w:tcW w:w="1019" w:type="dxa"/>
+            <w:tcBorders>
+              <w:top w:val="single" w:sz="4" w:space="0" w:color="000000"/>
+              <w:left w:val="single" w:sz="4" w:space="0" w:color="000000"/>
+              <w:bottom w:val="single" w:sz="4" w:space="0" w:color="000000"/>
+            </w:tcBorders>
+            <w:vAlign w:val="bottom"/>
+          </w:tcPr>
+          <w:p>
+            <w:pPr>
+              <w:pStyle w:val="Normal"/>
+              <w:widowControl w:val="false"/>
+              <w:spacing w:lineRule="auto" w:line="180"/>
+              <w:jc w:val="center"/>
+              <w:rPr>
+                <w:color w:val="000000"/>
+                <w:sz w:val="16"/>
+                <w:szCs w:val="16"/>
+              </w:rPr>
+            </w:pPr>
+            <w:r>
+              <w:rPr>
+                <w:color w:val="000000"/>
+                <w:sz w:val="16"/>
+                <w:szCs w:val="16"/>
+              </w:rPr>
+              <w:t>Schedule</w:t>
+            </w:r>
+          </w:p>
+        </w:tc>
+        <w:tc>
+          <w:tcPr>
+            <w:tcW w:w="1014" w:type="dxa"/>
+            <w:tcBorders>
+              <w:top w:val="single" w:sz="4" w:space="0" w:color="000000"/>
+              <w:left w:val="single" w:sz="4" w:space="0" w:color="000000"/>
+              <w:bottom w:val="single" w:sz="4" w:space="0" w:color="000000"/>
+            </w:tcBorders>
+            <w:vAlign w:val="bottom"/>
+          </w:tcPr>
+          <w:p>
+            <w:pPr>
+              <w:pStyle w:val="Normal"/>
+              <w:widowControl w:val="false"/>
+              <w:spacing w:lineRule="auto" w:line="180"/>
+              <w:jc w:val="center"/>
+              <w:rPr>
+                <w:color w:val="000000"/>
+                <w:sz w:val="16"/>
+                <w:szCs w:val="16"/>
+              </w:rPr>
+            </w:pPr>
+            <w:r>
+              <w:rPr>
+                <w:rFonts w:eastAsia="arial" w:ascii="arial" w:hAnsi="arial"/>
+                <w:color w:val="000000"/>
+                <w:sz w:val="16"/>
+                <w:szCs w:val="16"/>
+              </w:rPr>
+              <w:t>Engine Stop</w:t>
+            </w:r>
+          </w:p>
+        </w:tc>
+        <w:tc>
+          <w:tcPr>
+            <w:tcW w:w="1016" w:type="dxa"/>
+            <w:tcBorders>
+              <w:top w:val="single" w:sz="4" w:space="0" w:color="000000"/>
+              <w:left w:val="single" w:sz="4" w:space="0" w:color="000000"/>
+              <w:bottom w:val="single" w:sz="4" w:space="0" w:color="000000"/>
+            </w:tcBorders>
+            <w:vAlign w:val="bottom"/>
+          </w:tcPr>
+          <w:p>
+            <w:pPr>
+              <w:pStyle w:val="Normal"/>
+              <w:widowControl w:val="false"/>
+              <w:spacing w:lineRule="auto" w:line="180"/>
+              <w:jc w:val="center"/>
+              <w:rPr>
+                <w:color w:val="000000"/>
+                <w:sz w:val="16"/>
+                <w:szCs w:val="16"/>
+              </w:rPr>
+            </w:pPr>
+            <w:r>
+              <w:rPr>
+                <w:color w:val="000000"/>
+                <w:sz w:val="16"/>
+                <w:szCs w:val="16"/>
+              </w:rPr>
+              <w:t>Alerter</w:t>
+            </w:r>
+          </w:p>
+        </w:tc>
+        <w:tc>
+          <w:tcPr>
+            <w:tcW w:w="1020" w:type="dxa"/>
+            <w:tcBorders>
+              <w:top w:val="single" w:sz="4" w:space="0" w:color="000000"/>
+              <w:left w:val="single" w:sz="4" w:space="0" w:color="000000"/>
+              <w:bottom w:val="single" w:sz="4" w:space="0" w:color="000000"/>
+            </w:tcBorders>
+            <w:vAlign w:val="bottom"/>
+          </w:tcPr>
+          <w:p>
+            <w:pPr>
+              <w:pStyle w:val="Normal"/>
+              <w:widowControl w:val="false"/>
+              <w:spacing w:lineRule="auto" w:line="180"/>
+              <w:jc w:val="center"/>
+              <w:rPr>
+                <w:color w:val="000000"/>
+                <w:sz w:val="16"/>
+                <w:szCs w:val="16"/>
+              </w:rPr>
+            </w:pPr>
+            <w:r>
+              <w:rPr>
+                <w:color w:val="000000"/>
+                <w:sz w:val="16"/>
+                <w:szCs w:val="16"/>
+              </w:rPr>
+              <w:t>Control &amp; Fuel Pump</w:t>
+            </w:r>
+          </w:p>
+        </w:tc>
+        <w:tc>
+          <w:tcPr>
+            <w:tcW w:w="1016" w:type="dxa"/>
+            <w:tcBorders>
+              <w:top w:val="single" w:sz="4" w:space="0" w:color="000000"/>
+              <w:left w:val="single" w:sz="4" w:space="0" w:color="000000"/>
+              <w:bottom w:val="single" w:sz="4" w:space="0" w:color="000000"/>
+            </w:tcBorders>
+            <w:vAlign w:val="bottom"/>
+          </w:tcPr>
+          <w:p>
+            <w:pPr>
+              <w:pStyle w:val="Normal"/>
+              <w:widowControl w:val="false"/>
+              <w:jc w:val="center"/>
+              <w:rPr>
+                <w:color w:val="000000"/>
+                <w:sz w:val="16"/>
+                <w:szCs w:val="16"/>
+              </w:rPr>
+            </w:pPr>
+            <w:r>
+              <w:rPr>
+                <w:color w:val="000000"/>
+                <w:sz w:val="16"/>
+                <w:szCs w:val="16"/>
+              </w:rPr>
+              <w:t>Brake</w:t>
+            </w:r>
+          </w:p>
+          <w:p>
+            <w:pPr>
+              <w:pStyle w:val="Normal"/>
+              <w:widowControl w:val="false"/>
+              <w:jc w:val="center"/>
+              <w:rPr>
+                <w:color w:val="000000"/>
+                <w:sz w:val="16"/>
+                <w:szCs w:val="16"/>
+              </w:rPr>
+            </w:pPr>
+            <w:r>
+              <w:rPr>
+                <w:color w:val="000000"/>
+                <w:sz w:val="16"/>
+                <w:szCs w:val="16"/>
+              </w:rPr>
+              <w:t>Cut-</w:t>
+            </w:r>
+            <w:r>
+              <w:rPr>
+                <w:color w:val="000000"/>
+                <w:sz w:val="16"/>
+                <w:szCs w:val="16"/>
+              </w:rPr>
+              <w:t>Out</w:t>
+            </w:r>
+          </w:p>
+        </w:tc>
+        <w:tc>
+          <w:tcPr>
+            <w:tcW w:w="1016" w:type="dxa"/>
+            <w:tcBorders>
+              <w:top w:val="single" w:sz="4" w:space="0" w:color="000000"/>
+              <w:left w:val="single" w:sz="4" w:space="0" w:color="000000"/>
+              <w:bottom w:val="single" w:sz="4" w:space="0" w:color="000000"/>
+            </w:tcBorders>
+            <w:vAlign w:val="bottom"/>
+          </w:tcPr>
+          <w:p>
+            <w:pPr>
+              <w:pStyle w:val="Normal"/>
+              <w:widowControl w:val="false"/>
+              <w:jc w:val="center"/>
+              <w:rPr>
+                <w:color w:val="000000"/>
+                <w:sz w:val="16"/>
+                <w:szCs w:val="16"/>
+              </w:rPr>
+            </w:pPr>
+            <w:r>
+              <w:rPr/>
+            </w:r>
+          </w:p>
+        </w:tc>
+        <w:tc>
+          <w:tcPr>
+            <w:tcW w:w="1017" w:type="dxa"/>
+            <w:tcBorders>
+              <w:top w:val="single" w:sz="4" w:space="0" w:color="000000"/>
+              <w:left w:val="single" w:sz="4" w:space="0" w:color="000000"/>
+              <w:bottom w:val="single" w:sz="4" w:space="0" w:color="000000"/>
+            </w:tcBorders>
+            <w:vAlign w:val="bottom"/>
+          </w:tcPr>
+          <w:p>
+            <w:pPr>
+              <w:pStyle w:val="Normal"/>
+              <w:widowControl w:val="false"/>
+              <w:jc w:val="center"/>
+              <w:rPr>
+                <w:color w:val="000000"/>
+                <w:sz w:val="16"/>
+                <w:szCs w:val="16"/>
+              </w:rPr>
+            </w:pPr>
+            <w:r>
+              <w:rPr/>
+            </w:r>
+          </w:p>
+        </w:tc>
+        <w:tc>
+          <w:tcPr>
+            <w:tcW w:w="1016" w:type="dxa"/>
+            <w:tcBorders>
+              <w:top w:val="single" w:sz="4" w:space="0" w:color="000000"/>
+              <w:left w:val="single" w:sz="4" w:space="0" w:color="000000"/>
+              <w:bottom w:val="single" w:sz="4" w:space="0" w:color="000000"/>
+            </w:tcBorders>
+            <w:vAlign w:val="bottom"/>
+          </w:tcPr>
+          <w:p>
+            <w:pPr>
+              <w:pStyle w:val="Normal"/>
+              <w:widowControl w:val="false"/>
+              <w:jc w:val="center"/>
+              <w:rPr>
+                <w:sz w:val="16"/>
+                <w:szCs w:val="16"/>
+              </w:rPr>
+            </w:pPr>
+            <w:r>
+              <w:rPr/>
+            </w:r>
+          </w:p>
+        </w:tc>
+        <w:tc>
+          <w:tcPr>
+            <w:tcW w:w="1020" w:type="dxa"/>
+            <w:tcBorders>
+              <w:top w:val="single" w:sz="4" w:space="0" w:color="000000"/>
+              <w:left w:val="single" w:sz="4" w:space="0" w:color="000000"/>
+              <w:bottom w:val="single" w:sz="4" w:space="0" w:color="000000"/>
+            </w:tcBorders>
+            <w:vAlign w:val="bottom"/>
+          </w:tcPr>
+          <w:p>
+            <w:pPr>
+              <w:pStyle w:val="Normal"/>
+              <w:widowControl w:val="false"/>
+              <w:jc w:val="center"/>
+              <w:rPr>
+                <w:color w:val="000000"/>
+                <w:sz w:val="16"/>
+                <w:szCs w:val="16"/>
+              </w:rPr>
+            </w:pPr>
+            <w:r>
+              <w:rPr/>
+            </w:r>
+          </w:p>
+        </w:tc>
+        <w:tc>
+          <w:tcPr>
+            <w:tcW w:w="1016" w:type="dxa"/>
+            <w:tcBorders>
+              <w:top w:val="single" w:sz="4" w:space="0" w:color="000000"/>
+              <w:left w:val="single" w:sz="4" w:space="0" w:color="000000"/>
+              <w:bottom w:val="single" w:sz="4" w:space="0" w:color="000000"/>
+            </w:tcBorders>
+            <w:vAlign w:val="bottom"/>
+          </w:tcPr>
+          <w:p>
+            <w:pPr>
+              <w:pStyle w:val="Normal"/>
+              <w:widowControl w:val="false"/>
+              <w:spacing w:lineRule="auto" w:line="180"/>
+              <w:jc w:val="center"/>
+              <w:rPr>
+                <w:sz w:val="16"/>
+                <w:szCs w:val="16"/>
+              </w:rPr>
+            </w:pPr>
+            <w:r>
+              <w:rPr>
+                <w:rFonts w:eastAsia="arial" w:ascii="arial" w:hAnsi="arial"/>
+                <w:color w:val="000000"/>
+                <w:sz w:val="16"/>
+                <w:szCs w:val="16"/>
+              </w:rPr>
+              <w:t>Marker Light</w:t>
+            </w:r>
+          </w:p>
+        </w:tc>
+        <w:tc>
+          <w:tcPr>
+            <w:tcW w:w="1016" w:type="dxa"/>
+            <w:tcBorders>
+              <w:top w:val="single" w:sz="4" w:space="0" w:color="000000"/>
+              <w:left w:val="single" w:sz="4" w:space="0" w:color="000000"/>
+              <w:bottom w:val="single" w:sz="4" w:space="0" w:color="000000"/>
+            </w:tcBorders>
+            <w:vAlign w:val="bottom"/>
+          </w:tcPr>
+          <w:p>
+            <w:pPr>
+              <w:pStyle w:val="Normal"/>
+              <w:widowControl w:val="false"/>
+              <w:spacing w:lineRule="auto" w:line="180"/>
+              <w:jc w:val="center"/>
+              <w:rPr>
+                <w:sz w:val="16"/>
+                <w:szCs w:val="16"/>
+              </w:rPr>
+            </w:pPr>
+            <w:r>
+              <w:rPr>
+                <w:sz w:val="16"/>
+                <w:szCs w:val="16"/>
+              </w:rPr>
+              <w:t>Parking Brake</w:t>
+            </w:r>
+          </w:p>
+        </w:tc>
+        <w:tc>
+          <w:tcPr>
+            <w:tcW w:w="1016" w:type="dxa"/>
+            <w:tcBorders>
+              <w:top w:val="single" w:sz="4" w:space="0" w:color="000000"/>
+              <w:left w:val="single" w:sz="4" w:space="0" w:color="000000"/>
+              <w:bottom w:val="single" w:sz="4" w:space="0" w:color="000000"/>
+            </w:tcBorders>
+            <w:vAlign w:val="bottom"/>
+          </w:tcPr>
+          <w:p>
+            <w:pPr>
+              <w:pStyle w:val="Normal"/>
+              <w:widowControl w:val="false"/>
+              <w:spacing w:lineRule="auto" w:line="180"/>
+              <w:jc w:val="center"/>
+              <w:rPr>
+                <w:sz w:val="16"/>
+                <w:szCs w:val="16"/>
+              </w:rPr>
+            </w:pPr>
+            <w:r>
+              <w:rPr>
+                <w:rFonts w:eastAsia="arial" w:ascii="arial" w:hAnsi="arial"/>
+                <w:color w:val="000000"/>
+                <w:sz w:val="16"/>
+                <w:szCs w:val="16"/>
+              </w:rPr>
+              <w:t>Exterior</w:t>
+            </w:r>
+          </w:p>
+          <w:p>
+            <w:pPr>
+              <w:pStyle w:val="Normal"/>
+              <w:widowControl w:val="false"/>
+              <w:spacing w:lineRule="auto" w:line="180"/>
+              <w:jc w:val="center"/>
+              <w:rPr>
+                <w:sz w:val="16"/>
+                <w:szCs w:val="16"/>
+              </w:rPr>
+            </w:pPr>
+            <w:r>
+              <w:rPr>
+                <w:rFonts w:eastAsia="arial" w:ascii="arial" w:hAnsi="arial"/>
+                <w:color w:val="000000"/>
+                <w:sz w:val="16"/>
+                <w:szCs w:val="16"/>
+              </w:rPr>
+              <w:t>Camera</w:t>
+            </w:r>
+          </w:p>
+        </w:tc>
+        <w:tc>
+          <w:tcPr>
+            <w:tcW w:w="1029" w:type="dxa"/>
+            <w:tcBorders>
+              <w:top w:val="single" w:sz="4" w:space="0" w:color="000000"/>
+              <w:left w:val="single" w:sz="4" w:space="0" w:color="000000"/>
+              <w:bottom w:val="single" w:sz="4" w:space="0" w:color="000000"/>
+              <w:right w:val="single" w:sz="4" w:space="0" w:color="000000"/>
+            </w:tcBorders>
+            <w:vAlign w:val="bottom"/>
+          </w:tcPr>
+          <w:p>
+            <w:pPr>
+              <w:pStyle w:val="Normal"/>
+              <w:widowControl w:val="false"/>
+              <w:spacing w:lineRule="auto" w:line="180"/>
+              <w:jc w:val="center"/>
+              <w:rPr>
+                <w:sz w:val="16"/>
+                <w:szCs w:val="16"/>
+              </w:rPr>
+            </w:pPr>
+            <w:r>
+              <w:rPr>
+                <w:rFonts w:eastAsia="arial" w:ascii="arial" w:hAnsi="arial"/>
+                <w:color w:val="000000"/>
+                <w:sz w:val="16"/>
+                <w:szCs w:val="16"/>
+              </w:rPr>
+              <w:t>Prev</w:t>
+            </w:r>
+          </w:p>
+          <w:p>
+            <w:pPr>
+              <w:pStyle w:val="Normal"/>
+              <w:widowControl w:val="false"/>
+              <w:spacing w:lineRule="auto" w:line="180"/>
+              <w:jc w:val="center"/>
+              <w:rPr>
+                <w:sz w:val="16"/>
+                <w:szCs w:val="16"/>
+              </w:rPr>
+            </w:pPr>
+            <w:r>
+              <w:rPr>
+                <w:rFonts w:eastAsia="arial" w:ascii="arial" w:hAnsi="arial"/>
+                <w:color w:val="000000"/>
+                <w:sz w:val="16"/>
+                <w:szCs w:val="16"/>
+              </w:rPr>
+              <w:t>Cab Cam</w:t>
+            </w:r>
+          </w:p>
+        </w:tc>
+      </w:tr>
+    </w:tbl>
+    <w:p>
+      <w:pPr>
+        <w:pStyle w:val="Normal"/>
+        <w:rPr>
+          <w:color w:val="000000"/>
+          <w:sz w:val="16"/>
+          <w:szCs w:val="16"/>
+        </w:rPr>
+      </w:pPr>
+      <w:r>
+        <w:rPr>
+          <w:rFonts w:eastAsia="arial" w:ascii="arial" w:hAnsi="arial"/>
           <w:color w:val="000000"/>
           <w:sz w:val="16"/>
           <w:szCs w:val="16"/>
@@ -19262,12 +21645,12 @@
       <w:rFonts w:ascii="Symbol" w:hAnsi="Symbol" w:cs="Symbol"/>
     </w:rPr>
   </w:style>
-  <w:style w:type="character" w:styleId="Style5" w:customStyle="1">
-    <w:name w:val="번호 매기기 기호"/>
+  <w:style w:type="character" w:styleId="user" w:customStyle="1">
+    <w:name w:val="번호 매기기 기호 (user)"/>
     <w:qFormat/>
     <w:rPr/>
   </w:style>
-  <w:style w:type="paragraph" w:styleId="Style6">
+  <w:style w:type="paragraph" w:styleId="Style5">
     <w:name w:val="제목"/>
     <w:basedOn w:val="Normal"/>
     <w:next w:val="BodyText"/>
@@ -19277,7 +21660,7 @@
       <w:spacing w:before="240" w:after="120"/>
     </w:pPr>
     <w:rPr>
-      <w:rFonts w:ascii="Liberation Sans" w:hAnsi="Liberation Sans" w:eastAsia="나눔고딕" w:cs="Arial"/>
+      <w:rFonts w:ascii="Liberation Sans" w:hAnsi="Liberation Sans" w:eastAsia="Noto Sans CJK KR" w:cs="Lohit Devanagari"/>
       <w:sz w:val="28"/>
       <w:szCs w:val="28"/>
     </w:rPr>
@@ -19314,7 +21697,7 @@
       <w:szCs w:val="24"/>
     </w:rPr>
   </w:style>
-  <w:style w:type="paragraph" w:styleId="Style7">
+  <w:style w:type="paragraph" w:styleId="Style6" w:customStyle="1">
     <w:name w:val="색인"/>
     <w:basedOn w:val="Normal"/>
     <w:qFormat/>
@@ -19322,11 +21705,10 @@
       <w:suppressLineNumbers/>
     </w:pPr>
     <w:rPr>
-      <w:rFonts w:cs="Arial"/>
-      <w:sz w:val="24"/>
+      <w:rFonts w:cs="Lohit Devanagari"/>
     </w:rPr>
   </w:style>
-  <w:style w:type="paragraph" w:styleId="user">
+  <w:style w:type="paragraph" w:styleId="user1">
     <w:name w:val="제목 (user)"/>
     <w:basedOn w:val="Normal"/>
     <w:next w:val="BodyText"/>
@@ -19336,12 +21718,12 @@
       <w:spacing w:before="240" w:after="120"/>
     </w:pPr>
     <w:rPr>
-      <w:rFonts w:ascii="Liberation Sans" w:hAnsi="Liberation Sans" w:eastAsia="Noto Sans CJK KR" w:cs="Lohit Devanagari"/>
+      <w:rFonts w:ascii="Liberation Sans" w:hAnsi="Liberation Sans" w:eastAsia="나눔고딕" w:cs="Arial"/>
       <w:sz w:val="28"/>
       <w:szCs w:val="28"/>
     </w:rPr>
   </w:style>
-  <w:style w:type="paragraph" w:styleId="user1" w:customStyle="1">
+  <w:style w:type="paragraph" w:styleId="user2">
     <w:name w:val="색인 (user)"/>
     <w:basedOn w:val="Normal"/>
     <w:qFormat/>
@@ -19349,7 +21731,8 @@
       <w:suppressLineNumbers/>
     </w:pPr>
     <w:rPr>
-      <w:rFonts w:cs="Lohit Devanagari"/>
+      <w:rFonts w:cs="Arial"/>
+      <w:sz w:val="24"/>
     </w:rPr>
   </w:style>
   <w:style w:type="paragraph" w:styleId="Title">
@@ -20031,8 +22414,8 @@
       <w:szCs w:val="24"/>
     </w:rPr>
   </w:style>
-  <w:style w:type="paragraph" w:styleId="user2" w:customStyle="1">
-    <w:name w:val="표 내용 (user)"/>
+  <w:style w:type="paragraph" w:styleId="Style7" w:customStyle="1">
+    <w:name w:val="표 내용"/>
     <w:basedOn w:val="Normal"/>
     <w:qFormat/>
     <w:pPr>
@@ -20040,9 +22423,9 @@
     </w:pPr>
     <w:rPr/>
   </w:style>
-  <w:style w:type="paragraph" w:styleId="user3" w:customStyle="1">
-    <w:name w:val="표제목 (user)"/>
-    <w:basedOn w:val="user2"/>
+  <w:style w:type="paragraph" w:styleId="Style8" w:customStyle="1">
+    <w:name w:val="표제목"/>
+    <w:basedOn w:val="Style7"/>
     <w:qFormat/>
     <w:pPr>
       <w:jc w:val="center"/>
@@ -20052,8 +22435,8 @@
       <w:bCs/>
     </w:rPr>
   </w:style>
-  <w:style w:type="paragraph" w:styleId="Style8">
-    <w:name w:val="표 내용"/>
+  <w:style w:type="paragraph" w:styleId="user3">
+    <w:name w:val="표 내용 (user)"/>
     <w:basedOn w:val="Normal"/>
     <w:qFormat/>
     <w:pPr>
@@ -20062,9 +22445,9 @@
     </w:pPr>
     <w:rPr/>
   </w:style>
-  <w:style w:type="paragraph" w:styleId="Style9">
-    <w:name w:val="표제목"/>
-    <w:basedOn w:val="Style8"/>
+  <w:style w:type="paragraph" w:styleId="user4">
+    <w:name w:val="표제목 (user)"/>
+    <w:basedOn w:val="user3"/>
     <w:qFormat/>
     <w:pPr>
       <w:suppressLineNumbers/>

</xml_diff>

<commit_message>
Add Rotem Bi-level Cab Car
</commit_message>
<xml_diff>
--- a/raildriver-USA-Remapped.docx
+++ b/raildriver-USA-Remapped.docx
@@ -21687,6 +21687,1142 @@
           <w:sz w:val="16"/>
           <w:szCs w:val="16"/>
         </w:rPr>
+        <w:t xml:space="preserve">    F59PHR-1</w:t>
+      </w:r>
+    </w:p>
+    <w:tbl>
+      <w:tblPr>
+        <w:tblW w:w="14248" w:type="dxa"/>
+        <w:jc w:val="left"/>
+        <w:tblInd w:w="-5" w:type="dxa"/>
+        <w:tblLayout w:type="fixed"/>
+        <w:tblCellMar>
+          <w:top w:w="0" w:type="dxa"/>
+          <w:left w:w="108" w:type="dxa"/>
+          <w:bottom w:w="0" w:type="dxa"/>
+          <w:right w:w="108" w:type="dxa"/>
+        </w:tblCellMar>
+        <w:tblLook w:firstRow="1" w:noVBand="1" w:lastRow="0" w:firstColumn="1" w:lastColumn="0" w:noHBand="0" w:val="04a0"/>
+      </w:tblPr>
+      <w:tblGrid>
+        <w:gridCol w:w="1017"/>
+        <w:gridCol w:w="1019"/>
+        <w:gridCol w:w="1014"/>
+        <w:gridCol w:w="1016"/>
+        <w:gridCol w:w="1020"/>
+        <w:gridCol w:w="1016"/>
+        <w:gridCol w:w="1016"/>
+        <w:gridCol w:w="1017"/>
+        <w:gridCol w:w="1016"/>
+        <w:gridCol w:w="1020"/>
+        <w:gridCol w:w="1016"/>
+        <w:gridCol w:w="1016"/>
+        <w:gridCol w:w="1016"/>
+        <w:gridCol w:w="1029"/>
+      </w:tblGrid>
+      <w:tr>
+        <w:trPr>
+          <w:trHeight w:val="440" w:hRule="exact"/>
+          <w:cantSplit w:val="true"/>
+        </w:trPr>
+        <w:tc>
+          <w:tcPr>
+            <w:tcW w:w="1017" w:type="dxa"/>
+            <w:tcBorders>
+              <w:top w:val="single" w:sz="4" w:space="0" w:color="000000"/>
+              <w:left w:val="single" w:sz="4" w:space="0" w:color="000000"/>
+              <w:bottom w:val="single" w:sz="4" w:space="0" w:color="000000"/>
+            </w:tcBorders>
+            <w:vAlign w:val="bottom"/>
+          </w:tcPr>
+          <w:p>
+            <w:pPr>
+              <w:pStyle w:val="Normal"/>
+              <w:widowControl w:val="false"/>
+              <w:spacing w:lineRule="auto" w:line="180" w:before="0" w:after="60"/>
+              <w:jc w:val="center"/>
+              <w:rPr>
+                <w:color w:val="000000"/>
+                <w:sz w:val="16"/>
+                <w:szCs w:val="16"/>
+              </w:rPr>
+            </w:pPr>
+            <w:r>
+              <w:rPr>
+                <w:rFonts w:eastAsia="arial" w:ascii="arial" w:hAnsi="arial"/>
+                <w:b/>
+                <w:color w:val="000000"/>
+                <w:sz w:val="16"/>
+                <w:szCs w:val="16"/>
+              </w:rPr>
+              <w:t>Pause</w:t>
+            </w:r>
+          </w:p>
+        </w:tc>
+        <w:tc>
+          <w:tcPr>
+            <w:tcW w:w="1019" w:type="dxa"/>
+            <w:tcBorders>
+              <w:top w:val="single" w:sz="4" w:space="0" w:color="000000"/>
+              <w:left w:val="single" w:sz="4" w:space="0" w:color="000000"/>
+              <w:bottom w:val="single" w:sz="4" w:space="0" w:color="000000"/>
+            </w:tcBorders>
+            <w:vAlign w:val="bottom"/>
+          </w:tcPr>
+          <w:p>
+            <w:pPr>
+              <w:pStyle w:val="Normal"/>
+              <w:widowControl w:val="false"/>
+              <w:spacing w:lineRule="auto" w:line="180"/>
+              <w:jc w:val="center"/>
+              <w:rPr>
+                <w:color w:val="000000"/>
+                <w:sz w:val="16"/>
+                <w:szCs w:val="16"/>
+              </w:rPr>
+            </w:pPr>
+            <w:r>
+              <w:rPr>
+                <w:color w:val="000000"/>
+                <w:sz w:val="16"/>
+                <w:szCs w:val="16"/>
+              </w:rPr>
+              <w:t>Reverser Handle</w:t>
+            </w:r>
+          </w:p>
+        </w:tc>
+        <w:tc>
+          <w:tcPr>
+            <w:tcW w:w="1014" w:type="dxa"/>
+            <w:tcBorders>
+              <w:top w:val="single" w:sz="4" w:space="0" w:color="000000"/>
+              <w:left w:val="single" w:sz="4" w:space="0" w:color="000000"/>
+              <w:bottom w:val="single" w:sz="4" w:space="0" w:color="000000"/>
+            </w:tcBorders>
+            <w:vAlign w:val="bottom"/>
+          </w:tcPr>
+          <w:p>
+            <w:pPr>
+              <w:pStyle w:val="Normal"/>
+              <w:widowControl w:val="false"/>
+              <w:jc w:val="center"/>
+              <w:rPr>
+                <w:rFonts w:ascii="arial" w:hAnsi="arial" w:eastAsia="arial"/>
+                <w:color w:val="000000"/>
+                <w:sz w:val="16"/>
+                <w:szCs w:val="16"/>
+              </w:rPr>
+            </w:pPr>
+            <w:r>
+              <w:rPr>
+                <w:rFonts w:eastAsia="arial" w:ascii="arial" w:hAnsi="arial"/>
+                <w:color w:val="000000"/>
+                <w:sz w:val="16"/>
+                <w:szCs w:val="16"/>
+              </w:rPr>
+              <w:t>Engine Start</w:t>
+            </w:r>
+          </w:p>
+        </w:tc>
+        <w:tc>
+          <w:tcPr>
+            <w:tcW w:w="1016" w:type="dxa"/>
+            <w:tcBorders>
+              <w:top w:val="single" w:sz="4" w:space="0" w:color="000000"/>
+              <w:left w:val="single" w:sz="4" w:space="0" w:color="000000"/>
+              <w:bottom w:val="single" w:sz="4" w:space="0" w:color="000000"/>
+            </w:tcBorders>
+            <w:vAlign w:val="bottom"/>
+          </w:tcPr>
+          <w:p>
+            <w:pPr>
+              <w:pStyle w:val="Normal"/>
+              <w:widowControl w:val="false"/>
+              <w:spacing w:lineRule="auto" w:line="180"/>
+              <w:jc w:val="center"/>
+              <w:rPr>
+                <w:color w:val="000000"/>
+                <w:sz w:val="16"/>
+                <w:szCs w:val="16"/>
+              </w:rPr>
+            </w:pPr>
+            <w:r>
+              <w:rPr>
+                <w:color w:val="000000"/>
+                <w:sz w:val="16"/>
+                <w:szCs w:val="16"/>
+              </w:rPr>
+              <w:t>Engine Run</w:t>
+            </w:r>
+          </w:p>
+        </w:tc>
+        <w:tc>
+          <w:tcPr>
+            <w:tcW w:w="1020" w:type="dxa"/>
+            <w:tcBorders>
+              <w:top w:val="single" w:sz="4" w:space="0" w:color="000000"/>
+              <w:left w:val="single" w:sz="4" w:space="0" w:color="000000"/>
+              <w:bottom w:val="single" w:sz="4" w:space="0" w:color="000000"/>
+            </w:tcBorders>
+            <w:vAlign w:val="bottom"/>
+          </w:tcPr>
+          <w:p>
+            <w:pPr>
+              <w:pStyle w:val="Normal"/>
+              <w:widowControl w:val="false"/>
+              <w:spacing w:lineRule="auto" w:line="180"/>
+              <w:jc w:val="center"/>
+              <w:rPr>
+                <w:color w:val="000000"/>
+                <w:sz w:val="16"/>
+                <w:szCs w:val="16"/>
+              </w:rPr>
+            </w:pPr>
+            <w:r>
+              <w:rPr>
+                <w:color w:val="000000"/>
+                <w:sz w:val="16"/>
+                <w:szCs w:val="16"/>
+              </w:rPr>
+              <w:t>Generator Field</w:t>
+            </w:r>
+          </w:p>
+        </w:tc>
+        <w:tc>
+          <w:tcPr>
+            <w:tcW w:w="1016" w:type="dxa"/>
+            <w:tcBorders>
+              <w:top w:val="single" w:sz="4" w:space="0" w:color="000000"/>
+              <w:left w:val="single" w:sz="4" w:space="0" w:color="000000"/>
+              <w:bottom w:val="single" w:sz="4" w:space="0" w:color="000000"/>
+            </w:tcBorders>
+            <w:vAlign w:val="bottom"/>
+          </w:tcPr>
+          <w:p>
+            <w:pPr>
+              <w:pStyle w:val="Normal"/>
+              <w:widowControl w:val="false"/>
+              <w:jc w:val="center"/>
+              <w:rPr>
+                <w:color w:val="000000"/>
+                <w:sz w:val="16"/>
+                <w:szCs w:val="16"/>
+              </w:rPr>
+            </w:pPr>
+            <w:r>
+              <w:rPr>
+                <w:color w:val="000000"/>
+                <w:sz w:val="16"/>
+                <w:szCs w:val="16"/>
+              </w:rPr>
+              <w:t>Brake</w:t>
+            </w:r>
+          </w:p>
+          <w:p>
+            <w:pPr>
+              <w:pStyle w:val="Normal"/>
+              <w:widowControl w:val="false"/>
+              <w:jc w:val="center"/>
+              <w:rPr>
+                <w:color w:val="000000"/>
+                <w:sz w:val="16"/>
+                <w:szCs w:val="16"/>
+              </w:rPr>
+            </w:pPr>
+            <w:r>
+              <w:rPr>
+                <w:color w:val="000000"/>
+                <w:sz w:val="16"/>
+                <w:szCs w:val="16"/>
+              </w:rPr>
+              <w:t>Lead</w:t>
+            </w:r>
+          </w:p>
+        </w:tc>
+        <w:tc>
+          <w:tcPr>
+            <w:tcW w:w="1016" w:type="dxa"/>
+            <w:tcBorders>
+              <w:top w:val="single" w:sz="4" w:space="0" w:color="000000"/>
+              <w:left w:val="single" w:sz="4" w:space="0" w:color="000000"/>
+              <w:bottom w:val="single" w:sz="4" w:space="0" w:color="000000"/>
+            </w:tcBorders>
+            <w:vAlign w:val="bottom"/>
+          </w:tcPr>
+          <w:p>
+            <w:pPr>
+              <w:pStyle w:val="Normal"/>
+              <w:widowControl w:val="false"/>
+              <w:spacing w:lineRule="auto" w:line="180"/>
+              <w:jc w:val="center"/>
+              <w:rPr>
+                <w:color w:val="000000"/>
+                <w:sz w:val="16"/>
+                <w:szCs w:val="16"/>
+              </w:rPr>
+            </w:pPr>
+            <w:r>
+              <w:rPr>
+                <w:color w:val="000000"/>
+                <w:sz w:val="16"/>
+                <w:szCs w:val="16"/>
+              </w:rPr>
+              <w:t>HEP Start</w:t>
+            </w:r>
+          </w:p>
+        </w:tc>
+        <w:tc>
+          <w:tcPr>
+            <w:tcW w:w="1017" w:type="dxa"/>
+            <w:tcBorders>
+              <w:top w:val="single" w:sz="4" w:space="0" w:color="000000"/>
+              <w:left w:val="single" w:sz="4" w:space="0" w:color="000000"/>
+              <w:bottom w:val="single" w:sz="4" w:space="0" w:color="000000"/>
+            </w:tcBorders>
+            <w:vAlign w:val="bottom"/>
+          </w:tcPr>
+          <w:p>
+            <w:pPr>
+              <w:pStyle w:val="Normal"/>
+              <w:widowControl w:val="false"/>
+              <w:jc w:val="center"/>
+              <w:rPr>
+                <w:color w:val="000000"/>
+                <w:sz w:val="16"/>
+                <w:szCs w:val="16"/>
+              </w:rPr>
+            </w:pPr>
+            <w:r>
+              <w:rPr>
+                <w:rFonts w:eastAsia="arial" w:ascii="arial" w:hAnsi="arial"/>
+                <w:color w:val="000000"/>
+                <w:sz w:val="16"/>
+                <w:szCs w:val="16"/>
+              </w:rPr>
+              <w:t>Isolation Run</w:t>
+            </w:r>
+          </w:p>
+        </w:tc>
+        <w:tc>
+          <w:tcPr>
+            <w:tcW w:w="1016" w:type="dxa"/>
+            <w:tcBorders>
+              <w:top w:val="single" w:sz="4" w:space="0" w:color="000000"/>
+              <w:left w:val="single" w:sz="4" w:space="0" w:color="000000"/>
+              <w:bottom w:val="single" w:sz="4" w:space="0" w:color="000000"/>
+            </w:tcBorders>
+            <w:vAlign w:val="bottom"/>
+          </w:tcPr>
+          <w:p>
+            <w:pPr>
+              <w:pStyle w:val="Normal"/>
+              <w:widowControl w:val="false"/>
+              <w:jc w:val="center"/>
+              <w:rPr>
+                <w:sz w:val="16"/>
+                <w:szCs w:val="16"/>
+              </w:rPr>
+            </w:pPr>
+            <w:r>
+              <w:rPr>
+                <w:sz w:val="16"/>
+                <w:szCs w:val="16"/>
+              </w:rPr>
+              <w:t>Rear HL Up</w:t>
+            </w:r>
+          </w:p>
+        </w:tc>
+        <w:tc>
+          <w:tcPr>
+            <w:tcW w:w="1020" w:type="dxa"/>
+            <w:tcBorders>
+              <w:top w:val="single" w:sz="4" w:space="0" w:color="000000"/>
+              <w:left w:val="single" w:sz="4" w:space="0" w:color="000000"/>
+              <w:bottom w:val="single" w:sz="4" w:space="0" w:color="000000"/>
+            </w:tcBorders>
+            <w:vAlign w:val="bottom"/>
+          </w:tcPr>
+          <w:p>
+            <w:pPr>
+              <w:pStyle w:val="Normal"/>
+              <w:widowControl w:val="false"/>
+              <w:jc w:val="center"/>
+              <w:rPr>
+                <w:color w:val="000000"/>
+                <w:sz w:val="16"/>
+                <w:szCs w:val="16"/>
+              </w:rPr>
+            </w:pPr>
+            <w:r>
+              <w:rPr>
+                <w:rFonts w:eastAsia="arial" w:ascii="arial" w:hAnsi="arial"/>
+                <w:color w:val="000000"/>
+                <w:sz w:val="16"/>
+                <w:szCs w:val="16"/>
+              </w:rPr>
+              <w:t>HEP On</w:t>
+            </w:r>
+          </w:p>
+        </w:tc>
+        <w:tc>
+          <w:tcPr>
+            <w:tcW w:w="1016" w:type="dxa"/>
+            <w:tcBorders>
+              <w:top w:val="single" w:sz="4" w:space="0" w:color="000000"/>
+              <w:left w:val="single" w:sz="4" w:space="0" w:color="000000"/>
+              <w:bottom w:val="single" w:sz="4" w:space="0" w:color="000000"/>
+            </w:tcBorders>
+            <w:vAlign w:val="bottom"/>
+          </w:tcPr>
+          <w:p>
+            <w:pPr>
+              <w:pStyle w:val="Normal"/>
+              <w:widowControl w:val="false"/>
+              <w:spacing w:lineRule="auto" w:line="180"/>
+              <w:jc w:val="center"/>
+              <w:rPr>
+                <w:sz w:val="16"/>
+                <w:szCs w:val="16"/>
+              </w:rPr>
+            </w:pPr>
+            <w:r>
+              <w:rPr>
+                <w:rFonts w:eastAsia="arial" w:ascii="arial" w:hAnsi="arial"/>
+                <w:color w:val="000000"/>
+                <w:sz w:val="16"/>
+                <w:szCs w:val="16"/>
+              </w:rPr>
+              <w:t>Gauge Light</w:t>
+            </w:r>
+          </w:p>
+        </w:tc>
+        <w:tc>
+          <w:tcPr>
+            <w:tcW w:w="1016" w:type="dxa"/>
+            <w:tcBorders>
+              <w:top w:val="single" w:sz="4" w:space="0" w:color="000000"/>
+              <w:left w:val="single" w:sz="4" w:space="0" w:color="000000"/>
+              <w:bottom w:val="single" w:sz="4" w:space="0" w:color="000000"/>
+            </w:tcBorders>
+            <w:vAlign w:val="bottom"/>
+          </w:tcPr>
+          <w:p>
+            <w:pPr>
+              <w:pStyle w:val="Normal"/>
+              <w:widowControl w:val="false"/>
+              <w:spacing w:lineRule="auto" w:line="180"/>
+              <w:jc w:val="center"/>
+              <w:rPr>
+                <w:sz w:val="16"/>
+                <w:szCs w:val="16"/>
+              </w:rPr>
+            </w:pPr>
+            <w:r>
+              <w:rPr>
+                <w:sz w:val="16"/>
+                <w:szCs w:val="16"/>
+              </w:rPr>
+              <w:t>Cab Light</w:t>
+            </w:r>
+          </w:p>
+        </w:tc>
+        <w:tc>
+          <w:tcPr>
+            <w:tcW w:w="1016" w:type="dxa"/>
+            <w:tcBorders>
+              <w:top w:val="single" w:sz="4" w:space="0" w:color="000000"/>
+              <w:left w:val="single" w:sz="4" w:space="0" w:color="000000"/>
+              <w:bottom w:val="single" w:sz="4" w:space="0" w:color="000000"/>
+            </w:tcBorders>
+            <w:vAlign w:val="bottom"/>
+          </w:tcPr>
+          <w:p>
+            <w:pPr>
+              <w:pStyle w:val="Normal"/>
+              <w:widowControl w:val="false"/>
+              <w:spacing w:lineRule="auto" w:line="180"/>
+              <w:jc w:val="center"/>
+              <w:rPr>
+                <w:sz w:val="16"/>
+                <w:szCs w:val="16"/>
+              </w:rPr>
+            </w:pPr>
+            <w:r>
+              <w:rPr>
+                <w:rFonts w:eastAsia="arial" w:ascii="arial" w:hAnsi="arial"/>
+                <w:color w:val="000000"/>
+                <w:sz w:val="16"/>
+                <w:szCs w:val="16"/>
+              </w:rPr>
+              <w:t>1-Person</w:t>
+            </w:r>
+          </w:p>
+        </w:tc>
+        <w:tc>
+          <w:tcPr>
+            <w:tcW w:w="1029" w:type="dxa"/>
+            <w:tcBorders>
+              <w:top w:val="single" w:sz="4" w:space="0" w:color="000000"/>
+              <w:left w:val="single" w:sz="4" w:space="0" w:color="000000"/>
+              <w:bottom w:val="single" w:sz="4" w:space="0" w:color="000000"/>
+              <w:right w:val="single" w:sz="4" w:space="0" w:color="000000"/>
+            </w:tcBorders>
+            <w:vAlign w:val="bottom"/>
+          </w:tcPr>
+          <w:p>
+            <w:pPr>
+              <w:pStyle w:val="Normal"/>
+              <w:widowControl w:val="false"/>
+              <w:spacing w:lineRule="auto" w:line="180"/>
+              <w:jc w:val="center"/>
+              <w:rPr>
+                <w:sz w:val="16"/>
+                <w:szCs w:val="16"/>
+              </w:rPr>
+            </w:pPr>
+            <w:r>
+              <w:rPr>
+                <w:rFonts w:eastAsia="arial" w:ascii="arial" w:hAnsi="arial"/>
+                <w:color w:val="000000"/>
+                <w:sz w:val="16"/>
+                <w:szCs w:val="16"/>
+              </w:rPr>
+              <w:t>Next</w:t>
+            </w:r>
+          </w:p>
+          <w:p>
+            <w:pPr>
+              <w:pStyle w:val="Normal"/>
+              <w:widowControl w:val="false"/>
+              <w:spacing w:lineRule="auto" w:line="180"/>
+              <w:jc w:val="center"/>
+              <w:rPr>
+                <w:sz w:val="16"/>
+                <w:szCs w:val="16"/>
+              </w:rPr>
+            </w:pPr>
+            <w:r>
+              <w:rPr>
+                <w:rFonts w:eastAsia="arial" w:ascii="arial" w:hAnsi="arial"/>
+                <w:color w:val="000000"/>
+                <w:sz w:val="16"/>
+                <w:szCs w:val="16"/>
+              </w:rPr>
+              <w:t>Cab Cam</w:t>
+            </w:r>
+          </w:p>
+        </w:tc>
+      </w:tr>
+    </w:tbl>
+    <w:p>
+      <w:pPr>
+        <w:pStyle w:val="Normal"/>
+        <w:rPr>
+          <w:color w:val="000000"/>
+          <w:sz w:val="16"/>
+          <w:szCs w:val="16"/>
+        </w:rPr>
+      </w:pPr>
+      <w:r>
+        <w:rPr>
+          <w:rFonts w:eastAsia="arial" w:ascii="arial" w:hAnsi="arial"/>
+          <w:color w:val="000000"/>
+          <w:sz w:val="16"/>
+          <w:szCs w:val="16"/>
+        </w:rPr>
+        <w:tab/>
+        <w:t xml:space="preserve">           F59PHR-2</w:t>
+      </w:r>
+    </w:p>
+    <w:tbl>
+      <w:tblPr>
+        <w:tblW w:w="14248" w:type="dxa"/>
+        <w:jc w:val="left"/>
+        <w:tblInd w:w="-5" w:type="dxa"/>
+        <w:tblLayout w:type="fixed"/>
+        <w:tblCellMar>
+          <w:top w:w="0" w:type="dxa"/>
+          <w:left w:w="108" w:type="dxa"/>
+          <w:bottom w:w="0" w:type="dxa"/>
+          <w:right w:w="108" w:type="dxa"/>
+        </w:tblCellMar>
+        <w:tblLook w:firstRow="1" w:noVBand="1" w:lastRow="0" w:firstColumn="1" w:lastColumn="0" w:noHBand="0" w:val="04a0"/>
+      </w:tblPr>
+      <w:tblGrid>
+        <w:gridCol w:w="1017"/>
+        <w:gridCol w:w="1019"/>
+        <w:gridCol w:w="1014"/>
+        <w:gridCol w:w="1016"/>
+        <w:gridCol w:w="1020"/>
+        <w:gridCol w:w="1016"/>
+        <w:gridCol w:w="1016"/>
+        <w:gridCol w:w="1017"/>
+        <w:gridCol w:w="1016"/>
+        <w:gridCol w:w="1020"/>
+        <w:gridCol w:w="1016"/>
+        <w:gridCol w:w="1016"/>
+        <w:gridCol w:w="1016"/>
+        <w:gridCol w:w="1029"/>
+      </w:tblGrid>
+      <w:tr>
+        <w:trPr>
+          <w:trHeight w:val="440" w:hRule="exact"/>
+          <w:cantSplit w:val="true"/>
+        </w:trPr>
+        <w:tc>
+          <w:tcPr>
+            <w:tcW w:w="1017" w:type="dxa"/>
+            <w:tcBorders>
+              <w:top w:val="single" w:sz="4" w:space="0" w:color="000000"/>
+              <w:left w:val="single" w:sz="4" w:space="0" w:color="000000"/>
+              <w:bottom w:val="single" w:sz="4" w:space="0" w:color="000000"/>
+            </w:tcBorders>
+            <w:vAlign w:val="bottom"/>
+          </w:tcPr>
+          <w:p>
+            <w:pPr>
+              <w:pStyle w:val="Normal"/>
+              <w:widowControl w:val="false"/>
+              <w:spacing w:lineRule="auto" w:line="180" w:before="0" w:after="60"/>
+              <w:jc w:val="center"/>
+              <w:rPr>
+                <w:b/>
+                <w:bCs/>
+              </w:rPr>
+            </w:pPr>
+            <w:r>
+              <w:rPr>
+                <w:b/>
+                <w:bCs/>
+                <w:color w:val="000000"/>
+                <w:sz w:val="16"/>
+                <w:szCs w:val="16"/>
+              </w:rPr>
+              <w:t>HUD</w:t>
+            </w:r>
+          </w:p>
+        </w:tc>
+        <w:tc>
+          <w:tcPr>
+            <w:tcW w:w="1019" w:type="dxa"/>
+            <w:tcBorders>
+              <w:top w:val="single" w:sz="4" w:space="0" w:color="000000"/>
+              <w:left w:val="single" w:sz="4" w:space="0" w:color="000000"/>
+              <w:bottom w:val="single" w:sz="4" w:space="0" w:color="000000"/>
+            </w:tcBorders>
+            <w:vAlign w:val="bottom"/>
+          </w:tcPr>
+          <w:p>
+            <w:pPr>
+              <w:pStyle w:val="Normal"/>
+              <w:widowControl w:val="false"/>
+              <w:spacing w:lineRule="auto" w:line="180"/>
+              <w:jc w:val="center"/>
+              <w:rPr>
+                <w:color w:val="000000"/>
+                <w:sz w:val="16"/>
+                <w:szCs w:val="16"/>
+              </w:rPr>
+            </w:pPr>
+            <w:r>
+              <w:rPr>
+                <w:color w:val="000000"/>
+                <w:sz w:val="16"/>
+                <w:szCs w:val="16"/>
+              </w:rPr>
+              <w:t>Schedule</w:t>
+            </w:r>
+          </w:p>
+        </w:tc>
+        <w:tc>
+          <w:tcPr>
+            <w:tcW w:w="1014" w:type="dxa"/>
+            <w:tcBorders>
+              <w:top w:val="single" w:sz="4" w:space="0" w:color="000000"/>
+              <w:left w:val="single" w:sz="4" w:space="0" w:color="000000"/>
+              <w:bottom w:val="single" w:sz="4" w:space="0" w:color="000000"/>
+            </w:tcBorders>
+            <w:vAlign w:val="bottom"/>
+          </w:tcPr>
+          <w:p>
+            <w:pPr>
+              <w:pStyle w:val="Normal"/>
+              <w:widowControl w:val="false"/>
+              <w:spacing w:lineRule="auto" w:line="180"/>
+              <w:jc w:val="center"/>
+              <w:rPr>
+                <w:color w:val="000000"/>
+                <w:sz w:val="16"/>
+                <w:szCs w:val="16"/>
+              </w:rPr>
+            </w:pPr>
+            <w:r>
+              <w:rPr>
+                <w:rFonts w:eastAsia="arial" w:ascii="arial" w:hAnsi="arial"/>
+                <w:color w:val="000000"/>
+                <w:sz w:val="16"/>
+                <w:szCs w:val="16"/>
+              </w:rPr>
+              <w:t>Engine Stop</w:t>
+            </w:r>
+          </w:p>
+        </w:tc>
+        <w:tc>
+          <w:tcPr>
+            <w:tcW w:w="1016" w:type="dxa"/>
+            <w:tcBorders>
+              <w:top w:val="single" w:sz="4" w:space="0" w:color="000000"/>
+              <w:left w:val="single" w:sz="4" w:space="0" w:color="000000"/>
+              <w:bottom w:val="single" w:sz="4" w:space="0" w:color="000000"/>
+            </w:tcBorders>
+            <w:vAlign w:val="bottom"/>
+          </w:tcPr>
+          <w:p>
+            <w:pPr>
+              <w:pStyle w:val="Normal"/>
+              <w:widowControl w:val="false"/>
+              <w:spacing w:lineRule="auto" w:line="180"/>
+              <w:jc w:val="center"/>
+              <w:rPr>
+                <w:color w:val="000000"/>
+                <w:sz w:val="16"/>
+                <w:szCs w:val="16"/>
+              </w:rPr>
+            </w:pPr>
+            <w:r>
+              <w:rPr>
+                <w:color w:val="000000"/>
+                <w:sz w:val="16"/>
+                <w:szCs w:val="16"/>
+              </w:rPr>
+              <w:t>TMS</w:t>
+            </w:r>
+          </w:p>
+        </w:tc>
+        <w:tc>
+          <w:tcPr>
+            <w:tcW w:w="1020" w:type="dxa"/>
+            <w:tcBorders>
+              <w:top w:val="single" w:sz="4" w:space="0" w:color="000000"/>
+              <w:left w:val="single" w:sz="4" w:space="0" w:color="000000"/>
+              <w:bottom w:val="single" w:sz="4" w:space="0" w:color="000000"/>
+            </w:tcBorders>
+            <w:vAlign w:val="bottom"/>
+          </w:tcPr>
+          <w:p>
+            <w:pPr>
+              <w:pStyle w:val="Normal"/>
+              <w:widowControl w:val="false"/>
+              <w:spacing w:lineRule="auto" w:line="180"/>
+              <w:jc w:val="center"/>
+              <w:rPr>
+                <w:color w:val="000000"/>
+                <w:sz w:val="16"/>
+                <w:szCs w:val="16"/>
+              </w:rPr>
+            </w:pPr>
+            <w:r>
+              <w:rPr>
+                <w:color w:val="000000"/>
+                <w:sz w:val="16"/>
+                <w:szCs w:val="16"/>
+              </w:rPr>
+              <w:t>Control &amp; Fuel Pump</w:t>
+            </w:r>
+          </w:p>
+        </w:tc>
+        <w:tc>
+          <w:tcPr>
+            <w:tcW w:w="1016" w:type="dxa"/>
+            <w:tcBorders>
+              <w:top w:val="single" w:sz="4" w:space="0" w:color="000000"/>
+              <w:left w:val="single" w:sz="4" w:space="0" w:color="000000"/>
+              <w:bottom w:val="single" w:sz="4" w:space="0" w:color="000000"/>
+            </w:tcBorders>
+            <w:vAlign w:val="bottom"/>
+          </w:tcPr>
+          <w:p>
+            <w:pPr>
+              <w:pStyle w:val="Normal"/>
+              <w:widowControl w:val="false"/>
+              <w:jc w:val="center"/>
+              <w:rPr>
+                <w:color w:val="000000"/>
+                <w:sz w:val="16"/>
+                <w:szCs w:val="16"/>
+              </w:rPr>
+            </w:pPr>
+            <w:r>
+              <w:rPr>
+                <w:color w:val="000000"/>
+                <w:sz w:val="16"/>
+                <w:szCs w:val="16"/>
+              </w:rPr>
+              <w:t>Brake</w:t>
+            </w:r>
+          </w:p>
+          <w:p>
+            <w:pPr>
+              <w:pStyle w:val="Normal"/>
+              <w:widowControl w:val="false"/>
+              <w:jc w:val="center"/>
+              <w:rPr>
+                <w:color w:val="000000"/>
+                <w:sz w:val="16"/>
+                <w:szCs w:val="16"/>
+              </w:rPr>
+            </w:pPr>
+            <w:r>
+              <w:rPr>
+                <w:color w:val="000000"/>
+                <w:sz w:val="16"/>
+                <w:szCs w:val="16"/>
+              </w:rPr>
+              <w:t>Trail</w:t>
+            </w:r>
+          </w:p>
+        </w:tc>
+        <w:tc>
+          <w:tcPr>
+            <w:tcW w:w="1016" w:type="dxa"/>
+            <w:tcBorders>
+              <w:top w:val="single" w:sz="4" w:space="0" w:color="000000"/>
+              <w:left w:val="single" w:sz="4" w:space="0" w:color="000000"/>
+              <w:bottom w:val="single" w:sz="4" w:space="0" w:color="000000"/>
+            </w:tcBorders>
+            <w:vAlign w:val="bottom"/>
+          </w:tcPr>
+          <w:p>
+            <w:pPr>
+              <w:pStyle w:val="Normal"/>
+              <w:widowControl w:val="false"/>
+              <w:spacing w:lineRule="auto" w:line="180"/>
+              <w:jc w:val="center"/>
+              <w:rPr>
+                <w:color w:val="000000"/>
+                <w:sz w:val="16"/>
+                <w:szCs w:val="16"/>
+              </w:rPr>
+            </w:pPr>
+            <w:r>
+              <w:rPr>
+                <w:rFonts w:eastAsia="arial" w:ascii="arial" w:hAnsi="arial"/>
+                <w:color w:val="000000"/>
+                <w:sz w:val="16"/>
+                <w:szCs w:val="16"/>
+              </w:rPr>
+              <w:t>HEP Stop</w:t>
+            </w:r>
+          </w:p>
+        </w:tc>
+        <w:tc>
+          <w:tcPr>
+            <w:tcW w:w="1017" w:type="dxa"/>
+            <w:tcBorders>
+              <w:top w:val="single" w:sz="4" w:space="0" w:color="000000"/>
+              <w:left w:val="single" w:sz="4" w:space="0" w:color="000000"/>
+              <w:bottom w:val="single" w:sz="4" w:space="0" w:color="000000"/>
+            </w:tcBorders>
+            <w:vAlign w:val="bottom"/>
+          </w:tcPr>
+          <w:p>
+            <w:pPr>
+              <w:pStyle w:val="Normal"/>
+              <w:widowControl w:val="false"/>
+              <w:jc w:val="center"/>
+              <w:rPr>
+                <w:color w:val="000000"/>
+                <w:sz w:val="16"/>
+                <w:szCs w:val="16"/>
+              </w:rPr>
+            </w:pPr>
+            <w:r>
+              <w:rPr>
+                <w:rFonts w:eastAsia="arial" w:ascii="arial" w:hAnsi="arial"/>
+                <w:color w:val="000000"/>
+                <w:sz w:val="16"/>
+                <w:szCs w:val="16"/>
+              </w:rPr>
+              <w:t>Isolation Start Iso.</w:t>
+            </w:r>
+          </w:p>
+        </w:tc>
+        <w:tc>
+          <w:tcPr>
+            <w:tcW w:w="1016" w:type="dxa"/>
+            <w:tcBorders>
+              <w:top w:val="single" w:sz="4" w:space="0" w:color="000000"/>
+              <w:left w:val="single" w:sz="4" w:space="0" w:color="000000"/>
+              <w:bottom w:val="single" w:sz="4" w:space="0" w:color="000000"/>
+            </w:tcBorders>
+            <w:vAlign w:val="bottom"/>
+          </w:tcPr>
+          <w:p>
+            <w:pPr>
+              <w:pStyle w:val="Normal"/>
+              <w:widowControl w:val="false"/>
+              <w:jc w:val="center"/>
+              <w:rPr>
+                <w:sz w:val="16"/>
+                <w:szCs w:val="16"/>
+              </w:rPr>
+            </w:pPr>
+            <w:r>
+              <w:rPr>
+                <w:rFonts w:eastAsia="arial" w:ascii="arial" w:hAnsi="arial"/>
+                <w:color w:val="000000"/>
+                <w:sz w:val="16"/>
+                <w:szCs w:val="16"/>
+              </w:rPr>
+              <w:t>Rear HL Down</w:t>
+            </w:r>
+          </w:p>
+        </w:tc>
+        <w:tc>
+          <w:tcPr>
+            <w:tcW w:w="1020" w:type="dxa"/>
+            <w:tcBorders>
+              <w:top w:val="single" w:sz="4" w:space="0" w:color="000000"/>
+              <w:left w:val="single" w:sz="4" w:space="0" w:color="000000"/>
+              <w:bottom w:val="single" w:sz="4" w:space="0" w:color="000000"/>
+            </w:tcBorders>
+            <w:vAlign w:val="bottom"/>
+          </w:tcPr>
+          <w:p>
+            <w:pPr>
+              <w:pStyle w:val="Normal"/>
+              <w:widowControl w:val="false"/>
+              <w:jc w:val="center"/>
+              <w:rPr>
+                <w:color w:val="000000"/>
+                <w:sz w:val="16"/>
+                <w:szCs w:val="16"/>
+              </w:rPr>
+            </w:pPr>
+            <w:r>
+              <w:rPr>
+                <w:rFonts w:eastAsia="arial" w:ascii="arial" w:hAnsi="arial"/>
+                <w:color w:val="000000"/>
+                <w:sz w:val="16"/>
+                <w:szCs w:val="16"/>
+              </w:rPr>
+              <w:t>HEP Off</w:t>
+            </w:r>
+          </w:p>
+        </w:tc>
+        <w:tc>
+          <w:tcPr>
+            <w:tcW w:w="1016" w:type="dxa"/>
+            <w:tcBorders>
+              <w:top w:val="single" w:sz="4" w:space="0" w:color="000000"/>
+              <w:left w:val="single" w:sz="4" w:space="0" w:color="000000"/>
+              <w:bottom w:val="single" w:sz="4" w:space="0" w:color="000000"/>
+            </w:tcBorders>
+            <w:vAlign w:val="bottom"/>
+          </w:tcPr>
+          <w:p>
+            <w:pPr>
+              <w:pStyle w:val="Normal"/>
+              <w:widowControl w:val="false"/>
+              <w:spacing w:lineRule="auto" w:line="180"/>
+              <w:jc w:val="center"/>
+              <w:rPr>
+                <w:sz w:val="16"/>
+                <w:szCs w:val="16"/>
+              </w:rPr>
+            </w:pPr>
+            <w:r>
+              <w:rPr>
+                <w:rFonts w:eastAsia="arial" w:ascii="arial" w:hAnsi="arial"/>
+                <w:color w:val="000000"/>
+                <w:sz w:val="16"/>
+                <w:szCs w:val="16"/>
+              </w:rPr>
+              <w:t>Step Light</w:t>
+            </w:r>
+          </w:p>
+        </w:tc>
+        <w:tc>
+          <w:tcPr>
+            <w:tcW w:w="1016" w:type="dxa"/>
+            <w:tcBorders>
+              <w:top w:val="single" w:sz="4" w:space="0" w:color="000000"/>
+              <w:left w:val="single" w:sz="4" w:space="0" w:color="000000"/>
+              <w:bottom w:val="single" w:sz="4" w:space="0" w:color="000000"/>
+            </w:tcBorders>
+            <w:vAlign w:val="bottom"/>
+          </w:tcPr>
+          <w:p>
+            <w:pPr>
+              <w:pStyle w:val="Normal"/>
+              <w:widowControl w:val="false"/>
+              <w:spacing w:lineRule="auto" w:line="180"/>
+              <w:jc w:val="center"/>
+              <w:rPr>
+                <w:sz w:val="16"/>
+                <w:szCs w:val="16"/>
+              </w:rPr>
+            </w:pPr>
+            <w:r>
+              <w:rPr>
+                <w:sz w:val="16"/>
+                <w:szCs w:val="16"/>
+              </w:rPr>
+              <w:t>Marker Light</w:t>
+            </w:r>
+          </w:p>
+        </w:tc>
+        <w:tc>
+          <w:tcPr>
+            <w:tcW w:w="1016" w:type="dxa"/>
+            <w:tcBorders>
+              <w:top w:val="single" w:sz="4" w:space="0" w:color="000000"/>
+              <w:left w:val="single" w:sz="4" w:space="0" w:color="000000"/>
+              <w:bottom w:val="single" w:sz="4" w:space="0" w:color="000000"/>
+            </w:tcBorders>
+            <w:vAlign w:val="bottom"/>
+          </w:tcPr>
+          <w:p>
+            <w:pPr>
+              <w:pStyle w:val="Normal"/>
+              <w:widowControl w:val="false"/>
+              <w:spacing w:lineRule="auto" w:line="180"/>
+              <w:jc w:val="center"/>
+              <w:rPr>
+                <w:sz w:val="16"/>
+                <w:szCs w:val="16"/>
+              </w:rPr>
+            </w:pPr>
+            <w:r>
+              <w:rPr>
+                <w:rFonts w:eastAsia="arial" w:ascii="arial" w:hAnsi="arial"/>
+                <w:color w:val="000000"/>
+                <w:sz w:val="16"/>
+                <w:szCs w:val="16"/>
+              </w:rPr>
+              <w:t>Exterior</w:t>
+            </w:r>
+          </w:p>
+          <w:p>
+            <w:pPr>
+              <w:pStyle w:val="Normal"/>
+              <w:widowControl w:val="false"/>
+              <w:spacing w:lineRule="auto" w:line="180"/>
+              <w:jc w:val="center"/>
+              <w:rPr>
+                <w:sz w:val="16"/>
+                <w:szCs w:val="16"/>
+              </w:rPr>
+            </w:pPr>
+            <w:r>
+              <w:rPr>
+                <w:rFonts w:eastAsia="arial" w:ascii="arial" w:hAnsi="arial"/>
+                <w:color w:val="000000"/>
+                <w:sz w:val="16"/>
+                <w:szCs w:val="16"/>
+              </w:rPr>
+              <w:t>Camera</w:t>
+            </w:r>
+          </w:p>
+        </w:tc>
+        <w:tc>
+          <w:tcPr>
+            <w:tcW w:w="1029" w:type="dxa"/>
+            <w:tcBorders>
+              <w:top w:val="single" w:sz="4" w:space="0" w:color="000000"/>
+              <w:left w:val="single" w:sz="4" w:space="0" w:color="000000"/>
+              <w:bottom w:val="single" w:sz="4" w:space="0" w:color="000000"/>
+              <w:right w:val="single" w:sz="4" w:space="0" w:color="000000"/>
+            </w:tcBorders>
+            <w:vAlign w:val="bottom"/>
+          </w:tcPr>
+          <w:p>
+            <w:pPr>
+              <w:pStyle w:val="Normal"/>
+              <w:widowControl w:val="false"/>
+              <w:spacing w:lineRule="auto" w:line="180"/>
+              <w:jc w:val="center"/>
+              <w:rPr>
+                <w:sz w:val="16"/>
+                <w:szCs w:val="16"/>
+              </w:rPr>
+            </w:pPr>
+            <w:r>
+              <w:rPr>
+                <w:rFonts w:eastAsia="arial" w:ascii="arial" w:hAnsi="arial"/>
+                <w:color w:val="000000"/>
+                <w:sz w:val="16"/>
+                <w:szCs w:val="16"/>
+              </w:rPr>
+              <w:t>Prev</w:t>
+            </w:r>
+          </w:p>
+          <w:p>
+            <w:pPr>
+              <w:pStyle w:val="Normal"/>
+              <w:widowControl w:val="false"/>
+              <w:spacing w:lineRule="auto" w:line="180"/>
+              <w:jc w:val="center"/>
+              <w:rPr>
+                <w:sz w:val="16"/>
+                <w:szCs w:val="16"/>
+              </w:rPr>
+            </w:pPr>
+            <w:r>
+              <w:rPr>
+                <w:rFonts w:eastAsia="arial" w:ascii="arial" w:hAnsi="arial"/>
+                <w:color w:val="000000"/>
+                <w:sz w:val="16"/>
+                <w:szCs w:val="16"/>
+              </w:rPr>
+              <w:t>Cab Cam</w:t>
+            </w:r>
+          </w:p>
+        </w:tc>
+      </w:tr>
+    </w:tbl>
+    <w:p>
+      <w:pPr>
+        <w:pStyle w:val="Normal"/>
+        <w:rPr>
+          <w:color w:val="000000"/>
+          <w:sz w:val="16"/>
+          <w:szCs w:val="16"/>
+        </w:rPr>
+      </w:pPr>
+      <w:r>
+        <w:rPr>
+          <w:color w:val="000000"/>
+          <w:sz w:val="16"/>
+          <w:szCs w:val="16"/>
+        </w:rPr>
+      </w:r>
+    </w:p>
+    <w:p>
+      <w:pPr>
+        <w:pStyle w:val="Normal"/>
+        <w:rPr>
+          <w:color w:val="000000"/>
+          <w:sz w:val="16"/>
+          <w:szCs w:val="16"/>
+        </w:rPr>
+      </w:pPr>
+      <w:r>
+        <w:rPr>
+          <w:color w:val="000000"/>
+          <w:sz w:val="16"/>
+          <w:szCs w:val="16"/>
+        </w:rPr>
+        <w:tab/>
+        <w:t xml:space="preserve">       </w:t>
+      </w:r>
+      <w:r>
+        <w:rPr>
+          <w:rFonts w:eastAsia="arial" w:ascii="arial" w:hAnsi="arial"/>
+          <w:color w:val="000000"/>
+          <w:sz w:val="16"/>
+          <w:szCs w:val="16"/>
+        </w:rPr>
         <w:t xml:space="preserve">    </w:t>
       </w:r>
       <w:r>
@@ -21696,7 +22832,7 @@
           <w:sz w:val="16"/>
           <w:szCs w:val="16"/>
         </w:rPr>
-        <w:t>F59PHR</w:t>
+        <w:t>Rotem Bi-level Cab Car</w:t>
       </w:r>
       <w:r>
         <w:rPr>
@@ -21823,49 +22959,17 @@
             <w:pPr>
               <w:pStyle w:val="Normal"/>
               <w:widowControl w:val="false"/>
-              <w:jc w:val="center"/>
-              <w:rPr>
-                <w:rFonts w:ascii="arial" w:hAnsi="arial" w:eastAsia="arial"/>
-                <w:color w:val="000000"/>
-                <w:sz w:val="16"/>
-                <w:szCs w:val="16"/>
-              </w:rPr>
-            </w:pPr>
-            <w:r>
-              <w:rPr>
-                <w:rFonts w:eastAsia="arial" w:ascii="arial" w:hAnsi="arial"/>
-                <w:color w:val="000000"/>
-                <w:sz w:val="16"/>
-                <w:szCs w:val="16"/>
-              </w:rPr>
-              <w:t>Engine Start</w:t>
-            </w:r>
-          </w:p>
-        </w:tc>
-        <w:tc>
-          <w:tcPr>
-            <w:tcW w:w="1016" w:type="dxa"/>
-            <w:tcBorders>
-              <w:top w:val="single" w:sz="4" w:space="0" w:color="000000"/>
-              <w:left w:val="single" w:sz="4" w:space="0" w:color="000000"/>
-              <w:bottom w:val="single" w:sz="4" w:space="0" w:color="000000"/>
-            </w:tcBorders>
-            <w:vAlign w:val="bottom"/>
-          </w:tcPr>
-          <w:p>
-            <w:pPr>
-              <w:pStyle w:val="Normal"/>
-              <w:widowControl w:val="false"/>
-              <w:spacing w:lineRule="auto" w:line="180"/>
-              <w:jc w:val="center"/>
-              <w:rPr>
-                <w:color w:val="000000"/>
-                <w:sz w:val="16"/>
-                <w:szCs w:val="16"/>
-              </w:rPr>
-            </w:pPr>
-            <w:r>
-              <w:rPr>
+              <w:spacing w:lineRule="auto" w:line="180"/>
+              <w:jc w:val="center"/>
+              <w:rPr>
+                <w:color w:val="000000"/>
+                <w:sz w:val="16"/>
+                <w:szCs w:val="16"/>
+              </w:rPr>
+            </w:pPr>
+            <w:r>
+              <w:rPr>
+                <w:rFonts w:eastAsia="arial" w:ascii="arial" w:hAnsi="arial"/>
                 <w:color w:val="000000"/>
                 <w:sz w:val="16"/>
                 <w:szCs w:val="16"/>
@@ -21876,6 +22980,38 @@
         </w:tc>
         <w:tc>
           <w:tcPr>
+            <w:tcW w:w="1016" w:type="dxa"/>
+            <w:tcBorders>
+              <w:top w:val="single" w:sz="4" w:space="0" w:color="000000"/>
+              <w:left w:val="single" w:sz="4" w:space="0" w:color="000000"/>
+              <w:bottom w:val="single" w:sz="4" w:space="0" w:color="000000"/>
+            </w:tcBorders>
+            <w:vAlign w:val="bottom"/>
+          </w:tcPr>
+          <w:p>
+            <w:pPr>
+              <w:pStyle w:val="Normal"/>
+              <w:widowControl w:val="false"/>
+              <w:spacing w:lineRule="auto" w:line="180"/>
+              <w:jc w:val="center"/>
+              <w:rPr>
+                <w:color w:val="000000"/>
+                <w:sz w:val="16"/>
+                <w:szCs w:val="16"/>
+              </w:rPr>
+            </w:pPr>
+            <w:r>
+              <w:rPr>
+                <w:color w:val="000000"/>
+                <w:sz w:val="16"/>
+                <w:szCs w:val="16"/>
+              </w:rPr>
+              <w:t>ATS</w:t>
+            </w:r>
+          </w:p>
+        </w:tc>
+        <w:tc>
+          <w:tcPr>
             <w:tcW w:w="1020" w:type="dxa"/>
             <w:tcBorders>
               <w:top w:val="single" w:sz="4" w:space="0" w:color="000000"/>
@@ -21953,39 +23089,34 @@
                 <w:sz w:val="16"/>
                 <w:szCs w:val="16"/>
               </w:rPr>
-              <w:t>Lead</w:t>
-            </w:r>
-          </w:p>
-        </w:tc>
-        <w:tc>
-          <w:tcPr>
-            <w:tcW w:w="1016" w:type="dxa"/>
-            <w:tcBorders>
-              <w:top w:val="single" w:sz="4" w:space="0" w:color="000000"/>
-              <w:left w:val="single" w:sz="4" w:space="0" w:color="000000"/>
-              <w:bottom w:val="single" w:sz="4" w:space="0" w:color="000000"/>
-            </w:tcBorders>
-            <w:vAlign w:val="bottom"/>
-          </w:tcPr>
-          <w:p>
-            <w:pPr>
-              <w:pStyle w:val="Normal"/>
-              <w:widowControl w:val="false"/>
-              <w:spacing w:lineRule="auto" w:line="180"/>
-              <w:jc w:val="center"/>
-              <w:rPr>
-                <w:color w:val="000000"/>
-                <w:sz w:val="16"/>
-                <w:szCs w:val="16"/>
-              </w:rPr>
-            </w:pPr>
-            <w:r>
-              <w:rPr>
-                <w:color w:val="000000"/>
-                <w:sz w:val="16"/>
-                <w:szCs w:val="16"/>
-              </w:rPr>
-              <w:t>HEP Start</w:t>
+              <w:t>Cut-In</w:t>
+            </w:r>
+          </w:p>
+        </w:tc>
+        <w:tc>
+          <w:tcPr>
+            <w:tcW w:w="1016" w:type="dxa"/>
+            <w:tcBorders>
+              <w:top w:val="single" w:sz="4" w:space="0" w:color="000000"/>
+              <w:left w:val="single" w:sz="4" w:space="0" w:color="000000"/>
+              <w:bottom w:val="single" w:sz="4" w:space="0" w:color="000000"/>
+            </w:tcBorders>
+            <w:vAlign w:val="bottom"/>
+          </w:tcPr>
+          <w:p>
+            <w:pPr>
+              <w:pStyle w:val="Normal"/>
+              <w:widowControl w:val="false"/>
+              <w:spacing w:lineRule="auto" w:line="180"/>
+              <w:jc w:val="center"/>
+              <w:rPr>
+                <w:color w:val="000000"/>
+                <w:sz w:val="16"/>
+                <w:szCs w:val="16"/>
+              </w:rPr>
+            </w:pPr>
+            <w:r>
+              <w:rPr/>
             </w:r>
           </w:p>
         </w:tc>
@@ -22011,42 +23142,39 @@
               </w:rPr>
             </w:pPr>
             <w:r>
-              <w:rPr>
-                <w:rFonts w:eastAsia="arial" w:ascii="arial" w:hAnsi="arial"/>
-                <w:color w:val="000000"/>
-                <w:sz w:val="16"/>
-                <w:szCs w:val="16"/>
-              </w:rPr>
-              <w:t>Isolation Run</w:t>
-            </w:r>
-          </w:p>
-        </w:tc>
-        <w:tc>
-          <w:tcPr>
-            <w:tcW w:w="1016" w:type="dxa"/>
-            <w:tcBorders>
-              <w:top w:val="single" w:sz="4" w:space="0" w:color="000000"/>
-              <w:left w:val="single" w:sz="4" w:space="0" w:color="000000"/>
-              <w:bottom w:val="single" w:sz="4" w:space="0" w:color="000000"/>
-            </w:tcBorders>
-            <w:vAlign w:val="bottom"/>
-          </w:tcPr>
-          <w:p>
-            <w:pPr>
-              <w:pStyle w:val="Normal"/>
-              <w:widowControl w:val="false"/>
-              <w:jc w:val="center"/>
-              <w:rPr>
-                <w:sz w:val="16"/>
-                <w:szCs w:val="16"/>
-              </w:rPr>
-            </w:pPr>
-            <w:r>
-              <w:rPr>
-                <w:sz w:val="16"/>
-                <w:szCs w:val="16"/>
-              </w:rPr>
-              <w:t>Rear HL Up</w:t>
+              <w:rPr/>
+            </w:r>
+          </w:p>
+        </w:tc>
+        <w:tc>
+          <w:tcPr>
+            <w:tcW w:w="1016" w:type="dxa"/>
+            <w:tcBorders>
+              <w:top w:val="single" w:sz="4" w:space="0" w:color="000000"/>
+              <w:left w:val="single" w:sz="4" w:space="0" w:color="000000"/>
+              <w:bottom w:val="single" w:sz="4" w:space="0" w:color="000000"/>
+            </w:tcBorders>
+            <w:vAlign w:val="bottom"/>
+          </w:tcPr>
+          <w:p>
+            <w:pPr>
+              <w:pStyle w:val="Normal"/>
+              <w:widowControl w:val="false"/>
+              <w:jc w:val="center"/>
+              <w:rPr>
+                <w:color w:val="000000"/>
+                <w:sz w:val="16"/>
+                <w:szCs w:val="16"/>
+              </w:rPr>
+            </w:pPr>
+            <w:r>
+              <w:rPr>
+                <w:rFonts w:eastAsia="arial" w:ascii="arial" w:hAnsi="arial"/>
+                <w:color w:val="000000"/>
+                <w:sz w:val="16"/>
+                <w:szCs w:val="16"/>
+              </w:rPr>
+              <w:t>HEP Alarm Cut-Out</w:t>
             </w:r>
           </w:p>
         </w:tc>
@@ -22078,39 +23206,38 @@
                 <w:sz w:val="16"/>
                 <w:szCs w:val="16"/>
               </w:rPr>
-              <w:t>HEP On</w:t>
-            </w:r>
-          </w:p>
-        </w:tc>
-        <w:tc>
-          <w:tcPr>
-            <w:tcW w:w="1016" w:type="dxa"/>
-            <w:tcBorders>
-              <w:top w:val="single" w:sz="4" w:space="0" w:color="000000"/>
-              <w:left w:val="single" w:sz="4" w:space="0" w:color="000000"/>
-              <w:bottom w:val="single" w:sz="4" w:space="0" w:color="000000"/>
-            </w:tcBorders>
-            <w:vAlign w:val="bottom"/>
-          </w:tcPr>
-          <w:p>
-            <w:pPr>
-              <w:pStyle w:val="Normal"/>
-              <w:widowControl w:val="false"/>
-              <w:spacing w:lineRule="auto" w:line="180"/>
-              <w:jc w:val="center"/>
-              <w:rPr>
-                <w:sz w:val="16"/>
-                <w:szCs w:val="16"/>
-              </w:rPr>
-            </w:pPr>
-            <w:r>
-              <w:rPr>
-                <w:rFonts w:eastAsia="arial" w:ascii="arial" w:hAnsi="arial"/>
-                <w:color w:val="000000"/>
-                <w:sz w:val="16"/>
-                <w:szCs w:val="16"/>
-              </w:rPr>
-              <w:t>Gauge Light</w:t>
+              <w:t>Number Light</w:t>
+            </w:r>
+          </w:p>
+        </w:tc>
+        <w:tc>
+          <w:tcPr>
+            <w:tcW w:w="1016" w:type="dxa"/>
+            <w:tcBorders>
+              <w:top w:val="single" w:sz="4" w:space="0" w:color="000000"/>
+              <w:left w:val="single" w:sz="4" w:space="0" w:color="000000"/>
+              <w:bottom w:val="single" w:sz="4" w:space="0" w:color="000000"/>
+            </w:tcBorders>
+            <w:vAlign w:val="bottom"/>
+          </w:tcPr>
+          <w:p>
+            <w:pPr>
+              <w:pStyle w:val="Normal"/>
+              <w:widowControl w:val="false"/>
+              <w:jc w:val="center"/>
+              <w:rPr>
+                <w:sz w:val="16"/>
+                <w:szCs w:val="16"/>
+              </w:rPr>
+            </w:pPr>
+            <w:r>
+              <w:rPr>
+                <w:rFonts w:eastAsia="arial" w:ascii="arial" w:hAnsi="arial"/>
+                <w:color w:val="000000"/>
+                <w:sz w:val="16"/>
+                <w:szCs w:val="16"/>
+              </w:rPr>
+              <w:t>Gauge Light Up</w:t>
             </w:r>
           </w:p>
         </w:tc>
@@ -22232,6 +23359,24 @@
         </w:tc>
       </w:tr>
     </w:tbl>
+    <w:p>
+      <w:pPr>
+        <w:pStyle w:val="Normal"/>
+        <w:rPr>
+          <w:color w:val="000000"/>
+          <w:sz w:val="16"/>
+          <w:szCs w:val="16"/>
+        </w:rPr>
+      </w:pPr>
+      <w:r>
+        <w:rPr>
+          <w:rFonts w:eastAsia="arial" w:ascii="arial" w:hAnsi="arial"/>
+          <w:color w:val="000000"/>
+          <w:sz w:val="16"/>
+          <w:szCs w:val="16"/>
+        </w:rPr>
+      </w:r>
+    </w:p>
     <w:p>
       <w:pPr>
         <w:pStyle w:val="Normal"/>
@@ -22258,7 +23403,7 @@
           <w:sz w:val="16"/>
           <w:szCs w:val="16"/>
         </w:rPr>
-        <w:t>F59PHR</w:t>
+        <w:t>Rotem Bi-level Cab Car</w:t>
       </w:r>
       <w:r>
         <w:rPr>
@@ -22399,7 +23544,7 @@
                 <w:sz w:val="16"/>
                 <w:szCs w:val="16"/>
               </w:rPr>
-              <w:t>Engine Stop</w:t>
+              <w:t>Cab Setup</w:t>
             </w:r>
           </w:p>
         </w:tc>
@@ -22463,7 +23608,7 @@
                 <w:sz w:val="16"/>
                 <w:szCs w:val="16"/>
               </w:rPr>
-              <w:t>Control &amp; Fuel Pump</w:t>
+              <w:t>Fuel Pump</w:t>
             </w:r>
           </w:p>
         </w:tc>
@@ -22514,40 +23659,34 @@
                 <w:sz w:val="16"/>
                 <w:szCs w:val="16"/>
               </w:rPr>
-              <w:t>Trail</w:t>
-            </w:r>
-          </w:p>
-        </w:tc>
-        <w:tc>
-          <w:tcPr>
-            <w:tcW w:w="1016" w:type="dxa"/>
-            <w:tcBorders>
-              <w:top w:val="single" w:sz="4" w:space="0" w:color="000000"/>
-              <w:left w:val="single" w:sz="4" w:space="0" w:color="000000"/>
-              <w:bottom w:val="single" w:sz="4" w:space="0" w:color="000000"/>
-            </w:tcBorders>
-            <w:vAlign w:val="bottom"/>
-          </w:tcPr>
-          <w:p>
-            <w:pPr>
-              <w:pStyle w:val="Normal"/>
-              <w:widowControl w:val="false"/>
-              <w:spacing w:lineRule="auto" w:line="180"/>
-              <w:jc w:val="center"/>
-              <w:rPr>
-                <w:color w:val="000000"/>
-                <w:sz w:val="16"/>
-                <w:szCs w:val="16"/>
-              </w:rPr>
-            </w:pPr>
-            <w:r>
-              <w:rPr>
-                <w:rFonts w:eastAsia="arial" w:ascii="arial" w:hAnsi="arial"/>
-                <w:color w:val="000000"/>
-                <w:sz w:val="16"/>
-                <w:szCs w:val="16"/>
-              </w:rPr>
-              <w:t>HEP Stop</w:t>
+              <w:t>Cut-Out</w:t>
+            </w:r>
+          </w:p>
+        </w:tc>
+        <w:tc>
+          <w:tcPr>
+            <w:tcW w:w="1016" w:type="dxa"/>
+            <w:tcBorders>
+              <w:top w:val="single" w:sz="4" w:space="0" w:color="000000"/>
+              <w:left w:val="single" w:sz="4" w:space="0" w:color="000000"/>
+              <w:bottom w:val="single" w:sz="4" w:space="0" w:color="000000"/>
+            </w:tcBorders>
+            <w:vAlign w:val="bottom"/>
+          </w:tcPr>
+          <w:p>
+            <w:pPr>
+              <w:pStyle w:val="Normal"/>
+              <w:widowControl w:val="false"/>
+              <w:spacing w:lineRule="auto" w:line="180"/>
+              <w:jc w:val="center"/>
+              <w:rPr>
+                <w:color w:val="000000"/>
+                <w:sz w:val="16"/>
+                <w:szCs w:val="16"/>
+              </w:rPr>
+            </w:pPr>
+            <w:r>
+              <w:rPr/>
             </w:r>
           </w:p>
         </w:tc>
@@ -22573,44 +23712,32 @@
               </w:rPr>
             </w:pPr>
             <w:r>
-              <w:rPr>
-                <w:rFonts w:eastAsia="arial" w:ascii="arial" w:hAnsi="arial"/>
-                <w:color w:val="000000"/>
-                <w:sz w:val="16"/>
-                <w:szCs w:val="16"/>
-              </w:rPr>
-              <w:t>Isolation Start Iso.</w:t>
-            </w:r>
-          </w:p>
-        </w:tc>
-        <w:tc>
-          <w:tcPr>
-            <w:tcW w:w="1016" w:type="dxa"/>
-            <w:tcBorders>
-              <w:top w:val="single" w:sz="4" w:space="0" w:color="000000"/>
-              <w:left w:val="single" w:sz="4" w:space="0" w:color="000000"/>
-              <w:bottom w:val="single" w:sz="4" w:space="0" w:color="000000"/>
-            </w:tcBorders>
-            <w:vAlign w:val="bottom"/>
-          </w:tcPr>
-          <w:p>
-            <w:pPr>
-              <w:pStyle w:val="Normal"/>
-              <w:widowControl w:val="false"/>
-              <w:jc w:val="center"/>
-              <w:rPr>
-                <w:sz w:val="16"/>
-                <w:szCs w:val="16"/>
-              </w:rPr>
-            </w:pPr>
-            <w:r>
-              <w:rPr>
-                <w:rFonts w:eastAsia="arial" w:ascii="arial" w:hAnsi="arial"/>
-                <w:color w:val="000000"/>
-                <w:sz w:val="16"/>
-                <w:szCs w:val="16"/>
-              </w:rPr>
-              <w:t>Rear HL Down</w:t>
+              <w:rPr/>
+            </w:r>
+          </w:p>
+        </w:tc>
+        <w:tc>
+          <w:tcPr>
+            <w:tcW w:w="1016" w:type="dxa"/>
+            <w:tcBorders>
+              <w:top w:val="single" w:sz="4" w:space="0" w:color="000000"/>
+              <w:left w:val="single" w:sz="4" w:space="0" w:color="000000"/>
+              <w:bottom w:val="single" w:sz="4" w:space="0" w:color="000000"/>
+            </w:tcBorders>
+            <w:vAlign w:val="bottom"/>
+          </w:tcPr>
+          <w:p>
+            <w:pPr>
+              <w:pStyle w:val="Normal"/>
+              <w:widowControl w:val="false"/>
+              <w:jc w:val="center"/>
+              <w:rPr>
+                <w:sz w:val="16"/>
+                <w:szCs w:val="16"/>
+              </w:rPr>
+            </w:pPr>
+            <w:r>
+              <w:rPr/>
             </w:r>
           </w:p>
         </w:tc>
@@ -22642,39 +23769,38 @@
                 <w:sz w:val="16"/>
                 <w:szCs w:val="16"/>
               </w:rPr>
-              <w:t>HEP Off</w:t>
-            </w:r>
-          </w:p>
-        </w:tc>
-        <w:tc>
-          <w:tcPr>
-            <w:tcW w:w="1016" w:type="dxa"/>
-            <w:tcBorders>
-              <w:top w:val="single" w:sz="4" w:space="0" w:color="000000"/>
-              <w:left w:val="single" w:sz="4" w:space="0" w:color="000000"/>
-              <w:bottom w:val="single" w:sz="4" w:space="0" w:color="000000"/>
-            </w:tcBorders>
-            <w:vAlign w:val="bottom"/>
-          </w:tcPr>
-          <w:p>
-            <w:pPr>
-              <w:pStyle w:val="Normal"/>
-              <w:widowControl w:val="false"/>
-              <w:spacing w:lineRule="auto" w:line="180"/>
-              <w:jc w:val="center"/>
-              <w:rPr>
-                <w:sz w:val="16"/>
-                <w:szCs w:val="16"/>
-              </w:rPr>
-            </w:pPr>
-            <w:r>
-              <w:rPr>
-                <w:rFonts w:eastAsia="arial" w:ascii="arial" w:hAnsi="arial"/>
-                <w:color w:val="000000"/>
-                <w:sz w:val="16"/>
-                <w:szCs w:val="16"/>
-              </w:rPr>
-              <w:t>Step Light</w:t>
+              <w:t>Aux Light Flash</w:t>
+            </w:r>
+          </w:p>
+        </w:tc>
+        <w:tc>
+          <w:tcPr>
+            <w:tcW w:w="1016" w:type="dxa"/>
+            <w:tcBorders>
+              <w:top w:val="single" w:sz="4" w:space="0" w:color="000000"/>
+              <w:left w:val="single" w:sz="4" w:space="0" w:color="000000"/>
+              <w:bottom w:val="single" w:sz="4" w:space="0" w:color="000000"/>
+            </w:tcBorders>
+            <w:vAlign w:val="bottom"/>
+          </w:tcPr>
+          <w:p>
+            <w:pPr>
+              <w:pStyle w:val="Normal"/>
+              <w:widowControl w:val="false"/>
+              <w:jc w:val="center"/>
+              <w:rPr>
+                <w:sz w:val="16"/>
+                <w:szCs w:val="16"/>
+              </w:rPr>
+            </w:pPr>
+            <w:r>
+              <w:rPr>
+                <w:rFonts w:eastAsia="arial" w:ascii="arial" w:hAnsi="arial"/>
+                <w:color w:val="000000"/>
+                <w:sz w:val="16"/>
+                <w:szCs w:val="16"/>
+              </w:rPr>
+              <w:t>Gauge Light Dw</w:t>
             </w:r>
           </w:p>
         </w:tc>
@@ -23855,12 +24981,12 @@
       <w:rFonts w:ascii="Symbol" w:hAnsi="Symbol" w:cs="Symbol"/>
     </w:rPr>
   </w:style>
-  <w:style w:type="character" w:styleId="user" w:customStyle="1">
-    <w:name w:val="번호 매기기 기호 (user)"/>
+  <w:style w:type="character" w:styleId="Style5" w:customStyle="1">
+    <w:name w:val="번호 매기기 기호"/>
     <w:qFormat/>
     <w:rPr/>
   </w:style>
-  <w:style w:type="paragraph" w:styleId="Style5">
+  <w:style w:type="paragraph" w:styleId="Style6">
     <w:name w:val="제목"/>
     <w:basedOn w:val="Normal"/>
     <w:next w:val="BodyText"/>
@@ -23870,7 +24996,7 @@
       <w:spacing w:before="240" w:after="120"/>
     </w:pPr>
     <w:rPr>
-      <w:rFonts w:ascii="Liberation Sans" w:hAnsi="Liberation Sans" w:eastAsia="Noto Sans CJK KR" w:cs="Lohit Devanagari"/>
+      <w:rFonts w:ascii="Liberation Sans" w:hAnsi="Liberation Sans" w:eastAsia="나눔고딕" w:cs="Arial"/>
       <w:sz w:val="28"/>
       <w:szCs w:val="28"/>
     </w:rPr>
@@ -23907,7 +25033,7 @@
       <w:szCs w:val="24"/>
     </w:rPr>
   </w:style>
-  <w:style w:type="paragraph" w:styleId="Style6" w:customStyle="1">
+  <w:style w:type="paragraph" w:styleId="Style7">
     <w:name w:val="색인"/>
     <w:basedOn w:val="Normal"/>
     <w:qFormat/>
@@ -23915,10 +25041,11 @@
       <w:suppressLineNumbers/>
     </w:pPr>
     <w:rPr>
-      <w:rFonts w:cs="Lohit Devanagari"/>
+      <w:rFonts w:cs="Arial"/>
+      <w:sz w:val="24"/>
     </w:rPr>
   </w:style>
-  <w:style w:type="paragraph" w:styleId="user1">
+  <w:style w:type="paragraph" w:styleId="user">
     <w:name w:val="제목 (user)"/>
     <w:basedOn w:val="Normal"/>
     <w:next w:val="BodyText"/>
@@ -23928,12 +25055,12 @@
       <w:spacing w:before="240" w:after="120"/>
     </w:pPr>
     <w:rPr>
-      <w:rFonts w:ascii="Liberation Sans" w:hAnsi="Liberation Sans" w:eastAsia="나눔고딕" w:cs="Arial"/>
+      <w:rFonts w:ascii="Liberation Sans" w:hAnsi="Liberation Sans" w:eastAsia="Noto Sans CJK KR" w:cs="Lohit Devanagari"/>
       <w:sz w:val="28"/>
       <w:szCs w:val="28"/>
     </w:rPr>
   </w:style>
-  <w:style w:type="paragraph" w:styleId="user2">
+  <w:style w:type="paragraph" w:styleId="user1" w:customStyle="1">
     <w:name w:val="색인 (user)"/>
     <w:basedOn w:val="Normal"/>
     <w:qFormat/>
@@ -23941,8 +25068,7 @@
       <w:suppressLineNumbers/>
     </w:pPr>
     <w:rPr>
-      <w:rFonts w:cs="Arial"/>
-      <w:sz w:val="24"/>
+      <w:rFonts w:cs="Lohit Devanagari"/>
     </w:rPr>
   </w:style>
   <w:style w:type="paragraph" w:styleId="Title">
@@ -24624,8 +25750,8 @@
       <w:szCs w:val="24"/>
     </w:rPr>
   </w:style>
-  <w:style w:type="paragraph" w:styleId="Style7" w:customStyle="1">
-    <w:name w:val="표 내용"/>
+  <w:style w:type="paragraph" w:styleId="user2" w:customStyle="1">
+    <w:name w:val="표 내용 (user)"/>
     <w:basedOn w:val="Normal"/>
     <w:qFormat/>
     <w:pPr>
@@ -24633,9 +25759,9 @@
     </w:pPr>
     <w:rPr/>
   </w:style>
-  <w:style w:type="paragraph" w:styleId="Style8" w:customStyle="1">
-    <w:name w:val="표제목"/>
-    <w:basedOn w:val="Style7"/>
+  <w:style w:type="paragraph" w:styleId="user3" w:customStyle="1">
+    <w:name w:val="표제목 (user)"/>
+    <w:basedOn w:val="user2"/>
     <w:qFormat/>
     <w:pPr>
       <w:jc w:val="center"/>
@@ -24645,8 +25771,8 @@
       <w:bCs/>
     </w:rPr>
   </w:style>
-  <w:style w:type="paragraph" w:styleId="user3">
-    <w:name w:val="표 내용 (user)"/>
+  <w:style w:type="paragraph" w:styleId="Style8">
+    <w:name w:val="표 내용"/>
     <w:basedOn w:val="Normal"/>
     <w:qFormat/>
     <w:pPr>
@@ -24655,9 +25781,9 @@
     </w:pPr>
     <w:rPr/>
   </w:style>
-  <w:style w:type="paragraph" w:styleId="user4">
-    <w:name w:val="표제목 (user)"/>
-    <w:basedOn w:val="user3"/>
+  <w:style w:type="paragraph" w:styleId="Style9">
+    <w:name w:val="표제목"/>
+    <w:basedOn w:val="Style8"/>
     <w:qFormat/>
     <w:pPr>
       <w:suppressLineNumbers/>

</xml_diff>

<commit_message>
Add ALP-45DP, ALP-46 and Multi-Level Commuter Cab Car
</commit_message>
<xml_diff>
--- a/raildriver-USA-Remapped.docx
+++ b/raildriver-USA-Remapped.docx
@@ -29634,6 +29634,3480 @@
           <w:sz w:val="16"/>
           <w:szCs w:val="16"/>
         </w:rPr>
+        <w:t xml:space="preserve">    Amfleet Cab Car-1</w:t>
+      </w:r>
+    </w:p>
+    <w:tbl>
+      <w:tblPr>
+        <w:tblW w:w="14248" w:type="dxa"/>
+        <w:jc w:val="left"/>
+        <w:tblInd w:w="-5" w:type="dxa"/>
+        <w:tblLayout w:type="fixed"/>
+        <w:tblCellMar>
+          <w:top w:w="0" w:type="dxa"/>
+          <w:left w:w="108" w:type="dxa"/>
+          <w:bottom w:w="0" w:type="dxa"/>
+          <w:right w:w="108" w:type="dxa"/>
+        </w:tblCellMar>
+        <w:tblLook w:firstRow="1" w:noVBand="1" w:lastRow="0" w:firstColumn="1" w:lastColumn="0" w:noHBand="0" w:val="04a0"/>
+      </w:tblPr>
+      <w:tblGrid>
+        <w:gridCol w:w="1017"/>
+        <w:gridCol w:w="1019"/>
+        <w:gridCol w:w="1014"/>
+        <w:gridCol w:w="1016"/>
+        <w:gridCol w:w="1020"/>
+        <w:gridCol w:w="1016"/>
+        <w:gridCol w:w="1016"/>
+        <w:gridCol w:w="1017"/>
+        <w:gridCol w:w="1016"/>
+        <w:gridCol w:w="1020"/>
+        <w:gridCol w:w="1016"/>
+        <w:gridCol w:w="1016"/>
+        <w:gridCol w:w="1016"/>
+        <w:gridCol w:w="1029"/>
+      </w:tblGrid>
+      <w:tr>
+        <w:trPr>
+          <w:trHeight w:val="440" w:hRule="exact"/>
+          <w:cantSplit w:val="true"/>
+        </w:trPr>
+        <w:tc>
+          <w:tcPr>
+            <w:tcW w:w="1017" w:type="dxa"/>
+            <w:tcBorders>
+              <w:top w:val="single" w:sz="4" w:space="0" w:color="000000"/>
+              <w:left w:val="single" w:sz="4" w:space="0" w:color="000000"/>
+              <w:bottom w:val="single" w:sz="4" w:space="0" w:color="000000"/>
+            </w:tcBorders>
+            <w:vAlign w:val="bottom"/>
+          </w:tcPr>
+          <w:p>
+            <w:pPr>
+              <w:pStyle w:val="Normal"/>
+              <w:widowControl w:val="false"/>
+              <w:spacing w:lineRule="auto" w:line="180" w:before="0" w:after="60"/>
+              <w:jc w:val="center"/>
+              <w:rPr>
+                <w:color w:val="000000"/>
+                <w:sz w:val="16"/>
+                <w:szCs w:val="16"/>
+              </w:rPr>
+            </w:pPr>
+            <w:r>
+              <w:rPr>
+                <w:rFonts w:eastAsia="arial" w:ascii="arial" w:hAnsi="arial"/>
+                <w:b/>
+                <w:color w:val="000000"/>
+                <w:sz w:val="16"/>
+                <w:szCs w:val="16"/>
+              </w:rPr>
+              <w:t>Pause</w:t>
+            </w:r>
+          </w:p>
+        </w:tc>
+        <w:tc>
+          <w:tcPr>
+            <w:tcW w:w="1019" w:type="dxa"/>
+            <w:tcBorders>
+              <w:top w:val="single" w:sz="4" w:space="0" w:color="000000"/>
+              <w:left w:val="single" w:sz="4" w:space="0" w:color="000000"/>
+              <w:bottom w:val="single" w:sz="4" w:space="0" w:color="000000"/>
+            </w:tcBorders>
+            <w:vAlign w:val="bottom"/>
+          </w:tcPr>
+          <w:p>
+            <w:pPr>
+              <w:pStyle w:val="Normal"/>
+              <w:widowControl w:val="false"/>
+              <w:spacing w:lineRule="auto" w:line="180"/>
+              <w:jc w:val="center"/>
+              <w:rPr>
+                <w:color w:val="000000"/>
+                <w:sz w:val="16"/>
+                <w:szCs w:val="16"/>
+              </w:rPr>
+            </w:pPr>
+            <w:r>
+              <w:rPr>
+                <w:color w:val="000000"/>
+                <w:sz w:val="16"/>
+                <w:szCs w:val="16"/>
+              </w:rPr>
+            </w:r>
+          </w:p>
+        </w:tc>
+        <w:tc>
+          <w:tcPr>
+            <w:tcW w:w="1014" w:type="dxa"/>
+            <w:tcBorders>
+              <w:top w:val="single" w:sz="4" w:space="0" w:color="000000"/>
+              <w:left w:val="single" w:sz="4" w:space="0" w:color="000000"/>
+              <w:bottom w:val="single" w:sz="4" w:space="0" w:color="000000"/>
+            </w:tcBorders>
+            <w:vAlign w:val="bottom"/>
+          </w:tcPr>
+          <w:p>
+            <w:pPr>
+              <w:pStyle w:val="Normal"/>
+              <w:widowControl w:val="false"/>
+              <w:jc w:val="center"/>
+              <w:rPr>
+                <w:rFonts w:ascii="arial" w:hAnsi="arial" w:eastAsia="arial"/>
+                <w:color w:val="000000"/>
+                <w:sz w:val="16"/>
+                <w:szCs w:val="16"/>
+              </w:rPr>
+            </w:pPr>
+            <w:r>
+              <w:rPr>
+                <w:rFonts w:eastAsia="arial" w:ascii="arial" w:hAnsi="arial"/>
+                <w:color w:val="000000"/>
+                <w:sz w:val="16"/>
+                <w:szCs w:val="16"/>
+              </w:rPr>
+              <w:t>MCB</w:t>
+            </w:r>
+          </w:p>
+        </w:tc>
+        <w:tc>
+          <w:tcPr>
+            <w:tcW w:w="1016" w:type="dxa"/>
+            <w:tcBorders>
+              <w:top w:val="single" w:sz="4" w:space="0" w:color="000000"/>
+              <w:left w:val="single" w:sz="4" w:space="0" w:color="000000"/>
+              <w:bottom w:val="single" w:sz="4" w:space="0" w:color="000000"/>
+            </w:tcBorders>
+            <w:vAlign w:val="bottom"/>
+          </w:tcPr>
+          <w:p>
+            <w:pPr>
+              <w:pStyle w:val="Normal"/>
+              <w:widowControl w:val="false"/>
+              <w:spacing w:lineRule="auto" w:line="180"/>
+              <w:jc w:val="center"/>
+              <w:rPr>
+                <w:color w:val="000000"/>
+                <w:sz w:val="16"/>
+                <w:szCs w:val="16"/>
+              </w:rPr>
+            </w:pPr>
+            <w:r>
+              <w:rPr>
+                <w:color w:val="000000"/>
+                <w:sz w:val="16"/>
+                <w:szCs w:val="16"/>
+              </w:rPr>
+              <w:t>ATC/ACSES</w:t>
+            </w:r>
+          </w:p>
+        </w:tc>
+        <w:tc>
+          <w:tcPr>
+            <w:tcW w:w="1020" w:type="dxa"/>
+            <w:tcBorders>
+              <w:top w:val="single" w:sz="4" w:space="0" w:color="000000"/>
+              <w:left w:val="single" w:sz="4" w:space="0" w:color="000000"/>
+              <w:bottom w:val="single" w:sz="4" w:space="0" w:color="000000"/>
+            </w:tcBorders>
+            <w:vAlign w:val="bottom"/>
+          </w:tcPr>
+          <w:p>
+            <w:pPr>
+              <w:pStyle w:val="Normal"/>
+              <w:widowControl w:val="false"/>
+              <w:spacing w:lineRule="auto" w:line="180"/>
+              <w:jc w:val="center"/>
+              <w:rPr>
+                <w:color w:val="000000"/>
+                <w:sz w:val="16"/>
+                <w:szCs w:val="16"/>
+              </w:rPr>
+            </w:pPr>
+            <w:r>
+              <w:rPr>
+                <w:color w:val="000000"/>
+                <w:sz w:val="16"/>
+                <w:szCs w:val="16"/>
+              </w:rPr>
+              <w:t>Panto.</w:t>
+            </w:r>
+          </w:p>
+        </w:tc>
+        <w:tc>
+          <w:tcPr>
+            <w:tcW w:w="1016" w:type="dxa"/>
+            <w:tcBorders>
+              <w:top w:val="single" w:sz="4" w:space="0" w:color="000000"/>
+              <w:left w:val="single" w:sz="4" w:space="0" w:color="000000"/>
+              <w:bottom w:val="single" w:sz="4" w:space="0" w:color="000000"/>
+            </w:tcBorders>
+            <w:vAlign w:val="bottom"/>
+          </w:tcPr>
+          <w:p>
+            <w:pPr>
+              <w:pStyle w:val="Normal"/>
+              <w:widowControl w:val="false"/>
+              <w:spacing w:lineRule="auto" w:line="180"/>
+              <w:jc w:val="center"/>
+              <w:rPr>
+                <w:color w:val="000000"/>
+                <w:sz w:val="16"/>
+                <w:szCs w:val="16"/>
+              </w:rPr>
+            </w:pPr>
+            <w:r>
+              <w:rPr>
+                <w:color w:val="000000"/>
+                <w:sz w:val="16"/>
+                <w:szCs w:val="16"/>
+              </w:rPr>
+            </w:r>
+          </w:p>
+        </w:tc>
+        <w:tc>
+          <w:tcPr>
+            <w:tcW w:w="1016" w:type="dxa"/>
+            <w:tcBorders>
+              <w:top w:val="single" w:sz="4" w:space="0" w:color="000000"/>
+              <w:left w:val="single" w:sz="4" w:space="0" w:color="000000"/>
+              <w:bottom w:val="single" w:sz="4" w:space="0" w:color="000000"/>
+            </w:tcBorders>
+            <w:vAlign w:val="bottom"/>
+          </w:tcPr>
+          <w:p>
+            <w:pPr>
+              <w:pStyle w:val="Normal"/>
+              <w:widowControl w:val="false"/>
+              <w:jc w:val="center"/>
+              <w:rPr>
+                <w:color w:val="000000"/>
+                <w:sz w:val="16"/>
+                <w:szCs w:val="16"/>
+              </w:rPr>
+            </w:pPr>
+            <w:r>
+              <w:rPr>
+                <w:color w:val="000000"/>
+                <w:sz w:val="16"/>
+                <w:szCs w:val="16"/>
+              </w:rPr>
+              <w:t>Brake Lead</w:t>
+            </w:r>
+          </w:p>
+        </w:tc>
+        <w:tc>
+          <w:tcPr>
+            <w:tcW w:w="1017" w:type="dxa"/>
+            <w:tcBorders>
+              <w:top w:val="single" w:sz="4" w:space="0" w:color="000000"/>
+              <w:left w:val="single" w:sz="4" w:space="0" w:color="000000"/>
+              <w:bottom w:val="single" w:sz="4" w:space="0" w:color="000000"/>
+            </w:tcBorders>
+            <w:vAlign w:val="bottom"/>
+          </w:tcPr>
+          <w:p>
+            <w:pPr>
+              <w:pStyle w:val="Normal"/>
+              <w:widowControl w:val="false"/>
+              <w:jc w:val="center"/>
+              <w:rPr>
+                <w:color w:val="000000"/>
+                <w:sz w:val="16"/>
+                <w:szCs w:val="16"/>
+              </w:rPr>
+            </w:pPr>
+            <w:r>
+              <w:rPr>
+                <w:rFonts w:eastAsia="arial" w:ascii="arial" w:hAnsi="arial"/>
+                <w:color w:val="000000"/>
+                <w:sz w:val="16"/>
+                <w:szCs w:val="16"/>
+              </w:rPr>
+              <w:t>EQ Reg.</w:t>
+            </w:r>
+          </w:p>
+          <w:p>
+            <w:pPr>
+              <w:pStyle w:val="Normal"/>
+              <w:widowControl w:val="false"/>
+              <w:jc w:val="center"/>
+              <w:rPr>
+                <w:color w:val="000000"/>
+                <w:sz w:val="16"/>
+                <w:szCs w:val="16"/>
+              </w:rPr>
+            </w:pPr>
+            <w:r>
+              <w:rPr>
+                <w:rFonts w:eastAsia="arial" w:ascii="arial" w:hAnsi="arial"/>
+                <w:color w:val="000000"/>
+                <w:sz w:val="16"/>
+                <w:szCs w:val="16"/>
+              </w:rPr>
+              <w:t>Increase</w:t>
+            </w:r>
+          </w:p>
+        </w:tc>
+        <w:tc>
+          <w:tcPr>
+            <w:tcW w:w="1016" w:type="dxa"/>
+            <w:tcBorders>
+              <w:top w:val="single" w:sz="4" w:space="0" w:color="000000"/>
+              <w:left w:val="single" w:sz="4" w:space="0" w:color="000000"/>
+              <w:bottom w:val="single" w:sz="4" w:space="0" w:color="000000"/>
+            </w:tcBorders>
+            <w:vAlign w:val="bottom"/>
+          </w:tcPr>
+          <w:p>
+            <w:pPr>
+              <w:pStyle w:val="Normal"/>
+              <w:widowControl w:val="false"/>
+              <w:jc w:val="center"/>
+              <w:rPr>
+                <w:sz w:val="16"/>
+                <w:szCs w:val="16"/>
+              </w:rPr>
+            </w:pPr>
+            <w:r>
+              <w:rPr>
+                <w:sz w:val="16"/>
+                <w:szCs w:val="16"/>
+              </w:rPr>
+              <w:t>Strobe Light Wh</w:t>
+            </w:r>
+          </w:p>
+        </w:tc>
+        <w:tc>
+          <w:tcPr>
+            <w:tcW w:w="1020" w:type="dxa"/>
+            <w:tcBorders>
+              <w:top w:val="single" w:sz="4" w:space="0" w:color="000000"/>
+              <w:left w:val="single" w:sz="4" w:space="0" w:color="000000"/>
+              <w:bottom w:val="single" w:sz="4" w:space="0" w:color="000000"/>
+            </w:tcBorders>
+            <w:vAlign w:val="bottom"/>
+          </w:tcPr>
+          <w:p>
+            <w:pPr>
+              <w:pStyle w:val="Normal"/>
+              <w:widowControl w:val="false"/>
+              <w:jc w:val="center"/>
+              <w:rPr>
+                <w:color w:val="000000"/>
+                <w:sz w:val="16"/>
+                <w:szCs w:val="16"/>
+              </w:rPr>
+            </w:pPr>
+            <w:r>
+              <w:rPr>
+                <w:rFonts w:eastAsia="arial" w:ascii="arial" w:hAnsi="arial"/>
+                <w:color w:val="000000"/>
+                <w:sz w:val="16"/>
+                <w:szCs w:val="16"/>
+              </w:rPr>
+              <w:t>Ditch Light</w:t>
+            </w:r>
+          </w:p>
+        </w:tc>
+        <w:tc>
+          <w:tcPr>
+            <w:tcW w:w="1016" w:type="dxa"/>
+            <w:tcBorders>
+              <w:top w:val="single" w:sz="4" w:space="0" w:color="000000"/>
+              <w:left w:val="single" w:sz="4" w:space="0" w:color="000000"/>
+              <w:bottom w:val="single" w:sz="4" w:space="0" w:color="000000"/>
+            </w:tcBorders>
+            <w:vAlign w:val="bottom"/>
+          </w:tcPr>
+          <w:p>
+            <w:pPr>
+              <w:pStyle w:val="Normal"/>
+              <w:widowControl w:val="false"/>
+              <w:spacing w:lineRule="auto" w:line="180"/>
+              <w:jc w:val="center"/>
+              <w:rPr>
+                <w:sz w:val="16"/>
+                <w:szCs w:val="16"/>
+              </w:rPr>
+            </w:pPr>
+            <w:r>
+              <w:rPr>
+                <w:rFonts w:eastAsia="arial" w:ascii="arial" w:hAnsi="arial"/>
+                <w:color w:val="000000"/>
+                <w:sz w:val="16"/>
+                <w:szCs w:val="16"/>
+              </w:rPr>
+              <w:t>Gauge Light</w:t>
+            </w:r>
+          </w:p>
+        </w:tc>
+        <w:tc>
+          <w:tcPr>
+            <w:tcW w:w="1016" w:type="dxa"/>
+            <w:tcBorders>
+              <w:top w:val="single" w:sz="4" w:space="0" w:color="000000"/>
+              <w:left w:val="single" w:sz="4" w:space="0" w:color="000000"/>
+              <w:bottom w:val="single" w:sz="4" w:space="0" w:color="000000"/>
+            </w:tcBorders>
+            <w:vAlign w:val="bottom"/>
+          </w:tcPr>
+          <w:p>
+            <w:pPr>
+              <w:pStyle w:val="Normal"/>
+              <w:widowControl w:val="false"/>
+              <w:spacing w:lineRule="auto" w:line="180"/>
+              <w:jc w:val="center"/>
+              <w:rPr>
+                <w:sz w:val="16"/>
+                <w:szCs w:val="16"/>
+              </w:rPr>
+            </w:pPr>
+            <w:r>
+              <w:rPr>
+                <w:sz w:val="16"/>
+                <w:szCs w:val="16"/>
+              </w:rPr>
+              <w:t>Cab Light</w:t>
+            </w:r>
+          </w:p>
+        </w:tc>
+        <w:tc>
+          <w:tcPr>
+            <w:tcW w:w="1016" w:type="dxa"/>
+            <w:tcBorders>
+              <w:top w:val="single" w:sz="4" w:space="0" w:color="000000"/>
+              <w:left w:val="single" w:sz="4" w:space="0" w:color="000000"/>
+              <w:bottom w:val="single" w:sz="4" w:space="0" w:color="000000"/>
+            </w:tcBorders>
+            <w:vAlign w:val="bottom"/>
+          </w:tcPr>
+          <w:p>
+            <w:pPr>
+              <w:pStyle w:val="Normal"/>
+              <w:widowControl w:val="false"/>
+              <w:spacing w:lineRule="auto" w:line="180"/>
+              <w:jc w:val="center"/>
+              <w:rPr>
+                <w:sz w:val="16"/>
+                <w:szCs w:val="16"/>
+              </w:rPr>
+            </w:pPr>
+            <w:r>
+              <w:rPr>
+                <w:rFonts w:eastAsia="arial" w:ascii="arial" w:hAnsi="arial"/>
+                <w:color w:val="000000"/>
+                <w:sz w:val="16"/>
+                <w:szCs w:val="16"/>
+              </w:rPr>
+              <w:t>1-Person</w:t>
+            </w:r>
+          </w:p>
+        </w:tc>
+        <w:tc>
+          <w:tcPr>
+            <w:tcW w:w="1029" w:type="dxa"/>
+            <w:tcBorders>
+              <w:top w:val="single" w:sz="4" w:space="0" w:color="000000"/>
+              <w:left w:val="single" w:sz="4" w:space="0" w:color="000000"/>
+              <w:bottom w:val="single" w:sz="4" w:space="0" w:color="000000"/>
+              <w:right w:val="single" w:sz="4" w:space="0" w:color="000000"/>
+            </w:tcBorders>
+            <w:vAlign w:val="bottom"/>
+          </w:tcPr>
+          <w:p>
+            <w:pPr>
+              <w:pStyle w:val="Normal"/>
+              <w:widowControl w:val="false"/>
+              <w:spacing w:lineRule="auto" w:line="180"/>
+              <w:jc w:val="center"/>
+              <w:rPr>
+                <w:sz w:val="16"/>
+                <w:szCs w:val="16"/>
+              </w:rPr>
+            </w:pPr>
+            <w:r>
+              <w:rPr>
+                <w:rFonts w:eastAsia="arial" w:ascii="arial" w:hAnsi="arial"/>
+                <w:color w:val="000000"/>
+                <w:sz w:val="16"/>
+                <w:szCs w:val="16"/>
+              </w:rPr>
+              <w:t>Next</w:t>
+            </w:r>
+          </w:p>
+          <w:p>
+            <w:pPr>
+              <w:pStyle w:val="Normal"/>
+              <w:widowControl w:val="false"/>
+              <w:spacing w:lineRule="auto" w:line="180"/>
+              <w:jc w:val="center"/>
+              <w:rPr>
+                <w:sz w:val="16"/>
+                <w:szCs w:val="16"/>
+              </w:rPr>
+            </w:pPr>
+            <w:r>
+              <w:rPr>
+                <w:rFonts w:eastAsia="arial" w:ascii="arial" w:hAnsi="arial"/>
+                <w:color w:val="000000"/>
+                <w:sz w:val="16"/>
+                <w:szCs w:val="16"/>
+              </w:rPr>
+              <w:t>Cab Cam</w:t>
+            </w:r>
+          </w:p>
+        </w:tc>
+      </w:tr>
+    </w:tbl>
+    <w:p>
+      <w:pPr>
+        <w:pStyle w:val="Normal"/>
+        <w:rPr>
+          <w:rFonts w:ascii="arial" w:hAnsi="arial" w:eastAsia="arial"/>
+          <w:color w:val="000000"/>
+          <w:sz w:val="16"/>
+          <w:szCs w:val="16"/>
+        </w:rPr>
+      </w:pPr>
+      <w:r>
+        <w:rPr>
+          <w:rFonts w:eastAsia="arial" w:ascii="arial" w:hAnsi="arial"/>
+          <w:color w:val="000000"/>
+          <w:sz w:val="16"/>
+          <w:szCs w:val="16"/>
+        </w:rPr>
+      </w:r>
+    </w:p>
+    <w:p>
+      <w:pPr>
+        <w:pStyle w:val="Normal"/>
+        <w:rPr>
+          <w:color w:val="000000"/>
+          <w:sz w:val="16"/>
+          <w:szCs w:val="16"/>
+        </w:rPr>
+      </w:pPr>
+      <w:r>
+        <w:rPr>
+          <w:rFonts w:eastAsia="arial" w:ascii="arial" w:hAnsi="arial"/>
+          <w:color w:val="000000"/>
+          <w:sz w:val="16"/>
+          <w:szCs w:val="16"/>
+        </w:rPr>
+        <w:tab/>
+        <w:t xml:space="preserve">           Amfleet Cab Car-2</w:t>
+      </w:r>
+    </w:p>
+    <w:tbl>
+      <w:tblPr>
+        <w:tblW w:w="14248" w:type="dxa"/>
+        <w:jc w:val="left"/>
+        <w:tblInd w:w="-5" w:type="dxa"/>
+        <w:tblLayout w:type="fixed"/>
+        <w:tblCellMar>
+          <w:top w:w="0" w:type="dxa"/>
+          <w:left w:w="108" w:type="dxa"/>
+          <w:bottom w:w="0" w:type="dxa"/>
+          <w:right w:w="108" w:type="dxa"/>
+        </w:tblCellMar>
+        <w:tblLook w:firstRow="1" w:noVBand="1" w:lastRow="0" w:firstColumn="1" w:lastColumn="0" w:noHBand="0" w:val="04a0"/>
+      </w:tblPr>
+      <w:tblGrid>
+        <w:gridCol w:w="1017"/>
+        <w:gridCol w:w="1019"/>
+        <w:gridCol w:w="1014"/>
+        <w:gridCol w:w="1016"/>
+        <w:gridCol w:w="1020"/>
+        <w:gridCol w:w="1016"/>
+        <w:gridCol w:w="1016"/>
+        <w:gridCol w:w="1017"/>
+        <w:gridCol w:w="1016"/>
+        <w:gridCol w:w="1020"/>
+        <w:gridCol w:w="1016"/>
+        <w:gridCol w:w="1016"/>
+        <w:gridCol w:w="1016"/>
+        <w:gridCol w:w="1029"/>
+      </w:tblGrid>
+      <w:tr>
+        <w:trPr>
+          <w:trHeight w:val="440" w:hRule="exact"/>
+          <w:cantSplit w:val="true"/>
+        </w:trPr>
+        <w:tc>
+          <w:tcPr>
+            <w:tcW w:w="1017" w:type="dxa"/>
+            <w:tcBorders>
+              <w:top w:val="single" w:sz="4" w:space="0" w:color="000000"/>
+              <w:left w:val="single" w:sz="4" w:space="0" w:color="000000"/>
+              <w:bottom w:val="single" w:sz="4" w:space="0" w:color="000000"/>
+            </w:tcBorders>
+            <w:vAlign w:val="bottom"/>
+          </w:tcPr>
+          <w:p>
+            <w:pPr>
+              <w:pStyle w:val="Normal"/>
+              <w:widowControl w:val="false"/>
+              <w:spacing w:lineRule="auto" w:line="180" w:before="0" w:after="60"/>
+              <w:jc w:val="center"/>
+              <w:rPr>
+                <w:b/>
+                <w:bCs/>
+              </w:rPr>
+            </w:pPr>
+            <w:r>
+              <w:rPr>
+                <w:b/>
+                <w:bCs/>
+                <w:color w:val="000000"/>
+                <w:sz w:val="16"/>
+                <w:szCs w:val="16"/>
+              </w:rPr>
+              <w:t>HUD</w:t>
+            </w:r>
+          </w:p>
+        </w:tc>
+        <w:tc>
+          <w:tcPr>
+            <w:tcW w:w="1019" w:type="dxa"/>
+            <w:tcBorders>
+              <w:top w:val="single" w:sz="4" w:space="0" w:color="000000"/>
+              <w:left w:val="single" w:sz="4" w:space="0" w:color="000000"/>
+              <w:bottom w:val="single" w:sz="4" w:space="0" w:color="000000"/>
+            </w:tcBorders>
+            <w:vAlign w:val="bottom"/>
+          </w:tcPr>
+          <w:p>
+            <w:pPr>
+              <w:pStyle w:val="Normal"/>
+              <w:widowControl w:val="false"/>
+              <w:spacing w:lineRule="auto" w:line="180"/>
+              <w:jc w:val="center"/>
+              <w:rPr>
+                <w:color w:val="000000"/>
+                <w:sz w:val="16"/>
+                <w:szCs w:val="16"/>
+              </w:rPr>
+            </w:pPr>
+            <w:r>
+              <w:rPr>
+                <w:color w:val="000000"/>
+                <w:sz w:val="16"/>
+                <w:szCs w:val="16"/>
+              </w:rPr>
+              <w:t>Schedule</w:t>
+            </w:r>
+          </w:p>
+        </w:tc>
+        <w:tc>
+          <w:tcPr>
+            <w:tcW w:w="1014" w:type="dxa"/>
+            <w:tcBorders>
+              <w:top w:val="single" w:sz="4" w:space="0" w:color="000000"/>
+              <w:left w:val="single" w:sz="4" w:space="0" w:color="000000"/>
+              <w:bottom w:val="single" w:sz="4" w:space="0" w:color="000000"/>
+            </w:tcBorders>
+            <w:vAlign w:val="bottom"/>
+          </w:tcPr>
+          <w:p>
+            <w:pPr>
+              <w:pStyle w:val="Normal"/>
+              <w:widowControl w:val="false"/>
+              <w:jc w:val="center"/>
+              <w:rPr>
+                <w:rFonts w:ascii="arial" w:hAnsi="arial" w:eastAsia="arial"/>
+                <w:color w:val="000000"/>
+                <w:sz w:val="16"/>
+                <w:szCs w:val="16"/>
+              </w:rPr>
+            </w:pPr>
+            <w:r>
+              <w:rPr>
+                <w:rFonts w:eastAsia="arial" w:ascii="arial" w:hAnsi="arial"/>
+                <w:color w:val="000000"/>
+                <w:sz w:val="16"/>
+                <w:szCs w:val="16"/>
+              </w:rPr>
+            </w:r>
+          </w:p>
+        </w:tc>
+        <w:tc>
+          <w:tcPr>
+            <w:tcW w:w="1016" w:type="dxa"/>
+            <w:tcBorders>
+              <w:top w:val="single" w:sz="4" w:space="0" w:color="000000"/>
+              <w:left w:val="single" w:sz="4" w:space="0" w:color="000000"/>
+              <w:bottom w:val="single" w:sz="4" w:space="0" w:color="000000"/>
+            </w:tcBorders>
+            <w:vAlign w:val="bottom"/>
+          </w:tcPr>
+          <w:p>
+            <w:pPr>
+              <w:pStyle w:val="Normal"/>
+              <w:widowControl w:val="false"/>
+              <w:spacing w:lineRule="auto" w:line="180"/>
+              <w:jc w:val="center"/>
+              <w:rPr>
+                <w:color w:val="000000"/>
+                <w:sz w:val="16"/>
+                <w:szCs w:val="16"/>
+              </w:rPr>
+            </w:pPr>
+            <w:r>
+              <w:rPr>
+                <w:color w:val="000000"/>
+                <w:sz w:val="16"/>
+                <w:szCs w:val="16"/>
+              </w:rPr>
+              <w:t>Alerter</w:t>
+            </w:r>
+          </w:p>
+        </w:tc>
+        <w:tc>
+          <w:tcPr>
+            <w:tcW w:w="1020" w:type="dxa"/>
+            <w:tcBorders>
+              <w:top w:val="single" w:sz="4" w:space="0" w:color="000000"/>
+              <w:left w:val="single" w:sz="4" w:space="0" w:color="000000"/>
+              <w:bottom w:val="single" w:sz="4" w:space="0" w:color="000000"/>
+            </w:tcBorders>
+            <w:vAlign w:val="bottom"/>
+          </w:tcPr>
+          <w:p>
+            <w:pPr>
+              <w:pStyle w:val="Normal"/>
+              <w:widowControl w:val="false"/>
+              <w:spacing w:lineRule="auto" w:line="180"/>
+              <w:jc w:val="center"/>
+              <w:rPr>
+                <w:color w:val="000000"/>
+                <w:sz w:val="16"/>
+                <w:szCs w:val="16"/>
+              </w:rPr>
+            </w:pPr>
+            <w:r>
+              <w:rPr>
+                <w:color w:val="000000"/>
+                <w:sz w:val="16"/>
+                <w:szCs w:val="16"/>
+              </w:rPr>
+            </w:r>
+          </w:p>
+        </w:tc>
+        <w:tc>
+          <w:tcPr>
+            <w:tcW w:w="1016" w:type="dxa"/>
+            <w:tcBorders>
+              <w:top w:val="single" w:sz="4" w:space="0" w:color="000000"/>
+              <w:left w:val="single" w:sz="4" w:space="0" w:color="000000"/>
+              <w:bottom w:val="single" w:sz="4" w:space="0" w:color="000000"/>
+            </w:tcBorders>
+            <w:vAlign w:val="bottom"/>
+          </w:tcPr>
+          <w:p>
+            <w:pPr>
+              <w:pStyle w:val="Normal"/>
+              <w:widowControl w:val="false"/>
+              <w:spacing w:lineRule="auto" w:line="180"/>
+              <w:jc w:val="center"/>
+              <w:rPr>
+                <w:color w:val="000000"/>
+                <w:sz w:val="16"/>
+                <w:szCs w:val="16"/>
+              </w:rPr>
+            </w:pPr>
+            <w:r>
+              <w:rPr>
+                <w:rFonts w:eastAsia="arial" w:ascii="arial" w:hAnsi="arial"/>
+                <w:color w:val="000000"/>
+                <w:sz w:val="16"/>
+                <w:szCs w:val="16"/>
+              </w:rPr>
+              <w:t>Emer. Shutdown</w:t>
+            </w:r>
+          </w:p>
+        </w:tc>
+        <w:tc>
+          <w:tcPr>
+            <w:tcW w:w="1016" w:type="dxa"/>
+            <w:tcBorders>
+              <w:top w:val="single" w:sz="4" w:space="0" w:color="000000"/>
+              <w:left w:val="single" w:sz="4" w:space="0" w:color="000000"/>
+              <w:bottom w:val="single" w:sz="4" w:space="0" w:color="000000"/>
+            </w:tcBorders>
+            <w:vAlign w:val="bottom"/>
+          </w:tcPr>
+          <w:p>
+            <w:pPr>
+              <w:pStyle w:val="Normal"/>
+              <w:widowControl w:val="false"/>
+              <w:jc w:val="center"/>
+              <w:rPr>
+                <w:color w:val="000000"/>
+                <w:sz w:val="16"/>
+                <w:szCs w:val="16"/>
+              </w:rPr>
+            </w:pPr>
+            <w:r>
+              <w:rPr>
+                <w:rFonts w:eastAsia="arial" w:ascii="arial" w:hAnsi="arial"/>
+                <w:color w:val="000000"/>
+                <w:sz w:val="16"/>
+                <w:szCs w:val="16"/>
+              </w:rPr>
+              <w:t>Brake Trail</w:t>
+            </w:r>
+          </w:p>
+        </w:tc>
+        <w:tc>
+          <w:tcPr>
+            <w:tcW w:w="1017" w:type="dxa"/>
+            <w:tcBorders>
+              <w:top w:val="single" w:sz="4" w:space="0" w:color="000000"/>
+              <w:left w:val="single" w:sz="4" w:space="0" w:color="000000"/>
+              <w:bottom w:val="single" w:sz="4" w:space="0" w:color="000000"/>
+            </w:tcBorders>
+            <w:vAlign w:val="bottom"/>
+          </w:tcPr>
+          <w:p>
+            <w:pPr>
+              <w:pStyle w:val="Normal"/>
+              <w:widowControl w:val="false"/>
+              <w:jc w:val="center"/>
+              <w:rPr>
+                <w:color w:val="000000"/>
+                <w:sz w:val="16"/>
+                <w:szCs w:val="16"/>
+              </w:rPr>
+            </w:pPr>
+            <w:r>
+              <w:rPr>
+                <w:rFonts w:eastAsia="arial" w:ascii="arial" w:hAnsi="arial"/>
+                <w:color w:val="000000"/>
+                <w:sz w:val="16"/>
+                <w:szCs w:val="16"/>
+              </w:rPr>
+              <w:t>EQ Reg.</w:t>
+            </w:r>
+          </w:p>
+          <w:p>
+            <w:pPr>
+              <w:pStyle w:val="Normal"/>
+              <w:widowControl w:val="false"/>
+              <w:jc w:val="center"/>
+              <w:rPr>
+                <w:color w:val="000000"/>
+                <w:sz w:val="16"/>
+                <w:szCs w:val="16"/>
+              </w:rPr>
+            </w:pPr>
+            <w:r>
+              <w:rPr>
+                <w:rFonts w:eastAsia="arial" w:ascii="arial" w:hAnsi="arial"/>
+                <w:color w:val="000000"/>
+                <w:sz w:val="16"/>
+                <w:szCs w:val="16"/>
+              </w:rPr>
+              <w:t>Decrease</w:t>
+            </w:r>
+          </w:p>
+        </w:tc>
+        <w:tc>
+          <w:tcPr>
+            <w:tcW w:w="1016" w:type="dxa"/>
+            <w:tcBorders>
+              <w:top w:val="single" w:sz="4" w:space="0" w:color="000000"/>
+              <w:left w:val="single" w:sz="4" w:space="0" w:color="000000"/>
+              <w:bottom w:val="single" w:sz="4" w:space="0" w:color="000000"/>
+            </w:tcBorders>
+            <w:vAlign w:val="bottom"/>
+          </w:tcPr>
+          <w:p>
+            <w:pPr>
+              <w:pStyle w:val="Normal"/>
+              <w:widowControl w:val="false"/>
+              <w:jc w:val="center"/>
+              <w:rPr>
+                <w:sz w:val="16"/>
+                <w:szCs w:val="16"/>
+              </w:rPr>
+            </w:pPr>
+            <w:r>
+              <w:rPr>
+                <w:sz w:val="16"/>
+                <w:szCs w:val="16"/>
+              </w:rPr>
+              <w:t>Strobe Light Red</w:t>
+            </w:r>
+          </w:p>
+        </w:tc>
+        <w:tc>
+          <w:tcPr>
+            <w:tcW w:w="1020" w:type="dxa"/>
+            <w:tcBorders>
+              <w:top w:val="single" w:sz="4" w:space="0" w:color="000000"/>
+              <w:left w:val="single" w:sz="4" w:space="0" w:color="000000"/>
+              <w:bottom w:val="single" w:sz="4" w:space="0" w:color="000000"/>
+            </w:tcBorders>
+            <w:vAlign w:val="bottom"/>
+          </w:tcPr>
+          <w:p>
+            <w:pPr>
+              <w:pStyle w:val="Normal"/>
+              <w:widowControl w:val="false"/>
+              <w:jc w:val="center"/>
+              <w:rPr>
+                <w:color w:val="000000"/>
+                <w:sz w:val="16"/>
+                <w:szCs w:val="16"/>
+              </w:rPr>
+            </w:pPr>
+            <w:r>
+              <w:rPr>
+                <w:rFonts w:eastAsia="arial" w:ascii="arial" w:hAnsi="arial"/>
+                <w:color w:val="000000"/>
+                <w:sz w:val="16"/>
+                <w:szCs w:val="16"/>
+              </w:rPr>
+              <w:t>Step Light</w:t>
+            </w:r>
+          </w:p>
+        </w:tc>
+        <w:tc>
+          <w:tcPr>
+            <w:tcW w:w="1016" w:type="dxa"/>
+            <w:tcBorders>
+              <w:top w:val="single" w:sz="4" w:space="0" w:color="000000"/>
+              <w:left w:val="single" w:sz="4" w:space="0" w:color="000000"/>
+              <w:bottom w:val="single" w:sz="4" w:space="0" w:color="000000"/>
+            </w:tcBorders>
+            <w:vAlign w:val="bottom"/>
+          </w:tcPr>
+          <w:p>
+            <w:pPr>
+              <w:pStyle w:val="Normal"/>
+              <w:widowControl w:val="false"/>
+              <w:jc w:val="center"/>
+              <w:rPr>
+                <w:color w:val="000000"/>
+                <w:sz w:val="16"/>
+                <w:szCs w:val="16"/>
+              </w:rPr>
+            </w:pPr>
+            <w:r>
+              <w:rPr>
+                <w:rFonts w:eastAsia="arial" w:ascii="arial" w:hAnsi="arial"/>
+                <w:color w:val="000000"/>
+                <w:sz w:val="16"/>
+                <w:szCs w:val="16"/>
+              </w:rPr>
+              <w:t>Number Light</w:t>
+            </w:r>
+          </w:p>
+        </w:tc>
+        <w:tc>
+          <w:tcPr>
+            <w:tcW w:w="1016" w:type="dxa"/>
+            <w:tcBorders>
+              <w:top w:val="single" w:sz="4" w:space="0" w:color="000000"/>
+              <w:left w:val="single" w:sz="4" w:space="0" w:color="000000"/>
+              <w:bottom w:val="single" w:sz="4" w:space="0" w:color="000000"/>
+            </w:tcBorders>
+            <w:vAlign w:val="bottom"/>
+          </w:tcPr>
+          <w:p>
+            <w:pPr>
+              <w:pStyle w:val="Normal"/>
+              <w:widowControl w:val="false"/>
+              <w:spacing w:lineRule="auto" w:line="180"/>
+              <w:jc w:val="center"/>
+              <w:rPr>
+                <w:sz w:val="16"/>
+                <w:szCs w:val="16"/>
+              </w:rPr>
+            </w:pPr>
+            <w:r>
+              <w:rPr>
+                <w:sz w:val="16"/>
+                <w:szCs w:val="16"/>
+              </w:rPr>
+              <w:t>Marker Light</w:t>
+            </w:r>
+          </w:p>
+        </w:tc>
+        <w:tc>
+          <w:tcPr>
+            <w:tcW w:w="1016" w:type="dxa"/>
+            <w:tcBorders>
+              <w:top w:val="single" w:sz="4" w:space="0" w:color="000000"/>
+              <w:left w:val="single" w:sz="4" w:space="0" w:color="000000"/>
+              <w:bottom w:val="single" w:sz="4" w:space="0" w:color="000000"/>
+            </w:tcBorders>
+            <w:vAlign w:val="bottom"/>
+          </w:tcPr>
+          <w:p>
+            <w:pPr>
+              <w:pStyle w:val="Normal"/>
+              <w:widowControl w:val="false"/>
+              <w:spacing w:lineRule="auto" w:line="180"/>
+              <w:jc w:val="center"/>
+              <w:rPr>
+                <w:sz w:val="16"/>
+                <w:szCs w:val="16"/>
+              </w:rPr>
+            </w:pPr>
+            <w:r>
+              <w:rPr>
+                <w:rFonts w:eastAsia="arial" w:ascii="arial" w:hAnsi="arial"/>
+                <w:color w:val="000000"/>
+                <w:sz w:val="16"/>
+                <w:szCs w:val="16"/>
+              </w:rPr>
+              <w:t>Exterior</w:t>
+            </w:r>
+          </w:p>
+          <w:p>
+            <w:pPr>
+              <w:pStyle w:val="Normal"/>
+              <w:widowControl w:val="false"/>
+              <w:spacing w:lineRule="auto" w:line="180"/>
+              <w:jc w:val="center"/>
+              <w:rPr>
+                <w:sz w:val="16"/>
+                <w:szCs w:val="16"/>
+              </w:rPr>
+            </w:pPr>
+            <w:r>
+              <w:rPr>
+                <w:rFonts w:eastAsia="arial" w:ascii="arial" w:hAnsi="arial"/>
+                <w:color w:val="000000"/>
+                <w:sz w:val="16"/>
+                <w:szCs w:val="16"/>
+              </w:rPr>
+              <w:t>Camera</w:t>
+            </w:r>
+          </w:p>
+        </w:tc>
+        <w:tc>
+          <w:tcPr>
+            <w:tcW w:w="1029" w:type="dxa"/>
+            <w:tcBorders>
+              <w:top w:val="single" w:sz="4" w:space="0" w:color="000000"/>
+              <w:left w:val="single" w:sz="4" w:space="0" w:color="000000"/>
+              <w:bottom w:val="single" w:sz="4" w:space="0" w:color="000000"/>
+              <w:right w:val="single" w:sz="4" w:space="0" w:color="000000"/>
+            </w:tcBorders>
+            <w:vAlign w:val="bottom"/>
+          </w:tcPr>
+          <w:p>
+            <w:pPr>
+              <w:pStyle w:val="Normal"/>
+              <w:widowControl w:val="false"/>
+              <w:spacing w:lineRule="auto" w:line="180"/>
+              <w:jc w:val="center"/>
+              <w:rPr>
+                <w:sz w:val="16"/>
+                <w:szCs w:val="16"/>
+              </w:rPr>
+            </w:pPr>
+            <w:r>
+              <w:rPr>
+                <w:rFonts w:eastAsia="arial" w:ascii="arial" w:hAnsi="arial"/>
+                <w:color w:val="000000"/>
+                <w:sz w:val="16"/>
+                <w:szCs w:val="16"/>
+              </w:rPr>
+              <w:t>Prev</w:t>
+            </w:r>
+          </w:p>
+          <w:p>
+            <w:pPr>
+              <w:pStyle w:val="Normal"/>
+              <w:widowControl w:val="false"/>
+              <w:spacing w:lineRule="auto" w:line="180"/>
+              <w:jc w:val="center"/>
+              <w:rPr>
+                <w:sz w:val="16"/>
+                <w:szCs w:val="16"/>
+              </w:rPr>
+            </w:pPr>
+            <w:r>
+              <w:rPr>
+                <w:rFonts w:eastAsia="arial" w:ascii="arial" w:hAnsi="arial"/>
+                <w:color w:val="000000"/>
+                <w:sz w:val="16"/>
+                <w:szCs w:val="16"/>
+              </w:rPr>
+              <w:t>Cab Cam</w:t>
+            </w:r>
+          </w:p>
+        </w:tc>
+      </w:tr>
+    </w:tbl>
+    <w:p>
+      <w:pPr>
+        <w:pStyle w:val="Normal"/>
+        <w:rPr>
+          <w:color w:val="000000"/>
+          <w:position w:val="0"/>
+          <w:sz w:val="16"/>
+          <w:szCs w:val="16"/>
+          <w:vertAlign w:val="baseline"/>
+        </w:rPr>
+      </w:pPr>
+      <w:r>
+        <w:rPr>
+          <w:color w:val="000000"/>
+          <w:position w:val="0"/>
+          <w:sz w:val="16"/>
+          <w:szCs w:val="16"/>
+          <w:vertAlign w:val="baseline"/>
+        </w:rPr>
+      </w:r>
+    </w:p>
+    <w:p>
+      <w:pPr>
+        <w:pStyle w:val="Normal"/>
+        <w:rPr>
+          <w:color w:val="000000"/>
+          <w:sz w:val="16"/>
+          <w:szCs w:val="16"/>
+        </w:rPr>
+      </w:pPr>
+      <w:r>
+        <w:rPr>
+          <w:color w:val="000000"/>
+          <w:sz w:val="16"/>
+          <w:szCs w:val="16"/>
+        </w:rPr>
+        <w:tab/>
+        <w:t xml:space="preserve">       </w:t>
+      </w:r>
+      <w:r>
+        <w:rPr>
+          <w:rFonts w:eastAsia="arial" w:ascii="arial" w:hAnsi="arial"/>
+          <w:color w:val="000000"/>
+          <w:sz w:val="16"/>
+          <w:szCs w:val="16"/>
+        </w:rPr>
+        <w:t xml:space="preserve">    ALP-45DP-1</w:t>
+      </w:r>
+    </w:p>
+    <w:tbl>
+      <w:tblPr>
+        <w:tblW w:w="14248" w:type="dxa"/>
+        <w:jc w:val="left"/>
+        <w:tblInd w:w="-5" w:type="dxa"/>
+        <w:tblLayout w:type="fixed"/>
+        <w:tblCellMar>
+          <w:top w:w="0" w:type="dxa"/>
+          <w:left w:w="108" w:type="dxa"/>
+          <w:bottom w:w="0" w:type="dxa"/>
+          <w:right w:w="108" w:type="dxa"/>
+        </w:tblCellMar>
+        <w:tblLook w:firstRow="1" w:noVBand="1" w:lastRow="0" w:firstColumn="1" w:lastColumn="0" w:noHBand="0" w:val="04a0"/>
+      </w:tblPr>
+      <w:tblGrid>
+        <w:gridCol w:w="1017"/>
+        <w:gridCol w:w="1019"/>
+        <w:gridCol w:w="1014"/>
+        <w:gridCol w:w="1016"/>
+        <w:gridCol w:w="1020"/>
+        <w:gridCol w:w="1016"/>
+        <w:gridCol w:w="1016"/>
+        <w:gridCol w:w="1017"/>
+        <w:gridCol w:w="1016"/>
+        <w:gridCol w:w="1020"/>
+        <w:gridCol w:w="1016"/>
+        <w:gridCol w:w="1016"/>
+        <w:gridCol w:w="1016"/>
+        <w:gridCol w:w="1029"/>
+      </w:tblGrid>
+      <w:tr>
+        <w:trPr>
+          <w:trHeight w:val="440" w:hRule="exact"/>
+          <w:cantSplit w:val="true"/>
+        </w:trPr>
+        <w:tc>
+          <w:tcPr>
+            <w:tcW w:w="1017" w:type="dxa"/>
+            <w:tcBorders>
+              <w:top w:val="single" w:sz="4" w:space="0" w:color="000000"/>
+              <w:left w:val="single" w:sz="4" w:space="0" w:color="000000"/>
+              <w:bottom w:val="single" w:sz="4" w:space="0" w:color="000000"/>
+            </w:tcBorders>
+            <w:vAlign w:val="bottom"/>
+          </w:tcPr>
+          <w:p>
+            <w:pPr>
+              <w:pStyle w:val="Normal"/>
+              <w:widowControl w:val="false"/>
+              <w:spacing w:lineRule="auto" w:line="180" w:before="0" w:after="60"/>
+              <w:jc w:val="center"/>
+              <w:rPr>
+                <w:color w:val="000000"/>
+                <w:sz w:val="16"/>
+                <w:szCs w:val="16"/>
+              </w:rPr>
+            </w:pPr>
+            <w:r>
+              <w:rPr>
+                <w:rFonts w:eastAsia="arial" w:ascii="arial" w:hAnsi="arial"/>
+                <w:b/>
+                <w:color w:val="000000"/>
+                <w:sz w:val="16"/>
+                <w:szCs w:val="16"/>
+              </w:rPr>
+              <w:t>Pause</w:t>
+            </w:r>
+          </w:p>
+        </w:tc>
+        <w:tc>
+          <w:tcPr>
+            <w:tcW w:w="1019" w:type="dxa"/>
+            <w:tcBorders>
+              <w:top w:val="single" w:sz="4" w:space="0" w:color="000000"/>
+              <w:left w:val="single" w:sz="4" w:space="0" w:color="000000"/>
+              <w:bottom w:val="single" w:sz="4" w:space="0" w:color="000000"/>
+            </w:tcBorders>
+            <w:vAlign w:val="bottom"/>
+          </w:tcPr>
+          <w:p>
+            <w:pPr>
+              <w:pStyle w:val="Normal"/>
+              <w:widowControl w:val="false"/>
+              <w:spacing w:lineRule="auto" w:line="180"/>
+              <w:jc w:val="center"/>
+              <w:rPr>
+                <w:color w:val="000000"/>
+                <w:sz w:val="16"/>
+                <w:szCs w:val="16"/>
+              </w:rPr>
+            </w:pPr>
+            <w:r>
+              <w:rPr>
+                <w:color w:val="000000"/>
+                <w:sz w:val="16"/>
+                <w:szCs w:val="16"/>
+              </w:rPr>
+              <w:t>Reverser Handle</w:t>
+            </w:r>
+          </w:p>
+        </w:tc>
+        <w:tc>
+          <w:tcPr>
+            <w:tcW w:w="1014" w:type="dxa"/>
+            <w:tcBorders>
+              <w:top w:val="single" w:sz="4" w:space="0" w:color="000000"/>
+              <w:left w:val="single" w:sz="4" w:space="0" w:color="000000"/>
+              <w:bottom w:val="single" w:sz="4" w:space="0" w:color="000000"/>
+            </w:tcBorders>
+            <w:vAlign w:val="bottom"/>
+          </w:tcPr>
+          <w:p>
+            <w:pPr>
+              <w:pStyle w:val="Normal"/>
+              <w:widowControl w:val="false"/>
+              <w:jc w:val="center"/>
+              <w:rPr>
+                <w:rFonts w:ascii="arial" w:hAnsi="arial" w:eastAsia="arial"/>
+                <w:color w:val="000000"/>
+                <w:sz w:val="16"/>
+                <w:szCs w:val="16"/>
+              </w:rPr>
+            </w:pPr>
+            <w:r>
+              <w:rPr>
+                <w:rFonts w:eastAsia="arial" w:ascii="arial" w:hAnsi="arial"/>
+                <w:color w:val="000000"/>
+                <w:sz w:val="16"/>
+                <w:szCs w:val="16"/>
+              </w:rPr>
+              <w:t>Local Shutdown</w:t>
+            </w:r>
+          </w:p>
+        </w:tc>
+        <w:tc>
+          <w:tcPr>
+            <w:tcW w:w="1016" w:type="dxa"/>
+            <w:tcBorders>
+              <w:top w:val="single" w:sz="4" w:space="0" w:color="000000"/>
+              <w:left w:val="single" w:sz="4" w:space="0" w:color="000000"/>
+              <w:bottom w:val="single" w:sz="4" w:space="0" w:color="000000"/>
+            </w:tcBorders>
+            <w:vAlign w:val="bottom"/>
+          </w:tcPr>
+          <w:p>
+            <w:pPr>
+              <w:pStyle w:val="Normal"/>
+              <w:widowControl w:val="false"/>
+              <w:spacing w:lineRule="auto" w:line="180"/>
+              <w:jc w:val="center"/>
+              <w:rPr>
+                <w:color w:val="000000"/>
+                <w:sz w:val="16"/>
+                <w:szCs w:val="16"/>
+              </w:rPr>
+            </w:pPr>
+            <w:r>
+              <w:rPr>
+                <w:color w:val="000000"/>
+                <w:sz w:val="16"/>
+                <w:szCs w:val="16"/>
+              </w:rPr>
+              <w:t>ATC/ACSES</w:t>
+            </w:r>
+          </w:p>
+        </w:tc>
+        <w:tc>
+          <w:tcPr>
+            <w:tcW w:w="1020" w:type="dxa"/>
+            <w:tcBorders>
+              <w:top w:val="single" w:sz="4" w:space="0" w:color="000000"/>
+              <w:left w:val="single" w:sz="4" w:space="0" w:color="000000"/>
+              <w:bottom w:val="single" w:sz="4" w:space="0" w:color="000000"/>
+            </w:tcBorders>
+            <w:vAlign w:val="bottom"/>
+          </w:tcPr>
+          <w:p>
+            <w:pPr>
+              <w:pStyle w:val="Normal"/>
+              <w:widowControl w:val="false"/>
+              <w:spacing w:lineRule="auto" w:line="180"/>
+              <w:jc w:val="center"/>
+              <w:rPr>
+                <w:color w:val="000000"/>
+                <w:sz w:val="16"/>
+                <w:szCs w:val="16"/>
+              </w:rPr>
+            </w:pPr>
+            <w:r>
+              <w:rPr>
+                <w:color w:val="000000"/>
+                <w:sz w:val="16"/>
+                <w:szCs w:val="16"/>
+              </w:rPr>
+              <w:t>Panto. Raise</w:t>
+            </w:r>
+          </w:p>
+        </w:tc>
+        <w:tc>
+          <w:tcPr>
+            <w:tcW w:w="1016" w:type="dxa"/>
+            <w:tcBorders>
+              <w:top w:val="single" w:sz="4" w:space="0" w:color="000000"/>
+              <w:left w:val="single" w:sz="4" w:space="0" w:color="000000"/>
+              <w:bottom w:val="single" w:sz="4" w:space="0" w:color="000000"/>
+            </w:tcBorders>
+            <w:vAlign w:val="bottom"/>
+          </w:tcPr>
+          <w:p>
+            <w:pPr>
+              <w:pStyle w:val="Normal"/>
+              <w:widowControl w:val="false"/>
+              <w:spacing w:lineRule="auto" w:line="180"/>
+              <w:jc w:val="center"/>
+              <w:rPr>
+                <w:color w:val="000000"/>
+                <w:sz w:val="16"/>
+                <w:szCs w:val="16"/>
+              </w:rPr>
+            </w:pPr>
+            <w:r>
+              <w:rPr>
+                <w:rFonts w:eastAsia="arial" w:ascii="arial" w:hAnsi="arial"/>
+                <w:color w:val="000000"/>
+                <w:sz w:val="16"/>
+                <w:szCs w:val="16"/>
+              </w:rPr>
+              <w:t>HEP On</w:t>
+            </w:r>
+          </w:p>
+        </w:tc>
+        <w:tc>
+          <w:tcPr>
+            <w:tcW w:w="1016" w:type="dxa"/>
+            <w:tcBorders>
+              <w:top w:val="single" w:sz="4" w:space="0" w:color="000000"/>
+              <w:left w:val="single" w:sz="4" w:space="0" w:color="000000"/>
+              <w:bottom w:val="single" w:sz="4" w:space="0" w:color="000000"/>
+            </w:tcBorders>
+            <w:vAlign w:val="bottom"/>
+          </w:tcPr>
+          <w:p>
+            <w:pPr>
+              <w:pStyle w:val="Normal"/>
+              <w:widowControl w:val="false"/>
+              <w:jc w:val="center"/>
+              <w:rPr>
+                <w:color w:val="000000"/>
+                <w:sz w:val="16"/>
+                <w:szCs w:val="16"/>
+              </w:rPr>
+            </w:pPr>
+            <w:r>
+              <w:rPr>
+                <w:color w:val="000000"/>
+                <w:sz w:val="16"/>
+                <w:szCs w:val="16"/>
+              </w:rPr>
+              <w:t>Brake</w:t>
+            </w:r>
+          </w:p>
+          <w:p>
+            <w:pPr>
+              <w:pStyle w:val="Normal"/>
+              <w:widowControl w:val="false"/>
+              <w:jc w:val="center"/>
+              <w:rPr>
+                <w:color w:val="000000"/>
+                <w:sz w:val="16"/>
+                <w:szCs w:val="16"/>
+              </w:rPr>
+            </w:pPr>
+            <w:r>
+              <w:rPr>
+                <w:color w:val="000000"/>
+                <w:sz w:val="16"/>
+                <w:szCs w:val="16"/>
+              </w:rPr>
+              <w:t>Cut-In</w:t>
+            </w:r>
+          </w:p>
+        </w:tc>
+        <w:tc>
+          <w:tcPr>
+            <w:tcW w:w="1017" w:type="dxa"/>
+            <w:tcBorders>
+              <w:top w:val="single" w:sz="4" w:space="0" w:color="000000"/>
+              <w:left w:val="single" w:sz="4" w:space="0" w:color="000000"/>
+              <w:bottom w:val="single" w:sz="4" w:space="0" w:color="000000"/>
+            </w:tcBorders>
+            <w:vAlign w:val="bottom"/>
+          </w:tcPr>
+          <w:p>
+            <w:pPr>
+              <w:pStyle w:val="Normal"/>
+              <w:widowControl w:val="false"/>
+              <w:jc w:val="center"/>
+              <w:rPr>
+                <w:color w:val="000000"/>
+                <w:sz w:val="16"/>
+                <w:szCs w:val="16"/>
+              </w:rPr>
+            </w:pPr>
+            <w:r>
+              <w:rPr>
+                <w:rFonts w:eastAsia="arial" w:ascii="arial" w:hAnsi="arial"/>
+                <w:color w:val="000000"/>
+                <w:sz w:val="16"/>
+                <w:szCs w:val="16"/>
+              </w:rPr>
+              <w:t>FN1</w:t>
+            </w:r>
+          </w:p>
+        </w:tc>
+        <w:tc>
+          <w:tcPr>
+            <w:tcW w:w="1016" w:type="dxa"/>
+            <w:tcBorders>
+              <w:top w:val="single" w:sz="4" w:space="0" w:color="000000"/>
+              <w:left w:val="single" w:sz="4" w:space="0" w:color="000000"/>
+              <w:bottom w:val="single" w:sz="4" w:space="0" w:color="000000"/>
+            </w:tcBorders>
+            <w:vAlign w:val="bottom"/>
+          </w:tcPr>
+          <w:p>
+            <w:pPr>
+              <w:pStyle w:val="Normal"/>
+              <w:widowControl w:val="false"/>
+              <w:jc w:val="center"/>
+              <w:rPr>
+                <w:sz w:val="16"/>
+                <w:szCs w:val="16"/>
+              </w:rPr>
+            </w:pPr>
+            <w:r>
+              <w:rPr>
+                <w:sz w:val="16"/>
+                <w:szCs w:val="16"/>
+              </w:rPr>
+              <w:t>Rear HL</w:t>
+            </w:r>
+          </w:p>
+        </w:tc>
+        <w:tc>
+          <w:tcPr>
+            <w:tcW w:w="1020" w:type="dxa"/>
+            <w:tcBorders>
+              <w:top w:val="single" w:sz="4" w:space="0" w:color="000000"/>
+              <w:left w:val="single" w:sz="4" w:space="0" w:color="000000"/>
+              <w:bottom w:val="single" w:sz="4" w:space="0" w:color="000000"/>
+            </w:tcBorders>
+            <w:vAlign w:val="bottom"/>
+          </w:tcPr>
+          <w:p>
+            <w:pPr>
+              <w:pStyle w:val="Normal"/>
+              <w:widowControl w:val="false"/>
+              <w:spacing w:lineRule="auto" w:line="180"/>
+              <w:jc w:val="center"/>
+              <w:rPr>
+                <w:sz w:val="16"/>
+                <w:szCs w:val="16"/>
+              </w:rPr>
+            </w:pPr>
+            <w:r>
+              <w:rPr>
+                <w:rFonts w:eastAsia="arial" w:ascii="arial" w:hAnsi="arial"/>
+                <w:color w:val="000000"/>
+                <w:sz w:val="16"/>
+                <w:szCs w:val="16"/>
+              </w:rPr>
+              <w:t>Marker Light On</w:t>
+            </w:r>
+          </w:p>
+        </w:tc>
+        <w:tc>
+          <w:tcPr>
+            <w:tcW w:w="1016" w:type="dxa"/>
+            <w:tcBorders>
+              <w:top w:val="single" w:sz="4" w:space="0" w:color="000000"/>
+              <w:left w:val="single" w:sz="4" w:space="0" w:color="000000"/>
+              <w:bottom w:val="single" w:sz="4" w:space="0" w:color="000000"/>
+            </w:tcBorders>
+            <w:vAlign w:val="bottom"/>
+          </w:tcPr>
+          <w:p>
+            <w:pPr>
+              <w:pStyle w:val="Normal"/>
+              <w:widowControl w:val="false"/>
+              <w:spacing w:lineRule="auto" w:line="180"/>
+              <w:jc w:val="center"/>
+              <w:rPr>
+                <w:sz w:val="16"/>
+                <w:szCs w:val="16"/>
+              </w:rPr>
+            </w:pPr>
+            <w:r>
+              <w:rPr>
+                <w:rFonts w:eastAsia="arial" w:ascii="arial" w:hAnsi="arial"/>
+                <w:color w:val="000000"/>
+                <w:sz w:val="16"/>
+                <w:szCs w:val="16"/>
+              </w:rPr>
+              <w:t>Gauge Light</w:t>
+            </w:r>
+          </w:p>
+        </w:tc>
+        <w:tc>
+          <w:tcPr>
+            <w:tcW w:w="1016" w:type="dxa"/>
+            <w:tcBorders>
+              <w:top w:val="single" w:sz="4" w:space="0" w:color="000000"/>
+              <w:left w:val="single" w:sz="4" w:space="0" w:color="000000"/>
+              <w:bottom w:val="single" w:sz="4" w:space="0" w:color="000000"/>
+            </w:tcBorders>
+            <w:vAlign w:val="bottom"/>
+          </w:tcPr>
+          <w:p>
+            <w:pPr>
+              <w:pStyle w:val="Normal"/>
+              <w:widowControl w:val="false"/>
+              <w:spacing w:lineRule="auto" w:line="180"/>
+              <w:jc w:val="center"/>
+              <w:rPr>
+                <w:sz w:val="16"/>
+                <w:szCs w:val="16"/>
+              </w:rPr>
+            </w:pPr>
+            <w:r>
+              <w:rPr>
+                <w:sz w:val="16"/>
+                <w:szCs w:val="16"/>
+              </w:rPr>
+              <w:t>Cab Light</w:t>
+            </w:r>
+          </w:p>
+        </w:tc>
+        <w:tc>
+          <w:tcPr>
+            <w:tcW w:w="1016" w:type="dxa"/>
+            <w:tcBorders>
+              <w:top w:val="single" w:sz="4" w:space="0" w:color="000000"/>
+              <w:left w:val="single" w:sz="4" w:space="0" w:color="000000"/>
+              <w:bottom w:val="single" w:sz="4" w:space="0" w:color="000000"/>
+            </w:tcBorders>
+            <w:vAlign w:val="bottom"/>
+          </w:tcPr>
+          <w:p>
+            <w:pPr>
+              <w:pStyle w:val="Normal"/>
+              <w:widowControl w:val="false"/>
+              <w:spacing w:lineRule="auto" w:line="180"/>
+              <w:jc w:val="center"/>
+              <w:rPr>
+                <w:sz w:val="16"/>
+                <w:szCs w:val="16"/>
+              </w:rPr>
+            </w:pPr>
+            <w:r>
+              <w:rPr>
+                <w:rFonts w:eastAsia="arial" w:ascii="arial" w:hAnsi="arial"/>
+                <w:color w:val="000000"/>
+                <w:sz w:val="16"/>
+                <w:szCs w:val="16"/>
+              </w:rPr>
+              <w:t>1-Person</w:t>
+            </w:r>
+          </w:p>
+        </w:tc>
+        <w:tc>
+          <w:tcPr>
+            <w:tcW w:w="1029" w:type="dxa"/>
+            <w:tcBorders>
+              <w:top w:val="single" w:sz="4" w:space="0" w:color="000000"/>
+              <w:left w:val="single" w:sz="4" w:space="0" w:color="000000"/>
+              <w:bottom w:val="single" w:sz="4" w:space="0" w:color="000000"/>
+              <w:right w:val="single" w:sz="4" w:space="0" w:color="000000"/>
+            </w:tcBorders>
+            <w:vAlign w:val="bottom"/>
+          </w:tcPr>
+          <w:p>
+            <w:pPr>
+              <w:pStyle w:val="Normal"/>
+              <w:widowControl w:val="false"/>
+              <w:spacing w:lineRule="auto" w:line="180"/>
+              <w:jc w:val="center"/>
+              <w:rPr>
+                <w:sz w:val="16"/>
+                <w:szCs w:val="16"/>
+              </w:rPr>
+            </w:pPr>
+            <w:r>
+              <w:rPr>
+                <w:rFonts w:eastAsia="arial" w:ascii="arial" w:hAnsi="arial"/>
+                <w:color w:val="000000"/>
+                <w:sz w:val="16"/>
+                <w:szCs w:val="16"/>
+              </w:rPr>
+              <w:t>Next</w:t>
+            </w:r>
+          </w:p>
+          <w:p>
+            <w:pPr>
+              <w:pStyle w:val="Normal"/>
+              <w:widowControl w:val="false"/>
+              <w:spacing w:lineRule="auto" w:line="180"/>
+              <w:jc w:val="center"/>
+              <w:rPr>
+                <w:sz w:val="16"/>
+                <w:szCs w:val="16"/>
+              </w:rPr>
+            </w:pPr>
+            <w:r>
+              <w:rPr>
+                <w:rFonts w:eastAsia="arial" w:ascii="arial" w:hAnsi="arial"/>
+                <w:color w:val="000000"/>
+                <w:sz w:val="16"/>
+                <w:szCs w:val="16"/>
+              </w:rPr>
+              <w:t>Cab Cam</w:t>
+            </w:r>
+          </w:p>
+        </w:tc>
+      </w:tr>
+    </w:tbl>
+    <w:p>
+      <w:pPr>
+        <w:pStyle w:val="Normal"/>
+        <w:rPr>
+          <w:rFonts w:ascii="arial" w:hAnsi="arial" w:eastAsia="arial"/>
+          <w:color w:val="000000"/>
+          <w:sz w:val="16"/>
+          <w:szCs w:val="16"/>
+        </w:rPr>
+      </w:pPr>
+      <w:r>
+        <w:rPr>
+          <w:rFonts w:eastAsia="arial" w:ascii="arial" w:hAnsi="arial"/>
+          <w:color w:val="000000"/>
+          <w:sz w:val="16"/>
+          <w:szCs w:val="16"/>
+        </w:rPr>
+      </w:r>
+    </w:p>
+    <w:p>
+      <w:pPr>
+        <w:pStyle w:val="Normal"/>
+        <w:rPr>
+          <w:color w:val="000000"/>
+          <w:sz w:val="16"/>
+          <w:szCs w:val="16"/>
+        </w:rPr>
+      </w:pPr>
+      <w:r>
+        <w:rPr>
+          <w:rFonts w:eastAsia="arial" w:ascii="arial" w:hAnsi="arial"/>
+          <w:color w:val="000000"/>
+          <w:sz w:val="16"/>
+          <w:szCs w:val="16"/>
+        </w:rPr>
+        <w:tab/>
+        <w:t xml:space="preserve">           ALP-45DP-2</w:t>
+      </w:r>
+    </w:p>
+    <w:tbl>
+      <w:tblPr>
+        <w:tblW w:w="14248" w:type="dxa"/>
+        <w:jc w:val="left"/>
+        <w:tblInd w:w="-5" w:type="dxa"/>
+        <w:tblLayout w:type="fixed"/>
+        <w:tblCellMar>
+          <w:top w:w="0" w:type="dxa"/>
+          <w:left w:w="108" w:type="dxa"/>
+          <w:bottom w:w="0" w:type="dxa"/>
+          <w:right w:w="108" w:type="dxa"/>
+        </w:tblCellMar>
+        <w:tblLook w:firstRow="1" w:noVBand="1" w:lastRow="0" w:firstColumn="1" w:lastColumn="0" w:noHBand="0" w:val="04a0"/>
+      </w:tblPr>
+      <w:tblGrid>
+        <w:gridCol w:w="1017"/>
+        <w:gridCol w:w="1019"/>
+        <w:gridCol w:w="1014"/>
+        <w:gridCol w:w="1016"/>
+        <w:gridCol w:w="1020"/>
+        <w:gridCol w:w="1016"/>
+        <w:gridCol w:w="1016"/>
+        <w:gridCol w:w="1017"/>
+        <w:gridCol w:w="1016"/>
+        <w:gridCol w:w="1020"/>
+        <w:gridCol w:w="1016"/>
+        <w:gridCol w:w="1016"/>
+        <w:gridCol w:w="1016"/>
+        <w:gridCol w:w="1029"/>
+      </w:tblGrid>
+      <w:tr>
+        <w:trPr>
+          <w:trHeight w:val="440" w:hRule="exact"/>
+          <w:cantSplit w:val="true"/>
+        </w:trPr>
+        <w:tc>
+          <w:tcPr>
+            <w:tcW w:w="1017" w:type="dxa"/>
+            <w:tcBorders>
+              <w:top w:val="single" w:sz="4" w:space="0" w:color="000000"/>
+              <w:left w:val="single" w:sz="4" w:space="0" w:color="000000"/>
+              <w:bottom w:val="single" w:sz="4" w:space="0" w:color="000000"/>
+            </w:tcBorders>
+            <w:vAlign w:val="bottom"/>
+          </w:tcPr>
+          <w:p>
+            <w:pPr>
+              <w:pStyle w:val="Normal"/>
+              <w:widowControl w:val="false"/>
+              <w:spacing w:lineRule="auto" w:line="180" w:before="0" w:after="60"/>
+              <w:jc w:val="center"/>
+              <w:rPr>
+                <w:b/>
+                <w:bCs/>
+              </w:rPr>
+            </w:pPr>
+            <w:r>
+              <w:rPr>
+                <w:b/>
+                <w:bCs/>
+                <w:color w:val="000000"/>
+                <w:sz w:val="16"/>
+                <w:szCs w:val="16"/>
+              </w:rPr>
+              <w:t>HUD</w:t>
+            </w:r>
+          </w:p>
+        </w:tc>
+        <w:tc>
+          <w:tcPr>
+            <w:tcW w:w="1019" w:type="dxa"/>
+            <w:tcBorders>
+              <w:top w:val="single" w:sz="4" w:space="0" w:color="000000"/>
+              <w:left w:val="single" w:sz="4" w:space="0" w:color="000000"/>
+              <w:bottom w:val="single" w:sz="4" w:space="0" w:color="000000"/>
+            </w:tcBorders>
+            <w:vAlign w:val="bottom"/>
+          </w:tcPr>
+          <w:p>
+            <w:pPr>
+              <w:pStyle w:val="Normal"/>
+              <w:widowControl w:val="false"/>
+              <w:spacing w:lineRule="auto" w:line="180"/>
+              <w:jc w:val="center"/>
+              <w:rPr>
+                <w:color w:val="000000"/>
+                <w:sz w:val="16"/>
+                <w:szCs w:val="16"/>
+              </w:rPr>
+            </w:pPr>
+            <w:r>
+              <w:rPr>
+                <w:color w:val="000000"/>
+                <w:sz w:val="16"/>
+                <w:szCs w:val="16"/>
+              </w:rPr>
+              <w:t>Schedule</w:t>
+            </w:r>
+          </w:p>
+        </w:tc>
+        <w:tc>
+          <w:tcPr>
+            <w:tcW w:w="1014" w:type="dxa"/>
+            <w:tcBorders>
+              <w:top w:val="single" w:sz="4" w:space="0" w:color="000000"/>
+              <w:left w:val="single" w:sz="4" w:space="0" w:color="000000"/>
+              <w:bottom w:val="single" w:sz="4" w:space="0" w:color="000000"/>
+            </w:tcBorders>
+            <w:vAlign w:val="bottom"/>
+          </w:tcPr>
+          <w:p>
+            <w:pPr>
+              <w:pStyle w:val="Normal"/>
+              <w:widowControl w:val="false"/>
+              <w:jc w:val="center"/>
+              <w:rPr>
+                <w:rFonts w:ascii="arial" w:hAnsi="arial" w:eastAsia="arial"/>
+                <w:color w:val="000000"/>
+                <w:sz w:val="16"/>
+                <w:szCs w:val="16"/>
+              </w:rPr>
+            </w:pPr>
+            <w:r>
+              <w:rPr>
+                <w:rFonts w:eastAsia="arial" w:ascii="arial" w:hAnsi="arial"/>
+                <w:color w:val="000000"/>
+                <w:sz w:val="16"/>
+                <w:szCs w:val="16"/>
+              </w:rPr>
+              <w:t>Engine Stop</w:t>
+            </w:r>
+          </w:p>
+        </w:tc>
+        <w:tc>
+          <w:tcPr>
+            <w:tcW w:w="1016" w:type="dxa"/>
+            <w:tcBorders>
+              <w:top w:val="single" w:sz="4" w:space="0" w:color="000000"/>
+              <w:left w:val="single" w:sz="4" w:space="0" w:color="000000"/>
+              <w:bottom w:val="single" w:sz="4" w:space="0" w:color="000000"/>
+            </w:tcBorders>
+            <w:vAlign w:val="bottom"/>
+          </w:tcPr>
+          <w:p>
+            <w:pPr>
+              <w:pStyle w:val="Normal"/>
+              <w:widowControl w:val="false"/>
+              <w:spacing w:lineRule="auto" w:line="180"/>
+              <w:jc w:val="center"/>
+              <w:rPr>
+                <w:color w:val="000000"/>
+                <w:sz w:val="16"/>
+                <w:szCs w:val="16"/>
+              </w:rPr>
+            </w:pPr>
+            <w:r>
+              <w:rPr>
+                <w:color w:val="000000"/>
+                <w:sz w:val="16"/>
+                <w:szCs w:val="16"/>
+              </w:rPr>
+              <w:t>Alerter</w:t>
+            </w:r>
+          </w:p>
+        </w:tc>
+        <w:tc>
+          <w:tcPr>
+            <w:tcW w:w="1020" w:type="dxa"/>
+            <w:tcBorders>
+              <w:top w:val="single" w:sz="4" w:space="0" w:color="000000"/>
+              <w:left w:val="single" w:sz="4" w:space="0" w:color="000000"/>
+              <w:bottom w:val="single" w:sz="4" w:space="0" w:color="000000"/>
+            </w:tcBorders>
+            <w:vAlign w:val="bottom"/>
+          </w:tcPr>
+          <w:p>
+            <w:pPr>
+              <w:pStyle w:val="Normal"/>
+              <w:widowControl w:val="false"/>
+              <w:spacing w:lineRule="auto" w:line="180"/>
+              <w:jc w:val="center"/>
+              <w:rPr>
+                <w:color w:val="000000"/>
+                <w:sz w:val="16"/>
+                <w:szCs w:val="16"/>
+              </w:rPr>
+            </w:pPr>
+            <w:r>
+              <w:rPr>
+                <w:color w:val="000000"/>
+                <w:sz w:val="16"/>
+                <w:szCs w:val="16"/>
+              </w:rPr>
+              <w:t>Panto. Low</w:t>
+            </w:r>
+          </w:p>
+        </w:tc>
+        <w:tc>
+          <w:tcPr>
+            <w:tcW w:w="1016" w:type="dxa"/>
+            <w:tcBorders>
+              <w:top w:val="single" w:sz="4" w:space="0" w:color="000000"/>
+              <w:left w:val="single" w:sz="4" w:space="0" w:color="000000"/>
+              <w:bottom w:val="single" w:sz="4" w:space="0" w:color="000000"/>
+            </w:tcBorders>
+            <w:vAlign w:val="bottom"/>
+          </w:tcPr>
+          <w:p>
+            <w:pPr>
+              <w:pStyle w:val="Normal"/>
+              <w:widowControl w:val="false"/>
+              <w:spacing w:lineRule="auto" w:line="180"/>
+              <w:jc w:val="center"/>
+              <w:rPr>
+                <w:color w:val="000000"/>
+                <w:sz w:val="16"/>
+                <w:szCs w:val="16"/>
+              </w:rPr>
+            </w:pPr>
+            <w:r>
+              <w:rPr>
+                <w:rFonts w:eastAsia="arial" w:ascii="arial" w:hAnsi="arial"/>
+                <w:color w:val="000000"/>
+                <w:sz w:val="16"/>
+                <w:szCs w:val="16"/>
+              </w:rPr>
+              <w:t>HEP Off</w:t>
+            </w:r>
+          </w:p>
+        </w:tc>
+        <w:tc>
+          <w:tcPr>
+            <w:tcW w:w="1016" w:type="dxa"/>
+            <w:tcBorders>
+              <w:top w:val="single" w:sz="4" w:space="0" w:color="000000"/>
+              <w:left w:val="single" w:sz="4" w:space="0" w:color="000000"/>
+              <w:bottom w:val="single" w:sz="4" w:space="0" w:color="000000"/>
+            </w:tcBorders>
+            <w:vAlign w:val="bottom"/>
+          </w:tcPr>
+          <w:p>
+            <w:pPr>
+              <w:pStyle w:val="Normal"/>
+              <w:widowControl w:val="false"/>
+              <w:jc w:val="center"/>
+              <w:rPr>
+                <w:color w:val="000000"/>
+                <w:sz w:val="16"/>
+                <w:szCs w:val="16"/>
+              </w:rPr>
+            </w:pPr>
+            <w:r>
+              <w:rPr>
+                <w:rFonts w:eastAsia="arial" w:ascii="arial" w:hAnsi="arial"/>
+                <w:color w:val="000000"/>
+                <w:sz w:val="16"/>
+                <w:szCs w:val="16"/>
+              </w:rPr>
+              <w:t>Brake</w:t>
+            </w:r>
+          </w:p>
+          <w:p>
+            <w:pPr>
+              <w:pStyle w:val="Normal"/>
+              <w:widowControl w:val="false"/>
+              <w:jc w:val="center"/>
+              <w:rPr>
+                <w:color w:val="000000"/>
+                <w:sz w:val="16"/>
+                <w:szCs w:val="16"/>
+              </w:rPr>
+            </w:pPr>
+            <w:r>
+              <w:rPr>
+                <w:rFonts w:eastAsia="arial" w:ascii="arial" w:hAnsi="arial"/>
+                <w:color w:val="000000"/>
+                <w:sz w:val="16"/>
+                <w:szCs w:val="16"/>
+              </w:rPr>
+              <w:t>Cut-Out</w:t>
+            </w:r>
+          </w:p>
+        </w:tc>
+        <w:tc>
+          <w:tcPr>
+            <w:tcW w:w="1017" w:type="dxa"/>
+            <w:tcBorders>
+              <w:top w:val="single" w:sz="4" w:space="0" w:color="000000"/>
+              <w:left w:val="single" w:sz="4" w:space="0" w:color="000000"/>
+              <w:bottom w:val="single" w:sz="4" w:space="0" w:color="000000"/>
+            </w:tcBorders>
+            <w:vAlign w:val="bottom"/>
+          </w:tcPr>
+          <w:p>
+            <w:pPr>
+              <w:pStyle w:val="Normal"/>
+              <w:widowControl w:val="false"/>
+              <w:jc w:val="center"/>
+              <w:rPr>
+                <w:color w:val="000000"/>
+                <w:sz w:val="16"/>
+                <w:szCs w:val="16"/>
+              </w:rPr>
+            </w:pPr>
+            <w:r>
+              <w:rPr>
+                <w:rFonts w:eastAsia="arial" w:ascii="arial" w:hAnsi="arial"/>
+                <w:color w:val="000000"/>
+                <w:sz w:val="16"/>
+                <w:szCs w:val="16"/>
+              </w:rPr>
+              <w:t>Dim</w:t>
+            </w:r>
+          </w:p>
+        </w:tc>
+        <w:tc>
+          <w:tcPr>
+            <w:tcW w:w="1016" w:type="dxa"/>
+            <w:tcBorders>
+              <w:top w:val="single" w:sz="4" w:space="0" w:color="000000"/>
+              <w:left w:val="single" w:sz="4" w:space="0" w:color="000000"/>
+              <w:bottom w:val="single" w:sz="4" w:space="0" w:color="000000"/>
+            </w:tcBorders>
+            <w:vAlign w:val="bottom"/>
+          </w:tcPr>
+          <w:p>
+            <w:pPr>
+              <w:pStyle w:val="Normal"/>
+              <w:widowControl w:val="false"/>
+              <w:jc w:val="center"/>
+              <w:rPr>
+                <w:color w:val="000000"/>
+                <w:sz w:val="16"/>
+                <w:szCs w:val="16"/>
+              </w:rPr>
+            </w:pPr>
+            <w:r>
+              <w:rPr>
+                <w:rFonts w:eastAsia="arial" w:ascii="arial" w:hAnsi="arial"/>
+                <w:color w:val="000000"/>
+                <w:sz w:val="16"/>
+                <w:szCs w:val="16"/>
+              </w:rPr>
+              <w:t>Boarding Light</w:t>
+            </w:r>
+          </w:p>
+        </w:tc>
+        <w:tc>
+          <w:tcPr>
+            <w:tcW w:w="1020" w:type="dxa"/>
+            <w:tcBorders>
+              <w:top w:val="single" w:sz="4" w:space="0" w:color="000000"/>
+              <w:left w:val="single" w:sz="4" w:space="0" w:color="000000"/>
+              <w:bottom w:val="single" w:sz="4" w:space="0" w:color="000000"/>
+            </w:tcBorders>
+            <w:vAlign w:val="bottom"/>
+          </w:tcPr>
+          <w:p>
+            <w:pPr>
+              <w:pStyle w:val="Normal"/>
+              <w:widowControl w:val="false"/>
+              <w:spacing w:lineRule="auto" w:line="180"/>
+              <w:jc w:val="center"/>
+              <w:rPr>
+                <w:sz w:val="16"/>
+                <w:szCs w:val="16"/>
+              </w:rPr>
+            </w:pPr>
+            <w:r>
+              <w:rPr>
+                <w:rFonts w:eastAsia="arial" w:ascii="arial" w:hAnsi="arial"/>
+                <w:color w:val="000000"/>
+                <w:sz w:val="16"/>
+                <w:szCs w:val="16"/>
+              </w:rPr>
+              <w:t>Marker Light Off</w:t>
+            </w:r>
+          </w:p>
+        </w:tc>
+        <w:tc>
+          <w:tcPr>
+            <w:tcW w:w="1016" w:type="dxa"/>
+            <w:tcBorders>
+              <w:top w:val="single" w:sz="4" w:space="0" w:color="000000"/>
+              <w:left w:val="single" w:sz="4" w:space="0" w:color="000000"/>
+              <w:bottom w:val="single" w:sz="4" w:space="0" w:color="000000"/>
+            </w:tcBorders>
+            <w:vAlign w:val="bottom"/>
+          </w:tcPr>
+          <w:p>
+            <w:pPr>
+              <w:pStyle w:val="Normal"/>
+              <w:widowControl w:val="false"/>
+              <w:spacing w:lineRule="auto" w:line="180"/>
+              <w:jc w:val="center"/>
+              <w:rPr>
+                <w:sz w:val="16"/>
+                <w:szCs w:val="16"/>
+              </w:rPr>
+            </w:pPr>
+            <w:r>
+              <w:rPr>
+                <w:rFonts w:eastAsia="arial" w:ascii="arial" w:hAnsi="arial"/>
+                <w:color w:val="000000"/>
+                <w:sz w:val="16"/>
+                <w:szCs w:val="16"/>
+              </w:rPr>
+              <w:t>Desk Light</w:t>
+            </w:r>
+          </w:p>
+        </w:tc>
+        <w:tc>
+          <w:tcPr>
+            <w:tcW w:w="1016" w:type="dxa"/>
+            <w:tcBorders>
+              <w:top w:val="single" w:sz="4" w:space="0" w:color="000000"/>
+              <w:left w:val="single" w:sz="4" w:space="0" w:color="000000"/>
+              <w:bottom w:val="single" w:sz="4" w:space="0" w:color="000000"/>
+            </w:tcBorders>
+            <w:vAlign w:val="bottom"/>
+          </w:tcPr>
+          <w:p>
+            <w:pPr>
+              <w:pStyle w:val="Normal"/>
+              <w:widowControl w:val="false"/>
+              <w:jc w:val="center"/>
+              <w:rPr>
+                <w:color w:val="000000"/>
+                <w:sz w:val="16"/>
+                <w:szCs w:val="16"/>
+              </w:rPr>
+            </w:pPr>
+            <w:r>
+              <w:rPr>
+                <w:rFonts w:eastAsia="arial" w:ascii="arial" w:hAnsi="arial"/>
+                <w:color w:val="000000"/>
+                <w:sz w:val="16"/>
+                <w:szCs w:val="16"/>
+              </w:rPr>
+              <w:t>Ditch Light</w:t>
+            </w:r>
+          </w:p>
+        </w:tc>
+        <w:tc>
+          <w:tcPr>
+            <w:tcW w:w="1016" w:type="dxa"/>
+            <w:tcBorders>
+              <w:top w:val="single" w:sz="4" w:space="0" w:color="000000"/>
+              <w:left w:val="single" w:sz="4" w:space="0" w:color="000000"/>
+              <w:bottom w:val="single" w:sz="4" w:space="0" w:color="000000"/>
+            </w:tcBorders>
+            <w:vAlign w:val="bottom"/>
+          </w:tcPr>
+          <w:p>
+            <w:pPr>
+              <w:pStyle w:val="Normal"/>
+              <w:widowControl w:val="false"/>
+              <w:spacing w:lineRule="auto" w:line="180"/>
+              <w:jc w:val="center"/>
+              <w:rPr>
+                <w:sz w:val="16"/>
+                <w:szCs w:val="16"/>
+              </w:rPr>
+            </w:pPr>
+            <w:r>
+              <w:rPr>
+                <w:rFonts w:eastAsia="arial" w:ascii="arial" w:hAnsi="arial"/>
+                <w:color w:val="000000"/>
+                <w:sz w:val="16"/>
+                <w:szCs w:val="16"/>
+              </w:rPr>
+              <w:t>Exterior</w:t>
+            </w:r>
+          </w:p>
+          <w:p>
+            <w:pPr>
+              <w:pStyle w:val="Normal"/>
+              <w:widowControl w:val="false"/>
+              <w:spacing w:lineRule="auto" w:line="180"/>
+              <w:jc w:val="center"/>
+              <w:rPr>
+                <w:sz w:val="16"/>
+                <w:szCs w:val="16"/>
+              </w:rPr>
+            </w:pPr>
+            <w:r>
+              <w:rPr>
+                <w:rFonts w:eastAsia="arial" w:ascii="arial" w:hAnsi="arial"/>
+                <w:color w:val="000000"/>
+                <w:sz w:val="16"/>
+                <w:szCs w:val="16"/>
+              </w:rPr>
+              <w:t>Camera</w:t>
+            </w:r>
+          </w:p>
+        </w:tc>
+        <w:tc>
+          <w:tcPr>
+            <w:tcW w:w="1029" w:type="dxa"/>
+            <w:tcBorders>
+              <w:top w:val="single" w:sz="4" w:space="0" w:color="000000"/>
+              <w:left w:val="single" w:sz="4" w:space="0" w:color="000000"/>
+              <w:bottom w:val="single" w:sz="4" w:space="0" w:color="000000"/>
+              <w:right w:val="single" w:sz="4" w:space="0" w:color="000000"/>
+            </w:tcBorders>
+            <w:vAlign w:val="bottom"/>
+          </w:tcPr>
+          <w:p>
+            <w:pPr>
+              <w:pStyle w:val="Normal"/>
+              <w:widowControl w:val="false"/>
+              <w:spacing w:lineRule="auto" w:line="180"/>
+              <w:jc w:val="center"/>
+              <w:rPr>
+                <w:sz w:val="16"/>
+                <w:szCs w:val="16"/>
+              </w:rPr>
+            </w:pPr>
+            <w:r>
+              <w:rPr>
+                <w:rFonts w:eastAsia="arial" w:ascii="arial" w:hAnsi="arial"/>
+                <w:color w:val="000000"/>
+                <w:sz w:val="16"/>
+                <w:szCs w:val="16"/>
+              </w:rPr>
+              <w:t>Prev</w:t>
+            </w:r>
+          </w:p>
+          <w:p>
+            <w:pPr>
+              <w:pStyle w:val="Normal"/>
+              <w:widowControl w:val="false"/>
+              <w:spacing w:lineRule="auto" w:line="180"/>
+              <w:jc w:val="center"/>
+              <w:rPr>
+                <w:sz w:val="16"/>
+                <w:szCs w:val="16"/>
+              </w:rPr>
+            </w:pPr>
+            <w:r>
+              <w:rPr>
+                <w:rFonts w:eastAsia="arial" w:ascii="arial" w:hAnsi="arial"/>
+                <w:color w:val="000000"/>
+                <w:sz w:val="16"/>
+                <w:szCs w:val="16"/>
+              </w:rPr>
+              <w:t>Cab Cam</w:t>
+            </w:r>
+          </w:p>
+        </w:tc>
+      </w:tr>
+    </w:tbl>
+    <w:p>
+      <w:pPr>
+        <w:pStyle w:val="Normal"/>
+        <w:rPr>
+          <w:color w:val="000000"/>
+          <w:sz w:val="16"/>
+          <w:szCs w:val="16"/>
+        </w:rPr>
+      </w:pPr>
+      <w:r>
+        <w:rPr>
+          <w:color w:val="000000"/>
+          <w:sz w:val="16"/>
+          <w:szCs w:val="16"/>
+        </w:rPr>
+      </w:r>
+    </w:p>
+    <w:p>
+      <w:pPr>
+        <w:pStyle w:val="Normal"/>
+        <w:rPr>
+          <w:color w:val="000000"/>
+          <w:sz w:val="16"/>
+          <w:szCs w:val="16"/>
+        </w:rPr>
+      </w:pPr>
+      <w:r>
+        <w:rPr>
+          <w:color w:val="000000"/>
+          <w:sz w:val="16"/>
+          <w:szCs w:val="16"/>
+        </w:rPr>
+        <w:tab/>
+        <w:t xml:space="preserve">       </w:t>
+      </w:r>
+      <w:r>
+        <w:rPr>
+          <w:rFonts w:eastAsia="arial" w:ascii="arial" w:hAnsi="arial"/>
+          <w:color w:val="000000"/>
+          <w:sz w:val="16"/>
+          <w:szCs w:val="16"/>
+        </w:rPr>
+        <w:t xml:space="preserve">    ALP-46-1</w:t>
+      </w:r>
+    </w:p>
+    <w:tbl>
+      <w:tblPr>
+        <w:tblW w:w="14248" w:type="dxa"/>
+        <w:jc w:val="left"/>
+        <w:tblInd w:w="-5" w:type="dxa"/>
+        <w:tblLayout w:type="fixed"/>
+        <w:tblCellMar>
+          <w:top w:w="0" w:type="dxa"/>
+          <w:left w:w="108" w:type="dxa"/>
+          <w:bottom w:w="0" w:type="dxa"/>
+          <w:right w:w="108" w:type="dxa"/>
+        </w:tblCellMar>
+        <w:tblLook w:firstRow="1" w:noVBand="1" w:lastRow="0" w:firstColumn="1" w:lastColumn="0" w:noHBand="0" w:val="04a0"/>
+      </w:tblPr>
+      <w:tblGrid>
+        <w:gridCol w:w="1017"/>
+        <w:gridCol w:w="1019"/>
+        <w:gridCol w:w="1014"/>
+        <w:gridCol w:w="1016"/>
+        <w:gridCol w:w="1020"/>
+        <w:gridCol w:w="1016"/>
+        <w:gridCol w:w="1016"/>
+        <w:gridCol w:w="1017"/>
+        <w:gridCol w:w="1016"/>
+        <w:gridCol w:w="1020"/>
+        <w:gridCol w:w="1016"/>
+        <w:gridCol w:w="1016"/>
+        <w:gridCol w:w="1016"/>
+        <w:gridCol w:w="1029"/>
+      </w:tblGrid>
+      <w:tr>
+        <w:trPr>
+          <w:trHeight w:val="440" w:hRule="exact"/>
+          <w:cantSplit w:val="true"/>
+        </w:trPr>
+        <w:tc>
+          <w:tcPr>
+            <w:tcW w:w="1017" w:type="dxa"/>
+            <w:tcBorders>
+              <w:top w:val="single" w:sz="4" w:space="0" w:color="000000"/>
+              <w:left w:val="single" w:sz="4" w:space="0" w:color="000000"/>
+              <w:bottom w:val="single" w:sz="4" w:space="0" w:color="000000"/>
+            </w:tcBorders>
+            <w:vAlign w:val="bottom"/>
+          </w:tcPr>
+          <w:p>
+            <w:pPr>
+              <w:pStyle w:val="Normal"/>
+              <w:widowControl w:val="false"/>
+              <w:spacing w:lineRule="auto" w:line="180" w:before="0" w:after="60"/>
+              <w:jc w:val="center"/>
+              <w:rPr>
+                <w:color w:val="000000"/>
+                <w:sz w:val="16"/>
+                <w:szCs w:val="16"/>
+              </w:rPr>
+            </w:pPr>
+            <w:r>
+              <w:rPr>
+                <w:rFonts w:eastAsia="arial" w:ascii="arial" w:hAnsi="arial"/>
+                <w:b/>
+                <w:color w:val="000000"/>
+                <w:sz w:val="16"/>
+                <w:szCs w:val="16"/>
+              </w:rPr>
+              <w:t>Pause</w:t>
+            </w:r>
+          </w:p>
+        </w:tc>
+        <w:tc>
+          <w:tcPr>
+            <w:tcW w:w="1019" w:type="dxa"/>
+            <w:tcBorders>
+              <w:top w:val="single" w:sz="4" w:space="0" w:color="000000"/>
+              <w:left w:val="single" w:sz="4" w:space="0" w:color="000000"/>
+              <w:bottom w:val="single" w:sz="4" w:space="0" w:color="000000"/>
+            </w:tcBorders>
+            <w:vAlign w:val="bottom"/>
+          </w:tcPr>
+          <w:p>
+            <w:pPr>
+              <w:pStyle w:val="Normal"/>
+              <w:widowControl w:val="false"/>
+              <w:spacing w:lineRule="auto" w:line="180"/>
+              <w:jc w:val="center"/>
+              <w:rPr>
+                <w:color w:val="000000"/>
+                <w:sz w:val="16"/>
+                <w:szCs w:val="16"/>
+              </w:rPr>
+            </w:pPr>
+            <w:r>
+              <w:rPr>
+                <w:color w:val="000000"/>
+                <w:sz w:val="16"/>
+                <w:szCs w:val="16"/>
+              </w:rPr>
+            </w:r>
+          </w:p>
+        </w:tc>
+        <w:tc>
+          <w:tcPr>
+            <w:tcW w:w="1014" w:type="dxa"/>
+            <w:tcBorders>
+              <w:top w:val="single" w:sz="4" w:space="0" w:color="000000"/>
+              <w:left w:val="single" w:sz="4" w:space="0" w:color="000000"/>
+              <w:bottom w:val="single" w:sz="4" w:space="0" w:color="000000"/>
+            </w:tcBorders>
+            <w:vAlign w:val="bottom"/>
+          </w:tcPr>
+          <w:p>
+            <w:pPr>
+              <w:pStyle w:val="Normal"/>
+              <w:widowControl w:val="false"/>
+              <w:jc w:val="center"/>
+              <w:rPr>
+                <w:rFonts w:ascii="arial" w:hAnsi="arial" w:eastAsia="arial"/>
+                <w:color w:val="000000"/>
+                <w:sz w:val="16"/>
+                <w:szCs w:val="16"/>
+              </w:rPr>
+            </w:pPr>
+            <w:r>
+              <w:rPr>
+                <w:rFonts w:eastAsia="arial" w:ascii="arial" w:hAnsi="arial"/>
+                <w:color w:val="000000"/>
+                <w:sz w:val="16"/>
+                <w:szCs w:val="16"/>
+              </w:rPr>
+            </w:r>
+          </w:p>
+        </w:tc>
+        <w:tc>
+          <w:tcPr>
+            <w:tcW w:w="1016" w:type="dxa"/>
+            <w:tcBorders>
+              <w:top w:val="single" w:sz="4" w:space="0" w:color="000000"/>
+              <w:left w:val="single" w:sz="4" w:space="0" w:color="000000"/>
+              <w:bottom w:val="single" w:sz="4" w:space="0" w:color="000000"/>
+            </w:tcBorders>
+            <w:vAlign w:val="bottom"/>
+          </w:tcPr>
+          <w:p>
+            <w:pPr>
+              <w:pStyle w:val="Normal"/>
+              <w:widowControl w:val="false"/>
+              <w:spacing w:lineRule="auto" w:line="180"/>
+              <w:jc w:val="center"/>
+              <w:rPr>
+                <w:color w:val="000000"/>
+                <w:sz w:val="16"/>
+                <w:szCs w:val="16"/>
+              </w:rPr>
+            </w:pPr>
+            <w:r>
+              <w:rPr>
+                <w:color w:val="000000"/>
+                <w:sz w:val="16"/>
+                <w:szCs w:val="16"/>
+              </w:rPr>
+              <w:t>ATC/ACSES</w:t>
+            </w:r>
+          </w:p>
+        </w:tc>
+        <w:tc>
+          <w:tcPr>
+            <w:tcW w:w="1020" w:type="dxa"/>
+            <w:tcBorders>
+              <w:top w:val="single" w:sz="4" w:space="0" w:color="000000"/>
+              <w:left w:val="single" w:sz="4" w:space="0" w:color="000000"/>
+              <w:bottom w:val="single" w:sz="4" w:space="0" w:color="000000"/>
+            </w:tcBorders>
+            <w:vAlign w:val="bottom"/>
+          </w:tcPr>
+          <w:p>
+            <w:pPr>
+              <w:pStyle w:val="Normal"/>
+              <w:widowControl w:val="false"/>
+              <w:spacing w:lineRule="auto" w:line="180"/>
+              <w:jc w:val="center"/>
+              <w:rPr>
+                <w:color w:val="000000"/>
+                <w:sz w:val="16"/>
+                <w:szCs w:val="16"/>
+              </w:rPr>
+            </w:pPr>
+            <w:r>
+              <w:rPr>
+                <w:color w:val="000000"/>
+                <w:sz w:val="16"/>
+                <w:szCs w:val="16"/>
+              </w:rPr>
+              <w:t>Panto. Raise</w:t>
+            </w:r>
+          </w:p>
+        </w:tc>
+        <w:tc>
+          <w:tcPr>
+            <w:tcW w:w="1016" w:type="dxa"/>
+            <w:tcBorders>
+              <w:top w:val="single" w:sz="4" w:space="0" w:color="000000"/>
+              <w:left w:val="single" w:sz="4" w:space="0" w:color="000000"/>
+              <w:bottom w:val="single" w:sz="4" w:space="0" w:color="000000"/>
+            </w:tcBorders>
+            <w:vAlign w:val="bottom"/>
+          </w:tcPr>
+          <w:p>
+            <w:pPr>
+              <w:pStyle w:val="Normal"/>
+              <w:widowControl w:val="false"/>
+              <w:spacing w:lineRule="auto" w:line="180"/>
+              <w:jc w:val="center"/>
+              <w:rPr>
+                <w:color w:val="000000"/>
+                <w:sz w:val="16"/>
+                <w:szCs w:val="16"/>
+              </w:rPr>
+            </w:pPr>
+            <w:r>
+              <w:rPr>
+                <w:rFonts w:eastAsia="arial" w:ascii="arial" w:hAnsi="arial"/>
+                <w:color w:val="000000"/>
+                <w:sz w:val="16"/>
+                <w:szCs w:val="16"/>
+              </w:rPr>
+              <w:t>HEP On</w:t>
+            </w:r>
+          </w:p>
+        </w:tc>
+        <w:tc>
+          <w:tcPr>
+            <w:tcW w:w="1016" w:type="dxa"/>
+            <w:tcBorders>
+              <w:top w:val="single" w:sz="4" w:space="0" w:color="000000"/>
+              <w:left w:val="single" w:sz="4" w:space="0" w:color="000000"/>
+              <w:bottom w:val="single" w:sz="4" w:space="0" w:color="000000"/>
+            </w:tcBorders>
+            <w:vAlign w:val="bottom"/>
+          </w:tcPr>
+          <w:p>
+            <w:pPr>
+              <w:pStyle w:val="Normal"/>
+              <w:widowControl w:val="false"/>
+              <w:jc w:val="center"/>
+              <w:rPr>
+                <w:color w:val="000000"/>
+                <w:sz w:val="16"/>
+                <w:szCs w:val="16"/>
+              </w:rPr>
+            </w:pPr>
+            <w:r>
+              <w:rPr>
+                <w:color w:val="000000"/>
+                <w:sz w:val="16"/>
+                <w:szCs w:val="16"/>
+              </w:rPr>
+              <w:t>Brake</w:t>
+            </w:r>
+          </w:p>
+          <w:p>
+            <w:pPr>
+              <w:pStyle w:val="Normal"/>
+              <w:widowControl w:val="false"/>
+              <w:jc w:val="center"/>
+              <w:rPr>
+                <w:color w:val="000000"/>
+                <w:sz w:val="16"/>
+                <w:szCs w:val="16"/>
+              </w:rPr>
+            </w:pPr>
+            <w:r>
+              <w:rPr>
+                <w:color w:val="000000"/>
+                <w:sz w:val="16"/>
+                <w:szCs w:val="16"/>
+              </w:rPr>
+              <w:t>Cut-In</w:t>
+            </w:r>
+          </w:p>
+        </w:tc>
+        <w:tc>
+          <w:tcPr>
+            <w:tcW w:w="1017" w:type="dxa"/>
+            <w:tcBorders>
+              <w:top w:val="single" w:sz="4" w:space="0" w:color="000000"/>
+              <w:left w:val="single" w:sz="4" w:space="0" w:color="000000"/>
+              <w:bottom w:val="single" w:sz="4" w:space="0" w:color="000000"/>
+            </w:tcBorders>
+            <w:vAlign w:val="bottom"/>
+          </w:tcPr>
+          <w:p>
+            <w:pPr>
+              <w:pStyle w:val="Normal"/>
+              <w:widowControl w:val="false"/>
+              <w:jc w:val="center"/>
+              <w:rPr>
+                <w:color w:val="000000"/>
+                <w:sz w:val="16"/>
+                <w:szCs w:val="16"/>
+              </w:rPr>
+            </w:pPr>
+            <w:r>
+              <w:rPr>
+                <w:rFonts w:eastAsia="arial" w:ascii="arial" w:hAnsi="arial"/>
+                <w:color w:val="000000"/>
+                <w:sz w:val="16"/>
+                <w:szCs w:val="16"/>
+              </w:rPr>
+              <w:t>Brake Trail</w:t>
+            </w:r>
+          </w:p>
+        </w:tc>
+        <w:tc>
+          <w:tcPr>
+            <w:tcW w:w="1016" w:type="dxa"/>
+            <w:tcBorders>
+              <w:top w:val="single" w:sz="4" w:space="0" w:color="000000"/>
+              <w:left w:val="single" w:sz="4" w:space="0" w:color="000000"/>
+              <w:bottom w:val="single" w:sz="4" w:space="0" w:color="000000"/>
+            </w:tcBorders>
+            <w:vAlign w:val="bottom"/>
+          </w:tcPr>
+          <w:p>
+            <w:pPr>
+              <w:pStyle w:val="Normal"/>
+              <w:widowControl w:val="false"/>
+              <w:jc w:val="center"/>
+              <w:rPr>
+                <w:color w:val="000000"/>
+                <w:sz w:val="16"/>
+                <w:szCs w:val="16"/>
+              </w:rPr>
+            </w:pPr>
+            <w:r>
+              <w:rPr>
+                <w:rFonts w:eastAsia="arial" w:ascii="arial" w:hAnsi="arial"/>
+                <w:color w:val="000000"/>
+                <w:sz w:val="16"/>
+                <w:szCs w:val="16"/>
+              </w:rPr>
+              <w:t>Ditch Light On</w:t>
+            </w:r>
+          </w:p>
+        </w:tc>
+        <w:tc>
+          <w:tcPr>
+            <w:tcW w:w="1020" w:type="dxa"/>
+            <w:tcBorders>
+              <w:top w:val="single" w:sz="4" w:space="0" w:color="000000"/>
+              <w:left w:val="single" w:sz="4" w:space="0" w:color="000000"/>
+              <w:bottom w:val="single" w:sz="4" w:space="0" w:color="000000"/>
+            </w:tcBorders>
+            <w:vAlign w:val="bottom"/>
+          </w:tcPr>
+          <w:p>
+            <w:pPr>
+              <w:pStyle w:val="Normal"/>
+              <w:widowControl w:val="false"/>
+              <w:spacing w:lineRule="auto" w:line="180"/>
+              <w:jc w:val="center"/>
+              <w:rPr>
+                <w:sz w:val="16"/>
+                <w:szCs w:val="16"/>
+              </w:rPr>
+            </w:pPr>
+            <w:r>
+              <w:rPr>
+                <w:rFonts w:eastAsia="arial" w:ascii="arial" w:hAnsi="arial"/>
+                <w:color w:val="000000"/>
+                <w:sz w:val="16"/>
+                <w:szCs w:val="16"/>
+              </w:rPr>
+              <w:t>Marker Light On</w:t>
+            </w:r>
+          </w:p>
+        </w:tc>
+        <w:tc>
+          <w:tcPr>
+            <w:tcW w:w="1016" w:type="dxa"/>
+            <w:tcBorders>
+              <w:top w:val="single" w:sz="4" w:space="0" w:color="000000"/>
+              <w:left w:val="single" w:sz="4" w:space="0" w:color="000000"/>
+              <w:bottom w:val="single" w:sz="4" w:space="0" w:color="000000"/>
+            </w:tcBorders>
+            <w:vAlign w:val="bottom"/>
+          </w:tcPr>
+          <w:p>
+            <w:pPr>
+              <w:pStyle w:val="Normal"/>
+              <w:widowControl w:val="false"/>
+              <w:spacing w:lineRule="auto" w:line="180"/>
+              <w:jc w:val="center"/>
+              <w:rPr>
+                <w:sz w:val="16"/>
+                <w:szCs w:val="16"/>
+              </w:rPr>
+            </w:pPr>
+            <w:r>
+              <w:rPr>
+                <w:rFonts w:eastAsia="arial" w:ascii="arial" w:hAnsi="arial"/>
+                <w:color w:val="000000"/>
+                <w:sz w:val="16"/>
+                <w:szCs w:val="16"/>
+              </w:rPr>
+              <w:t>Gauge Light On</w:t>
+            </w:r>
+          </w:p>
+        </w:tc>
+        <w:tc>
+          <w:tcPr>
+            <w:tcW w:w="1016" w:type="dxa"/>
+            <w:tcBorders>
+              <w:top w:val="single" w:sz="4" w:space="0" w:color="000000"/>
+              <w:left w:val="single" w:sz="4" w:space="0" w:color="000000"/>
+              <w:bottom w:val="single" w:sz="4" w:space="0" w:color="000000"/>
+            </w:tcBorders>
+            <w:vAlign w:val="bottom"/>
+          </w:tcPr>
+          <w:p>
+            <w:pPr>
+              <w:pStyle w:val="Normal"/>
+              <w:widowControl w:val="false"/>
+              <w:spacing w:lineRule="auto" w:line="180"/>
+              <w:jc w:val="center"/>
+              <w:rPr>
+                <w:sz w:val="16"/>
+                <w:szCs w:val="16"/>
+              </w:rPr>
+            </w:pPr>
+            <w:r>
+              <w:rPr>
+                <w:sz w:val="16"/>
+                <w:szCs w:val="16"/>
+              </w:rPr>
+              <w:t>Cab Light</w:t>
+            </w:r>
+          </w:p>
+        </w:tc>
+        <w:tc>
+          <w:tcPr>
+            <w:tcW w:w="1016" w:type="dxa"/>
+            <w:tcBorders>
+              <w:top w:val="single" w:sz="4" w:space="0" w:color="000000"/>
+              <w:left w:val="single" w:sz="4" w:space="0" w:color="000000"/>
+              <w:bottom w:val="single" w:sz="4" w:space="0" w:color="000000"/>
+            </w:tcBorders>
+            <w:vAlign w:val="bottom"/>
+          </w:tcPr>
+          <w:p>
+            <w:pPr>
+              <w:pStyle w:val="Normal"/>
+              <w:widowControl w:val="false"/>
+              <w:spacing w:lineRule="auto" w:line="180"/>
+              <w:jc w:val="center"/>
+              <w:rPr>
+                <w:sz w:val="16"/>
+                <w:szCs w:val="16"/>
+              </w:rPr>
+            </w:pPr>
+            <w:r>
+              <w:rPr>
+                <w:rFonts w:eastAsia="arial" w:ascii="arial" w:hAnsi="arial"/>
+                <w:color w:val="000000"/>
+                <w:sz w:val="16"/>
+                <w:szCs w:val="16"/>
+              </w:rPr>
+              <w:t>1-Person</w:t>
+            </w:r>
+          </w:p>
+        </w:tc>
+        <w:tc>
+          <w:tcPr>
+            <w:tcW w:w="1029" w:type="dxa"/>
+            <w:tcBorders>
+              <w:top w:val="single" w:sz="4" w:space="0" w:color="000000"/>
+              <w:left w:val="single" w:sz="4" w:space="0" w:color="000000"/>
+              <w:bottom w:val="single" w:sz="4" w:space="0" w:color="000000"/>
+              <w:right w:val="single" w:sz="4" w:space="0" w:color="000000"/>
+            </w:tcBorders>
+            <w:vAlign w:val="bottom"/>
+          </w:tcPr>
+          <w:p>
+            <w:pPr>
+              <w:pStyle w:val="Normal"/>
+              <w:widowControl w:val="false"/>
+              <w:spacing w:lineRule="auto" w:line="180"/>
+              <w:jc w:val="center"/>
+              <w:rPr>
+                <w:sz w:val="16"/>
+                <w:szCs w:val="16"/>
+              </w:rPr>
+            </w:pPr>
+            <w:r>
+              <w:rPr>
+                <w:rFonts w:eastAsia="arial" w:ascii="arial" w:hAnsi="arial"/>
+                <w:color w:val="000000"/>
+                <w:sz w:val="16"/>
+                <w:szCs w:val="16"/>
+              </w:rPr>
+              <w:t>Next</w:t>
+            </w:r>
+          </w:p>
+          <w:p>
+            <w:pPr>
+              <w:pStyle w:val="Normal"/>
+              <w:widowControl w:val="false"/>
+              <w:spacing w:lineRule="auto" w:line="180"/>
+              <w:jc w:val="center"/>
+              <w:rPr>
+                <w:sz w:val="16"/>
+                <w:szCs w:val="16"/>
+              </w:rPr>
+            </w:pPr>
+            <w:r>
+              <w:rPr>
+                <w:rFonts w:eastAsia="arial" w:ascii="arial" w:hAnsi="arial"/>
+                <w:color w:val="000000"/>
+                <w:sz w:val="16"/>
+                <w:szCs w:val="16"/>
+              </w:rPr>
+              <w:t>Cab Cam</w:t>
+            </w:r>
+          </w:p>
+        </w:tc>
+      </w:tr>
+    </w:tbl>
+    <w:p>
+      <w:pPr>
+        <w:pStyle w:val="Normal"/>
+        <w:rPr>
+          <w:rFonts w:ascii="arial" w:hAnsi="arial" w:eastAsia="arial"/>
+          <w:color w:val="000000"/>
+          <w:sz w:val="16"/>
+          <w:szCs w:val="16"/>
+        </w:rPr>
+      </w:pPr>
+      <w:r>
+        <w:rPr>
+          <w:rFonts w:eastAsia="arial" w:ascii="arial" w:hAnsi="arial"/>
+          <w:color w:val="000000"/>
+          <w:sz w:val="16"/>
+          <w:szCs w:val="16"/>
+        </w:rPr>
+      </w:r>
+    </w:p>
+    <w:p>
+      <w:pPr>
+        <w:pStyle w:val="Normal"/>
+        <w:rPr>
+          <w:color w:val="000000"/>
+          <w:sz w:val="16"/>
+          <w:szCs w:val="16"/>
+        </w:rPr>
+      </w:pPr>
+      <w:r>
+        <w:rPr>
+          <w:rFonts w:eastAsia="arial" w:ascii="arial" w:hAnsi="arial"/>
+          <w:color w:val="000000"/>
+          <w:sz w:val="16"/>
+          <w:szCs w:val="16"/>
+        </w:rPr>
+        <w:tab/>
+        <w:t xml:space="preserve">           ALP-46-2</w:t>
+      </w:r>
+    </w:p>
+    <w:tbl>
+      <w:tblPr>
+        <w:tblW w:w="14248" w:type="dxa"/>
+        <w:jc w:val="left"/>
+        <w:tblInd w:w="-5" w:type="dxa"/>
+        <w:tblLayout w:type="fixed"/>
+        <w:tblCellMar>
+          <w:top w:w="0" w:type="dxa"/>
+          <w:left w:w="108" w:type="dxa"/>
+          <w:bottom w:w="0" w:type="dxa"/>
+          <w:right w:w="108" w:type="dxa"/>
+        </w:tblCellMar>
+        <w:tblLook w:firstRow="1" w:noVBand="1" w:lastRow="0" w:firstColumn="1" w:lastColumn="0" w:noHBand="0" w:val="04a0"/>
+      </w:tblPr>
+      <w:tblGrid>
+        <w:gridCol w:w="1017"/>
+        <w:gridCol w:w="1019"/>
+        <w:gridCol w:w="1014"/>
+        <w:gridCol w:w="1016"/>
+        <w:gridCol w:w="1020"/>
+        <w:gridCol w:w="1016"/>
+        <w:gridCol w:w="1016"/>
+        <w:gridCol w:w="1017"/>
+        <w:gridCol w:w="1016"/>
+        <w:gridCol w:w="1020"/>
+        <w:gridCol w:w="1016"/>
+        <w:gridCol w:w="1016"/>
+        <w:gridCol w:w="1016"/>
+        <w:gridCol w:w="1029"/>
+      </w:tblGrid>
+      <w:tr>
+        <w:trPr>
+          <w:trHeight w:val="440" w:hRule="exact"/>
+          <w:cantSplit w:val="true"/>
+        </w:trPr>
+        <w:tc>
+          <w:tcPr>
+            <w:tcW w:w="1017" w:type="dxa"/>
+            <w:tcBorders>
+              <w:top w:val="single" w:sz="4" w:space="0" w:color="000000"/>
+              <w:left w:val="single" w:sz="4" w:space="0" w:color="000000"/>
+              <w:bottom w:val="single" w:sz="4" w:space="0" w:color="000000"/>
+            </w:tcBorders>
+            <w:vAlign w:val="bottom"/>
+          </w:tcPr>
+          <w:p>
+            <w:pPr>
+              <w:pStyle w:val="Normal"/>
+              <w:widowControl w:val="false"/>
+              <w:spacing w:lineRule="auto" w:line="180" w:before="0" w:after="60"/>
+              <w:jc w:val="center"/>
+              <w:rPr>
+                <w:b/>
+                <w:bCs/>
+              </w:rPr>
+            </w:pPr>
+            <w:r>
+              <w:rPr>
+                <w:b/>
+                <w:bCs/>
+                <w:color w:val="000000"/>
+                <w:sz w:val="16"/>
+                <w:szCs w:val="16"/>
+              </w:rPr>
+              <w:t>HUD</w:t>
+            </w:r>
+          </w:p>
+        </w:tc>
+        <w:tc>
+          <w:tcPr>
+            <w:tcW w:w="1019" w:type="dxa"/>
+            <w:tcBorders>
+              <w:top w:val="single" w:sz="4" w:space="0" w:color="000000"/>
+              <w:left w:val="single" w:sz="4" w:space="0" w:color="000000"/>
+              <w:bottom w:val="single" w:sz="4" w:space="0" w:color="000000"/>
+            </w:tcBorders>
+            <w:vAlign w:val="bottom"/>
+          </w:tcPr>
+          <w:p>
+            <w:pPr>
+              <w:pStyle w:val="Normal"/>
+              <w:widowControl w:val="false"/>
+              <w:spacing w:lineRule="auto" w:line="180"/>
+              <w:jc w:val="center"/>
+              <w:rPr>
+                <w:color w:val="000000"/>
+                <w:sz w:val="16"/>
+                <w:szCs w:val="16"/>
+              </w:rPr>
+            </w:pPr>
+            <w:r>
+              <w:rPr>
+                <w:color w:val="000000"/>
+                <w:sz w:val="16"/>
+                <w:szCs w:val="16"/>
+              </w:rPr>
+              <w:t>Schedule</w:t>
+            </w:r>
+          </w:p>
+        </w:tc>
+        <w:tc>
+          <w:tcPr>
+            <w:tcW w:w="1014" w:type="dxa"/>
+            <w:tcBorders>
+              <w:top w:val="single" w:sz="4" w:space="0" w:color="000000"/>
+              <w:left w:val="single" w:sz="4" w:space="0" w:color="000000"/>
+              <w:bottom w:val="single" w:sz="4" w:space="0" w:color="000000"/>
+            </w:tcBorders>
+            <w:vAlign w:val="bottom"/>
+          </w:tcPr>
+          <w:p>
+            <w:pPr>
+              <w:pStyle w:val="Normal"/>
+              <w:widowControl w:val="false"/>
+              <w:jc w:val="center"/>
+              <w:rPr>
+                <w:rFonts w:ascii="arial" w:hAnsi="arial" w:eastAsia="arial"/>
+                <w:color w:val="000000"/>
+                <w:sz w:val="16"/>
+                <w:szCs w:val="16"/>
+              </w:rPr>
+            </w:pPr>
+            <w:r>
+              <w:rPr>
+                <w:rFonts w:eastAsia="arial" w:ascii="arial" w:hAnsi="arial"/>
+                <w:color w:val="000000"/>
+                <w:sz w:val="16"/>
+                <w:szCs w:val="16"/>
+              </w:rPr>
+            </w:r>
+          </w:p>
+        </w:tc>
+        <w:tc>
+          <w:tcPr>
+            <w:tcW w:w="1016" w:type="dxa"/>
+            <w:tcBorders>
+              <w:top w:val="single" w:sz="4" w:space="0" w:color="000000"/>
+              <w:left w:val="single" w:sz="4" w:space="0" w:color="000000"/>
+              <w:bottom w:val="single" w:sz="4" w:space="0" w:color="000000"/>
+            </w:tcBorders>
+            <w:vAlign w:val="bottom"/>
+          </w:tcPr>
+          <w:p>
+            <w:pPr>
+              <w:pStyle w:val="Normal"/>
+              <w:widowControl w:val="false"/>
+              <w:spacing w:lineRule="auto" w:line="180"/>
+              <w:jc w:val="center"/>
+              <w:rPr>
+                <w:color w:val="000000"/>
+                <w:sz w:val="16"/>
+                <w:szCs w:val="16"/>
+              </w:rPr>
+            </w:pPr>
+            <w:r>
+              <w:rPr>
+                <w:color w:val="000000"/>
+                <w:sz w:val="16"/>
+                <w:szCs w:val="16"/>
+              </w:rPr>
+              <w:t>Alerter</w:t>
+            </w:r>
+          </w:p>
+        </w:tc>
+        <w:tc>
+          <w:tcPr>
+            <w:tcW w:w="1020" w:type="dxa"/>
+            <w:tcBorders>
+              <w:top w:val="single" w:sz="4" w:space="0" w:color="000000"/>
+              <w:left w:val="single" w:sz="4" w:space="0" w:color="000000"/>
+              <w:bottom w:val="single" w:sz="4" w:space="0" w:color="000000"/>
+            </w:tcBorders>
+            <w:vAlign w:val="bottom"/>
+          </w:tcPr>
+          <w:p>
+            <w:pPr>
+              <w:pStyle w:val="Normal"/>
+              <w:widowControl w:val="false"/>
+              <w:spacing w:lineRule="auto" w:line="180"/>
+              <w:jc w:val="center"/>
+              <w:rPr>
+                <w:color w:val="000000"/>
+                <w:sz w:val="16"/>
+                <w:szCs w:val="16"/>
+              </w:rPr>
+            </w:pPr>
+            <w:r>
+              <w:rPr>
+                <w:color w:val="000000"/>
+                <w:sz w:val="16"/>
+                <w:szCs w:val="16"/>
+              </w:rPr>
+              <w:t>Panto. Low</w:t>
+            </w:r>
+          </w:p>
+        </w:tc>
+        <w:tc>
+          <w:tcPr>
+            <w:tcW w:w="1016" w:type="dxa"/>
+            <w:tcBorders>
+              <w:top w:val="single" w:sz="4" w:space="0" w:color="000000"/>
+              <w:left w:val="single" w:sz="4" w:space="0" w:color="000000"/>
+              <w:bottom w:val="single" w:sz="4" w:space="0" w:color="000000"/>
+            </w:tcBorders>
+            <w:vAlign w:val="bottom"/>
+          </w:tcPr>
+          <w:p>
+            <w:pPr>
+              <w:pStyle w:val="Normal"/>
+              <w:widowControl w:val="false"/>
+              <w:spacing w:lineRule="auto" w:line="180"/>
+              <w:jc w:val="center"/>
+              <w:rPr>
+                <w:color w:val="000000"/>
+                <w:sz w:val="16"/>
+                <w:szCs w:val="16"/>
+              </w:rPr>
+            </w:pPr>
+            <w:r>
+              <w:rPr>
+                <w:rFonts w:eastAsia="arial" w:ascii="arial" w:hAnsi="arial"/>
+                <w:color w:val="000000"/>
+                <w:sz w:val="16"/>
+                <w:szCs w:val="16"/>
+              </w:rPr>
+              <w:t>HEP Off</w:t>
+            </w:r>
+          </w:p>
+        </w:tc>
+        <w:tc>
+          <w:tcPr>
+            <w:tcW w:w="1016" w:type="dxa"/>
+            <w:tcBorders>
+              <w:top w:val="single" w:sz="4" w:space="0" w:color="000000"/>
+              <w:left w:val="single" w:sz="4" w:space="0" w:color="000000"/>
+              <w:bottom w:val="single" w:sz="4" w:space="0" w:color="000000"/>
+            </w:tcBorders>
+            <w:vAlign w:val="bottom"/>
+          </w:tcPr>
+          <w:p>
+            <w:pPr>
+              <w:pStyle w:val="Normal"/>
+              <w:widowControl w:val="false"/>
+              <w:jc w:val="center"/>
+              <w:rPr>
+                <w:color w:val="000000"/>
+                <w:sz w:val="16"/>
+                <w:szCs w:val="16"/>
+              </w:rPr>
+            </w:pPr>
+            <w:r>
+              <w:rPr>
+                <w:rFonts w:eastAsia="arial" w:ascii="arial" w:hAnsi="arial"/>
+                <w:color w:val="000000"/>
+                <w:sz w:val="16"/>
+                <w:szCs w:val="16"/>
+              </w:rPr>
+              <w:t>Brake</w:t>
+            </w:r>
+          </w:p>
+          <w:p>
+            <w:pPr>
+              <w:pStyle w:val="Normal"/>
+              <w:widowControl w:val="false"/>
+              <w:jc w:val="center"/>
+              <w:rPr>
+                <w:color w:val="000000"/>
+                <w:sz w:val="16"/>
+                <w:szCs w:val="16"/>
+              </w:rPr>
+            </w:pPr>
+            <w:r>
+              <w:rPr>
+                <w:rFonts w:eastAsia="arial" w:ascii="arial" w:hAnsi="arial"/>
+                <w:color w:val="000000"/>
+                <w:sz w:val="16"/>
+                <w:szCs w:val="16"/>
+              </w:rPr>
+              <w:t>Cut-Out</w:t>
+            </w:r>
+          </w:p>
+        </w:tc>
+        <w:tc>
+          <w:tcPr>
+            <w:tcW w:w="1017" w:type="dxa"/>
+            <w:tcBorders>
+              <w:top w:val="single" w:sz="4" w:space="0" w:color="000000"/>
+              <w:left w:val="single" w:sz="4" w:space="0" w:color="000000"/>
+              <w:bottom w:val="single" w:sz="4" w:space="0" w:color="000000"/>
+            </w:tcBorders>
+            <w:vAlign w:val="bottom"/>
+          </w:tcPr>
+          <w:p>
+            <w:pPr>
+              <w:pStyle w:val="Normal"/>
+              <w:widowControl w:val="false"/>
+              <w:jc w:val="center"/>
+              <w:rPr>
+                <w:color w:val="000000"/>
+                <w:sz w:val="16"/>
+                <w:szCs w:val="16"/>
+              </w:rPr>
+            </w:pPr>
+            <w:r>
+              <w:rPr>
+                <w:color w:val="000000"/>
+                <w:sz w:val="16"/>
+                <w:szCs w:val="16"/>
+              </w:rPr>
+            </w:r>
+          </w:p>
+        </w:tc>
+        <w:tc>
+          <w:tcPr>
+            <w:tcW w:w="1016" w:type="dxa"/>
+            <w:tcBorders>
+              <w:top w:val="single" w:sz="4" w:space="0" w:color="000000"/>
+              <w:left w:val="single" w:sz="4" w:space="0" w:color="000000"/>
+              <w:bottom w:val="single" w:sz="4" w:space="0" w:color="000000"/>
+            </w:tcBorders>
+            <w:vAlign w:val="bottom"/>
+          </w:tcPr>
+          <w:p>
+            <w:pPr>
+              <w:pStyle w:val="Normal"/>
+              <w:widowControl w:val="false"/>
+              <w:jc w:val="center"/>
+              <w:rPr>
+                <w:color w:val="000000"/>
+                <w:sz w:val="16"/>
+                <w:szCs w:val="16"/>
+              </w:rPr>
+            </w:pPr>
+            <w:r>
+              <w:rPr>
+                <w:rFonts w:eastAsia="arial" w:ascii="arial" w:hAnsi="arial"/>
+                <w:color w:val="000000"/>
+                <w:sz w:val="16"/>
+                <w:szCs w:val="16"/>
+              </w:rPr>
+              <w:t>Ditch Light Off</w:t>
+            </w:r>
+          </w:p>
+        </w:tc>
+        <w:tc>
+          <w:tcPr>
+            <w:tcW w:w="1020" w:type="dxa"/>
+            <w:tcBorders>
+              <w:top w:val="single" w:sz="4" w:space="0" w:color="000000"/>
+              <w:left w:val="single" w:sz="4" w:space="0" w:color="000000"/>
+              <w:bottom w:val="single" w:sz="4" w:space="0" w:color="000000"/>
+            </w:tcBorders>
+            <w:vAlign w:val="bottom"/>
+          </w:tcPr>
+          <w:p>
+            <w:pPr>
+              <w:pStyle w:val="Normal"/>
+              <w:widowControl w:val="false"/>
+              <w:spacing w:lineRule="auto" w:line="180"/>
+              <w:jc w:val="center"/>
+              <w:rPr>
+                <w:sz w:val="16"/>
+                <w:szCs w:val="16"/>
+              </w:rPr>
+            </w:pPr>
+            <w:r>
+              <w:rPr>
+                <w:rFonts w:eastAsia="arial" w:ascii="arial" w:hAnsi="arial"/>
+                <w:color w:val="000000"/>
+                <w:sz w:val="16"/>
+                <w:szCs w:val="16"/>
+              </w:rPr>
+              <w:t>Marker Light Off</w:t>
+            </w:r>
+          </w:p>
+        </w:tc>
+        <w:tc>
+          <w:tcPr>
+            <w:tcW w:w="1016" w:type="dxa"/>
+            <w:tcBorders>
+              <w:top w:val="single" w:sz="4" w:space="0" w:color="000000"/>
+              <w:left w:val="single" w:sz="4" w:space="0" w:color="000000"/>
+              <w:bottom w:val="single" w:sz="4" w:space="0" w:color="000000"/>
+            </w:tcBorders>
+            <w:vAlign w:val="bottom"/>
+          </w:tcPr>
+          <w:p>
+            <w:pPr>
+              <w:pStyle w:val="Normal"/>
+              <w:widowControl w:val="false"/>
+              <w:spacing w:lineRule="auto" w:line="180"/>
+              <w:jc w:val="center"/>
+              <w:rPr>
+                <w:sz w:val="16"/>
+                <w:szCs w:val="16"/>
+              </w:rPr>
+            </w:pPr>
+            <w:r>
+              <w:rPr>
+                <w:rFonts w:eastAsia="arial" w:ascii="arial" w:hAnsi="arial"/>
+                <w:color w:val="000000"/>
+                <w:sz w:val="16"/>
+                <w:szCs w:val="16"/>
+              </w:rPr>
+              <w:t>Gauge Light Off</w:t>
+            </w:r>
+          </w:p>
+        </w:tc>
+        <w:tc>
+          <w:tcPr>
+            <w:tcW w:w="1016" w:type="dxa"/>
+            <w:tcBorders>
+              <w:top w:val="single" w:sz="4" w:space="0" w:color="000000"/>
+              <w:left w:val="single" w:sz="4" w:space="0" w:color="000000"/>
+              <w:bottom w:val="single" w:sz="4" w:space="0" w:color="000000"/>
+            </w:tcBorders>
+            <w:vAlign w:val="bottom"/>
+          </w:tcPr>
+          <w:p>
+            <w:pPr>
+              <w:pStyle w:val="Normal"/>
+              <w:widowControl w:val="false"/>
+              <w:jc w:val="center"/>
+              <w:rPr>
+                <w:color w:val="000000"/>
+                <w:sz w:val="16"/>
+                <w:szCs w:val="16"/>
+              </w:rPr>
+            </w:pPr>
+            <w:r>
+              <w:rPr>
+                <w:color w:val="000000"/>
+                <w:sz w:val="16"/>
+                <w:szCs w:val="16"/>
+              </w:rPr>
+            </w:r>
+          </w:p>
+        </w:tc>
+        <w:tc>
+          <w:tcPr>
+            <w:tcW w:w="1016" w:type="dxa"/>
+            <w:tcBorders>
+              <w:top w:val="single" w:sz="4" w:space="0" w:color="000000"/>
+              <w:left w:val="single" w:sz="4" w:space="0" w:color="000000"/>
+              <w:bottom w:val="single" w:sz="4" w:space="0" w:color="000000"/>
+            </w:tcBorders>
+            <w:vAlign w:val="bottom"/>
+          </w:tcPr>
+          <w:p>
+            <w:pPr>
+              <w:pStyle w:val="Normal"/>
+              <w:widowControl w:val="false"/>
+              <w:spacing w:lineRule="auto" w:line="180"/>
+              <w:jc w:val="center"/>
+              <w:rPr>
+                <w:sz w:val="16"/>
+                <w:szCs w:val="16"/>
+              </w:rPr>
+            </w:pPr>
+            <w:r>
+              <w:rPr>
+                <w:rFonts w:eastAsia="arial" w:ascii="arial" w:hAnsi="arial"/>
+                <w:color w:val="000000"/>
+                <w:sz w:val="16"/>
+                <w:szCs w:val="16"/>
+              </w:rPr>
+              <w:t>Exterior</w:t>
+            </w:r>
+          </w:p>
+          <w:p>
+            <w:pPr>
+              <w:pStyle w:val="Normal"/>
+              <w:widowControl w:val="false"/>
+              <w:spacing w:lineRule="auto" w:line="180"/>
+              <w:jc w:val="center"/>
+              <w:rPr>
+                <w:sz w:val="16"/>
+                <w:szCs w:val="16"/>
+              </w:rPr>
+            </w:pPr>
+            <w:r>
+              <w:rPr>
+                <w:rFonts w:eastAsia="arial" w:ascii="arial" w:hAnsi="arial"/>
+                <w:color w:val="000000"/>
+                <w:sz w:val="16"/>
+                <w:szCs w:val="16"/>
+              </w:rPr>
+              <w:t>Camera</w:t>
+            </w:r>
+          </w:p>
+        </w:tc>
+        <w:tc>
+          <w:tcPr>
+            <w:tcW w:w="1029" w:type="dxa"/>
+            <w:tcBorders>
+              <w:top w:val="single" w:sz="4" w:space="0" w:color="000000"/>
+              <w:left w:val="single" w:sz="4" w:space="0" w:color="000000"/>
+              <w:bottom w:val="single" w:sz="4" w:space="0" w:color="000000"/>
+              <w:right w:val="single" w:sz="4" w:space="0" w:color="000000"/>
+            </w:tcBorders>
+            <w:vAlign w:val="bottom"/>
+          </w:tcPr>
+          <w:p>
+            <w:pPr>
+              <w:pStyle w:val="Normal"/>
+              <w:widowControl w:val="false"/>
+              <w:spacing w:lineRule="auto" w:line="180"/>
+              <w:jc w:val="center"/>
+              <w:rPr>
+                <w:sz w:val="16"/>
+                <w:szCs w:val="16"/>
+              </w:rPr>
+            </w:pPr>
+            <w:r>
+              <w:rPr>
+                <w:rFonts w:eastAsia="arial" w:ascii="arial" w:hAnsi="arial"/>
+                <w:color w:val="000000"/>
+                <w:sz w:val="16"/>
+                <w:szCs w:val="16"/>
+              </w:rPr>
+              <w:t>Prev</w:t>
+            </w:r>
+          </w:p>
+          <w:p>
+            <w:pPr>
+              <w:pStyle w:val="Normal"/>
+              <w:widowControl w:val="false"/>
+              <w:spacing w:lineRule="auto" w:line="180"/>
+              <w:jc w:val="center"/>
+              <w:rPr>
+                <w:sz w:val="16"/>
+                <w:szCs w:val="16"/>
+              </w:rPr>
+            </w:pPr>
+            <w:r>
+              <w:rPr>
+                <w:rFonts w:eastAsia="arial" w:ascii="arial" w:hAnsi="arial"/>
+                <w:color w:val="000000"/>
+                <w:sz w:val="16"/>
+                <w:szCs w:val="16"/>
+              </w:rPr>
+              <w:t>Cab Cam</w:t>
+            </w:r>
+          </w:p>
+        </w:tc>
+      </w:tr>
+    </w:tbl>
+    <w:p>
+      <w:pPr>
+        <w:pStyle w:val="Normal"/>
+        <w:rPr>
+          <w:color w:val="000000"/>
+          <w:sz w:val="16"/>
+          <w:szCs w:val="16"/>
+        </w:rPr>
+      </w:pPr>
+      <w:r>
+        <w:rPr>
+          <w:color w:val="000000"/>
+          <w:sz w:val="16"/>
+          <w:szCs w:val="16"/>
+        </w:rPr>
+      </w:r>
+    </w:p>
+    <w:p>
+      <w:pPr>
+        <w:pStyle w:val="Normal"/>
+        <w:rPr>
+          <w:color w:val="000000"/>
+          <w:sz w:val="16"/>
+          <w:szCs w:val="16"/>
+        </w:rPr>
+      </w:pPr>
+      <w:r>
+        <w:rPr>
+          <w:color w:val="000000"/>
+          <w:sz w:val="16"/>
+          <w:szCs w:val="16"/>
+        </w:rPr>
+        <w:tab/>
+        <w:t xml:space="preserve">       </w:t>
+      </w:r>
+      <w:r>
+        <w:rPr>
+          <w:rFonts w:eastAsia="arial" w:ascii="arial" w:hAnsi="arial"/>
+          <w:color w:val="000000"/>
+          <w:sz w:val="16"/>
+          <w:szCs w:val="16"/>
+        </w:rPr>
         <w:t xml:space="preserve">    </w:t>
       </w:r>
       <w:r>
@@ -29643,7 +33117,7 @@
           <w:sz w:val="16"/>
           <w:szCs w:val="16"/>
         </w:rPr>
-        <w:t>Amfleet Cab Car</w:t>
+        <w:t>Multi-level Commuter Cab Car</w:t>
       </w:r>
       <w:r>
         <w:rPr>
@@ -29747,7 +33221,11 @@
               </w:rPr>
             </w:pPr>
             <w:r>
-              <w:rPr/>
+              <w:rPr>
+                <w:color w:val="000000"/>
+                <w:sz w:val="16"/>
+                <w:szCs w:val="16"/>
+              </w:rPr>
             </w:r>
           </w:p>
         </w:tc>
@@ -29780,39 +33258,38 @@
                 <w:sz w:val="16"/>
                 <w:szCs w:val="16"/>
               </w:rPr>
-              <w:t>MCB</w:t>
-            </w:r>
-          </w:p>
-        </w:tc>
-        <w:tc>
-          <w:tcPr>
-            <w:tcW w:w="1016" w:type="dxa"/>
-            <w:tcBorders>
-              <w:top w:val="single" w:sz="4" w:space="0" w:color="000000"/>
-              <w:left w:val="single" w:sz="4" w:space="0" w:color="000000"/>
-              <w:bottom w:val="single" w:sz="4" w:space="0" w:color="000000"/>
-            </w:tcBorders>
-            <w:vAlign w:val="bottom"/>
-          </w:tcPr>
-          <w:p>
-            <w:pPr>
-              <w:pStyle w:val="Normal"/>
-              <w:widowControl w:val="false"/>
-              <w:spacing w:lineRule="auto" w:line="180"/>
-              <w:jc w:val="center"/>
-              <w:rPr>
-                <w:color w:val="000000"/>
-                <w:sz w:val="16"/>
-                <w:szCs w:val="16"/>
-              </w:rPr>
-            </w:pPr>
-            <w:r>
-              <w:rPr>
-                <w:color w:val="000000"/>
-                <w:sz w:val="16"/>
-                <w:szCs w:val="16"/>
-              </w:rPr>
-              <w:t>ATC/ACSES</w:t>
+            </w:r>
+          </w:p>
+        </w:tc>
+        <w:tc>
+          <w:tcPr>
+            <w:tcW w:w="1016" w:type="dxa"/>
+            <w:tcBorders>
+              <w:top w:val="single" w:sz="4" w:space="0" w:color="000000"/>
+              <w:left w:val="single" w:sz="4" w:space="0" w:color="000000"/>
+              <w:bottom w:val="single" w:sz="4" w:space="0" w:color="000000"/>
+            </w:tcBorders>
+            <w:vAlign w:val="bottom"/>
+          </w:tcPr>
+          <w:p>
+            <w:pPr>
+              <w:pStyle w:val="Normal"/>
+              <w:widowControl w:val="false"/>
+              <w:spacing w:lineRule="auto" w:line="180"/>
+              <w:jc w:val="center"/>
+              <w:rPr>
+                <w:color w:val="000000"/>
+                <w:sz w:val="16"/>
+                <w:szCs w:val="16"/>
+              </w:rPr>
+            </w:pPr>
+            <w:r>
+              <w:rPr>
+                <w:color w:val="000000"/>
+                <w:sz w:val="16"/>
+                <w:szCs w:val="16"/>
+              </w:rPr>
+              <w:t>ASES</w:t>
             </w:r>
           </w:p>
         </w:tc>
@@ -29844,73 +33321,91 @@
                 <w:sz w:val="16"/>
                 <w:szCs w:val="16"/>
               </w:rPr>
-              <w:t>Pant</w:t>
-            </w:r>
-            <w:r>
-              <w:rPr>
-                <w:color w:val="000000"/>
-                <w:sz w:val="16"/>
-                <w:szCs w:val="16"/>
-              </w:rPr>
-              <w:t>o.</w:t>
-            </w:r>
-          </w:p>
-        </w:tc>
-        <w:tc>
-          <w:tcPr>
-            <w:tcW w:w="1016" w:type="dxa"/>
-            <w:tcBorders>
-              <w:top w:val="single" w:sz="4" w:space="0" w:color="000000"/>
-              <w:left w:val="single" w:sz="4" w:space="0" w:color="000000"/>
-              <w:bottom w:val="single" w:sz="4" w:space="0" w:color="000000"/>
-            </w:tcBorders>
-            <w:vAlign w:val="bottom"/>
-          </w:tcPr>
-          <w:p>
-            <w:pPr>
-              <w:pStyle w:val="Normal"/>
-              <w:widowControl w:val="false"/>
-              <w:spacing w:lineRule="auto" w:line="180"/>
-              <w:jc w:val="center"/>
-              <w:rPr>
-                <w:color w:val="000000"/>
-                <w:sz w:val="16"/>
-                <w:szCs w:val="16"/>
-              </w:rPr>
-            </w:pPr>
-            <w:r>
-              <w:rPr/>
-            </w:r>
-          </w:p>
-        </w:tc>
-        <w:tc>
-          <w:tcPr>
-            <w:tcW w:w="1016" w:type="dxa"/>
-            <w:tcBorders>
-              <w:top w:val="single" w:sz="4" w:space="0" w:color="000000"/>
-              <w:left w:val="single" w:sz="4" w:space="0" w:color="000000"/>
-              <w:bottom w:val="single" w:sz="4" w:space="0" w:color="000000"/>
-            </w:tcBorders>
-            <w:vAlign w:val="bottom"/>
-          </w:tcPr>
-          <w:p>
-            <w:pPr>
-              <w:pStyle w:val="Normal"/>
-              <w:widowControl w:val="false"/>
-              <w:jc w:val="center"/>
-              <w:rPr>
-                <w:color w:val="000000"/>
-                <w:sz w:val="16"/>
-                <w:szCs w:val="16"/>
-              </w:rPr>
-            </w:pPr>
-            <w:r>
-              <w:rPr>
-                <w:color w:val="000000"/>
-                <w:sz w:val="16"/>
-                <w:szCs w:val="16"/>
-              </w:rPr>
-              <w:t>Brake Lead</w:t>
+              <w:t>Panto. Raise</w:t>
+            </w:r>
+          </w:p>
+        </w:tc>
+        <w:tc>
+          <w:tcPr>
+            <w:tcW w:w="1016" w:type="dxa"/>
+            <w:tcBorders>
+              <w:top w:val="single" w:sz="4" w:space="0" w:color="000000"/>
+              <w:left w:val="single" w:sz="4" w:space="0" w:color="000000"/>
+              <w:bottom w:val="single" w:sz="4" w:space="0" w:color="000000"/>
+            </w:tcBorders>
+            <w:vAlign w:val="bottom"/>
+          </w:tcPr>
+          <w:p>
+            <w:pPr>
+              <w:pStyle w:val="Normal"/>
+              <w:widowControl w:val="false"/>
+              <w:spacing w:lineRule="auto" w:line="180"/>
+              <w:jc w:val="center"/>
+              <w:rPr>
+                <w:color w:val="000000"/>
+                <w:sz w:val="16"/>
+                <w:szCs w:val="16"/>
+              </w:rPr>
+            </w:pPr>
+            <w:r>
+              <w:rPr>
+                <w:rFonts w:eastAsia="arial" w:ascii="arial" w:hAnsi="arial"/>
+                <w:color w:val="000000"/>
+                <w:sz w:val="16"/>
+                <w:szCs w:val="16"/>
+              </w:rPr>
+              <w:t>Display Dim Up</w:t>
+            </w:r>
+          </w:p>
+        </w:tc>
+        <w:tc>
+          <w:tcPr>
+            <w:tcW w:w="1016" w:type="dxa"/>
+            <w:tcBorders>
+              <w:top w:val="single" w:sz="4" w:space="0" w:color="000000"/>
+              <w:left w:val="single" w:sz="4" w:space="0" w:color="000000"/>
+              <w:bottom w:val="single" w:sz="4" w:space="0" w:color="000000"/>
+            </w:tcBorders>
+            <w:vAlign w:val="bottom"/>
+          </w:tcPr>
+          <w:p>
+            <w:pPr>
+              <w:pStyle w:val="Normal"/>
+              <w:widowControl w:val="false"/>
+              <w:jc w:val="center"/>
+              <w:rPr>
+                <w:color w:val="000000"/>
+                <w:sz w:val="16"/>
+                <w:szCs w:val="16"/>
+              </w:rPr>
+            </w:pPr>
+            <w:r>
+              <w:rPr>
+                <w:color w:val="000000"/>
+                <w:sz w:val="16"/>
+                <w:szCs w:val="16"/>
+              </w:rPr>
+              <w:t>Brake</w:t>
+            </w:r>
+          </w:p>
+          <w:p>
+            <w:pPr>
+              <w:pStyle w:val="Normal"/>
+              <w:widowControl w:val="false"/>
+              <w:jc w:val="center"/>
+              <w:rPr>
+                <w:color w:val="000000"/>
+                <w:sz w:val="16"/>
+                <w:szCs w:val="16"/>
+              </w:rPr>
+            </w:pPr>
+            <w:r>
+              <w:rPr>
+                <w:color w:val="000000"/>
+                <w:sz w:val="16"/>
+                <w:szCs w:val="16"/>
+              </w:rPr>
+              <w:t>Cut-In</w:t>
             </w:r>
           </w:p>
         </w:tc>
@@ -29942,57 +33437,39 @@
                 <w:sz w:val="16"/>
                 <w:szCs w:val="16"/>
               </w:rPr>
-              <w:t>EQ Reg.</w:t>
-            </w:r>
-          </w:p>
-          <w:p>
-            <w:pPr>
-              <w:pStyle w:val="Normal"/>
-              <w:widowControl w:val="false"/>
-              <w:jc w:val="center"/>
-              <w:rPr>
-                <w:color w:val="000000"/>
-                <w:sz w:val="16"/>
-                <w:szCs w:val="16"/>
-              </w:rPr>
-            </w:pPr>
-            <w:r>
-              <w:rPr>
-                <w:rFonts w:eastAsia="arial" w:ascii="arial" w:hAnsi="arial"/>
-                <w:color w:val="000000"/>
-                <w:sz w:val="16"/>
-                <w:szCs w:val="16"/>
-              </w:rPr>
-              <w:t>Increase</w:t>
-            </w:r>
-          </w:p>
-        </w:tc>
-        <w:tc>
-          <w:tcPr>
-            <w:tcW w:w="1016" w:type="dxa"/>
-            <w:tcBorders>
-              <w:top w:val="single" w:sz="4" w:space="0" w:color="000000"/>
-              <w:left w:val="single" w:sz="4" w:space="0" w:color="000000"/>
-              <w:bottom w:val="single" w:sz="4" w:space="0" w:color="000000"/>
-            </w:tcBorders>
-            <w:vAlign w:val="bottom"/>
-          </w:tcPr>
-          <w:p>
-            <w:pPr>
-              <w:pStyle w:val="Normal"/>
-              <w:widowControl w:val="false"/>
-              <w:jc w:val="center"/>
-              <w:rPr>
-                <w:sz w:val="16"/>
-                <w:szCs w:val="16"/>
-              </w:rPr>
-            </w:pPr>
-            <w:r>
-              <w:rPr>
-                <w:sz w:val="16"/>
-                <w:szCs w:val="16"/>
-              </w:rPr>
-              <w:t>Strobe Light Wh</w:t>
+              <w:t>Aux Light On</w:t>
+            </w:r>
+          </w:p>
+        </w:tc>
+        <w:tc>
+          <w:tcPr>
+            <w:tcW w:w="1016" w:type="dxa"/>
+            <w:tcBorders>
+              <w:top w:val="single" w:sz="4" w:space="0" w:color="000000"/>
+              <w:left w:val="single" w:sz="4" w:space="0" w:color="000000"/>
+              <w:bottom w:val="single" w:sz="4" w:space="0" w:color="000000"/>
+            </w:tcBorders>
+            <w:vAlign w:val="bottom"/>
+          </w:tcPr>
+          <w:p>
+            <w:pPr>
+              <w:pStyle w:val="Normal"/>
+              <w:widowControl w:val="false"/>
+              <w:jc w:val="center"/>
+              <w:rPr>
+                <w:color w:val="000000"/>
+                <w:sz w:val="16"/>
+                <w:szCs w:val="16"/>
+              </w:rPr>
+            </w:pPr>
+            <w:r>
+              <w:rPr>
+                <w:rFonts w:eastAsia="arial" w:ascii="arial" w:hAnsi="arial"/>
+                <w:color w:val="000000"/>
+                <w:sz w:val="16"/>
+                <w:szCs w:val="16"/>
+              </w:rPr>
+              <w:t>Vestibule Light</w:t>
             </w:r>
           </w:p>
         </w:tc>
@@ -30010,53 +33487,62 @@
             <w:pPr>
               <w:pStyle w:val="Normal"/>
               <w:widowControl w:val="false"/>
-              <w:jc w:val="center"/>
-              <w:rPr>
-                <w:color w:val="000000"/>
-                <w:sz w:val="16"/>
-                <w:szCs w:val="16"/>
-              </w:rPr>
-            </w:pPr>
-            <w:r>
-              <w:rPr>
-                <w:rFonts w:eastAsia="arial" w:ascii="arial" w:hAnsi="arial"/>
-                <w:color w:val="000000"/>
-                <w:sz w:val="16"/>
-                <w:szCs w:val="16"/>
-              </w:rPr>
-              <w:t>Ditch Light</w:t>
-            </w:r>
-          </w:p>
-        </w:tc>
-        <w:tc>
-          <w:tcPr>
-            <w:tcW w:w="1016" w:type="dxa"/>
-            <w:tcBorders>
-              <w:top w:val="single" w:sz="4" w:space="0" w:color="000000"/>
-              <w:left w:val="single" w:sz="4" w:space="0" w:color="000000"/>
-              <w:bottom w:val="single" w:sz="4" w:space="0" w:color="000000"/>
-            </w:tcBorders>
-            <w:vAlign w:val="bottom"/>
-          </w:tcPr>
-          <w:p>
-            <w:pPr>
-              <w:pStyle w:val="Normal"/>
-              <w:widowControl w:val="false"/>
-              <w:spacing w:lineRule="auto" w:line="180"/>
-              <w:jc w:val="center"/>
-              <w:rPr>
-                <w:sz w:val="16"/>
-                <w:szCs w:val="16"/>
-              </w:rPr>
-            </w:pPr>
-            <w:r>
-              <w:rPr>
-                <w:rFonts w:eastAsia="arial" w:ascii="arial" w:hAnsi="arial"/>
-                <w:color w:val="000000"/>
-                <w:sz w:val="16"/>
-                <w:szCs w:val="16"/>
-              </w:rPr>
-              <w:t>Gauge Light</w:t>
+              <w:spacing w:lineRule="auto" w:line="180"/>
+              <w:jc w:val="center"/>
+              <w:rPr>
+                <w:sz w:val="16"/>
+                <w:szCs w:val="16"/>
+              </w:rPr>
+            </w:pPr>
+            <w:r>
+              <w:rPr>
+                <w:rFonts w:eastAsia="arial" w:ascii="arial" w:hAnsi="arial"/>
+                <w:color w:val="000000"/>
+                <w:sz w:val="16"/>
+                <w:szCs w:val="16"/>
+              </w:rPr>
+              <w:t>Reading Light Up</w:t>
+            </w:r>
+          </w:p>
+        </w:tc>
+        <w:tc>
+          <w:tcPr>
+            <w:tcW w:w="1016" w:type="dxa"/>
+            <w:tcBorders>
+              <w:top w:val="single" w:sz="4" w:space="0" w:color="000000"/>
+              <w:left w:val="single" w:sz="4" w:space="0" w:color="000000"/>
+              <w:bottom w:val="single" w:sz="4" w:space="0" w:color="000000"/>
+            </w:tcBorders>
+            <w:vAlign w:val="bottom"/>
+          </w:tcPr>
+          <w:p>
+            <w:pPr>
+              <w:pStyle w:val="Normal"/>
+              <w:widowControl w:val="false"/>
+              <w:spacing w:lineRule="auto" w:line="180"/>
+              <w:jc w:val="center"/>
+              <w:rPr>
+                <w:sz w:val="16"/>
+                <w:szCs w:val="16"/>
+              </w:rPr>
+            </w:pPr>
+            <w:r>
+              <w:rPr>
+                <w:rFonts w:eastAsia="arial" w:ascii="arial" w:hAnsi="arial"/>
+                <w:color w:val="000000"/>
+                <w:sz w:val="16"/>
+                <w:szCs w:val="16"/>
+              </w:rPr>
+              <w:t xml:space="preserve">Gauge Light </w:t>
+            </w:r>
+            <w:r>
+              <w:rPr>
+                <w:rFonts w:eastAsia="arial" w:ascii="arial" w:hAnsi="arial"/>
+                <w:color w:val="000000"/>
+                <w:sz w:val="16"/>
+                <w:szCs w:val="16"/>
+              </w:rPr>
+              <w:t>Up</w:t>
             </w:r>
           </w:p>
         </w:tc>
@@ -30223,7 +33709,7 @@
           <w:sz w:val="16"/>
           <w:szCs w:val="16"/>
         </w:rPr>
-        <w:t>Amfleet Cab Car</w:t>
+        <w:t>Multi-level Commuter Cab Car</w:t>
       </w:r>
       <w:r>
         <w:rPr>
@@ -30358,7 +33844,12 @@
               </w:rPr>
             </w:pPr>
             <w:r>
-              <w:rPr/>
+              <w:rPr>
+                <w:rFonts w:eastAsia="arial" w:ascii="arial" w:hAnsi="arial"/>
+                <w:color w:val="000000"/>
+                <w:sz w:val="16"/>
+                <w:szCs w:val="16"/>
+              </w:rPr>
             </w:r>
           </w:p>
         </w:tc>
@@ -30417,72 +33908,98 @@
               </w:rPr>
             </w:pPr>
             <w:r>
-              <w:rPr/>
-            </w:r>
-          </w:p>
-        </w:tc>
-        <w:tc>
-          <w:tcPr>
-            <w:tcW w:w="1016" w:type="dxa"/>
-            <w:tcBorders>
-              <w:top w:val="single" w:sz="4" w:space="0" w:color="000000"/>
-              <w:left w:val="single" w:sz="4" w:space="0" w:color="000000"/>
-              <w:bottom w:val="single" w:sz="4" w:space="0" w:color="000000"/>
-            </w:tcBorders>
-            <w:vAlign w:val="bottom"/>
-          </w:tcPr>
-          <w:p>
-            <w:pPr>
-              <w:pStyle w:val="Normal"/>
-              <w:widowControl w:val="false"/>
-              <w:spacing w:lineRule="auto" w:line="180"/>
-              <w:jc w:val="center"/>
-              <w:rPr>
-                <w:color w:val="000000"/>
-                <w:sz w:val="16"/>
-                <w:szCs w:val="16"/>
-              </w:rPr>
-            </w:pPr>
-            <w:r>
-              <w:rPr>
-                <w:rFonts w:eastAsia="arial" w:ascii="arial" w:hAnsi="arial"/>
-                <w:color w:val="000000"/>
-                <w:sz w:val="16"/>
-                <w:szCs w:val="16"/>
-              </w:rPr>
-              <w:t>Emer. Shutdown</w:t>
-            </w:r>
-          </w:p>
-        </w:tc>
-        <w:tc>
-          <w:tcPr>
-            <w:tcW w:w="1016" w:type="dxa"/>
-            <w:tcBorders>
-              <w:top w:val="single" w:sz="4" w:space="0" w:color="000000"/>
-              <w:left w:val="single" w:sz="4" w:space="0" w:color="000000"/>
-              <w:bottom w:val="single" w:sz="4" w:space="0" w:color="000000"/>
-            </w:tcBorders>
-            <w:vAlign w:val="bottom"/>
-          </w:tcPr>
-          <w:p>
-            <w:pPr>
-              <w:pStyle w:val="Normal"/>
-              <w:widowControl w:val="false"/>
-              <w:jc w:val="center"/>
-              <w:rPr>
-                <w:color w:val="000000"/>
-                <w:sz w:val="16"/>
-                <w:szCs w:val="16"/>
-              </w:rPr>
-            </w:pPr>
-            <w:r>
-              <w:rPr>
-                <w:rFonts w:eastAsia="arial" w:ascii="arial" w:hAnsi="arial"/>
-                <w:color w:val="000000"/>
-                <w:sz w:val="16"/>
-                <w:szCs w:val="16"/>
-              </w:rPr>
-              <w:t>Brake Trail</w:t>
+              <w:rPr>
+                <w:color w:val="000000"/>
+                <w:sz w:val="16"/>
+                <w:szCs w:val="16"/>
+              </w:rPr>
+              <w:t>Panto. Low</w:t>
+            </w:r>
+          </w:p>
+        </w:tc>
+        <w:tc>
+          <w:tcPr>
+            <w:tcW w:w="1016" w:type="dxa"/>
+            <w:tcBorders>
+              <w:top w:val="single" w:sz="4" w:space="0" w:color="000000"/>
+              <w:left w:val="single" w:sz="4" w:space="0" w:color="000000"/>
+              <w:bottom w:val="single" w:sz="4" w:space="0" w:color="000000"/>
+            </w:tcBorders>
+            <w:vAlign w:val="bottom"/>
+          </w:tcPr>
+          <w:p>
+            <w:pPr>
+              <w:pStyle w:val="Normal"/>
+              <w:widowControl w:val="false"/>
+              <w:spacing w:lineRule="auto" w:line="180"/>
+              <w:jc w:val="center"/>
+              <w:rPr>
+                <w:color w:val="000000"/>
+                <w:sz w:val="16"/>
+                <w:szCs w:val="16"/>
+              </w:rPr>
+            </w:pPr>
+            <w:r>
+              <w:rPr>
+                <w:rFonts w:eastAsia="arial" w:ascii="arial" w:hAnsi="arial"/>
+                <w:color w:val="000000"/>
+                <w:sz w:val="16"/>
+                <w:szCs w:val="16"/>
+              </w:rPr>
+              <w:t>Display Dim Dw</w:t>
+            </w:r>
+          </w:p>
+        </w:tc>
+        <w:tc>
+          <w:tcPr>
+            <w:tcW w:w="1016" w:type="dxa"/>
+            <w:tcBorders>
+              <w:top w:val="single" w:sz="4" w:space="0" w:color="000000"/>
+              <w:left w:val="single" w:sz="4" w:space="0" w:color="000000"/>
+              <w:bottom w:val="single" w:sz="4" w:space="0" w:color="000000"/>
+            </w:tcBorders>
+            <w:vAlign w:val="bottom"/>
+          </w:tcPr>
+          <w:p>
+            <w:pPr>
+              <w:pStyle w:val="Normal"/>
+              <w:widowControl w:val="false"/>
+              <w:jc w:val="center"/>
+              <w:rPr>
+                <w:color w:val="000000"/>
+                <w:sz w:val="16"/>
+                <w:szCs w:val="16"/>
+              </w:rPr>
+            </w:pPr>
+            <w:r>
+              <w:rPr>
+                <w:rFonts w:eastAsia="arial" w:ascii="arial" w:hAnsi="arial"/>
+                <w:color w:val="000000"/>
+                <w:sz w:val="16"/>
+                <w:szCs w:val="16"/>
+              </w:rPr>
+              <w:t>Brake</w:t>
+            </w:r>
+          </w:p>
+          <w:p>
+            <w:pPr>
+              <w:pStyle w:val="Normal"/>
+              <w:widowControl w:val="false"/>
+              <w:jc w:val="center"/>
+              <w:rPr>
+                <w:color w:val="000000"/>
+                <w:sz w:val="16"/>
+                <w:szCs w:val="16"/>
+              </w:rPr>
+            </w:pPr>
+            <w:r>
+              <w:rPr>
+                <w:rFonts w:eastAsia="arial" w:ascii="arial" w:hAnsi="arial"/>
+                <w:color w:val="000000"/>
+                <w:sz w:val="16"/>
+                <w:szCs w:val="16"/>
+              </w:rPr>
+              <w:t>Cut-Out</w:t>
             </w:r>
           </w:p>
         </w:tc>
@@ -30502,69 +34019,49 @@
               <w:widowControl w:val="false"/>
               <w:jc w:val="center"/>
               <w:rPr>
-                <w:color w:val="000000"/>
-                <w:sz w:val="16"/>
-                <w:szCs w:val="16"/>
-              </w:rPr>
-            </w:pPr>
-            <w:r>
-              <w:rPr>
-                <w:rFonts w:eastAsia="arial" w:ascii="arial" w:hAnsi="arial"/>
-                <w:color w:val="000000"/>
-                <w:sz w:val="16"/>
-                <w:szCs w:val="16"/>
-              </w:rPr>
-              <w:t>EQ Reg.</w:t>
-            </w:r>
-          </w:p>
-          <w:p>
-            <w:pPr>
-              <w:pStyle w:val="Normal"/>
-              <w:widowControl w:val="false"/>
-              <w:jc w:val="center"/>
-              <w:rPr>
-                <w:color w:val="000000"/>
-                <w:sz w:val="16"/>
-                <w:szCs w:val="16"/>
-              </w:rPr>
-            </w:pPr>
-            <w:r>
-              <w:rPr>
-                <w:rFonts w:eastAsia="arial" w:ascii="arial" w:hAnsi="arial"/>
-                <w:color w:val="000000"/>
-                <w:sz w:val="16"/>
-                <w:szCs w:val="16"/>
-              </w:rPr>
-              <w:t>Decrease</w:t>
-            </w:r>
-          </w:p>
-        </w:tc>
-        <w:tc>
-          <w:tcPr>
-            <w:tcW w:w="1016" w:type="dxa"/>
-            <w:tcBorders>
-              <w:top w:val="single" w:sz="4" w:space="0" w:color="000000"/>
-              <w:left w:val="single" w:sz="4" w:space="0" w:color="000000"/>
-              <w:bottom w:val="single" w:sz="4" w:space="0" w:color="000000"/>
-            </w:tcBorders>
-            <w:vAlign w:val="bottom"/>
-          </w:tcPr>
-          <w:p>
-            <w:pPr>
-              <w:pStyle w:val="Normal"/>
-              <w:widowControl w:val="false"/>
-              <w:jc w:val="center"/>
-              <w:rPr>
-                <w:sz w:val="16"/>
-                <w:szCs w:val="16"/>
-              </w:rPr>
-            </w:pPr>
-            <w:r>
-              <w:rPr>
-                <w:sz w:val="16"/>
-                <w:szCs w:val="16"/>
-              </w:rPr>
-              <w:t>Strobe Light Red</w:t>
+                <w:sz w:val="16"/>
+                <w:szCs w:val="16"/>
+              </w:rPr>
+            </w:pPr>
+            <w:r>
+              <w:rPr>
+                <w:rFonts w:eastAsia="arial" w:ascii="arial" w:hAnsi="arial"/>
+                <w:sz w:val="16"/>
+                <w:szCs w:val="16"/>
+              </w:rPr>
+              <w:t>Aux Light Off</w:t>
+            </w:r>
+          </w:p>
+        </w:tc>
+        <w:tc>
+          <w:tcPr>
+            <w:tcW w:w="1016" w:type="dxa"/>
+            <w:tcBorders>
+              <w:top w:val="single" w:sz="4" w:space="0" w:color="000000"/>
+              <w:left w:val="single" w:sz="4" w:space="0" w:color="000000"/>
+              <w:bottom w:val="single" w:sz="4" w:space="0" w:color="000000"/>
+            </w:tcBorders>
+            <w:vAlign w:val="bottom"/>
+          </w:tcPr>
+          <w:p>
+            <w:pPr>
+              <w:pStyle w:val="Normal"/>
+              <w:widowControl w:val="false"/>
+              <w:jc w:val="center"/>
+              <w:rPr>
+                <w:color w:val="000000"/>
+                <w:sz w:val="16"/>
+                <w:szCs w:val="16"/>
+              </w:rPr>
+            </w:pPr>
+            <w:r>
+              <w:rPr>
+                <w:rFonts w:eastAsia="arial" w:ascii="arial" w:hAnsi="arial"/>
+                <w:color w:val="000000"/>
+                <w:sz w:val="16"/>
+                <w:szCs w:val="16"/>
+              </w:rPr>
+              <w:t>Reading Light</w:t>
             </w:r>
           </w:p>
         </w:tc>
@@ -30582,79 +34079,89 @@
             <w:pPr>
               <w:pStyle w:val="Normal"/>
               <w:widowControl w:val="false"/>
-              <w:jc w:val="center"/>
-              <w:rPr>
-                <w:color w:val="000000"/>
-                <w:sz w:val="16"/>
-                <w:szCs w:val="16"/>
-              </w:rPr>
-            </w:pPr>
-            <w:r>
-              <w:rPr>
-                <w:rFonts w:eastAsia="arial" w:ascii="arial" w:hAnsi="arial"/>
-                <w:color w:val="000000"/>
-                <w:sz w:val="16"/>
-                <w:szCs w:val="16"/>
-              </w:rPr>
-              <w:t>Step Light</w:t>
-            </w:r>
-          </w:p>
-        </w:tc>
-        <w:tc>
-          <w:tcPr>
-            <w:tcW w:w="1016" w:type="dxa"/>
-            <w:tcBorders>
-              <w:top w:val="single" w:sz="4" w:space="0" w:color="000000"/>
-              <w:left w:val="single" w:sz="4" w:space="0" w:color="000000"/>
-              <w:bottom w:val="single" w:sz="4" w:space="0" w:color="000000"/>
-            </w:tcBorders>
-            <w:vAlign w:val="bottom"/>
-          </w:tcPr>
-          <w:p>
-            <w:pPr>
-              <w:pStyle w:val="Normal"/>
-              <w:widowControl w:val="false"/>
-              <w:jc w:val="center"/>
-              <w:rPr>
-                <w:color w:val="000000"/>
-                <w:sz w:val="16"/>
-                <w:szCs w:val="16"/>
-              </w:rPr>
-            </w:pPr>
-            <w:r>
-              <w:rPr>
-                <w:rFonts w:eastAsia="arial" w:ascii="arial" w:hAnsi="arial"/>
-                <w:color w:val="000000"/>
-                <w:sz w:val="16"/>
-                <w:szCs w:val="16"/>
-              </w:rPr>
-              <w:t>Number Light</w:t>
-            </w:r>
-          </w:p>
-        </w:tc>
-        <w:tc>
-          <w:tcPr>
-            <w:tcW w:w="1016" w:type="dxa"/>
-            <w:tcBorders>
-              <w:top w:val="single" w:sz="4" w:space="0" w:color="000000"/>
-              <w:left w:val="single" w:sz="4" w:space="0" w:color="000000"/>
-              <w:bottom w:val="single" w:sz="4" w:space="0" w:color="000000"/>
-            </w:tcBorders>
-            <w:vAlign w:val="bottom"/>
-          </w:tcPr>
-          <w:p>
-            <w:pPr>
-              <w:pStyle w:val="Normal"/>
-              <w:widowControl w:val="false"/>
-              <w:spacing w:lineRule="auto" w:line="180"/>
-              <w:jc w:val="center"/>
-              <w:rPr>
-                <w:sz w:val="16"/>
-                <w:szCs w:val="16"/>
-              </w:rPr>
-            </w:pPr>
-            <w:r>
-              <w:rPr>
+              <w:spacing w:lineRule="auto" w:line="180"/>
+              <w:jc w:val="center"/>
+              <w:rPr>
+                <w:sz w:val="16"/>
+                <w:szCs w:val="16"/>
+              </w:rPr>
+            </w:pPr>
+            <w:r>
+              <w:rPr>
+                <w:rFonts w:eastAsia="arial" w:ascii="arial" w:hAnsi="arial"/>
+                <w:color w:val="000000"/>
+                <w:sz w:val="16"/>
+                <w:szCs w:val="16"/>
+              </w:rPr>
+              <w:t>Reading Light Dw</w:t>
+            </w:r>
+          </w:p>
+        </w:tc>
+        <w:tc>
+          <w:tcPr>
+            <w:tcW w:w="1016" w:type="dxa"/>
+            <w:tcBorders>
+              <w:top w:val="single" w:sz="4" w:space="0" w:color="000000"/>
+              <w:left w:val="single" w:sz="4" w:space="0" w:color="000000"/>
+              <w:bottom w:val="single" w:sz="4" w:space="0" w:color="000000"/>
+            </w:tcBorders>
+            <w:vAlign w:val="bottom"/>
+          </w:tcPr>
+          <w:p>
+            <w:pPr>
+              <w:pStyle w:val="Normal"/>
+              <w:widowControl w:val="false"/>
+              <w:spacing w:lineRule="auto" w:line="180"/>
+              <w:jc w:val="center"/>
+              <w:rPr>
+                <w:sz w:val="16"/>
+                <w:szCs w:val="16"/>
+              </w:rPr>
+            </w:pPr>
+            <w:r>
+              <w:rPr>
+                <w:rFonts w:eastAsia="arial" w:ascii="arial" w:hAnsi="arial"/>
+                <w:color w:val="000000"/>
+                <w:sz w:val="16"/>
+                <w:szCs w:val="16"/>
+              </w:rPr>
+              <w:t xml:space="preserve">Gauge Light </w:t>
+            </w:r>
+            <w:r>
+              <w:rPr>
+                <w:rFonts w:eastAsia="arial" w:ascii="arial" w:hAnsi="arial"/>
+                <w:color w:val="000000"/>
+                <w:sz w:val="16"/>
+                <w:szCs w:val="16"/>
+              </w:rPr>
+              <w:t>Dw</w:t>
+            </w:r>
+          </w:p>
+        </w:tc>
+        <w:tc>
+          <w:tcPr>
+            <w:tcW w:w="1016" w:type="dxa"/>
+            <w:tcBorders>
+              <w:top w:val="single" w:sz="4" w:space="0" w:color="000000"/>
+              <w:left w:val="single" w:sz="4" w:space="0" w:color="000000"/>
+              <w:bottom w:val="single" w:sz="4" w:space="0" w:color="000000"/>
+            </w:tcBorders>
+            <w:vAlign w:val="bottom"/>
+          </w:tcPr>
+          <w:p>
+            <w:pPr>
+              <w:pStyle w:val="Normal"/>
+              <w:widowControl w:val="false"/>
+              <w:jc w:val="center"/>
+              <w:rPr>
+                <w:color w:val="000000"/>
+                <w:sz w:val="16"/>
+                <w:szCs w:val="16"/>
+              </w:rPr>
+            </w:pPr>
+            <w:r>
+              <w:rPr>
+                <w:color w:val="000000"/>
                 <w:sz w:val="16"/>
                 <w:szCs w:val="16"/>
               </w:rPr>
@@ -30776,19 +34283,15 @@
         <w:pStyle w:val="Normal"/>
         <w:rPr>
           <w:color w:val="000000"/>
-          <w:position w:val="0"/>
           <w:sz w:val="16"/>
           <w:szCs w:val="16"/>
-          <w:vertAlign w:val="baseline"/>
         </w:rPr>
       </w:pPr>
       <w:r>
         <w:rPr>
           <w:color w:val="000000"/>
-          <w:position w:val="0"/>
           <w:sz w:val="16"/>
           <w:szCs w:val="16"/>
-          <w:vertAlign w:val="baseline"/>
         </w:rPr>
       </w:r>
     </w:p>
@@ -31813,12 +35316,12 @@
       <w:rFonts w:ascii="Symbol" w:hAnsi="Symbol" w:cs="Symbol"/>
     </w:rPr>
   </w:style>
-  <w:style w:type="character" w:styleId="user" w:customStyle="1">
-    <w:name w:val="번호 매기기 기호 (user)"/>
+  <w:style w:type="character" w:styleId="Style5" w:customStyle="1">
+    <w:name w:val="번호 매기기 기호"/>
     <w:qFormat/>
     <w:rPr/>
   </w:style>
-  <w:style w:type="paragraph" w:styleId="Style5">
+  <w:style w:type="paragraph" w:styleId="Style6">
     <w:name w:val="제목"/>
     <w:basedOn w:val="Normal"/>
     <w:next w:val="BodyText"/>
@@ -31828,7 +35331,7 @@
       <w:spacing w:before="240" w:after="120"/>
     </w:pPr>
     <w:rPr>
-      <w:rFonts w:ascii="Liberation Sans" w:hAnsi="Liberation Sans" w:eastAsia="Noto Sans CJK KR" w:cs="Lohit Devanagari"/>
+      <w:rFonts w:ascii="Liberation Sans" w:hAnsi="Liberation Sans" w:eastAsia="나눔고딕" w:cs="Arial"/>
       <w:sz w:val="28"/>
       <w:szCs w:val="28"/>
     </w:rPr>
@@ -31865,7 +35368,7 @@
       <w:szCs w:val="24"/>
     </w:rPr>
   </w:style>
-  <w:style w:type="paragraph" w:styleId="Style6" w:customStyle="1">
+  <w:style w:type="paragraph" w:styleId="Style7">
     <w:name w:val="색인"/>
     <w:basedOn w:val="Normal"/>
     <w:qFormat/>
@@ -31873,10 +35376,11 @@
       <w:suppressLineNumbers/>
     </w:pPr>
     <w:rPr>
-      <w:rFonts w:cs="Lohit Devanagari"/>
+      <w:rFonts w:cs="Arial"/>
+      <w:sz w:val="24"/>
     </w:rPr>
   </w:style>
-  <w:style w:type="paragraph" w:styleId="user1">
+  <w:style w:type="paragraph" w:styleId="user">
     <w:name w:val="제목 (user)"/>
     <w:basedOn w:val="Normal"/>
     <w:next w:val="BodyText"/>
@@ -31886,12 +35390,12 @@
       <w:spacing w:before="240" w:after="120"/>
     </w:pPr>
     <w:rPr>
-      <w:rFonts w:ascii="Liberation Sans" w:hAnsi="Liberation Sans" w:eastAsia="나눔고딕" w:cs="Arial"/>
+      <w:rFonts w:ascii="Liberation Sans" w:hAnsi="Liberation Sans" w:eastAsia="Noto Sans CJK KR" w:cs="Lohit Devanagari"/>
       <w:sz w:val="28"/>
       <w:szCs w:val="28"/>
     </w:rPr>
   </w:style>
-  <w:style w:type="paragraph" w:styleId="user2">
+  <w:style w:type="paragraph" w:styleId="user1" w:customStyle="1">
     <w:name w:val="색인 (user)"/>
     <w:basedOn w:val="Normal"/>
     <w:qFormat/>
@@ -31899,8 +35403,7 @@
       <w:suppressLineNumbers/>
     </w:pPr>
     <w:rPr>
-      <w:rFonts w:cs="Arial"/>
-      <w:sz w:val="24"/>
+      <w:rFonts w:cs="Lohit Devanagari"/>
     </w:rPr>
   </w:style>
   <w:style w:type="paragraph" w:styleId="Title">
@@ -32582,8 +36085,8 @@
       <w:szCs w:val="24"/>
     </w:rPr>
   </w:style>
-  <w:style w:type="paragraph" w:styleId="Style7" w:customStyle="1">
-    <w:name w:val="표 내용"/>
+  <w:style w:type="paragraph" w:styleId="user2" w:customStyle="1">
+    <w:name w:val="표 내용 (user)"/>
     <w:basedOn w:val="Normal"/>
     <w:qFormat/>
     <w:pPr>
@@ -32591,9 +36094,9 @@
     </w:pPr>
     <w:rPr/>
   </w:style>
-  <w:style w:type="paragraph" w:styleId="Style8" w:customStyle="1">
-    <w:name w:val="표제목"/>
-    <w:basedOn w:val="Style7"/>
+  <w:style w:type="paragraph" w:styleId="user3" w:customStyle="1">
+    <w:name w:val="표제목 (user)"/>
+    <w:basedOn w:val="user2"/>
     <w:qFormat/>
     <w:pPr>
       <w:jc w:val="center"/>
@@ -32603,8 +36106,8 @@
       <w:bCs/>
     </w:rPr>
   </w:style>
-  <w:style w:type="paragraph" w:styleId="user3">
-    <w:name w:val="표 내용 (user)"/>
+  <w:style w:type="paragraph" w:styleId="Style8">
+    <w:name w:val="표 내용"/>
     <w:basedOn w:val="Normal"/>
     <w:qFormat/>
     <w:pPr>
@@ -32613,9 +36116,9 @@
     </w:pPr>
     <w:rPr/>
   </w:style>
-  <w:style w:type="paragraph" w:styleId="user4">
-    <w:name w:val="표제목 (user)"/>
-    <w:basedOn w:val="user3"/>
+  <w:style w:type="paragraph" w:styleId="Style9">
+    <w:name w:val="표제목"/>
+    <w:basedOn w:val="Style8"/>
     <w:qFormat/>
     <w:pPr>
       <w:suppressLineNumbers/>

</xml_diff>

<commit_message>
Add M8 and M9
</commit_message>
<xml_diff>
--- a/raildriver-USA-Remapped.docx
+++ b/raildriver-USA-Remapped.docx
@@ -37631,6 +37631,1104 @@
           <w:sz w:val="16"/>
           <w:szCs w:val="16"/>
         </w:rPr>
+        <w:t xml:space="preserve">    M7-1</w:t>
+      </w:r>
+    </w:p>
+    <w:tbl>
+      <w:tblPr>
+        <w:tblW w:w="14248" w:type="dxa"/>
+        <w:jc w:val="left"/>
+        <w:tblInd w:w="-5" w:type="dxa"/>
+        <w:tblLayout w:type="fixed"/>
+        <w:tblCellMar>
+          <w:top w:w="0" w:type="dxa"/>
+          <w:left w:w="108" w:type="dxa"/>
+          <w:bottom w:w="0" w:type="dxa"/>
+          <w:right w:w="108" w:type="dxa"/>
+        </w:tblCellMar>
+        <w:tblLook w:firstRow="1" w:noVBand="1" w:lastRow="0" w:firstColumn="1" w:lastColumn="0" w:noHBand="0" w:val="04a0"/>
+      </w:tblPr>
+      <w:tblGrid>
+        <w:gridCol w:w="1017"/>
+        <w:gridCol w:w="1019"/>
+        <w:gridCol w:w="1014"/>
+        <w:gridCol w:w="1016"/>
+        <w:gridCol w:w="1020"/>
+        <w:gridCol w:w="1016"/>
+        <w:gridCol w:w="1016"/>
+        <w:gridCol w:w="1017"/>
+        <w:gridCol w:w="1016"/>
+        <w:gridCol w:w="1020"/>
+        <w:gridCol w:w="1016"/>
+        <w:gridCol w:w="1016"/>
+        <w:gridCol w:w="1016"/>
+        <w:gridCol w:w="1029"/>
+      </w:tblGrid>
+      <w:tr>
+        <w:trPr>
+          <w:trHeight w:val="440" w:hRule="exact"/>
+          <w:cantSplit w:val="true"/>
+        </w:trPr>
+        <w:tc>
+          <w:tcPr>
+            <w:tcW w:w="1017" w:type="dxa"/>
+            <w:tcBorders>
+              <w:top w:val="single" w:sz="4" w:space="0" w:color="000000"/>
+              <w:left w:val="single" w:sz="4" w:space="0" w:color="000000"/>
+              <w:bottom w:val="single" w:sz="4" w:space="0" w:color="000000"/>
+            </w:tcBorders>
+            <w:vAlign w:val="bottom"/>
+          </w:tcPr>
+          <w:p>
+            <w:pPr>
+              <w:pStyle w:val="Normal"/>
+              <w:widowControl w:val="false"/>
+              <w:spacing w:lineRule="auto" w:line="180" w:before="0" w:after="60"/>
+              <w:jc w:val="center"/>
+              <w:rPr>
+                <w:color w:val="000000"/>
+                <w:sz w:val="16"/>
+                <w:szCs w:val="16"/>
+              </w:rPr>
+            </w:pPr>
+            <w:r>
+              <w:rPr>
+                <w:rFonts w:eastAsia="arial" w:ascii="arial" w:hAnsi="arial"/>
+                <w:b/>
+                <w:color w:val="000000"/>
+                <w:sz w:val="16"/>
+                <w:szCs w:val="16"/>
+              </w:rPr>
+              <w:t>Pause</w:t>
+            </w:r>
+          </w:p>
+        </w:tc>
+        <w:tc>
+          <w:tcPr>
+            <w:tcW w:w="1019" w:type="dxa"/>
+            <w:tcBorders>
+              <w:top w:val="single" w:sz="4" w:space="0" w:color="000000"/>
+              <w:left w:val="single" w:sz="4" w:space="0" w:color="000000"/>
+              <w:bottom w:val="single" w:sz="4" w:space="0" w:color="000000"/>
+            </w:tcBorders>
+            <w:vAlign w:val="bottom"/>
+          </w:tcPr>
+          <w:p>
+            <w:pPr>
+              <w:pStyle w:val="Normal"/>
+              <w:widowControl w:val="false"/>
+              <w:jc w:val="center"/>
+              <w:rPr>
+                <w:rFonts w:ascii="arial" w:hAnsi="arial" w:eastAsia="arial"/>
+                <w:color w:val="000000"/>
+                <w:sz w:val="16"/>
+                <w:szCs w:val="16"/>
+              </w:rPr>
+            </w:pPr>
+            <w:r>
+              <w:rPr>
+                <w:rFonts w:eastAsia="arial" w:ascii="arial" w:hAnsi="arial"/>
+                <w:color w:val="000000"/>
+                <w:sz w:val="16"/>
+                <w:szCs w:val="16"/>
+              </w:rPr>
+              <w:t>Master Key</w:t>
+            </w:r>
+          </w:p>
+        </w:tc>
+        <w:tc>
+          <w:tcPr>
+            <w:tcW w:w="1014" w:type="dxa"/>
+            <w:tcBorders>
+              <w:top w:val="single" w:sz="4" w:space="0" w:color="000000"/>
+              <w:left w:val="single" w:sz="4" w:space="0" w:color="000000"/>
+              <w:bottom w:val="single" w:sz="4" w:space="0" w:color="000000"/>
+            </w:tcBorders>
+            <w:vAlign w:val="bottom"/>
+          </w:tcPr>
+          <w:p>
+            <w:pPr>
+              <w:pStyle w:val="Normal"/>
+              <w:widowControl w:val="false"/>
+              <w:jc w:val="center"/>
+              <w:rPr>
+                <w:rFonts w:ascii="arial" w:hAnsi="arial" w:eastAsia="arial"/>
+                <w:color w:val="000000"/>
+                <w:sz w:val="16"/>
+                <w:szCs w:val="16"/>
+              </w:rPr>
+            </w:pPr>
+            <w:r>
+              <w:rPr>
+                <w:rFonts w:eastAsia="arial" w:ascii="arial" w:hAnsi="arial"/>
+                <w:color w:val="000000"/>
+                <w:sz w:val="16"/>
+                <w:szCs w:val="16"/>
+              </w:rPr>
+            </w:r>
+          </w:p>
+        </w:tc>
+        <w:tc>
+          <w:tcPr>
+            <w:tcW w:w="1016" w:type="dxa"/>
+            <w:tcBorders>
+              <w:top w:val="single" w:sz="4" w:space="0" w:color="000000"/>
+              <w:left w:val="single" w:sz="4" w:space="0" w:color="000000"/>
+              <w:bottom w:val="single" w:sz="4" w:space="0" w:color="000000"/>
+            </w:tcBorders>
+            <w:vAlign w:val="bottom"/>
+          </w:tcPr>
+          <w:p>
+            <w:pPr>
+              <w:pStyle w:val="Normal"/>
+              <w:widowControl w:val="false"/>
+              <w:spacing w:lineRule="auto" w:line="180"/>
+              <w:jc w:val="center"/>
+              <w:rPr>
+                <w:color w:val="000000"/>
+                <w:sz w:val="16"/>
+                <w:szCs w:val="16"/>
+              </w:rPr>
+            </w:pPr>
+            <w:r>
+              <w:rPr>
+                <w:color w:val="000000"/>
+                <w:sz w:val="16"/>
+                <w:szCs w:val="16"/>
+              </w:rPr>
+              <w:t>ATC/ACSES</w:t>
+            </w:r>
+          </w:p>
+        </w:tc>
+        <w:tc>
+          <w:tcPr>
+            <w:tcW w:w="1020" w:type="dxa"/>
+            <w:tcBorders>
+              <w:top w:val="single" w:sz="4" w:space="0" w:color="000000"/>
+              <w:left w:val="single" w:sz="4" w:space="0" w:color="000000"/>
+              <w:bottom w:val="single" w:sz="4" w:space="0" w:color="000000"/>
+            </w:tcBorders>
+            <w:vAlign w:val="bottom"/>
+          </w:tcPr>
+          <w:p>
+            <w:pPr>
+              <w:pStyle w:val="Normal"/>
+              <w:widowControl w:val="false"/>
+              <w:spacing w:lineRule="auto" w:line="180"/>
+              <w:jc w:val="center"/>
+              <w:rPr>
+                <w:color w:val="000000"/>
+                <w:sz w:val="16"/>
+                <w:szCs w:val="16"/>
+              </w:rPr>
+            </w:pPr>
+            <w:r>
+              <w:rPr>
+                <w:color w:val="000000"/>
+                <w:sz w:val="16"/>
+                <w:szCs w:val="16"/>
+              </w:rPr>
+            </w:r>
+          </w:p>
+        </w:tc>
+        <w:tc>
+          <w:tcPr>
+            <w:tcW w:w="1016" w:type="dxa"/>
+            <w:tcBorders>
+              <w:top w:val="single" w:sz="4" w:space="0" w:color="000000"/>
+              <w:left w:val="single" w:sz="4" w:space="0" w:color="000000"/>
+              <w:bottom w:val="single" w:sz="4" w:space="0" w:color="000000"/>
+            </w:tcBorders>
+            <w:vAlign w:val="bottom"/>
+          </w:tcPr>
+          <w:p>
+            <w:pPr>
+              <w:pStyle w:val="Normal"/>
+              <w:widowControl w:val="false"/>
+              <w:spacing w:lineRule="auto" w:line="180"/>
+              <w:jc w:val="center"/>
+              <w:rPr>
+                <w:color w:val="000000"/>
+                <w:sz w:val="16"/>
+                <w:szCs w:val="16"/>
+              </w:rPr>
+            </w:pPr>
+            <w:r>
+              <w:rPr>
+                <w:color w:val="000000"/>
+                <w:sz w:val="16"/>
+                <w:szCs w:val="16"/>
+              </w:rPr>
+            </w:r>
+          </w:p>
+        </w:tc>
+        <w:tc>
+          <w:tcPr>
+            <w:tcW w:w="1016" w:type="dxa"/>
+            <w:tcBorders>
+              <w:top w:val="single" w:sz="4" w:space="0" w:color="000000"/>
+              <w:left w:val="single" w:sz="4" w:space="0" w:color="000000"/>
+              <w:bottom w:val="single" w:sz="4" w:space="0" w:color="000000"/>
+            </w:tcBorders>
+            <w:vAlign w:val="bottom"/>
+          </w:tcPr>
+          <w:p>
+            <w:pPr>
+              <w:pStyle w:val="Normal"/>
+              <w:widowControl w:val="false"/>
+              <w:jc w:val="center"/>
+              <w:rPr>
+                <w:color w:val="000000"/>
+                <w:sz w:val="16"/>
+                <w:szCs w:val="16"/>
+              </w:rPr>
+            </w:pPr>
+            <w:r>
+              <w:rPr>
+                <w:color w:val="000000"/>
+                <w:sz w:val="16"/>
+                <w:szCs w:val="16"/>
+              </w:rPr>
+              <w:t>Buzzer</w:t>
+            </w:r>
+          </w:p>
+        </w:tc>
+        <w:tc>
+          <w:tcPr>
+            <w:tcW w:w="1017" w:type="dxa"/>
+            <w:tcBorders>
+              <w:top w:val="single" w:sz="4" w:space="0" w:color="000000"/>
+              <w:left w:val="single" w:sz="4" w:space="0" w:color="000000"/>
+              <w:bottom w:val="single" w:sz="4" w:space="0" w:color="000000"/>
+            </w:tcBorders>
+            <w:vAlign w:val="bottom"/>
+          </w:tcPr>
+          <w:p>
+            <w:pPr>
+              <w:pStyle w:val="Normal"/>
+              <w:widowControl w:val="false"/>
+              <w:jc w:val="center"/>
+              <w:rPr>
+                <w:color w:val="000000"/>
+                <w:sz w:val="16"/>
+                <w:szCs w:val="16"/>
+              </w:rPr>
+            </w:pPr>
+            <w:r>
+              <w:rPr>
+                <w:rFonts w:eastAsia="arial" w:ascii="arial" w:hAnsi="arial"/>
+                <w:color w:val="000000"/>
+                <w:sz w:val="16"/>
+                <w:szCs w:val="16"/>
+              </w:rPr>
+              <w:t>Snow Brake</w:t>
+            </w:r>
+          </w:p>
+        </w:tc>
+        <w:tc>
+          <w:tcPr>
+            <w:tcW w:w="1016" w:type="dxa"/>
+            <w:tcBorders>
+              <w:top w:val="single" w:sz="4" w:space="0" w:color="000000"/>
+              <w:left w:val="single" w:sz="4" w:space="0" w:color="000000"/>
+              <w:bottom w:val="single" w:sz="4" w:space="0" w:color="000000"/>
+            </w:tcBorders>
+            <w:vAlign w:val="bottom"/>
+          </w:tcPr>
+          <w:p>
+            <w:pPr>
+              <w:pStyle w:val="Normal"/>
+              <w:widowControl w:val="false"/>
+              <w:spacing w:lineRule="auto" w:line="180"/>
+              <w:jc w:val="center"/>
+              <w:rPr>
+                <w:sz w:val="16"/>
+                <w:szCs w:val="16"/>
+              </w:rPr>
+            </w:pPr>
+            <w:r>
+              <w:rPr>
+                <w:sz w:val="16"/>
+                <w:szCs w:val="16"/>
+              </w:rPr>
+              <w:t>Desk Light Up</w:t>
+            </w:r>
+          </w:p>
+        </w:tc>
+        <w:tc>
+          <w:tcPr>
+            <w:tcW w:w="1020" w:type="dxa"/>
+            <w:tcBorders>
+              <w:top w:val="single" w:sz="4" w:space="0" w:color="000000"/>
+              <w:left w:val="single" w:sz="4" w:space="0" w:color="000000"/>
+              <w:bottom w:val="single" w:sz="4" w:space="0" w:color="000000"/>
+            </w:tcBorders>
+            <w:vAlign w:val="bottom"/>
+          </w:tcPr>
+          <w:p>
+            <w:pPr>
+              <w:pStyle w:val="Normal"/>
+              <w:widowControl w:val="false"/>
+              <w:spacing w:lineRule="auto" w:line="180"/>
+              <w:jc w:val="center"/>
+              <w:rPr>
+                <w:sz w:val="16"/>
+                <w:szCs w:val="16"/>
+              </w:rPr>
+            </w:pPr>
+            <w:r>
+              <w:rPr>
+                <w:sz w:val="16"/>
+                <w:szCs w:val="16"/>
+              </w:rPr>
+              <w:t>Gauge Light Up</w:t>
+            </w:r>
+          </w:p>
+        </w:tc>
+        <w:tc>
+          <w:tcPr>
+            <w:tcW w:w="1016" w:type="dxa"/>
+            <w:tcBorders>
+              <w:top w:val="single" w:sz="4" w:space="0" w:color="000000"/>
+              <w:left w:val="single" w:sz="4" w:space="0" w:color="000000"/>
+              <w:bottom w:val="single" w:sz="4" w:space="0" w:color="000000"/>
+            </w:tcBorders>
+            <w:vAlign w:val="bottom"/>
+          </w:tcPr>
+          <w:p>
+            <w:pPr>
+              <w:pStyle w:val="Normal"/>
+              <w:widowControl w:val="false"/>
+              <w:spacing w:lineRule="auto" w:line="180"/>
+              <w:jc w:val="center"/>
+              <w:rPr>
+                <w:sz w:val="16"/>
+                <w:szCs w:val="16"/>
+              </w:rPr>
+            </w:pPr>
+            <w:r>
+              <w:rPr>
+                <w:rFonts w:eastAsia="arial" w:ascii="arial" w:hAnsi="arial"/>
+                <w:color w:val="000000"/>
+                <w:sz w:val="16"/>
+                <w:szCs w:val="16"/>
+              </w:rPr>
+              <w:t>Marker Light On</w:t>
+            </w:r>
+          </w:p>
+        </w:tc>
+        <w:tc>
+          <w:tcPr>
+            <w:tcW w:w="1016" w:type="dxa"/>
+            <w:tcBorders>
+              <w:top w:val="single" w:sz="4" w:space="0" w:color="000000"/>
+              <w:left w:val="single" w:sz="4" w:space="0" w:color="000000"/>
+              <w:bottom w:val="single" w:sz="4" w:space="0" w:color="000000"/>
+            </w:tcBorders>
+            <w:vAlign w:val="bottom"/>
+          </w:tcPr>
+          <w:p>
+            <w:pPr>
+              <w:pStyle w:val="Normal"/>
+              <w:widowControl w:val="false"/>
+              <w:spacing w:lineRule="auto" w:line="180"/>
+              <w:jc w:val="center"/>
+              <w:rPr>
+                <w:sz w:val="16"/>
+                <w:szCs w:val="16"/>
+              </w:rPr>
+            </w:pPr>
+            <w:r>
+              <w:rPr>
+                <w:sz w:val="16"/>
+                <w:szCs w:val="16"/>
+              </w:rPr>
+              <w:t>Cab Light</w:t>
+            </w:r>
+          </w:p>
+        </w:tc>
+        <w:tc>
+          <w:tcPr>
+            <w:tcW w:w="1016" w:type="dxa"/>
+            <w:tcBorders>
+              <w:top w:val="single" w:sz="4" w:space="0" w:color="000000"/>
+              <w:left w:val="single" w:sz="4" w:space="0" w:color="000000"/>
+              <w:bottom w:val="single" w:sz="4" w:space="0" w:color="000000"/>
+            </w:tcBorders>
+            <w:vAlign w:val="bottom"/>
+          </w:tcPr>
+          <w:p>
+            <w:pPr>
+              <w:pStyle w:val="Normal"/>
+              <w:widowControl w:val="false"/>
+              <w:spacing w:lineRule="auto" w:line="180"/>
+              <w:jc w:val="center"/>
+              <w:rPr>
+                <w:sz w:val="16"/>
+                <w:szCs w:val="16"/>
+              </w:rPr>
+            </w:pPr>
+            <w:r>
+              <w:rPr>
+                <w:rFonts w:eastAsia="arial" w:ascii="arial" w:hAnsi="arial"/>
+                <w:color w:val="000000"/>
+                <w:sz w:val="16"/>
+                <w:szCs w:val="16"/>
+              </w:rPr>
+              <w:t>1-Person</w:t>
+            </w:r>
+          </w:p>
+        </w:tc>
+        <w:tc>
+          <w:tcPr>
+            <w:tcW w:w="1029" w:type="dxa"/>
+            <w:tcBorders>
+              <w:top w:val="single" w:sz="4" w:space="0" w:color="000000"/>
+              <w:left w:val="single" w:sz="4" w:space="0" w:color="000000"/>
+              <w:bottom w:val="single" w:sz="4" w:space="0" w:color="000000"/>
+              <w:right w:val="single" w:sz="4" w:space="0" w:color="000000"/>
+            </w:tcBorders>
+            <w:vAlign w:val="bottom"/>
+          </w:tcPr>
+          <w:p>
+            <w:pPr>
+              <w:pStyle w:val="Normal"/>
+              <w:widowControl w:val="false"/>
+              <w:spacing w:lineRule="auto" w:line="180"/>
+              <w:jc w:val="center"/>
+              <w:rPr>
+                <w:sz w:val="16"/>
+                <w:szCs w:val="16"/>
+              </w:rPr>
+            </w:pPr>
+            <w:r>
+              <w:rPr>
+                <w:rFonts w:eastAsia="arial" w:ascii="arial" w:hAnsi="arial"/>
+                <w:color w:val="000000"/>
+                <w:sz w:val="16"/>
+                <w:szCs w:val="16"/>
+              </w:rPr>
+              <w:t>Next</w:t>
+            </w:r>
+          </w:p>
+          <w:p>
+            <w:pPr>
+              <w:pStyle w:val="Normal"/>
+              <w:widowControl w:val="false"/>
+              <w:spacing w:lineRule="auto" w:line="180"/>
+              <w:jc w:val="center"/>
+              <w:rPr>
+                <w:sz w:val="16"/>
+                <w:szCs w:val="16"/>
+              </w:rPr>
+            </w:pPr>
+            <w:r>
+              <w:rPr>
+                <w:rFonts w:eastAsia="arial" w:ascii="arial" w:hAnsi="arial"/>
+                <w:color w:val="000000"/>
+                <w:sz w:val="16"/>
+                <w:szCs w:val="16"/>
+              </w:rPr>
+              <w:t>Cab Cam</w:t>
+            </w:r>
+          </w:p>
+        </w:tc>
+      </w:tr>
+    </w:tbl>
+    <w:p>
+      <w:pPr>
+        <w:pStyle w:val="Normal"/>
+        <w:rPr>
+          <w:color w:val="000000"/>
+          <w:sz w:val="16"/>
+          <w:szCs w:val="16"/>
+        </w:rPr>
+      </w:pPr>
+      <w:r>
+        <w:rPr>
+          <w:color w:val="000000"/>
+          <w:sz w:val="16"/>
+          <w:szCs w:val="16"/>
+        </w:rPr>
+      </w:r>
+    </w:p>
+    <w:p>
+      <w:pPr>
+        <w:pStyle w:val="Normal"/>
+        <w:rPr>
+          <w:color w:val="000000"/>
+          <w:sz w:val="16"/>
+          <w:szCs w:val="16"/>
+        </w:rPr>
+      </w:pPr>
+      <w:r>
+        <w:rPr>
+          <w:rFonts w:eastAsia="arial" w:ascii="arial" w:hAnsi="arial"/>
+          <w:color w:val="000000"/>
+          <w:sz w:val="16"/>
+          <w:szCs w:val="16"/>
+        </w:rPr>
+        <w:tab/>
+        <w:t xml:space="preserve">           M7-2</w:t>
+      </w:r>
+    </w:p>
+    <w:tbl>
+      <w:tblPr>
+        <w:tblW w:w="14248" w:type="dxa"/>
+        <w:jc w:val="left"/>
+        <w:tblInd w:w="-5" w:type="dxa"/>
+        <w:tblLayout w:type="fixed"/>
+        <w:tblCellMar>
+          <w:top w:w="0" w:type="dxa"/>
+          <w:left w:w="108" w:type="dxa"/>
+          <w:bottom w:w="0" w:type="dxa"/>
+          <w:right w:w="108" w:type="dxa"/>
+        </w:tblCellMar>
+        <w:tblLook w:firstRow="1" w:noVBand="1" w:lastRow="0" w:firstColumn="1" w:lastColumn="0" w:noHBand="0" w:val="04a0"/>
+      </w:tblPr>
+      <w:tblGrid>
+        <w:gridCol w:w="1017"/>
+        <w:gridCol w:w="1019"/>
+        <w:gridCol w:w="1014"/>
+        <w:gridCol w:w="1016"/>
+        <w:gridCol w:w="1020"/>
+        <w:gridCol w:w="1016"/>
+        <w:gridCol w:w="1016"/>
+        <w:gridCol w:w="1017"/>
+        <w:gridCol w:w="1016"/>
+        <w:gridCol w:w="1020"/>
+        <w:gridCol w:w="1016"/>
+        <w:gridCol w:w="1016"/>
+        <w:gridCol w:w="1016"/>
+        <w:gridCol w:w="1029"/>
+      </w:tblGrid>
+      <w:tr>
+        <w:trPr>
+          <w:trHeight w:val="440" w:hRule="exact"/>
+          <w:cantSplit w:val="true"/>
+        </w:trPr>
+        <w:tc>
+          <w:tcPr>
+            <w:tcW w:w="1017" w:type="dxa"/>
+            <w:tcBorders>
+              <w:top w:val="single" w:sz="4" w:space="0" w:color="000000"/>
+              <w:left w:val="single" w:sz="4" w:space="0" w:color="000000"/>
+              <w:bottom w:val="single" w:sz="4" w:space="0" w:color="000000"/>
+            </w:tcBorders>
+            <w:vAlign w:val="bottom"/>
+          </w:tcPr>
+          <w:p>
+            <w:pPr>
+              <w:pStyle w:val="Normal"/>
+              <w:widowControl w:val="false"/>
+              <w:spacing w:lineRule="auto" w:line="180" w:before="0" w:after="60"/>
+              <w:jc w:val="center"/>
+              <w:rPr>
+                <w:b/>
+                <w:bCs/>
+              </w:rPr>
+            </w:pPr>
+            <w:r>
+              <w:rPr>
+                <w:b/>
+                <w:bCs/>
+                <w:color w:val="000000"/>
+                <w:sz w:val="16"/>
+                <w:szCs w:val="16"/>
+              </w:rPr>
+              <w:t>HUD</w:t>
+            </w:r>
+          </w:p>
+        </w:tc>
+        <w:tc>
+          <w:tcPr>
+            <w:tcW w:w="1019" w:type="dxa"/>
+            <w:tcBorders>
+              <w:top w:val="single" w:sz="4" w:space="0" w:color="000000"/>
+              <w:left w:val="single" w:sz="4" w:space="0" w:color="000000"/>
+              <w:bottom w:val="single" w:sz="4" w:space="0" w:color="000000"/>
+            </w:tcBorders>
+            <w:vAlign w:val="bottom"/>
+          </w:tcPr>
+          <w:p>
+            <w:pPr>
+              <w:pStyle w:val="Normal"/>
+              <w:widowControl w:val="false"/>
+              <w:spacing w:lineRule="auto" w:line="180"/>
+              <w:jc w:val="center"/>
+              <w:rPr>
+                <w:color w:val="000000"/>
+                <w:sz w:val="16"/>
+                <w:szCs w:val="16"/>
+              </w:rPr>
+            </w:pPr>
+            <w:r>
+              <w:rPr>
+                <w:color w:val="000000"/>
+                <w:sz w:val="16"/>
+                <w:szCs w:val="16"/>
+              </w:rPr>
+              <w:t>Schedule</w:t>
+            </w:r>
+          </w:p>
+        </w:tc>
+        <w:tc>
+          <w:tcPr>
+            <w:tcW w:w="1014" w:type="dxa"/>
+            <w:tcBorders>
+              <w:top w:val="single" w:sz="4" w:space="0" w:color="000000"/>
+              <w:left w:val="single" w:sz="4" w:space="0" w:color="000000"/>
+              <w:bottom w:val="single" w:sz="4" w:space="0" w:color="000000"/>
+            </w:tcBorders>
+            <w:vAlign w:val="bottom"/>
+          </w:tcPr>
+          <w:p>
+            <w:pPr>
+              <w:pStyle w:val="Normal"/>
+              <w:widowControl w:val="false"/>
+              <w:spacing w:lineRule="auto" w:line="180"/>
+              <w:jc w:val="center"/>
+              <w:rPr>
+                <w:sz w:val="16"/>
+                <w:szCs w:val="16"/>
+              </w:rPr>
+            </w:pPr>
+            <w:r>
+              <w:rPr>
+                <w:sz w:val="16"/>
+                <w:szCs w:val="16"/>
+              </w:rPr>
+            </w:r>
+          </w:p>
+        </w:tc>
+        <w:tc>
+          <w:tcPr>
+            <w:tcW w:w="1016" w:type="dxa"/>
+            <w:tcBorders>
+              <w:top w:val="single" w:sz="4" w:space="0" w:color="000000"/>
+              <w:left w:val="single" w:sz="4" w:space="0" w:color="000000"/>
+              <w:bottom w:val="single" w:sz="4" w:space="0" w:color="000000"/>
+            </w:tcBorders>
+            <w:vAlign w:val="bottom"/>
+          </w:tcPr>
+          <w:p>
+            <w:pPr>
+              <w:pStyle w:val="Normal"/>
+              <w:widowControl w:val="false"/>
+              <w:spacing w:lineRule="auto" w:line="180"/>
+              <w:jc w:val="center"/>
+              <w:rPr>
+                <w:color w:val="000000"/>
+                <w:sz w:val="16"/>
+                <w:szCs w:val="16"/>
+              </w:rPr>
+            </w:pPr>
+            <w:r>
+              <w:rPr>
+                <w:color w:val="000000"/>
+                <w:sz w:val="16"/>
+                <w:szCs w:val="16"/>
+              </w:rPr>
+              <w:t>Alerter/Deadman</w:t>
+            </w:r>
+          </w:p>
+        </w:tc>
+        <w:tc>
+          <w:tcPr>
+            <w:tcW w:w="1020" w:type="dxa"/>
+            <w:tcBorders>
+              <w:top w:val="single" w:sz="4" w:space="0" w:color="000000"/>
+              <w:left w:val="single" w:sz="4" w:space="0" w:color="000000"/>
+              <w:bottom w:val="single" w:sz="4" w:space="0" w:color="000000"/>
+            </w:tcBorders>
+            <w:vAlign w:val="bottom"/>
+          </w:tcPr>
+          <w:p>
+            <w:pPr>
+              <w:pStyle w:val="Normal"/>
+              <w:widowControl w:val="false"/>
+              <w:spacing w:lineRule="auto" w:line="180"/>
+              <w:jc w:val="center"/>
+              <w:rPr>
+                <w:color w:val="000000"/>
+                <w:sz w:val="16"/>
+                <w:szCs w:val="16"/>
+              </w:rPr>
+            </w:pPr>
+            <w:r>
+              <w:rPr>
+                <w:color w:val="000000"/>
+                <w:sz w:val="16"/>
+                <w:szCs w:val="16"/>
+              </w:rPr>
+            </w:r>
+          </w:p>
+        </w:tc>
+        <w:tc>
+          <w:tcPr>
+            <w:tcW w:w="1016" w:type="dxa"/>
+            <w:tcBorders>
+              <w:top w:val="single" w:sz="4" w:space="0" w:color="000000"/>
+              <w:left w:val="single" w:sz="4" w:space="0" w:color="000000"/>
+              <w:bottom w:val="single" w:sz="4" w:space="0" w:color="000000"/>
+            </w:tcBorders>
+            <w:vAlign w:val="bottom"/>
+          </w:tcPr>
+          <w:p>
+            <w:pPr>
+              <w:pStyle w:val="Normal"/>
+              <w:widowControl w:val="false"/>
+              <w:spacing w:lineRule="auto" w:line="180"/>
+              <w:jc w:val="center"/>
+              <w:rPr>
+                <w:color w:val="000000"/>
+                <w:sz w:val="16"/>
+                <w:szCs w:val="16"/>
+              </w:rPr>
+            </w:pPr>
+            <w:r>
+              <w:rPr>
+                <w:color w:val="000000"/>
+                <w:sz w:val="16"/>
+                <w:szCs w:val="16"/>
+              </w:rPr>
+              <w:t>Charge Brake</w:t>
+            </w:r>
+          </w:p>
+        </w:tc>
+        <w:tc>
+          <w:tcPr>
+            <w:tcW w:w="1016" w:type="dxa"/>
+            <w:tcBorders>
+              <w:top w:val="single" w:sz="4" w:space="0" w:color="000000"/>
+              <w:left w:val="single" w:sz="4" w:space="0" w:color="000000"/>
+              <w:bottom w:val="single" w:sz="4" w:space="0" w:color="000000"/>
+            </w:tcBorders>
+            <w:vAlign w:val="bottom"/>
+          </w:tcPr>
+          <w:p>
+            <w:pPr>
+              <w:pStyle w:val="Normal"/>
+              <w:widowControl w:val="false"/>
+              <w:jc w:val="center"/>
+              <w:rPr>
+                <w:sz w:val="16"/>
+                <w:szCs w:val="16"/>
+              </w:rPr>
+            </w:pPr>
+            <w:r>
+              <w:rPr>
+                <w:sz w:val="16"/>
+                <w:szCs w:val="16"/>
+              </w:rPr>
+            </w:r>
+          </w:p>
+        </w:tc>
+        <w:tc>
+          <w:tcPr>
+            <w:tcW w:w="1017" w:type="dxa"/>
+            <w:tcBorders>
+              <w:top w:val="single" w:sz="4" w:space="0" w:color="000000"/>
+              <w:left w:val="single" w:sz="4" w:space="0" w:color="000000"/>
+              <w:bottom w:val="single" w:sz="4" w:space="0" w:color="000000"/>
+            </w:tcBorders>
+            <w:vAlign w:val="bottom"/>
+          </w:tcPr>
+          <w:p>
+            <w:pPr>
+              <w:pStyle w:val="Normal"/>
+              <w:widowControl w:val="false"/>
+              <w:jc w:val="center"/>
+              <w:rPr>
+                <w:sz w:val="16"/>
+                <w:szCs w:val="16"/>
+              </w:rPr>
+            </w:pPr>
+            <w:r>
+              <w:rPr>
+                <w:sz w:val="16"/>
+                <w:szCs w:val="16"/>
+              </w:rPr>
+            </w:r>
+          </w:p>
+        </w:tc>
+        <w:tc>
+          <w:tcPr>
+            <w:tcW w:w="1016" w:type="dxa"/>
+            <w:tcBorders>
+              <w:top w:val="single" w:sz="4" w:space="0" w:color="000000"/>
+              <w:left w:val="single" w:sz="4" w:space="0" w:color="000000"/>
+              <w:bottom w:val="single" w:sz="4" w:space="0" w:color="000000"/>
+            </w:tcBorders>
+            <w:vAlign w:val="bottom"/>
+          </w:tcPr>
+          <w:p>
+            <w:pPr>
+              <w:pStyle w:val="Normal"/>
+              <w:widowControl w:val="false"/>
+              <w:spacing w:lineRule="auto" w:line="180"/>
+              <w:jc w:val="center"/>
+              <w:rPr>
+                <w:sz w:val="16"/>
+                <w:szCs w:val="16"/>
+              </w:rPr>
+            </w:pPr>
+            <w:r>
+              <w:rPr>
+                <w:sz w:val="16"/>
+                <w:szCs w:val="16"/>
+              </w:rPr>
+              <w:t>Desk Light Down</w:t>
+            </w:r>
+          </w:p>
+        </w:tc>
+        <w:tc>
+          <w:tcPr>
+            <w:tcW w:w="1020" w:type="dxa"/>
+            <w:tcBorders>
+              <w:top w:val="single" w:sz="4" w:space="0" w:color="000000"/>
+              <w:left w:val="single" w:sz="4" w:space="0" w:color="000000"/>
+              <w:bottom w:val="single" w:sz="4" w:space="0" w:color="000000"/>
+            </w:tcBorders>
+            <w:vAlign w:val="bottom"/>
+          </w:tcPr>
+          <w:p>
+            <w:pPr>
+              <w:pStyle w:val="Normal"/>
+              <w:widowControl w:val="false"/>
+              <w:spacing w:lineRule="auto" w:line="180"/>
+              <w:jc w:val="center"/>
+              <w:rPr>
+                <w:sz w:val="16"/>
+                <w:szCs w:val="16"/>
+              </w:rPr>
+            </w:pPr>
+            <w:r>
+              <w:rPr>
+                <w:rFonts w:eastAsia="arial" w:ascii="arial" w:hAnsi="arial"/>
+                <w:color w:val="000000"/>
+                <w:sz w:val="16"/>
+                <w:szCs w:val="16"/>
+              </w:rPr>
+              <w:t>Gauge Light Dw</w:t>
+            </w:r>
+          </w:p>
+        </w:tc>
+        <w:tc>
+          <w:tcPr>
+            <w:tcW w:w="1016" w:type="dxa"/>
+            <w:tcBorders>
+              <w:top w:val="single" w:sz="4" w:space="0" w:color="000000"/>
+              <w:left w:val="single" w:sz="4" w:space="0" w:color="000000"/>
+              <w:bottom w:val="single" w:sz="4" w:space="0" w:color="000000"/>
+            </w:tcBorders>
+            <w:vAlign w:val="bottom"/>
+          </w:tcPr>
+          <w:p>
+            <w:pPr>
+              <w:pStyle w:val="Normal"/>
+              <w:widowControl w:val="false"/>
+              <w:spacing w:lineRule="auto" w:line="180"/>
+              <w:jc w:val="center"/>
+              <w:rPr>
+                <w:sz w:val="16"/>
+                <w:szCs w:val="16"/>
+              </w:rPr>
+            </w:pPr>
+            <w:r>
+              <w:rPr>
+                <w:rFonts w:eastAsia="arial" w:ascii="arial" w:hAnsi="arial"/>
+                <w:color w:val="000000"/>
+                <w:sz w:val="16"/>
+                <w:szCs w:val="16"/>
+              </w:rPr>
+              <w:t>Marker Light Off</w:t>
+            </w:r>
+          </w:p>
+        </w:tc>
+        <w:tc>
+          <w:tcPr>
+            <w:tcW w:w="1016" w:type="dxa"/>
+            <w:tcBorders>
+              <w:top w:val="single" w:sz="4" w:space="0" w:color="000000"/>
+              <w:left w:val="single" w:sz="4" w:space="0" w:color="000000"/>
+              <w:bottom w:val="single" w:sz="4" w:space="0" w:color="000000"/>
+            </w:tcBorders>
+            <w:vAlign w:val="bottom"/>
+          </w:tcPr>
+          <w:p>
+            <w:pPr>
+              <w:pStyle w:val="Normal"/>
+              <w:widowControl w:val="false"/>
+              <w:spacing w:lineRule="auto" w:line="180"/>
+              <w:jc w:val="center"/>
+              <w:rPr>
+                <w:sz w:val="16"/>
+                <w:szCs w:val="16"/>
+              </w:rPr>
+            </w:pPr>
+            <w:r>
+              <w:rPr>
+                <w:color w:val="000000"/>
+                <w:sz w:val="16"/>
+                <w:szCs w:val="16"/>
+              </w:rPr>
+              <w:t>Uncouple</w:t>
+            </w:r>
+          </w:p>
+        </w:tc>
+        <w:tc>
+          <w:tcPr>
+            <w:tcW w:w="1016" w:type="dxa"/>
+            <w:tcBorders>
+              <w:top w:val="single" w:sz="4" w:space="0" w:color="000000"/>
+              <w:left w:val="single" w:sz="4" w:space="0" w:color="000000"/>
+              <w:bottom w:val="single" w:sz="4" w:space="0" w:color="000000"/>
+            </w:tcBorders>
+            <w:vAlign w:val="bottom"/>
+          </w:tcPr>
+          <w:p>
+            <w:pPr>
+              <w:pStyle w:val="Normal"/>
+              <w:widowControl w:val="false"/>
+              <w:spacing w:lineRule="auto" w:line="180"/>
+              <w:jc w:val="center"/>
+              <w:rPr>
+                <w:sz w:val="16"/>
+                <w:szCs w:val="16"/>
+              </w:rPr>
+            </w:pPr>
+            <w:r>
+              <w:rPr>
+                <w:rFonts w:eastAsia="arial" w:ascii="arial" w:hAnsi="arial"/>
+                <w:color w:val="000000"/>
+                <w:sz w:val="16"/>
+                <w:szCs w:val="16"/>
+              </w:rPr>
+              <w:t>Exterior</w:t>
+            </w:r>
+          </w:p>
+          <w:p>
+            <w:pPr>
+              <w:pStyle w:val="Normal"/>
+              <w:widowControl w:val="false"/>
+              <w:spacing w:lineRule="auto" w:line="180"/>
+              <w:jc w:val="center"/>
+              <w:rPr>
+                <w:sz w:val="16"/>
+                <w:szCs w:val="16"/>
+              </w:rPr>
+            </w:pPr>
+            <w:r>
+              <w:rPr>
+                <w:rFonts w:eastAsia="arial" w:ascii="arial" w:hAnsi="arial"/>
+                <w:color w:val="000000"/>
+                <w:sz w:val="16"/>
+                <w:szCs w:val="16"/>
+              </w:rPr>
+              <w:t>Camera</w:t>
+            </w:r>
+          </w:p>
+        </w:tc>
+        <w:tc>
+          <w:tcPr>
+            <w:tcW w:w="1029" w:type="dxa"/>
+            <w:tcBorders>
+              <w:top w:val="single" w:sz="4" w:space="0" w:color="000000"/>
+              <w:left w:val="single" w:sz="4" w:space="0" w:color="000000"/>
+              <w:bottom w:val="single" w:sz="4" w:space="0" w:color="000000"/>
+              <w:right w:val="single" w:sz="4" w:space="0" w:color="000000"/>
+            </w:tcBorders>
+            <w:vAlign w:val="bottom"/>
+          </w:tcPr>
+          <w:p>
+            <w:pPr>
+              <w:pStyle w:val="Normal"/>
+              <w:widowControl w:val="false"/>
+              <w:spacing w:lineRule="auto" w:line="180"/>
+              <w:jc w:val="center"/>
+              <w:rPr>
+                <w:sz w:val="16"/>
+                <w:szCs w:val="16"/>
+              </w:rPr>
+            </w:pPr>
+            <w:r>
+              <w:rPr>
+                <w:rFonts w:eastAsia="arial" w:ascii="arial" w:hAnsi="arial"/>
+                <w:color w:val="000000"/>
+                <w:sz w:val="16"/>
+                <w:szCs w:val="16"/>
+              </w:rPr>
+              <w:t>Prev</w:t>
+            </w:r>
+          </w:p>
+          <w:p>
+            <w:pPr>
+              <w:pStyle w:val="Normal"/>
+              <w:widowControl w:val="false"/>
+              <w:spacing w:lineRule="auto" w:line="180"/>
+              <w:jc w:val="center"/>
+              <w:rPr>
+                <w:sz w:val="16"/>
+                <w:szCs w:val="16"/>
+              </w:rPr>
+            </w:pPr>
+            <w:r>
+              <w:rPr>
+                <w:rFonts w:eastAsia="arial" w:ascii="arial" w:hAnsi="arial"/>
+                <w:color w:val="000000"/>
+                <w:sz w:val="16"/>
+                <w:szCs w:val="16"/>
+              </w:rPr>
+              <w:t>Cab Cam</w:t>
+            </w:r>
+          </w:p>
+        </w:tc>
+      </w:tr>
+    </w:tbl>
+    <w:p>
+      <w:pPr>
+        <w:pStyle w:val="Normal"/>
+        <w:bidi w:val="0"/>
+        <w:rPr>
+          <w:color w:val="000000"/>
+          <w:sz w:val="16"/>
+          <w:szCs w:val="16"/>
+        </w:rPr>
+      </w:pPr>
+      <w:r>
+        <w:rPr>
+          <w:color w:val="000000"/>
+          <w:sz w:val="16"/>
+          <w:szCs w:val="16"/>
+        </w:rPr>
+      </w:r>
+    </w:p>
+    <w:p>
+      <w:pPr>
+        <w:pStyle w:val="Normal"/>
+        <w:rPr>
+          <w:color w:val="000000"/>
+          <w:sz w:val="16"/>
+          <w:szCs w:val="16"/>
+        </w:rPr>
+      </w:pPr>
+      <w:r>
+        <w:rPr>
+          <w:color w:val="000000"/>
+          <w:sz w:val="16"/>
+          <w:szCs w:val="16"/>
+        </w:rPr>
+        <w:tab/>
+        <w:t xml:space="preserve">       </w:t>
+      </w:r>
+      <w:r>
+        <w:rPr>
+          <w:rFonts w:eastAsia="arial" w:ascii="arial" w:hAnsi="arial"/>
+          <w:color w:val="000000"/>
+          <w:sz w:val="16"/>
+          <w:szCs w:val="16"/>
+        </w:rPr>
         <w:t xml:space="preserve">    M</w:t>
       </w:r>
       <w:r>
@@ -37640,7 +38738,7 @@
           <w:sz w:val="16"/>
           <w:szCs w:val="16"/>
         </w:rPr>
-        <w:t>7</w:t>
+        <w:t>8</w:t>
       </w:r>
       <w:r>
         <w:rPr>
@@ -37783,46 +38881,34 @@
                 <w:sz w:val="16"/>
                 <w:szCs w:val="16"/>
               </w:rPr>
-            </w:r>
-          </w:p>
-        </w:tc>
-        <w:tc>
-          <w:tcPr>
-            <w:tcW w:w="1016" w:type="dxa"/>
-            <w:tcBorders>
-              <w:top w:val="single" w:sz="4" w:space="0" w:color="000000"/>
-              <w:left w:val="single" w:sz="4" w:space="0" w:color="000000"/>
-              <w:bottom w:val="single" w:sz="4" w:space="0" w:color="000000"/>
-            </w:tcBorders>
-            <w:vAlign w:val="bottom"/>
-          </w:tcPr>
-          <w:p>
-            <w:pPr>
-              <w:pStyle w:val="Normal"/>
-              <w:widowControl w:val="false"/>
-              <w:spacing w:lineRule="auto" w:line="180"/>
-              <w:jc w:val="center"/>
-              <w:rPr>
-                <w:color w:val="000000"/>
-                <w:sz w:val="16"/>
-                <w:szCs w:val="16"/>
-              </w:rPr>
-            </w:pPr>
-            <w:r>
-              <w:rPr>
-                <w:color w:val="000000"/>
-                <w:sz w:val="16"/>
-                <w:szCs w:val="16"/>
-              </w:rPr>
-              <w:t>AT</w:t>
-            </w:r>
-            <w:r>
-              <w:rPr>
-                <w:color w:val="000000"/>
-                <w:sz w:val="16"/>
-                <w:szCs w:val="16"/>
-              </w:rPr>
-              <w:t>C/ACSES</w:t>
+              <w:t>Operation Mode AC</w:t>
+            </w:r>
+          </w:p>
+        </w:tc>
+        <w:tc>
+          <w:tcPr>
+            <w:tcW w:w="1016" w:type="dxa"/>
+            <w:tcBorders>
+              <w:top w:val="single" w:sz="4" w:space="0" w:color="000000"/>
+              <w:left w:val="single" w:sz="4" w:space="0" w:color="000000"/>
+              <w:bottom w:val="single" w:sz="4" w:space="0" w:color="000000"/>
+            </w:tcBorders>
+            <w:vAlign w:val="bottom"/>
+          </w:tcPr>
+          <w:p>
+            <w:pPr>
+              <w:pStyle w:val="Normal"/>
+              <w:widowControl w:val="false"/>
+              <w:spacing w:lineRule="auto" w:line="180"/>
+              <w:jc w:val="center"/>
+              <w:rPr>
+                <w:color w:val="000000"/>
+                <w:sz w:val="16"/>
+                <w:szCs w:val="16"/>
+              </w:rPr>
+            </w:pPr>
+            <w:r>
+              <w:rPr/>
             </w:r>
           </w:p>
         </w:tc>
@@ -37854,33 +38940,38 @@
                 <w:sz w:val="16"/>
                 <w:szCs w:val="16"/>
               </w:rPr>
-            </w:r>
-          </w:p>
-        </w:tc>
-        <w:tc>
-          <w:tcPr>
-            <w:tcW w:w="1016" w:type="dxa"/>
-            <w:tcBorders>
-              <w:top w:val="single" w:sz="4" w:space="0" w:color="000000"/>
-              <w:left w:val="single" w:sz="4" w:space="0" w:color="000000"/>
-              <w:bottom w:val="single" w:sz="4" w:space="0" w:color="000000"/>
-            </w:tcBorders>
-            <w:vAlign w:val="bottom"/>
-          </w:tcPr>
-          <w:p>
-            <w:pPr>
-              <w:pStyle w:val="Normal"/>
-              <w:widowControl w:val="false"/>
-              <w:spacing w:lineRule="auto" w:line="180"/>
-              <w:jc w:val="center"/>
-              <w:rPr>
-                <w:color w:val="000000"/>
-                <w:sz w:val="16"/>
-                <w:szCs w:val="16"/>
-              </w:rPr>
-            </w:pPr>
-            <w:r>
-              <w:rPr/>
+              <w:t>Panto. Raise</w:t>
+            </w:r>
+          </w:p>
+        </w:tc>
+        <w:tc>
+          <w:tcPr>
+            <w:tcW w:w="1016" w:type="dxa"/>
+            <w:tcBorders>
+              <w:top w:val="single" w:sz="4" w:space="0" w:color="000000"/>
+              <w:left w:val="single" w:sz="4" w:space="0" w:color="000000"/>
+              <w:bottom w:val="single" w:sz="4" w:space="0" w:color="000000"/>
+            </w:tcBorders>
+            <w:vAlign w:val="bottom"/>
+          </w:tcPr>
+          <w:p>
+            <w:pPr>
+              <w:pStyle w:val="Normal"/>
+              <w:widowControl w:val="false"/>
+              <w:spacing w:lineRule="auto" w:line="180"/>
+              <w:jc w:val="center"/>
+              <w:rPr>
+                <w:color w:val="000000"/>
+                <w:sz w:val="16"/>
+                <w:szCs w:val="16"/>
+              </w:rPr>
+            </w:pPr>
+            <w:r>
+              <w:rPr>
+                <w:color w:val="000000"/>
+                <w:sz w:val="16"/>
+                <w:szCs w:val="16"/>
+              </w:rPr>
             </w:r>
           </w:p>
         </w:tc>
@@ -37943,37 +39034,53 @@
                 <w:sz w:val="16"/>
                 <w:szCs w:val="16"/>
               </w:rPr>
-              <w:t>Snow Brake</w:t>
-            </w:r>
-          </w:p>
-        </w:tc>
-        <w:tc>
-          <w:tcPr>
-            <w:tcW w:w="1016" w:type="dxa"/>
-            <w:tcBorders>
-              <w:top w:val="single" w:sz="4" w:space="0" w:color="000000"/>
-              <w:left w:val="single" w:sz="4" w:space="0" w:color="000000"/>
-              <w:bottom w:val="single" w:sz="4" w:space="0" w:color="000000"/>
-            </w:tcBorders>
-            <w:vAlign w:val="bottom"/>
-          </w:tcPr>
-          <w:p>
-            <w:pPr>
-              <w:pStyle w:val="Normal"/>
-              <w:widowControl w:val="false"/>
-              <w:spacing w:lineRule="auto" w:line="180"/>
-              <w:jc w:val="center"/>
-              <w:rPr>
-                <w:sz w:val="16"/>
-                <w:szCs w:val="16"/>
-              </w:rPr>
-            </w:pPr>
-            <w:r>
-              <w:rPr>
-                <w:sz w:val="16"/>
-                <w:szCs w:val="16"/>
-              </w:rPr>
-              <w:t>Desk Light Up</w:t>
+              <w:t xml:space="preserve">Snow Brake </w:t>
+            </w:r>
+            <w:r>
+              <w:rPr>
+                <w:rFonts w:eastAsia="arial" w:ascii="arial" w:hAnsi="arial"/>
+                <w:color w:val="000000"/>
+                <w:sz w:val="16"/>
+                <w:szCs w:val="16"/>
+              </w:rPr>
+              <w:t>On</w:t>
+            </w:r>
+          </w:p>
+        </w:tc>
+        <w:tc>
+          <w:tcPr>
+            <w:tcW w:w="1016" w:type="dxa"/>
+            <w:tcBorders>
+              <w:top w:val="single" w:sz="4" w:space="0" w:color="000000"/>
+              <w:left w:val="single" w:sz="4" w:space="0" w:color="000000"/>
+              <w:bottom w:val="single" w:sz="4" w:space="0" w:color="000000"/>
+            </w:tcBorders>
+            <w:vAlign w:val="bottom"/>
+          </w:tcPr>
+          <w:p>
+            <w:pPr>
+              <w:pStyle w:val="Normal"/>
+              <w:widowControl w:val="false"/>
+              <w:spacing w:lineRule="auto" w:line="180"/>
+              <w:jc w:val="center"/>
+              <w:rPr>
+                <w:sz w:val="16"/>
+                <w:szCs w:val="16"/>
+              </w:rPr>
+            </w:pPr>
+            <w:r>
+              <w:rPr>
+                <w:sz w:val="16"/>
+                <w:szCs w:val="16"/>
+              </w:rPr>
+              <w:t xml:space="preserve">Gimbal </w:t>
+            </w:r>
+            <w:r>
+              <w:rPr>
+                <w:sz w:val="16"/>
+                <w:szCs w:val="16"/>
+              </w:rPr>
+              <w:t>Light Up</w:t>
             </w:r>
           </w:p>
         </w:tc>
@@ -38003,46 +39110,39 @@
                 <w:sz w:val="16"/>
                 <w:szCs w:val="16"/>
               </w:rPr>
-              <w:t>Gauge Light</w:t>
-            </w:r>
-            <w:r>
-              <w:rPr>
-                <w:sz w:val="16"/>
-                <w:szCs w:val="16"/>
-              </w:rPr>
-              <w:t xml:space="preserve"> Up</w:t>
-            </w:r>
-          </w:p>
-        </w:tc>
-        <w:tc>
-          <w:tcPr>
-            <w:tcW w:w="1016" w:type="dxa"/>
-            <w:tcBorders>
-              <w:top w:val="single" w:sz="4" w:space="0" w:color="000000"/>
-              <w:left w:val="single" w:sz="4" w:space="0" w:color="000000"/>
-              <w:bottom w:val="single" w:sz="4" w:space="0" w:color="000000"/>
-            </w:tcBorders>
-            <w:vAlign w:val="bottom"/>
-          </w:tcPr>
-          <w:p>
-            <w:pPr>
-              <w:pStyle w:val="Normal"/>
-              <w:widowControl w:val="false"/>
-              <w:spacing w:lineRule="auto" w:line="180"/>
-              <w:jc w:val="center"/>
-              <w:rPr>
-                <w:sz w:val="16"/>
-                <w:szCs w:val="16"/>
-              </w:rPr>
-            </w:pPr>
-            <w:r>
-              <w:rPr>
-                <w:rFonts w:eastAsia="arial" w:ascii="arial" w:hAnsi="arial"/>
-                <w:color w:val="000000"/>
-                <w:sz w:val="16"/>
-                <w:szCs w:val="16"/>
-              </w:rPr>
-              <w:t>Marker Light On</w:t>
+              <w:t>Gauge Light Up</w:t>
+            </w:r>
+          </w:p>
+        </w:tc>
+        <w:tc>
+          <w:tcPr>
+            <w:tcW w:w="1016" w:type="dxa"/>
+            <w:tcBorders>
+              <w:top w:val="single" w:sz="4" w:space="0" w:color="000000"/>
+              <w:left w:val="single" w:sz="4" w:space="0" w:color="000000"/>
+              <w:bottom w:val="single" w:sz="4" w:space="0" w:color="000000"/>
+            </w:tcBorders>
+            <w:vAlign w:val="bottom"/>
+          </w:tcPr>
+          <w:p>
+            <w:pPr>
+              <w:pStyle w:val="Normal"/>
+              <w:widowControl w:val="false"/>
+              <w:spacing w:lineRule="auto" w:line="180"/>
+              <w:jc w:val="center"/>
+              <w:rPr>
+                <w:sz w:val="16"/>
+                <w:szCs w:val="16"/>
+              </w:rPr>
+            </w:pPr>
+            <w:r>
+              <w:rPr>
+                <w:rFonts w:eastAsia="arial" w:ascii="arial" w:hAnsi="arial"/>
+                <w:color w:val="000000"/>
+                <w:sz w:val="16"/>
+                <w:szCs w:val="16"/>
+              </w:rPr>
+              <w:t>Indicator Light Up</w:t>
             </w:r>
           </w:p>
         </w:tc>
@@ -38175,7 +39275,6 @@
       </w:pPr>
       <w:r>
         <w:rPr>
-          <w:rFonts w:eastAsia="arial" w:ascii="arial" w:hAnsi="arial"/>
           <w:color w:val="000000"/>
           <w:sz w:val="16"/>
           <w:szCs w:val="16"/>
@@ -38208,7 +39307,7 @@
           <w:sz w:val="16"/>
           <w:szCs w:val="16"/>
         </w:rPr>
-        <w:t>7</w:t>
+        <w:t>8</w:t>
       </w:r>
       <w:r>
         <w:rPr>
@@ -38334,50 +39433,49 @@
             <w:pPr>
               <w:pStyle w:val="Normal"/>
               <w:widowControl w:val="false"/>
-              <w:spacing w:lineRule="auto" w:line="180"/>
-              <w:jc w:val="center"/>
-              <w:rPr>
-                <w:sz w:val="16"/>
-                <w:szCs w:val="16"/>
-              </w:rPr>
-            </w:pPr>
-            <w:r>
-              <w:rPr>
-                <w:sz w:val="16"/>
-                <w:szCs w:val="16"/>
-              </w:rPr>
-            </w:r>
-          </w:p>
-        </w:tc>
-        <w:tc>
-          <w:tcPr>
-            <w:tcW w:w="1016" w:type="dxa"/>
-            <w:tcBorders>
-              <w:top w:val="single" w:sz="4" w:space="0" w:color="000000"/>
-              <w:left w:val="single" w:sz="4" w:space="0" w:color="000000"/>
-              <w:bottom w:val="single" w:sz="4" w:space="0" w:color="000000"/>
-            </w:tcBorders>
-            <w:vAlign w:val="bottom"/>
-          </w:tcPr>
-          <w:p>
-            <w:pPr>
-              <w:pStyle w:val="Normal"/>
-              <w:widowControl w:val="false"/>
-              <w:spacing w:lineRule="auto" w:line="180"/>
-              <w:jc w:val="center"/>
-              <w:rPr>
-                <w:color w:val="000000"/>
-                <w:sz w:val="16"/>
-                <w:szCs w:val="16"/>
-              </w:rPr>
-            </w:pPr>
-            <w:r>
-              <w:rPr>
-                <w:color w:val="000000"/>
-                <w:sz w:val="16"/>
-                <w:szCs w:val="16"/>
-              </w:rPr>
-              <w:t>Alerter/Deadman</w:t>
+              <w:jc w:val="center"/>
+              <w:rPr>
+                <w:rFonts w:ascii="arial" w:hAnsi="arial" w:eastAsia="arial"/>
+                <w:color w:val="000000"/>
+                <w:sz w:val="16"/>
+                <w:szCs w:val="16"/>
+              </w:rPr>
+            </w:pPr>
+            <w:r>
+              <w:rPr>
+                <w:rFonts w:eastAsia="arial" w:ascii="arial" w:hAnsi="arial"/>
+                <w:color w:val="000000"/>
+                <w:sz w:val="16"/>
+                <w:szCs w:val="16"/>
+              </w:rPr>
+              <w:t>Operation Mode DC</w:t>
+            </w:r>
+          </w:p>
+        </w:tc>
+        <w:tc>
+          <w:tcPr>
+            <w:tcW w:w="1016" w:type="dxa"/>
+            <w:tcBorders>
+              <w:top w:val="single" w:sz="4" w:space="0" w:color="000000"/>
+              <w:left w:val="single" w:sz="4" w:space="0" w:color="000000"/>
+              <w:bottom w:val="single" w:sz="4" w:space="0" w:color="000000"/>
+            </w:tcBorders>
+            <w:vAlign w:val="bottom"/>
+          </w:tcPr>
+          <w:p>
+            <w:pPr>
+              <w:pStyle w:val="Normal"/>
+              <w:widowControl w:val="false"/>
+              <w:spacing w:lineRule="auto" w:line="180"/>
+              <w:jc w:val="center"/>
+              <w:rPr>
+                <w:color w:val="000000"/>
+                <w:sz w:val="16"/>
+                <w:szCs w:val="16"/>
+              </w:rPr>
+            </w:pPr>
+            <w:r>
+              <w:rPr/>
             </w:r>
           </w:p>
         </w:tc>
@@ -38409,38 +39507,34 @@
                 <w:sz w:val="16"/>
                 <w:szCs w:val="16"/>
               </w:rPr>
-            </w:r>
-          </w:p>
-        </w:tc>
-        <w:tc>
-          <w:tcPr>
-            <w:tcW w:w="1016" w:type="dxa"/>
-            <w:tcBorders>
-              <w:top w:val="single" w:sz="4" w:space="0" w:color="000000"/>
-              <w:left w:val="single" w:sz="4" w:space="0" w:color="000000"/>
-              <w:bottom w:val="single" w:sz="4" w:space="0" w:color="000000"/>
-            </w:tcBorders>
-            <w:vAlign w:val="bottom"/>
-          </w:tcPr>
-          <w:p>
-            <w:pPr>
-              <w:pStyle w:val="Normal"/>
-              <w:widowControl w:val="false"/>
-              <w:spacing w:lineRule="auto" w:line="180"/>
-              <w:jc w:val="center"/>
-              <w:rPr>
-                <w:color w:val="000000"/>
-                <w:sz w:val="16"/>
-                <w:szCs w:val="16"/>
-              </w:rPr>
-            </w:pPr>
-            <w:r>
-              <w:rPr>
-                <w:color w:val="000000"/>
-                <w:sz w:val="16"/>
-                <w:szCs w:val="16"/>
-              </w:rPr>
-              <w:t>Charge Brake</w:t>
+              <w:t>Panto. Low</w:t>
+            </w:r>
+          </w:p>
+        </w:tc>
+        <w:tc>
+          <w:tcPr>
+            <w:tcW w:w="1016" w:type="dxa"/>
+            <w:tcBorders>
+              <w:top w:val="single" w:sz="4" w:space="0" w:color="000000"/>
+              <w:left w:val="single" w:sz="4" w:space="0" w:color="000000"/>
+              <w:bottom w:val="single" w:sz="4" w:space="0" w:color="000000"/>
+            </w:tcBorders>
+            <w:vAlign w:val="bottom"/>
+          </w:tcPr>
+          <w:p>
+            <w:pPr>
+              <w:pStyle w:val="Normal"/>
+              <w:widowControl w:val="false"/>
+              <w:spacing w:lineRule="auto" w:line="180"/>
+              <w:jc w:val="center"/>
+              <w:rPr>
+                <w:color w:val="000000"/>
+                <w:sz w:val="16"/>
+                <w:szCs w:val="16"/>
+              </w:rPr>
+            </w:pPr>
+            <w:r>
+              <w:rPr/>
             </w:r>
           </w:p>
         </w:tc>
@@ -38494,39 +39588,65 @@
             </w:pPr>
             <w:r>
               <w:rPr>
-                <w:sz w:val="16"/>
-                <w:szCs w:val="16"/>
-              </w:rPr>
-            </w:r>
-          </w:p>
-        </w:tc>
-        <w:tc>
-          <w:tcPr>
-            <w:tcW w:w="1016" w:type="dxa"/>
-            <w:tcBorders>
-              <w:top w:val="single" w:sz="4" w:space="0" w:color="000000"/>
-              <w:left w:val="single" w:sz="4" w:space="0" w:color="000000"/>
-              <w:bottom w:val="single" w:sz="4" w:space="0" w:color="000000"/>
-            </w:tcBorders>
-            <w:vAlign w:val="bottom"/>
-          </w:tcPr>
-          <w:p>
-            <w:pPr>
-              <w:pStyle w:val="Normal"/>
-              <w:widowControl w:val="false"/>
-              <w:spacing w:lineRule="auto" w:line="180"/>
-              <w:jc w:val="center"/>
-              <w:rPr>
-                <w:sz w:val="16"/>
-                <w:szCs w:val="16"/>
-              </w:rPr>
-            </w:pPr>
-            <w:r>
-              <w:rPr>
-                <w:sz w:val="16"/>
-                <w:szCs w:val="16"/>
-              </w:rPr>
-              <w:t>Desk Light Down</w:t>
+                <w:rFonts w:eastAsia="arial" w:ascii="arial" w:hAnsi="arial"/>
+                <w:color w:val="000000"/>
+                <w:sz w:val="16"/>
+                <w:szCs w:val="16"/>
+              </w:rPr>
+              <w:t xml:space="preserve">Snow Brake </w:t>
+            </w:r>
+            <w:r>
+              <w:rPr>
+                <w:rFonts w:eastAsia="arial" w:ascii="arial" w:hAnsi="arial"/>
+                <w:color w:val="000000"/>
+                <w:sz w:val="16"/>
+                <w:szCs w:val="16"/>
+              </w:rPr>
+              <w:t>Off</w:t>
+            </w:r>
+          </w:p>
+        </w:tc>
+        <w:tc>
+          <w:tcPr>
+            <w:tcW w:w="1016" w:type="dxa"/>
+            <w:tcBorders>
+              <w:top w:val="single" w:sz="4" w:space="0" w:color="000000"/>
+              <w:left w:val="single" w:sz="4" w:space="0" w:color="000000"/>
+              <w:bottom w:val="single" w:sz="4" w:space="0" w:color="000000"/>
+            </w:tcBorders>
+            <w:vAlign w:val="bottom"/>
+          </w:tcPr>
+          <w:p>
+            <w:pPr>
+              <w:pStyle w:val="Normal"/>
+              <w:widowControl w:val="false"/>
+              <w:spacing w:lineRule="auto" w:line="180"/>
+              <w:jc w:val="center"/>
+              <w:rPr>
+                <w:sz w:val="16"/>
+                <w:szCs w:val="16"/>
+              </w:rPr>
+            </w:pPr>
+            <w:r>
+              <w:rPr>
+                <w:sz w:val="16"/>
+                <w:szCs w:val="16"/>
+              </w:rPr>
+              <w:t>Gimbal</w:t>
+            </w:r>
+            <w:r>
+              <w:rPr>
+                <w:sz w:val="16"/>
+                <w:szCs w:val="16"/>
+              </w:rPr>
+              <w:t xml:space="preserve"> Light </w:t>
+            </w:r>
+            <w:r>
+              <w:rPr>
+                <w:sz w:val="16"/>
+                <w:szCs w:val="16"/>
+              </w:rPr>
+              <w:t>Dw</w:t>
             </w:r>
           </w:p>
         </w:tc>
@@ -38558,25 +39678,1161 @@
                 <w:sz w:val="16"/>
                 <w:szCs w:val="16"/>
               </w:rPr>
-              <w:t>Gauge Light</w:t>
-            </w:r>
-            <w:r>
-              <w:rPr>
-                <w:rFonts w:eastAsia="arial" w:ascii="arial" w:hAnsi="arial"/>
-                <w:color w:val="000000"/>
-                <w:sz w:val="16"/>
-                <w:szCs w:val="16"/>
-              </w:rPr>
-              <w:t xml:space="preserve"> D</w:t>
-            </w:r>
-            <w:r>
-              <w:rPr>
-                <w:rFonts w:eastAsia="arial" w:ascii="arial" w:hAnsi="arial"/>
-                <w:color w:val="000000"/>
-                <w:sz w:val="16"/>
-                <w:szCs w:val="16"/>
-              </w:rPr>
-              <w:t>w</w:t>
+              <w:t>Gauge Light Dw</w:t>
+            </w:r>
+          </w:p>
+        </w:tc>
+        <w:tc>
+          <w:tcPr>
+            <w:tcW w:w="1016" w:type="dxa"/>
+            <w:tcBorders>
+              <w:top w:val="single" w:sz="4" w:space="0" w:color="000000"/>
+              <w:left w:val="single" w:sz="4" w:space="0" w:color="000000"/>
+              <w:bottom w:val="single" w:sz="4" w:space="0" w:color="000000"/>
+            </w:tcBorders>
+            <w:vAlign w:val="bottom"/>
+          </w:tcPr>
+          <w:p>
+            <w:pPr>
+              <w:pStyle w:val="Normal"/>
+              <w:widowControl w:val="false"/>
+              <w:spacing w:lineRule="auto" w:line="180"/>
+              <w:jc w:val="center"/>
+              <w:rPr>
+                <w:sz w:val="16"/>
+                <w:szCs w:val="16"/>
+              </w:rPr>
+            </w:pPr>
+            <w:r>
+              <w:rPr>
+                <w:rFonts w:eastAsia="arial" w:ascii="arial" w:hAnsi="arial"/>
+                <w:color w:val="000000"/>
+                <w:sz w:val="16"/>
+                <w:szCs w:val="16"/>
+              </w:rPr>
+              <w:t>Indicator Light Dw</w:t>
+            </w:r>
+          </w:p>
+        </w:tc>
+        <w:tc>
+          <w:tcPr>
+            <w:tcW w:w="1016" w:type="dxa"/>
+            <w:tcBorders>
+              <w:top w:val="single" w:sz="4" w:space="0" w:color="000000"/>
+              <w:left w:val="single" w:sz="4" w:space="0" w:color="000000"/>
+              <w:bottom w:val="single" w:sz="4" w:space="0" w:color="000000"/>
+            </w:tcBorders>
+            <w:vAlign w:val="bottom"/>
+          </w:tcPr>
+          <w:p>
+            <w:pPr>
+              <w:pStyle w:val="Normal"/>
+              <w:widowControl w:val="false"/>
+              <w:spacing w:lineRule="auto" w:line="180"/>
+              <w:jc w:val="center"/>
+              <w:rPr>
+                <w:sz w:val="16"/>
+                <w:szCs w:val="16"/>
+              </w:rPr>
+            </w:pPr>
+            <w:r>
+              <w:rPr>
+                <w:color w:val="000000"/>
+                <w:sz w:val="16"/>
+                <w:szCs w:val="16"/>
+              </w:rPr>
+              <w:t>Uncouple</w:t>
+            </w:r>
+          </w:p>
+        </w:tc>
+        <w:tc>
+          <w:tcPr>
+            <w:tcW w:w="1016" w:type="dxa"/>
+            <w:tcBorders>
+              <w:top w:val="single" w:sz="4" w:space="0" w:color="000000"/>
+              <w:left w:val="single" w:sz="4" w:space="0" w:color="000000"/>
+              <w:bottom w:val="single" w:sz="4" w:space="0" w:color="000000"/>
+            </w:tcBorders>
+            <w:vAlign w:val="bottom"/>
+          </w:tcPr>
+          <w:p>
+            <w:pPr>
+              <w:pStyle w:val="Normal"/>
+              <w:widowControl w:val="false"/>
+              <w:spacing w:lineRule="auto" w:line="180"/>
+              <w:jc w:val="center"/>
+              <w:rPr>
+                <w:sz w:val="16"/>
+                <w:szCs w:val="16"/>
+              </w:rPr>
+            </w:pPr>
+            <w:r>
+              <w:rPr>
+                <w:rFonts w:eastAsia="arial" w:ascii="arial" w:hAnsi="arial"/>
+                <w:color w:val="000000"/>
+                <w:sz w:val="16"/>
+                <w:szCs w:val="16"/>
+              </w:rPr>
+              <w:t>Exterior</w:t>
+            </w:r>
+          </w:p>
+          <w:p>
+            <w:pPr>
+              <w:pStyle w:val="Normal"/>
+              <w:widowControl w:val="false"/>
+              <w:spacing w:lineRule="auto" w:line="180"/>
+              <w:jc w:val="center"/>
+              <w:rPr>
+                <w:sz w:val="16"/>
+                <w:szCs w:val="16"/>
+              </w:rPr>
+            </w:pPr>
+            <w:r>
+              <w:rPr>
+                <w:rFonts w:eastAsia="arial" w:ascii="arial" w:hAnsi="arial"/>
+                <w:color w:val="000000"/>
+                <w:sz w:val="16"/>
+                <w:szCs w:val="16"/>
+              </w:rPr>
+              <w:t>Camera</w:t>
+            </w:r>
+          </w:p>
+        </w:tc>
+        <w:tc>
+          <w:tcPr>
+            <w:tcW w:w="1029" w:type="dxa"/>
+            <w:tcBorders>
+              <w:top w:val="single" w:sz="4" w:space="0" w:color="000000"/>
+              <w:left w:val="single" w:sz="4" w:space="0" w:color="000000"/>
+              <w:bottom w:val="single" w:sz="4" w:space="0" w:color="000000"/>
+              <w:right w:val="single" w:sz="4" w:space="0" w:color="000000"/>
+            </w:tcBorders>
+            <w:vAlign w:val="bottom"/>
+          </w:tcPr>
+          <w:p>
+            <w:pPr>
+              <w:pStyle w:val="Normal"/>
+              <w:widowControl w:val="false"/>
+              <w:spacing w:lineRule="auto" w:line="180"/>
+              <w:jc w:val="center"/>
+              <w:rPr>
+                <w:sz w:val="16"/>
+                <w:szCs w:val="16"/>
+              </w:rPr>
+            </w:pPr>
+            <w:r>
+              <w:rPr>
+                <w:rFonts w:eastAsia="arial" w:ascii="arial" w:hAnsi="arial"/>
+                <w:color w:val="000000"/>
+                <w:sz w:val="16"/>
+                <w:szCs w:val="16"/>
+              </w:rPr>
+              <w:t>Prev</w:t>
+            </w:r>
+          </w:p>
+          <w:p>
+            <w:pPr>
+              <w:pStyle w:val="Normal"/>
+              <w:widowControl w:val="false"/>
+              <w:spacing w:lineRule="auto" w:line="180"/>
+              <w:jc w:val="center"/>
+              <w:rPr>
+                <w:sz w:val="16"/>
+                <w:szCs w:val="16"/>
+              </w:rPr>
+            </w:pPr>
+            <w:r>
+              <w:rPr>
+                <w:rFonts w:eastAsia="arial" w:ascii="arial" w:hAnsi="arial"/>
+                <w:color w:val="000000"/>
+                <w:sz w:val="16"/>
+                <w:szCs w:val="16"/>
+              </w:rPr>
+              <w:t>Cab Cam</w:t>
+            </w:r>
+          </w:p>
+        </w:tc>
+      </w:tr>
+    </w:tbl>
+    <w:p>
+      <w:pPr>
+        <w:pStyle w:val="Normal"/>
+        <w:bidi w:val="0"/>
+        <w:rPr>
+          <w:color w:val="000000"/>
+          <w:sz w:val="16"/>
+          <w:szCs w:val="16"/>
+        </w:rPr>
+      </w:pPr>
+      <w:r>
+        <w:rPr>
+          <w:color w:val="000000"/>
+          <w:sz w:val="16"/>
+          <w:szCs w:val="16"/>
+        </w:rPr>
+      </w:r>
+    </w:p>
+    <w:p>
+      <w:pPr>
+        <w:pStyle w:val="Normal"/>
+        <w:rPr>
+          <w:color w:val="000000"/>
+          <w:sz w:val="16"/>
+          <w:szCs w:val="16"/>
+        </w:rPr>
+      </w:pPr>
+      <w:r>
+        <w:rPr>
+          <w:color w:val="000000"/>
+          <w:sz w:val="16"/>
+          <w:szCs w:val="16"/>
+        </w:rPr>
+        <w:tab/>
+        <w:t xml:space="preserve">       </w:t>
+      </w:r>
+      <w:r>
+        <w:rPr>
+          <w:rFonts w:eastAsia="arial" w:ascii="arial" w:hAnsi="arial"/>
+          <w:color w:val="000000"/>
+          <w:sz w:val="16"/>
+          <w:szCs w:val="16"/>
+        </w:rPr>
+        <w:t xml:space="preserve">    M</w:t>
+      </w:r>
+      <w:r>
+        <w:rPr>
+          <w:rFonts w:eastAsia="arial" w:ascii="arial" w:hAnsi="arial"/>
+          <w:color w:val="000000"/>
+          <w:sz w:val="16"/>
+          <w:szCs w:val="16"/>
+        </w:rPr>
+        <w:t>9</w:t>
+      </w:r>
+      <w:r>
+        <w:rPr>
+          <w:rFonts w:eastAsia="arial" w:ascii="arial" w:hAnsi="arial"/>
+          <w:color w:val="000000"/>
+          <w:sz w:val="16"/>
+          <w:szCs w:val="16"/>
+        </w:rPr>
+        <w:t>-1</w:t>
+      </w:r>
+    </w:p>
+    <w:tbl>
+      <w:tblPr>
+        <w:tblW w:w="14248" w:type="dxa"/>
+        <w:jc w:val="left"/>
+        <w:tblInd w:w="-5" w:type="dxa"/>
+        <w:tblLayout w:type="fixed"/>
+        <w:tblCellMar>
+          <w:top w:w="0" w:type="dxa"/>
+          <w:left w:w="108" w:type="dxa"/>
+          <w:bottom w:w="0" w:type="dxa"/>
+          <w:right w:w="108" w:type="dxa"/>
+        </w:tblCellMar>
+        <w:tblLook w:firstRow="1" w:noVBand="1" w:lastRow="0" w:firstColumn="1" w:lastColumn="0" w:noHBand="0" w:val="04a0"/>
+      </w:tblPr>
+      <w:tblGrid>
+        <w:gridCol w:w="1017"/>
+        <w:gridCol w:w="1019"/>
+        <w:gridCol w:w="1014"/>
+        <w:gridCol w:w="1016"/>
+        <w:gridCol w:w="1020"/>
+        <w:gridCol w:w="1016"/>
+        <w:gridCol w:w="1016"/>
+        <w:gridCol w:w="1017"/>
+        <w:gridCol w:w="1016"/>
+        <w:gridCol w:w="1020"/>
+        <w:gridCol w:w="1016"/>
+        <w:gridCol w:w="1016"/>
+        <w:gridCol w:w="1016"/>
+        <w:gridCol w:w="1029"/>
+      </w:tblGrid>
+      <w:tr>
+        <w:trPr>
+          <w:trHeight w:val="440" w:hRule="exact"/>
+          <w:cantSplit w:val="true"/>
+        </w:trPr>
+        <w:tc>
+          <w:tcPr>
+            <w:tcW w:w="1017" w:type="dxa"/>
+            <w:tcBorders>
+              <w:top w:val="single" w:sz="4" w:space="0" w:color="000000"/>
+              <w:left w:val="single" w:sz="4" w:space="0" w:color="000000"/>
+              <w:bottom w:val="single" w:sz="4" w:space="0" w:color="000000"/>
+            </w:tcBorders>
+            <w:vAlign w:val="bottom"/>
+          </w:tcPr>
+          <w:p>
+            <w:pPr>
+              <w:pStyle w:val="Normal"/>
+              <w:widowControl w:val="false"/>
+              <w:spacing w:lineRule="auto" w:line="180" w:before="0" w:after="60"/>
+              <w:jc w:val="center"/>
+              <w:rPr>
+                <w:color w:val="000000"/>
+                <w:sz w:val="16"/>
+                <w:szCs w:val="16"/>
+              </w:rPr>
+            </w:pPr>
+            <w:r>
+              <w:rPr>
+                <w:rFonts w:eastAsia="arial" w:ascii="arial" w:hAnsi="arial"/>
+                <w:b/>
+                <w:color w:val="000000"/>
+                <w:sz w:val="16"/>
+                <w:szCs w:val="16"/>
+              </w:rPr>
+              <w:t>Pause</w:t>
+            </w:r>
+          </w:p>
+        </w:tc>
+        <w:tc>
+          <w:tcPr>
+            <w:tcW w:w="1019" w:type="dxa"/>
+            <w:tcBorders>
+              <w:top w:val="single" w:sz="4" w:space="0" w:color="000000"/>
+              <w:left w:val="single" w:sz="4" w:space="0" w:color="000000"/>
+              <w:bottom w:val="single" w:sz="4" w:space="0" w:color="000000"/>
+            </w:tcBorders>
+            <w:vAlign w:val="bottom"/>
+          </w:tcPr>
+          <w:p>
+            <w:pPr>
+              <w:pStyle w:val="Normal"/>
+              <w:widowControl w:val="false"/>
+              <w:jc w:val="center"/>
+              <w:rPr>
+                <w:rFonts w:ascii="arial" w:hAnsi="arial" w:eastAsia="arial"/>
+                <w:color w:val="000000"/>
+                <w:sz w:val="16"/>
+                <w:szCs w:val="16"/>
+              </w:rPr>
+            </w:pPr>
+            <w:r>
+              <w:rPr>
+                <w:rFonts w:eastAsia="arial" w:ascii="arial" w:hAnsi="arial"/>
+                <w:color w:val="000000"/>
+                <w:sz w:val="16"/>
+                <w:szCs w:val="16"/>
+              </w:rPr>
+              <w:t>Master Key</w:t>
+            </w:r>
+          </w:p>
+        </w:tc>
+        <w:tc>
+          <w:tcPr>
+            <w:tcW w:w="1014" w:type="dxa"/>
+            <w:tcBorders>
+              <w:top w:val="single" w:sz="4" w:space="0" w:color="000000"/>
+              <w:left w:val="single" w:sz="4" w:space="0" w:color="000000"/>
+              <w:bottom w:val="single" w:sz="4" w:space="0" w:color="000000"/>
+            </w:tcBorders>
+            <w:vAlign w:val="bottom"/>
+          </w:tcPr>
+          <w:p>
+            <w:pPr>
+              <w:pStyle w:val="Normal"/>
+              <w:widowControl w:val="false"/>
+              <w:jc w:val="center"/>
+              <w:rPr>
+                <w:rFonts w:ascii="arial" w:hAnsi="arial" w:eastAsia="arial"/>
+                <w:color w:val="000000"/>
+                <w:sz w:val="16"/>
+                <w:szCs w:val="16"/>
+              </w:rPr>
+            </w:pPr>
+            <w:r>
+              <w:rPr>
+                <w:rFonts w:eastAsia="arial" w:ascii="arial" w:hAnsi="arial"/>
+                <w:color w:val="000000"/>
+                <w:sz w:val="16"/>
+                <w:szCs w:val="16"/>
+              </w:rPr>
+            </w:r>
+          </w:p>
+        </w:tc>
+        <w:tc>
+          <w:tcPr>
+            <w:tcW w:w="1016" w:type="dxa"/>
+            <w:tcBorders>
+              <w:top w:val="single" w:sz="4" w:space="0" w:color="000000"/>
+              <w:left w:val="single" w:sz="4" w:space="0" w:color="000000"/>
+              <w:bottom w:val="single" w:sz="4" w:space="0" w:color="000000"/>
+            </w:tcBorders>
+            <w:vAlign w:val="bottom"/>
+          </w:tcPr>
+          <w:p>
+            <w:pPr>
+              <w:pStyle w:val="Normal"/>
+              <w:widowControl w:val="false"/>
+              <w:spacing w:lineRule="auto" w:line="180"/>
+              <w:jc w:val="center"/>
+              <w:rPr>
+                <w:color w:val="000000"/>
+                <w:sz w:val="16"/>
+                <w:szCs w:val="16"/>
+              </w:rPr>
+            </w:pPr>
+            <w:r>
+              <w:rPr/>
+            </w:r>
+          </w:p>
+        </w:tc>
+        <w:tc>
+          <w:tcPr>
+            <w:tcW w:w="1020" w:type="dxa"/>
+            <w:tcBorders>
+              <w:top w:val="single" w:sz="4" w:space="0" w:color="000000"/>
+              <w:left w:val="single" w:sz="4" w:space="0" w:color="000000"/>
+              <w:bottom w:val="single" w:sz="4" w:space="0" w:color="000000"/>
+            </w:tcBorders>
+            <w:vAlign w:val="bottom"/>
+          </w:tcPr>
+          <w:p>
+            <w:pPr>
+              <w:pStyle w:val="Normal"/>
+              <w:widowControl w:val="false"/>
+              <w:spacing w:lineRule="auto" w:line="180"/>
+              <w:jc w:val="center"/>
+              <w:rPr>
+                <w:color w:val="000000"/>
+                <w:sz w:val="16"/>
+                <w:szCs w:val="16"/>
+              </w:rPr>
+            </w:pPr>
+            <w:r>
+              <w:rPr>
+                <w:color w:val="000000"/>
+                <w:sz w:val="16"/>
+                <w:szCs w:val="16"/>
+              </w:rPr>
+            </w:r>
+          </w:p>
+        </w:tc>
+        <w:tc>
+          <w:tcPr>
+            <w:tcW w:w="1016" w:type="dxa"/>
+            <w:tcBorders>
+              <w:top w:val="single" w:sz="4" w:space="0" w:color="000000"/>
+              <w:left w:val="single" w:sz="4" w:space="0" w:color="000000"/>
+              <w:bottom w:val="single" w:sz="4" w:space="0" w:color="000000"/>
+            </w:tcBorders>
+            <w:vAlign w:val="bottom"/>
+          </w:tcPr>
+          <w:p>
+            <w:pPr>
+              <w:pStyle w:val="Normal"/>
+              <w:widowControl w:val="false"/>
+              <w:spacing w:lineRule="auto" w:line="180"/>
+              <w:jc w:val="center"/>
+              <w:rPr>
+                <w:color w:val="000000"/>
+                <w:sz w:val="16"/>
+                <w:szCs w:val="16"/>
+              </w:rPr>
+            </w:pPr>
+            <w:r>
+              <w:rPr>
+                <w:color w:val="000000"/>
+                <w:sz w:val="16"/>
+                <w:szCs w:val="16"/>
+              </w:rPr>
+            </w:r>
+          </w:p>
+        </w:tc>
+        <w:tc>
+          <w:tcPr>
+            <w:tcW w:w="1016" w:type="dxa"/>
+            <w:tcBorders>
+              <w:top w:val="single" w:sz="4" w:space="0" w:color="000000"/>
+              <w:left w:val="single" w:sz="4" w:space="0" w:color="000000"/>
+              <w:bottom w:val="single" w:sz="4" w:space="0" w:color="000000"/>
+            </w:tcBorders>
+            <w:vAlign w:val="bottom"/>
+          </w:tcPr>
+          <w:p>
+            <w:pPr>
+              <w:pStyle w:val="Normal"/>
+              <w:widowControl w:val="false"/>
+              <w:jc w:val="center"/>
+              <w:rPr>
+                <w:color w:val="000000"/>
+                <w:sz w:val="16"/>
+                <w:szCs w:val="16"/>
+              </w:rPr>
+            </w:pPr>
+            <w:r>
+              <w:rPr>
+                <w:color w:val="000000"/>
+                <w:sz w:val="16"/>
+                <w:szCs w:val="16"/>
+              </w:rPr>
+              <w:t>Buzzer</w:t>
+            </w:r>
+          </w:p>
+        </w:tc>
+        <w:tc>
+          <w:tcPr>
+            <w:tcW w:w="1017" w:type="dxa"/>
+            <w:tcBorders>
+              <w:top w:val="single" w:sz="4" w:space="0" w:color="000000"/>
+              <w:left w:val="single" w:sz="4" w:space="0" w:color="000000"/>
+              <w:bottom w:val="single" w:sz="4" w:space="0" w:color="000000"/>
+            </w:tcBorders>
+            <w:vAlign w:val="bottom"/>
+          </w:tcPr>
+          <w:p>
+            <w:pPr>
+              <w:pStyle w:val="Normal"/>
+              <w:widowControl w:val="false"/>
+              <w:jc w:val="center"/>
+              <w:rPr>
+                <w:color w:val="000000"/>
+                <w:sz w:val="16"/>
+                <w:szCs w:val="16"/>
+              </w:rPr>
+            </w:pPr>
+            <w:r>
+              <w:rPr>
+                <w:rFonts w:eastAsia="arial" w:ascii="arial" w:hAnsi="arial"/>
+                <w:color w:val="000000"/>
+                <w:sz w:val="16"/>
+                <w:szCs w:val="16"/>
+              </w:rPr>
+              <w:t>Snow Brake</w:t>
+            </w:r>
+          </w:p>
+        </w:tc>
+        <w:tc>
+          <w:tcPr>
+            <w:tcW w:w="1016" w:type="dxa"/>
+            <w:tcBorders>
+              <w:top w:val="single" w:sz="4" w:space="0" w:color="000000"/>
+              <w:left w:val="single" w:sz="4" w:space="0" w:color="000000"/>
+              <w:bottom w:val="single" w:sz="4" w:space="0" w:color="000000"/>
+            </w:tcBorders>
+            <w:vAlign w:val="bottom"/>
+          </w:tcPr>
+          <w:p>
+            <w:pPr>
+              <w:pStyle w:val="Normal"/>
+              <w:widowControl w:val="false"/>
+              <w:spacing w:lineRule="auto" w:line="180"/>
+              <w:jc w:val="center"/>
+              <w:rPr>
+                <w:sz w:val="16"/>
+                <w:szCs w:val="16"/>
+              </w:rPr>
+            </w:pPr>
+            <w:r>
+              <w:rPr>
+                <w:sz w:val="16"/>
+                <w:szCs w:val="16"/>
+              </w:rPr>
+              <w:t xml:space="preserve">Desk </w:t>
+            </w:r>
+            <w:r>
+              <w:rPr>
+                <w:sz w:val="16"/>
+                <w:szCs w:val="16"/>
+              </w:rPr>
+              <w:t>Light Up</w:t>
+            </w:r>
+          </w:p>
+        </w:tc>
+        <w:tc>
+          <w:tcPr>
+            <w:tcW w:w="1020" w:type="dxa"/>
+            <w:tcBorders>
+              <w:top w:val="single" w:sz="4" w:space="0" w:color="000000"/>
+              <w:left w:val="single" w:sz="4" w:space="0" w:color="000000"/>
+              <w:bottom w:val="single" w:sz="4" w:space="0" w:color="000000"/>
+            </w:tcBorders>
+            <w:vAlign w:val="bottom"/>
+          </w:tcPr>
+          <w:p>
+            <w:pPr>
+              <w:pStyle w:val="Normal"/>
+              <w:widowControl w:val="false"/>
+              <w:spacing w:lineRule="auto" w:line="180"/>
+              <w:jc w:val="center"/>
+              <w:rPr>
+                <w:sz w:val="16"/>
+                <w:szCs w:val="16"/>
+              </w:rPr>
+            </w:pPr>
+            <w:r>
+              <w:rPr>
+                <w:sz w:val="16"/>
+                <w:szCs w:val="16"/>
+              </w:rPr>
+              <w:t>Gauge Light Up</w:t>
+            </w:r>
+          </w:p>
+        </w:tc>
+        <w:tc>
+          <w:tcPr>
+            <w:tcW w:w="1016" w:type="dxa"/>
+            <w:tcBorders>
+              <w:top w:val="single" w:sz="4" w:space="0" w:color="000000"/>
+              <w:left w:val="single" w:sz="4" w:space="0" w:color="000000"/>
+              <w:bottom w:val="single" w:sz="4" w:space="0" w:color="000000"/>
+            </w:tcBorders>
+            <w:vAlign w:val="bottom"/>
+          </w:tcPr>
+          <w:p>
+            <w:pPr>
+              <w:pStyle w:val="Normal"/>
+              <w:widowControl w:val="false"/>
+              <w:spacing w:lineRule="auto" w:line="180"/>
+              <w:jc w:val="center"/>
+              <w:rPr>
+                <w:sz w:val="16"/>
+                <w:szCs w:val="16"/>
+              </w:rPr>
+            </w:pPr>
+            <w:r>
+              <w:rPr>
+                <w:rFonts w:eastAsia="arial" w:ascii="arial" w:hAnsi="arial"/>
+                <w:color w:val="000000"/>
+                <w:sz w:val="16"/>
+                <w:szCs w:val="16"/>
+              </w:rPr>
+              <w:t>Marker Light On</w:t>
+            </w:r>
+          </w:p>
+        </w:tc>
+        <w:tc>
+          <w:tcPr>
+            <w:tcW w:w="1016" w:type="dxa"/>
+            <w:tcBorders>
+              <w:top w:val="single" w:sz="4" w:space="0" w:color="000000"/>
+              <w:left w:val="single" w:sz="4" w:space="0" w:color="000000"/>
+              <w:bottom w:val="single" w:sz="4" w:space="0" w:color="000000"/>
+            </w:tcBorders>
+            <w:vAlign w:val="bottom"/>
+          </w:tcPr>
+          <w:p>
+            <w:pPr>
+              <w:pStyle w:val="Normal"/>
+              <w:widowControl w:val="false"/>
+              <w:spacing w:lineRule="auto" w:line="180"/>
+              <w:jc w:val="center"/>
+              <w:rPr>
+                <w:sz w:val="16"/>
+                <w:szCs w:val="16"/>
+              </w:rPr>
+            </w:pPr>
+            <w:r>
+              <w:rPr>
+                <w:sz w:val="16"/>
+                <w:szCs w:val="16"/>
+              </w:rPr>
+              <w:t xml:space="preserve">Cab Light </w:t>
+            </w:r>
+            <w:r>
+              <w:rPr>
+                <w:sz w:val="16"/>
+                <w:szCs w:val="16"/>
+              </w:rPr>
+              <w:t>On</w:t>
+            </w:r>
+          </w:p>
+        </w:tc>
+        <w:tc>
+          <w:tcPr>
+            <w:tcW w:w="1016" w:type="dxa"/>
+            <w:tcBorders>
+              <w:top w:val="single" w:sz="4" w:space="0" w:color="000000"/>
+              <w:left w:val="single" w:sz="4" w:space="0" w:color="000000"/>
+              <w:bottom w:val="single" w:sz="4" w:space="0" w:color="000000"/>
+            </w:tcBorders>
+            <w:vAlign w:val="bottom"/>
+          </w:tcPr>
+          <w:p>
+            <w:pPr>
+              <w:pStyle w:val="Normal"/>
+              <w:widowControl w:val="false"/>
+              <w:spacing w:lineRule="auto" w:line="180"/>
+              <w:jc w:val="center"/>
+              <w:rPr>
+                <w:sz w:val="16"/>
+                <w:szCs w:val="16"/>
+              </w:rPr>
+            </w:pPr>
+            <w:r>
+              <w:rPr>
+                <w:rFonts w:eastAsia="arial" w:ascii="arial" w:hAnsi="arial"/>
+                <w:color w:val="000000"/>
+                <w:sz w:val="16"/>
+                <w:szCs w:val="16"/>
+              </w:rPr>
+              <w:t>1-Person</w:t>
+            </w:r>
+          </w:p>
+        </w:tc>
+        <w:tc>
+          <w:tcPr>
+            <w:tcW w:w="1029" w:type="dxa"/>
+            <w:tcBorders>
+              <w:top w:val="single" w:sz="4" w:space="0" w:color="000000"/>
+              <w:left w:val="single" w:sz="4" w:space="0" w:color="000000"/>
+              <w:bottom w:val="single" w:sz="4" w:space="0" w:color="000000"/>
+              <w:right w:val="single" w:sz="4" w:space="0" w:color="000000"/>
+            </w:tcBorders>
+            <w:vAlign w:val="bottom"/>
+          </w:tcPr>
+          <w:p>
+            <w:pPr>
+              <w:pStyle w:val="Normal"/>
+              <w:widowControl w:val="false"/>
+              <w:spacing w:lineRule="auto" w:line="180"/>
+              <w:jc w:val="center"/>
+              <w:rPr>
+                <w:sz w:val="16"/>
+                <w:szCs w:val="16"/>
+              </w:rPr>
+            </w:pPr>
+            <w:r>
+              <w:rPr>
+                <w:rFonts w:eastAsia="arial" w:ascii="arial" w:hAnsi="arial"/>
+                <w:color w:val="000000"/>
+                <w:sz w:val="16"/>
+                <w:szCs w:val="16"/>
+              </w:rPr>
+              <w:t>Next</w:t>
+            </w:r>
+          </w:p>
+          <w:p>
+            <w:pPr>
+              <w:pStyle w:val="Normal"/>
+              <w:widowControl w:val="false"/>
+              <w:spacing w:lineRule="auto" w:line="180"/>
+              <w:jc w:val="center"/>
+              <w:rPr>
+                <w:sz w:val="16"/>
+                <w:szCs w:val="16"/>
+              </w:rPr>
+            </w:pPr>
+            <w:r>
+              <w:rPr>
+                <w:rFonts w:eastAsia="arial" w:ascii="arial" w:hAnsi="arial"/>
+                <w:color w:val="000000"/>
+                <w:sz w:val="16"/>
+                <w:szCs w:val="16"/>
+              </w:rPr>
+              <w:t>Cab Cam</w:t>
+            </w:r>
+          </w:p>
+        </w:tc>
+      </w:tr>
+    </w:tbl>
+    <w:p>
+      <w:pPr>
+        <w:pStyle w:val="Normal"/>
+        <w:rPr>
+          <w:color w:val="000000"/>
+          <w:sz w:val="16"/>
+          <w:szCs w:val="16"/>
+        </w:rPr>
+      </w:pPr>
+      <w:r>
+        <w:rPr>
+          <w:color w:val="000000"/>
+          <w:sz w:val="16"/>
+          <w:szCs w:val="16"/>
+        </w:rPr>
+      </w:r>
+    </w:p>
+    <w:p>
+      <w:pPr>
+        <w:pStyle w:val="Normal"/>
+        <w:rPr>
+          <w:color w:val="000000"/>
+          <w:sz w:val="16"/>
+          <w:szCs w:val="16"/>
+        </w:rPr>
+      </w:pPr>
+      <w:r>
+        <w:rPr>
+          <w:rFonts w:eastAsia="arial" w:ascii="arial" w:hAnsi="arial"/>
+          <w:color w:val="000000"/>
+          <w:sz w:val="16"/>
+          <w:szCs w:val="16"/>
+        </w:rPr>
+        <w:tab/>
+        <w:t xml:space="preserve">           M</w:t>
+      </w:r>
+      <w:r>
+        <w:rPr>
+          <w:rFonts w:eastAsia="arial" w:ascii="arial" w:hAnsi="arial"/>
+          <w:color w:val="000000"/>
+          <w:sz w:val="16"/>
+          <w:szCs w:val="16"/>
+        </w:rPr>
+        <w:t>9</w:t>
+      </w:r>
+      <w:r>
+        <w:rPr>
+          <w:rFonts w:eastAsia="arial" w:ascii="arial" w:hAnsi="arial"/>
+          <w:color w:val="000000"/>
+          <w:sz w:val="16"/>
+          <w:szCs w:val="16"/>
+        </w:rPr>
+        <w:t>-2</w:t>
+      </w:r>
+    </w:p>
+    <w:tbl>
+      <w:tblPr>
+        <w:tblW w:w="14248" w:type="dxa"/>
+        <w:jc w:val="left"/>
+        <w:tblInd w:w="-5" w:type="dxa"/>
+        <w:tblLayout w:type="fixed"/>
+        <w:tblCellMar>
+          <w:top w:w="0" w:type="dxa"/>
+          <w:left w:w="108" w:type="dxa"/>
+          <w:bottom w:w="0" w:type="dxa"/>
+          <w:right w:w="108" w:type="dxa"/>
+        </w:tblCellMar>
+        <w:tblLook w:firstRow="1" w:noVBand="1" w:lastRow="0" w:firstColumn="1" w:lastColumn="0" w:noHBand="0" w:val="04a0"/>
+      </w:tblPr>
+      <w:tblGrid>
+        <w:gridCol w:w="1017"/>
+        <w:gridCol w:w="1019"/>
+        <w:gridCol w:w="1014"/>
+        <w:gridCol w:w="1016"/>
+        <w:gridCol w:w="1020"/>
+        <w:gridCol w:w="1016"/>
+        <w:gridCol w:w="1016"/>
+        <w:gridCol w:w="1017"/>
+        <w:gridCol w:w="1016"/>
+        <w:gridCol w:w="1020"/>
+        <w:gridCol w:w="1016"/>
+        <w:gridCol w:w="1016"/>
+        <w:gridCol w:w="1016"/>
+        <w:gridCol w:w="1029"/>
+      </w:tblGrid>
+      <w:tr>
+        <w:trPr>
+          <w:trHeight w:val="440" w:hRule="exact"/>
+          <w:cantSplit w:val="true"/>
+        </w:trPr>
+        <w:tc>
+          <w:tcPr>
+            <w:tcW w:w="1017" w:type="dxa"/>
+            <w:tcBorders>
+              <w:top w:val="single" w:sz="4" w:space="0" w:color="000000"/>
+              <w:left w:val="single" w:sz="4" w:space="0" w:color="000000"/>
+              <w:bottom w:val="single" w:sz="4" w:space="0" w:color="000000"/>
+            </w:tcBorders>
+            <w:vAlign w:val="bottom"/>
+          </w:tcPr>
+          <w:p>
+            <w:pPr>
+              <w:pStyle w:val="Normal"/>
+              <w:widowControl w:val="false"/>
+              <w:spacing w:lineRule="auto" w:line="180" w:before="0" w:after="60"/>
+              <w:jc w:val="center"/>
+              <w:rPr>
+                <w:b/>
+                <w:bCs/>
+              </w:rPr>
+            </w:pPr>
+            <w:r>
+              <w:rPr>
+                <w:b/>
+                <w:bCs/>
+                <w:color w:val="000000"/>
+                <w:sz w:val="16"/>
+                <w:szCs w:val="16"/>
+              </w:rPr>
+              <w:t>HUD</w:t>
+            </w:r>
+          </w:p>
+        </w:tc>
+        <w:tc>
+          <w:tcPr>
+            <w:tcW w:w="1019" w:type="dxa"/>
+            <w:tcBorders>
+              <w:top w:val="single" w:sz="4" w:space="0" w:color="000000"/>
+              <w:left w:val="single" w:sz="4" w:space="0" w:color="000000"/>
+              <w:bottom w:val="single" w:sz="4" w:space="0" w:color="000000"/>
+            </w:tcBorders>
+            <w:vAlign w:val="bottom"/>
+          </w:tcPr>
+          <w:p>
+            <w:pPr>
+              <w:pStyle w:val="Normal"/>
+              <w:widowControl w:val="false"/>
+              <w:spacing w:lineRule="auto" w:line="180"/>
+              <w:jc w:val="center"/>
+              <w:rPr>
+                <w:color w:val="000000"/>
+                <w:sz w:val="16"/>
+                <w:szCs w:val="16"/>
+              </w:rPr>
+            </w:pPr>
+            <w:r>
+              <w:rPr>
+                <w:color w:val="000000"/>
+                <w:sz w:val="16"/>
+                <w:szCs w:val="16"/>
+              </w:rPr>
+              <w:t>Schedule</w:t>
+            </w:r>
+          </w:p>
+        </w:tc>
+        <w:tc>
+          <w:tcPr>
+            <w:tcW w:w="1014" w:type="dxa"/>
+            <w:tcBorders>
+              <w:top w:val="single" w:sz="4" w:space="0" w:color="000000"/>
+              <w:left w:val="single" w:sz="4" w:space="0" w:color="000000"/>
+              <w:bottom w:val="single" w:sz="4" w:space="0" w:color="000000"/>
+            </w:tcBorders>
+            <w:vAlign w:val="bottom"/>
+          </w:tcPr>
+          <w:p>
+            <w:pPr>
+              <w:pStyle w:val="Normal"/>
+              <w:widowControl w:val="false"/>
+              <w:jc w:val="center"/>
+              <w:rPr>
+                <w:rFonts w:ascii="arial" w:hAnsi="arial" w:eastAsia="arial"/>
+                <w:color w:val="000000"/>
+                <w:sz w:val="16"/>
+                <w:szCs w:val="16"/>
+              </w:rPr>
+            </w:pPr>
+            <w:r>
+              <w:rPr>
+                <w:rFonts w:eastAsia="arial" w:ascii="arial" w:hAnsi="arial"/>
+                <w:color w:val="000000"/>
+                <w:sz w:val="16"/>
+                <w:szCs w:val="16"/>
+              </w:rPr>
+            </w:r>
+          </w:p>
+        </w:tc>
+        <w:tc>
+          <w:tcPr>
+            <w:tcW w:w="1016" w:type="dxa"/>
+            <w:tcBorders>
+              <w:top w:val="single" w:sz="4" w:space="0" w:color="000000"/>
+              <w:left w:val="single" w:sz="4" w:space="0" w:color="000000"/>
+              <w:bottom w:val="single" w:sz="4" w:space="0" w:color="000000"/>
+            </w:tcBorders>
+            <w:vAlign w:val="bottom"/>
+          </w:tcPr>
+          <w:p>
+            <w:pPr>
+              <w:pStyle w:val="Normal"/>
+              <w:widowControl w:val="false"/>
+              <w:spacing w:lineRule="auto" w:line="180"/>
+              <w:jc w:val="center"/>
+              <w:rPr>
+                <w:color w:val="000000"/>
+                <w:sz w:val="16"/>
+                <w:szCs w:val="16"/>
+              </w:rPr>
+            </w:pPr>
+            <w:r>
+              <w:rPr/>
+            </w:r>
+          </w:p>
+        </w:tc>
+        <w:tc>
+          <w:tcPr>
+            <w:tcW w:w="1020" w:type="dxa"/>
+            <w:tcBorders>
+              <w:top w:val="single" w:sz="4" w:space="0" w:color="000000"/>
+              <w:left w:val="single" w:sz="4" w:space="0" w:color="000000"/>
+              <w:bottom w:val="single" w:sz="4" w:space="0" w:color="000000"/>
+            </w:tcBorders>
+            <w:vAlign w:val="bottom"/>
+          </w:tcPr>
+          <w:p>
+            <w:pPr>
+              <w:pStyle w:val="Normal"/>
+              <w:widowControl w:val="false"/>
+              <w:spacing w:lineRule="auto" w:line="180"/>
+              <w:jc w:val="center"/>
+              <w:rPr>
+                <w:color w:val="000000"/>
+                <w:sz w:val="16"/>
+                <w:szCs w:val="16"/>
+              </w:rPr>
+            </w:pPr>
+            <w:r>
+              <w:rPr>
+                <w:color w:val="000000"/>
+                <w:sz w:val="16"/>
+                <w:szCs w:val="16"/>
+              </w:rPr>
+            </w:r>
+          </w:p>
+        </w:tc>
+        <w:tc>
+          <w:tcPr>
+            <w:tcW w:w="1016" w:type="dxa"/>
+            <w:tcBorders>
+              <w:top w:val="single" w:sz="4" w:space="0" w:color="000000"/>
+              <w:left w:val="single" w:sz="4" w:space="0" w:color="000000"/>
+              <w:bottom w:val="single" w:sz="4" w:space="0" w:color="000000"/>
+            </w:tcBorders>
+            <w:vAlign w:val="bottom"/>
+          </w:tcPr>
+          <w:p>
+            <w:pPr>
+              <w:pStyle w:val="Normal"/>
+              <w:widowControl w:val="false"/>
+              <w:spacing w:lineRule="auto" w:line="180"/>
+              <w:jc w:val="center"/>
+              <w:rPr>
+                <w:color w:val="000000"/>
+                <w:sz w:val="16"/>
+                <w:szCs w:val="16"/>
+              </w:rPr>
+            </w:pPr>
+            <w:r>
+              <w:rPr/>
+            </w:r>
+          </w:p>
+        </w:tc>
+        <w:tc>
+          <w:tcPr>
+            <w:tcW w:w="1016" w:type="dxa"/>
+            <w:tcBorders>
+              <w:top w:val="single" w:sz="4" w:space="0" w:color="000000"/>
+              <w:left w:val="single" w:sz="4" w:space="0" w:color="000000"/>
+              <w:bottom w:val="single" w:sz="4" w:space="0" w:color="000000"/>
+            </w:tcBorders>
+            <w:vAlign w:val="bottom"/>
+          </w:tcPr>
+          <w:p>
+            <w:pPr>
+              <w:pStyle w:val="Normal"/>
+              <w:widowControl w:val="false"/>
+              <w:jc w:val="center"/>
+              <w:rPr>
+                <w:sz w:val="16"/>
+                <w:szCs w:val="16"/>
+              </w:rPr>
+            </w:pPr>
+            <w:r>
+              <w:rPr>
+                <w:sz w:val="16"/>
+                <w:szCs w:val="16"/>
+              </w:rPr>
+            </w:r>
+          </w:p>
+        </w:tc>
+        <w:tc>
+          <w:tcPr>
+            <w:tcW w:w="1017" w:type="dxa"/>
+            <w:tcBorders>
+              <w:top w:val="single" w:sz="4" w:space="0" w:color="000000"/>
+              <w:left w:val="single" w:sz="4" w:space="0" w:color="000000"/>
+              <w:bottom w:val="single" w:sz="4" w:space="0" w:color="000000"/>
+            </w:tcBorders>
+            <w:vAlign w:val="bottom"/>
+          </w:tcPr>
+          <w:p>
+            <w:pPr>
+              <w:pStyle w:val="Normal"/>
+              <w:widowControl w:val="false"/>
+              <w:spacing w:lineRule="auto" w:line="180"/>
+              <w:jc w:val="center"/>
+              <w:rPr>
+                <w:sz w:val="16"/>
+                <w:szCs w:val="16"/>
+              </w:rPr>
+            </w:pPr>
+            <w:r>
+              <w:rPr>
+                <w:rFonts w:eastAsia="arial" w:ascii="arial" w:hAnsi="arial"/>
+                <w:color w:val="000000"/>
+                <w:sz w:val="16"/>
+                <w:szCs w:val="16"/>
+              </w:rPr>
+              <w:t>Uncouple</w:t>
+            </w:r>
+          </w:p>
+        </w:tc>
+        <w:tc>
+          <w:tcPr>
+            <w:tcW w:w="1016" w:type="dxa"/>
+            <w:tcBorders>
+              <w:top w:val="single" w:sz="4" w:space="0" w:color="000000"/>
+              <w:left w:val="single" w:sz="4" w:space="0" w:color="000000"/>
+              <w:bottom w:val="single" w:sz="4" w:space="0" w:color="000000"/>
+            </w:tcBorders>
+            <w:vAlign w:val="bottom"/>
+          </w:tcPr>
+          <w:p>
+            <w:pPr>
+              <w:pStyle w:val="Normal"/>
+              <w:widowControl w:val="false"/>
+              <w:spacing w:lineRule="auto" w:line="180"/>
+              <w:jc w:val="center"/>
+              <w:rPr>
+                <w:sz w:val="16"/>
+                <w:szCs w:val="16"/>
+              </w:rPr>
+            </w:pPr>
+            <w:r>
+              <w:rPr>
+                <w:sz w:val="16"/>
+                <w:szCs w:val="16"/>
+              </w:rPr>
+              <w:t>Desk</w:t>
+            </w:r>
+            <w:r>
+              <w:rPr>
+                <w:sz w:val="16"/>
+                <w:szCs w:val="16"/>
+              </w:rPr>
+              <w:t xml:space="preserve"> Light </w:t>
+            </w:r>
+            <w:r>
+              <w:rPr>
+                <w:sz w:val="16"/>
+                <w:szCs w:val="16"/>
+              </w:rPr>
+              <w:t>Dw</w:t>
+            </w:r>
+          </w:p>
+        </w:tc>
+        <w:tc>
+          <w:tcPr>
+            <w:tcW w:w="1020" w:type="dxa"/>
+            <w:tcBorders>
+              <w:top w:val="single" w:sz="4" w:space="0" w:color="000000"/>
+              <w:left w:val="single" w:sz="4" w:space="0" w:color="000000"/>
+              <w:bottom w:val="single" w:sz="4" w:space="0" w:color="000000"/>
+            </w:tcBorders>
+            <w:vAlign w:val="bottom"/>
+          </w:tcPr>
+          <w:p>
+            <w:pPr>
+              <w:pStyle w:val="Normal"/>
+              <w:widowControl w:val="false"/>
+              <w:spacing w:lineRule="auto" w:line="180"/>
+              <w:jc w:val="center"/>
+              <w:rPr>
+                <w:sz w:val="16"/>
+                <w:szCs w:val="16"/>
+              </w:rPr>
+            </w:pPr>
+            <w:r>
+              <w:rPr>
+                <w:rFonts w:eastAsia="arial" w:ascii="arial" w:hAnsi="arial"/>
+                <w:color w:val="000000"/>
+                <w:sz w:val="16"/>
+                <w:szCs w:val="16"/>
+              </w:rPr>
+              <w:t>Gauge Light Dw</w:t>
             </w:r>
           </w:p>
         </w:tc>
@@ -38639,7 +40895,15 @@
                 <w:sz w:val="16"/>
                 <w:szCs w:val="16"/>
               </w:rPr>
-              <w:t>Uncouple</w:t>
+              <w:t xml:space="preserve">Cab Light </w:t>
+            </w:r>
+            <w:r>
+              <w:rPr>
+                <w:color w:val="000000"/>
+                <w:sz w:val="16"/>
+                <w:szCs w:val="16"/>
+              </w:rPr>
+              <w:t>Off</w:t>
             </w:r>
           </w:p>
         </w:tc>
@@ -39791,12 +42055,12 @@
       <w:rFonts w:ascii="Symbol" w:hAnsi="Symbol" w:cs="Symbol"/>
     </w:rPr>
   </w:style>
-  <w:style w:type="character" w:styleId="Style5" w:customStyle="1">
-    <w:name w:val="번호 매기기 기호"/>
+  <w:style w:type="character" w:styleId="user" w:customStyle="1">
+    <w:name w:val="번호 매기기 기호 (user)"/>
     <w:qFormat/>
     <w:rPr/>
   </w:style>
-  <w:style w:type="paragraph" w:styleId="Style6">
+  <w:style w:type="paragraph" w:styleId="Style5">
     <w:name w:val="제목"/>
     <w:basedOn w:val="Normal"/>
     <w:next w:val="BodyText"/>
@@ -39806,7 +42070,7 @@
       <w:spacing w:before="240" w:after="120"/>
     </w:pPr>
     <w:rPr>
-      <w:rFonts w:ascii="Liberation Sans" w:hAnsi="Liberation Sans" w:eastAsia="나눔고딕" w:cs="Arial"/>
+      <w:rFonts w:ascii="Liberation Sans" w:hAnsi="Liberation Sans" w:eastAsia="Noto Sans CJK KR" w:cs="Lohit Devanagari"/>
       <w:sz w:val="28"/>
       <w:szCs w:val="28"/>
     </w:rPr>
@@ -39843,7 +42107,7 @@
       <w:szCs w:val="24"/>
     </w:rPr>
   </w:style>
-  <w:style w:type="paragraph" w:styleId="Style7">
+  <w:style w:type="paragraph" w:styleId="Style6" w:customStyle="1">
     <w:name w:val="색인"/>
     <w:basedOn w:val="Normal"/>
     <w:qFormat/>
@@ -39851,11 +42115,10 @@
       <w:suppressLineNumbers/>
     </w:pPr>
     <w:rPr>
-      <w:rFonts w:cs="Arial"/>
-      <w:sz w:val="24"/>
+      <w:rFonts w:cs="Lohit Devanagari"/>
     </w:rPr>
   </w:style>
-  <w:style w:type="paragraph" w:styleId="user">
+  <w:style w:type="paragraph" w:styleId="user1">
     <w:name w:val="제목 (user)"/>
     <w:basedOn w:val="Normal"/>
     <w:next w:val="BodyText"/>
@@ -39865,12 +42128,12 @@
       <w:spacing w:before="240" w:after="120"/>
     </w:pPr>
     <w:rPr>
-      <w:rFonts w:ascii="Liberation Sans" w:hAnsi="Liberation Sans" w:eastAsia="Noto Sans CJK KR" w:cs="Lohit Devanagari"/>
+      <w:rFonts w:ascii="Liberation Sans" w:hAnsi="Liberation Sans" w:eastAsia="나눔고딕" w:cs="Arial"/>
       <w:sz w:val="28"/>
       <w:szCs w:val="28"/>
     </w:rPr>
   </w:style>
-  <w:style w:type="paragraph" w:styleId="user1" w:customStyle="1">
+  <w:style w:type="paragraph" w:styleId="user2">
     <w:name w:val="색인 (user)"/>
     <w:basedOn w:val="Normal"/>
     <w:qFormat/>
@@ -39878,7 +42141,8 @@
       <w:suppressLineNumbers/>
     </w:pPr>
     <w:rPr>
-      <w:rFonts w:cs="Lohit Devanagari"/>
+      <w:rFonts w:cs="Arial"/>
+      <w:sz w:val="24"/>
     </w:rPr>
   </w:style>
   <w:style w:type="paragraph" w:styleId="Title">
@@ -40560,8 +42824,8 @@
       <w:szCs w:val="24"/>
     </w:rPr>
   </w:style>
-  <w:style w:type="paragraph" w:styleId="user2" w:customStyle="1">
-    <w:name w:val="표 내용 (user)"/>
+  <w:style w:type="paragraph" w:styleId="Style7" w:customStyle="1">
+    <w:name w:val="표 내용"/>
     <w:basedOn w:val="Normal"/>
     <w:qFormat/>
     <w:pPr>
@@ -40569,9 +42833,9 @@
     </w:pPr>
     <w:rPr/>
   </w:style>
-  <w:style w:type="paragraph" w:styleId="user3" w:customStyle="1">
-    <w:name w:val="표제목 (user)"/>
-    <w:basedOn w:val="user2"/>
+  <w:style w:type="paragraph" w:styleId="Style8" w:customStyle="1">
+    <w:name w:val="표제목"/>
+    <w:basedOn w:val="Style7"/>
     <w:qFormat/>
     <w:pPr>
       <w:jc w:val="center"/>
@@ -40581,8 +42845,8 @@
       <w:bCs/>
     </w:rPr>
   </w:style>
-  <w:style w:type="paragraph" w:styleId="Style8">
-    <w:name w:val="표 내용"/>
+  <w:style w:type="paragraph" w:styleId="user3">
+    <w:name w:val="표 내용 (user)"/>
     <w:basedOn w:val="Normal"/>
     <w:qFormat/>
     <w:pPr>
@@ -40591,9 +42855,9 @@
     </w:pPr>
     <w:rPr/>
   </w:style>
-  <w:style w:type="paragraph" w:styleId="Style9">
-    <w:name w:val="표제목"/>
-    <w:basedOn w:val="Style8"/>
+  <w:style w:type="paragraph" w:styleId="user4">
+    <w:name w:val="표제목 (user)"/>
+    <w:basedOn w:val="user3"/>
     <w:qFormat/>
     <w:pPr>
       <w:suppressLineNumbers/>

</xml_diff>